<commit_message>
update manuscript and p2p letter
</commit_message>
<xml_diff>
--- a/publication/manuscripts/LLM4AE_rev1.docx
+++ b/publication/manuscripts/LLM4AE_rev1.docx
@@ -432,7 +432,6 @@
         <w:pStyle w:val="Heading1"/>
       </w:pPr>
       <w:r>
-        <w:lastRenderedPageBreak/>
         <w:t>Abstract</w:t>
       </w:r>
     </w:p>
@@ -547,17 +546,28 @@
         <w:t>compiled</w:t>
       </w:r>
       <w:r>
-        <w:t xml:space="preserve"> 829</w:t>
-      </w:r>
-      <w:r>
         <w:t xml:space="preserve"> </w:t>
       </w:r>
-      <w:ins w:id="0" w:author="Wu, Leihong" w:date="2026-08-28T10:15:00Z" w16du:dateUtc="2026-08-28T15:15:00Z">
+      <w:ins w:id="0" w:author="Wu, Leihong" w:date="2026-08-31T08:57:00Z" w16du:dateUtc="2026-08-31T13:57:00Z">
+        <w:r>
+          <w:t xml:space="preserve">expert reference annotations </w:t>
+        </w:r>
+        <w:r>
+          <w:t xml:space="preserve">for </w:t>
+        </w:r>
+      </w:ins>
+      <w:r>
+        <w:t>829</w:t>
+      </w:r>
+      <w:r>
+        <w:t xml:space="preserve"> </w:t>
+      </w:r>
+      <w:ins w:id="1" w:author="Wu, Leihong" w:date="2026-08-28T10:15:00Z" w16du:dateUtc="2026-08-28T15:15:00Z">
         <w:r>
           <w:t xml:space="preserve">FDA Adverse Event Reporting System (FAERS) </w:t>
         </w:r>
       </w:ins>
-      <w:del w:id="1" w:author="Wu, Leihong" w:date="2026-08-28T10:15:00Z" w16du:dateUtc="2026-08-28T15:15:00Z">
+      <w:del w:id="2" w:author="Wu, Leihong" w:date="2026-08-28T10:15:00Z" w16du:dateUtc="2026-08-28T15:15:00Z">
         <w:r>
           <w:delText>FAERS</w:delText>
         </w:r>
@@ -574,9 +584,11 @@
       <w:r>
         <w:t xml:space="preserve">narratives </w:t>
       </w:r>
-      <w:r>
-        <w:t xml:space="preserve">with expert annotations </w:t>
-      </w:r>
+      <w:del w:id="3" w:author="Wu, Leihong" w:date="2026-08-31T08:58:00Z" w16du:dateUtc="2026-08-31T13:58:00Z">
+        <w:r>
+          <w:delText xml:space="preserve">with expert annotations </w:delText>
+        </w:r>
+      </w:del>
       <w:r>
         <w:t>covering 17 clinical entity types</w:t>
       </w:r>
@@ -589,26 +601,36 @@
       <w:r>
         <w:t xml:space="preserve"> </w:t>
       </w:r>
-      <w:r>
-        <w:t xml:space="preserve">demonstrate the value of </w:t>
-      </w:r>
-      <w:r>
-        <w:t>this benchmarking dataset</w:t>
-      </w:r>
-      <w:r>
-        <w:t xml:space="preserve"> </w:t>
-      </w:r>
-      <w:r>
-        <w:t>by</w:t>
-      </w:r>
-      <w:r>
-        <w:t xml:space="preserve"> compar</w:t>
-      </w:r>
-      <w:r>
-        <w:t>ing</w:t>
-      </w:r>
-      <w:r>
-        <w:t xml:space="preserve"> three </w:t>
+      <w:ins w:id="4" w:author="Wu, Leihong" w:date="2026-08-31T08:58:00Z" w16du:dateUtc="2026-08-31T13:58:00Z">
+        <w:r>
+          <w:t xml:space="preserve">used this corpus to compare </w:t>
+        </w:r>
+      </w:ins>
+      <w:del w:id="5" w:author="Wu, Leihong" w:date="2026-08-31T08:58:00Z" w16du:dateUtc="2026-08-31T13:58:00Z">
+        <w:r>
+          <w:delText xml:space="preserve">demonstrate the value of </w:delText>
+        </w:r>
+        <w:r>
+          <w:delText>this benchmarking dataset</w:delText>
+        </w:r>
+        <w:r>
+          <w:delText xml:space="preserve"> </w:delText>
+        </w:r>
+        <w:r>
+          <w:delText>by</w:delText>
+        </w:r>
+        <w:r>
+          <w:delText xml:space="preserve"> compar</w:delText>
+        </w:r>
+        <w:r>
+          <w:delText>ing</w:delText>
+        </w:r>
+        <w:r>
+          <w:delText xml:space="preserve"> </w:delText>
+        </w:r>
+      </w:del>
+      <w:r>
+        <w:t xml:space="preserve">three </w:t>
       </w:r>
       <w:r>
         <w:t xml:space="preserve">automated </w:t>
@@ -700,7 +722,7 @@
       <w:r>
         <w:t>on an existing</w:t>
       </w:r>
-      <w:ins w:id="2" w:author="Wu, Leihong" w:date="2026-08-28T10:16:00Z" w16du:dateUtc="2026-08-28T15:16:00Z">
+      <w:ins w:id="6" w:author="Wu, Leihong" w:date="2026-08-28T10:16:00Z" w16du:dateUtc="2026-08-28T15:16:00Z">
         <w:r>
           <w:t xml:space="preserve"> Vaccine Adverse Events Reporting System</w:t>
         </w:r>
@@ -708,7 +730,7 @@
       <w:r>
         <w:t xml:space="preserve"> </w:t>
       </w:r>
-      <w:ins w:id="3" w:author="Wu, Leihong" w:date="2026-08-28T10:16:00Z" w16du:dateUtc="2026-08-28T15:16:00Z">
+      <w:ins w:id="7" w:author="Wu, Leihong" w:date="2026-08-28T10:16:00Z" w16du:dateUtc="2026-08-28T15:16:00Z">
         <w:r>
           <w:t>(</w:t>
         </w:r>
@@ -716,7 +738,7 @@
       <w:r>
         <w:t>VAERS</w:t>
       </w:r>
-      <w:ins w:id="4" w:author="Wu, Leihong" w:date="2026-08-28T10:16:00Z" w16du:dateUtc="2026-08-28T15:16:00Z">
+      <w:ins w:id="8" w:author="Wu, Leihong" w:date="2026-08-28T10:16:00Z" w16du:dateUtc="2026-08-28T15:16:00Z">
         <w:r>
           <w:t>)</w:t>
         </w:r>
@@ -770,17 +792,53 @@
         <w:t xml:space="preserve"> tasks</w:t>
       </w:r>
       <w:r>
-        <w:t xml:space="preserve"> and position our FAERS corpus as a reusable benchmark</w:t>
-      </w:r>
-      <w:r>
-        <w:t>ing dataset</w:t>
-      </w:r>
-      <w:r>
-        <w:t xml:space="preserve"> for </w:t>
+        <w:t xml:space="preserve"> and </w:t>
+      </w:r>
+      <w:ins w:id="9" w:author="Wu, Leihong" w:date="2026-08-31T08:59:00Z" w16du:dateUtc="2026-08-31T13:59:00Z">
+        <w:r>
+          <w:t xml:space="preserve">establish the </w:t>
+        </w:r>
+      </w:ins>
+      <w:del w:id="10" w:author="Wu, Leihong" w:date="2026-08-31T08:59:00Z" w16du:dateUtc="2026-08-31T13:59:00Z">
+        <w:r>
+          <w:delText xml:space="preserve">position our </w:delText>
+        </w:r>
+      </w:del>
+      <w:r>
+        <w:t xml:space="preserve">FAERS </w:t>
+      </w:r>
+      <w:ins w:id="11" w:author="Wu, Leihong" w:date="2026-08-31T08:59:00Z" w16du:dateUtc="2026-08-31T13:59:00Z">
+        <w:r>
+          <w:t>annotations as an expert-curat</w:t>
+        </w:r>
+      </w:ins>
+      <w:ins w:id="12" w:author="Wu, Leihong" w:date="2026-08-31T09:00:00Z" w16du:dateUtc="2026-08-31T14:00:00Z">
+        <w:r>
+          <w:t xml:space="preserve">ed reference resource </w:t>
+        </w:r>
+      </w:ins>
+      <w:del w:id="13" w:author="Wu, Leihong" w:date="2026-08-31T09:00:00Z" w16du:dateUtc="2026-08-31T14:00:00Z">
+        <w:r>
+          <w:delText>corpus as a reusable benchmark</w:delText>
+        </w:r>
+        <w:r>
+          <w:delText>ing dataset</w:delText>
+        </w:r>
+        <w:r>
+          <w:delText xml:space="preserve"> </w:delText>
+        </w:r>
+      </w:del>
+      <w:r>
+        <w:t xml:space="preserve">for </w:t>
       </w:r>
       <w:r>
         <w:t xml:space="preserve">development and </w:t>
       </w:r>
+      <w:ins w:id="14" w:author="Wu, Leihong" w:date="2026-08-31T09:00:00Z" w16du:dateUtc="2026-08-31T14:00:00Z">
+        <w:r>
+          <w:t xml:space="preserve">methodological </w:t>
+        </w:r>
+      </w:ins>
       <w:r>
         <w:t>evaluati</w:t>
       </w:r>
@@ -791,7 +849,20 @@
         <w:t xml:space="preserve">clinical </w:t>
       </w:r>
       <w:r>
-        <w:t>concept extraction methods.</w:t>
+        <w:t xml:space="preserve">concept extraction </w:t>
+      </w:r>
+      <w:del w:id="15" w:author="Wu, Leihong" w:date="2026-08-31T09:00:00Z" w16du:dateUtc="2026-08-31T14:00:00Z">
+        <w:r>
+          <w:delText>methods</w:delText>
+        </w:r>
+      </w:del>
+      <w:ins w:id="16" w:author="Wu, Leihong" w:date="2026-08-31T09:00:00Z" w16du:dateUtc="2026-08-31T14:00:00Z">
+        <w:r>
+          <w:t>from safety narratives</w:t>
+        </w:r>
+      </w:ins>
+      <w:r>
+        <w:t>.</w:t>
       </w:r>
     </w:p>
     <w:p>
@@ -805,7 +876,6 @@
           <w:b/>
           <w:bCs/>
         </w:rPr>
-        <w:lastRenderedPageBreak/>
         <w:t>Key</w:t>
       </w:r>
       <w:r>
@@ -828,13 +898,57 @@
     </w:p>
     <w:p>
       <w:r>
-        <w:t xml:space="preserve">• We developed an expert-annotated FAERS benchmark dataset for clinical concept extraction from safety report narratives, establishing a reusable resource for </w:t>
-      </w:r>
-      <w:r>
-        <w:t xml:space="preserve">future FDA </w:t>
-      </w:r>
-      <w:r>
-        <w:t>pharmacovigilance research.</w:t>
+        <w:t>• We developed an expert-</w:t>
+      </w:r>
+      <w:ins w:id="17" w:author="Wu, Leihong" w:date="2026-08-31T09:01:00Z" w16du:dateUtc="2026-08-31T14:01:00Z">
+        <w:r>
+          <w:t>curated</w:t>
+        </w:r>
+      </w:ins>
+      <w:del w:id="18" w:author="Wu, Leihong" w:date="2026-08-31T09:01:00Z" w16du:dateUtc="2026-08-31T14:01:00Z">
+        <w:r>
+          <w:delText>annotated</w:delText>
+        </w:r>
+      </w:del>
+      <w:r>
+        <w:t xml:space="preserve"> FAERS </w:t>
+      </w:r>
+      <w:ins w:id="19" w:author="Wu, Leihong" w:date="2026-08-31T09:01:00Z" w16du:dateUtc="2026-08-31T14:01:00Z">
+        <w:r>
+          <w:t>reference corpus</w:t>
+        </w:r>
+      </w:ins>
+      <w:del w:id="20" w:author="Wu, Leihong" w:date="2026-08-31T09:01:00Z" w16du:dateUtc="2026-08-31T14:01:00Z">
+        <w:r>
+          <w:delText>benchmark dataset</w:delText>
+        </w:r>
+      </w:del>
+      <w:r>
+        <w:t xml:space="preserve"> for clinical concept extraction from safety report narratives, </w:t>
+      </w:r>
+      <w:ins w:id="21" w:author="Wu, Leihong" w:date="2026-08-31T09:01:00Z" w16du:dateUtc="2026-08-31T14:01:00Z">
+        <w:r>
+          <w:t>and characterized its scale</w:t>
+        </w:r>
+      </w:ins>
+      <w:ins w:id="22" w:author="Wu, Leihong" w:date="2026-08-31T09:02:00Z" w16du:dateUtc="2026-08-31T14:02:00Z">
+        <w:r>
+          <w:t>, clinical composition, and annotation diversity</w:t>
+        </w:r>
+      </w:ins>
+      <w:del w:id="23" w:author="Wu, Leihong" w:date="2026-08-31T09:02:00Z" w16du:dateUtc="2026-08-31T14:02:00Z">
+        <w:r>
+          <w:delText xml:space="preserve">establishing a reusable resource for </w:delText>
+        </w:r>
+        <w:r>
+          <w:delText xml:space="preserve">future FDA </w:delText>
+        </w:r>
+        <w:r>
+          <w:delText>pharmacovigilance research</w:delText>
+        </w:r>
+      </w:del>
+      <w:r>
+        <w:t>.</w:t>
       </w:r>
     </w:p>
     <w:p>
@@ -844,8 +958,18 @@
     </w:p>
     <w:p>
       <w:r>
-        <w:t>• Fine-tuned BERT models achieved the highest performance, underscoring the importance of curated training data and domain-specific model development for pharmacovigilance applications.</w:t>
-      </w:r>
+        <w:t xml:space="preserve">• Fine-tuned BERT models </w:t>
+      </w:r>
+      <w:ins w:id="24" w:author="Wu, Leihong" w:date="2026-08-31T09:02:00Z" w16du:dateUtc="2026-08-31T14:02:00Z">
+        <w:r>
+          <w:t xml:space="preserve">are evaluated using repeated random-seed training and cross-validation to quantify robustness and reduce dependence on a single experiment run. </w:t>
+        </w:r>
+      </w:ins>
+      <w:del w:id="25" w:author="Wu, Leihong" w:date="2026-08-31T09:02:00Z" w16du:dateUtc="2026-08-31T14:02:00Z">
+        <w:r>
+          <w:delText>achieved the highest performance, underscoring the importance of curated training data and domain-specific model development for pharmacovigilance applications.</w:delText>
+        </w:r>
+      </w:del>
     </w:p>
     <w:p/>
     <w:p>
@@ -860,12 +984,12 @@
       <w:r>
         <w:t xml:space="preserve">Post-marketing safety surveillance is essential for ensuring the continued safety of drugs and vaccines after they enter the market. In the United States, the FDA relies heavily on </w:t>
       </w:r>
-      <w:ins w:id="5" w:author="Wu, Leihong" w:date="2026-08-28T10:17:00Z" w16du:dateUtc="2026-08-28T15:17:00Z">
+      <w:ins w:id="26" w:author="Wu, Leihong" w:date="2026-08-28T10:17:00Z" w16du:dateUtc="2026-08-28T15:17:00Z">
         <w:r>
           <w:t>A</w:t>
         </w:r>
       </w:ins>
-      <w:del w:id="6" w:author="Wu, Leihong" w:date="2026-08-28T10:17:00Z" w16du:dateUtc="2026-08-28T15:17:00Z">
+      <w:del w:id="27" w:author="Wu, Leihong" w:date="2026-08-28T10:17:00Z" w16du:dateUtc="2026-08-28T15:17:00Z">
         <w:r>
           <w:delText>a</w:delText>
         </w:r>
@@ -873,12 +997,12 @@
       <w:r>
         <w:t xml:space="preserve">dverse </w:t>
       </w:r>
-      <w:del w:id="7" w:author="Wu, Leihong" w:date="2026-08-28T10:17:00Z" w16du:dateUtc="2026-08-28T15:17:00Z">
+      <w:del w:id="28" w:author="Wu, Leihong" w:date="2026-08-28T10:17:00Z" w16du:dateUtc="2026-08-28T15:17:00Z">
         <w:r>
           <w:delText>e</w:delText>
         </w:r>
       </w:del>
-      <w:ins w:id="8" w:author="Wu, Leihong" w:date="2026-08-28T10:17:00Z" w16du:dateUtc="2026-08-28T15:17:00Z">
+      <w:ins w:id="29" w:author="Wu, Leihong" w:date="2026-08-28T10:17:00Z" w16du:dateUtc="2026-08-28T15:17:00Z">
         <w:r>
           <w:t>E</w:t>
         </w:r>
@@ -886,23 +1010,20 @@
       <w:r>
         <w:t xml:space="preserve">vent </w:t>
       </w:r>
-      <w:del w:id="9" w:author="Wu, Leihong" w:date="2026-08-28T10:17:00Z" w16du:dateUtc="2026-08-28T15:17:00Z">
+      <w:del w:id="30" w:author="Wu, Leihong" w:date="2026-08-28T10:17:00Z" w16du:dateUtc="2026-08-28T15:17:00Z">
         <w:r>
           <w:delText xml:space="preserve">reporting </w:delText>
         </w:r>
       </w:del>
-      <w:ins w:id="10" w:author="Wu, Leihong" w:date="2026-08-28T10:17:00Z" w16du:dateUtc="2026-08-28T15:17:00Z">
-        <w:r>
-          <w:t>Monitoring</w:t>
-        </w:r>
-        <w:r>
-          <w:t xml:space="preserve"> </w:t>
+      <w:ins w:id="31" w:author="Wu, Leihong" w:date="2026-08-28T10:17:00Z" w16du:dateUtc="2026-08-28T15:17:00Z">
+        <w:r>
+          <w:t xml:space="preserve">Monitoring </w:t>
         </w:r>
         <w:r>
           <w:t>S</w:t>
         </w:r>
       </w:ins>
-      <w:del w:id="11" w:author="Wu, Leihong" w:date="2026-08-28T10:17:00Z" w16du:dateUtc="2026-08-28T15:17:00Z">
+      <w:del w:id="32" w:author="Wu, Leihong" w:date="2026-08-28T10:17:00Z" w16du:dateUtc="2026-08-28T15:17:00Z">
         <w:r>
           <w:delText>s</w:delText>
         </w:r>
@@ -916,12 +1037,12 @@
       <w:r>
         <w:t xml:space="preserve"> </w:t>
       </w:r>
-      <w:ins w:id="12" w:author="Wu, Leihong" w:date="2026-08-28T10:17:00Z" w16du:dateUtc="2026-08-28T15:17:00Z">
+      <w:ins w:id="33" w:author="Wu, Leihong" w:date="2026-08-28T10:17:00Z" w16du:dateUtc="2026-08-28T15:17:00Z">
         <w:r>
           <w:t>(AEMS) including</w:t>
         </w:r>
       </w:ins>
-      <w:del w:id="13" w:author="Wu, Leihong" w:date="2026-08-28T10:17:00Z" w16du:dateUtc="2026-08-28T15:17:00Z">
+      <w:del w:id="34" w:author="Wu, Leihong" w:date="2026-08-28T10:17:00Z" w16du:dateUtc="2026-08-28T15:17:00Z">
         <w:r>
           <w:delText>like</w:delText>
         </w:r>
@@ -1120,11 +1241,7 @@
         <w:t xml:space="preserve">pharmacovigilance </w:t>
       </w:r>
       <w:r>
-        <w:t xml:space="preserve">tasks such </w:t>
-      </w:r>
-      <w:r>
-        <w:lastRenderedPageBreak/>
-        <w:t xml:space="preserve">as duplicate </w:t>
+        <w:t xml:space="preserve">tasks such as duplicate </w:t>
       </w:r>
       <w:r>
         <w:t xml:space="preserve">ICSR </w:t>
@@ -1474,7 +1591,6 @@
         <w:pStyle w:val="Heading1"/>
       </w:pPr>
       <w:r>
-        <w:lastRenderedPageBreak/>
         <w:t>2. Materials and Methods</w:t>
       </w:r>
     </w:p>
@@ -1489,7 +1605,7 @@
     <w:p>
       <w:pPr>
         <w:rPr>
-          <w:ins w:id="14" w:author="Wu, Leihong" w:date="2026-08-28T11:21:00Z" w16du:dateUtc="2026-08-28T16:21:00Z"/>
+          <w:ins w:id="35" w:author="Wu, Leihong" w:date="2026-08-28T11:21:00Z" w16du:dateUtc="2026-08-28T16:21:00Z"/>
         </w:rPr>
       </w:pPr>
       <w:r>
@@ -1546,19 +1662,19 @@
       <w:r>
         <w:t xml:space="preserve"> </w:t>
       </w:r>
-      <w:ins w:id="15" w:author="Wu, Leihong" w:date="2026-08-28T11:20:00Z" w16du:dateUtc="2026-08-28T16:20:00Z">
-        <w:r>
-          <w:t>Together, the two corpora comprise 1,829 clinical narrative reports, in total of 854,257 tokens</w:t>
+      <w:ins w:id="36" w:author="Wu, Leihong" w:date="2026-08-28T11:20:00Z" w16du:dateUtc="2026-08-28T16:20:00Z">
+        <w:r>
+          <w:t>Together, the two corpora comprise 1,829 clinical narrative reports, 854,257 tokens</w:t>
         </w:r>
       </w:ins>
-      <w:ins w:id="16" w:author="Wu, Leihong" w:date="2026-08-28T11:24:00Z" w16du:dateUtc="2026-08-28T16:24:00Z">
-        <w:r>
-          <w:t xml:space="preserve"> in</w:t>
+      <w:ins w:id="37" w:author="Wu, Leihong" w:date="2026-08-31T09:03:00Z" w16du:dateUtc="2026-08-31T14:03:00Z">
+        <w:r>
+          <w:t xml:space="preserve">, and </w:t>
         </w:r>
       </w:ins>
-      <w:ins w:id="17" w:author="Wu, Leihong" w:date="2026-08-28T11:20:00Z" w16du:dateUtc="2026-08-28T16:20:00Z">
-        <w:r>
-          <w:t xml:space="preserve"> 39,809 sentences. </w:t>
+      <w:ins w:id="38" w:author="Wu, Leihong" w:date="2026-08-28T11:20:00Z" w16du:dateUtc="2026-08-28T16:20:00Z">
+        <w:r>
+          <w:t xml:space="preserve">39,809 sentences. </w:t>
         </w:r>
         <w:r>
           <w:rPr>
@@ -1574,24 +1690,42 @@
           <w:t>summarizes</w:t>
         </w:r>
         <w:r>
-          <w:t xml:space="preserve"> the key corpus statistics.</w:t>
+          <w:t xml:space="preserve"> the key corpus statistics</w:t>
+        </w:r>
+      </w:ins>
+      <w:ins w:id="39" w:author="Wu, Leihong" w:date="2026-08-31T09:03:00Z" w16du:dateUtc="2026-08-31T14:03:00Z">
+        <w:r>
+          <w:t xml:space="preserve">, including </w:t>
+        </w:r>
+        <w:r>
+          <w:t>document le</w:t>
+        </w:r>
+      </w:ins>
+      <w:ins w:id="40" w:author="Wu, Leihong" w:date="2026-08-31T09:04:00Z" w16du:dateUtc="2026-08-31T14:04:00Z">
+        <w:r>
+          <w:t>ngth, annotation volume, and lexical surface-form diversity</w:t>
+        </w:r>
+      </w:ins>
+      <w:ins w:id="41" w:author="Wu, Leihong" w:date="2026-08-28T11:20:00Z" w16du:dateUtc="2026-08-28T16:20:00Z">
+        <w:r>
+          <w:t>.</w:t>
         </w:r>
       </w:ins>
     </w:p>
     <w:p>
       <w:pPr>
         <w:rPr>
-          <w:ins w:id="18" w:author="Wu, Leihong" w:date="2026-08-28T11:21:00Z" w16du:dateUtc="2026-08-28T16:21:00Z"/>
+          <w:ins w:id="42" w:author="Wu, Leihong" w:date="2026-08-28T11:21:00Z" w16du:dateUtc="2026-08-28T16:21:00Z"/>
         </w:rPr>
       </w:pPr>
     </w:p>
     <w:p>
       <w:pPr>
         <w:rPr>
-          <w:ins w:id="19" w:author="Wu, Leihong" w:date="2026-08-28T11:21:00Z" w16du:dateUtc="2026-08-28T16:21:00Z"/>
-        </w:rPr>
-      </w:pPr>
-      <w:ins w:id="20" w:author="Wu, Leihong" w:date="2026-08-28T11:21:00Z">
+          <w:ins w:id="43" w:author="Wu, Leihong" w:date="2026-08-28T11:21:00Z" w16du:dateUtc="2026-08-28T16:21:00Z"/>
+        </w:rPr>
+      </w:pPr>
+      <w:ins w:id="44" w:author="Wu, Leihong" w:date="2026-08-28T11:21:00Z">
         <w:r>
           <w:t>Table 1. Descriptive statistics of the annotated corpora.</w:t>
         </w:r>
@@ -1604,14 +1738,15 @@
         <w:tblLook w:val="04A0" w:firstRow="1" w:lastRow="0" w:firstColumn="1" w:lastColumn="0" w:noHBand="0" w:noVBand="1"/>
       </w:tblPr>
       <w:tblGrid>
-        <w:gridCol w:w="2944"/>
+        <w:gridCol w:w="3223"/>
         <w:gridCol w:w="2276"/>
         <w:gridCol w:w="2835"/>
       </w:tblGrid>
       <w:tr>
         <w:trPr>
           <w:cnfStyle w:val="100000000000" w:firstRow="1" w:lastRow="0" w:firstColumn="0" w:lastColumn="0" w:oddVBand="0" w:evenVBand="0" w:oddHBand="0" w:evenHBand="0" w:firstRowFirstColumn="0" w:firstRowLastColumn="0" w:lastRowFirstColumn="0" w:lastRowLastColumn="0"/>
-          <w:ins w:id="21" w:author="Wu, Leihong" w:date="2026-08-28T11:21:00Z"/>
+          <w:trHeight w:val="432"/>
+          <w:ins w:id="45" w:author="Wu, Leihong" w:date="2026-08-28T11:21:00Z"/>
         </w:trPr>
         <w:tc>
           <w:tcPr>
@@ -1623,10 +1758,10 @@
             <w:pPr>
               <w:spacing w:after="160" w:line="278" w:lineRule="auto"/>
               <w:rPr>
-                <w:ins w:id="22" w:author="Wu, Leihong" w:date="2026-08-28T11:21:00Z"/>
-              </w:rPr>
-            </w:pPr>
-            <w:ins w:id="23" w:author="Wu, Leihong" w:date="2026-08-28T11:21:00Z">
+                <w:ins w:id="46" w:author="Wu, Leihong" w:date="2026-08-28T11:21:00Z"/>
+              </w:rPr>
+            </w:pPr>
+            <w:ins w:id="47" w:author="Wu, Leihong" w:date="2026-08-28T11:21:00Z">
               <w:r>
                 <w:t>Statistic</w:t>
               </w:r>
@@ -1643,10 +1778,10 @@
               <w:spacing w:after="160" w:line="278" w:lineRule="auto"/>
               <w:cnfStyle w:val="100000000000" w:firstRow="1" w:lastRow="0" w:firstColumn="0" w:lastColumn="0" w:oddVBand="0" w:evenVBand="0" w:oddHBand="0" w:evenHBand="0" w:firstRowFirstColumn="0" w:firstRowLastColumn="0" w:lastRowFirstColumn="0" w:lastRowLastColumn="0"/>
               <w:rPr>
-                <w:ins w:id="24" w:author="Wu, Leihong" w:date="2026-08-28T11:21:00Z"/>
-              </w:rPr>
-            </w:pPr>
-            <w:ins w:id="25" w:author="Wu, Leihong" w:date="2026-08-28T11:21:00Z">
+                <w:ins w:id="48" w:author="Wu, Leihong" w:date="2026-08-28T11:21:00Z"/>
+              </w:rPr>
+            </w:pPr>
+            <w:ins w:id="49" w:author="Wu, Leihong" w:date="2026-08-28T11:21:00Z">
               <w:r>
                 <w:t>FAERS D1</w:t>
               </w:r>
@@ -1663,10 +1798,10 @@
               <w:spacing w:after="160" w:line="278" w:lineRule="auto"/>
               <w:cnfStyle w:val="100000000000" w:firstRow="1" w:lastRow="0" w:firstColumn="0" w:lastColumn="0" w:oddVBand="0" w:evenVBand="0" w:oddHBand="0" w:evenHBand="0" w:firstRowFirstColumn="0" w:firstRowLastColumn="0" w:lastRowFirstColumn="0" w:lastRowLastColumn="0"/>
               <w:rPr>
-                <w:ins w:id="26" w:author="Wu, Leihong" w:date="2026-08-28T11:21:00Z"/>
-              </w:rPr>
-            </w:pPr>
-            <w:ins w:id="27" w:author="Wu, Leihong" w:date="2026-08-28T11:21:00Z">
+                <w:ins w:id="50" w:author="Wu, Leihong" w:date="2026-08-28T11:21:00Z"/>
+              </w:rPr>
+            </w:pPr>
+            <w:ins w:id="51" w:author="Wu, Leihong" w:date="2026-08-28T11:21:00Z">
               <w:r>
                 <w:t>VAERS</w:t>
               </w:r>
@@ -1677,7 +1812,8 @@
       <w:tr>
         <w:trPr>
           <w:cnfStyle w:val="000000100000" w:firstRow="0" w:lastRow="0" w:firstColumn="0" w:lastColumn="0" w:oddVBand="0" w:evenVBand="0" w:oddHBand="1" w:evenHBand="0" w:firstRowFirstColumn="0" w:firstRowLastColumn="0" w:lastRowFirstColumn="0" w:lastRowLastColumn="0"/>
-          <w:ins w:id="28" w:author="Wu, Leihong" w:date="2026-08-28T11:21:00Z"/>
+          <w:trHeight w:val="432"/>
+          <w:ins w:id="52" w:author="Wu, Leihong" w:date="2026-08-28T11:21:00Z"/>
         </w:trPr>
         <w:tc>
           <w:tcPr>
@@ -1689,15 +1825,15 @@
             <w:pPr>
               <w:spacing w:after="160" w:line="278" w:lineRule="auto"/>
               <w:rPr>
-                <w:ins w:id="29" w:author="Wu, Leihong" w:date="2026-08-28T11:21:00Z"/>
-              </w:rPr>
-            </w:pPr>
-            <w:ins w:id="30" w:author="Wu, Leihong" w:date="2026-08-28T11:22:00Z" w16du:dateUtc="2026-08-28T16:22:00Z">
+                <w:ins w:id="53" w:author="Wu, Leihong" w:date="2026-08-28T11:21:00Z"/>
+              </w:rPr>
+            </w:pPr>
+            <w:ins w:id="54" w:author="Wu, Leihong" w:date="2026-08-28T11:22:00Z" w16du:dateUtc="2026-08-28T16:22:00Z">
               <w:r>
                 <w:t>#R</w:t>
               </w:r>
             </w:ins>
-            <w:ins w:id="31" w:author="Wu, Leihong" w:date="2026-08-28T11:21:00Z">
+            <w:ins w:id="55" w:author="Wu, Leihong" w:date="2026-08-28T11:21:00Z">
               <w:r>
                 <w:t>eports</w:t>
               </w:r>
@@ -1714,10 +1850,10 @@
               <w:spacing w:after="160" w:line="278" w:lineRule="auto"/>
               <w:cnfStyle w:val="000000100000" w:firstRow="0" w:lastRow="0" w:firstColumn="0" w:lastColumn="0" w:oddVBand="0" w:evenVBand="0" w:oddHBand="1" w:evenHBand="0" w:firstRowFirstColumn="0" w:firstRowLastColumn="0" w:lastRowFirstColumn="0" w:lastRowLastColumn="0"/>
               <w:rPr>
-                <w:ins w:id="32" w:author="Wu, Leihong" w:date="2026-08-28T11:21:00Z"/>
-              </w:rPr>
-            </w:pPr>
-            <w:ins w:id="33" w:author="Wu, Leihong" w:date="2026-08-28T11:21:00Z">
+                <w:ins w:id="56" w:author="Wu, Leihong" w:date="2026-08-28T11:21:00Z"/>
+              </w:rPr>
+            </w:pPr>
+            <w:ins w:id="57" w:author="Wu, Leihong" w:date="2026-08-28T11:21:00Z">
               <w:r>
                 <w:t>829</w:t>
               </w:r>
@@ -1734,10 +1870,10 @@
               <w:spacing w:after="160" w:line="278" w:lineRule="auto"/>
               <w:cnfStyle w:val="000000100000" w:firstRow="0" w:lastRow="0" w:firstColumn="0" w:lastColumn="0" w:oddVBand="0" w:evenVBand="0" w:oddHBand="1" w:evenHBand="0" w:firstRowFirstColumn="0" w:firstRowLastColumn="0" w:lastRowFirstColumn="0" w:lastRowLastColumn="0"/>
               <w:rPr>
-                <w:ins w:id="34" w:author="Wu, Leihong" w:date="2026-08-28T11:21:00Z"/>
-              </w:rPr>
-            </w:pPr>
-            <w:ins w:id="35" w:author="Wu, Leihong" w:date="2026-08-28T11:21:00Z">
+                <w:ins w:id="58" w:author="Wu, Leihong" w:date="2026-08-28T11:21:00Z"/>
+              </w:rPr>
+            </w:pPr>
+            <w:ins w:id="59" w:author="Wu, Leihong" w:date="2026-08-28T11:21:00Z">
               <w:r>
                 <w:t>1,000</w:t>
               </w:r>
@@ -1747,7 +1883,8 @@
       </w:tr>
       <w:tr>
         <w:trPr>
-          <w:ins w:id="36" w:author="Wu, Leihong" w:date="2026-08-28T11:21:00Z"/>
+          <w:trHeight w:val="432"/>
+          <w:ins w:id="60" w:author="Wu, Leihong" w:date="2026-08-28T11:21:00Z"/>
         </w:trPr>
         <w:tc>
           <w:tcPr>
@@ -1759,10 +1896,10 @@
             <w:pPr>
               <w:spacing w:after="160" w:line="278" w:lineRule="auto"/>
               <w:rPr>
-                <w:ins w:id="37" w:author="Wu, Leihong" w:date="2026-08-28T11:21:00Z"/>
-              </w:rPr>
-            </w:pPr>
-            <w:ins w:id="38" w:author="Wu, Leihong" w:date="2026-08-28T11:21:00Z">
+                <w:ins w:id="61" w:author="Wu, Leihong" w:date="2026-08-28T11:21:00Z"/>
+              </w:rPr>
+            </w:pPr>
+            <w:ins w:id="62" w:author="Wu, Leihong" w:date="2026-08-28T11:21:00Z">
               <w:r>
                 <w:t>Total tokens</w:t>
               </w:r>
@@ -1779,10 +1916,10 @@
               <w:spacing w:after="160" w:line="278" w:lineRule="auto"/>
               <w:cnfStyle w:val="000000000000" w:firstRow="0" w:lastRow="0" w:firstColumn="0" w:lastColumn="0" w:oddVBand="0" w:evenVBand="0" w:oddHBand="0" w:evenHBand="0" w:firstRowFirstColumn="0" w:firstRowLastColumn="0" w:lastRowFirstColumn="0" w:lastRowLastColumn="0"/>
               <w:rPr>
-                <w:ins w:id="39" w:author="Wu, Leihong" w:date="2026-08-28T11:21:00Z"/>
-              </w:rPr>
-            </w:pPr>
-            <w:ins w:id="40" w:author="Wu, Leihong" w:date="2026-08-28T11:21:00Z">
+                <w:ins w:id="63" w:author="Wu, Leihong" w:date="2026-08-28T11:21:00Z"/>
+              </w:rPr>
+            </w:pPr>
+            <w:ins w:id="64" w:author="Wu, Leihong" w:date="2026-08-28T11:21:00Z">
               <w:r>
                 <w:t>414,576</w:t>
               </w:r>
@@ -1799,10 +1936,10 @@
               <w:spacing w:after="160" w:line="278" w:lineRule="auto"/>
               <w:cnfStyle w:val="000000000000" w:firstRow="0" w:lastRow="0" w:firstColumn="0" w:lastColumn="0" w:oddVBand="0" w:evenVBand="0" w:oddHBand="0" w:evenHBand="0" w:firstRowFirstColumn="0" w:firstRowLastColumn="0" w:lastRowFirstColumn="0" w:lastRowLastColumn="0"/>
               <w:rPr>
-                <w:ins w:id="41" w:author="Wu, Leihong" w:date="2026-08-28T11:21:00Z"/>
-              </w:rPr>
-            </w:pPr>
-            <w:ins w:id="42" w:author="Wu, Leihong" w:date="2026-08-28T11:21:00Z">
+                <w:ins w:id="65" w:author="Wu, Leihong" w:date="2026-08-28T11:21:00Z"/>
+              </w:rPr>
+            </w:pPr>
+            <w:ins w:id="66" w:author="Wu, Leihong" w:date="2026-08-28T11:21:00Z">
               <w:r>
                 <w:t>439,681</w:t>
               </w:r>
@@ -1813,7 +1950,8 @@
       <w:tr>
         <w:trPr>
           <w:cnfStyle w:val="000000100000" w:firstRow="0" w:lastRow="0" w:firstColumn="0" w:lastColumn="0" w:oddVBand="0" w:evenVBand="0" w:oddHBand="1" w:evenHBand="0" w:firstRowFirstColumn="0" w:firstRowLastColumn="0" w:lastRowFirstColumn="0" w:lastRowLastColumn="0"/>
-          <w:ins w:id="43" w:author="Wu, Leihong" w:date="2026-08-28T11:21:00Z"/>
+          <w:trHeight w:val="432"/>
+          <w:ins w:id="67" w:author="Wu, Leihong" w:date="2026-08-28T11:21:00Z"/>
         </w:trPr>
         <w:tc>
           <w:tcPr>
@@ -1825,10 +1963,10 @@
             <w:pPr>
               <w:spacing w:after="160" w:line="278" w:lineRule="auto"/>
               <w:rPr>
-                <w:ins w:id="44" w:author="Wu, Leihong" w:date="2026-08-28T11:21:00Z"/>
-              </w:rPr>
-            </w:pPr>
-            <w:ins w:id="45" w:author="Wu, Leihong" w:date="2026-08-28T11:21:00Z">
+                <w:ins w:id="68" w:author="Wu, Leihong" w:date="2026-08-28T11:21:00Z"/>
+              </w:rPr>
+            </w:pPr>
+            <w:ins w:id="69" w:author="Wu, Leihong" w:date="2026-08-28T11:21:00Z">
               <w:r>
                 <w:t>Total sentences</w:t>
               </w:r>
@@ -1845,10 +1983,10 @@
               <w:spacing w:after="160" w:line="278" w:lineRule="auto"/>
               <w:cnfStyle w:val="000000100000" w:firstRow="0" w:lastRow="0" w:firstColumn="0" w:lastColumn="0" w:oddVBand="0" w:evenVBand="0" w:oddHBand="1" w:evenHBand="0" w:firstRowFirstColumn="0" w:firstRowLastColumn="0" w:lastRowFirstColumn="0" w:lastRowLastColumn="0"/>
               <w:rPr>
-                <w:ins w:id="46" w:author="Wu, Leihong" w:date="2026-08-28T11:21:00Z"/>
-              </w:rPr>
-            </w:pPr>
-            <w:ins w:id="47" w:author="Wu, Leihong" w:date="2026-08-28T11:21:00Z">
+                <w:ins w:id="70" w:author="Wu, Leihong" w:date="2026-08-28T11:21:00Z"/>
+              </w:rPr>
+            </w:pPr>
+            <w:ins w:id="71" w:author="Wu, Leihong" w:date="2026-08-28T11:21:00Z">
               <w:r>
                 <w:t>17,766</w:t>
               </w:r>
@@ -1865,10 +2003,10 @@
               <w:spacing w:after="160" w:line="278" w:lineRule="auto"/>
               <w:cnfStyle w:val="000000100000" w:firstRow="0" w:lastRow="0" w:firstColumn="0" w:lastColumn="0" w:oddVBand="0" w:evenVBand="0" w:oddHBand="1" w:evenHBand="0" w:firstRowFirstColumn="0" w:firstRowLastColumn="0" w:lastRowFirstColumn="0" w:lastRowLastColumn="0"/>
               <w:rPr>
-                <w:ins w:id="48" w:author="Wu, Leihong" w:date="2026-08-28T11:21:00Z"/>
-              </w:rPr>
-            </w:pPr>
-            <w:ins w:id="49" w:author="Wu, Leihong" w:date="2026-08-28T11:21:00Z">
+                <w:ins w:id="72" w:author="Wu, Leihong" w:date="2026-08-28T11:21:00Z"/>
+              </w:rPr>
+            </w:pPr>
+            <w:ins w:id="73" w:author="Wu, Leihong" w:date="2026-08-28T11:21:00Z">
               <w:r>
                 <w:t>22,043</w:t>
               </w:r>
@@ -1878,7 +2016,8 @@
       </w:tr>
       <w:tr>
         <w:trPr>
-          <w:ins w:id="50" w:author="Wu, Leihong" w:date="2026-08-28T11:21:00Z"/>
+          <w:trHeight w:val="432"/>
+          <w:ins w:id="74" w:author="Wu, Leihong" w:date="2026-08-28T11:21:00Z"/>
         </w:trPr>
         <w:tc>
           <w:tcPr>
@@ -1890,20 +2029,20 @@
             <w:pPr>
               <w:spacing w:after="160" w:line="278" w:lineRule="auto"/>
               <w:rPr>
-                <w:ins w:id="51" w:author="Wu, Leihong" w:date="2026-08-28T11:21:00Z"/>
-              </w:rPr>
-            </w:pPr>
-            <w:ins w:id="52" w:author="Wu, Leihong" w:date="2026-08-28T11:21:00Z">
+                <w:ins w:id="75" w:author="Wu, Leihong" w:date="2026-08-28T11:21:00Z"/>
+              </w:rPr>
+            </w:pPr>
+            <w:ins w:id="76" w:author="Wu, Leihong" w:date="2026-08-28T11:21:00Z">
               <w:r>
                 <w:t xml:space="preserve">Avg tokens per </w:t>
               </w:r>
             </w:ins>
-            <w:ins w:id="53" w:author="Wu, Leihong" w:date="2026-08-28T11:24:00Z" w16du:dateUtc="2026-08-28T16:24:00Z">
+            <w:ins w:id="77" w:author="Wu, Leihong" w:date="2026-08-28T11:24:00Z" w16du:dateUtc="2026-08-28T16:24:00Z">
               <w:r>
                 <w:t>report</w:t>
               </w:r>
             </w:ins>
-            <w:ins w:id="54" w:author="Wu, Leihong" w:date="2026-08-28T11:21:00Z">
+            <w:ins w:id="78" w:author="Wu, Leihong" w:date="2026-08-28T11:21:00Z">
               <w:r>
                 <w:t xml:space="preserve"> </w:t>
               </w:r>
@@ -1920,10 +2059,10 @@
               <w:spacing w:after="160" w:line="278" w:lineRule="auto"/>
               <w:cnfStyle w:val="000000000000" w:firstRow="0" w:lastRow="0" w:firstColumn="0" w:lastColumn="0" w:oddVBand="0" w:evenVBand="0" w:oddHBand="0" w:evenHBand="0" w:firstRowFirstColumn="0" w:firstRowLastColumn="0" w:lastRowFirstColumn="0" w:lastRowLastColumn="0"/>
               <w:rPr>
-                <w:ins w:id="55" w:author="Wu, Leihong" w:date="2026-08-28T11:21:00Z"/>
-              </w:rPr>
-            </w:pPr>
-            <w:ins w:id="56" w:author="Wu, Leihong" w:date="2026-08-28T11:21:00Z">
+                <w:ins w:id="79" w:author="Wu, Leihong" w:date="2026-08-28T11:21:00Z"/>
+              </w:rPr>
+            </w:pPr>
+            <w:ins w:id="80" w:author="Wu, Leihong" w:date="2026-08-28T11:21:00Z">
               <w:r>
                 <w:t>500.1 ± 254.6</w:t>
               </w:r>
@@ -1940,10 +2079,10 @@
               <w:spacing w:after="160" w:line="278" w:lineRule="auto"/>
               <w:cnfStyle w:val="000000000000" w:firstRow="0" w:lastRow="0" w:firstColumn="0" w:lastColumn="0" w:oddVBand="0" w:evenVBand="0" w:oddHBand="0" w:evenHBand="0" w:firstRowFirstColumn="0" w:firstRowLastColumn="0" w:lastRowFirstColumn="0" w:lastRowLastColumn="0"/>
               <w:rPr>
-                <w:ins w:id="57" w:author="Wu, Leihong" w:date="2026-08-28T11:21:00Z"/>
-              </w:rPr>
-            </w:pPr>
-            <w:ins w:id="58" w:author="Wu, Leihong" w:date="2026-08-28T11:21:00Z">
+                <w:ins w:id="81" w:author="Wu, Leihong" w:date="2026-08-28T11:21:00Z"/>
+              </w:rPr>
+            </w:pPr>
+            <w:ins w:id="82" w:author="Wu, Leihong" w:date="2026-08-28T11:21:00Z">
               <w:r>
                 <w:t>439.7 ± 143.0</w:t>
               </w:r>
@@ -1954,7 +2093,8 @@
       <w:tr>
         <w:trPr>
           <w:cnfStyle w:val="000000100000" w:firstRow="0" w:lastRow="0" w:firstColumn="0" w:lastColumn="0" w:oddVBand="0" w:evenVBand="0" w:oddHBand="1" w:evenHBand="0" w:firstRowFirstColumn="0" w:firstRowLastColumn="0" w:lastRowFirstColumn="0" w:lastRowLastColumn="0"/>
-          <w:ins w:id="59" w:author="Wu, Leihong" w:date="2026-08-28T11:21:00Z"/>
+          <w:trHeight w:val="432"/>
+          <w:ins w:id="83" w:author="Wu, Leihong" w:date="2026-08-28T11:21:00Z"/>
         </w:trPr>
         <w:tc>
           <w:tcPr>
@@ -1966,15 +2106,15 @@
             <w:pPr>
               <w:spacing w:after="160" w:line="278" w:lineRule="auto"/>
               <w:rPr>
-                <w:ins w:id="60" w:author="Wu, Leihong" w:date="2026-08-28T11:21:00Z"/>
-              </w:rPr>
-            </w:pPr>
-            <w:ins w:id="61" w:author="Wu, Leihong" w:date="2026-08-28T11:21:00Z">
+                <w:ins w:id="84" w:author="Wu, Leihong" w:date="2026-08-28T11:21:00Z"/>
+              </w:rPr>
+            </w:pPr>
+            <w:ins w:id="85" w:author="Wu, Leihong" w:date="2026-08-28T11:21:00Z">
               <w:r>
                 <w:t xml:space="preserve">Median tokens per </w:t>
               </w:r>
             </w:ins>
-            <w:ins w:id="62" w:author="Wu, Leihong" w:date="2026-08-28T11:24:00Z" w16du:dateUtc="2026-08-28T16:24:00Z">
+            <w:ins w:id="86" w:author="Wu, Leihong" w:date="2026-08-28T11:24:00Z" w16du:dateUtc="2026-08-28T16:24:00Z">
               <w:r>
                 <w:t>report</w:t>
               </w:r>
@@ -1991,10 +2131,10 @@
               <w:spacing w:after="160" w:line="278" w:lineRule="auto"/>
               <w:cnfStyle w:val="000000100000" w:firstRow="0" w:lastRow="0" w:firstColumn="0" w:lastColumn="0" w:oddVBand="0" w:evenVBand="0" w:oddHBand="1" w:evenHBand="0" w:firstRowFirstColumn="0" w:firstRowLastColumn="0" w:lastRowFirstColumn="0" w:lastRowLastColumn="0"/>
               <w:rPr>
-                <w:ins w:id="63" w:author="Wu, Leihong" w:date="2026-08-28T11:21:00Z"/>
-              </w:rPr>
-            </w:pPr>
-            <w:ins w:id="64" w:author="Wu, Leihong" w:date="2026-08-28T11:21:00Z">
+                <w:ins w:id="87" w:author="Wu, Leihong" w:date="2026-08-28T11:21:00Z"/>
+              </w:rPr>
+            </w:pPr>
+            <w:ins w:id="88" w:author="Wu, Leihong" w:date="2026-08-28T11:21:00Z">
               <w:r>
                 <w:t>476</w:t>
               </w:r>
@@ -2011,10 +2151,10 @@
               <w:spacing w:after="160" w:line="278" w:lineRule="auto"/>
               <w:cnfStyle w:val="000000100000" w:firstRow="0" w:lastRow="0" w:firstColumn="0" w:lastColumn="0" w:oddVBand="0" w:evenVBand="0" w:oddHBand="1" w:evenHBand="0" w:firstRowFirstColumn="0" w:firstRowLastColumn="0" w:lastRowFirstColumn="0" w:lastRowLastColumn="0"/>
               <w:rPr>
-                <w:ins w:id="65" w:author="Wu, Leihong" w:date="2026-08-28T11:21:00Z"/>
-              </w:rPr>
-            </w:pPr>
-            <w:ins w:id="66" w:author="Wu, Leihong" w:date="2026-08-28T11:21:00Z">
+                <w:ins w:id="89" w:author="Wu, Leihong" w:date="2026-08-28T11:21:00Z"/>
+              </w:rPr>
+            </w:pPr>
+            <w:ins w:id="90" w:author="Wu, Leihong" w:date="2026-08-28T11:21:00Z">
               <w:r>
                 <w:t>395</w:t>
               </w:r>
@@ -2022,6 +2162,200 @@
           </w:p>
         </w:tc>
       </w:tr>
+      <w:tr>
+        <w:trPr>
+          <w:trHeight w:val="432"/>
+          <w:ins w:id="91" w:author="Wu, Leihong" w:date="2026-08-31T09:05:00Z" w16du:dateUtc="2026-08-31T14:05:00Z"/>
+        </w:trPr>
+        <w:tc>
+          <w:tcPr>
+            <w:cnfStyle w:val="001000000000" w:firstRow="0" w:lastRow="0" w:firstColumn="1" w:lastColumn="0" w:oddVBand="0" w:evenVBand="0" w:oddHBand="0" w:evenHBand="0" w:firstRowFirstColumn="0" w:firstRowLastColumn="0" w:lastRowFirstColumn="0" w:lastRowLastColumn="0"/>
+            <w:tcW w:w="0" w:type="auto"/>
+          </w:tcPr>
+          <w:p>
+            <w:pPr>
+              <w:rPr>
+                <w:ins w:id="92" w:author="Wu, Leihong" w:date="2026-08-31T09:05:00Z" w16du:dateUtc="2026-08-31T14:05:00Z"/>
+              </w:rPr>
+            </w:pPr>
+            <w:ins w:id="93" w:author="Wu, Leihong" w:date="2026-08-31T09:05:00Z" w16du:dateUtc="2026-08-31T14:05:00Z">
+              <w:r>
+                <w:t>SME</w:t>
+              </w:r>
+              <w:r>
+                <w:t xml:space="preserve"> annotations</w:t>
+              </w:r>
+            </w:ins>
+          </w:p>
+        </w:tc>
+        <w:tc>
+          <w:tcPr>
+            <w:tcW w:w="2276" w:type="dxa"/>
+          </w:tcPr>
+          <w:p>
+            <w:pPr>
+              <w:cnfStyle w:val="000000000000" w:firstRow="0" w:lastRow="0" w:firstColumn="0" w:lastColumn="0" w:oddVBand="0" w:evenVBand="0" w:oddHBand="0" w:evenHBand="0" w:firstRowFirstColumn="0" w:firstRowLastColumn="0" w:lastRowFirstColumn="0" w:lastRowLastColumn="0"/>
+              <w:rPr>
+                <w:ins w:id="94" w:author="Wu, Leihong" w:date="2026-08-31T09:05:00Z" w16du:dateUtc="2026-08-31T14:05:00Z"/>
+              </w:rPr>
+            </w:pPr>
+            <w:ins w:id="95" w:author="Wu, Leihong" w:date="2026-08-31T09:05:00Z" w16du:dateUtc="2026-08-31T14:05:00Z">
+              <w:r>
+                <w:t>36,425</w:t>
+              </w:r>
+            </w:ins>
+          </w:p>
+        </w:tc>
+        <w:tc>
+          <w:tcPr>
+            <w:tcW w:w="2835" w:type="dxa"/>
+          </w:tcPr>
+          <w:p>
+            <w:pPr>
+              <w:cnfStyle w:val="000000000000" w:firstRow="0" w:lastRow="0" w:firstColumn="0" w:lastColumn="0" w:oddVBand="0" w:evenVBand="0" w:oddHBand="0" w:evenHBand="0" w:firstRowFirstColumn="0" w:firstRowLastColumn="0" w:lastRowFirstColumn="0" w:lastRowLastColumn="0"/>
+              <w:rPr>
+                <w:ins w:id="96" w:author="Wu, Leihong" w:date="2026-08-31T09:05:00Z" w16du:dateUtc="2026-08-31T14:05:00Z"/>
+              </w:rPr>
+            </w:pPr>
+            <w:ins w:id="97" w:author="Wu, Leihong" w:date="2026-08-31T09:05:00Z" w16du:dateUtc="2026-08-31T14:05:00Z">
+              <w:r>
+                <w:t>40,711</w:t>
+              </w:r>
+            </w:ins>
+          </w:p>
+        </w:tc>
+      </w:tr>
+      <w:tr>
+        <w:trPr>
+          <w:cnfStyle w:val="000000100000" w:firstRow="0" w:lastRow="0" w:firstColumn="0" w:lastColumn="0" w:oddVBand="0" w:evenVBand="0" w:oddHBand="1" w:evenHBand="0" w:firstRowFirstColumn="0" w:firstRowLastColumn="0" w:lastRowFirstColumn="0" w:lastRowLastColumn="0"/>
+          <w:trHeight w:val="432"/>
+          <w:ins w:id="98" w:author="Wu, Leihong" w:date="2026-08-31T09:05:00Z" w16du:dateUtc="2026-08-31T14:05:00Z"/>
+        </w:trPr>
+        <w:tc>
+          <w:tcPr>
+            <w:cnfStyle w:val="001000000000" w:firstRow="0" w:lastRow="0" w:firstColumn="1" w:lastColumn="0" w:oddVBand="0" w:evenVBand="0" w:oddHBand="0" w:evenHBand="0" w:firstRowFirstColumn="0" w:firstRowLastColumn="0" w:lastRowFirstColumn="0" w:lastRowLastColumn="0"/>
+            <w:tcW w:w="0" w:type="auto"/>
+          </w:tcPr>
+          <w:p>
+            <w:pPr>
+              <w:rPr>
+                <w:ins w:id="99" w:author="Wu, Leihong" w:date="2026-08-31T09:05:00Z" w16du:dateUtc="2026-08-31T14:05:00Z"/>
+              </w:rPr>
+            </w:pPr>
+            <w:ins w:id="100" w:author="Wu, Leihong" w:date="2026-08-31T09:06:00Z" w16du:dateUtc="2026-08-31T14:06:00Z">
+              <w:r>
+                <w:t>Unique AE terms</w:t>
+              </w:r>
+            </w:ins>
+          </w:p>
+        </w:tc>
+        <w:tc>
+          <w:tcPr>
+            <w:tcW w:w="2276" w:type="dxa"/>
+          </w:tcPr>
+          <w:p>
+            <w:pPr>
+              <w:cnfStyle w:val="000000100000" w:firstRow="0" w:lastRow="0" w:firstColumn="0" w:lastColumn="0" w:oddVBand="0" w:evenVBand="0" w:oddHBand="1" w:evenHBand="0" w:firstRowFirstColumn="0" w:firstRowLastColumn="0" w:lastRowFirstColumn="0" w:lastRowLastColumn="0"/>
+              <w:rPr>
+                <w:ins w:id="101" w:author="Wu, Leihong" w:date="2026-08-31T09:05:00Z" w16du:dateUtc="2026-08-31T14:05:00Z"/>
+              </w:rPr>
+            </w:pPr>
+            <w:ins w:id="102" w:author="Wu, Leihong" w:date="2026-08-31T09:06:00Z" w16du:dateUtc="2026-08-31T14:06:00Z">
+              <w:r>
+                <w:t>3,991</w:t>
+              </w:r>
+            </w:ins>
+          </w:p>
+        </w:tc>
+        <w:tc>
+          <w:tcPr>
+            <w:tcW w:w="2835" w:type="dxa"/>
+          </w:tcPr>
+          <w:p>
+            <w:pPr>
+              <w:cnfStyle w:val="000000100000" w:firstRow="0" w:lastRow="0" w:firstColumn="0" w:lastColumn="0" w:oddVBand="0" w:evenVBand="0" w:oddHBand="1" w:evenHBand="0" w:firstRowFirstColumn="0" w:firstRowLastColumn="0" w:lastRowFirstColumn="0" w:lastRowLastColumn="0"/>
+              <w:rPr>
+                <w:ins w:id="103" w:author="Wu, Leihong" w:date="2026-08-31T09:05:00Z" w16du:dateUtc="2026-08-31T14:05:00Z"/>
+              </w:rPr>
+            </w:pPr>
+            <w:ins w:id="104" w:author="Wu, Leihong" w:date="2026-08-31T09:06:00Z" w16du:dateUtc="2026-08-31T14:06:00Z">
+              <w:r>
+                <w:t>13,819</w:t>
+              </w:r>
+            </w:ins>
+          </w:p>
+        </w:tc>
+      </w:tr>
+      <w:tr>
+        <w:trPr>
+          <w:trHeight w:val="432"/>
+          <w:ins w:id="105" w:author="Wu, Leihong" w:date="2026-08-31T09:05:00Z" w16du:dateUtc="2026-08-31T14:05:00Z"/>
+        </w:trPr>
+        <w:tc>
+          <w:tcPr>
+            <w:cnfStyle w:val="001000000000" w:firstRow="0" w:lastRow="0" w:firstColumn="1" w:lastColumn="0" w:oddVBand="0" w:evenVBand="0" w:oddHBand="0" w:evenHBand="0" w:firstRowFirstColumn="0" w:firstRowLastColumn="0" w:lastRowFirstColumn="0" w:lastRowLastColumn="0"/>
+            <w:tcW w:w="0" w:type="auto"/>
+          </w:tcPr>
+          <w:p>
+            <w:pPr>
+              <w:rPr>
+                <w:ins w:id="106" w:author="Wu, Leihong" w:date="2026-08-31T09:05:00Z" w16du:dateUtc="2026-08-31T14:05:00Z"/>
+              </w:rPr>
+            </w:pPr>
+            <w:ins w:id="107" w:author="Wu, Leihong" w:date="2026-08-31T09:06:00Z" w16du:dateUtc="2026-08-31T14:06:00Z">
+              <w:r>
+                <w:t>Unique Drug</w:t>
+              </w:r>
+            </w:ins>
+            <w:ins w:id="108" w:author="Wu, Leihong" w:date="2026-08-31T09:07:00Z" w16du:dateUtc="2026-08-31T14:07:00Z">
+              <w:r>
+                <w:t xml:space="preserve">/Vaccine </w:t>
+              </w:r>
+            </w:ins>
+            <w:ins w:id="109" w:author="Wu, Leihong" w:date="2026-08-31T09:06:00Z" w16du:dateUtc="2026-08-31T14:06:00Z">
+              <w:r>
+                <w:t>terms</w:t>
+              </w:r>
+            </w:ins>
+          </w:p>
+        </w:tc>
+        <w:tc>
+          <w:tcPr>
+            <w:tcW w:w="2276" w:type="dxa"/>
+          </w:tcPr>
+          <w:p>
+            <w:pPr>
+              <w:cnfStyle w:val="000000000000" w:firstRow="0" w:lastRow="0" w:firstColumn="0" w:lastColumn="0" w:oddVBand="0" w:evenVBand="0" w:oddHBand="0" w:evenHBand="0" w:firstRowFirstColumn="0" w:firstRowLastColumn="0" w:lastRowFirstColumn="0" w:lastRowLastColumn="0"/>
+              <w:rPr>
+                <w:ins w:id="110" w:author="Wu, Leihong" w:date="2026-08-31T09:05:00Z" w16du:dateUtc="2026-08-31T14:05:00Z"/>
+              </w:rPr>
+            </w:pPr>
+            <w:ins w:id="111" w:author="Wu, Leihong" w:date="2026-08-31T09:06:00Z" w16du:dateUtc="2026-08-31T14:06:00Z">
+              <w:r>
+                <w:t>2,085</w:t>
+              </w:r>
+            </w:ins>
+          </w:p>
+        </w:tc>
+        <w:tc>
+          <w:tcPr>
+            <w:tcW w:w="2835" w:type="dxa"/>
+          </w:tcPr>
+          <w:p>
+            <w:pPr>
+              <w:cnfStyle w:val="000000000000" w:firstRow="0" w:lastRow="0" w:firstColumn="0" w:lastColumn="0" w:oddVBand="0" w:evenVBand="0" w:oddHBand="0" w:evenHBand="0" w:firstRowFirstColumn="0" w:firstRowLastColumn="0" w:lastRowFirstColumn="0" w:lastRowLastColumn="0"/>
+              <w:rPr>
+                <w:ins w:id="112" w:author="Wu, Leihong" w:date="2026-08-31T09:05:00Z" w16du:dateUtc="2026-08-31T14:05:00Z"/>
+              </w:rPr>
+            </w:pPr>
+            <w:ins w:id="113" w:author="Wu, Leihong" w:date="2026-08-31T09:06:00Z" w16du:dateUtc="2026-08-31T14:06:00Z">
+              <w:r>
+                <w:t>863</w:t>
+              </w:r>
+            </w:ins>
+          </w:p>
+        </w:tc>
+      </w:tr>
     </w:tbl>
     <w:p/>
     <w:p>
@@ -2043,12 +2377,12 @@
       <w:r>
         <w:t xml:space="preserve"> </w:t>
       </w:r>
-      <w:del w:id="67" w:author="Wu, Leihong" w:date="2026-08-28T11:28:00Z" w16du:dateUtc="2026-08-28T16:28:00Z">
+      <w:del w:id="114" w:author="Wu, Leihong" w:date="2026-08-28T11:28:00Z" w16du:dateUtc="2026-08-28T16:28:00Z">
         <w:r>
           <w:delText>FAERS reports</w:delText>
         </w:r>
       </w:del>
-      <w:ins w:id="68" w:author="Wu, Leihong" w:date="2026-08-28T11:28:00Z" w16du:dateUtc="2026-08-28T16:28:00Z">
+      <w:ins w:id="115" w:author="Wu, Leihong" w:date="2026-08-28T11:28:00Z" w16du:dateUtc="2026-08-28T16:28:00Z">
         <w:r>
           <w:t>ICSRs</w:t>
         </w:r>
@@ -2116,7 +2450,7 @@
       <w:r>
         <w:t xml:space="preserve"> </w:t>
       </w:r>
-      <w:ins w:id="69" w:author="Wu, Leihong" w:date="2026-08-28T11:28:00Z" w16du:dateUtc="2026-08-28T16:28:00Z">
+      <w:ins w:id="116" w:author="Wu, Leihong" w:date="2026-08-28T11:28:00Z" w16du:dateUtc="2026-08-28T16:28:00Z">
         <w:r>
           <w:t xml:space="preserve">These </w:t>
         </w:r>
@@ -2124,12 +2458,12 @@
           <w:t xml:space="preserve">829 </w:t>
         </w:r>
       </w:ins>
-      <w:ins w:id="70" w:author="Wu, Leihong" w:date="2026-08-28T11:29:00Z" w16du:dateUtc="2026-08-28T16:29:00Z">
+      <w:ins w:id="117" w:author="Wu, Leihong" w:date="2026-08-28T11:29:00Z" w16du:dateUtc="2026-08-28T16:29:00Z">
         <w:r>
           <w:t>ICSRs</w:t>
         </w:r>
       </w:ins>
-      <w:ins w:id="71" w:author="Wu, Leihong" w:date="2026-08-28T11:28:00Z" w16du:dateUtc="2026-08-28T16:28:00Z">
+      <w:ins w:id="118" w:author="Wu, Leihong" w:date="2026-08-28T11:28:00Z" w16du:dateUtc="2026-08-28T16:28:00Z">
         <w:r>
           <w:t xml:space="preserve"> </w:t>
         </w:r>
@@ -2137,17 +2471,17 @@
           <w:t>involv</w:t>
         </w:r>
       </w:ins>
-      <w:ins w:id="72" w:author="Wu, Leihong" w:date="2026-08-28T11:29:00Z" w16du:dateUtc="2026-08-28T16:29:00Z">
+      <w:ins w:id="119" w:author="Wu, Leihong" w:date="2026-08-28T11:29:00Z" w16du:dateUtc="2026-08-28T16:29:00Z">
         <w:r>
           <w:t>ed</w:t>
         </w:r>
       </w:ins>
-      <w:ins w:id="73" w:author="Wu, Leihong" w:date="2026-08-28T11:28:00Z" w16du:dateUtc="2026-08-28T16:28:00Z">
+      <w:ins w:id="120" w:author="Wu, Leihong" w:date="2026-08-28T11:28:00Z" w16du:dateUtc="2026-08-28T16:28:00Z">
         <w:r>
           <w:t xml:space="preserve"> four drug–adverse event pairs: Azacitidine–QT prolongation, Tramadol–hypoglycemia, Baricitinib–hypersensitivity, and Erenumab–stroke.</w:t>
         </w:r>
       </w:ins>
-      <w:ins w:id="74" w:author="Wu, Leihong" w:date="2026-08-28T11:29:00Z" w16du:dateUtc="2026-08-28T16:29:00Z">
+      <w:ins w:id="121" w:author="Wu, Leihong" w:date="2026-08-28T11:29:00Z" w16du:dateUtc="2026-08-28T16:29:00Z">
         <w:r>
           <w:t xml:space="preserve"> </w:t>
         </w:r>
@@ -2168,7 +2502,15 @@
         <w:t>manually annotated</w:t>
       </w:r>
       <w:r>
-        <w:t xml:space="preserve"> this dataset in this study. (see </w:t>
+        <w:t xml:space="preserve"> this dataset in this study</w:t>
+      </w:r>
+      <w:del w:id="122" w:author="Wu, Leihong" w:date="2026-08-31T09:08:00Z" w16du:dateUtc="2026-08-31T14:08:00Z">
+        <w:r>
+          <w:delText>.</w:delText>
+        </w:r>
+      </w:del>
+      <w:r>
+        <w:t xml:space="preserve"> (see </w:t>
       </w:r>
       <w:r>
         <w:t>2.2</w:t>
@@ -2176,6 +2518,41 @@
       <w:r>
         <w:t>)</w:t>
       </w:r>
+      <w:ins w:id="123" w:author="Wu, Leihong" w:date="2026-08-31T09:08:00Z" w16du:dateUtc="2026-08-31T14:08:00Z">
+        <w:r>
+          <w:t xml:space="preserve">. </w:t>
+        </w:r>
+      </w:ins>
+      <w:ins w:id="124" w:author="Wu, Leihong" w:date="2026-08-31T09:08:00Z">
+        <w:r>
+          <w:t xml:space="preserve">Across the FAERS corpus, the expert reference set contained 36,425 annotations, including 3,991 unique AE/symptom </w:t>
+        </w:r>
+      </w:ins>
+      <w:ins w:id="125" w:author="Wu, Leihong" w:date="2026-08-31T09:08:00Z" w16du:dateUtc="2026-08-31T14:08:00Z">
+        <w:r>
+          <w:t>terms</w:t>
+        </w:r>
+      </w:ins>
+      <w:ins w:id="126" w:author="Wu, Leihong" w:date="2026-08-31T09:08:00Z">
+        <w:r>
+          <w:t xml:space="preserve"> and 2,085 unique drug </w:t>
+        </w:r>
+      </w:ins>
+      <w:ins w:id="127" w:author="Wu, Leihong" w:date="2026-08-31T09:08:00Z" w16du:dateUtc="2026-08-31T14:08:00Z">
+        <w:r>
+          <w:t>terms</w:t>
+        </w:r>
+      </w:ins>
+      <w:ins w:id="128" w:author="Wu, Leihong" w:date="2026-08-31T09:08:00Z">
+        <w:r>
+          <w:t xml:space="preserve"> under exact string matching.</w:t>
+        </w:r>
+      </w:ins>
+      <w:ins w:id="129" w:author="Wu, Leihong" w:date="2026-08-31T09:08:00Z" w16du:dateUtc="2026-08-31T14:08:00Z">
+        <w:r>
+          <w:t xml:space="preserve"> </w:t>
+        </w:r>
+      </w:ins>
     </w:p>
     <w:p>
       <w:r>
@@ -2247,6 +2624,71 @@
       <w:r>
         <w:t xml:space="preserve"> with expert-defined guidelines and quality-controlled through adjudicator review.</w:t>
       </w:r>
+      <w:ins w:id="130" w:author="Wu, Leihong" w:date="2026-08-31T09:09:00Z" w16du:dateUtc="2026-08-31T14:09:00Z">
+        <w:r>
+          <w:t xml:space="preserve"> </w:t>
+        </w:r>
+      </w:ins>
+      <w:ins w:id="131" w:author="Wu, Leihong" w:date="2026-08-31T09:09:00Z">
+        <w:r>
+          <w:t>The corpus contains 40,711 reference annotations</w:t>
+        </w:r>
+      </w:ins>
+      <w:ins w:id="132" w:author="Wu, Leihong" w:date="2026-08-31T09:09:00Z" w16du:dateUtc="2026-08-31T14:09:00Z">
+        <w:r>
+          <w:t xml:space="preserve">, </w:t>
+        </w:r>
+      </w:ins>
+      <w:ins w:id="133" w:author="Wu, Leihong" w:date="2026-08-31T09:10:00Z" w16du:dateUtc="2026-08-31T14:10:00Z">
+        <w:r>
+          <w:t xml:space="preserve">with </w:t>
+        </w:r>
+      </w:ins>
+      <w:ins w:id="134" w:author="Wu, Leihong" w:date="2026-08-31T09:09:00Z" w16du:dateUtc="2026-08-31T14:09:00Z">
+        <w:r>
+          <w:t xml:space="preserve">2085 </w:t>
+        </w:r>
+      </w:ins>
+      <w:ins w:id="135" w:author="Wu, Leihong" w:date="2026-08-31T09:10:00Z" w16du:dateUtc="2026-08-31T14:10:00Z">
+        <w:r>
+          <w:t xml:space="preserve">unique </w:t>
+        </w:r>
+      </w:ins>
+      <w:ins w:id="136" w:author="Wu, Leihong" w:date="2026-08-31T09:09:00Z" w16du:dateUtc="2026-08-31T14:09:00Z">
+        <w:r>
+          <w:t>Drug/Vacci</w:t>
+        </w:r>
+      </w:ins>
+      <w:ins w:id="137" w:author="Wu, Leihong" w:date="2026-08-31T09:10:00Z" w16du:dateUtc="2026-08-31T14:10:00Z">
+        <w:r>
+          <w:t xml:space="preserve">ne terms </w:t>
+        </w:r>
+      </w:ins>
+      <w:ins w:id="138" w:author="Wu, Leihong" w:date="2026-08-31T09:09:00Z">
+        <w:r>
+          <w:t xml:space="preserve">and 13,819 unique </w:t>
+        </w:r>
+      </w:ins>
+      <w:ins w:id="139" w:author="Wu, Leihong" w:date="2026-08-31T09:09:00Z" w16du:dateUtc="2026-08-31T14:09:00Z">
+        <w:r>
+          <w:t>AE/</w:t>
+        </w:r>
+      </w:ins>
+      <w:ins w:id="140" w:author="Wu, Leihong" w:date="2026-08-31T09:09:00Z">
+        <w:r>
+          <w:t xml:space="preserve">symptom </w:t>
+        </w:r>
+      </w:ins>
+      <w:ins w:id="141" w:author="Wu, Leihong" w:date="2026-08-31T09:09:00Z" w16du:dateUtc="2026-08-31T14:09:00Z">
+        <w:r>
+          <w:t>terms</w:t>
+        </w:r>
+      </w:ins>
+      <w:ins w:id="142" w:author="Wu, Leihong" w:date="2026-08-31T09:09:00Z">
+        <w:r>
+          <w:t xml:space="preserve"> under exact string matching.</w:t>
+        </w:r>
+      </w:ins>
     </w:p>
     <w:p/>
     <w:p>
@@ -2254,7 +2696,6 @@
         <w:pStyle w:val="Heading2"/>
       </w:pPr>
       <w:r>
-        <w:lastRenderedPageBreak/>
         <w:t>2.2 Human Annotation Protocol</w:t>
       </w:r>
     </w:p>
@@ -2346,7 +2787,6 @@
         <w:rPr>
           <w:noProof/>
         </w:rPr>
-        <w:lastRenderedPageBreak/>
         <w:drawing>
           <wp:inline distT="0" distB="0" distL="0" distR="0" wp14:anchorId="1E1F9ADA" wp14:editId="777B1157">
             <wp:extent cx="5943600" cy="3797935"/>
@@ -2537,12 +2977,12 @@
       <w:r>
         <w:t xml:space="preserve">. The </w:t>
       </w:r>
-      <w:del w:id="75" w:author="Wu, Leihong" w:date="2026-08-28T12:25:00Z" w16du:dateUtc="2026-08-28T17:25:00Z">
+      <w:del w:id="143" w:author="Wu, Leihong" w:date="2026-08-28T12:25:00Z" w16du:dateUtc="2026-08-28T17:25:00Z">
         <w:r>
           <w:delText xml:space="preserve">model </w:delText>
         </w:r>
       </w:del>
-      <w:ins w:id="76" w:author="Wu, Leihong" w:date="2026-08-28T12:25:00Z" w16du:dateUtc="2026-08-28T17:25:00Z">
+      <w:ins w:id="144" w:author="Wu, Leihong" w:date="2026-08-28T12:25:00Z" w16du:dateUtc="2026-08-28T17:25:00Z">
         <w:r>
           <w:rPr>
             <w:i/>
@@ -2568,7 +3008,7 @@
       <w:r>
         <w:t>insert</w:t>
       </w:r>
-      <w:del w:id="77" w:author="Wu, Leihong" w:date="2026-08-28T12:25:00Z" w16du:dateUtc="2026-08-28T17:25:00Z">
+      <w:del w:id="145" w:author="Wu, Leihong" w:date="2026-08-28T12:25:00Z" w16du:dateUtc="2026-08-28T17:25:00Z">
         <w:r>
           <w:delText>s</w:delText>
         </w:r>
@@ -2576,7 +3016,7 @@
       <w:r>
         <w:t xml:space="preserve"> tags around identified entities without altering the surrounding text</w:t>
       </w:r>
-      <w:ins w:id="78" w:author="Wu, Leihong" w:date="2026-08-28T12:25:00Z" w16du:dateUtc="2026-08-28T17:25:00Z">
+      <w:ins w:id="146" w:author="Wu, Leihong" w:date="2026-08-28T12:25:00Z" w16du:dateUtc="2026-08-28T17:25:00Z">
         <w:r>
           <w:t xml:space="preserve"> </w:t>
         </w:r>
@@ -2595,7 +3035,7 @@
         </w:rPr>
         <w:t>Apart from the inserted annotation tags, every character of the original narrative must remain unchanged.</w:t>
       </w:r>
-      <w:ins w:id="79" w:author="Wu, Leihong" w:date="2026-08-28T12:25:00Z" w16du:dateUtc="2026-08-28T17:25:00Z">
+      <w:ins w:id="147" w:author="Wu, Leihong" w:date="2026-08-28T12:25:00Z" w16du:dateUtc="2026-08-28T17:25:00Z">
         <w:r>
           <w:rPr>
             <w:iCs/>
@@ -2613,13 +3053,12 @@
       <w:r>
         <w:t xml:space="preserve"> After annotation, </w:t>
       </w:r>
-      <w:del w:id="80" w:author="Wu, Leihong" w:date="2026-08-28T12:27:00Z" w16du:dateUtc="2026-08-28T17:27:00Z">
-        <w:r>
-          <w:lastRenderedPageBreak/>
+      <w:del w:id="148" w:author="Wu, Leihong" w:date="2026-08-28T12:27:00Z" w16du:dateUtc="2026-08-28T17:27:00Z">
+        <w:r>
           <w:delText>the tagged outputs were mapped back to the original narrative</w:delText>
         </w:r>
       </w:del>
-      <w:ins w:id="81" w:author="Wu, Leihong" w:date="2026-08-28T12:27:00Z" w16du:dateUtc="2026-08-28T17:27:00Z">
+      <w:ins w:id="149" w:author="Wu, Leihong" w:date="2026-08-28T12:27:00Z" w16du:dateUtc="2026-08-28T17:27:00Z">
         <w:r>
           <w:rPr>
             <w:color w:val="7030A0"/>
@@ -2627,7 +3066,7 @@
           <w:t xml:space="preserve">we </w:t>
         </w:r>
       </w:ins>
-      <w:ins w:id="82" w:author="Wu, Leihong" w:date="2026-08-28T12:26:00Z" w16du:dateUtc="2026-08-28T17:26:00Z">
+      <w:ins w:id="150" w:author="Wu, Leihong" w:date="2026-08-28T12:26:00Z" w16du:dateUtc="2026-08-28T17:26:00Z">
         <w:r>
           <w:rPr>
             <w:color w:val="7030A0"/>
@@ -2678,8 +3117,7 @@
       <w:r>
         <w:t xml:space="preserve">to extract accurate character offsets. </w:t>
       </w:r>
-      <w:commentRangeStart w:id="83"/>
-      <w:del w:id="84" w:author="Penny, Brandon *" w:date="2026-08-28T15:35:00Z" w16du:dateUtc="2026-08-28T15:35:24Z">
+      <w:del w:id="151" w:author="Penny, Brandon *" w:date="2026-08-28T15:35:00Z" w16du:dateUtc="2026-08-28T15:35:24Z">
         <w:r>
           <w:delText xml:space="preserve">Besides </w:delText>
         </w:r>
@@ -2738,23 +3176,33 @@
           <w:delText xml:space="preserve"> particularly where</w:delText>
         </w:r>
       </w:del>
-      <w:ins w:id="85" w:author="Penny, Brandon *" w:date="2026-08-28T15:35:00Z" w16du:dateUtc="2026-08-28T15:35:24Z">
+      <w:ins w:id="152" w:author="Penny, Brandon *" w:date="2026-08-28T15:35:00Z" w16du:dateUtc="2026-08-28T15:35:24Z">
         <w:r>
           <w:t xml:space="preserve"> </w:t>
         </w:r>
         <w:r>
-          <w:t>Besides filtering out unsuccessfully tagged items, using in-text annotation plus back mapping as a strategy helped ensure the original narratives were not altered during the annotation process. Unsuccessful tagging and text alterations have both been observed during preliminary studies, particularly where</w:t>
+          <w:t>Besides filtering out unsuccessfully tagged items</w:t>
         </w:r>
       </w:ins>
-      <w:commentRangeEnd w:id="83"/>
-      <w:r>
-        <w:rPr>
-          <w:rStyle w:val="CommentReference"/>
-          <w:sz w:val="24"/>
-          <w:szCs w:val="24"/>
-        </w:rPr>
-        <w:commentReference w:id="83"/>
-      </w:r>
+      <w:ins w:id="153" w:author="Wu, Leihong" w:date="2026-08-31T10:02:00Z" w16du:dateUtc="2026-08-31T15:02:00Z">
+        <w:r>
+          <w:t xml:space="preserve"> (</w:t>
+        </w:r>
+        <w:r>
+          <w:t xml:space="preserve">e.g., mismatched closing tags, unescaped angle brackets, or tags </w:t>
+        </w:r>
+        <w:r>
+          <w:t>did not match pre-defined categories</w:t>
+        </w:r>
+        <w:r>
+          <w:t>)</w:t>
+        </w:r>
+      </w:ins>
+      <w:ins w:id="154" w:author="Penny, Brandon *" w:date="2026-08-28T15:35:00Z" w16du:dateUtc="2026-08-28T15:35:24Z">
+        <w:r>
+          <w:t>, using in-text annotation plus back mapping as a strategy helped ensure the original narratives were not altered during the annotation process. Unsuccessful tagging and text alterations have both been observed during preliminary studies, particularly where</w:t>
+        </w:r>
+      </w:ins>
       <w:r>
         <w:t xml:space="preserve"> </w:t>
       </w:r>
@@ -2849,7 +3297,7 @@
                     </pic:cNvPicPr>
                   </pic:nvPicPr>
                   <pic:blipFill>
-                    <a:blip r:embed="rId16"/>
+                    <a:blip r:embed="rId12"/>
                     <a:stretch>
                       <a:fillRect/>
                     </a:stretch>
@@ -2888,6 +3336,11 @@
     </w:p>
     <w:p/>
     <w:p>
+      <w:pPr>
+        <w:rPr>
+          <w:ins w:id="155" w:author="Wu, Leihong" w:date="2026-08-31T09:12:00Z" w16du:dateUtc="2026-08-31T14:12:00Z"/>
+        </w:rPr>
+      </w:pPr>
       <w:r>
         <w:t xml:space="preserve">Third, BERT-based NER </w:t>
       </w:r>
@@ -2921,42 +3374,80 @@
       <w:r>
         <w:t xml:space="preserve"> </w:t>
       </w:r>
-      <w:r>
-        <w:t>W</w:t>
-      </w:r>
-      <w:r>
-        <w:t xml:space="preserve">e randomly selected 80% of the entire annotated </w:t>
-      </w:r>
-      <w:r>
-        <w:t xml:space="preserve">ICSRs </w:t>
-      </w:r>
-      <w:r>
-        <w:t xml:space="preserve">to train the BERT NER model, where </w:t>
-      </w:r>
-      <w:r>
-        <w:lastRenderedPageBreak/>
-        <w:t xml:space="preserve">the remaining 20% of the annotated </w:t>
-      </w:r>
-      <w:r>
-        <w:t>ICSRs</w:t>
-      </w:r>
-      <w:r>
-        <w:t xml:space="preserve"> </w:t>
-      </w:r>
-      <w:r>
-        <w:t>were</w:t>
-      </w:r>
-      <w:r>
-        <w:t xml:space="preserve"> used to </w:t>
-      </w:r>
-      <w:r>
-        <w:t xml:space="preserve">test </w:t>
-      </w:r>
-      <w:r>
-        <w:t xml:space="preserve">the model performance. </w:t>
-      </w:r>
-      <w:r>
-        <w:t>Hyperparameters included a learning rate of 0.0001, batch size of 32, and up to 20,000 training steps. Sentences exceeding the 512-token limit were segmented prior to tokenization.</w:t>
+    </w:p>
+    <w:p>
+      <w:ins w:id="156" w:author="Wu, Leihong" w:date="2026-08-31T09:12:00Z">
+        <w:r>
+          <w:t>To address variability associated with neural-network initialization, all BERT evaluations were repeated using five independent random seeds (42, 123, 456, 789, and 1011).</w:t>
+        </w:r>
+      </w:ins>
+      <w:ins w:id="157" w:author="Wu, Leihong" w:date="2026-08-31T09:13:00Z" w16du:dateUtc="2026-08-31T14:13:00Z">
+        <w:r>
+          <w:t xml:space="preserve"> </w:t>
+        </w:r>
+      </w:ins>
+      <w:ins w:id="158" w:author="Wu, Leihong" w:date="2026-08-31T09:13:00Z">
+        <w:r>
+          <w:t>For FAERS, the four predefined drug–adverse-event case series enabled a four-fold leave-one-drug–event-pair-out evaluation: each case series served once as the held-out test domain, and each fold was independently trained under all five seeds (20 training runs). For VAERS, which lacks an analogous predefined drug–event grouping, we use report-level 10-fold cross-validation with fixed folds; each fold is repeated under the same five seeds (50 training runs). The final overall estimates are calculated from pooled out-of-fold predictions for each seed and summarized as mean ± standard deviation across the five seeds.</w:t>
+        </w:r>
+      </w:ins>
+      <w:ins w:id="159" w:author="Wu, Leihong" w:date="2026-08-31T09:12:00Z">
+        <w:r>
+          <w:t xml:space="preserve"> </w:t>
+        </w:r>
+      </w:ins>
+      <w:del w:id="160" w:author="Wu, Leihong" w:date="2026-08-31T09:13:00Z" w16du:dateUtc="2026-08-31T14:13:00Z">
+        <w:r>
+          <w:delText>W</w:delText>
+        </w:r>
+        <w:r>
+          <w:delText xml:space="preserve">e randomly selected 80% of the entire annotated </w:delText>
+        </w:r>
+        <w:r>
+          <w:delText xml:space="preserve">ICSRs </w:delText>
+        </w:r>
+        <w:r>
+          <w:delText xml:space="preserve">to train the BERT NER model, where the remaining 20% of the annotated </w:delText>
+        </w:r>
+        <w:r>
+          <w:delText>ICSRs</w:delText>
+        </w:r>
+        <w:r>
+          <w:delText xml:space="preserve"> </w:delText>
+        </w:r>
+        <w:r>
+          <w:delText>were</w:delText>
+        </w:r>
+        <w:r>
+          <w:delText xml:space="preserve"> used to </w:delText>
+        </w:r>
+        <w:r>
+          <w:delText xml:space="preserve">test </w:delText>
+        </w:r>
+        <w:r>
+          <w:delText xml:space="preserve">the model performance. </w:delText>
+        </w:r>
+      </w:del>
+      <w:r>
+        <w:t xml:space="preserve">Hyperparameters included a learning rate of 0.0001, batch size of 32, and up to 20,000 training steps. Sentences exceeding the 512-token limit were segmented </w:t>
+      </w:r>
+      <w:ins w:id="161" w:author="Wu, Leihong" w:date="2026-08-31T09:13:00Z" w16du:dateUtc="2026-08-31T14:13:00Z">
+        <w:r>
+          <w:t>before transformer</w:t>
+        </w:r>
+      </w:ins>
+      <w:ins w:id="162" w:author="Wu, Leihong" w:date="2026-08-31T09:14:00Z" w16du:dateUtc="2026-08-31T14:14:00Z">
+        <w:r>
+          <w:t xml:space="preserve"> processing</w:t>
+        </w:r>
+      </w:ins>
+      <w:del w:id="163" w:author="Wu, Leihong" w:date="2026-08-31T09:14:00Z" w16du:dateUtc="2026-08-31T14:14:00Z">
+        <w:r>
+          <w:delText>prior to tokenization</w:delText>
+        </w:r>
+      </w:del>
+      <w:r>
+        <w:t>.</w:t>
       </w:r>
     </w:p>
     <w:p>
@@ -3092,20 +3583,35 @@
     <w:p>
       <w:pPr>
         <w:rPr>
-          <w:ins w:id="86" w:author="Wu, Leihong" w:date="2026-08-28T12:55:00Z" w16du:dateUtc="2026-08-28T17:55:00Z"/>
+          <w:ins w:id="164" w:author="Wu, Leihong" w:date="2026-08-28T12:55:00Z" w16du:dateUtc="2026-08-28T17:55:00Z"/>
         </w:rPr>
       </w:pPr>
       <w:r>
         <w:t xml:space="preserve">Model performance was evaluated using </w:t>
       </w:r>
-      <w:r>
-        <w:t xml:space="preserve">an </w:t>
-      </w:r>
-      <w:r>
-        <w:t>exact mention match metric</w:t>
-      </w:r>
-      <w:r>
-        <w:t xml:space="preserve"> adapted from ADE-Eval</w:t>
+      <w:ins w:id="165" w:author="Wu, Leihong" w:date="2026-08-31T09:15:00Z" w16du:dateUtc="2026-08-31T14:15:00Z">
+        <w:r>
+          <w:t xml:space="preserve">mention-level </w:t>
+        </w:r>
+      </w:ins>
+      <w:ins w:id="166" w:author="Wu, Leihong" w:date="2026-08-31T09:16:00Z" w16du:dateUtc="2026-08-31T14:16:00Z">
+        <w:r>
+          <w:t xml:space="preserve">matching </w:t>
+        </w:r>
+      </w:ins>
+      <w:del w:id="167" w:author="Wu, Leihong" w:date="2026-08-31T09:16:00Z" w16du:dateUtc="2026-08-31T14:16:00Z">
+        <w:r>
+          <w:delText xml:space="preserve">an </w:delText>
+        </w:r>
+        <w:r>
+          <w:delText>exact mention match metric</w:delText>
+        </w:r>
+        <w:r>
+          <w:delText xml:space="preserve"> </w:delText>
+        </w:r>
+      </w:del>
+      <w:r>
+        <w:t>adapted from ADE-Eval</w:t>
       </w:r>
       <w:r>
         <w:fldChar w:fldCharType="begin">
@@ -3219,14 +3725,42 @@
       <w:r>
         <w:t xml:space="preserve">. </w:t>
       </w:r>
-      <w:r>
-        <w:t xml:space="preserve">Particularly, </w:t>
-      </w:r>
-      <w:r>
-        <w:t>we categorized system predictions into four mutually exclusive outcomes</w:t>
-      </w:r>
-      <w:r>
-        <w:t>, as Match (M), Conflation (C), Spurious (S)</w:t>
+      <w:del w:id="168" w:author="Wu, Leihong" w:date="2026-08-31T09:16:00Z" w16du:dateUtc="2026-08-31T14:16:00Z">
+        <w:r>
+          <w:delText xml:space="preserve">Particularly, </w:delText>
+        </w:r>
+        <w:r>
+          <w:delText xml:space="preserve">we categorized </w:delText>
+        </w:r>
+      </w:del>
+      <w:ins w:id="169" w:author="Wu, Leihong" w:date="2026-08-31T09:16:00Z" w16du:dateUtc="2026-08-31T14:16:00Z">
+        <w:r>
+          <w:t>S</w:t>
+        </w:r>
+      </w:ins>
+      <w:del w:id="170" w:author="Wu, Leihong" w:date="2026-08-31T09:16:00Z" w16du:dateUtc="2026-08-31T14:16:00Z">
+        <w:r>
+          <w:delText>s</w:delText>
+        </w:r>
+      </w:del>
+      <w:r>
+        <w:t xml:space="preserve">ystem predictions </w:t>
+      </w:r>
+      <w:ins w:id="171" w:author="Wu, Leihong" w:date="2026-08-31T09:16:00Z" w16du:dateUtc="2026-08-31T14:16:00Z">
+        <w:r>
+          <w:t xml:space="preserve">were categorized </w:t>
+        </w:r>
+      </w:ins>
+      <w:del w:id="172" w:author="Wu, Leihong" w:date="2026-08-31T09:16:00Z" w16du:dateUtc="2026-08-31T14:16:00Z">
+        <w:r>
+          <w:delText>into four mutually exclusive outcomes</w:delText>
+        </w:r>
+        <w:r>
+          <w:delText xml:space="preserve">, </w:delText>
+        </w:r>
+      </w:del>
+      <w:r>
+        <w:t>as Match (M), Conflation (C), Spurious (S)</w:t>
       </w:r>
       <w:r>
         <w:t>,</w:t>
@@ -3234,7 +3768,27 @@
       <w:r>
         <w:t xml:space="preserve"> and Null (N).</w:t>
       </w:r>
-      <w:del w:id="87" w:author="Wu, Leihong" w:date="2026-08-28T13:44:00Z" w16du:dateUtc="2026-08-28T18:44:00Z">
+      <w:ins w:id="173" w:author="Wu, Leihong" w:date="2026-08-31T09:16:00Z" w16du:dateUtc="2026-08-31T14:16:00Z">
+        <w:r>
+          <w:t xml:space="preserve"> </w:t>
+        </w:r>
+      </w:ins>
+      <w:ins w:id="174" w:author="Wu, Leihong" w:date="2026-08-31T09:16:00Z">
+        <w:r>
+          <w:t>Match denotes an exact span and label match; Conflation denotes an overlapping span with inexact boundaries under the same label</w:t>
+        </w:r>
+      </w:ins>
+      <w:ins w:id="175" w:author="Wu, Leihong" w:date="2026-08-31T09:17:00Z" w16du:dateUtc="2026-08-31T14:17:00Z">
+        <w:r>
+          <w:t>, or a mis-label annotation</w:t>
+        </w:r>
+      </w:ins>
+      <w:ins w:id="176" w:author="Wu, Leihong" w:date="2026-08-31T09:16:00Z">
+        <w:r>
+          <w:t>; Spurious denotes a predicted entity without a corresponding reference match; and Null denotes a reference entity that was not identified.</w:t>
+        </w:r>
+      </w:ins>
+      <w:del w:id="177" w:author="Wu, Leihong" w:date="2026-08-28T13:44:00Z" w16du:dateUtc="2026-08-28T18:44:00Z">
         <w:r>
           <w:delText xml:space="preserve"> </w:delText>
         </w:r>
@@ -3242,12 +3796,12 @@
           <w:delText xml:space="preserve">Among them, M was </w:delText>
         </w:r>
       </w:del>
-      <w:del w:id="88" w:author="Wu, Leihong" w:date="2026-08-28T13:41:00Z" w16du:dateUtc="2026-08-28T18:41:00Z">
+      <w:del w:id="178" w:author="Wu, Leihong" w:date="2026-08-28T13:41:00Z" w16du:dateUtc="2026-08-28T18:41:00Z">
         <w:r>
           <w:delText xml:space="preserve">also </w:delText>
         </w:r>
       </w:del>
-      <w:del w:id="89" w:author="Wu, Leihong" w:date="2026-08-28T13:44:00Z" w16du:dateUtc="2026-08-28T18:44:00Z">
+      <w:del w:id="179" w:author="Wu, Leihong" w:date="2026-08-28T13:44:00Z" w16du:dateUtc="2026-08-28T18:44:00Z">
         <w:r>
           <w:delText xml:space="preserve">considered as True Positive, where </w:delText>
         </w:r>
@@ -3270,7 +3824,7 @@
           <w:delText>; C and S were considered as False Positive</w:delText>
         </w:r>
       </w:del>
-      <w:del w:id="90" w:author="Wu, Leihong" w:date="2026-08-28T13:08:00Z" w16du:dateUtc="2026-08-28T18:08:00Z">
+      <w:del w:id="180" w:author="Wu, Leihong" w:date="2026-08-28T13:08:00Z" w16du:dateUtc="2026-08-28T18:08:00Z">
         <w:r>
           <w:delText>, where C</w:delText>
         </w:r>
@@ -3354,7 +3908,7 @@
           <w:delText>)</w:delText>
         </w:r>
       </w:del>
-      <w:del w:id="91" w:author="Wu, Leihong" w:date="2026-08-28T13:09:00Z" w16du:dateUtc="2026-08-28T18:09:00Z">
+      <w:del w:id="181" w:author="Wu, Leihong" w:date="2026-08-28T13:09:00Z" w16du:dateUtc="2026-08-28T18:09:00Z">
         <w:r>
           <w:delText>.</w:delText>
         </w:r>
@@ -3399,19 +3953,21 @@
     <w:p>
       <w:pPr>
         <w:rPr>
+          <w:ins w:id="182" w:author="Wu, Leihong" w:date="2026-08-31T09:23:00Z"/>
           <w:iCs/>
-        </w:rPr>
-      </w:pPr>
-      <w:ins w:id="92" w:author="Wu, Leihong" w:date="2026-08-28T13:06:00Z" w16du:dateUtc="2026-08-28T18:06:00Z">
+          <w:color w:val="7030A0"/>
+        </w:rPr>
+      </w:pPr>
+      <w:ins w:id="183" w:author="Wu, Leihong" w:date="2026-08-31T09:23:00Z" w16du:dateUtc="2026-08-31T14:23:00Z">
         <w:r>
           <w:rPr>
             <w:iCs/>
             <w:color w:val="7030A0"/>
           </w:rPr>
-          <w:t>Particularly, a</w:t>
+          <w:t>For example,</w:t>
         </w:r>
       </w:ins>
-      <w:ins w:id="93" w:author="Wu, Leihong" w:date="2026-08-28T12:55:00Z" w16du:dateUtc="2026-08-28T17:55:00Z">
+      <w:ins w:id="184" w:author="Wu, Leihong" w:date="2026-08-31T09:23:00Z">
         <w:r>
           <w:rPr>
             <w:iCs/>
@@ -3420,52 +3976,525 @@
           <w:t xml:space="preserve"> </w:t>
         </w:r>
       </w:ins>
-      <w:ins w:id="94" w:author="Wu, Leihong" w:date="2026-08-28T13:41:00Z" w16du:dateUtc="2026-08-28T18:41:00Z">
+      <w:ins w:id="185" w:author="Wu, Leihong" w:date="2026-08-31T09:23:00Z" w16du:dateUtc="2026-08-31T14:23:00Z">
         <w:r>
           <w:rPr>
             <w:iCs/>
             <w:color w:val="7030A0"/>
           </w:rPr>
-          <w:t>C</w:t>
+          <w:t>a</w:t>
         </w:r>
       </w:ins>
-      <w:ins w:id="95" w:author="Wu, Leihong" w:date="2026-08-28T13:06:00Z" w16du:dateUtc="2026-08-28T18:06:00Z">
+      <w:ins w:id="186" w:author="Wu, Leihong" w:date="2026-08-31T09:23:00Z">
         <w:r>
           <w:rPr>
             <w:iCs/>
             <w:color w:val="7030A0"/>
           </w:rPr>
-          <w:t>onflation</w:t>
-        </w:r>
-      </w:ins>
-      <w:ins w:id="96" w:author="Wu, Leihong" w:date="2026-08-28T12:55:00Z" w16du:dateUtc="2026-08-28T17:55:00Z">
+          <w:t xml:space="preserve">n automated prediction of </w:t>
+        </w:r>
+        <w:r>
+          <w:rPr>
+            <w:i/>
+            <w:iCs/>
+            <w:color w:val="7030A0"/>
+          </w:rPr>
+          <w:t>“hypoglycemia”</w:t>
+        </w:r>
         <w:r>
           <w:rPr>
             <w:iCs/>
             <w:color w:val="7030A0"/>
           </w:rPr>
-          <w:t xml:space="preserve"> arises when boundaries diverge despite the same label</w:t>
-        </w:r>
-      </w:ins>
-      <w:ins w:id="97" w:author="Wu, Leihong" w:date="2026-08-28T13:06:00Z" w16du:dateUtc="2026-08-28T18:06:00Z">
+          <w:t xml:space="preserve"> as AE that exactly matches the reference span and label is classified as a </w:t>
+        </w:r>
+        <w:r>
+          <w:rPr>
+            <w:iCs/>
+            <w:color w:val="7030A0"/>
+            <w:rPrChange w:id="187" w:author="Wu, Leihong" w:date="2026-08-31T09:23:00Z" w16du:dateUtc="2026-08-31T14:23:00Z">
+              <w:rPr>
+                <w:b/>
+                <w:bCs/>
+                <w:iCs/>
+                <w:color w:val="7030A0"/>
+              </w:rPr>
+            </w:rPrChange>
+          </w:rPr>
+          <w:t>Match (M)</w:t>
+        </w:r>
         <w:r>
           <w:rPr>
             <w:iCs/>
             <w:color w:val="7030A0"/>
           </w:rPr>
-          <w:t>. F</w:t>
-        </w:r>
-      </w:ins>
-      <w:ins w:id="98" w:author="Wu, Leihong" w:date="2026-08-28T12:55:00Z" w16du:dateUtc="2026-08-28T17:55:00Z">
+          <w:t xml:space="preserve">. A prediction is classified as </w:t>
+        </w:r>
+        <w:r>
+          <w:rPr>
+            <w:iCs/>
+            <w:color w:val="7030A0"/>
+            <w:rPrChange w:id="188" w:author="Wu, Leihong" w:date="2026-08-31T09:23:00Z" w16du:dateUtc="2026-08-31T14:23:00Z">
+              <w:rPr>
+                <w:b/>
+                <w:bCs/>
+                <w:iCs/>
+                <w:color w:val="7030A0"/>
+              </w:rPr>
+            </w:rPrChange>
+          </w:rPr>
+          <w:t>Conflation (C)</w:t>
+        </w:r>
         <w:r>
           <w:rPr>
             <w:iCs/>
             <w:color w:val="7030A0"/>
           </w:rPr>
-          <w:t>or instance, the expert annotating the full dose-change expression "100 mg OD to 200 mg OD" as a single DOSE span</w:t>
+          <w:t xml:space="preserve"> when it identifies the same underlying text region but does not exactly reproduce the reference annotation. Conflation includes both </w:t>
+        </w:r>
+        <w:r>
+          <w:rPr>
+            <w:iCs/>
+            <w:color w:val="7030A0"/>
+            <w:rPrChange w:id="189" w:author="Wu, Leihong" w:date="2026-08-31T09:23:00Z" w16du:dateUtc="2026-08-31T14:23:00Z">
+              <w:rPr>
+                <w:b/>
+                <w:bCs/>
+                <w:iCs/>
+                <w:color w:val="7030A0"/>
+              </w:rPr>
+            </w:rPrChange>
+          </w:rPr>
+          <w:t>boundary inexactness</w:t>
+        </w:r>
+        <w:r>
+          <w:rPr>
+            <w:iCs/>
+            <w:color w:val="7030A0"/>
+          </w:rPr>
+          <w:t xml:space="preserve">, for example predicting </w:t>
+        </w:r>
+        <w:r>
+          <w:rPr>
+            <w:i/>
+            <w:iCs/>
+            <w:color w:val="7030A0"/>
+          </w:rPr>
+          <w:t>“severe hypoglycemia”</w:t>
+        </w:r>
+        <w:r>
+          <w:rPr>
+            <w:iCs/>
+            <w:color w:val="7030A0"/>
+          </w:rPr>
+          <w:t xml:space="preserve"> when the reference span is </w:t>
+        </w:r>
+        <w:r>
+          <w:rPr>
+            <w:i/>
+            <w:iCs/>
+            <w:color w:val="7030A0"/>
+          </w:rPr>
+          <w:t>“hypoglycemia”</w:t>
+        </w:r>
+        <w:r>
+          <w:rPr>
+            <w:iCs/>
+            <w:color w:val="7030A0"/>
+          </w:rPr>
+          <w:t xml:space="preserve">, and </w:t>
+        </w:r>
+        <w:r>
+          <w:rPr>
+            <w:iCs/>
+            <w:color w:val="7030A0"/>
+            <w:rPrChange w:id="190" w:author="Wu, Leihong" w:date="2026-08-31T09:24:00Z" w16du:dateUtc="2026-08-31T14:24:00Z">
+              <w:rPr>
+                <w:b/>
+                <w:bCs/>
+                <w:iCs/>
+                <w:color w:val="7030A0"/>
+              </w:rPr>
+            </w:rPrChange>
+          </w:rPr>
+          <w:t>category misclassification</w:t>
+        </w:r>
+        <w:r>
+          <w:rPr>
+            <w:iCs/>
+            <w:color w:val="7030A0"/>
+          </w:rPr>
+          <w:t xml:space="preserve">, for example identifying </w:t>
+        </w:r>
+        <w:r>
+          <w:rPr>
+            <w:i/>
+            <w:iCs/>
+            <w:color w:val="7030A0"/>
+          </w:rPr>
+          <w:t>“hypoglycemia”</w:t>
+        </w:r>
+        <w:r>
+          <w:rPr>
+            <w:iCs/>
+            <w:color w:val="7030A0"/>
+          </w:rPr>
+          <w:t xml:space="preserve"> but labeling it as DX rather than AE. A </w:t>
+        </w:r>
+        <w:r>
+          <w:rPr>
+            <w:iCs/>
+            <w:color w:val="7030A0"/>
+            <w:rPrChange w:id="191" w:author="Wu, Leihong" w:date="2026-08-31T09:24:00Z" w16du:dateUtc="2026-08-31T14:24:00Z">
+              <w:rPr>
+                <w:b/>
+                <w:bCs/>
+                <w:iCs/>
+                <w:color w:val="7030A0"/>
+              </w:rPr>
+            </w:rPrChange>
+          </w:rPr>
+          <w:t>Spurious (S)</w:t>
+        </w:r>
+        <w:r>
+          <w:rPr>
+            <w:iCs/>
+            <w:color w:val="7030A0"/>
+          </w:rPr>
+          <w:t xml:space="preserve"> </w:t>
         </w:r>
       </w:ins>
-      <w:ins w:id="99" w:author="Wu, Leihong" w:date="2026-08-28T13:06:00Z" w16du:dateUtc="2026-08-28T18:06:00Z">
+      <w:ins w:id="192" w:author="Wu, Leihong" w:date="2026-08-31T09:24:00Z" w16du:dateUtc="2026-08-31T14:24:00Z">
+        <w:r>
+          <w:rPr>
+            <w:iCs/>
+            <w:color w:val="7030A0"/>
+          </w:rPr>
+          <w:t xml:space="preserve">prediction </w:t>
+        </w:r>
+      </w:ins>
+      <w:ins w:id="193" w:author="Wu, Leihong" w:date="2026-08-31T09:23:00Z">
+        <w:r>
+          <w:rPr>
+            <w:iCs/>
+            <w:color w:val="7030A0"/>
+          </w:rPr>
+          <w:t xml:space="preserve">is a predicted entity with no character overlap with any reference entity, whereas </w:t>
+        </w:r>
+        <w:r>
+          <w:rPr>
+            <w:iCs/>
+            <w:color w:val="7030A0"/>
+            <w:rPrChange w:id="194" w:author="Wu, Leihong" w:date="2026-08-31T09:24:00Z" w16du:dateUtc="2026-08-31T14:24:00Z">
+              <w:rPr>
+                <w:b/>
+                <w:bCs/>
+                <w:iCs/>
+                <w:color w:val="7030A0"/>
+              </w:rPr>
+            </w:rPrChange>
+          </w:rPr>
+          <w:t>Null (N)</w:t>
+        </w:r>
+        <w:r>
+          <w:rPr>
+            <w:iCs/>
+            <w:color w:val="7030A0"/>
+          </w:rPr>
+          <w:t xml:space="preserve"> represents a reference entity for which no overlapping prediction is produced, such as failing to identify </w:t>
+        </w:r>
+        <w:r>
+          <w:rPr>
+            <w:i/>
+            <w:iCs/>
+            <w:color w:val="7030A0"/>
+          </w:rPr>
+          <w:t>“somnolence”</w:t>
+        </w:r>
+        <w:r>
+          <w:rPr>
+            <w:iCs/>
+            <w:color w:val="7030A0"/>
+          </w:rPr>
+          <w:t>.</w:t>
+        </w:r>
+      </w:ins>
+    </w:p>
+    <w:p>
+      <w:pPr>
+        <w:rPr>
+          <w:ins w:id="195" w:author="Wu, Leihong" w:date="2026-08-31T09:25:00Z" w16du:dateUtc="2026-08-31T14:25:00Z"/>
+          <w:iCs/>
+          <w:color w:val="7030A0"/>
+        </w:rPr>
+      </w:pPr>
+      <w:ins w:id="196" w:author="Wu, Leihong" w:date="2026-08-31T09:23:00Z">
+        <w:r>
+          <w:rPr>
+            <w:iCs/>
+            <w:color w:val="7030A0"/>
+          </w:rPr>
+          <w:t xml:space="preserve">We evaluated model performance using two complementary evaluation schemes. The </w:t>
+        </w:r>
+        <w:r>
+          <w:rPr>
+            <w:iCs/>
+            <w:color w:val="7030A0"/>
+            <w:rPrChange w:id="197" w:author="Wu, Leihong" w:date="2026-08-31T09:24:00Z" w16du:dateUtc="2026-08-31T14:24:00Z">
+              <w:rPr>
+                <w:b/>
+                <w:bCs/>
+                <w:iCs/>
+                <w:color w:val="7030A0"/>
+              </w:rPr>
+            </w:rPrChange>
+          </w:rPr>
+          <w:t>primary scheme was a strict exact-match NER evaluation</w:t>
+        </w:r>
+        <w:r>
+          <w:rPr>
+            <w:iCs/>
+            <w:color w:val="7030A0"/>
+          </w:rPr>
+          <w:t xml:space="preserve">, in which a prediction was counted as correct only when both its span boundaries and entity label exactly matched the reference annotation. Under this scheme, precision and recall were calculated as </w:t>
+        </w:r>
+      </w:ins>
+      <w:ins w:id="198" w:author="Wu, Leihong" w:date="2026-08-31T09:25:00Z" w16du:dateUtc="2026-08-31T14:25:00Z">
+        <w:r>
+          <w:rPr>
+            <w:iCs/>
+            <w:color w:val="7030A0"/>
+          </w:rPr>
+          <w:t>below:</w:t>
+        </w:r>
+      </w:ins>
+    </w:p>
+    <w:p>
+      <w:pPr>
+        <w:rPr>
+          <w:ins w:id="199" w:author="Wu, Leihong" w:date="2026-08-31T09:25:00Z" w16du:dateUtc="2026-08-31T14:25:00Z"/>
+          <w:rFonts w:eastAsiaTheme="minorEastAsia"/>
+          <w:iCs/>
+          <w:color w:val="7030A0"/>
+        </w:rPr>
+      </w:pPr>
+      <m:oMathPara>
+        <m:oMath>
+          <m:sSub>
+            <m:sSubPr>
+              <m:ctrlPr>
+                <w:ins w:id="200" w:author="Wu, Leihong" w:date="2026-08-31T09:26:00Z" w16du:dateUtc="2026-08-31T14:26:00Z">
+                  <w:rPr>
+                    <w:rFonts w:ascii="Cambria Math" w:hAnsi="Cambria Math"/>
+                    <w:i/>
+                    <w:iCs/>
+                    <w:color w:val="7030A0"/>
+                  </w:rPr>
+                </w:ins>
+              </m:ctrlPr>
+            </m:sSubPr>
+            <m:e>
+              <m:r>
+                <w:ins w:id="201" w:author="Wu, Leihong" w:date="2026-08-31T09:26:00Z" w16du:dateUtc="2026-08-31T14:26:00Z">
+                  <w:rPr>
+                    <w:rFonts w:ascii="Cambria Math" w:hAnsi="Cambria Math"/>
+                    <w:color w:val="7030A0"/>
+                  </w:rPr>
+                  <m:t>P</m:t>
+                </w:ins>
+              </m:r>
+            </m:e>
+            <m:sub>
+              <m:r>
+                <w:ins w:id="202" w:author="Wu, Leihong" w:date="2026-08-31T09:26:00Z" w16du:dateUtc="2026-08-31T14:26:00Z">
+                  <w:rPr>
+                    <w:rFonts w:ascii="Cambria Math" w:hAnsi="Cambria Math"/>
+                    <w:color w:val="7030A0"/>
+                  </w:rPr>
+                  <m:t>1</m:t>
+                </w:ins>
+              </m:r>
+            </m:sub>
+          </m:sSub>
+          <m:r>
+            <w:ins w:id="203" w:author="Wu, Leihong" w:date="2026-08-31T09:25:00Z" w16du:dateUtc="2026-08-31T14:25:00Z">
+              <w:rPr>
+                <w:rFonts w:ascii="Cambria Math" w:hAnsi="Cambria Math"/>
+                <w:color w:val="7030A0"/>
+              </w:rPr>
+              <m:t>=</m:t>
+            </w:ins>
+          </m:r>
+          <m:r>
+            <w:ins w:id="204" w:author="Wu, Leihong" w:date="2026-08-31T09:25:00Z" w16du:dateUtc="2026-08-31T14:25:00Z">
+              <w:rPr>
+                <w:rFonts w:ascii="Cambria Math" w:hAnsi="Cambria Math"/>
+                <w:color w:val="7030A0"/>
+              </w:rPr>
+              <m:t>M/(M+C+S)</m:t>
+            </w:ins>
+          </m:r>
+          <m:r>
+            <w:ins w:id="205" w:author="Wu, Leihong" w:date="2026-08-31T09:25:00Z" w16du:dateUtc="2026-08-31T14:25:00Z">
+              <w:rPr>
+                <w:rFonts w:ascii="Cambria Math" w:hAnsi="Cambria Math"/>
+                <w:color w:val="7030A0"/>
+              </w:rPr>
+              <m:t xml:space="preserve"> </m:t>
+            </w:ins>
+          </m:r>
+        </m:oMath>
+      </m:oMathPara>
+    </w:p>
+    <w:p>
+      <w:pPr>
+        <w:rPr>
+          <w:ins w:id="206" w:author="Wu, Leihong" w:date="2026-08-31T09:25:00Z" w16du:dateUtc="2026-08-31T14:25:00Z"/>
+          <w:iCs/>
+          <w:color w:val="7030A0"/>
+        </w:rPr>
+      </w:pPr>
+      <m:oMathPara>
+        <m:oMath>
+          <m:sSub>
+            <m:sSubPr>
+              <m:ctrlPr>
+                <w:ins w:id="207" w:author="Wu, Leihong" w:date="2026-08-31T09:26:00Z" w16du:dateUtc="2026-08-31T14:26:00Z">
+                  <w:rPr>
+                    <w:rFonts w:ascii="Cambria Math" w:hAnsi="Cambria Math"/>
+                    <w:i/>
+                    <w:iCs/>
+                    <w:color w:val="7030A0"/>
+                  </w:rPr>
+                </w:ins>
+              </m:ctrlPr>
+            </m:sSubPr>
+            <m:e>
+              <m:r>
+                <w:ins w:id="208" w:author="Wu, Leihong" w:date="2026-08-31T09:26:00Z" w16du:dateUtc="2026-08-31T14:26:00Z">
+                  <w:rPr>
+                    <w:rFonts w:ascii="Cambria Math" w:hAnsi="Cambria Math"/>
+                    <w:color w:val="7030A0"/>
+                  </w:rPr>
+                  <m:t>R</m:t>
+                </w:ins>
+              </m:r>
+            </m:e>
+            <m:sub>
+              <m:r>
+                <w:ins w:id="209" w:author="Wu, Leihong" w:date="2026-08-31T09:26:00Z" w16du:dateUtc="2026-08-31T14:26:00Z">
+                  <w:rPr>
+                    <w:rFonts w:ascii="Cambria Math" w:hAnsi="Cambria Math"/>
+                    <w:color w:val="7030A0"/>
+                  </w:rPr>
+                  <m:t>1</m:t>
+                </w:ins>
+              </m:r>
+            </m:sub>
+          </m:sSub>
+          <m:r>
+            <w:ins w:id="210" w:author="Wu, Leihong" w:date="2026-08-31T09:25:00Z" w16du:dateUtc="2026-08-31T14:25:00Z">
+              <w:rPr>
+                <w:rFonts w:ascii="Cambria Math" w:hAnsi="Cambria Math"/>
+                <w:color w:val="7030A0"/>
+              </w:rPr>
+              <m:t>=M/(M+C+N)</m:t>
+            </w:ins>
+          </m:r>
+        </m:oMath>
+      </m:oMathPara>
+    </w:p>
+    <w:p>
+      <w:pPr>
+        <w:rPr>
+          <w:ins w:id="211" w:author="Wu, Leihong" w:date="2026-08-31T09:25:00Z" w16du:dateUtc="2026-08-31T14:25:00Z"/>
+          <w:iCs/>
+          <w:color w:val="7030A0"/>
+        </w:rPr>
+      </w:pPr>
+    </w:p>
+    <w:p>
+      <w:pPr>
+        <w:rPr>
+          <w:ins w:id="212" w:author="Wu, Leihong" w:date="2026-08-31T09:27:00Z" w16du:dateUtc="2026-08-31T14:27:00Z"/>
+          <w:iCs/>
+          <w:color w:val="7030A0"/>
+        </w:rPr>
+      </w:pPr>
+      <w:ins w:id="213" w:author="Wu, Leihong" w:date="2026-08-31T09:23:00Z">
+        <w:r>
+          <w:rPr>
+            <w:iCs/>
+            <w:color w:val="7030A0"/>
+          </w:rPr>
+          <w:t xml:space="preserve">The </w:t>
+        </w:r>
+        <w:r>
+          <w:rPr>
+            <w:iCs/>
+            <w:color w:val="7030A0"/>
+            <w:rPrChange w:id="214" w:author="Wu, Leihong" w:date="2026-08-31T09:27:00Z" w16du:dateUtc="2026-08-31T14:27:00Z">
+              <w:rPr>
+                <w:b/>
+                <w:bCs/>
+                <w:iCs/>
+                <w:color w:val="7030A0"/>
+              </w:rPr>
+            </w:rPrChange>
+          </w:rPr>
+          <w:t>secondary scheme was an adapted ADE-Eval weighted evaluation</w:t>
+        </w:r>
+        <w:r>
+          <w:rPr>
+            <w:iCs/>
+            <w:color w:val="7030A0"/>
+          </w:rPr>
+          <w:t>. In this scheme, an exact Match receives full credit</w:t>
+        </w:r>
+        <w:r>
+          <w:rPr>
+            <w:iCs/>
+            <w:color w:val="7030A0"/>
+          </w:rPr>
+          <w:t xml:space="preserve">, while a Conflation receives </w:t>
+        </w:r>
+        <w:r>
+          <w:rPr>
+            <w:iCs/>
+            <w:color w:val="7030A0"/>
+            <w:rPrChange w:id="215" w:author="Wu, Leihong" w:date="2026-08-31T09:27:00Z" w16du:dateUtc="2026-08-31T14:27:00Z">
+              <w:rPr>
+                <w:b/>
+                <w:bCs/>
+                <w:iCs/>
+                <w:color w:val="7030A0"/>
+              </w:rPr>
+            </w:rPrChange>
+          </w:rPr>
+          <w:t>0.5 partial credit</w:t>
+        </w:r>
+        <w:r>
+          <w:rPr>
+            <w:iCs/>
+            <w:color w:val="7030A0"/>
+          </w:rPr>
+          <w:t xml:space="preserve">. Spurious predictions are assigned a </w:t>
+        </w:r>
+        <w:r>
+          <w:rPr>
+            <w:iCs/>
+            <w:color w:val="7030A0"/>
+            <w:rPrChange w:id="216" w:author="Wu, Leihong" w:date="2026-08-31T09:27:00Z" w16du:dateUtc="2026-08-31T14:27:00Z">
+              <w:rPr>
+                <w:b/>
+                <w:bCs/>
+                <w:iCs/>
+                <w:color w:val="7030A0"/>
+              </w:rPr>
+            </w:rPrChange>
+          </w:rPr>
+          <w:t>0.25 penalty weight</w:t>
+        </w:r>
         <w:r>
           <w:rPr>
             <w:iCs/>
@@ -3473,174 +4502,379 @@
           </w:rPr>
           <w:t>,</w:t>
         </w:r>
-      </w:ins>
-      <w:ins w:id="100" w:author="Wu, Leihong" w:date="2026-08-28T12:55:00Z" w16du:dateUtc="2026-08-28T17:55:00Z">
         <w:r>
           <w:rPr>
             <w:iCs/>
             <w:color w:val="7030A0"/>
           </w:rPr>
-          <w:t xml:space="preserve"> while the system splits it into two separate mentions ("100 mg OD" and "200 mg OD"), or truncating a drug name to "montelukast sodium" when the reference span includes the dosage form "montelukast sodium chewable tablet". </w:t>
+          <w:t xml:space="preserve"> whereas completely missed reference entities (N) retain their full penalty. Weighted precision and recall were therefore calculated as </w:t>
         </w:r>
       </w:ins>
-      <w:ins w:id="101" w:author="Wu, Leihong" w:date="2026-08-28T13:06:00Z" w16du:dateUtc="2026-08-28T18:06:00Z">
+      <w:ins w:id="217" w:author="Wu, Leihong" w:date="2026-08-31T09:27:00Z" w16du:dateUtc="2026-08-31T14:27:00Z">
         <w:r>
           <w:rPr>
             <w:iCs/>
             <w:color w:val="7030A0"/>
           </w:rPr>
-          <w:t>On the other hand, Spurious</w:t>
+          <w:t>below:</w:t>
         </w:r>
       </w:ins>
-      <w:ins w:id="102" w:author="Wu, Leihong" w:date="2026-08-28T12:55:00Z" w16du:dateUtc="2026-08-28T17:55:00Z">
+    </w:p>
+    <w:p>
+      <w:pPr>
+        <w:rPr>
+          <w:ins w:id="218" w:author="Wu, Leihong" w:date="2026-08-31T09:27:00Z" w16du:dateUtc="2026-08-31T14:27:00Z"/>
+          <w:rFonts w:eastAsiaTheme="minorEastAsia"/>
+          <w:iCs/>
+          <w:color w:val="7030A0"/>
+        </w:rPr>
+      </w:pPr>
+      <m:oMathPara>
+        <m:oMath>
+          <m:sSub>
+            <m:sSubPr>
+              <m:ctrlPr>
+                <w:ins w:id="219" w:author="Wu, Leihong" w:date="2026-08-31T09:27:00Z" w16du:dateUtc="2026-08-31T14:27:00Z">
+                  <w:rPr>
+                    <w:rFonts w:ascii="Cambria Math" w:hAnsi="Cambria Math"/>
+                    <w:i/>
+                    <w:iCs/>
+                    <w:color w:val="7030A0"/>
+                  </w:rPr>
+                </w:ins>
+              </m:ctrlPr>
+            </m:sSubPr>
+            <m:e>
+              <m:r>
+                <w:ins w:id="220" w:author="Wu, Leihong" w:date="2026-08-31T09:27:00Z" w16du:dateUtc="2026-08-31T14:27:00Z">
+                  <w:rPr>
+                    <w:rFonts w:ascii="Cambria Math" w:hAnsi="Cambria Math"/>
+                    <w:color w:val="7030A0"/>
+                  </w:rPr>
+                  <m:t>P</m:t>
+                </w:ins>
+              </m:r>
+            </m:e>
+            <m:sub>
+              <m:r>
+                <w:ins w:id="221" w:author="Wu, Leihong" w:date="2026-08-31T09:27:00Z" w16du:dateUtc="2026-08-31T14:27:00Z">
+                  <w:rPr>
+                    <w:rFonts w:ascii="Cambria Math" w:hAnsi="Cambria Math"/>
+                    <w:color w:val="7030A0"/>
+                  </w:rPr>
+                  <m:t>2</m:t>
+                </w:ins>
+              </m:r>
+            </m:sub>
+          </m:sSub>
+          <m:r>
+            <w:ins w:id="222" w:author="Wu, Leihong" w:date="2026-08-31T09:27:00Z" w16du:dateUtc="2026-08-31T14:27:00Z">
+              <w:rPr>
+                <w:rFonts w:ascii="Cambria Math" w:hAnsi="Cambria Math"/>
+                <w:color w:val="7030A0"/>
+              </w:rPr>
+              <m:t>=(</m:t>
+            </w:ins>
+          </m:r>
+          <m:r>
+            <w:ins w:id="223" w:author="Wu, Leihong" w:date="2026-08-31T09:27:00Z" w16du:dateUtc="2026-08-31T14:27:00Z">
+              <w:rPr>
+                <w:rFonts w:ascii="Cambria Math" w:hAnsi="Cambria Math"/>
+                <w:color w:val="7030A0"/>
+              </w:rPr>
+              <m:t>M</m:t>
+            </w:ins>
+          </m:r>
+          <m:r>
+            <w:ins w:id="224" w:author="Wu, Leihong" w:date="2026-08-31T09:27:00Z" w16du:dateUtc="2026-08-31T14:27:00Z">
+              <w:rPr>
+                <w:rFonts w:ascii="Cambria Math" w:hAnsi="Cambria Math"/>
+                <w:color w:val="7030A0"/>
+              </w:rPr>
+              <m:t>+0.5C)</m:t>
+            </w:ins>
+          </m:r>
+          <m:r>
+            <w:ins w:id="225" w:author="Wu, Leihong" w:date="2026-08-31T09:27:00Z" w16du:dateUtc="2026-08-31T14:27:00Z">
+              <w:rPr>
+                <w:rFonts w:ascii="Cambria Math" w:hAnsi="Cambria Math"/>
+                <w:color w:val="7030A0"/>
+              </w:rPr>
+              <m:t>/(M+C+</m:t>
+            </w:ins>
+          </m:r>
+          <m:r>
+            <w:ins w:id="226" w:author="Wu, Leihong" w:date="2026-08-31T09:28:00Z" w16du:dateUtc="2026-08-31T14:28:00Z">
+              <w:rPr>
+                <w:rFonts w:ascii="Cambria Math" w:hAnsi="Cambria Math"/>
+                <w:color w:val="7030A0"/>
+              </w:rPr>
+              <m:t>0.25</m:t>
+            </w:ins>
+          </m:r>
+          <m:r>
+            <w:ins w:id="227" w:author="Wu, Leihong" w:date="2026-08-31T09:27:00Z" w16du:dateUtc="2026-08-31T14:27:00Z">
+              <w:rPr>
+                <w:rFonts w:ascii="Cambria Math" w:hAnsi="Cambria Math"/>
+                <w:color w:val="7030A0"/>
+              </w:rPr>
+              <m:t>S)</m:t>
+            </w:ins>
+          </m:r>
+          <m:r>
+            <w:ins w:id="228" w:author="Wu, Leihong" w:date="2026-08-31T09:27:00Z" w16du:dateUtc="2026-08-31T14:27:00Z">
+              <w:rPr>
+                <w:rFonts w:ascii="Cambria Math" w:hAnsi="Cambria Math"/>
+                <w:color w:val="7030A0"/>
+              </w:rPr>
+              <m:t xml:space="preserve"> </m:t>
+            </w:ins>
+          </m:r>
+        </m:oMath>
+      </m:oMathPara>
+    </w:p>
+    <w:p>
+      <w:pPr>
+        <w:rPr>
+          <w:ins w:id="229" w:author="Wu, Leihong" w:date="2026-08-31T09:27:00Z" w16du:dateUtc="2026-08-31T14:27:00Z"/>
+          <w:iCs/>
+          <w:color w:val="7030A0"/>
+        </w:rPr>
+      </w:pPr>
+      <m:oMathPara>
+        <m:oMath>
+          <m:sSub>
+            <m:sSubPr>
+              <m:ctrlPr>
+                <w:ins w:id="230" w:author="Wu, Leihong" w:date="2026-08-31T09:27:00Z" w16du:dateUtc="2026-08-31T14:27:00Z">
+                  <w:rPr>
+                    <w:rFonts w:ascii="Cambria Math" w:hAnsi="Cambria Math"/>
+                    <w:i/>
+                    <w:iCs/>
+                    <w:color w:val="7030A0"/>
+                  </w:rPr>
+                </w:ins>
+              </m:ctrlPr>
+            </m:sSubPr>
+            <m:e>
+              <m:r>
+                <w:ins w:id="231" w:author="Wu, Leihong" w:date="2026-08-31T09:27:00Z" w16du:dateUtc="2026-08-31T14:27:00Z">
+                  <w:rPr>
+                    <w:rFonts w:ascii="Cambria Math" w:hAnsi="Cambria Math"/>
+                    <w:color w:val="7030A0"/>
+                  </w:rPr>
+                  <m:t>R</m:t>
+                </w:ins>
+              </m:r>
+            </m:e>
+            <m:sub>
+              <m:r>
+                <w:ins w:id="232" w:author="Wu, Leihong" w:date="2026-08-31T09:27:00Z" w16du:dateUtc="2026-08-31T14:27:00Z">
+                  <w:rPr>
+                    <w:rFonts w:ascii="Cambria Math" w:hAnsi="Cambria Math"/>
+                    <w:color w:val="7030A0"/>
+                  </w:rPr>
+                  <m:t>2</m:t>
+                </w:ins>
+              </m:r>
+            </m:sub>
+          </m:sSub>
+          <m:r>
+            <w:ins w:id="233" w:author="Wu, Leihong" w:date="2026-08-31T09:27:00Z" w16du:dateUtc="2026-08-31T14:27:00Z">
+              <w:rPr>
+                <w:rFonts w:ascii="Cambria Math" w:hAnsi="Cambria Math"/>
+                <w:color w:val="7030A0"/>
+              </w:rPr>
+              <m:t>=</m:t>
+            </w:ins>
+          </m:r>
+          <m:r>
+            <w:ins w:id="234" w:author="Wu, Leihong" w:date="2026-08-31T09:28:00Z" w16du:dateUtc="2026-08-31T14:28:00Z">
+              <w:rPr>
+                <w:rFonts w:ascii="Cambria Math" w:hAnsi="Cambria Math"/>
+                <w:color w:val="7030A0"/>
+              </w:rPr>
+              <m:t>(</m:t>
+            </w:ins>
+          </m:r>
+          <m:r>
+            <w:ins w:id="235" w:author="Wu, Leihong" w:date="2026-08-31T09:27:00Z" w16du:dateUtc="2026-08-31T14:27:00Z">
+              <w:rPr>
+                <w:rFonts w:ascii="Cambria Math" w:hAnsi="Cambria Math"/>
+                <w:color w:val="7030A0"/>
+              </w:rPr>
+              <m:t>M</m:t>
+            </w:ins>
+          </m:r>
+          <m:r>
+            <w:ins w:id="236" w:author="Wu, Leihong" w:date="2026-08-31T09:28:00Z" w16du:dateUtc="2026-08-31T14:28:00Z">
+              <w:rPr>
+                <w:rFonts w:ascii="Cambria Math" w:hAnsi="Cambria Math"/>
+                <w:color w:val="7030A0"/>
+              </w:rPr>
+              <m:t>+0.5C)</m:t>
+            </w:ins>
+          </m:r>
+          <m:r>
+            <w:ins w:id="237" w:author="Wu, Leihong" w:date="2026-08-31T09:27:00Z" w16du:dateUtc="2026-08-31T14:27:00Z">
+              <w:rPr>
+                <w:rFonts w:ascii="Cambria Math" w:hAnsi="Cambria Math"/>
+                <w:color w:val="7030A0"/>
+              </w:rPr>
+              <m:t>/(M+C+N)</m:t>
+            </w:ins>
+          </m:r>
+        </m:oMath>
+      </m:oMathPara>
+    </w:p>
+    <w:p>
+      <w:pPr>
+        <w:rPr>
+          <w:ins w:id="238" w:author="Wu, Leihong" w:date="2026-08-31T09:27:00Z" w16du:dateUtc="2026-08-31T14:27:00Z"/>
+          <w:iCs/>
+          <w:color w:val="7030A0"/>
+        </w:rPr>
+      </w:pPr>
+    </w:p>
+    <w:p>
+      <w:pPr>
+        <w:rPr>
+          <w:del w:id="239" w:author="Wu, Leihong" w:date="2026-08-31T09:15:00Z" w16du:dateUtc="2026-08-31T14:15:00Z"/>
+          <w:iCs/>
+          <w:color w:val="7030A0"/>
+        </w:rPr>
+      </w:pPr>
+      <w:ins w:id="240" w:author="Wu, Leihong" w:date="2026-08-31T09:23:00Z">
         <w:r>
           <w:rPr>
             <w:iCs/>
             <w:color w:val="7030A0"/>
           </w:rPr>
-          <w:t xml:space="preserve"> captures failure</w:t>
+          <w:t xml:space="preserve">F1 was calculated as the harmonic </w:t>
         </w:r>
       </w:ins>
-      <w:ins w:id="103" w:author="Wu, Leihong" w:date="2026-08-28T13:42:00Z" w16du:dateUtc="2026-08-28T18:42:00Z">
+      <w:ins w:id="241" w:author="Wu, Leihong" w:date="2026-08-31T09:34:00Z" w16du:dateUtc="2026-08-31T14:34:00Z">
         <w:r>
           <w:rPr>
             <w:iCs/>
             <w:color w:val="7030A0"/>
           </w:rPr>
-          <w:t xml:space="preserve">s </w:t>
+          <w:t>means</w:t>
         </w:r>
       </w:ins>
-      <w:ins w:id="104" w:author="Wu, Leihong" w:date="2026-08-28T12:55:00Z" w16du:dateUtc="2026-08-28T17:55:00Z">
+      <w:ins w:id="242" w:author="Wu, Leihong" w:date="2026-08-31T09:23:00Z">
         <w:r>
           <w:rPr>
             <w:iCs/>
             <w:color w:val="7030A0"/>
           </w:rPr>
-          <w:t xml:space="preserve">where the system assigns the correct span but the wrong category (e.g., tagging "suicide attempt" as AE when the expert labelled it MHx), and hallucination of non-entities, such as annotating the section phrase "medical history" as a history entity. </w:t>
+          <w:t xml:space="preserve"> of precision and recall under each scheme</w:t>
         </w:r>
       </w:ins>
-      <w:ins w:id="105" w:author="Wu, Leihong" w:date="2026-08-28T13:07:00Z" w16du:dateUtc="2026-08-28T18:07:00Z">
+      <w:ins w:id="243" w:author="Wu, Leihong" w:date="2026-08-31T09:37:00Z" w16du:dateUtc="2026-08-31T14:37:00Z">
         <w:r>
           <w:rPr>
             <w:iCs/>
             <w:color w:val="7030A0"/>
           </w:rPr>
-          <w:t>Null</w:t>
+          <w:t>,</w:t>
         </w:r>
       </w:ins>
-      <w:ins w:id="106" w:author="Wu, Leihong" w:date="2026-08-28T12:55:00Z" w16du:dateUtc="2026-08-28T17:55:00Z">
+      <w:ins w:id="244" w:author="Wu, Leihong" w:date="2026-08-31T09:23:00Z">
         <w:r>
           <w:rPr>
             <w:iCs/>
             <w:color w:val="7030A0"/>
           </w:rPr>
-          <w:t xml:space="preserve"> occurs when the system produces no prediction for a reference span, such as missing "major depression" as a documented medical history.</w:t>
+          <w:t xml:space="preserve"> </w:t>
+        </w:r>
+      </w:ins>
+      <w:ins w:id="245" w:author="Wu, Leihong" w:date="2026-08-31T09:37:00Z" w16du:dateUtc="2026-08-31T14:37:00Z">
+        <w:r>
+          <w:rPr>
+            <w:iCs/>
+            <w:color w:val="7030A0"/>
+          </w:rPr>
+          <w:t xml:space="preserve">all P/R/F1 were measured in Micro-Level; </w:t>
+        </w:r>
+      </w:ins>
+      <w:ins w:id="246" w:author="Wu, Leihong" w:date="2026-08-31T09:23:00Z">
+        <w:r>
+          <w:rPr>
+            <w:iCs/>
+            <w:color w:val="7030A0"/>
+          </w:rPr>
+          <w:t>per-category metrics were reported separately.</w:t>
+        </w:r>
+      </w:ins>
+      <w:ins w:id="247" w:author="Wu, Leihong" w:date="2026-08-31T09:37:00Z" w16du:dateUtc="2026-08-31T14:37:00Z">
+        <w:r>
+          <w:rPr>
+            <w:iCs/>
+            <w:color w:val="7030A0"/>
+          </w:rPr>
+          <w:t xml:space="preserve"> </w:t>
         </w:r>
       </w:ins>
     </w:p>
     <w:p>
-      <w:ins w:id="107" w:author="Wu, Leihong" w:date="2026-08-28T13:44:00Z" w16du:dateUtc="2026-08-28T18:44:00Z">
-        <w:r>
-          <w:t>After all</w:t>
-        </w:r>
-        <w:r>
-          <w:t xml:space="preserve">, Match was considered as True Positive, where </w:t>
-        </w:r>
-        <w:r>
-          <w:t>the</w:t>
-        </w:r>
-        <w:r>
-          <w:t xml:space="preserve"> automated </w:t>
-        </w:r>
-        <w:r>
-          <w:t xml:space="preserve">system span exactly matches a </w:t>
-        </w:r>
-        <w:r>
-          <w:t>reference</w:t>
-        </w:r>
-        <w:r>
-          <w:t xml:space="preserve"> span in both boundaries and label</w:t>
-        </w:r>
-        <w:r>
-          <w:t xml:space="preserve">; Conflation and Spurious were considered as False Positive, and Null was considered as False Negative. </w:t>
-        </w:r>
-      </w:ins>
-      <w:r>
-        <w:t>Based on the defin</w:t>
-      </w:r>
-      <w:r>
-        <w:t>ed TP, FP</w:t>
-      </w:r>
-      <w:r>
-        <w:t>,</w:t>
-      </w:r>
-      <w:r>
-        <w:t xml:space="preserve"> and FN</w:t>
-      </w:r>
-      <w:r>
-        <w:t xml:space="preserve">, </w:t>
-      </w:r>
-      <w:r>
-        <w:t xml:space="preserve">we further measured the </w:t>
-      </w:r>
-      <w:r>
-        <w:t xml:space="preserve">precision, recall, and F1-score at </w:t>
-      </w:r>
-      <w:r>
-        <w:t>the</w:t>
-      </w:r>
-      <w:r>
-        <w:t xml:space="preserve"> overall and per-entity levels</w:t>
-      </w:r>
-      <w:ins w:id="108" w:author="Wu, Leihong" w:date="2026-08-28T13:46:00Z" w16du:dateUtc="2026-08-28T18:46:00Z">
-        <w:r>
-          <w:t xml:space="preserve"> (i.e., </w:t>
-        </w:r>
-      </w:ins>
-      <w:ins w:id="109" w:author="Wu, Leihong" w:date="2026-08-28T13:47:00Z" w16du:dateUtc="2026-08-28T18:47:00Z">
-        <w:r>
-          <w:t>Mic</w:t>
-        </w:r>
-      </w:ins>
-      <w:ins w:id="110" w:author="Wu, Leihong" w:date="2026-08-28T13:46:00Z" w16du:dateUtc="2026-08-28T18:46:00Z">
-        <w:r>
-          <w:t>ro)</w:t>
-        </w:r>
-      </w:ins>
-      <w:r>
-        <w:t xml:space="preserve">. </w:t>
-      </w:r>
-      <w:r>
-        <w:t xml:space="preserve">This evaluation requires exact agreement on both </w:t>
-      </w:r>
-      <w:r>
-        <w:lastRenderedPageBreak/>
-        <w:t>span boundaries and entity labels and therefore represents a stringent criterion for model performance.</w:t>
-      </w:r>
-      <w:ins w:id="111" w:author="Wu, Leihong" w:date="2026-08-28T13:46:00Z" w16du:dateUtc="2026-08-28T18:46:00Z">
-        <w:r>
-          <w:t xml:space="preserve"> </w:t>
-        </w:r>
-      </w:ins>
+      <w:pPr>
+        <w:rPr>
+          <w:ins w:id="248" w:author="Wu, Leihong" w:date="2026-08-31T09:15:00Z" w16du:dateUtc="2026-08-31T14:15:00Z"/>
+        </w:rPr>
+      </w:pPr>
+      <w:del w:id="249" w:author="Wu, Leihong" w:date="2026-08-31T09:15:00Z" w16du:dateUtc="2026-08-31T14:15:00Z">
+        <w:r>
+          <w:delText>Based on the defin</w:delText>
+        </w:r>
+        <w:r>
+          <w:delText>ed TP, FP</w:delText>
+        </w:r>
+        <w:r>
+          <w:delText>,</w:delText>
+        </w:r>
+        <w:r>
+          <w:delText xml:space="preserve"> and FN</w:delText>
+        </w:r>
+        <w:r>
+          <w:delText xml:space="preserve">, </w:delText>
+        </w:r>
+        <w:r>
+          <w:delText xml:space="preserve">we further measured the </w:delText>
+        </w:r>
+        <w:r>
+          <w:delText xml:space="preserve">precision, recall, and F1-score at </w:delText>
+        </w:r>
+        <w:r>
+          <w:delText>the</w:delText>
+        </w:r>
+        <w:r>
+          <w:delText xml:space="preserve"> overall and per-entity levels. </w:delText>
+        </w:r>
+        <w:r>
+          <w:delText>This evaluation requires exact agreement on both span boundaries and entity labels and therefore represents a stringent criterion for model performance.</w:delText>
+        </w:r>
+      </w:del>
+    </w:p>
+    <w:p/>
+    <w:p>
+      <w:pPr>
+        <w:pStyle w:val="Heading1"/>
+      </w:pPr>
+      <w:r>
+        <w:t>3. Results</w:t>
+      </w:r>
     </w:p>
     <w:p>
       <w:pPr>
-        <w:pStyle w:val="Heading1"/>
-      </w:pPr>
-      <w:r>
-        <w:t>3. Results</w:t>
+        <w:pStyle w:val="Heading2"/>
+      </w:pPr>
+      <w:r>
+        <w:t>3.1 Annotation Statistics</w:t>
       </w:r>
     </w:p>
     <w:p>
       <w:pPr>
-        <w:pStyle w:val="Heading2"/>
-      </w:pPr>
-      <w:r>
-        <w:t>3.1 Annotation Statistics</w:t>
-      </w:r>
-    </w:p>
-    <w:p>
-      <w:pPr>
         <w:rPr>
           <w:b/>
           <w:bCs/>
@@ -3658,7 +4892,7 @@
       <w:r>
         <w:t xml:space="preserve"> clinical concept categories</w:t>
       </w:r>
-      <w:ins w:id="112" w:author="Wu, Leihong" w:date="2026-08-28T14:16:00Z" w16du:dateUtc="2026-08-28T19:16:00Z">
+      <w:ins w:id="250" w:author="Wu, Leihong" w:date="2026-08-28T14:16:00Z" w16du:dateUtc="2026-08-28T19:16:00Z">
         <w:r>
           <w:t xml:space="preserve">, as summarized in </w:t>
         </w:r>
@@ -3670,7 +4904,7 @@
           <w:t xml:space="preserve">Table </w:t>
         </w:r>
       </w:ins>
-      <w:ins w:id="113" w:author="Wu, Leihong" w:date="2026-08-28T14:17:00Z" w16du:dateUtc="2026-08-28T19:17:00Z">
+      <w:ins w:id="251" w:author="Wu, Leihong" w:date="2026-08-28T14:17:00Z" w16du:dateUtc="2026-08-28T19:17:00Z">
         <w:r>
           <w:rPr>
             <w:b/>
@@ -3680,7 +4914,7 @@
         </w:r>
         <w:r>
           <w:rPr>
-            <w:rPrChange w:id="114" w:author="Wu, Leihong" w:date="2026-08-28T14:17:00Z" w16du:dateUtc="2026-08-28T19:17:00Z">
+            <w:rPrChange w:id="252" w:author="Wu, Leihong" w:date="2026-08-28T14:17:00Z" w16du:dateUtc="2026-08-28T19:17:00Z">
               <w:rPr>
                 <w:b/>
                 <w:bCs/>
@@ -3702,7 +4936,7 @@
           <w:t>included.</w:t>
         </w:r>
       </w:ins>
-      <w:del w:id="115" w:author="Wu, Leihong" w:date="2026-08-28T14:16:00Z" w16du:dateUtc="2026-08-28T19:16:00Z">
+      <w:del w:id="253" w:author="Wu, Leihong" w:date="2026-08-28T14:16:00Z" w16du:dateUtc="2026-08-28T19:16:00Z">
         <w:r>
           <w:delText xml:space="preserve">, </w:delText>
         </w:r>
@@ -3780,7 +5014,7 @@
     <w:p>
       <w:pPr>
         <w:rPr>
-          <w:ins w:id="116" w:author="Wu, Leihong" w:date="2026-08-28T13:59:00Z" w16du:dateUtc="2026-08-28T18:59:00Z"/>
+          <w:ins w:id="254" w:author="Wu, Leihong" w:date="2026-08-28T13:59:00Z" w16du:dateUtc="2026-08-28T18:59:00Z"/>
         </w:rPr>
       </w:pPr>
       <w:r>
@@ -3788,10 +5022,9 @@
           <w:b/>
           <w:bCs/>
         </w:rPr>
-        <w:lastRenderedPageBreak/>
         <w:t xml:space="preserve">Table </w:t>
       </w:r>
-      <w:del w:id="117" w:author="Wu, Leihong" w:date="2026-08-28T11:31:00Z" w16du:dateUtc="2026-08-28T16:31:00Z">
+      <w:del w:id="255" w:author="Wu, Leihong" w:date="2026-08-28T11:31:00Z" w16du:dateUtc="2026-08-28T16:31:00Z">
         <w:r>
           <w:rPr>
             <w:b/>
@@ -3800,7 +5033,7 @@
           <w:delText>1</w:delText>
         </w:r>
       </w:del>
-      <w:ins w:id="118" w:author="Wu, Leihong" w:date="2026-08-28T11:31:00Z" w16du:dateUtc="2026-08-28T16:31:00Z">
+      <w:ins w:id="256" w:author="Wu, Leihong" w:date="2026-08-28T11:31:00Z" w16du:dateUtc="2026-08-28T16:31:00Z">
         <w:r>
           <w:rPr>
             <w:b/>
@@ -5262,12 +6495,12 @@
     <w:p>
       <w:pPr>
         <w:rPr>
-          <w:ins w:id="119" w:author="Wu, Leihong" w:date="2026-08-28T14:00:00Z" w16du:dateUtc="2026-08-28T19:00:00Z"/>
+          <w:ins w:id="257" w:author="Wu, Leihong" w:date="2026-08-28T14:00:00Z" w16du:dateUtc="2026-08-28T19:00:00Z"/>
           <w:sz w:val="20"/>
           <w:szCs w:val="20"/>
         </w:rPr>
       </w:pPr>
-      <w:ins w:id="120" w:author="Wu, Leihong" w:date="2026-08-28T14:00:00Z" w16du:dateUtc="2026-08-28T19:00:00Z">
+      <w:ins w:id="258" w:author="Wu, Leihong" w:date="2026-08-28T14:00:00Z" w16du:dateUtc="2026-08-28T19:00:00Z">
         <w:r>
           <w:rPr>
             <w:sz w:val="20"/>
@@ -5276,7 +6509,7 @@
           <w:t xml:space="preserve">  - † ETHER does not distinguish drug roles</w:t>
         </w:r>
       </w:ins>
-      <w:ins w:id="121" w:author="Wu, Leihong" w:date="2026-08-28T14:15:00Z" w16du:dateUtc="2026-08-28T19:15:00Z">
+      <w:ins w:id="259" w:author="Wu, Leihong" w:date="2026-08-28T14:15:00Z" w16du:dateUtc="2026-08-28T19:15:00Z">
         <w:r>
           <w:rPr>
             <w:sz w:val="20"/>
@@ -5285,7 +6518,7 @@
           <w:t xml:space="preserve"> or AE types</w:t>
         </w:r>
       </w:ins>
-      <w:ins w:id="122" w:author="Wu, Leihong" w:date="2026-08-28T14:00:00Z" w16du:dateUtc="2026-08-28T19:00:00Z">
+      <w:ins w:id="260" w:author="Wu, Leihong" w:date="2026-08-28T14:00:00Z" w16du:dateUtc="2026-08-28T19:00:00Z">
         <w:r>
           <w:rPr>
             <w:sz w:val="20"/>
@@ -5294,7 +6527,7 @@
           <w:t xml:space="preserve"> — all drug </w:t>
         </w:r>
       </w:ins>
-      <w:ins w:id="123" w:author="Wu, Leihong" w:date="2026-08-28T14:15:00Z" w16du:dateUtc="2026-08-28T19:15:00Z">
+      <w:ins w:id="261" w:author="Wu, Leihong" w:date="2026-08-28T14:15:00Z" w16du:dateUtc="2026-08-28T19:15:00Z">
         <w:r>
           <w:rPr>
             <w:sz w:val="20"/>
@@ -5303,7 +6536,7 @@
           <w:t xml:space="preserve">and AE </w:t>
         </w:r>
       </w:ins>
-      <w:ins w:id="124" w:author="Wu, Leihong" w:date="2026-08-28T14:00:00Z" w16du:dateUtc="2026-08-28T19:00:00Z">
+      <w:ins w:id="262" w:author="Wu, Leihong" w:date="2026-08-28T14:00:00Z" w16du:dateUtc="2026-08-28T19:00:00Z">
         <w:r>
           <w:rPr>
             <w:sz w:val="20"/>
@@ -5312,7 +6545,7 @@
           <w:t>mentions are output under a single DRUG tag (17,</w:t>
         </w:r>
       </w:ins>
-      <w:ins w:id="125" w:author="Wu, Leihong" w:date="2026-08-28T14:15:00Z" w16du:dateUtc="2026-08-28T19:15:00Z">
+      <w:ins w:id="263" w:author="Wu, Leihong" w:date="2026-08-28T14:15:00Z" w16du:dateUtc="2026-08-28T19:15:00Z">
         <w:r>
           <w:rPr>
             <w:sz w:val="20"/>
@@ -5321,7 +6554,7 @@
           <w:t>164</w:t>
         </w:r>
       </w:ins>
-      <w:ins w:id="126" w:author="Wu, Leihong" w:date="2026-08-28T14:00:00Z" w16du:dateUtc="2026-08-28T19:00:00Z">
+      <w:ins w:id="264" w:author="Wu, Leihong" w:date="2026-08-28T14:00:00Z" w16du:dateUtc="2026-08-28T19:00:00Z">
         <w:r>
           <w:rPr>
             <w:sz w:val="20"/>
@@ -5330,7 +6563,7 @@
           <w:t>3)</w:t>
         </w:r>
       </w:ins>
-      <w:ins w:id="127" w:author="Wu, Leihong" w:date="2026-08-28T14:15:00Z" w16du:dateUtc="2026-08-28T19:15:00Z">
+      <w:ins w:id="265" w:author="Wu, Leihong" w:date="2026-08-28T14:15:00Z" w16du:dateUtc="2026-08-28T19:15:00Z">
         <w:r>
           <w:rPr>
             <w:sz w:val="20"/>
@@ -5339,7 +6572,7 @@
           <w:t xml:space="preserve"> and AE tag (25031)</w:t>
         </w:r>
       </w:ins>
-      <w:ins w:id="128" w:author="Wu, Leihong" w:date="2026-08-28T14:00:00Z" w16du:dateUtc="2026-08-28T19:00:00Z">
+      <w:ins w:id="266" w:author="Wu, Leihong" w:date="2026-08-28T14:00:00Z" w16du:dateUtc="2026-08-28T19:00:00Z">
         <w:r>
           <w:rPr>
             <w:sz w:val="20"/>
@@ -5367,7 +6600,7 @@
         <w:trPr>
           <w:trHeight w:val="144"/>
           <w:jc w:val="center"/>
-          <w:del w:id="129" w:author="Wu, Leihong" w:date="2026-08-28T13:59:00Z" w16du:dateUtc="2026-08-28T18:59:00Z"/>
+          <w:del w:id="267" w:author="Wu, Leihong" w:date="2026-08-28T13:59:00Z"/>
         </w:trPr>
         <w:tc>
           <w:tcPr>
@@ -5380,7 +6613,7 @@
             <w:pPr>
               <w:jc w:val="center"/>
               <w:rPr>
-                <w:del w:id="130" w:author="Wu, Leihong" w:date="2026-08-28T13:59:00Z" w16du:dateUtc="2026-08-28T18:59:00Z"/>
+                <w:del w:id="268" w:author="Wu, Leihong" w:date="2026-08-28T13:59:00Z" w16du:dateUtc="2026-08-28T18:59:00Z"/>
                 <w:rFonts w:ascii="Times New Roman" w:eastAsia="Times New Roman" w:hAnsi="Times New Roman" w:cs="Times New Roman"/>
                 <w:sz w:val="24"/>
                 <w14:ligatures w14:val="none"/>
@@ -5398,7 +6631,7 @@
             <w:pPr>
               <w:jc w:val="center"/>
               <w:rPr>
-                <w:del w:id="131" w:author="Wu, Leihong" w:date="2026-08-28T13:59:00Z" w16du:dateUtc="2026-08-28T18:59:00Z"/>
+                <w:del w:id="269" w:author="Wu, Leihong" w:date="2026-08-28T13:59:00Z" w16du:dateUtc="2026-08-28T18:59:00Z"/>
                 <w:rFonts w:ascii="Aptos Narrow" w:eastAsia="Times New Roman" w:hAnsi="Aptos Narrow" w:cs="Times New Roman"/>
                 <w:b/>
                 <w:bCs/>
@@ -5407,7 +6640,7 @@
                 <w14:ligatures w14:val="none"/>
               </w:rPr>
             </w:pPr>
-            <w:del w:id="132" w:author="Wu, Leihong" w:date="2026-08-28T13:59:00Z" w16du:dateUtc="2026-08-28T18:59:00Z">
+            <w:del w:id="270" w:author="Wu, Leihong" w:date="2026-08-28T13:59:00Z" w16du:dateUtc="2026-08-28T18:59:00Z">
               <w:r>
                 <w:rPr>
                   <w:rFonts w:ascii="Aptos Narrow" w:eastAsia="Times New Roman" w:hAnsi="Aptos Narrow" w:cs="Times New Roman"/>
@@ -5432,7 +6665,7 @@
             <w:pPr>
               <w:jc w:val="center"/>
               <w:rPr>
-                <w:del w:id="133" w:author="Wu, Leihong" w:date="2026-08-28T13:59:00Z" w16du:dateUtc="2026-08-28T18:59:00Z"/>
+                <w:del w:id="271" w:author="Wu, Leihong" w:date="2026-08-28T13:59:00Z" w16du:dateUtc="2026-08-28T18:59:00Z"/>
                 <w:rFonts w:ascii="Aptos Narrow" w:eastAsia="Times New Roman" w:hAnsi="Aptos Narrow" w:cs="Times New Roman"/>
                 <w:b/>
                 <w:bCs/>
@@ -5441,7 +6674,7 @@
                 <w14:ligatures w14:val="none"/>
               </w:rPr>
             </w:pPr>
-            <w:del w:id="134" w:author="Wu, Leihong" w:date="2026-08-28T13:59:00Z" w16du:dateUtc="2026-08-28T18:59:00Z">
+            <w:del w:id="272" w:author="Wu, Leihong" w:date="2026-08-28T13:59:00Z" w16du:dateUtc="2026-08-28T18:59:00Z">
               <w:r>
                 <w:rPr>
                   <w:rFonts w:ascii="Aptos Narrow" w:eastAsia="Times New Roman" w:hAnsi="Aptos Narrow" w:cs="Times New Roman"/>
@@ -5477,7 +6710,7 @@
             <w:pPr>
               <w:jc w:val="center"/>
               <w:rPr>
-                <w:del w:id="135" w:author="Wu, Leihong" w:date="2026-08-28T13:59:00Z" w16du:dateUtc="2026-08-28T18:59:00Z"/>
+                <w:del w:id="273" w:author="Wu, Leihong" w:date="2026-08-28T13:59:00Z" w16du:dateUtc="2026-08-28T18:59:00Z"/>
                 <w:rFonts w:ascii="Aptos Narrow" w:eastAsia="Times New Roman" w:hAnsi="Aptos Narrow" w:cs="Times New Roman"/>
                 <w:b/>
                 <w:bCs/>
@@ -5486,7 +6719,7 @@
                 <w14:ligatures w14:val="none"/>
               </w:rPr>
             </w:pPr>
-            <w:del w:id="136" w:author="Wu, Leihong" w:date="2026-08-28T13:59:00Z" w16du:dateUtc="2026-08-28T18:59:00Z">
+            <w:del w:id="274" w:author="Wu, Leihong" w:date="2026-08-28T13:59:00Z" w16du:dateUtc="2026-08-28T18:59:00Z">
               <w:r>
                 <w:rPr>
                   <w:rFonts w:ascii="Aptos Narrow" w:eastAsia="Times New Roman" w:hAnsi="Aptos Narrow" w:cs="Times New Roman"/>
@@ -5506,7 +6739,7 @@
         <w:trPr>
           <w:trHeight w:val="144"/>
           <w:jc w:val="center"/>
-          <w:del w:id="137" w:author="Wu, Leihong" w:date="2026-08-28T13:59:00Z" w16du:dateUtc="2026-08-28T18:59:00Z"/>
+          <w:del w:id="275" w:author="Wu, Leihong" w:date="2026-08-28T13:59:00Z"/>
         </w:trPr>
         <w:tc>
           <w:tcPr>
@@ -5518,7 +6751,7 @@
             <w:pPr>
               <w:jc w:val="center"/>
               <w:rPr>
-                <w:del w:id="138" w:author="Wu, Leihong" w:date="2026-08-28T13:59:00Z" w16du:dateUtc="2026-08-28T18:59:00Z"/>
+                <w:del w:id="276" w:author="Wu, Leihong" w:date="2026-08-28T13:59:00Z" w16du:dateUtc="2026-08-28T18:59:00Z"/>
                 <w:rFonts w:ascii="Aptos Narrow" w:eastAsia="Times New Roman" w:hAnsi="Aptos Narrow" w:cs="Times New Roman"/>
                 <w:b/>
                 <w:bCs/>
@@ -5527,7 +6760,7 @@
                 <w14:ligatures w14:val="none"/>
               </w:rPr>
             </w:pPr>
-            <w:del w:id="139" w:author="Wu, Leihong" w:date="2026-08-28T13:59:00Z" w16du:dateUtc="2026-08-28T18:59:00Z">
+            <w:del w:id="277" w:author="Wu, Leihong" w:date="2026-08-28T13:59:00Z" w16du:dateUtc="2026-08-28T18:59:00Z">
               <w:r>
                 <w:rPr>
                   <w:rFonts w:ascii="Aptos Narrow" w:eastAsia="Times New Roman" w:hAnsi="Aptos Narrow" w:cs="Times New Roman"/>
@@ -5553,13 +6786,13 @@
             <w:pPr>
               <w:jc w:val="center"/>
               <w:rPr>
-                <w:del w:id="140" w:author="Wu, Leihong" w:date="2026-08-28T13:59:00Z" w16du:dateUtc="2026-08-28T18:59:00Z"/>
+                <w:del w:id="278" w:author="Wu, Leihong" w:date="2026-08-28T13:59:00Z" w16du:dateUtc="2026-08-28T18:59:00Z"/>
                 <w:rFonts w:ascii="Aptos Narrow" w:eastAsia="Times New Roman" w:hAnsi="Aptos Narrow" w:cs="Times New Roman"/>
                 <w:color w:val="000000"/>
                 <w14:ligatures w14:val="none"/>
               </w:rPr>
             </w:pPr>
-            <w:del w:id="141" w:author="Wu, Leihong" w:date="2026-08-28T13:59:00Z" w16du:dateUtc="2026-08-28T18:59:00Z">
+            <w:del w:id="279" w:author="Wu, Leihong" w:date="2026-08-28T13:59:00Z" w16du:dateUtc="2026-08-28T18:59:00Z">
               <w:r>
                 <w:rPr>
                   <w:rFonts w:ascii="Aptos Narrow" w:eastAsia="Times New Roman" w:hAnsi="Aptos Narrow" w:cs="Times New Roman"/>
@@ -5582,13 +6815,13 @@
             <w:pPr>
               <w:jc w:val="center"/>
               <w:rPr>
-                <w:del w:id="142" w:author="Wu, Leihong" w:date="2026-08-28T13:59:00Z" w16du:dateUtc="2026-08-28T18:59:00Z"/>
+                <w:del w:id="280" w:author="Wu, Leihong" w:date="2026-08-28T13:59:00Z" w16du:dateUtc="2026-08-28T18:59:00Z"/>
                 <w:rFonts w:ascii="Aptos Narrow" w:eastAsia="Times New Roman" w:hAnsi="Aptos Narrow" w:cs="Times New Roman"/>
                 <w:color w:val="000000"/>
                 <w14:ligatures w14:val="none"/>
               </w:rPr>
             </w:pPr>
-            <w:del w:id="143" w:author="Wu, Leihong" w:date="2026-08-28T13:59:00Z" w16du:dateUtc="2026-08-28T18:59:00Z">
+            <w:del w:id="281" w:author="Wu, Leihong" w:date="2026-08-28T13:59:00Z" w16du:dateUtc="2026-08-28T18:59:00Z">
               <w:r>
                 <w:rPr>
                   <w:rFonts w:ascii="Aptos Narrow" w:eastAsia="Times New Roman" w:hAnsi="Aptos Narrow" w:cs="Times New Roman"/>
@@ -5611,13 +6844,13 @@
             <w:pPr>
               <w:jc w:val="center"/>
               <w:rPr>
-                <w:del w:id="144" w:author="Wu, Leihong" w:date="2026-08-28T13:59:00Z" w16du:dateUtc="2026-08-28T18:59:00Z"/>
+                <w:del w:id="282" w:author="Wu, Leihong" w:date="2026-08-28T13:59:00Z" w16du:dateUtc="2026-08-28T18:59:00Z"/>
                 <w:rFonts w:ascii="Aptos Narrow" w:eastAsia="Times New Roman" w:hAnsi="Aptos Narrow" w:cs="Times New Roman"/>
                 <w:color w:val="000000"/>
                 <w14:ligatures w14:val="none"/>
               </w:rPr>
             </w:pPr>
-            <w:del w:id="145" w:author="Wu, Leihong" w:date="2026-08-28T13:59:00Z" w16du:dateUtc="2026-08-28T18:59:00Z">
+            <w:del w:id="283" w:author="Wu, Leihong" w:date="2026-08-28T13:59:00Z" w16du:dateUtc="2026-08-28T18:59:00Z">
               <w:r>
                 <w:rPr>
                   <w:rFonts w:ascii="Aptos Narrow" w:eastAsia="Times New Roman" w:hAnsi="Aptos Narrow" w:cs="Times New Roman"/>
@@ -5634,7 +6867,7 @@
         <w:trPr>
           <w:trHeight w:val="144"/>
           <w:jc w:val="center"/>
-          <w:del w:id="146" w:author="Wu, Leihong" w:date="2026-08-28T13:59:00Z" w16du:dateUtc="2026-08-28T18:59:00Z"/>
+          <w:del w:id="284" w:author="Wu, Leihong" w:date="2026-08-28T13:59:00Z"/>
         </w:trPr>
         <w:tc>
           <w:tcPr>
@@ -5646,7 +6879,7 @@
             <w:pPr>
               <w:jc w:val="center"/>
               <w:rPr>
-                <w:del w:id="147" w:author="Wu, Leihong" w:date="2026-08-28T13:59:00Z" w16du:dateUtc="2026-08-28T18:59:00Z"/>
+                <w:del w:id="285" w:author="Wu, Leihong" w:date="2026-08-28T13:59:00Z" w16du:dateUtc="2026-08-28T18:59:00Z"/>
                 <w:rFonts w:ascii="Aptos Narrow" w:eastAsia="Times New Roman" w:hAnsi="Aptos Narrow" w:cs="Times New Roman"/>
                 <w:b/>
                 <w:bCs/>
@@ -5655,7 +6888,7 @@
                 <w14:ligatures w14:val="none"/>
               </w:rPr>
             </w:pPr>
-            <w:del w:id="148" w:author="Wu, Leihong" w:date="2026-08-28T13:59:00Z" w16du:dateUtc="2026-08-28T18:59:00Z">
+            <w:del w:id="286" w:author="Wu, Leihong" w:date="2026-08-28T13:59:00Z" w16du:dateUtc="2026-08-28T18:59:00Z">
               <w:r>
                 <w:rPr>
                   <w:rFonts w:ascii="Aptos Narrow" w:eastAsia="Times New Roman" w:hAnsi="Aptos Narrow" w:cs="Times New Roman"/>
@@ -5681,13 +6914,13 @@
             <w:pPr>
               <w:jc w:val="center"/>
               <w:rPr>
-                <w:del w:id="149" w:author="Wu, Leihong" w:date="2026-08-28T13:59:00Z" w16du:dateUtc="2026-08-28T18:59:00Z"/>
+                <w:del w:id="287" w:author="Wu, Leihong" w:date="2026-08-28T13:59:00Z" w16du:dateUtc="2026-08-28T18:59:00Z"/>
                 <w:rFonts w:ascii="Aptos Narrow" w:eastAsia="Times New Roman" w:hAnsi="Aptos Narrow" w:cs="Times New Roman"/>
                 <w:color w:val="000000"/>
                 <w14:ligatures w14:val="none"/>
               </w:rPr>
             </w:pPr>
-            <w:del w:id="150" w:author="Wu, Leihong" w:date="2026-08-28T13:59:00Z" w16du:dateUtc="2026-08-28T18:59:00Z">
+            <w:del w:id="288" w:author="Wu, Leihong" w:date="2026-08-28T13:59:00Z" w16du:dateUtc="2026-08-28T18:59:00Z">
               <w:r>
                 <w:rPr>
                   <w:rFonts w:ascii="Aptos Narrow" w:eastAsia="Times New Roman" w:hAnsi="Aptos Narrow" w:cs="Times New Roman"/>
@@ -5711,13 +6944,13 @@
             <w:pPr>
               <w:jc w:val="center"/>
               <w:rPr>
-                <w:del w:id="151" w:author="Wu, Leihong" w:date="2026-08-28T13:59:00Z" w16du:dateUtc="2026-08-28T18:59:00Z"/>
+                <w:del w:id="289" w:author="Wu, Leihong" w:date="2026-08-28T13:59:00Z" w16du:dateUtc="2026-08-28T18:59:00Z"/>
                 <w:rFonts w:ascii="Aptos Narrow" w:eastAsia="Times New Roman" w:hAnsi="Aptos Narrow" w:cs="Times New Roman"/>
                 <w:color w:val="000000"/>
                 <w14:ligatures w14:val="none"/>
               </w:rPr>
             </w:pPr>
-            <w:del w:id="152" w:author="Wu, Leihong" w:date="2026-08-28T13:59:00Z" w16du:dateUtc="2026-08-28T18:59:00Z">
+            <w:del w:id="290" w:author="Wu, Leihong" w:date="2026-08-28T13:59:00Z" w16du:dateUtc="2026-08-28T18:59:00Z">
               <w:r>
                 <w:rPr>
                   <w:rFonts w:ascii="Aptos Narrow" w:eastAsia="Times New Roman" w:hAnsi="Aptos Narrow" w:cs="Times New Roman"/>
@@ -5748,13 +6981,13 @@
             <w:pPr>
               <w:jc w:val="center"/>
               <w:rPr>
-                <w:del w:id="153" w:author="Wu, Leihong" w:date="2026-08-28T13:59:00Z" w16du:dateUtc="2026-08-28T18:59:00Z"/>
+                <w:del w:id="291" w:author="Wu, Leihong" w:date="2026-08-28T13:59:00Z" w16du:dateUtc="2026-08-28T18:59:00Z"/>
                 <w:rFonts w:ascii="Aptos Narrow" w:eastAsia="Times New Roman" w:hAnsi="Aptos Narrow" w:cs="Times New Roman"/>
                 <w:color w:val="000000"/>
                 <w14:ligatures w14:val="none"/>
               </w:rPr>
             </w:pPr>
-            <w:del w:id="154" w:author="Wu, Leihong" w:date="2026-08-28T13:59:00Z" w16du:dateUtc="2026-08-28T18:59:00Z">
+            <w:del w:id="292" w:author="Wu, Leihong" w:date="2026-08-28T13:59:00Z" w16du:dateUtc="2026-08-28T18:59:00Z">
               <w:r>
                 <w:rPr>
                   <w:rFonts w:ascii="Aptos Narrow" w:eastAsia="Times New Roman" w:hAnsi="Aptos Narrow" w:cs="Times New Roman"/>
@@ -5771,7 +7004,7 @@
         <w:trPr>
           <w:trHeight w:val="144"/>
           <w:jc w:val="center"/>
-          <w:del w:id="155" w:author="Wu, Leihong" w:date="2026-08-28T13:59:00Z" w16du:dateUtc="2026-08-28T18:59:00Z"/>
+          <w:del w:id="293" w:author="Wu, Leihong" w:date="2026-08-28T13:59:00Z"/>
         </w:trPr>
         <w:tc>
           <w:tcPr>
@@ -5782,7 +7015,7 @@
             <w:pPr>
               <w:jc w:val="center"/>
               <w:rPr>
-                <w:del w:id="156" w:author="Wu, Leihong" w:date="2026-08-28T13:59:00Z" w16du:dateUtc="2026-08-28T18:59:00Z"/>
+                <w:del w:id="294" w:author="Wu, Leihong" w:date="2026-08-28T13:59:00Z" w16du:dateUtc="2026-08-28T18:59:00Z"/>
                 <w:rFonts w:ascii="Aptos Narrow" w:eastAsia="Times New Roman" w:hAnsi="Aptos Narrow" w:cs="Times New Roman"/>
                 <w:b/>
                 <w:bCs/>
@@ -5790,7 +7023,7 @@
                 <w14:ligatures w14:val="none"/>
               </w:rPr>
             </w:pPr>
-            <w:del w:id="157" w:author="Wu, Leihong" w:date="2026-08-28T13:59:00Z" w16du:dateUtc="2026-08-28T18:59:00Z">
+            <w:del w:id="295" w:author="Wu, Leihong" w:date="2026-08-28T13:59:00Z" w16du:dateUtc="2026-08-28T18:59:00Z">
               <w:r>
                 <w:rPr>
                   <w:rFonts w:ascii="Aptos Narrow" w:eastAsia="Times New Roman" w:hAnsi="Aptos Narrow" w:cs="Times New Roman"/>
@@ -5815,13 +7048,13 @@
             <w:pPr>
               <w:jc w:val="center"/>
               <w:rPr>
-                <w:del w:id="158" w:author="Wu, Leihong" w:date="2026-08-28T13:59:00Z" w16du:dateUtc="2026-08-28T18:59:00Z"/>
+                <w:del w:id="296" w:author="Wu, Leihong" w:date="2026-08-28T13:59:00Z" w16du:dateUtc="2026-08-28T18:59:00Z"/>
                 <w:rFonts w:ascii="Aptos Narrow" w:eastAsia="Times New Roman" w:hAnsi="Aptos Narrow" w:cs="Times New Roman"/>
                 <w:color w:val="000000"/>
                 <w14:ligatures w14:val="none"/>
               </w:rPr>
             </w:pPr>
-            <w:del w:id="159" w:author="Wu, Leihong" w:date="2026-08-28T13:59:00Z" w16du:dateUtc="2026-08-28T18:59:00Z">
+            <w:del w:id="297" w:author="Wu, Leihong" w:date="2026-08-28T13:59:00Z" w16du:dateUtc="2026-08-28T18:59:00Z">
               <w:r>
                 <w:rPr>
                   <w:rFonts w:ascii="Aptos Narrow" w:eastAsia="Times New Roman" w:hAnsi="Aptos Narrow" w:cs="Times New Roman"/>
@@ -5844,7 +7077,7 @@
             <w:pPr>
               <w:jc w:val="center"/>
               <w:rPr>
-                <w:del w:id="160" w:author="Wu, Leihong" w:date="2026-08-28T13:59:00Z" w16du:dateUtc="2026-08-28T18:59:00Z"/>
+                <w:del w:id="298" w:author="Wu, Leihong" w:date="2026-08-28T13:59:00Z" w16du:dateUtc="2026-08-28T18:59:00Z"/>
                 <w:rFonts w:ascii="Aptos Narrow" w:eastAsia="Times New Roman" w:hAnsi="Aptos Narrow" w:cs="Times New Roman"/>
                 <w:color w:val="000000"/>
                 <w14:ligatures w14:val="none"/>
@@ -5862,13 +7095,13 @@
             <w:pPr>
               <w:jc w:val="center"/>
               <w:rPr>
-                <w:del w:id="161" w:author="Wu, Leihong" w:date="2026-08-28T13:59:00Z" w16du:dateUtc="2026-08-28T18:59:00Z"/>
+                <w:del w:id="299" w:author="Wu, Leihong" w:date="2026-08-28T13:59:00Z" w16du:dateUtc="2026-08-28T18:59:00Z"/>
                 <w:rFonts w:ascii="Aptos Narrow" w:eastAsia="Times New Roman" w:hAnsi="Aptos Narrow" w:cs="Times New Roman"/>
                 <w:color w:val="000000"/>
                 <w14:ligatures w14:val="none"/>
               </w:rPr>
             </w:pPr>
-            <w:del w:id="162" w:author="Wu, Leihong" w:date="2026-08-28T13:59:00Z" w16du:dateUtc="2026-08-28T18:59:00Z">
+            <w:del w:id="300" w:author="Wu, Leihong" w:date="2026-08-28T13:59:00Z" w16du:dateUtc="2026-08-28T18:59:00Z">
               <w:r>
                 <w:rPr>
                   <w:rFonts w:ascii="Aptos Narrow" w:eastAsia="Times New Roman" w:hAnsi="Aptos Narrow" w:cs="Times New Roman"/>
@@ -5885,7 +7118,7 @@
         <w:trPr>
           <w:trHeight w:val="144"/>
           <w:jc w:val="center"/>
-          <w:del w:id="163" w:author="Wu, Leihong" w:date="2026-08-28T13:59:00Z" w16du:dateUtc="2026-08-28T18:59:00Z"/>
+          <w:del w:id="301" w:author="Wu, Leihong" w:date="2026-08-28T13:59:00Z"/>
         </w:trPr>
         <w:tc>
           <w:tcPr>
@@ -5897,7 +7130,7 @@
             <w:pPr>
               <w:jc w:val="center"/>
               <w:rPr>
-                <w:del w:id="164" w:author="Wu, Leihong" w:date="2026-08-28T13:59:00Z" w16du:dateUtc="2026-08-28T18:59:00Z"/>
+                <w:del w:id="302" w:author="Wu, Leihong" w:date="2026-08-28T13:59:00Z" w16du:dateUtc="2026-08-28T18:59:00Z"/>
                 <w:rFonts w:ascii="Aptos Narrow" w:eastAsia="Times New Roman" w:hAnsi="Aptos Narrow" w:cs="Times New Roman"/>
                 <w:b/>
                 <w:bCs/>
@@ -5906,7 +7139,7 @@
                 <w14:ligatures w14:val="none"/>
               </w:rPr>
             </w:pPr>
-            <w:del w:id="165" w:author="Wu, Leihong" w:date="2026-08-28T13:59:00Z" w16du:dateUtc="2026-08-28T18:59:00Z">
+            <w:del w:id="303" w:author="Wu, Leihong" w:date="2026-08-28T13:59:00Z" w16du:dateUtc="2026-08-28T18:59:00Z">
               <w:r>
                 <w:rPr>
                   <w:rFonts w:ascii="Aptos Narrow" w:eastAsia="Times New Roman" w:hAnsi="Aptos Narrow" w:cs="Times New Roman"/>
@@ -5932,13 +7165,13 @@
             <w:pPr>
               <w:jc w:val="center"/>
               <w:rPr>
-                <w:del w:id="166" w:author="Wu, Leihong" w:date="2026-08-28T13:59:00Z" w16du:dateUtc="2026-08-28T18:59:00Z"/>
+                <w:del w:id="304" w:author="Wu, Leihong" w:date="2026-08-28T13:59:00Z" w16du:dateUtc="2026-08-28T18:59:00Z"/>
                 <w:rFonts w:ascii="Aptos Narrow" w:eastAsia="Times New Roman" w:hAnsi="Aptos Narrow" w:cs="Times New Roman"/>
                 <w:color w:val="000000"/>
                 <w14:ligatures w14:val="none"/>
               </w:rPr>
             </w:pPr>
-            <w:del w:id="167" w:author="Wu, Leihong" w:date="2026-08-28T13:59:00Z" w16du:dateUtc="2026-08-28T18:59:00Z">
+            <w:del w:id="305" w:author="Wu, Leihong" w:date="2026-08-28T13:59:00Z" w16du:dateUtc="2026-08-28T18:59:00Z">
               <w:r>
                 <w:rPr>
                   <w:rFonts w:ascii="Aptos Narrow" w:eastAsia="Times New Roman" w:hAnsi="Aptos Narrow" w:cs="Times New Roman"/>
@@ -5961,13 +7194,13 @@
             <w:pPr>
               <w:jc w:val="center"/>
               <w:rPr>
-                <w:del w:id="168" w:author="Wu, Leihong" w:date="2026-08-28T13:59:00Z" w16du:dateUtc="2026-08-28T18:59:00Z"/>
+                <w:del w:id="306" w:author="Wu, Leihong" w:date="2026-08-28T13:59:00Z" w16du:dateUtc="2026-08-28T18:59:00Z"/>
                 <w:rFonts w:ascii="Aptos Narrow" w:eastAsia="Times New Roman" w:hAnsi="Aptos Narrow" w:cs="Times New Roman"/>
                 <w:color w:val="000000"/>
                 <w14:ligatures w14:val="none"/>
               </w:rPr>
             </w:pPr>
-            <w:del w:id="169" w:author="Wu, Leihong" w:date="2026-08-28T13:59:00Z" w16du:dateUtc="2026-08-28T18:59:00Z">
+            <w:del w:id="307" w:author="Wu, Leihong" w:date="2026-08-28T13:59:00Z" w16du:dateUtc="2026-08-28T18:59:00Z">
               <w:r>
                 <w:rPr>
                   <w:rFonts w:ascii="Aptos Narrow" w:eastAsia="Times New Roman" w:hAnsi="Aptos Narrow" w:cs="Times New Roman"/>
@@ -5998,13 +7231,13 @@
             <w:pPr>
               <w:jc w:val="center"/>
               <w:rPr>
-                <w:del w:id="170" w:author="Wu, Leihong" w:date="2026-08-28T13:59:00Z" w16du:dateUtc="2026-08-28T18:59:00Z"/>
+                <w:del w:id="308" w:author="Wu, Leihong" w:date="2026-08-28T13:59:00Z" w16du:dateUtc="2026-08-28T18:59:00Z"/>
                 <w:rFonts w:ascii="Aptos Narrow" w:eastAsia="Times New Roman" w:hAnsi="Aptos Narrow" w:cs="Times New Roman"/>
                 <w:color w:val="000000"/>
                 <w14:ligatures w14:val="none"/>
               </w:rPr>
             </w:pPr>
-            <w:del w:id="171" w:author="Wu, Leihong" w:date="2026-08-28T13:59:00Z" w16du:dateUtc="2026-08-28T18:59:00Z">
+            <w:del w:id="309" w:author="Wu, Leihong" w:date="2026-08-28T13:59:00Z" w16du:dateUtc="2026-08-28T18:59:00Z">
               <w:r>
                 <w:rPr>
                   <w:rFonts w:ascii="Aptos Narrow" w:eastAsia="Times New Roman" w:hAnsi="Aptos Narrow" w:cs="Times New Roman"/>
@@ -6021,7 +7254,7 @@
         <w:trPr>
           <w:trHeight w:val="144"/>
           <w:jc w:val="center"/>
-          <w:del w:id="172" w:author="Wu, Leihong" w:date="2026-08-28T13:59:00Z" w16du:dateUtc="2026-08-28T18:59:00Z"/>
+          <w:del w:id="310" w:author="Wu, Leihong" w:date="2026-08-28T13:59:00Z"/>
         </w:trPr>
         <w:tc>
           <w:tcPr>
@@ -6033,7 +7266,7 @@
             <w:pPr>
               <w:jc w:val="center"/>
               <w:rPr>
-                <w:del w:id="173" w:author="Wu, Leihong" w:date="2026-08-28T13:59:00Z" w16du:dateUtc="2026-08-28T18:59:00Z"/>
+                <w:del w:id="311" w:author="Wu, Leihong" w:date="2026-08-28T13:59:00Z" w16du:dateUtc="2026-08-28T18:59:00Z"/>
                 <w:rFonts w:ascii="Aptos Narrow" w:eastAsia="Times New Roman" w:hAnsi="Aptos Narrow" w:cs="Times New Roman"/>
                 <w:b/>
                 <w:bCs/>
@@ -6042,7 +7275,7 @@
                 <w14:ligatures w14:val="none"/>
               </w:rPr>
             </w:pPr>
-            <w:del w:id="174" w:author="Wu, Leihong" w:date="2026-08-28T13:59:00Z" w16du:dateUtc="2026-08-28T18:59:00Z">
+            <w:del w:id="312" w:author="Wu, Leihong" w:date="2026-08-28T13:59:00Z" w16du:dateUtc="2026-08-28T18:59:00Z">
               <w:r>
                 <w:rPr>
                   <w:rFonts w:ascii="Aptos Narrow" w:eastAsia="Times New Roman" w:hAnsi="Aptos Narrow" w:cs="Times New Roman"/>
@@ -6068,13 +7301,13 @@
             <w:pPr>
               <w:jc w:val="center"/>
               <w:rPr>
-                <w:del w:id="175" w:author="Wu, Leihong" w:date="2026-08-28T13:59:00Z" w16du:dateUtc="2026-08-28T18:59:00Z"/>
+                <w:del w:id="313" w:author="Wu, Leihong" w:date="2026-08-28T13:59:00Z" w16du:dateUtc="2026-08-28T18:59:00Z"/>
                 <w:rFonts w:ascii="Aptos Narrow" w:eastAsia="Times New Roman" w:hAnsi="Aptos Narrow" w:cs="Times New Roman"/>
                 <w:color w:val="000000"/>
                 <w14:ligatures w14:val="none"/>
               </w:rPr>
             </w:pPr>
-            <w:del w:id="176" w:author="Wu, Leihong" w:date="2026-08-28T13:59:00Z" w16du:dateUtc="2026-08-28T18:59:00Z">
+            <w:del w:id="314" w:author="Wu, Leihong" w:date="2026-08-28T13:59:00Z" w16du:dateUtc="2026-08-28T18:59:00Z">
               <w:r>
                 <w:rPr>
                   <w:rFonts w:ascii="Aptos Narrow" w:eastAsia="Times New Roman" w:hAnsi="Aptos Narrow" w:cs="Times New Roman"/>
@@ -6097,13 +7330,13 @@
             <w:pPr>
               <w:jc w:val="center"/>
               <w:rPr>
-                <w:del w:id="177" w:author="Wu, Leihong" w:date="2026-08-28T13:59:00Z" w16du:dateUtc="2026-08-28T18:59:00Z"/>
+                <w:del w:id="315" w:author="Wu, Leihong" w:date="2026-08-28T13:59:00Z" w16du:dateUtc="2026-08-28T18:59:00Z"/>
                 <w:rFonts w:ascii="Aptos Narrow" w:eastAsia="Times New Roman" w:hAnsi="Aptos Narrow" w:cs="Times New Roman"/>
                 <w:color w:val="000000"/>
                 <w14:ligatures w14:val="none"/>
               </w:rPr>
             </w:pPr>
-            <w:del w:id="178" w:author="Wu, Leihong" w:date="2026-08-28T13:59:00Z" w16du:dateUtc="2026-08-28T18:59:00Z">
+            <w:del w:id="316" w:author="Wu, Leihong" w:date="2026-08-28T13:59:00Z" w16du:dateUtc="2026-08-28T18:59:00Z">
               <w:r>
                 <w:rPr>
                   <w:rFonts w:ascii="Aptos Narrow" w:eastAsia="Times New Roman" w:hAnsi="Aptos Narrow" w:cs="Times New Roman"/>
@@ -6126,13 +7359,13 @@
             <w:pPr>
               <w:jc w:val="center"/>
               <w:rPr>
-                <w:del w:id="179" w:author="Wu, Leihong" w:date="2026-08-28T13:59:00Z" w16du:dateUtc="2026-08-28T18:59:00Z"/>
+                <w:del w:id="317" w:author="Wu, Leihong" w:date="2026-08-28T13:59:00Z" w16du:dateUtc="2026-08-28T18:59:00Z"/>
                 <w:rFonts w:ascii="Aptos Narrow" w:eastAsia="Times New Roman" w:hAnsi="Aptos Narrow" w:cs="Times New Roman"/>
                 <w:color w:val="000000"/>
                 <w14:ligatures w14:val="none"/>
               </w:rPr>
             </w:pPr>
-            <w:del w:id="180" w:author="Wu, Leihong" w:date="2026-08-28T13:59:00Z" w16du:dateUtc="2026-08-28T18:59:00Z">
+            <w:del w:id="318" w:author="Wu, Leihong" w:date="2026-08-28T13:59:00Z" w16du:dateUtc="2026-08-28T18:59:00Z">
               <w:r>
                 <w:rPr>
                   <w:rFonts w:ascii="Aptos Narrow" w:eastAsia="Times New Roman" w:hAnsi="Aptos Narrow" w:cs="Times New Roman"/>
@@ -6149,7 +7382,7 @@
         <w:trPr>
           <w:trHeight w:val="144"/>
           <w:jc w:val="center"/>
-          <w:del w:id="181" w:author="Wu, Leihong" w:date="2026-08-28T13:59:00Z" w16du:dateUtc="2026-08-28T18:59:00Z"/>
+          <w:del w:id="319" w:author="Wu, Leihong" w:date="2026-08-28T13:59:00Z"/>
         </w:trPr>
         <w:tc>
           <w:tcPr>
@@ -6161,7 +7394,7 @@
             <w:pPr>
               <w:jc w:val="center"/>
               <w:rPr>
-                <w:del w:id="182" w:author="Wu, Leihong" w:date="2026-08-28T13:59:00Z" w16du:dateUtc="2026-08-28T18:59:00Z"/>
+                <w:del w:id="320" w:author="Wu, Leihong" w:date="2026-08-28T13:59:00Z" w16du:dateUtc="2026-08-28T18:59:00Z"/>
                 <w:rFonts w:ascii="Aptos Narrow" w:eastAsia="Times New Roman" w:hAnsi="Aptos Narrow" w:cs="Times New Roman"/>
                 <w:b/>
                 <w:bCs/>
@@ -6170,7 +7403,7 @@
                 <w14:ligatures w14:val="none"/>
               </w:rPr>
             </w:pPr>
-            <w:del w:id="183" w:author="Wu, Leihong" w:date="2026-08-28T13:59:00Z" w16du:dateUtc="2026-08-28T18:59:00Z">
+            <w:del w:id="321" w:author="Wu, Leihong" w:date="2026-08-28T13:59:00Z" w16du:dateUtc="2026-08-28T18:59:00Z">
               <w:r>
                 <w:rPr>
                   <w:rFonts w:ascii="Aptos Narrow" w:eastAsia="Times New Roman" w:hAnsi="Aptos Narrow" w:cs="Times New Roman"/>
@@ -6196,13 +7429,13 @@
             <w:pPr>
               <w:jc w:val="center"/>
               <w:rPr>
-                <w:del w:id="184" w:author="Wu, Leihong" w:date="2026-08-28T13:59:00Z" w16du:dateUtc="2026-08-28T18:59:00Z"/>
+                <w:del w:id="322" w:author="Wu, Leihong" w:date="2026-08-28T13:59:00Z" w16du:dateUtc="2026-08-28T18:59:00Z"/>
                 <w:rFonts w:ascii="Aptos Narrow" w:eastAsia="Times New Roman" w:hAnsi="Aptos Narrow" w:cs="Times New Roman"/>
                 <w:color w:val="000000"/>
                 <w14:ligatures w14:val="none"/>
               </w:rPr>
             </w:pPr>
-            <w:del w:id="185" w:author="Wu, Leihong" w:date="2026-08-28T13:59:00Z" w16du:dateUtc="2026-08-28T18:59:00Z">
+            <w:del w:id="323" w:author="Wu, Leihong" w:date="2026-08-28T13:59:00Z" w16du:dateUtc="2026-08-28T18:59:00Z">
               <w:r>
                 <w:rPr>
                   <w:rFonts w:ascii="Aptos Narrow" w:eastAsia="Times New Roman" w:hAnsi="Aptos Narrow" w:cs="Times New Roman"/>
@@ -6225,13 +7458,13 @@
             <w:pPr>
               <w:jc w:val="center"/>
               <w:rPr>
-                <w:del w:id="186" w:author="Wu, Leihong" w:date="2026-08-28T13:59:00Z" w16du:dateUtc="2026-08-28T18:59:00Z"/>
+                <w:del w:id="324" w:author="Wu, Leihong" w:date="2026-08-28T13:59:00Z" w16du:dateUtc="2026-08-28T18:59:00Z"/>
                 <w:rFonts w:ascii="Aptos Narrow" w:eastAsia="Times New Roman" w:hAnsi="Aptos Narrow" w:cs="Times New Roman"/>
                 <w:color w:val="000000"/>
                 <w14:ligatures w14:val="none"/>
               </w:rPr>
             </w:pPr>
-            <w:del w:id="187" w:author="Wu, Leihong" w:date="2026-08-28T13:59:00Z" w16du:dateUtc="2026-08-28T18:59:00Z">
+            <w:del w:id="325" w:author="Wu, Leihong" w:date="2026-08-28T13:59:00Z" w16du:dateUtc="2026-08-28T18:59:00Z">
               <w:r>
                 <w:rPr>
                   <w:rFonts w:ascii="Aptos Narrow" w:eastAsia="Times New Roman" w:hAnsi="Aptos Narrow" w:cs="Times New Roman"/>
@@ -6254,13 +7487,13 @@
             <w:pPr>
               <w:jc w:val="center"/>
               <w:rPr>
-                <w:del w:id="188" w:author="Wu, Leihong" w:date="2026-08-28T13:59:00Z" w16du:dateUtc="2026-08-28T18:59:00Z"/>
+                <w:del w:id="326" w:author="Wu, Leihong" w:date="2026-08-28T13:59:00Z" w16du:dateUtc="2026-08-28T18:59:00Z"/>
                 <w:rFonts w:ascii="Aptos Narrow" w:eastAsia="Times New Roman" w:hAnsi="Aptos Narrow" w:cs="Times New Roman"/>
                 <w:color w:val="000000"/>
                 <w14:ligatures w14:val="none"/>
               </w:rPr>
             </w:pPr>
-            <w:del w:id="189" w:author="Wu, Leihong" w:date="2026-08-28T13:59:00Z" w16du:dateUtc="2026-08-28T18:59:00Z">
+            <w:del w:id="327" w:author="Wu, Leihong" w:date="2026-08-28T13:59:00Z" w16du:dateUtc="2026-08-28T18:59:00Z">
               <w:r>
                 <w:rPr>
                   <w:rFonts w:ascii="Aptos Narrow" w:eastAsia="Times New Roman" w:hAnsi="Aptos Narrow" w:cs="Times New Roman"/>
@@ -6277,7 +7510,7 @@
         <w:trPr>
           <w:trHeight w:val="144"/>
           <w:jc w:val="center"/>
-          <w:del w:id="190" w:author="Wu, Leihong" w:date="2026-08-28T13:59:00Z" w16du:dateUtc="2026-08-28T18:59:00Z"/>
+          <w:del w:id="328" w:author="Wu, Leihong" w:date="2026-08-28T13:59:00Z"/>
         </w:trPr>
         <w:tc>
           <w:tcPr>
@@ -6289,7 +7522,7 @@
             <w:pPr>
               <w:jc w:val="center"/>
               <w:rPr>
-                <w:del w:id="191" w:author="Wu, Leihong" w:date="2026-08-28T13:59:00Z" w16du:dateUtc="2026-08-28T18:59:00Z"/>
+                <w:del w:id="329" w:author="Wu, Leihong" w:date="2026-08-28T13:59:00Z" w16du:dateUtc="2026-08-28T18:59:00Z"/>
                 <w:rFonts w:ascii="Aptos Narrow" w:eastAsia="Times New Roman" w:hAnsi="Aptos Narrow" w:cs="Times New Roman"/>
                 <w:b/>
                 <w:bCs/>
@@ -6298,7 +7531,7 @@
                 <w14:ligatures w14:val="none"/>
               </w:rPr>
             </w:pPr>
-            <w:del w:id="192" w:author="Wu, Leihong" w:date="2026-08-28T13:59:00Z" w16du:dateUtc="2026-08-28T18:59:00Z">
+            <w:del w:id="330" w:author="Wu, Leihong" w:date="2026-08-28T13:59:00Z" w16du:dateUtc="2026-08-28T18:59:00Z">
               <w:r>
                 <w:rPr>
                   <w:rFonts w:ascii="Aptos Narrow" w:eastAsia="Times New Roman" w:hAnsi="Aptos Narrow" w:cs="Times New Roman"/>
@@ -6324,13 +7557,13 @@
             <w:pPr>
               <w:jc w:val="center"/>
               <w:rPr>
-                <w:del w:id="193" w:author="Wu, Leihong" w:date="2026-08-28T13:59:00Z" w16du:dateUtc="2026-08-28T18:59:00Z"/>
+                <w:del w:id="331" w:author="Wu, Leihong" w:date="2026-08-28T13:59:00Z" w16du:dateUtc="2026-08-28T18:59:00Z"/>
                 <w:rFonts w:ascii="Aptos Narrow" w:eastAsia="Times New Roman" w:hAnsi="Aptos Narrow" w:cs="Times New Roman"/>
                 <w:color w:val="000000"/>
                 <w14:ligatures w14:val="none"/>
               </w:rPr>
             </w:pPr>
-            <w:del w:id="194" w:author="Wu, Leihong" w:date="2026-08-28T13:59:00Z" w16du:dateUtc="2026-08-28T18:59:00Z">
+            <w:del w:id="332" w:author="Wu, Leihong" w:date="2026-08-28T13:59:00Z" w16du:dateUtc="2026-08-28T18:59:00Z">
               <w:r>
                 <w:rPr>
                   <w:rFonts w:ascii="Aptos Narrow" w:eastAsia="Times New Roman" w:hAnsi="Aptos Narrow" w:cs="Times New Roman"/>
@@ -6353,13 +7586,13 @@
             <w:pPr>
               <w:jc w:val="center"/>
               <w:rPr>
-                <w:del w:id="195" w:author="Wu, Leihong" w:date="2026-08-28T13:59:00Z" w16du:dateUtc="2026-08-28T18:59:00Z"/>
+                <w:del w:id="333" w:author="Wu, Leihong" w:date="2026-08-28T13:59:00Z" w16du:dateUtc="2026-08-28T18:59:00Z"/>
                 <w:rFonts w:ascii="Aptos Narrow" w:eastAsia="Times New Roman" w:hAnsi="Aptos Narrow" w:cs="Times New Roman"/>
                 <w:color w:val="000000"/>
                 <w14:ligatures w14:val="none"/>
               </w:rPr>
             </w:pPr>
-            <w:del w:id="196" w:author="Wu, Leihong" w:date="2026-08-28T13:59:00Z" w16du:dateUtc="2026-08-28T18:59:00Z">
+            <w:del w:id="334" w:author="Wu, Leihong" w:date="2026-08-28T13:59:00Z" w16du:dateUtc="2026-08-28T18:59:00Z">
               <w:r>
                 <w:rPr>
                   <w:rFonts w:ascii="Aptos Narrow" w:eastAsia="Times New Roman" w:hAnsi="Aptos Narrow" w:cs="Times New Roman"/>
@@ -6390,13 +7623,13 @@
             <w:pPr>
               <w:jc w:val="center"/>
               <w:rPr>
-                <w:del w:id="197" w:author="Wu, Leihong" w:date="2026-08-28T13:59:00Z" w16du:dateUtc="2026-08-28T18:59:00Z"/>
+                <w:del w:id="335" w:author="Wu, Leihong" w:date="2026-08-28T13:59:00Z" w16du:dateUtc="2026-08-28T18:59:00Z"/>
                 <w:rFonts w:ascii="Aptos Narrow" w:eastAsia="Times New Roman" w:hAnsi="Aptos Narrow" w:cs="Times New Roman"/>
                 <w:color w:val="000000"/>
                 <w14:ligatures w14:val="none"/>
               </w:rPr>
             </w:pPr>
-            <w:del w:id="198" w:author="Wu, Leihong" w:date="2026-08-28T13:59:00Z" w16du:dateUtc="2026-08-28T18:59:00Z">
+            <w:del w:id="336" w:author="Wu, Leihong" w:date="2026-08-28T13:59:00Z" w16du:dateUtc="2026-08-28T18:59:00Z">
               <w:r>
                 <w:rPr>
                   <w:rFonts w:ascii="Aptos Narrow" w:eastAsia="Times New Roman" w:hAnsi="Aptos Narrow" w:cs="Times New Roman"/>
@@ -6413,7 +7646,7 @@
         <w:trPr>
           <w:trHeight w:val="144"/>
           <w:jc w:val="center"/>
-          <w:del w:id="199" w:author="Wu, Leihong" w:date="2026-08-28T13:59:00Z" w16du:dateUtc="2026-08-28T18:59:00Z"/>
+          <w:del w:id="337" w:author="Wu, Leihong" w:date="2026-08-28T13:59:00Z"/>
         </w:trPr>
         <w:tc>
           <w:tcPr>
@@ -6425,7 +7658,7 @@
             <w:pPr>
               <w:jc w:val="center"/>
               <w:rPr>
-                <w:del w:id="200" w:author="Wu, Leihong" w:date="2026-08-28T13:59:00Z" w16du:dateUtc="2026-08-28T18:59:00Z"/>
+                <w:del w:id="338" w:author="Wu, Leihong" w:date="2026-08-28T13:59:00Z" w16du:dateUtc="2026-08-28T18:59:00Z"/>
                 <w:rFonts w:ascii="Aptos Narrow" w:eastAsia="Times New Roman" w:hAnsi="Aptos Narrow" w:cs="Times New Roman"/>
                 <w:b/>
                 <w:bCs/>
@@ -6434,7 +7667,7 @@
                 <w14:ligatures w14:val="none"/>
               </w:rPr>
             </w:pPr>
-            <w:del w:id="201" w:author="Wu, Leihong" w:date="2026-08-28T13:59:00Z" w16du:dateUtc="2026-08-28T18:59:00Z">
+            <w:del w:id="339" w:author="Wu, Leihong" w:date="2026-08-28T13:59:00Z" w16du:dateUtc="2026-08-28T18:59:00Z">
               <w:r>
                 <w:rPr>
                   <w:rFonts w:ascii="Aptos Narrow" w:eastAsia="Times New Roman" w:hAnsi="Aptos Narrow" w:cs="Times New Roman"/>
@@ -6460,13 +7693,13 @@
             <w:pPr>
               <w:jc w:val="center"/>
               <w:rPr>
-                <w:del w:id="202" w:author="Wu, Leihong" w:date="2026-08-28T13:59:00Z" w16du:dateUtc="2026-08-28T18:59:00Z"/>
+                <w:del w:id="340" w:author="Wu, Leihong" w:date="2026-08-28T13:59:00Z" w16du:dateUtc="2026-08-28T18:59:00Z"/>
                 <w:rFonts w:ascii="Aptos Narrow" w:eastAsia="Times New Roman" w:hAnsi="Aptos Narrow" w:cs="Times New Roman"/>
                 <w:color w:val="000000"/>
                 <w14:ligatures w14:val="none"/>
               </w:rPr>
             </w:pPr>
-            <w:del w:id="203" w:author="Wu, Leihong" w:date="2026-08-28T13:59:00Z" w16du:dateUtc="2026-08-28T18:59:00Z">
+            <w:del w:id="341" w:author="Wu, Leihong" w:date="2026-08-28T13:59:00Z" w16du:dateUtc="2026-08-28T18:59:00Z">
               <w:r>
                 <w:rPr>
                   <w:rFonts w:ascii="Aptos Narrow" w:eastAsia="Times New Roman" w:hAnsi="Aptos Narrow" w:cs="Times New Roman"/>
@@ -6489,13 +7722,13 @@
             <w:pPr>
               <w:jc w:val="center"/>
               <w:rPr>
-                <w:del w:id="204" w:author="Wu, Leihong" w:date="2026-08-28T13:59:00Z" w16du:dateUtc="2026-08-28T18:59:00Z"/>
+                <w:del w:id="342" w:author="Wu, Leihong" w:date="2026-08-28T13:59:00Z" w16du:dateUtc="2026-08-28T18:59:00Z"/>
                 <w:rFonts w:ascii="Aptos Narrow" w:eastAsia="Times New Roman" w:hAnsi="Aptos Narrow" w:cs="Times New Roman"/>
                 <w:color w:val="000000"/>
                 <w14:ligatures w14:val="none"/>
               </w:rPr>
             </w:pPr>
-            <w:del w:id="205" w:author="Wu, Leihong" w:date="2026-08-28T13:59:00Z" w16du:dateUtc="2026-08-28T18:59:00Z">
+            <w:del w:id="343" w:author="Wu, Leihong" w:date="2026-08-28T13:59:00Z" w16du:dateUtc="2026-08-28T18:59:00Z">
               <w:r>
                 <w:rPr>
                   <w:rFonts w:ascii="Aptos Narrow" w:eastAsia="Times New Roman" w:hAnsi="Aptos Narrow" w:cs="Times New Roman"/>
@@ -6526,13 +7759,13 @@
             <w:pPr>
               <w:jc w:val="center"/>
               <w:rPr>
-                <w:del w:id="206" w:author="Wu, Leihong" w:date="2026-08-28T13:59:00Z" w16du:dateUtc="2026-08-28T18:59:00Z"/>
+                <w:del w:id="344" w:author="Wu, Leihong" w:date="2026-08-28T13:59:00Z" w16du:dateUtc="2026-08-28T18:59:00Z"/>
                 <w:rFonts w:ascii="Aptos Narrow" w:eastAsia="Times New Roman" w:hAnsi="Aptos Narrow" w:cs="Times New Roman"/>
                 <w:color w:val="000000"/>
                 <w14:ligatures w14:val="none"/>
               </w:rPr>
             </w:pPr>
-            <w:del w:id="207" w:author="Wu, Leihong" w:date="2026-08-28T13:59:00Z" w16du:dateUtc="2026-08-28T18:59:00Z">
+            <w:del w:id="345" w:author="Wu, Leihong" w:date="2026-08-28T13:59:00Z" w16du:dateUtc="2026-08-28T18:59:00Z">
               <w:r>
                 <w:rPr>
                   <w:rFonts w:ascii="Aptos Narrow" w:eastAsia="Times New Roman" w:hAnsi="Aptos Narrow" w:cs="Times New Roman"/>
@@ -6549,7 +7782,7 @@
         <w:trPr>
           <w:trHeight w:val="144"/>
           <w:jc w:val="center"/>
-          <w:del w:id="208" w:author="Wu, Leihong" w:date="2026-08-28T13:59:00Z" w16du:dateUtc="2026-08-28T18:59:00Z"/>
+          <w:del w:id="346" w:author="Wu, Leihong" w:date="2026-08-28T13:59:00Z"/>
         </w:trPr>
         <w:tc>
           <w:tcPr>
@@ -6561,7 +7794,7 @@
             <w:pPr>
               <w:jc w:val="center"/>
               <w:rPr>
-                <w:del w:id="209" w:author="Wu, Leihong" w:date="2026-08-28T13:59:00Z" w16du:dateUtc="2026-08-28T18:59:00Z"/>
+                <w:del w:id="347" w:author="Wu, Leihong" w:date="2026-08-28T13:59:00Z" w16du:dateUtc="2026-08-28T18:59:00Z"/>
                 <w:rFonts w:ascii="Aptos Narrow" w:eastAsia="Times New Roman" w:hAnsi="Aptos Narrow" w:cs="Times New Roman"/>
                 <w:b/>
                 <w:bCs/>
@@ -6570,7 +7803,7 @@
                 <w14:ligatures w14:val="none"/>
               </w:rPr>
             </w:pPr>
-            <w:del w:id="210" w:author="Wu, Leihong" w:date="2026-08-28T13:59:00Z" w16du:dateUtc="2026-08-28T18:59:00Z">
+            <w:del w:id="348" w:author="Wu, Leihong" w:date="2026-08-28T13:59:00Z" w16du:dateUtc="2026-08-28T18:59:00Z">
               <w:r>
                 <w:rPr>
                   <w:rFonts w:ascii="Aptos Narrow" w:eastAsia="Times New Roman" w:hAnsi="Aptos Narrow" w:cs="Times New Roman"/>
@@ -6596,13 +7829,13 @@
             <w:pPr>
               <w:jc w:val="center"/>
               <w:rPr>
-                <w:del w:id="211" w:author="Wu, Leihong" w:date="2026-08-28T13:59:00Z" w16du:dateUtc="2026-08-28T18:59:00Z"/>
+                <w:del w:id="349" w:author="Wu, Leihong" w:date="2026-08-28T13:59:00Z" w16du:dateUtc="2026-08-28T18:59:00Z"/>
                 <w:rFonts w:ascii="Aptos Narrow" w:eastAsia="Times New Roman" w:hAnsi="Aptos Narrow" w:cs="Times New Roman"/>
                 <w:color w:val="000000"/>
                 <w14:ligatures w14:val="none"/>
               </w:rPr>
             </w:pPr>
-            <w:del w:id="212" w:author="Wu, Leihong" w:date="2026-08-28T13:59:00Z" w16du:dateUtc="2026-08-28T18:59:00Z">
+            <w:del w:id="350" w:author="Wu, Leihong" w:date="2026-08-28T13:59:00Z" w16du:dateUtc="2026-08-28T18:59:00Z">
               <w:r>
                 <w:rPr>
                   <w:rFonts w:ascii="Aptos Narrow" w:eastAsia="Times New Roman" w:hAnsi="Aptos Narrow" w:cs="Times New Roman"/>
@@ -6625,13 +7858,13 @@
             <w:pPr>
               <w:jc w:val="center"/>
               <w:rPr>
-                <w:del w:id="213" w:author="Wu, Leihong" w:date="2026-08-28T13:59:00Z" w16du:dateUtc="2026-08-28T18:59:00Z"/>
+                <w:del w:id="351" w:author="Wu, Leihong" w:date="2026-08-28T13:59:00Z" w16du:dateUtc="2026-08-28T18:59:00Z"/>
                 <w:rFonts w:ascii="Aptos Narrow" w:eastAsia="Times New Roman" w:hAnsi="Aptos Narrow" w:cs="Times New Roman"/>
                 <w:color w:val="000000"/>
                 <w14:ligatures w14:val="none"/>
               </w:rPr>
             </w:pPr>
-            <w:del w:id="214" w:author="Wu, Leihong" w:date="2026-08-28T13:59:00Z" w16du:dateUtc="2026-08-28T18:59:00Z">
+            <w:del w:id="352" w:author="Wu, Leihong" w:date="2026-08-28T13:59:00Z" w16du:dateUtc="2026-08-28T18:59:00Z">
               <w:r>
                 <w:rPr>
                   <w:rFonts w:ascii="Aptos Narrow" w:eastAsia="Times New Roman" w:hAnsi="Aptos Narrow" w:cs="Times New Roman"/>
@@ -6662,13 +7895,13 @@
             <w:pPr>
               <w:jc w:val="center"/>
               <w:rPr>
-                <w:del w:id="215" w:author="Wu, Leihong" w:date="2026-08-28T13:59:00Z" w16du:dateUtc="2026-08-28T18:59:00Z"/>
+                <w:del w:id="353" w:author="Wu, Leihong" w:date="2026-08-28T13:59:00Z" w16du:dateUtc="2026-08-28T18:59:00Z"/>
                 <w:rFonts w:ascii="Aptos Narrow" w:eastAsia="Times New Roman" w:hAnsi="Aptos Narrow" w:cs="Times New Roman"/>
                 <w:color w:val="000000"/>
                 <w14:ligatures w14:val="none"/>
               </w:rPr>
             </w:pPr>
-            <w:del w:id="216" w:author="Wu, Leihong" w:date="2026-08-28T13:59:00Z" w16du:dateUtc="2026-08-28T18:59:00Z">
+            <w:del w:id="354" w:author="Wu, Leihong" w:date="2026-08-28T13:59:00Z" w16du:dateUtc="2026-08-28T18:59:00Z">
               <w:r>
                 <w:rPr>
                   <w:rFonts w:ascii="Aptos Narrow" w:eastAsia="Times New Roman" w:hAnsi="Aptos Narrow" w:cs="Times New Roman"/>
@@ -6686,14 +7919,14 @@
       <w:pPr>
         <w:jc w:val="center"/>
         <w:rPr>
-          <w:del w:id="217" w:author="Wu, Leihong" w:date="2026-08-28T14:00:00Z" w16du:dateUtc="2026-08-28T19:00:00Z"/>
+          <w:del w:id="355" w:author="Wu, Leihong" w:date="2026-08-28T14:00:00Z" w16du:dateUtc="2026-08-28T19:00:00Z"/>
           <w:i/>
           <w:iCs/>
           <w:sz w:val="18"/>
           <w:szCs w:val="18"/>
         </w:rPr>
       </w:pPr>
-      <w:del w:id="218" w:author="Wu, Leihong" w:date="2026-08-28T14:00:00Z" w16du:dateUtc="2026-08-28T19:00:00Z">
+      <w:del w:id="356" w:author="Wu, Leihong" w:date="2026-08-28T14:00:00Z" w16du:dateUtc="2026-08-28T19:00:00Z">
         <w:r>
           <w:rPr>
             <w:i/>
@@ -6783,7 +8016,6 @@
         <w:pStyle w:val="Heading2"/>
       </w:pPr>
       <w:r>
-        <w:lastRenderedPageBreak/>
         <w:t>3.2 LLM performs significantly better than ETHER</w:t>
       </w:r>
     </w:p>
@@ -6957,7 +8189,7 @@
       <w:r>
         <w:t xml:space="preserve"> </w:t>
       </w:r>
-      <w:del w:id="219" w:author="Wu, Leihong" w:date="2026-08-28T13:52:00Z" w16du:dateUtc="2026-08-28T18:52:00Z">
+      <w:del w:id="357" w:author="Wu, Leihong" w:date="2026-08-28T13:52:00Z" w16du:dateUtc="2026-08-28T18:52:00Z">
         <w:r>
           <w:delText xml:space="preserve">In addition, </w:delText>
         </w:r>
@@ -6977,7 +8209,7 @@
           <w:delText>LAB, AGE</w:delText>
         </w:r>
       </w:del>
-      <w:del w:id="220" w:author="Wu, Leihong" w:date="2026-08-28T13:50:00Z" w16du:dateUtc="2026-08-28T18:50:00Z">
+      <w:del w:id="358" w:author="Wu, Leihong" w:date="2026-08-28T13:50:00Z" w16du:dateUtc="2026-08-28T18:50:00Z">
         <w:r>
           <w:delText>,</w:delText>
         </w:r>
@@ -7076,7 +8308,7 @@
                     </pic:cNvPicPr>
                   </pic:nvPicPr>
                   <pic:blipFill>
-                    <a:blip r:embed="rId17"/>
+                    <a:blip r:embed="rId13"/>
                     <a:stretch>
                       <a:fillRect/>
                     </a:stretch>
@@ -7148,7 +8380,6 @@
         <w:pStyle w:val="Heading2"/>
       </w:pPr>
       <w:r>
-        <w:lastRenderedPageBreak/>
         <w:t xml:space="preserve">3.3 BERT-based NER model </w:t>
       </w:r>
       <w:r>
@@ -7156,6 +8387,11 @@
       </w:r>
     </w:p>
     <w:p>
+      <w:pPr>
+        <w:rPr>
+          <w:ins w:id="359" w:author="Wu, Leihong" w:date="2026-08-31T09:38:00Z" w16du:dateUtc="2026-08-31T14:38:00Z"/>
+        </w:rPr>
+      </w:pPr>
       <w:r>
         <w:t xml:space="preserve">We </w:t>
       </w:r>
@@ -7173,161 +8409,282 @@
         <w:t>Table S2</w:t>
       </w:r>
       <w:r>
-        <w:t>), motivating its use as the backbone of our final NER model. To ensure a fair comparison, BERT and the LLM were evaluated on the same held-out test set that was excluded from BERT training; specifically, 80% of the data were used for BERT training and the remaining 20% for evaluation. We further verified that the LLM’s overall performance on the full dataset (100%) was comparable to its performance on the held-out test subset.</w:t>
+        <w:t xml:space="preserve">), motivating its use as the backbone of our final NER model. </w:t>
       </w:r>
     </w:p>
     <w:p>
-      <w:r>
-        <w:t xml:space="preserve">As shown in </w:t>
-      </w:r>
-      <w:r>
-        <w:rPr>
-          <w:b/>
-          <w:bCs/>
-        </w:rPr>
-        <w:t>Figure 4</w:t>
-      </w:r>
-      <w:r>
-        <w:t>, the BERT-based model achieved a higher overall F1-score than the LLM (0.54 vs. 0.42), reflecting its more balanced precision–recall trade-off. Category-level performance varied substantially across entity types. For common, surface-level entities, the two models performed comparably</w:t>
-      </w:r>
-      <w:r>
-        <w:t xml:space="preserve">. For example, AE </w:t>
-      </w:r>
-      <w:r>
-        <w:t>(</w:t>
-      </w:r>
-      <w:r>
-        <w:t xml:space="preserve">BERT </w:t>
-      </w:r>
-      <w:r>
-        <w:t xml:space="preserve">0.57 vs. </w:t>
-      </w:r>
-      <w:r>
-        <w:t xml:space="preserve">LLM </w:t>
-      </w:r>
-      <w:r>
-        <w:t>0.55)</w:t>
-      </w:r>
-      <w:r>
-        <w:t xml:space="preserve"> and </w:t>
-      </w:r>
-      <w:r>
-        <w:t>DRUG</w:t>
-      </w:r>
-      <w:r>
-        <w:t xml:space="preserve"> </w:t>
-      </w:r>
-      <w:r>
-        <w:t>(</w:t>
-      </w:r>
-      <w:r>
-        <w:t xml:space="preserve">BERT </w:t>
-      </w:r>
-      <w:r>
-        <w:t>0.5</w:t>
-      </w:r>
-      <w:r>
-        <w:t>4</w:t>
-      </w:r>
-      <w:r>
-        <w:t xml:space="preserve"> vs. </w:t>
-      </w:r>
-      <w:r>
-        <w:t xml:space="preserve">LLM </w:t>
-      </w:r>
-      <w:r>
-        <w:t>0.5</w:t>
-      </w:r>
-      <w:r>
-        <w:t>5</w:t>
-      </w:r>
-      <w:r>
-        <w:t>), indicating similar effectiveness for frequently mentioned therapeutic entities.</w:t>
-      </w:r>
+      <w:pPr>
+        <w:rPr>
+          <w:ins w:id="360" w:author="Wu, Leihong" w:date="2026-08-31T09:42:00Z" w16du:dateUtc="2026-08-31T14:42:00Z"/>
+        </w:rPr>
+      </w:pPr>
+      <w:ins w:id="361" w:author="Wu, Leihong" w:date="2026-08-31T09:38:00Z" w16du:dateUtc="2026-08-31T14:38:00Z">
+        <w:r>
+          <w:t xml:space="preserve">We applied a repeated Leave-One-Drug-Event-Pair-Out approach in </w:t>
+        </w:r>
+      </w:ins>
+      <w:ins w:id="362" w:author="Wu, Leihong" w:date="2026-08-31T09:39:00Z" w16du:dateUtc="2026-08-31T14:39:00Z">
+        <w:r>
+          <w:t xml:space="preserve">FAERS data analysis. </w:t>
+        </w:r>
+      </w:ins>
+      <w:ins w:id="363" w:author="Wu, Leihong" w:date="2026-08-31T09:41:00Z" w16du:dateUtc="2026-08-31T14:41:00Z">
+        <w:r>
+          <w:t>For</w:t>
+        </w:r>
+      </w:ins>
+      <w:ins w:id="364" w:author="Wu, Leihong" w:date="2026-08-31T09:39:00Z" w16du:dateUtc="2026-08-31T14:39:00Z">
+        <w:r>
+          <w:t xml:space="preserve"> each of 4 reported drug-event pairs, they would be considered as validation set and excluded from the </w:t>
+        </w:r>
+        <w:r>
+          <w:t xml:space="preserve">training process. </w:t>
+        </w:r>
+      </w:ins>
+      <w:ins w:id="365" w:author="Wu, Leihong" w:date="2026-08-31T09:40:00Z" w16du:dateUtc="2026-08-31T14:40:00Z">
+        <w:r>
+          <w:t>T</w:t>
+        </w:r>
+        <w:r>
+          <w:t xml:space="preserve">he experiment </w:t>
+        </w:r>
+      </w:ins>
+      <w:ins w:id="366" w:author="Wu, Leihong" w:date="2026-08-31T09:41:00Z" w16du:dateUtc="2026-08-31T14:41:00Z">
+        <w:r>
+          <w:t xml:space="preserve">therefore </w:t>
+        </w:r>
+      </w:ins>
+      <w:ins w:id="367" w:author="Wu, Leihong" w:date="2026-08-31T09:40:00Z" w16du:dateUtc="2026-08-31T14:40:00Z">
+        <w:r>
+          <w:t xml:space="preserve">consisted of 4 folds </w:t>
+        </w:r>
+        <w:r>
+          <w:t>to cover all cases the be included in the validation set once.</w:t>
+        </w:r>
+      </w:ins>
+      <w:ins w:id="368" w:author="Wu, Leihong" w:date="2026-08-31T09:41:00Z" w16du:dateUtc="2026-08-31T14:41:00Z">
+        <w:r>
+          <w:t xml:space="preserve"> We repeated this process 5 times with different random seeds. </w:t>
+        </w:r>
+      </w:ins>
     </w:p>
     <w:p>
-      <w:r>
-        <w:t>BERT demonstrated clear advantages for several clinically nuanced or structurally complex categories. In LAB, BERT substantially outperformed the LLM (0.57 vs. 0.14), while for DX, BERT more than doubled the LLM’s F1-score (0.33 vs. 0.13). The largest disparity was observed for STATUS, where the LLM’s performance was extremely low (0.06), compared with a markedly higher score for BERT (0.59), highlighting the difficulty of capturing contextual clinical status information without supervised training. BERT also outperformed the LLM for DOSE (0.37 vs. 0.16) and MHX (0.47 vs. 0.45), further illustrating its robustness for less standardized or context-dependent entities.</w:t>
-      </w:r>
+      <w:pPr>
+        <w:rPr>
+          <w:ins w:id="369" w:author="Wu, Leihong" w:date="2026-08-31T09:38:00Z" w16du:dateUtc="2026-08-31T14:38:00Z"/>
+        </w:rPr>
+      </w:pPr>
+      <w:ins w:id="370" w:author="Wu, Leihong" w:date="2026-08-31T09:42:00Z">
+        <w:r>
+          <w:t>Mean strict exact-match F1 across the five seeds was 0.6280 ± 0.0097 for azacitidine–QT prolongation, 0.6563 ± 0.0178 for baricitinib–hypersensitivity, 0.5602 ± 0.0091 for tramadol–hypoglycemia, and 0.5274 ± 0.0105 for erenumab–stroke. The between-series spread was larger than the within-fold seed variation, indicating that case-series difficulty contributed more variation than stochastic initialization in these runs.</w:t>
+        </w:r>
+      </w:ins>
     </w:p>
     <w:p>
-      <w:r>
-        <w:t>For structured demographic fields, BERT again showed strong performance. In AGE, BERT achieved a high F1-score of 0.88, compared with 0.24 for the LLM, and for SEX, BERT reached 0.92 versus 0.56 for the LLM, reflecting the benefits of supervised learning in capturing consistent lexical and syntactic patterns.</w:t>
-      </w:r>
+      <w:pPr>
+        <w:rPr>
+          <w:del w:id="371" w:author="Wu, Leihong" w:date="2026-08-31T09:43:00Z" w16du:dateUtc="2026-08-31T14:43:00Z"/>
+        </w:rPr>
+      </w:pPr>
+      <w:del w:id="372" w:author="Wu, Leihong" w:date="2026-08-31T09:43:00Z" w16du:dateUtc="2026-08-31T14:43:00Z">
+        <w:r>
+          <w:delText>To ensure a fair comparison, BERT and the LLM were evaluated on the same held-out test set that was excluded from BERT training; specifically, 80% of the data were used for BERT training and the remaining 20% for evaluation. We further verified that the LLM’s overall performance on the full dataset (100%) was comparable to its performance on the held-out test subset.</w:delText>
+        </w:r>
+      </w:del>
     </w:p>
     <w:p>
-      <w:r>
-        <w:t xml:space="preserve">Overall, while the zero-shot LLM is competitive for some high-frequency or semantically broad entities such as AE and DRUG, the BERT-based NER model delivers more consistent and reliable performance across the full spectrum of pharmacovigilance concepts. </w:t>
-      </w:r>
+      <w:pPr>
+        <w:rPr>
+          <w:del w:id="373" w:author="Wu, Leihong" w:date="2026-08-31T09:43:00Z" w16du:dateUtc="2026-08-31T14:43:00Z"/>
+        </w:rPr>
+      </w:pPr>
+      <w:del w:id="374" w:author="Wu, Leihong" w:date="2026-08-31T09:43:00Z" w16du:dateUtc="2026-08-31T14:43:00Z">
+        <w:r>
+          <w:delText xml:space="preserve">As shown in </w:delText>
+        </w:r>
+        <w:r>
+          <w:rPr>
+            <w:b/>
+            <w:bCs/>
+          </w:rPr>
+          <w:delText>Figure 4</w:delText>
+        </w:r>
+        <w:r>
+          <w:delText>, the BERT-based model achieved a higher overall F1-score than the LLM (0.54 vs. 0.42), reflecting its more balanced precision–recall trade-off. Category-level performance varied substantially across entity types. For common, surface-level entities, the two models performed comparably</w:delText>
+        </w:r>
+        <w:r>
+          <w:delText xml:space="preserve">. For example, AE </w:delText>
+        </w:r>
+        <w:r>
+          <w:delText>(</w:delText>
+        </w:r>
+        <w:r>
+          <w:delText xml:space="preserve">BERT </w:delText>
+        </w:r>
+        <w:r>
+          <w:delText xml:space="preserve">0.57 vs. </w:delText>
+        </w:r>
+        <w:r>
+          <w:delText xml:space="preserve">LLM </w:delText>
+        </w:r>
+        <w:r>
+          <w:delText>0.55)</w:delText>
+        </w:r>
+        <w:r>
+          <w:delText xml:space="preserve"> and </w:delText>
+        </w:r>
+        <w:r>
+          <w:delText>DRUG</w:delText>
+        </w:r>
+        <w:r>
+          <w:delText xml:space="preserve"> </w:delText>
+        </w:r>
+        <w:r>
+          <w:delText>(</w:delText>
+        </w:r>
+        <w:r>
+          <w:delText xml:space="preserve">BERT </w:delText>
+        </w:r>
+        <w:r>
+          <w:delText>0.5</w:delText>
+        </w:r>
+        <w:r>
+          <w:delText>4</w:delText>
+        </w:r>
+        <w:r>
+          <w:delText xml:space="preserve"> vs. </w:delText>
+        </w:r>
+        <w:r>
+          <w:delText xml:space="preserve">LLM </w:delText>
+        </w:r>
+        <w:r>
+          <w:delText>0.5</w:delText>
+        </w:r>
+        <w:r>
+          <w:delText>5</w:delText>
+        </w:r>
+        <w:r>
+          <w:delText>), indicating similar effectiveness for frequently mentioned therapeutic entities.</w:delText>
+        </w:r>
+      </w:del>
+    </w:p>
+    <w:p>
+      <w:pPr>
+        <w:rPr>
+          <w:del w:id="375" w:author="Wu, Leihong" w:date="2026-08-31T09:43:00Z" w16du:dateUtc="2026-08-31T14:43:00Z"/>
+        </w:rPr>
+      </w:pPr>
+      <w:del w:id="376" w:author="Wu, Leihong" w:date="2026-08-31T09:43:00Z" w16du:dateUtc="2026-08-31T14:43:00Z">
+        <w:r>
+          <w:delText>BERT demonstrated clear advantages for several clinically nuanced or structurally complex categories. In LAB, BERT substantially outperformed the LLM (0.57 vs. 0.14), while for DX, BERT more than doubled the LLM’s F1-score (0.33 vs. 0.13). The largest disparity was observed for STATUS, where the LLM’s performance was extremely low (0.06), compared with a markedly higher score for BERT (0.59), highlighting the difficulty of capturing contextual clinical status information without supervised training. BERT also outperformed the LLM for DOSE (0.37 vs. 0.16) and MHX (0.47 vs. 0.45), further illustrating its robustness for less standardized or context-dependent entities.</w:delText>
+        </w:r>
+      </w:del>
+    </w:p>
+    <w:p>
+      <w:pPr>
+        <w:rPr>
+          <w:del w:id="377" w:author="Wu, Leihong" w:date="2026-08-31T09:43:00Z" w16du:dateUtc="2026-08-31T14:43:00Z"/>
+        </w:rPr>
+      </w:pPr>
+      <w:del w:id="378" w:author="Wu, Leihong" w:date="2026-08-31T09:43:00Z" w16du:dateUtc="2026-08-31T14:43:00Z">
+        <w:r>
+          <w:delText>For structured demographic fields, BERT again showed strong performance. In AGE, BERT achieved a high F1-score of 0.88, compared with 0.24 for the LLM, and for SEX, BERT reached 0.92 versus 0.56 for the LLM, reflecting the benefits of supervised learning in capturing consistent lexical and syntactic patterns.</w:delText>
+        </w:r>
+      </w:del>
+    </w:p>
+    <w:p>
+      <w:pPr>
+        <w:rPr>
+          <w:del w:id="379" w:author="Wu, Leihong" w:date="2026-08-31T09:43:00Z" w16du:dateUtc="2026-08-31T14:43:00Z"/>
+        </w:rPr>
+      </w:pPr>
+      <w:del w:id="380" w:author="Wu, Leihong" w:date="2026-08-31T09:43:00Z" w16du:dateUtc="2026-08-31T14:43:00Z">
+        <w:r>
+          <w:delText xml:space="preserve">Overall, while the zero-shot LLM is competitive for some high-frequency or semantically broad entities such as AE and DRUG, the BERT-based NER model delivers more consistent and reliable performance across the full spectrum of pharmacovigilance concepts. </w:delText>
+        </w:r>
+      </w:del>
     </w:p>
     <w:p/>
     <w:p>
-      <w:r>
-        <w:rPr>
-          <w:noProof/>
-        </w:rPr>
-        <w:lastRenderedPageBreak/>
-        <w:drawing>
-          <wp:inline distT="0" distB="0" distL="0" distR="0" wp14:anchorId="0C5129AB" wp14:editId="472E2FAB">
-            <wp:extent cx="5943600" cy="2448560"/>
-            <wp:effectExtent l="0" t="0" r="0" b="8890"/>
-            <wp:docPr id="2102271256" name="Picture 1" descr="Chart, bar chart, histogram&#10;&#10;AI-generated content may be incorrect."/>
-            <wp:cNvGraphicFramePr>
-              <a:graphicFrameLocks xmlns:a="http://schemas.openxmlformats.org/drawingml/2006/main" noChangeAspect="1"/>
-            </wp:cNvGraphicFramePr>
-            <a:graphic xmlns:a="http://schemas.openxmlformats.org/drawingml/2006/main">
-              <a:graphicData uri="http://schemas.openxmlformats.org/drawingml/2006/picture">
-                <pic:pic xmlns:pic="http://schemas.openxmlformats.org/drawingml/2006/picture">
-                  <pic:nvPicPr>
-                    <pic:cNvPr id="2102271256" name="Picture 1" descr="Chart, bar chart, histogram&#10;&#10;AI-generated content may be incorrect."/>
-                    <pic:cNvPicPr>
-                      <a:picLocks noChangeAspect="1" noChangeArrowheads="1"/>
-                    </pic:cNvPicPr>
-                  </pic:nvPicPr>
-                  <pic:blipFill>
-                    <a:blip r:embed="rId18">
-                      <a:extLst>
-                        <a:ext uri="{28A0092B-C50C-407E-A947-70E740481C1C}">
-                          <a14:useLocalDpi xmlns:a14="http://schemas.microsoft.com/office/drawing/2010/main" val="0"/>
-                        </a:ext>
-                      </a:extLst>
-                    </a:blip>
-                    <a:srcRect/>
-                    <a:stretch>
-                      <a:fillRect/>
-                    </a:stretch>
-                  </pic:blipFill>
-                  <pic:spPr bwMode="auto">
-                    <a:xfrm>
-                      <a:off x="0" y="0"/>
-                      <a:ext cx="5943600" cy="2448560"/>
-                    </a:xfrm>
-                    <a:prstGeom prst="rect">
-                      <a:avLst/>
-                    </a:prstGeom>
-                    <a:noFill/>
-                    <a:ln>
+      <w:pPr>
+        <w:rPr>
+          <w:del w:id="381" w:author="Wu, Leihong" w:date="2026-08-31T09:43:00Z" w16du:dateUtc="2026-08-31T14:43:00Z"/>
+        </w:rPr>
+      </w:pPr>
+      <w:del w:id="382" w:author="Wu, Leihong" w:date="2026-08-31T09:43:00Z" w16du:dateUtc="2026-08-31T14:43:00Z">
+        <w:r>
+          <w:rPr>
+            <w:noProof/>
+          </w:rPr>
+          <w:drawing>
+            <wp:inline distT="0" distB="0" distL="0" distR="0" wp14:anchorId="0C5129AB" wp14:editId="472E2FAB">
+              <wp:extent cx="5943600" cy="2448560"/>
+              <wp:effectExtent l="0" t="0" r="0" b="8890"/>
+              <wp:docPr id="2102271256" name="Picture 1" descr="Chart, bar chart, histogram&#10;&#10;AI-generated content may be incorrect."/>
+              <wp:cNvGraphicFramePr>
+                <a:graphicFrameLocks xmlns:a="http://schemas.openxmlformats.org/drawingml/2006/main" noChangeAspect="1"/>
+              </wp:cNvGraphicFramePr>
+              <a:graphic xmlns:a="http://schemas.openxmlformats.org/drawingml/2006/main">
+                <a:graphicData uri="http://schemas.openxmlformats.org/drawingml/2006/picture">
+                  <pic:pic xmlns:pic="http://schemas.openxmlformats.org/drawingml/2006/picture">
+                    <pic:nvPicPr>
+                      <pic:cNvPr id="2102271256" name="Picture 1" descr="Chart, bar chart, histogram&#10;&#10;AI-generated content may be incorrect."/>
+                      <pic:cNvPicPr>
+                        <a:picLocks noChangeAspect="1" noChangeArrowheads="1"/>
+                      </pic:cNvPicPr>
+                    </pic:nvPicPr>
+                    <pic:blipFill>
+                      <a:blip r:embed="rId14">
+                        <a:extLst>
+                          <a:ext uri="{28A0092B-C50C-407E-A947-70E740481C1C}">
+                            <a14:useLocalDpi xmlns:a14="http://schemas.microsoft.com/office/drawing/2010/main" val="0"/>
+                          </a:ext>
+                        </a:extLst>
+                      </a:blip>
+                      <a:srcRect/>
+                      <a:stretch>
+                        <a:fillRect/>
+                      </a:stretch>
+                    </pic:blipFill>
+                    <pic:spPr bwMode="auto">
+                      <a:xfrm>
+                        <a:off x="0" y="0"/>
+                        <a:ext cx="5943600" cy="2448560"/>
+                      </a:xfrm>
+                      <a:prstGeom prst="rect">
+                        <a:avLst/>
+                      </a:prstGeom>
                       <a:noFill/>
-                    </a:ln>
-                  </pic:spPr>
-                </pic:pic>
-              </a:graphicData>
-            </a:graphic>
-          </wp:inline>
-        </w:drawing>
-      </w:r>
+                      <a:ln>
+                        <a:noFill/>
+                      </a:ln>
+                    </pic:spPr>
+                  </pic:pic>
+                </a:graphicData>
+              </a:graphic>
+            </wp:inline>
+          </w:drawing>
+        </w:r>
+      </w:del>
     </w:p>
     <w:p>
-      <w:r>
-        <w:rPr>
-          <w:b/>
-          <w:bCs/>
-        </w:rPr>
-        <w:t>Figure 4</w:t>
-      </w:r>
-      <w:r>
-        <w:t xml:space="preserve">. BERT and LLM annotation performance on FAERS testing dataset. </w:t>
-      </w:r>
+      <w:pPr>
+        <w:rPr>
+          <w:del w:id="383" w:author="Wu, Leihong" w:date="2026-08-31T09:43:00Z" w16du:dateUtc="2026-08-31T14:43:00Z"/>
+        </w:rPr>
+      </w:pPr>
+      <w:del w:id="384" w:author="Wu, Leihong" w:date="2026-08-31T09:43:00Z" w16du:dateUtc="2026-08-31T14:43:00Z">
+        <w:r>
+          <w:rPr>
+            <w:b/>
+            <w:bCs/>
+          </w:rPr>
+          <w:delText>Figure 4</w:delText>
+        </w:r>
+        <w:r>
+          <w:delText xml:space="preserve">. BERT and LLM annotation performance on FAERS testing dataset. </w:delText>
+        </w:r>
+      </w:del>
     </w:p>
     <w:p/>
     <w:p>
@@ -7479,11 +8836,7 @@
         <w:t>Figure 5b and 5c</w:t>
       </w:r>
       <w:r>
-        <w:t xml:space="preserve">) show that mistakes cluster in closely related label types rather than being spread out randomly. For BERT, the most </w:t>
-      </w:r>
-      <w:r>
-        <w:lastRenderedPageBreak/>
-        <w:t>common error is diagnostic</w:t>
+        <w:t>) show that mistakes cluster in closely related label types rather than being spread out randomly. For BERT, the most common error is diagnostic</w:t>
       </w:r>
       <w:r>
         <w:t>s</w:t>
@@ -7642,7 +8995,7 @@
       <w:r>
         <w:rPr>
           <w:i/>
-          <w:rPrChange w:id="221" w:author="Penny, Brandon *" w:date="2026-08-28T10:17:00Z" w16du:dateUtc="2026-08-28T15:17:00Z">
+          <w:rPrChange w:id="385" w:author="Penny, Brandon *" w:date="2026-08-28T10:17:00Z" w16du:dateUtc="2026-08-28T15:17:00Z">
             <w:rPr/>
           </w:rPrChange>
         </w:rPr>
@@ -7657,7 +9010,7 @@
       <w:r>
         <w:rPr>
           <w:i/>
-          <w:rPrChange w:id="222" w:author="Penny, Brandon *" w:date="2026-08-28T10:17:00Z" w16du:dateUtc="2026-08-28T15:17:00Z">
+          <w:rPrChange w:id="386" w:author="Penny, Brandon *" w:date="2026-08-28T10:17:00Z" w16du:dateUtc="2026-08-28T15:17:00Z">
             <w:rPr/>
           </w:rPrChange>
         </w:rPr>
@@ -7678,18 +9031,18 @@
       <w:r>
         <w:t xml:space="preserve">error </w:t>
       </w:r>
-      <w:commentRangeStart w:id="223"/>
+      <w:commentRangeStart w:id="387"/>
       <w:r>
         <w:t xml:space="preserve">C </w:t>
       </w:r>
-      <w:commentRangeEnd w:id="223"/>
+      <w:commentRangeEnd w:id="387"/>
       <w:r>
         <w:rPr>
           <w:rStyle w:val="CommentReference"/>
           <w:sz w:val="24"/>
           <w:szCs w:val="24"/>
         </w:rPr>
-        <w:commentReference w:id="223"/>
+        <w:commentReference w:id="387"/>
       </w:r>
       <w:r>
         <w:t>(boundary and label error)</w:t>
@@ -7820,7 +9173,6 @@
         <w:rPr>
           <w:noProof/>
         </w:rPr>
-        <w:lastRenderedPageBreak/>
         <w:drawing>
           <wp:inline distT="0" distB="0" distL="0" distR="0" wp14:anchorId="1855E802" wp14:editId="56FBCE81">
             <wp:extent cx="5943600" cy="5299075"/>
@@ -7940,23 +9292,28 @@
         <w:pStyle w:val="Heading2"/>
       </w:pPr>
       <w:r>
-        <w:t>3.5 Similar trend</w:t>
-      </w:r>
-      <w:r>
-        <w:t>s</w:t>
-      </w:r>
-      <w:r>
-        <w:t xml:space="preserve"> w</w:t>
-      </w:r>
-      <w:r>
-        <w:t>ere</w:t>
-      </w:r>
-      <w:r>
-        <w:t xml:space="preserve"> observed in </w:t>
-      </w:r>
-      <w:r>
-        <w:t xml:space="preserve">the </w:t>
-      </w:r>
+        <w:t xml:space="preserve">3.5 </w:t>
+      </w:r>
+      <w:del w:id="388" w:author="Wu, Leihong" w:date="2026-08-31T09:44:00Z" w16du:dateUtc="2026-08-31T14:44:00Z">
+        <w:r>
+          <w:delText>Similar trend</w:delText>
+        </w:r>
+        <w:r>
+          <w:delText>s</w:delText>
+        </w:r>
+        <w:r>
+          <w:delText xml:space="preserve"> w</w:delText>
+        </w:r>
+        <w:r>
+          <w:delText>ere</w:delText>
+        </w:r>
+        <w:r>
+          <w:delText xml:space="preserve"> observed in </w:delText>
+        </w:r>
+        <w:r>
+          <w:delText xml:space="preserve">the </w:delText>
+        </w:r>
+      </w:del>
       <w:r>
         <w:t>VAER</w:t>
       </w:r>
@@ -7964,8 +9321,18 @@
         <w:t>S</w:t>
       </w:r>
       <w:r>
-        <w:t xml:space="preserve"> Dataset</w:t>
-      </w:r>
+        <w:t xml:space="preserve"> </w:t>
+      </w:r>
+      <w:ins w:id="389" w:author="Wu, Leihong" w:date="2026-08-31T09:44:00Z" w16du:dateUtc="2026-08-31T14:44:00Z">
+        <w:r>
+          <w:t>Evaluation</w:t>
+        </w:r>
+      </w:ins>
+      <w:del w:id="390" w:author="Wu, Leihong" w:date="2026-08-31T09:44:00Z" w16du:dateUtc="2026-08-31T14:44:00Z">
+        <w:r>
+          <w:delText>Dataset</w:delText>
+        </w:r>
+      </w:del>
     </w:p>
     <w:p>
       <w:r>
@@ -7979,11 +9346,7 @@
         <w:t>Figure 6</w:t>
       </w:r>
       <w:r>
-        <w:t xml:space="preserve">, the BERT-based model achieved a substantially higher overall F1-score than the LLM baseline (0.53 vs. 0.31). This difference reflects consistent gains across both precision and recall, </w:t>
-      </w:r>
-      <w:r>
-        <w:lastRenderedPageBreak/>
-        <w:t>resulting in an absolute F1 improvement of approximately 0.22, and highlighting the advantages of supervised, domain-specific training for vaccine safety narratives.</w:t>
+        <w:t>, the BERT-based model achieved a substantially higher overall F1-score than the LLM baseline (0.53 vs. 0.31). This difference reflects consistent gains across both precision and recall, resulting in an absolute F1 improvement of approximately 0.22, and highlighting the advantages of supervised, domain-specific training for vaccine safety narratives.</w:t>
       </w:r>
     </w:p>
     <w:p>
@@ -7999,10 +9362,10 @@
     <w:p>
       <w:pPr>
         <w:rPr>
-          <w:del w:id="224" w:author="Penny, Brandon *" w:date="2026-08-28T15:31:00Z" w16du:dateUtc="2026-08-28T15:31:28Z"/>
-        </w:rPr>
-      </w:pPr>
-      <w:del w:id="225" w:author="Penny, Brandon *" w:date="2026-08-28T15:31:00Z" w16du:dateUtc="2026-08-28T15:31:28Z">
+          <w:del w:id="391" w:author="Penny, Brandon *" w:date="2026-08-28T15:31:00Z" w16du:dateUtc="2026-08-28T15:31:28Z"/>
+        </w:rPr>
+      </w:pPr>
+      <w:del w:id="392" w:author="Penny, Brandon *" w:date="2026-08-28T15:31:00Z" w16du:dateUtc="2026-08-28T15:31:28Z">
         <w:r>
           <w:delText>Taken together with the FAERS results, these VAERS findings demonstrate that BERT-based models trained on high-quality human annotations provide more robust and reliable performance across heterogeneous pharmacovigilance datasets. While LLM-derived annotations offer a convenient low-resource alternative, their direct use leads to substantially lower accuracy, particularly in semantically complex categories such as STATUS, LAB, and HX. These results underscore the continued importance of curated human-labeled data for medical NER and highlight the effectiveness of supervised transformer models for large-scale safety narrative processing in real-world biomedical applications.</w:delText>
         </w:r>
@@ -8014,7 +9377,6 @@
         <w:rPr>
           <w:noProof/>
         </w:rPr>
-        <w:lastRenderedPageBreak/>
         <w:drawing>
           <wp:inline distT="0" distB="0" distL="0" distR="0" wp14:anchorId="46402949" wp14:editId="03D9F47F">
             <wp:extent cx="5943600" cy="2448560"/>
@@ -8149,7 +9511,7 @@
     <w:p>
       <w:pPr>
         <w:rPr>
-          <w:ins w:id="226" w:author="Penny, Brandon *" w:date="2026-08-28T15:31:00Z" w16du:dateUtc="2026-08-28T15:31:04Z"/>
+          <w:ins w:id="393" w:author="Penny, Brandon *" w:date="2026-08-28T15:31:00Z" w16du:dateUtc="2026-08-28T15:31:04Z"/>
         </w:rPr>
       </w:pPr>
       <w:r>
@@ -8178,24 +9540,20 @@
       </w:r>
     </w:p>
     <w:p>
-      <w:commentRangeStart w:id="227"/>
-      <w:ins w:id="228" w:author="Penny, Brandon *" w:date="2026-08-28T15:31:00Z" w16du:dateUtc="2026-08-28T15:31:07Z">
-        <w:r>
-          <w:t xml:space="preserve">Taken together with the FAERS results, these VAERS findings demonstrate that BERT-based models trained on high-quality human annotations provide more robust and reliable performance across heterogeneous pharmacovigilance datasets. While LLM-derived annotations offer a convenient low-resource alternative, their direct use leads to substantially lower accuracy, particularly in semantically complex categories such as STATUS, LAB, and HX. These results underscore the continued importance of curated </w:t>
-        </w:r>
-        <w:r>
-          <w:lastRenderedPageBreak/>
-          <w:t>human-labeled data for medical NER and highlight the effectiveness of supervised transformer models for large-scale safety narrative processing in real-world biomedical applications.</w:t>
+      <w:commentRangeStart w:id="394"/>
+      <w:ins w:id="395" w:author="Penny, Brandon *" w:date="2026-08-28T15:31:00Z" w16du:dateUtc="2026-08-28T15:31:07Z">
+        <w:r>
+          <w:t>Taken together with the FAERS results, these VAERS findings demonstrate that BERT-based models trained on high-quality human annotations provide more robust and reliable performance across heterogeneous pharmacovigilance datasets. While LLM-derived annotations offer a convenient low-resource alternative, their direct use leads to substantially lower accuracy, particularly in semantically complex categories such as STATUS, LAB, and HX. These results underscore the continued importance of curated human-labeled data for medical NER and highlight the effectiveness of supervised transformer models for large-scale safety narrative processing in real-world biomedical applications.</w:t>
         </w:r>
       </w:ins>
-      <w:commentRangeEnd w:id="227"/>
+      <w:commentRangeEnd w:id="394"/>
       <w:r>
         <w:rPr>
           <w:rStyle w:val="CommentReference"/>
           <w:sz w:val="24"/>
           <w:szCs w:val="24"/>
         </w:rPr>
-        <w:commentReference w:id="227"/>
+        <w:commentReference w:id="394"/>
       </w:r>
     </w:p>
     <w:p>
@@ -8256,11 +9614,7 @@
         <w:t xml:space="preserve">The current annotation workflow was designed </w:t>
       </w:r>
       <w:r>
-        <w:t xml:space="preserve">as a linear </w:t>
-      </w:r>
-      <w:r>
-        <w:lastRenderedPageBreak/>
-        <w:t>process</w:t>
+        <w:t>as a linear process</w:t>
       </w:r>
       <w:r>
         <w:t>, start</w:t>
@@ -8408,7 +9762,6 @@
         <w:rPr>
           <w:shd w:val="clear" w:color="auto" w:fill="FFFFFF"/>
         </w:rPr>
-        <w:lastRenderedPageBreak/>
         <w:t>Ethics approval</w:t>
       </w:r>
     </w:p>
@@ -9114,7 +10467,6 @@
         <w:ind w:left="720" w:hanging="720"/>
       </w:pPr>
       <w:r>
-        <w:lastRenderedPageBreak/>
         <w:t>17.</w:t>
       </w:r>
       <w:r>
@@ -10561,7 +11913,6 @@
           <w:b/>
           <w:bCs/>
         </w:rPr>
-        <w:lastRenderedPageBreak/>
         <w:t xml:space="preserve">Table </w:t>
       </w:r>
       <w:r>
@@ -11411,7 +12762,6 @@
                 <w:sz w:val="18"/>
                 <w:szCs w:val="18"/>
               </w:rPr>
-              <w:lastRenderedPageBreak/>
               <w:t>CoD: Cause of Death </w:t>
             </w:r>
           </w:p>
@@ -12782,7 +14132,7 @@
 
 <file path=word/comments.xml><?xml version="1.0" encoding="utf-8"?>
 <w:comments xmlns:wpc="http://schemas.microsoft.com/office/word/2010/wordprocessingCanvas" xmlns:cx="http://schemas.microsoft.com/office/drawing/2014/chartex" xmlns:cx1="http://schemas.microsoft.com/office/drawing/2015/9/8/chartex" xmlns:cx2="http://schemas.microsoft.com/office/drawing/2015/10/21/chartex" xmlns:cx3="http://schemas.microsoft.com/office/drawing/2016/5/9/chartex" xmlns:cx4="http://schemas.microsoft.com/office/drawing/2016/5/10/chartex" xmlns:cx5="http://schemas.microsoft.com/office/drawing/2016/5/11/chartex" xmlns:cx6="http://schemas.microsoft.com/office/drawing/2016/5/12/chartex" xmlns:cx7="http://schemas.microsoft.com/office/drawing/2016/5/13/chartex" xmlns:cx8="http://schemas.microsoft.com/office/drawing/2016/5/14/chartex" xmlns:mc="http://schemas.openxmlformats.org/markup-compatibility/2006" xmlns:aink="http://schemas.microsoft.com/office/drawing/2016/ink" xmlns:am3d="http://schemas.microsoft.com/office/drawing/2017/model3d" xmlns:o="urn:schemas-microsoft-com:office:office" xmlns:oel="http://schemas.microsoft.com/office/2019/extlst" xmlns:r="http://schemas.openxmlformats.org/officeDocument/2006/relationships" xmlns:m="http://schemas.openxmlformats.org/officeDocument/2006/math" xmlns:v="urn:schemas-microsoft-com:vml" xmlns:wp14="http://schemas.microsoft.com/office/word/2010/wordprocessingDrawing" xmlns:wp="http://schemas.openxmlformats.org/drawingml/2006/wordprocessingDrawing" xmlns:w10="urn:schemas-microsoft-com:office:word" xmlns:w="http://schemas.openxmlformats.org/wordprocessingml/2006/main" xmlns:w14="http://schemas.microsoft.com/office/word/2010/wordml" xmlns:w15="http://schemas.microsoft.com/office/word/2012/wordml" xmlns:w16cex="http://schemas.microsoft.com/office/word/2018/wordml/cex" xmlns:w16cid="http://schemas.microsoft.com/office/word/2016/wordml/cid" xmlns:w16="http://schemas.microsoft.com/office/word/2018/wordml" xmlns:w16du="http://schemas.microsoft.com/office/word/2023/wordml/word16du" xmlns:w16sdtdh="http://schemas.microsoft.com/office/word/2020/wordml/sdtdatahash" xmlns:w16sdtfl="http://schemas.microsoft.com/office/word/2024/wordml/sdtformatlock" xmlns:w16se="http://schemas.microsoft.com/office/word/2015/wordml/symex" xmlns:wpg="http://schemas.microsoft.com/office/word/2010/wordprocessingGroup" xmlns:wpi="http://schemas.microsoft.com/office/word/2010/wordprocessingInk" xmlns:wne="http://schemas.microsoft.com/office/word/2006/wordml" xmlns:wps="http://schemas.microsoft.com/office/word/2010/wordprocessingShape" mc:Ignorable="w14 w15 w16se w16cid w16 w16cex w16sdtdh w16sdtfl w16du wp14">
-  <w:comment w:id="83" w:author="Penny, Brandon *" w:date="2026-08-28T10:36:00Z" w:initials="PB">
+  <w:comment w:id="387" w:author="Penny, Brandon *" w:date="2026-08-28T10:25:00Z" w:initials="PB">
     <w:p>
       <w:pPr>
         <w:pStyle w:val="CommentText"/>
@@ -12794,34 +14144,18 @@
         <w:annotationRef/>
       </w:r>
       <w:r>
-        <w:t>Comment 3.7 suggested this edit of the text</w:t>
+        <w:rPr>
+          <w:i/>
+          <w:iCs/>
+        </w:rPr>
+        <w:t>Comment 2.11: Please, use italics when citing words and corpus examples, i.e., isoniazid, hepatitis...</w:t>
+      </w:r>
+      <w:r>
+        <w:t> </w:t>
       </w:r>
     </w:p>
   </w:comment>
-  <w:comment w:id="223" w:author="Penny, Brandon *" w:date="2026-08-28T10:25:00Z" w:initials="PB">
-    <w:p>
-      <w:pPr>
-        <w:pStyle w:val="CommentText"/>
-      </w:pPr>
-      <w:r>
-        <w:rPr>
-          <w:rStyle w:val="CommentReference"/>
-        </w:rPr>
-        <w:annotationRef/>
-      </w:r>
-      <w:r>
-        <w:rPr>
-          <w:i/>
-          <w:iCs/>
-        </w:rPr>
-        <w:t>Comment 2.11: Please, use italics when citing words and corpus examples, i.e., isoniazid, hepatitis...</w:t>
-      </w:r>
-      <w:r>
-        <w:t> </w:t>
-      </w:r>
-    </w:p>
-  </w:comment>
-  <w:comment w:id="227" w:author="Penny, Brandon *" w:date="2026-08-28T10:32:00Z" w:initials="PB">
+  <w:comment w:id="394" w:author="Penny, Brandon *" w:date="2026-08-28T10:32:00Z" w:initials="PB">
     <w:p>
       <w:pPr>
         <w:pStyle w:val="CommentText"/>
@@ -12842,7 +14176,6 @@
 
 <file path=word/commentsExtended.xml><?xml version="1.0" encoding="utf-8"?>
 <w15:commentsEx xmlns:wpc="http://schemas.microsoft.com/office/word/2010/wordprocessingCanvas" xmlns:cx="http://schemas.microsoft.com/office/drawing/2014/chartex" xmlns:cx1="http://schemas.microsoft.com/office/drawing/2015/9/8/chartex" xmlns:cx2="http://schemas.microsoft.com/office/drawing/2015/10/21/chartex" xmlns:cx3="http://schemas.microsoft.com/office/drawing/2016/5/9/chartex" xmlns:cx4="http://schemas.microsoft.com/office/drawing/2016/5/10/chartex" xmlns:cx5="http://schemas.microsoft.com/office/drawing/2016/5/11/chartex" xmlns:cx6="http://schemas.microsoft.com/office/drawing/2016/5/12/chartex" xmlns:cx7="http://schemas.microsoft.com/office/drawing/2016/5/13/chartex" xmlns:cx8="http://schemas.microsoft.com/office/drawing/2016/5/14/chartex" xmlns:mc="http://schemas.openxmlformats.org/markup-compatibility/2006" xmlns:aink="http://schemas.microsoft.com/office/drawing/2016/ink" xmlns:am3d="http://schemas.microsoft.com/office/drawing/2017/model3d" xmlns:o="urn:schemas-microsoft-com:office:office" xmlns:oel="http://schemas.microsoft.com/office/2019/extlst" xmlns:r="http://schemas.openxmlformats.org/officeDocument/2006/relationships" xmlns:m="http://schemas.openxmlformats.org/officeDocument/2006/math" xmlns:v="urn:schemas-microsoft-com:vml" xmlns:wp14="http://schemas.microsoft.com/office/word/2010/wordprocessingDrawing" xmlns:wp="http://schemas.openxmlformats.org/drawingml/2006/wordprocessingDrawing" xmlns:w10="urn:schemas-microsoft-com:office:word" xmlns:w="http://schemas.openxmlformats.org/wordprocessingml/2006/main" xmlns:w14="http://schemas.microsoft.com/office/word/2010/wordml" xmlns:w15="http://schemas.microsoft.com/office/word/2012/wordml" xmlns:w16cex="http://schemas.microsoft.com/office/word/2018/wordml/cex" xmlns:w16cid="http://schemas.microsoft.com/office/word/2016/wordml/cid" xmlns:w16="http://schemas.microsoft.com/office/word/2018/wordml" xmlns:w16du="http://schemas.microsoft.com/office/word/2023/wordml/word16du" xmlns:w16sdtdh="http://schemas.microsoft.com/office/word/2020/wordml/sdtdatahash" xmlns:w16sdtfl="http://schemas.microsoft.com/office/word/2024/wordml/sdtformatlock" xmlns:w16se="http://schemas.microsoft.com/office/word/2015/wordml/symex" xmlns:wpg="http://schemas.microsoft.com/office/word/2010/wordprocessingGroup" xmlns:wpi="http://schemas.microsoft.com/office/word/2010/wordprocessingInk" xmlns:wne="http://schemas.microsoft.com/office/word/2006/wordml" xmlns:wps="http://schemas.microsoft.com/office/word/2010/wordprocessingShape" mc:Ignorable="w14 w15 w16se w16cid w16 w16cex w16sdtdh w16sdtfl w16du wp14">
-  <w15:commentEx w15:paraId="3FC040C7" w15:done="0"/>
   <w15:commentEx w15:paraId="061C72EF" w15:done="0"/>
   <w15:commentEx w15:paraId="560D7E82" w15:done="0"/>
 </w15:commentsEx>
@@ -12850,7 +14183,6 @@
 
 <file path=word/commentsExtensible.xml><?xml version="1.0" encoding="utf-8"?>
 <w16cex:commentsExtensible xmlns:wpc="http://schemas.microsoft.com/office/word/2010/wordprocessingCanvas" xmlns:cx="http://schemas.microsoft.com/office/drawing/2014/chartex" xmlns:cx1="http://schemas.microsoft.com/office/drawing/2015/9/8/chartex" xmlns:cx2="http://schemas.microsoft.com/office/drawing/2015/10/21/chartex" xmlns:cx3="http://schemas.microsoft.com/office/drawing/2016/5/9/chartex" xmlns:cx4="http://schemas.microsoft.com/office/drawing/2016/5/10/chartex" xmlns:cx5="http://schemas.microsoft.com/office/drawing/2016/5/11/chartex" xmlns:cx6="http://schemas.microsoft.com/office/drawing/2016/5/12/chartex" xmlns:cx7="http://schemas.microsoft.com/office/drawing/2016/5/13/chartex" xmlns:cx8="http://schemas.microsoft.com/office/drawing/2016/5/14/chartex" xmlns:cr="http://schemas.microsoft.com/office/comments/2020/reactions" xmlns:mc="http://schemas.openxmlformats.org/markup-compatibility/2006" xmlns:aink="http://schemas.microsoft.com/office/drawing/2016/ink" xmlns:am3d="http://schemas.microsoft.com/office/drawing/2017/model3d" xmlns:o="urn:schemas-microsoft-com:office:office" xmlns:oel="http://schemas.microsoft.com/office/2019/extlst" xmlns:r="http://schemas.openxmlformats.org/officeDocument/2006/relationships" xmlns:m="http://schemas.openxmlformats.org/officeDocument/2006/math" xmlns:v="urn:schemas-microsoft-com:vml" xmlns:wp14="http://schemas.microsoft.com/office/word/2010/wordprocessingDrawing" xmlns:wp="http://schemas.openxmlformats.org/drawingml/2006/wordprocessingDrawing" xmlns:w10="urn:schemas-microsoft-com:office:word" xmlns:w="http://schemas.openxmlformats.org/wordprocessingml/2006/main" xmlns:w14="http://schemas.microsoft.com/office/word/2010/wordml" xmlns:w15="http://schemas.microsoft.com/office/word/2012/wordml" xmlns:w16cex="http://schemas.microsoft.com/office/word/2018/wordml/cex" xmlns:w16cid="http://schemas.microsoft.com/office/word/2016/wordml/cid" xmlns:w16="http://schemas.microsoft.com/office/word/2018/wordml" xmlns:w16du="http://schemas.microsoft.com/office/word/2023/wordml/word16du" xmlns:w16sdtdh="http://schemas.microsoft.com/office/word/2020/wordml/sdtdatahash" xmlns:w16sdtfl="http://schemas.microsoft.com/office/word/2024/wordml/sdtformatlock" xmlns:w16se="http://schemas.microsoft.com/office/word/2015/wordml/symex" xmlns:wpg="http://schemas.microsoft.com/office/word/2010/wordprocessingGroup" xmlns:wpi="http://schemas.microsoft.com/office/word/2010/wordprocessingInk" xmlns:wne="http://schemas.microsoft.com/office/word/2006/wordml" xmlns:wps="http://schemas.microsoft.com/office/word/2010/wordprocessingShape" mc:Ignorable="w14 w15 w16se w16cid w16 w16cex w16sdtdh w16sdtfl cr w16du wp14">
-  <w16cex:commentExtensible w16cex:durableId="05076F7E" w16cex:dateUtc="2026-08-28T15:36:00Z"/>
   <w16cex:commentExtensible w16cex:durableId="5FC23D58" w16cex:dateUtc="2026-08-28T15:25:00Z"/>
   <w16cex:commentExtensible w16cex:durableId="518E1248" w16cex:dateUtc="2026-08-28T15:32:00Z"/>
 </w16cex:commentsExtensible>
@@ -12858,7 +14190,6 @@
 
 <file path=word/commentsIds.xml><?xml version="1.0" encoding="utf-8"?>
 <w16cid:commentsIds xmlns:wpc="http://schemas.microsoft.com/office/word/2010/wordprocessingCanvas" xmlns:cx="http://schemas.microsoft.com/office/drawing/2014/chartex" xmlns:cx1="http://schemas.microsoft.com/office/drawing/2015/9/8/chartex" xmlns:cx2="http://schemas.microsoft.com/office/drawing/2015/10/21/chartex" xmlns:cx3="http://schemas.microsoft.com/office/drawing/2016/5/9/chartex" xmlns:cx4="http://schemas.microsoft.com/office/drawing/2016/5/10/chartex" xmlns:cx5="http://schemas.microsoft.com/office/drawing/2016/5/11/chartex" xmlns:cx6="http://schemas.microsoft.com/office/drawing/2016/5/12/chartex" xmlns:cx7="http://schemas.microsoft.com/office/drawing/2016/5/13/chartex" xmlns:cx8="http://schemas.microsoft.com/office/drawing/2016/5/14/chartex" xmlns:mc="http://schemas.openxmlformats.org/markup-compatibility/2006" xmlns:aink="http://schemas.microsoft.com/office/drawing/2016/ink" xmlns:am3d="http://schemas.microsoft.com/office/drawing/2017/model3d" xmlns:o="urn:schemas-microsoft-com:office:office" xmlns:oel="http://schemas.microsoft.com/office/2019/extlst" xmlns:r="http://schemas.openxmlformats.org/officeDocument/2006/relationships" xmlns:m="http://schemas.openxmlformats.org/officeDocument/2006/math" xmlns:v="urn:schemas-microsoft-com:vml" xmlns:wp14="http://schemas.microsoft.com/office/word/2010/wordprocessingDrawing" xmlns:wp="http://schemas.openxmlformats.org/drawingml/2006/wordprocessingDrawing" xmlns:w10="urn:schemas-microsoft-com:office:word" xmlns:w="http://schemas.openxmlformats.org/wordprocessingml/2006/main" xmlns:w14="http://schemas.microsoft.com/office/word/2010/wordml" xmlns:w15="http://schemas.microsoft.com/office/word/2012/wordml" xmlns:w16cex="http://schemas.microsoft.com/office/word/2018/wordml/cex" xmlns:w16cid="http://schemas.microsoft.com/office/word/2016/wordml/cid" xmlns:w16="http://schemas.microsoft.com/office/word/2018/wordml" xmlns:w16du="http://schemas.microsoft.com/office/word/2023/wordml/word16du" xmlns:w16sdtdh="http://schemas.microsoft.com/office/word/2020/wordml/sdtdatahash" xmlns:w16sdtfl="http://schemas.microsoft.com/office/word/2024/wordml/sdtformatlock" xmlns:w16se="http://schemas.microsoft.com/office/word/2015/wordml/symex" xmlns:wpg="http://schemas.microsoft.com/office/word/2010/wordprocessingGroup" xmlns:wpi="http://schemas.microsoft.com/office/word/2010/wordprocessingInk" xmlns:wne="http://schemas.microsoft.com/office/word/2006/wordml" xmlns:wps="http://schemas.microsoft.com/office/word/2010/wordprocessingShape" mc:Ignorable="w14 w15 w16se w16cid w16 w16cex w16sdtdh w16sdtfl w16du wp14">
-  <w16cid:commentId w16cid:paraId="3FC040C7" w16cid:durableId="05076F7E"/>
   <w16cid:commentId w16cid:paraId="061C72EF" w16cid:durableId="5FC23D58"/>
   <w16cid:commentId w16cid:paraId="560D7E82" w16cid:durableId="518E1248"/>
 </w16cid:commentsIds>
@@ -12868,7 +14199,7 @@
 <w:numbering xmlns:wpc="http://schemas.microsoft.com/office/word/2010/wordprocessingCanvas" xmlns:cx="http://schemas.microsoft.com/office/drawing/2014/chartex" xmlns:cx1="http://schemas.microsoft.com/office/drawing/2015/9/8/chartex" xmlns:cx2="http://schemas.microsoft.com/office/drawing/2015/10/21/chartex" xmlns:cx3="http://schemas.microsoft.com/office/drawing/2016/5/9/chartex" xmlns:cx4="http://schemas.microsoft.com/office/drawing/2016/5/10/chartex" xmlns:cx5="http://schemas.microsoft.com/office/drawing/2016/5/11/chartex" xmlns:cx6="http://schemas.microsoft.com/office/drawing/2016/5/12/chartex" xmlns:cx7="http://schemas.microsoft.com/office/drawing/2016/5/13/chartex" xmlns:cx8="http://schemas.microsoft.com/office/drawing/2016/5/14/chartex" xmlns:mc="http://schemas.openxmlformats.org/markup-compatibility/2006" xmlns:aink="http://schemas.microsoft.com/office/drawing/2016/ink" xmlns:am3d="http://schemas.microsoft.com/office/drawing/2017/model3d" xmlns:o="urn:schemas-microsoft-com:office:office" xmlns:oel="http://schemas.microsoft.com/office/2019/extlst" xmlns:r="http://schemas.openxmlformats.org/officeDocument/2006/relationships" xmlns:m="http://schemas.openxmlformats.org/officeDocument/2006/math" xmlns:v="urn:schemas-microsoft-com:vml" xmlns:wp14="http://schemas.microsoft.com/office/word/2010/wordprocessingDrawing" xmlns:wp="http://schemas.openxmlformats.org/drawingml/2006/wordprocessingDrawing" xmlns:w10="urn:schemas-microsoft-com:office:word" xmlns:w="http://schemas.openxmlformats.org/wordprocessingml/2006/main" xmlns:w14="http://schemas.microsoft.com/office/word/2010/wordml" xmlns:w15="http://schemas.microsoft.com/office/word/2012/wordml" xmlns:w16cex="http://schemas.microsoft.com/office/word/2018/wordml/cex" xmlns:w16cid="http://schemas.microsoft.com/office/word/2016/wordml/cid" xmlns:w16="http://schemas.microsoft.com/office/word/2018/wordml" xmlns:w16du="http://schemas.microsoft.com/office/word/2023/wordml/word16du" xmlns:w16sdtdh="http://schemas.microsoft.com/office/word/2020/wordml/sdtdatahash" xmlns:w16sdtfl="http://schemas.microsoft.com/office/word/2024/wordml/sdtformatlock" xmlns:w16se="http://schemas.microsoft.com/office/word/2015/wordml/symex" xmlns:wpg="http://schemas.microsoft.com/office/word/2010/wordprocessingGroup" xmlns:wpi="http://schemas.microsoft.com/office/word/2010/wordprocessingInk" xmlns:wne="http://schemas.microsoft.com/office/word/2006/wordml" xmlns:wps="http://schemas.microsoft.com/office/word/2010/wordprocessingShape" mc:Ignorable="w14 w15 w16se w16cid w16 w16cex w16sdtdh w16sdtfl w16du wp14">
   <w:numPicBullet w:numPicBulletId="0">
     <w:pict>
-      <v:rect id="_x0000_i1400" style="width:0;height:1.5pt" o:hralign="center" o:bullet="t" o:hrstd="t" o:hr="t" fillcolor="#a0a0a0" stroked="f"/>
+      <v:rect id="_x0000_i1138" style="width:0;height:1.5pt" o:hralign="center" o:bullet="t" o:hrstd="t" o:hr="t" fillcolor="#a0a0a0" stroked="f"/>
     </w:pict>
   </w:numPicBullet>
   <w:abstractNum w:abstractNumId="0" w15:restartNumberingAfterBreak="0">
@@ -20096,6 +21427,16 @@
       </w:tblBorders>
     </w:tblPr>
   </w:style>
+  <w:style w:type="character" w:styleId="PlaceholderText">
+    <w:name w:val="Placeholder Text"/>
+    <w:basedOn w:val="DefaultParagraphFont"/>
+    <w:uiPriority w:val="99"/>
+    <w:semiHidden/>
+    <w:rsid w:val="00D87E23"/>
+    <w:rPr>
+      <w:color w:val="666666"/>
+    </w:rPr>
+  </w:style>
 </w:styles>
 </file>
 

</xml_diff>

<commit_message>
Update VAERS Table 4 annotations
</commit_message>
<xml_diff>
--- a/publication/manuscripts/LLM4AE_rev1.docx
+++ b/publication/manuscripts/LLM4AE_rev1.docx
@@ -1083,7 +1083,11 @@
         <w:t xml:space="preserve">causality assessment, </w:t>
       </w:r>
       <w:r>
-        <w:t xml:space="preserve">safety signal detection, </w:t>
+        <w:t xml:space="preserve">safety </w:t>
+      </w:r>
+      <w:r>
+        <w:lastRenderedPageBreak/>
+        <w:t xml:space="preserve">signal detection, </w:t>
       </w:r>
       <w:r>
         <w:t xml:space="preserve">and </w:t>
@@ -1110,11 +1114,7 @@
         <w:t xml:space="preserve">recent </w:t>
       </w:r>
       <w:r>
-        <w:t xml:space="preserve">advances in natural language </w:t>
-      </w:r>
-      <w:r>
-        <w:lastRenderedPageBreak/>
-        <w:t xml:space="preserve">processing (NLP), the performance of automated methods on specialized regulatory safety data such as FAERS and VAERS </w:t>
+        <w:t xml:space="preserve">advances in natural language processing (NLP), the performance of automated methods on specialized regulatory safety data such as FAERS and VAERS </w:t>
       </w:r>
       <w:r>
         <w:t>can be compared and</w:t>
@@ -2655,7 +2655,11 @@
         <w:t xml:space="preserve"> </w:t>
       </w:r>
       <w:r>
-        <w:t>standard annotated reference to support the development and evaluation of NLP systems, including the ETHER text-mining algorithm</w:t>
+        <w:t xml:space="preserve">standard annotated reference to support the development and evaluation of NLP systems, including the ETHER text-mining </w:t>
+      </w:r>
+      <w:r>
+        <w:lastRenderedPageBreak/>
+        <w:t>algorithm</w:t>
       </w:r>
       <w:r>
         <w:fldChar w:fldCharType="begin"/>
@@ -2682,11 +2686,7 @@
         <w:t>has been</w:t>
       </w:r>
       <w:r>
-        <w:t xml:space="preserve"> annotated for clinical features, temporal features, and clinical–temporal </w:t>
-      </w:r>
-      <w:r>
-        <w:lastRenderedPageBreak/>
-        <w:t>associations using a multi-phase annotation methodology. The annotations were produced using the ETHER Annotator</w:t>
+        <w:t xml:space="preserve"> annotated for clinical features, temporal features, and clinical–temporal associations using a multi-phase annotation methodology. The annotations were produced using the ETHER Annotator</w:t>
       </w:r>
       <w:r>
         <w:fldChar w:fldCharType="begin"/>
@@ -2876,11 +2876,11 @@
         <w:t>a</w:t>
       </w:r>
       <w:r>
-        <w:t xml:space="preserve"> predefined controlled vocabulary, directly reflecting the annotation guidelines. It also provides functionalities for case management and annotation review, supporting systematic data organization and quality control throughout the process. Importantly, the platform incorporates version control to track changes across annotation iterations, allowing transparent comparison of updates and ensuring reproducibility. In addition, adjudication functionalities are built in to support review and resolution of ambiguous or uncertain annotations, enabling refinement of guideline interpretation and improving overall annotation consistency. These features collectively enhance data reliability and facilitate future </w:t>
+        <w:t xml:space="preserve"> predefined controlled vocabulary, directly reflecting the annotation guidelines. It also provides functionalities for case management and annotation review, supporting systematic data organization and quality control throughout the process. Importantly, the platform incorporates version control to track changes across annotation iterations, allowing transparent comparison of updates and ensuring reproducibility. In addition, adjudication functionalities are built in to support </w:t>
       </w:r>
       <w:r>
         <w:lastRenderedPageBreak/>
-        <w:t xml:space="preserve">validation and extension of the dataset. The user interface of the platform is illustrated in </w:t>
+        <w:t xml:space="preserve">review and resolution of ambiguous or uncertain annotations, enabling refinement of guideline interpretation and improving overall annotation consistency. These features collectively enhance data reliability and facilitate future validation and extension of the dataset. The user interface of the platform is illustrated in </w:t>
       </w:r>
       <w:r>
         <w:rPr>
@@ -3073,6 +3073,7 @@
     </w:p>
     <w:p>
       <w:r>
+        <w:lastRenderedPageBreak/>
         <w:t xml:space="preserve">Second, </w:t>
       </w:r>
       <w:r>
@@ -3159,7 +3160,6 @@
             <w:rStyle w:val="Hyperlink"/>
             <w:lang w:val="it-IT"/>
           </w:rPr>
-          <w:lastRenderedPageBreak/>
           <w:t>Llama</w:t>
         </w:r>
         <w:r>
@@ -3316,7 +3316,6 @@
       <w:r>
         <w:t>did not match pre-defined categories</w:t>
       </w:r>
-      <w:proofErr w:type="gramStart"/>
       <w:r>
         <w:t>)</w:t>
       </w:r>
@@ -3324,11 +3323,7 @@
         <w:t>,</w:t>
       </w:r>
       <w:r>
-        <w:t>using</w:t>
-      </w:r>
-      <w:proofErr w:type="gramEnd"/>
-      <w:r>
-        <w:t xml:space="preserve"> in-text annotation plus back mapping as a strategy helped ensure the original narratives were not altered during the annotation process. Unsuccessful tagging and text alterations have both been observed during preliminary studies, particularly where</w:t>
+        <w:t>using in-text annotation plus back mapping as a strategy helped ensure the original narratives were not altered during the annotation process. Unsuccessful tagging and text alterations have both been observed during preliminary studies, particularly where</w:t>
       </w:r>
       <w:r>
         <w:t xml:space="preserve"> </w:t>
@@ -3496,6 +3491,7 @@
     <w:p/>
     <w:p>
       <w:r>
+        <w:lastRenderedPageBreak/>
         <w:t xml:space="preserve">Third, BERT-based NER </w:t>
       </w:r>
       <w:r>
@@ -3549,7 +3545,6 @@
     </w:p>
     <w:p>
       <w:r>
-        <w:lastRenderedPageBreak/>
         <w:t>For the primary BioBERT evaluation, we used a prespecified random seed (seed 42). For FAERS, BioBERT was evaluated using four-fold leave-one-drug-event-pair-out cross-validation, with each of the four drug–event case series serving once as the held-out test cohort. For VAERS, BioBERT was evaluated using report-level 10-fold cross-validation with fixed folds. Primary performance estimates were calculated from the out-of-fold predictions generated under this prespecified seed. To assess sensitivity to stochastic model initialization, the complete cross-validation procedures were subsequently repeated using four additional random seeds (123, 456, 789, and 1011); these results are reported separately in Section 3.6.</w:t>
       </w:r>
     </w:p>
@@ -3877,7 +3872,14 @@
         <w:rPr>
           <w:iCs/>
         </w:rPr>
-        <w:t xml:space="preserve"> as AE that exactly matches the reference span and label is classified as a Match (M). A prediction is classified as Conflation (C) when it identifies the same underlying text region but does not exactly reproduce the reference annotation. Conflation includes both boundary inexactness, for example predicting </w:t>
+        <w:t xml:space="preserve"> as AE that exactly matches the reference span and label is classified as a Match (M). A prediction is classified as Conflation (C) when it identifies the same underlying text region but does not exactly reproduce the reference annotation. Conflation includes both boundary inexactness, for </w:t>
+      </w:r>
+      <w:r>
+        <w:rPr>
+          <w:iCs/>
+        </w:rPr>
+        <w:lastRenderedPageBreak/>
+        <w:t xml:space="preserve">example predicting </w:t>
       </w:r>
       <w:r>
         <w:rPr>
@@ -3942,7 +3944,6 @@
         <w:rPr>
           <w:iCs/>
         </w:rPr>
-        <w:lastRenderedPageBreak/>
         <w:t>We evaluated model performance using two complementary evaluation schemes. The primary scheme was a strict exact-match NER evaluation, in which a prediction was counted as correct only when both its span boundaries and entity label exactly matched the reference annotation. Under this scheme, precision and recall were calculated as below:</w:t>
       </w:r>
     </w:p>
@@ -3985,55 +3986,7 @@
             <w:rPr>
               <w:rFonts w:ascii="Cambria Math" w:hAnsi="Cambria Math"/>
             </w:rPr>
-            <m:t>=</m:t>
-          </m:r>
-          <m:r>
-            <w:rPr>
-              <w:rFonts w:ascii="Cambria Math" w:hAnsi="Cambria Math"/>
-            </w:rPr>
-            <m:t>M</m:t>
-          </m:r>
-          <m:r>
-            <w:rPr>
-              <w:rFonts w:ascii="Cambria Math" w:hAnsi="Cambria Math"/>
-            </w:rPr>
-            <m:t>/(</m:t>
-          </m:r>
-          <m:r>
-            <w:rPr>
-              <w:rFonts w:ascii="Cambria Math" w:hAnsi="Cambria Math"/>
-            </w:rPr>
-            <m:t>M</m:t>
-          </m:r>
-          <m:r>
-            <w:rPr>
-              <w:rFonts w:ascii="Cambria Math" w:hAnsi="Cambria Math"/>
-            </w:rPr>
-            <m:t>+</m:t>
-          </m:r>
-          <m:r>
-            <w:rPr>
-              <w:rFonts w:ascii="Cambria Math" w:hAnsi="Cambria Math"/>
-            </w:rPr>
-            <m:t>C</m:t>
-          </m:r>
-          <m:r>
-            <w:rPr>
-              <w:rFonts w:ascii="Cambria Math" w:hAnsi="Cambria Math"/>
-            </w:rPr>
-            <m:t>+</m:t>
-          </m:r>
-          <m:r>
-            <w:rPr>
-              <w:rFonts w:ascii="Cambria Math" w:hAnsi="Cambria Math"/>
-            </w:rPr>
-            <m:t>S</m:t>
-          </m:r>
-          <m:r>
-            <w:rPr>
-              <w:rFonts w:ascii="Cambria Math" w:hAnsi="Cambria Math"/>
-            </w:rPr>
-            <m:t xml:space="preserve">) </m:t>
+            <m:t xml:space="preserve">=M/(M+C+S) </m:t>
           </m:r>
         </m:oMath>
       </m:oMathPara>
@@ -4077,55 +4030,7 @@
             <w:rPr>
               <w:rFonts w:ascii="Cambria Math" w:hAnsi="Cambria Math"/>
             </w:rPr>
-            <m:t>=</m:t>
-          </m:r>
-          <m:r>
-            <w:rPr>
-              <w:rFonts w:ascii="Cambria Math" w:hAnsi="Cambria Math"/>
-            </w:rPr>
-            <m:t>M</m:t>
-          </m:r>
-          <m:r>
-            <w:rPr>
-              <w:rFonts w:ascii="Cambria Math" w:hAnsi="Cambria Math"/>
-            </w:rPr>
-            <m:t>/(</m:t>
-          </m:r>
-          <m:r>
-            <w:rPr>
-              <w:rFonts w:ascii="Cambria Math" w:hAnsi="Cambria Math"/>
-            </w:rPr>
-            <m:t>M</m:t>
-          </m:r>
-          <m:r>
-            <w:rPr>
-              <w:rFonts w:ascii="Cambria Math" w:hAnsi="Cambria Math"/>
-            </w:rPr>
-            <m:t>+</m:t>
-          </m:r>
-          <m:r>
-            <w:rPr>
-              <w:rFonts w:ascii="Cambria Math" w:hAnsi="Cambria Math"/>
-            </w:rPr>
-            <m:t>C</m:t>
-          </m:r>
-          <m:r>
-            <w:rPr>
-              <w:rFonts w:ascii="Cambria Math" w:hAnsi="Cambria Math"/>
-            </w:rPr>
-            <m:t>+</m:t>
-          </m:r>
-          <m:r>
-            <w:rPr>
-              <w:rFonts w:ascii="Cambria Math" w:hAnsi="Cambria Math"/>
-            </w:rPr>
-            <m:t>N</m:t>
-          </m:r>
-          <m:r>
-            <w:rPr>
-              <w:rFonts w:ascii="Cambria Math" w:hAnsi="Cambria Math"/>
-            </w:rPr>
-            <m:t>)</m:t>
+            <m:t>=M/(M+C+N)</m:t>
           </m:r>
         </m:oMath>
       </m:oMathPara>
@@ -4195,67 +4100,7 @@
             <w:rPr>
               <w:rFonts w:ascii="Cambria Math" w:hAnsi="Cambria Math"/>
             </w:rPr>
-            <m:t>=(</m:t>
-          </m:r>
-          <m:r>
-            <w:rPr>
-              <w:rFonts w:ascii="Cambria Math" w:hAnsi="Cambria Math"/>
-            </w:rPr>
-            <m:t>M</m:t>
-          </m:r>
-          <m:r>
-            <w:rPr>
-              <w:rFonts w:ascii="Cambria Math" w:hAnsi="Cambria Math"/>
-            </w:rPr>
-            <m:t>+0.5</m:t>
-          </m:r>
-          <m:r>
-            <w:rPr>
-              <w:rFonts w:ascii="Cambria Math" w:hAnsi="Cambria Math"/>
-            </w:rPr>
-            <m:t>C</m:t>
-          </m:r>
-          <m:r>
-            <w:rPr>
-              <w:rFonts w:ascii="Cambria Math" w:hAnsi="Cambria Math"/>
-            </w:rPr>
-            <m:t>)/(</m:t>
-          </m:r>
-          <m:r>
-            <w:rPr>
-              <w:rFonts w:ascii="Cambria Math" w:hAnsi="Cambria Math"/>
-            </w:rPr>
-            <m:t>M</m:t>
-          </m:r>
-          <m:r>
-            <w:rPr>
-              <w:rFonts w:ascii="Cambria Math" w:hAnsi="Cambria Math"/>
-            </w:rPr>
-            <m:t>+</m:t>
-          </m:r>
-          <m:r>
-            <w:rPr>
-              <w:rFonts w:ascii="Cambria Math" w:hAnsi="Cambria Math"/>
-            </w:rPr>
-            <m:t>C</m:t>
-          </m:r>
-          <m:r>
-            <w:rPr>
-              <w:rFonts w:ascii="Cambria Math" w:hAnsi="Cambria Math"/>
-            </w:rPr>
-            <m:t>+0.25</m:t>
-          </m:r>
-          <m:r>
-            <w:rPr>
-              <w:rFonts w:ascii="Cambria Math" w:hAnsi="Cambria Math"/>
-            </w:rPr>
-            <m:t>S</m:t>
-          </m:r>
-          <m:r>
-            <w:rPr>
-              <w:rFonts w:ascii="Cambria Math" w:hAnsi="Cambria Math"/>
-            </w:rPr>
-            <m:t xml:space="preserve">) </m:t>
+            <m:t xml:space="preserve">=(M+0.5C)/(M+C+0.25S) </m:t>
           </m:r>
         </m:oMath>
       </m:oMathPara>
@@ -4299,67 +4144,7 @@
             <w:rPr>
               <w:rFonts w:ascii="Cambria Math" w:hAnsi="Cambria Math"/>
             </w:rPr>
-            <m:t>=(</m:t>
-          </m:r>
-          <m:r>
-            <w:rPr>
-              <w:rFonts w:ascii="Cambria Math" w:hAnsi="Cambria Math"/>
-            </w:rPr>
-            <m:t>M</m:t>
-          </m:r>
-          <m:r>
-            <w:rPr>
-              <w:rFonts w:ascii="Cambria Math" w:hAnsi="Cambria Math"/>
-            </w:rPr>
-            <m:t>+0.5</m:t>
-          </m:r>
-          <m:r>
-            <w:rPr>
-              <w:rFonts w:ascii="Cambria Math" w:hAnsi="Cambria Math"/>
-            </w:rPr>
-            <m:t>C</m:t>
-          </m:r>
-          <m:r>
-            <w:rPr>
-              <w:rFonts w:ascii="Cambria Math" w:hAnsi="Cambria Math"/>
-            </w:rPr>
-            <m:t>)/(</m:t>
-          </m:r>
-          <m:r>
-            <w:rPr>
-              <w:rFonts w:ascii="Cambria Math" w:hAnsi="Cambria Math"/>
-            </w:rPr>
-            <m:t>M</m:t>
-          </m:r>
-          <m:r>
-            <w:rPr>
-              <w:rFonts w:ascii="Cambria Math" w:hAnsi="Cambria Math"/>
-            </w:rPr>
-            <m:t>+</m:t>
-          </m:r>
-          <m:r>
-            <w:rPr>
-              <w:rFonts w:ascii="Cambria Math" w:hAnsi="Cambria Math"/>
-            </w:rPr>
-            <m:t>C</m:t>
-          </m:r>
-          <m:r>
-            <w:rPr>
-              <w:rFonts w:ascii="Cambria Math" w:hAnsi="Cambria Math"/>
-            </w:rPr>
-            <m:t>+</m:t>
-          </m:r>
-          <m:r>
-            <w:rPr>
-              <w:rFonts w:ascii="Cambria Math" w:hAnsi="Cambria Math"/>
-            </w:rPr>
-            <m:t>N</m:t>
-          </m:r>
-          <m:r>
-            <w:rPr>
-              <w:rFonts w:ascii="Cambria Math" w:hAnsi="Cambria Math"/>
-            </w:rPr>
-            <m:t>)</m:t>
+            <m:t>=(M+0.5C)/(M+C+N)</m:t>
           </m:r>
         </m:oMath>
       </m:oMathPara>
@@ -7337,7 +7122,6 @@
                 <w:lang w:eastAsia="en-US"/>
               </w:rPr>
             </w:pPr>
-            <w:proofErr w:type="spellStart"/>
             <w:r>
               <w:rPr>
                 <w:rFonts w:ascii="Arial" w:hAnsi="Arial"/>
@@ -7350,7 +7134,6 @@
               </w:rPr>
               <w:t>FHx</w:t>
             </w:r>
-            <w:proofErr w:type="spellEnd"/>
           </w:p>
         </w:tc>
         <w:tc>
@@ -8121,7 +7904,11 @@
         <w:t xml:space="preserve">. Moreover, </w:t>
       </w:r>
       <w:r>
-        <w:t xml:space="preserve">LLMs offer broader coverage </w:t>
+        <w:t xml:space="preserve">LLMs </w:t>
+      </w:r>
+      <w:r>
+        <w:lastRenderedPageBreak/>
+        <w:t xml:space="preserve">offer broader coverage </w:t>
       </w:r>
       <w:r>
         <w:t xml:space="preserve">of safety concepts such as age, sex, </w:t>
@@ -8142,11 +7929,7 @@
         <w:t xml:space="preserve">which </w:t>
       </w:r>
       <w:r>
-        <w:t xml:space="preserve">were challenging to </w:t>
-      </w:r>
-      <w:r>
-        <w:lastRenderedPageBreak/>
-        <w:t xml:space="preserve">extract </w:t>
+        <w:t xml:space="preserve">were challenging to extract </w:t>
       </w:r>
       <w:r>
         <w:t>using</w:t>
@@ -8670,16 +8453,7 @@
                 <w:color w:val="222222"/>
                 <w:sz w:val="16"/>
               </w:rPr>
-              <w:t>Llama-4</w:t>
-            </w:r>
-            <w:r>
-              <w:rPr>
-                <w:rFonts w:ascii="Arial" w:hAnsi="Arial"/>
-                <w:b/>
-                <w:color w:val="222222"/>
-                <w:sz w:val="16"/>
-              </w:rPr>
-              <w:t xml:space="preserve"> </w:t>
+              <w:t xml:space="preserve">Llama-4 </w:t>
             </w:r>
           </w:p>
         </w:tc>
@@ -9180,7 +8954,6 @@
         <w:pStyle w:val="Heading2"/>
       </w:pPr>
       <w:r>
-        <w:lastRenderedPageBreak/>
         <w:t xml:space="preserve">3.4 </w:t>
       </w:r>
       <w:r>
@@ -9387,13 +9160,7 @@
         <w:t xml:space="preserve">BERT </w:t>
       </w:r>
       <w:r>
-        <w:t>(</w:t>
-      </w:r>
-      <w:r>
-        <w:t>5,793</w:t>
-      </w:r>
-      <w:r>
-        <w:t xml:space="preserve">) </w:t>
+        <w:t xml:space="preserve">(5,793) </w:t>
       </w:r>
       <w:r>
         <w:t>and LLM</w:t>
@@ -9513,7 +9280,15 @@
           <w:sz w:val="20"/>
           <w:szCs w:val="20"/>
         </w:rPr>
-        <w:t>). (b) Top label misclassifications for BERT. (c) Top label misclassifications for LLM. (d) Typical concomitant drug and treatment terms misclassified as suspect drug (sDrug) by LLM. (e) Typical clinical terms exhibiting medical history (MHx) versus diagnosis (Dx) or adverse event (AE) confusions by LLM.</w:t>
+        <w:t xml:space="preserve">). (b) Top label misclassifications for BERT. (c) Top label misclassifications for LLM. (d) Typical concomitant drug and treatment terms misclassified as suspect drug </w:t>
+      </w:r>
+      <w:r>
+        <w:rPr>
+          <w:sz w:val="20"/>
+          <w:szCs w:val="20"/>
+        </w:rPr>
+        <w:lastRenderedPageBreak/>
+        <w:t>(sDrug) by LLM. (e) Typical clinical terms exhibiting medical history (MHx) versus diagnosis (Dx) or adverse event (AE) confusions by LLM.</w:t>
       </w:r>
     </w:p>
     <w:p/>
@@ -9748,6 +9523,7 @@
         <w:pStyle w:val="Heading2"/>
       </w:pPr>
       <w:r>
+        <w:lastRenderedPageBreak/>
         <w:t>3.5 VAER</w:t>
       </w:r>
       <w:r>
@@ -9774,7 +9550,17 @@
         <w:t>dataset</w:t>
       </w:r>
       <w:r>
-        <w:t xml:space="preserve">. As </w:t>
+        <w:t>.</w:t>
+      </w:r>
+      <w:r>
+        <w:rPr>
+          <w:rFonts w:hint="eastAsia"/>
+          <w:lang w:eastAsia="zh-CN"/>
+        </w:rPr>
+        <w:t xml:space="preserve"> Since VAERS dataset did not provide ETHER result, we only compared SME with LLM annotations</w:t>
+      </w:r>
+      <w:r>
+        <w:t xml:space="preserve"> As </w:t>
       </w:r>
       <w:r>
         <w:t>the result,</w:t>
@@ -9783,10 +9569,7 @@
         <w:t xml:space="preserve"> BioBERT fine-tuned via 10-fold cross-validation achieved a strict exact-match F1 of 0.7015 </w:t>
       </w:r>
       <w:r>
-        <w:t>± 0.0174</w:t>
-      </w:r>
-      <w:r>
-        <w:t xml:space="preserve"> </w:t>
+        <w:t xml:space="preserve">± 0.0174 </w:t>
       </w:r>
       <w:r>
         <w:t xml:space="preserve">(0.8370 </w:t>
@@ -9795,11 +9578,7 @@
         <w:t>± 0.0095</w:t>
       </w:r>
       <w:r>
-        <w:t xml:space="preserve"> for </w:t>
-      </w:r>
-      <w:r>
-        <w:lastRenderedPageBreak/>
-        <w:t>A</w:t>
+        <w:t xml:space="preserve"> for A</w:t>
       </w:r>
       <w:r>
         <w:t>dapted</w:t>
@@ -9825,108 +9604,14 @@
           <w:sz w:val="20"/>
           <w:szCs w:val="20"/>
         </w:rPr>
-        <w:t xml:space="preserve">Table </w:t>
-      </w:r>
-      <w:r>
-        <w:rPr>
-          <w:b/>
-          <w:bCs/>
+        <w:t xml:space="preserve">Table 4. </w:t>
+      </w:r>
+      <w:r>
+        <w:rPr>
           <w:sz w:val="20"/>
           <w:szCs w:val="20"/>
         </w:rPr>
-        <w:t>4</w:t>
-      </w:r>
-      <w:r>
-        <w:rPr>
-          <w:rFonts w:hint="eastAsia"/>
-          <w:b/>
-          <w:bCs/>
-          <w:sz w:val="20"/>
-          <w:szCs w:val="20"/>
-        </w:rPr>
-        <w:t>.</w:t>
-      </w:r>
-      <w:r>
-        <w:rPr>
-          <w:rFonts w:hint="eastAsia"/>
-          <w:sz w:val="20"/>
-          <w:szCs w:val="20"/>
-        </w:rPr>
-        <w:t xml:space="preserve"> </w:t>
-      </w:r>
-      <w:r>
-        <w:rPr>
-          <w:sz w:val="20"/>
-          <w:szCs w:val="20"/>
-        </w:rPr>
-        <w:t>V</w:t>
-      </w:r>
-      <w:r>
-        <w:rPr>
-          <w:sz w:val="20"/>
-          <w:szCs w:val="20"/>
-        </w:rPr>
-        <w:t xml:space="preserve">AERS </w:t>
-      </w:r>
-      <w:r>
-        <w:rPr>
-          <w:rFonts w:hint="eastAsia"/>
-          <w:sz w:val="20"/>
-          <w:szCs w:val="20"/>
-        </w:rPr>
-        <w:t>annotations</w:t>
-      </w:r>
-      <w:r>
-        <w:rPr>
-          <w:sz w:val="20"/>
-          <w:szCs w:val="20"/>
-        </w:rPr>
-        <w:t>, categorized</w:t>
-      </w:r>
-      <w:r>
-        <w:rPr>
-          <w:rFonts w:hint="eastAsia"/>
-          <w:sz w:val="20"/>
-          <w:szCs w:val="20"/>
-        </w:rPr>
-        <w:t xml:space="preserve"> </w:t>
-      </w:r>
-      <w:r>
-        <w:rPr>
-          <w:sz w:val="20"/>
-          <w:szCs w:val="20"/>
-        </w:rPr>
-        <w:t>by</w:t>
-      </w:r>
-      <w:r>
-        <w:rPr>
-          <w:rFonts w:hint="eastAsia"/>
-          <w:sz w:val="20"/>
-          <w:szCs w:val="20"/>
-        </w:rPr>
-        <w:t xml:space="preserve"> </w:t>
-      </w:r>
-      <w:r>
-        <w:rPr>
-          <w:sz w:val="20"/>
-          <w:szCs w:val="20"/>
-        </w:rPr>
-        <w:t>GT</w:t>
-      </w:r>
-      <w:r>
-        <w:rPr>
-          <w:rFonts w:hint="eastAsia"/>
-          <w:sz w:val="20"/>
-          <w:szCs w:val="20"/>
-        </w:rPr>
-        <w:t>, ETHER</w:t>
-      </w:r>
-      <w:r>
-        <w:rPr>
-          <w:sz w:val="20"/>
-          <w:szCs w:val="20"/>
-        </w:rPr>
-        <w:t xml:space="preserve"> and LLM</w:t>
+        <w:t>VAERS annotations across 11 categories.</w:t>
       </w:r>
     </w:p>
     <w:tbl>
@@ -9939,12 +9624,12 @@
         <w:gridCol w:w="1440"/>
         <w:gridCol w:w="1440"/>
         <w:gridCol w:w="1440"/>
-        <w:gridCol w:w="1440"/>
       </w:tblGrid>
       <w:tr>
         <w:trPr>
           <w:cnfStyle w:val="100000000000" w:firstRow="1" w:lastRow="0" w:firstColumn="0" w:lastColumn="0" w:oddVBand="0" w:evenVBand="0" w:oddHBand="0" w:evenHBand="0" w:firstRowFirstColumn="0" w:firstRowLastColumn="0" w:lastRowFirstColumn="0" w:lastRowLastColumn="0"/>
           <w:trHeight w:val="20"/>
+          <w:tblHeader/>
         </w:trPr>
         <w:tc>
           <w:tcPr>
@@ -10047,31 +9732,19 @@
                 <w:szCs w:val="24"/>
                 <w:lang w:eastAsia="en-US"/>
               </w:rPr>
-              <w:t>ETHER</w:t>
-            </w:r>
-          </w:p>
-        </w:tc>
-        <w:tc>
-          <w:tcPr>
-            <w:tcW w:w="1440" w:type="dxa"/>
-            <w:vAlign w:val="center"/>
-            <w:hideMark/>
-          </w:tcPr>
-          <w:p>
-            <w:pPr>
-              <w:spacing w:before="30" w:after="30" w:line="278" w:lineRule="auto"/>
-              <w:jc w:val="right"/>
-              <w:cnfStyle w:val="100000000000" w:firstRow="1" w:lastRow="0" w:firstColumn="0" w:lastColumn="0" w:oddVBand="0" w:evenVBand="0" w:oddHBand="0" w:evenHBand="0" w:firstRowFirstColumn="0" w:firstRowLastColumn="0" w:lastRowFirstColumn="0" w:lastRowLastColumn="0"/>
-              <w:rPr>
-                <w:rFonts w:ascii="Arial" w:hAnsi="Arial"/>
+              <w:t>LLM (</w:t>
+            </w:r>
+            <w:r>
+              <w:rPr>
+                <w:rFonts w:ascii="Arial" w:hAnsi="Arial" w:hint="eastAsia"/>
                 <w:bCs w:val="0"/>
                 <w:color w:val="111111"/>
                 <w:kern w:val="2"/>
                 <w:sz w:val="16"/>
                 <w:szCs w:val="24"/>
-                <w:lang w:eastAsia="en-US"/>
-              </w:rPr>
-            </w:pPr>
+              </w:rPr>
+              <w:t>Llama-</w:t>
+            </w:r>
             <w:r>
               <w:rPr>
                 <w:rFonts w:ascii="Arial" w:hAnsi="Arial"/>
@@ -10082,19 +9755,7 @@
                 <w:szCs w:val="24"/>
                 <w:lang w:eastAsia="en-US"/>
               </w:rPr>
-              <w:t>LLM</w:t>
-            </w:r>
-            <w:r>
-              <w:rPr>
-                <w:rFonts w:ascii="Arial" w:hAnsi="Arial"/>
-                <w:bCs w:val="0"/>
-                <w:color w:val="111111"/>
-                <w:kern w:val="2"/>
-                <w:sz w:val="16"/>
-                <w:szCs w:val="24"/>
-                <w:lang w:eastAsia="en-US"/>
-              </w:rPr>
-              <w:t xml:space="preserve"> (Llama-4)</w:t>
+              <w:t>4)</w:t>
             </w:r>
           </w:p>
         </w:tc>
@@ -10134,7 +9795,7 @@
                 <w:szCs w:val="24"/>
                 <w:lang w:eastAsia="en-US"/>
               </w:rPr>
-              <w:t>SDrug</w:t>
+              <w:t>pDx</w:t>
             </w:r>
           </w:p>
         </w:tc>
@@ -10169,15 +9830,13 @@
                 <w:szCs w:val="24"/>
                 <w:lang w:eastAsia="en-US"/>
               </w:rPr>
-              <w:t>3,501</w:t>
+              <w:t>1,244</w:t>
             </w:r>
           </w:p>
         </w:tc>
         <w:tc>
           <w:tcPr>
             <w:tcW w:w="1440" w:type="dxa"/>
-            <w:vMerge w:val="restart"/>
-            <w:vAlign w:val="center"/>
             <w:hideMark/>
           </w:tcPr>
           <w:p>
@@ -10205,54 +9864,7 @@
                 <w:szCs w:val="24"/>
                 <w:lang w:eastAsia="en-US"/>
               </w:rPr>
-              <w:t>17164</w:t>
-            </w:r>
-            <w:r>
-              <w:rPr>
-                <w:rFonts w:ascii="Arial" w:hAnsi="Arial"/>
-                <w:bCs/>
-                <w:color w:val="111111"/>
-                <w:kern w:val="2"/>
-                <w:sz w:val="16"/>
-                <w:szCs w:val="24"/>
-                <w:vertAlign w:val="superscript"/>
-                <w:lang w:eastAsia="en-US"/>
-              </w:rPr>
-              <w:t>†</w:t>
-            </w:r>
-          </w:p>
-        </w:tc>
-        <w:tc>
-          <w:tcPr>
-            <w:tcW w:w="1440" w:type="dxa"/>
-            <w:hideMark/>
-          </w:tcPr>
-          <w:p>
-            <w:pPr>
-              <w:spacing w:before="30" w:after="30" w:line="278" w:lineRule="auto"/>
-              <w:jc w:val="right"/>
-              <w:cnfStyle w:val="000000000000" w:firstRow="0" w:lastRow="0" w:firstColumn="0" w:lastColumn="0" w:oddVBand="0" w:evenVBand="0" w:oddHBand="0" w:evenHBand="0" w:firstRowFirstColumn="0" w:firstRowLastColumn="0" w:lastRowFirstColumn="0" w:lastRowLastColumn="0"/>
-              <w:rPr>
-                <w:rFonts w:ascii="Arial" w:hAnsi="Arial"/>
-                <w:bCs/>
-                <w:color w:val="111111"/>
-                <w:kern w:val="2"/>
-                <w:sz w:val="16"/>
-                <w:szCs w:val="24"/>
-                <w:lang w:eastAsia="en-US"/>
-              </w:rPr>
-            </w:pPr>
-            <w:r>
-              <w:rPr>
-                <w:rFonts w:ascii="Arial" w:hAnsi="Arial"/>
-                <w:bCs/>
-                <w:color w:val="111111"/>
-                <w:kern w:val="2"/>
-                <w:sz w:val="16"/>
-                <w:szCs w:val="24"/>
-                <w:lang w:eastAsia="en-US"/>
-              </w:rPr>
-              <w:t>5907</w:t>
+              <w:t>1,243</w:t>
             </w:r>
           </w:p>
         </w:tc>
@@ -10292,7 +9904,7 @@
                 <w:szCs w:val="24"/>
                 <w:lang w:eastAsia="en-US"/>
               </w:rPr>
-              <w:t>CDrug</w:t>
+              <w:t>sDx</w:t>
             </w:r>
           </w:p>
         </w:tc>
@@ -10327,15 +9939,13 @@
                 <w:szCs w:val="24"/>
                 <w:lang w:eastAsia="en-US"/>
               </w:rPr>
-              <w:t>2,928</w:t>
+              <w:t>8,265</w:t>
             </w:r>
           </w:p>
         </w:tc>
         <w:tc>
           <w:tcPr>
             <w:tcW w:w="1440" w:type="dxa"/>
-            <w:vMerge/>
-            <w:vAlign w:val="center"/>
             <w:hideMark/>
           </w:tcPr>
           <w:p>
@@ -10353,18 +9963,7 @@
                 <w:lang w:eastAsia="en-US"/>
               </w:rPr>
             </w:pPr>
-          </w:p>
-        </w:tc>
-        <w:tc>
-          <w:tcPr>
-            <w:tcW w:w="1440" w:type="dxa"/>
-            <w:hideMark/>
-          </w:tcPr>
-          <w:p>
-            <w:pPr>
-              <w:spacing w:before="30" w:after="30" w:line="278" w:lineRule="auto"/>
-              <w:jc w:val="right"/>
-              <w:cnfStyle w:val="000000000000" w:firstRow="0" w:lastRow="0" w:firstColumn="0" w:lastColumn="0" w:oddVBand="0" w:evenVBand="0" w:oddHBand="0" w:evenHBand="0" w:firstRowFirstColumn="0" w:firstRowLastColumn="0" w:lastRowFirstColumn="0" w:lastRowLastColumn="0"/>
+            <w:r>
               <w:rPr>
                 <w:rFonts w:ascii="Arial" w:hAnsi="Arial"/>
                 <w:bCs/>
@@ -10374,18 +9973,7 @@
                 <w:szCs w:val="24"/>
                 <w:lang w:eastAsia="en-US"/>
               </w:rPr>
-            </w:pPr>
-            <w:r>
-              <w:rPr>
-                <w:rFonts w:ascii="Arial" w:hAnsi="Arial"/>
-                <w:bCs/>
-                <w:color w:val="111111"/>
-                <w:kern w:val="2"/>
-                <w:sz w:val="16"/>
-                <w:szCs w:val="24"/>
-                <w:lang w:eastAsia="en-US"/>
-              </w:rPr>
-              <w:t>3514</w:t>
+              <w:t>2,784</w:t>
             </w:r>
           </w:p>
         </w:tc>
@@ -10425,31 +10013,7 @@
                 <w:szCs w:val="24"/>
                 <w:lang w:eastAsia="en-US"/>
               </w:rPr>
-              <w:t>O</w:t>
-            </w:r>
-            <w:r>
-              <w:rPr>
-                <w:rFonts w:ascii="Arial" w:hAnsi="Arial"/>
-                <w:bCs w:val="0"/>
-                <w:color w:val="111111"/>
-                <w:kern w:val="2"/>
-                <w:sz w:val="16"/>
-                <w:szCs w:val="24"/>
-                <w:lang w:eastAsia="en-US"/>
-              </w:rPr>
-              <w:t>D</w:t>
-            </w:r>
-            <w:r>
-              <w:rPr>
-                <w:rFonts w:ascii="Arial" w:hAnsi="Arial"/>
-                <w:bCs w:val="0"/>
-                <w:color w:val="111111"/>
-                <w:kern w:val="2"/>
-                <w:sz w:val="16"/>
-                <w:szCs w:val="24"/>
-                <w:lang w:eastAsia="en-US"/>
-              </w:rPr>
-              <w:t>rug</w:t>
+              <w:t>R/O</w:t>
             </w:r>
           </w:p>
         </w:tc>
@@ -10484,15 +10048,13 @@
                 <w:szCs w:val="24"/>
                 <w:lang w:eastAsia="en-US"/>
               </w:rPr>
-              <w:t>245</w:t>
+              <w:t>171</w:t>
             </w:r>
           </w:p>
         </w:tc>
         <w:tc>
           <w:tcPr>
             <w:tcW w:w="1440" w:type="dxa"/>
-            <w:vMerge/>
-            <w:vAlign w:val="center"/>
             <w:hideMark/>
           </w:tcPr>
           <w:p>
@@ -10510,18 +10072,7 @@
                 <w:lang w:eastAsia="en-US"/>
               </w:rPr>
             </w:pPr>
-          </w:p>
-        </w:tc>
-        <w:tc>
-          <w:tcPr>
-            <w:tcW w:w="1440" w:type="dxa"/>
-            <w:hideMark/>
-          </w:tcPr>
-          <w:p>
-            <w:pPr>
-              <w:spacing w:before="30" w:after="30" w:line="278" w:lineRule="auto"/>
-              <w:jc w:val="right"/>
-              <w:cnfStyle w:val="000000000000" w:firstRow="0" w:lastRow="0" w:firstColumn="0" w:lastColumn="0" w:oddVBand="0" w:evenVBand="0" w:oddHBand="0" w:evenHBand="0" w:firstRowFirstColumn="0" w:firstRowLastColumn="0" w:lastRowFirstColumn="0" w:lastRowLastColumn="0"/>
+            <w:r>
               <w:rPr>
                 <w:rFonts w:ascii="Arial" w:hAnsi="Arial"/>
                 <w:bCs/>
@@ -10531,18 +10082,7 @@
                 <w:szCs w:val="24"/>
                 <w:lang w:eastAsia="en-US"/>
               </w:rPr>
-            </w:pPr>
-            <w:r>
-              <w:rPr>
-                <w:rFonts w:ascii="Arial" w:hAnsi="Arial"/>
-                <w:bCs/>
-                <w:color w:val="111111"/>
-                <w:kern w:val="2"/>
-                <w:sz w:val="16"/>
-                <w:szCs w:val="24"/>
-                <w:lang w:eastAsia="en-US"/>
-              </w:rPr>
-              <w:t>511</w:t>
+              <w:t>498</w:t>
             </w:r>
           </w:p>
         </w:tc>
@@ -10582,7 +10122,7 @@
                 <w:szCs w:val="24"/>
                 <w:lang w:eastAsia="en-US"/>
               </w:rPr>
-              <w:t>Dose</w:t>
+              <w:t>SYM</w:t>
             </w:r>
           </w:p>
         </w:tc>
@@ -10617,14 +10157,13 @@
                 <w:szCs w:val="24"/>
                 <w:lang w:eastAsia="en-US"/>
               </w:rPr>
-              <w:t>1,621</w:t>
+              <w:t>14,581</w:t>
             </w:r>
           </w:p>
         </w:tc>
         <w:tc>
           <w:tcPr>
             <w:tcW w:w="1440" w:type="dxa"/>
-            <w:vAlign w:val="center"/>
             <w:hideMark/>
           </w:tcPr>
           <w:p>
@@ -10652,41 +10191,7 @@
                 <w:szCs w:val="24"/>
                 <w:lang w:eastAsia="en-US"/>
               </w:rPr>
-              <w:t>n/a</w:t>
-            </w:r>
-          </w:p>
-        </w:tc>
-        <w:tc>
-          <w:tcPr>
-            <w:tcW w:w="1440" w:type="dxa"/>
-            <w:hideMark/>
-          </w:tcPr>
-          <w:p>
-            <w:pPr>
-              <w:spacing w:before="30" w:after="30" w:line="278" w:lineRule="auto"/>
-              <w:jc w:val="right"/>
-              <w:cnfStyle w:val="000000000000" w:firstRow="0" w:lastRow="0" w:firstColumn="0" w:lastColumn="0" w:oddVBand="0" w:evenVBand="0" w:oddHBand="0" w:evenHBand="0" w:firstRowFirstColumn="0" w:firstRowLastColumn="0" w:lastRowFirstColumn="0" w:lastRowLastColumn="0"/>
-              <w:rPr>
-                <w:rFonts w:ascii="Arial" w:hAnsi="Arial"/>
-                <w:bCs/>
-                <w:color w:val="111111"/>
-                <w:kern w:val="2"/>
-                <w:sz w:val="16"/>
-                <w:szCs w:val="24"/>
-                <w:lang w:eastAsia="en-US"/>
-              </w:rPr>
-            </w:pPr>
-            <w:r>
-              <w:rPr>
-                <w:rFonts w:ascii="Arial" w:hAnsi="Arial"/>
-                <w:bCs/>
-                <w:color w:val="111111"/>
-                <w:kern w:val="2"/>
-                <w:sz w:val="16"/>
-                <w:szCs w:val="24"/>
-                <w:lang w:eastAsia="en-US"/>
-              </w:rPr>
-              <w:t>2013</w:t>
+              <w:t>11,656</w:t>
             </w:r>
           </w:p>
         </w:tc>
@@ -10726,7 +10231,7 @@
                 <w:szCs w:val="24"/>
                 <w:lang w:eastAsia="en-US"/>
               </w:rPr>
-              <w:t>Indication</w:t>
+              <w:t>CoD</w:t>
             </w:r>
           </w:p>
         </w:tc>
@@ -10761,14 +10266,13 @@
                 <w:szCs w:val="24"/>
                 <w:lang w:eastAsia="en-US"/>
               </w:rPr>
-              <w:t>162</w:t>
+              <w:t>46</w:t>
             </w:r>
           </w:p>
         </w:tc>
         <w:tc>
           <w:tcPr>
             <w:tcW w:w="1440" w:type="dxa"/>
-            <w:vAlign w:val="center"/>
             <w:hideMark/>
           </w:tcPr>
           <w:p>
@@ -10796,41 +10300,7 @@
                 <w:szCs w:val="24"/>
                 <w:lang w:eastAsia="en-US"/>
               </w:rPr>
-              <w:t>n/a</w:t>
-            </w:r>
-          </w:p>
-        </w:tc>
-        <w:tc>
-          <w:tcPr>
-            <w:tcW w:w="1440" w:type="dxa"/>
-            <w:hideMark/>
-          </w:tcPr>
-          <w:p>
-            <w:pPr>
-              <w:spacing w:before="30" w:after="30" w:line="278" w:lineRule="auto"/>
-              <w:jc w:val="right"/>
-              <w:cnfStyle w:val="000000000000" w:firstRow="0" w:lastRow="0" w:firstColumn="0" w:lastColumn="0" w:oddVBand="0" w:evenVBand="0" w:oddHBand="0" w:evenHBand="0" w:firstRowFirstColumn="0" w:firstRowLastColumn="0" w:lastRowFirstColumn="0" w:lastRowLastColumn="0"/>
-              <w:rPr>
-                <w:rFonts w:ascii="Arial" w:hAnsi="Arial"/>
-                <w:bCs/>
-                <w:color w:val="111111"/>
-                <w:kern w:val="2"/>
-                <w:sz w:val="16"/>
-                <w:szCs w:val="24"/>
-                <w:lang w:eastAsia="en-US"/>
-              </w:rPr>
-            </w:pPr>
-            <w:r>
-              <w:rPr>
-                <w:rFonts w:ascii="Arial" w:hAnsi="Arial"/>
-                <w:bCs/>
-                <w:color w:val="111111"/>
-                <w:kern w:val="2"/>
-                <w:sz w:val="16"/>
-                <w:szCs w:val="24"/>
-                <w:lang w:eastAsia="en-US"/>
-              </w:rPr>
-              <w:t>1415</w:t>
+              <w:t>45</w:t>
             </w:r>
           </w:p>
         </w:tc>
@@ -10870,7 +10340,7 @@
                 <w:szCs w:val="24"/>
                 <w:lang w:eastAsia="en-US"/>
               </w:rPr>
-              <w:t>Treatment</w:t>
+              <w:t>Lab</w:t>
             </w:r>
           </w:p>
         </w:tc>
@@ -10905,14 +10375,13 @@
                 <w:szCs w:val="24"/>
                 <w:lang w:eastAsia="en-US"/>
               </w:rPr>
-              <w:t>1,479</w:t>
+              <w:t>3,849</w:t>
             </w:r>
           </w:p>
         </w:tc>
         <w:tc>
           <w:tcPr>
             <w:tcW w:w="1440" w:type="dxa"/>
-            <w:vAlign w:val="center"/>
             <w:hideMark/>
           </w:tcPr>
           <w:p>
@@ -10940,41 +10409,7 @@
                 <w:szCs w:val="24"/>
                 <w:lang w:eastAsia="en-US"/>
               </w:rPr>
-              <w:t>n/a</w:t>
-            </w:r>
-          </w:p>
-        </w:tc>
-        <w:tc>
-          <w:tcPr>
-            <w:tcW w:w="1440" w:type="dxa"/>
-            <w:hideMark/>
-          </w:tcPr>
-          <w:p>
-            <w:pPr>
-              <w:spacing w:before="30" w:after="30" w:line="278" w:lineRule="auto"/>
-              <w:jc w:val="right"/>
-              <w:cnfStyle w:val="000000000000" w:firstRow="0" w:lastRow="0" w:firstColumn="0" w:lastColumn="0" w:oddVBand="0" w:evenVBand="0" w:oddHBand="0" w:evenHBand="0" w:firstRowFirstColumn="0" w:firstRowLastColumn="0" w:lastRowFirstColumn="0" w:lastRowLastColumn="0"/>
-              <w:rPr>
-                <w:rFonts w:ascii="Arial" w:hAnsi="Arial"/>
-                <w:bCs/>
-                <w:color w:val="111111"/>
-                <w:kern w:val="2"/>
-                <w:sz w:val="16"/>
-                <w:szCs w:val="24"/>
-                <w:lang w:eastAsia="en-US"/>
-              </w:rPr>
-            </w:pPr>
-            <w:r>
-              <w:rPr>
-                <w:rFonts w:ascii="Arial" w:hAnsi="Arial"/>
-                <w:bCs/>
-                <w:color w:val="111111"/>
-                <w:kern w:val="2"/>
-                <w:sz w:val="16"/>
-                <w:szCs w:val="24"/>
-                <w:lang w:eastAsia="en-US"/>
-              </w:rPr>
-              <w:t>1720</w:t>
+              <w:t>4,858</w:t>
             </w:r>
           </w:p>
         </w:tc>
@@ -11014,7 +10449,7 @@
                 <w:szCs w:val="24"/>
                 <w:lang w:eastAsia="en-US"/>
               </w:rPr>
-              <w:t>AE</w:t>
+              <w:t>FHx</w:t>
             </w:r>
           </w:p>
         </w:tc>
@@ -11049,15 +10484,13 @@
                 <w:szCs w:val="24"/>
                 <w:lang w:eastAsia="en-US"/>
               </w:rPr>
-              <w:t>9,080</w:t>
+              <w:t>195</w:t>
             </w:r>
           </w:p>
         </w:tc>
         <w:tc>
           <w:tcPr>
             <w:tcW w:w="1440" w:type="dxa"/>
-            <w:vMerge w:val="restart"/>
-            <w:vAlign w:val="center"/>
             <w:hideMark/>
           </w:tcPr>
           <w:p>
@@ -11085,54 +10518,7 @@
                 <w:szCs w:val="24"/>
                 <w:lang w:eastAsia="en-US"/>
               </w:rPr>
-              <w:t>25,031</w:t>
-            </w:r>
-            <w:r>
-              <w:rPr>
-                <w:rFonts w:ascii="Arial" w:hAnsi="Arial"/>
-                <w:bCs/>
-                <w:color w:val="111111"/>
-                <w:kern w:val="2"/>
-                <w:sz w:val="16"/>
-                <w:szCs w:val="24"/>
-                <w:vertAlign w:val="superscript"/>
-                <w:lang w:eastAsia="en-US"/>
-              </w:rPr>
-              <w:t>†</w:t>
-            </w:r>
-          </w:p>
-        </w:tc>
-        <w:tc>
-          <w:tcPr>
-            <w:tcW w:w="1440" w:type="dxa"/>
-            <w:hideMark/>
-          </w:tcPr>
-          <w:p>
-            <w:pPr>
-              <w:spacing w:before="30" w:after="30" w:line="278" w:lineRule="auto"/>
-              <w:jc w:val="right"/>
-              <w:cnfStyle w:val="000000000000" w:firstRow="0" w:lastRow="0" w:firstColumn="0" w:lastColumn="0" w:oddVBand="0" w:evenVBand="0" w:oddHBand="0" w:evenHBand="0" w:firstRowFirstColumn="0" w:firstRowLastColumn="0" w:lastRowFirstColumn="0" w:lastRowLastColumn="0"/>
-              <w:rPr>
-                <w:rFonts w:ascii="Arial" w:hAnsi="Arial"/>
-                <w:bCs/>
-                <w:color w:val="111111"/>
-                <w:kern w:val="2"/>
-                <w:sz w:val="16"/>
-                <w:szCs w:val="24"/>
-                <w:lang w:eastAsia="en-US"/>
-              </w:rPr>
-            </w:pPr>
-            <w:r>
-              <w:rPr>
-                <w:rFonts w:ascii="Arial" w:hAnsi="Arial"/>
-                <w:bCs/>
-                <w:color w:val="111111"/>
-                <w:kern w:val="2"/>
-                <w:sz w:val="16"/>
-                <w:szCs w:val="24"/>
-                <w:lang w:eastAsia="en-US"/>
-              </w:rPr>
-              <w:t>12398</w:t>
+              <w:t>198</w:t>
             </w:r>
           </w:p>
         </w:tc>
@@ -11172,7 +10558,7 @@
                 <w:szCs w:val="24"/>
                 <w:lang w:eastAsia="en-US"/>
               </w:rPr>
-              <w:t>mAE</w:t>
+              <w:t>MHx</w:t>
             </w:r>
           </w:p>
         </w:tc>
@@ -11207,15 +10593,13 @@
                 <w:szCs w:val="24"/>
                 <w:lang w:eastAsia="en-US"/>
               </w:rPr>
-              <w:t>112</w:t>
+              <w:t>1,183</w:t>
             </w:r>
           </w:p>
         </w:tc>
         <w:tc>
           <w:tcPr>
             <w:tcW w:w="1440" w:type="dxa"/>
-            <w:vMerge/>
-            <w:vAlign w:val="center"/>
             <w:hideMark/>
           </w:tcPr>
           <w:p>
@@ -11233,18 +10617,7 @@
                 <w:lang w:eastAsia="en-US"/>
               </w:rPr>
             </w:pPr>
-          </w:p>
-        </w:tc>
-        <w:tc>
-          <w:tcPr>
-            <w:tcW w:w="1440" w:type="dxa"/>
-            <w:hideMark/>
-          </w:tcPr>
-          <w:p>
-            <w:pPr>
-              <w:spacing w:before="30" w:after="30" w:line="278" w:lineRule="auto"/>
-              <w:jc w:val="right"/>
-              <w:cnfStyle w:val="000000000000" w:firstRow="0" w:lastRow="0" w:firstColumn="0" w:lastColumn="0" w:oddVBand="0" w:evenVBand="0" w:oddHBand="0" w:evenHBand="0" w:firstRowFirstColumn="0" w:firstRowLastColumn="0" w:lastRowFirstColumn="0" w:lastRowLastColumn="0"/>
+            <w:r>
               <w:rPr>
                 <w:rFonts w:ascii="Arial" w:hAnsi="Arial"/>
                 <w:bCs/>
@@ -11254,18 +10627,7 @@
                 <w:szCs w:val="24"/>
                 <w:lang w:eastAsia="en-US"/>
               </w:rPr>
-            </w:pPr>
-            <w:r>
-              <w:rPr>
-                <w:rFonts w:ascii="Arial" w:hAnsi="Arial"/>
-                <w:bCs/>
-                <w:color w:val="111111"/>
-                <w:kern w:val="2"/>
-                <w:sz w:val="16"/>
-                <w:szCs w:val="24"/>
-                <w:lang w:eastAsia="en-US"/>
-              </w:rPr>
-              <w:t>605</w:t>
+              <w:t>2,006</w:t>
             </w:r>
           </w:p>
         </w:tc>
@@ -11305,7 +10667,7 @@
                 <w:szCs w:val="24"/>
                 <w:lang w:eastAsia="en-US"/>
               </w:rPr>
-              <w:t>Dx</w:t>
+              <w:t>STATUS</w:t>
             </w:r>
           </w:p>
         </w:tc>
@@ -11340,14 +10702,13 @@
                 <w:szCs w:val="24"/>
                 <w:lang w:eastAsia="en-US"/>
               </w:rPr>
-              <w:t>1783</w:t>
+              <w:t>1,747</w:t>
             </w:r>
           </w:p>
         </w:tc>
         <w:tc>
           <w:tcPr>
             <w:tcW w:w="1440" w:type="dxa"/>
-            <w:vAlign w:val="center"/>
             <w:hideMark/>
           </w:tcPr>
           <w:p>
@@ -11375,41 +10736,7 @@
                 <w:szCs w:val="24"/>
                 <w:lang w:eastAsia="en-US"/>
               </w:rPr>
-              <w:t>4,344</w:t>
-            </w:r>
-          </w:p>
-        </w:tc>
-        <w:tc>
-          <w:tcPr>
-            <w:tcW w:w="1440" w:type="dxa"/>
-            <w:hideMark/>
-          </w:tcPr>
-          <w:p>
-            <w:pPr>
-              <w:spacing w:before="30" w:after="30" w:line="278" w:lineRule="auto"/>
-              <w:jc w:val="right"/>
-              <w:cnfStyle w:val="000000000000" w:firstRow="0" w:lastRow="0" w:firstColumn="0" w:lastColumn="0" w:oddVBand="0" w:evenVBand="0" w:oddHBand="0" w:evenHBand="0" w:firstRowFirstColumn="0" w:firstRowLastColumn="0" w:lastRowFirstColumn="0" w:lastRowLastColumn="0"/>
-              <w:rPr>
-                <w:rFonts w:ascii="Arial" w:hAnsi="Arial"/>
-                <w:bCs/>
-                <w:color w:val="111111"/>
-                <w:kern w:val="2"/>
-                <w:sz w:val="16"/>
-                <w:szCs w:val="24"/>
-                <w:lang w:eastAsia="en-US"/>
-              </w:rPr>
-            </w:pPr>
-            <w:r>
-              <w:rPr>
-                <w:rFonts w:ascii="Arial" w:hAnsi="Arial"/>
-                <w:bCs/>
-                <w:color w:val="111111"/>
-                <w:kern w:val="2"/>
-                <w:sz w:val="16"/>
-                <w:szCs w:val="24"/>
-                <w:lang w:eastAsia="en-US"/>
-              </w:rPr>
-              <w:t>813</w:t>
+              <w:t>2,898</w:t>
             </w:r>
           </w:p>
         </w:tc>
@@ -11449,7 +10776,7 @@
                 <w:szCs w:val="24"/>
                 <w:lang w:eastAsia="en-US"/>
               </w:rPr>
-              <w:t>Lab</w:t>
+              <w:t>TX</w:t>
             </w:r>
           </w:p>
         </w:tc>
@@ -11484,14 +10811,13 @@
                 <w:szCs w:val="24"/>
                 <w:lang w:eastAsia="en-US"/>
               </w:rPr>
-              <w:t>3,480</w:t>
+              <w:t>3,607</w:t>
             </w:r>
           </w:p>
         </w:tc>
         <w:tc>
           <w:tcPr>
             <w:tcW w:w="1440" w:type="dxa"/>
-            <w:vAlign w:val="center"/>
             <w:hideMark/>
           </w:tcPr>
           <w:p>
@@ -11519,41 +10845,7 @@
                 <w:szCs w:val="24"/>
                 <w:lang w:eastAsia="en-US"/>
               </w:rPr>
-              <w:t>n/a</w:t>
-            </w:r>
-          </w:p>
-        </w:tc>
-        <w:tc>
-          <w:tcPr>
-            <w:tcW w:w="1440" w:type="dxa"/>
-            <w:hideMark/>
-          </w:tcPr>
-          <w:p>
-            <w:pPr>
-              <w:spacing w:before="30" w:after="30" w:line="278" w:lineRule="auto"/>
-              <w:jc w:val="right"/>
-              <w:cnfStyle w:val="000000000000" w:firstRow="0" w:lastRow="0" w:firstColumn="0" w:lastColumn="0" w:oddVBand="0" w:evenVBand="0" w:oddHBand="0" w:evenHBand="0" w:firstRowFirstColumn="0" w:firstRowLastColumn="0" w:lastRowFirstColumn="0" w:lastRowLastColumn="0"/>
-              <w:rPr>
-                <w:rFonts w:ascii="Arial" w:hAnsi="Arial"/>
-                <w:bCs/>
-                <w:color w:val="111111"/>
-                <w:kern w:val="2"/>
-                <w:sz w:val="16"/>
-                <w:szCs w:val="24"/>
-                <w:lang w:eastAsia="en-US"/>
-              </w:rPr>
-            </w:pPr>
-            <w:r>
-              <w:rPr>
-                <w:rFonts w:ascii="Arial" w:hAnsi="Arial"/>
-                <w:bCs/>
-                <w:color w:val="111111"/>
-                <w:kern w:val="2"/>
-                <w:sz w:val="16"/>
-                <w:szCs w:val="24"/>
-                <w:lang w:eastAsia="en-US"/>
-              </w:rPr>
-              <w:t>4348</w:t>
+              <w:t>3,955</w:t>
             </w:r>
           </w:p>
         </w:tc>
@@ -11593,7 +10885,7 @@
                 <w:szCs w:val="24"/>
                 <w:lang w:eastAsia="en-US"/>
               </w:rPr>
-              <w:t>Status</w:t>
+              <w:t>VAX</w:t>
             </w:r>
           </w:p>
         </w:tc>
@@ -11628,14 +10920,13 @@
                 <w:szCs w:val="24"/>
                 <w:lang w:eastAsia="en-US"/>
               </w:rPr>
-              <w:t>1,796</w:t>
+              <w:t>5,823</w:t>
             </w:r>
           </w:p>
         </w:tc>
         <w:tc>
           <w:tcPr>
             <w:tcW w:w="1440" w:type="dxa"/>
-            <w:vAlign w:val="center"/>
             <w:hideMark/>
           </w:tcPr>
           <w:p>
@@ -11663,41 +10954,7 @@
                 <w:szCs w:val="24"/>
                 <w:lang w:eastAsia="en-US"/>
               </w:rPr>
-              <w:t>n/a</w:t>
-            </w:r>
-          </w:p>
-        </w:tc>
-        <w:tc>
-          <w:tcPr>
-            <w:tcW w:w="1440" w:type="dxa"/>
-            <w:hideMark/>
-          </w:tcPr>
-          <w:p>
-            <w:pPr>
-              <w:spacing w:before="30" w:after="30" w:line="278" w:lineRule="auto"/>
-              <w:jc w:val="right"/>
-              <w:cnfStyle w:val="000000000000" w:firstRow="0" w:lastRow="0" w:firstColumn="0" w:lastColumn="0" w:oddVBand="0" w:evenVBand="0" w:oddHBand="0" w:evenHBand="0" w:firstRowFirstColumn="0" w:firstRowLastColumn="0" w:lastRowFirstColumn="0" w:lastRowLastColumn="0"/>
-              <w:rPr>
-                <w:rFonts w:ascii="Arial" w:hAnsi="Arial"/>
-                <w:bCs/>
-                <w:color w:val="111111"/>
-                <w:kern w:val="2"/>
-                <w:sz w:val="16"/>
-                <w:szCs w:val="24"/>
-                <w:lang w:eastAsia="en-US"/>
-              </w:rPr>
-            </w:pPr>
-            <w:r>
-              <w:rPr>
-                <w:rFonts w:ascii="Arial" w:hAnsi="Arial"/>
-                <w:bCs/>
-                <w:color w:val="111111"/>
-                <w:kern w:val="2"/>
-                <w:sz w:val="16"/>
-                <w:szCs w:val="24"/>
-                <w:lang w:eastAsia="en-US"/>
-              </w:rPr>
-              <w:t>1038</w:t>
+              <w:t>5,429</w:t>
             </w:r>
           </w:p>
         </w:tc>
@@ -11710,6 +10967,9 @@
           <w:tcPr>
             <w:cnfStyle w:val="001000000000" w:firstRow="0" w:lastRow="0" w:firstColumn="1" w:lastColumn="0" w:oddVBand="0" w:evenVBand="0" w:oddHBand="0" w:evenHBand="0" w:firstRowFirstColumn="0" w:firstRowLastColumn="0" w:lastRowFirstColumn="0" w:lastRowLastColumn="0"/>
             <w:tcW w:w="1440" w:type="dxa"/>
+            <w:tcBorders>
+              <w:top w:val="single" w:sz="8" w:space="0" w:color="333333"/>
+            </w:tcBorders>
             <w:vAlign w:val="center"/>
             <w:hideMark/>
           </w:tcPr>
@@ -11737,13 +10997,16 @@
                 <w:szCs w:val="24"/>
                 <w:lang w:eastAsia="en-US"/>
               </w:rPr>
-              <w:t>R/O</w:t>
+              <w:t>TOTAL</w:t>
             </w:r>
           </w:p>
         </w:tc>
         <w:tc>
           <w:tcPr>
             <w:tcW w:w="1440" w:type="dxa"/>
+            <w:tcBorders>
+              <w:top w:val="single" w:sz="8" w:space="0" w:color="333333"/>
+            </w:tcBorders>
             <w:vAlign w:val="center"/>
             <w:hideMark/>
           </w:tcPr>
@@ -11765,6 +11028,7 @@
             <w:r>
               <w:rPr>
                 <w:rFonts w:ascii="Arial" w:hAnsi="Arial"/>
+                <w:b/>
                 <w:bCs/>
                 <w:color w:val="111111"/>
                 <w:kern w:val="2"/>
@@ -11772,14 +11036,16 @@
                 <w:szCs w:val="24"/>
                 <w:lang w:eastAsia="en-US"/>
               </w:rPr>
-              <w:t>9</w:t>
+              <w:t>40,711</w:t>
             </w:r>
           </w:p>
         </w:tc>
         <w:tc>
           <w:tcPr>
             <w:tcW w:w="1440" w:type="dxa"/>
-            <w:vAlign w:val="center"/>
+            <w:tcBorders>
+              <w:top w:val="single" w:sz="8" w:space="0" w:color="333333"/>
+            </w:tcBorders>
             <w:hideMark/>
           </w:tcPr>
           <w:p>
@@ -11800,6 +11066,7 @@
             <w:r>
               <w:rPr>
                 <w:rFonts w:ascii="Arial" w:hAnsi="Arial"/>
+                <w:b/>
                 <w:bCs/>
                 <w:color w:val="111111"/>
                 <w:kern w:val="2"/>
@@ -11807,769 +11074,20 @@
                 <w:szCs w:val="24"/>
                 <w:lang w:eastAsia="en-US"/>
               </w:rPr>
-              <w:t>33</w:t>
-            </w:r>
-          </w:p>
-        </w:tc>
-        <w:tc>
-          <w:tcPr>
-            <w:tcW w:w="1440" w:type="dxa"/>
-            <w:hideMark/>
-          </w:tcPr>
-          <w:p>
-            <w:pPr>
-              <w:spacing w:before="30" w:after="30" w:line="278" w:lineRule="auto"/>
-              <w:jc w:val="right"/>
-              <w:cnfStyle w:val="000000000000" w:firstRow="0" w:lastRow="0" w:firstColumn="0" w:lastColumn="0" w:oddVBand="0" w:evenVBand="0" w:oddHBand="0" w:evenHBand="0" w:firstRowFirstColumn="0" w:firstRowLastColumn="0" w:lastRowFirstColumn="0" w:lastRowLastColumn="0"/>
-              <w:rPr>
-                <w:rFonts w:ascii="Arial" w:hAnsi="Arial"/>
-                <w:bCs/>
-                <w:color w:val="111111"/>
-                <w:kern w:val="2"/>
-                <w:sz w:val="16"/>
-                <w:szCs w:val="24"/>
-                <w:lang w:eastAsia="en-US"/>
-              </w:rPr>
-            </w:pPr>
-            <w:r>
-              <w:rPr>
-                <w:rFonts w:ascii="Arial" w:hAnsi="Arial"/>
-                <w:bCs/>
-                <w:color w:val="111111"/>
-                <w:kern w:val="2"/>
-                <w:sz w:val="16"/>
-                <w:szCs w:val="24"/>
-                <w:lang w:eastAsia="en-US"/>
-              </w:rPr>
-              <w:t>175</w:t>
-            </w:r>
-          </w:p>
-        </w:tc>
-      </w:tr>
-      <w:tr>
-        <w:trPr>
-          <w:trHeight w:val="20"/>
-        </w:trPr>
-        <w:tc>
-          <w:tcPr>
-            <w:cnfStyle w:val="001000000000" w:firstRow="0" w:lastRow="0" w:firstColumn="1" w:lastColumn="0" w:oddVBand="0" w:evenVBand="0" w:oddHBand="0" w:evenHBand="0" w:firstRowFirstColumn="0" w:firstRowLastColumn="0" w:lastRowFirstColumn="0" w:lastRowLastColumn="0"/>
-            <w:tcW w:w="1440" w:type="dxa"/>
-            <w:vAlign w:val="center"/>
-            <w:hideMark/>
-          </w:tcPr>
-          <w:p>
-            <w:pPr>
-              <w:spacing w:before="30" w:after="30" w:line="278" w:lineRule="auto"/>
-              <w:jc w:val="right"/>
-              <w:rPr>
-                <w:rFonts w:ascii="Arial" w:hAnsi="Arial"/>
-                <w:bCs w:val="0"/>
-                <w:color w:val="111111"/>
-                <w:kern w:val="2"/>
-                <w:sz w:val="16"/>
-                <w:szCs w:val="24"/>
-                <w:lang w:eastAsia="en-US"/>
-              </w:rPr>
-            </w:pPr>
-            <w:r>
-              <w:rPr>
-                <w:rFonts w:ascii="Arial" w:hAnsi="Arial"/>
-                <w:bCs w:val="0"/>
-                <w:color w:val="111111"/>
-                <w:kern w:val="2"/>
-                <w:sz w:val="16"/>
-                <w:szCs w:val="24"/>
-                <w:lang w:eastAsia="en-US"/>
-              </w:rPr>
-              <w:t>CoD</w:t>
-            </w:r>
-          </w:p>
-        </w:tc>
-        <w:tc>
-          <w:tcPr>
-            <w:tcW w:w="1440" w:type="dxa"/>
-            <w:vAlign w:val="center"/>
-            <w:hideMark/>
-          </w:tcPr>
-          <w:p>
-            <w:pPr>
-              <w:spacing w:before="30" w:after="30" w:line="278" w:lineRule="auto"/>
-              <w:jc w:val="right"/>
-              <w:cnfStyle w:val="000000000000" w:firstRow="0" w:lastRow="0" w:firstColumn="0" w:lastColumn="0" w:oddVBand="0" w:evenVBand="0" w:oddHBand="0" w:evenHBand="0" w:firstRowFirstColumn="0" w:firstRowLastColumn="0" w:lastRowFirstColumn="0" w:lastRowLastColumn="0"/>
-              <w:rPr>
-                <w:rFonts w:ascii="Arial" w:hAnsi="Arial"/>
-                <w:bCs/>
-                <w:color w:val="111111"/>
-                <w:kern w:val="2"/>
-                <w:sz w:val="16"/>
-                <w:szCs w:val="24"/>
-                <w:lang w:eastAsia="en-US"/>
-              </w:rPr>
-            </w:pPr>
-            <w:r>
-              <w:rPr>
-                <w:rFonts w:ascii="Arial" w:hAnsi="Arial"/>
-                <w:bCs/>
-                <w:color w:val="111111"/>
-                <w:kern w:val="2"/>
-                <w:sz w:val="16"/>
-                <w:szCs w:val="24"/>
-                <w:lang w:eastAsia="en-US"/>
-              </w:rPr>
-              <w:t>3</w:t>
-            </w:r>
-          </w:p>
-        </w:tc>
-        <w:tc>
-          <w:tcPr>
-            <w:tcW w:w="1440" w:type="dxa"/>
-            <w:vAlign w:val="center"/>
-            <w:hideMark/>
-          </w:tcPr>
-          <w:p>
-            <w:pPr>
-              <w:spacing w:before="30" w:after="30" w:line="278" w:lineRule="auto"/>
-              <w:jc w:val="right"/>
-              <w:cnfStyle w:val="000000000000" w:firstRow="0" w:lastRow="0" w:firstColumn="0" w:lastColumn="0" w:oddVBand="0" w:evenVBand="0" w:oddHBand="0" w:evenHBand="0" w:firstRowFirstColumn="0" w:firstRowLastColumn="0" w:lastRowFirstColumn="0" w:lastRowLastColumn="0"/>
-              <w:rPr>
-                <w:rFonts w:ascii="Arial" w:hAnsi="Arial"/>
-                <w:bCs/>
-                <w:color w:val="111111"/>
-                <w:kern w:val="2"/>
-                <w:sz w:val="16"/>
-                <w:szCs w:val="24"/>
-                <w:lang w:eastAsia="en-US"/>
-              </w:rPr>
-            </w:pPr>
-            <w:r>
-              <w:rPr>
-                <w:rFonts w:ascii="Arial" w:hAnsi="Arial"/>
-                <w:bCs/>
-                <w:color w:val="111111"/>
-                <w:kern w:val="2"/>
-                <w:sz w:val="16"/>
-                <w:szCs w:val="24"/>
-                <w:lang w:eastAsia="en-US"/>
-              </w:rPr>
-              <w:t>125</w:t>
-            </w:r>
-          </w:p>
-        </w:tc>
-        <w:tc>
-          <w:tcPr>
-            <w:tcW w:w="1440" w:type="dxa"/>
-            <w:hideMark/>
-          </w:tcPr>
-          <w:p>
-            <w:pPr>
-              <w:spacing w:before="30" w:after="30" w:line="278" w:lineRule="auto"/>
-              <w:jc w:val="right"/>
-              <w:cnfStyle w:val="000000000000" w:firstRow="0" w:lastRow="0" w:firstColumn="0" w:lastColumn="0" w:oddVBand="0" w:evenVBand="0" w:oddHBand="0" w:evenHBand="0" w:firstRowFirstColumn="0" w:firstRowLastColumn="0" w:lastRowFirstColumn="0" w:lastRowLastColumn="0"/>
-              <w:rPr>
-                <w:rFonts w:ascii="Arial" w:hAnsi="Arial"/>
-                <w:bCs/>
-                <w:color w:val="111111"/>
-                <w:kern w:val="2"/>
-                <w:sz w:val="16"/>
-                <w:szCs w:val="24"/>
-                <w:lang w:eastAsia="en-US"/>
-              </w:rPr>
-            </w:pPr>
-            <w:r>
-              <w:rPr>
-                <w:rFonts w:ascii="Arial" w:hAnsi="Arial"/>
-                <w:bCs/>
-                <w:color w:val="111111"/>
-                <w:kern w:val="2"/>
-                <w:sz w:val="16"/>
-                <w:szCs w:val="24"/>
-                <w:lang w:eastAsia="en-US"/>
-              </w:rPr>
-              <w:t>234</w:t>
-            </w:r>
-          </w:p>
-        </w:tc>
-      </w:tr>
-      <w:tr>
-        <w:trPr>
-          <w:trHeight w:val="20"/>
-        </w:trPr>
-        <w:tc>
-          <w:tcPr>
-            <w:cnfStyle w:val="001000000000" w:firstRow="0" w:lastRow="0" w:firstColumn="1" w:lastColumn="0" w:oddVBand="0" w:evenVBand="0" w:oddHBand="0" w:evenHBand="0" w:firstRowFirstColumn="0" w:firstRowLastColumn="0" w:lastRowFirstColumn="0" w:lastRowLastColumn="0"/>
-            <w:tcW w:w="1440" w:type="dxa"/>
-            <w:vAlign w:val="center"/>
-            <w:hideMark/>
-          </w:tcPr>
-          <w:p>
-            <w:pPr>
-              <w:spacing w:before="30" w:after="30" w:line="278" w:lineRule="auto"/>
-              <w:jc w:val="right"/>
-              <w:rPr>
-                <w:rFonts w:ascii="Arial" w:hAnsi="Arial"/>
-                <w:bCs w:val="0"/>
-                <w:color w:val="111111"/>
-                <w:kern w:val="2"/>
-                <w:sz w:val="16"/>
-                <w:szCs w:val="24"/>
-                <w:lang w:eastAsia="en-US"/>
-              </w:rPr>
-            </w:pPr>
-            <w:r>
-              <w:rPr>
-                <w:rFonts w:ascii="Arial" w:hAnsi="Arial"/>
-                <w:bCs w:val="0"/>
-                <w:color w:val="111111"/>
-                <w:kern w:val="2"/>
-                <w:sz w:val="16"/>
-                <w:szCs w:val="24"/>
-                <w:lang w:eastAsia="en-US"/>
-              </w:rPr>
-              <w:t>MHx</w:t>
-            </w:r>
-          </w:p>
-        </w:tc>
-        <w:tc>
-          <w:tcPr>
-            <w:tcW w:w="1440" w:type="dxa"/>
-            <w:vAlign w:val="center"/>
-            <w:hideMark/>
-          </w:tcPr>
-          <w:p>
-            <w:pPr>
-              <w:spacing w:before="30" w:after="30" w:line="278" w:lineRule="auto"/>
-              <w:jc w:val="right"/>
-              <w:cnfStyle w:val="000000000000" w:firstRow="0" w:lastRow="0" w:firstColumn="0" w:lastColumn="0" w:oddVBand="0" w:evenVBand="0" w:oddHBand="0" w:evenHBand="0" w:firstRowFirstColumn="0" w:firstRowLastColumn="0" w:lastRowFirstColumn="0" w:lastRowLastColumn="0"/>
-              <w:rPr>
-                <w:rFonts w:ascii="Arial" w:hAnsi="Arial"/>
-                <w:bCs/>
-                <w:color w:val="111111"/>
-                <w:kern w:val="2"/>
-                <w:sz w:val="16"/>
-                <w:szCs w:val="24"/>
-                <w:lang w:eastAsia="en-US"/>
-              </w:rPr>
-            </w:pPr>
-            <w:r>
-              <w:rPr>
-                <w:rFonts w:ascii="Arial" w:hAnsi="Arial"/>
-                <w:bCs/>
-                <w:color w:val="111111"/>
-                <w:kern w:val="2"/>
-                <w:sz w:val="16"/>
-                <w:szCs w:val="24"/>
-                <w:lang w:eastAsia="en-US"/>
-              </w:rPr>
-              <w:t>2,304</w:t>
-            </w:r>
-          </w:p>
-        </w:tc>
-        <w:tc>
-          <w:tcPr>
-            <w:tcW w:w="1440" w:type="dxa"/>
-            <w:vAlign w:val="center"/>
-            <w:hideMark/>
-          </w:tcPr>
-          <w:p>
-            <w:pPr>
-              <w:spacing w:before="30" w:after="30" w:line="278" w:lineRule="auto"/>
-              <w:jc w:val="right"/>
-              <w:cnfStyle w:val="000000000000" w:firstRow="0" w:lastRow="0" w:firstColumn="0" w:lastColumn="0" w:oddVBand="0" w:evenVBand="0" w:oddHBand="0" w:evenHBand="0" w:firstRowFirstColumn="0" w:firstRowLastColumn="0" w:lastRowFirstColumn="0" w:lastRowLastColumn="0"/>
-              <w:rPr>
-                <w:rFonts w:ascii="Arial" w:hAnsi="Arial"/>
-                <w:bCs/>
-                <w:color w:val="111111"/>
-                <w:kern w:val="2"/>
-                <w:sz w:val="16"/>
-                <w:szCs w:val="24"/>
-                <w:lang w:eastAsia="en-US"/>
-              </w:rPr>
-            </w:pPr>
-            <w:r>
-              <w:rPr>
-                <w:rFonts w:ascii="Arial" w:hAnsi="Arial"/>
-                <w:bCs/>
-                <w:color w:val="111111"/>
-                <w:kern w:val="2"/>
-                <w:sz w:val="16"/>
-                <w:szCs w:val="24"/>
-                <w:lang w:eastAsia="en-US"/>
-              </w:rPr>
-              <w:t>755</w:t>
-            </w:r>
-          </w:p>
-        </w:tc>
-        <w:tc>
-          <w:tcPr>
-            <w:tcW w:w="1440" w:type="dxa"/>
-            <w:hideMark/>
-          </w:tcPr>
-          <w:p>
-            <w:pPr>
-              <w:spacing w:before="30" w:after="30" w:line="278" w:lineRule="auto"/>
-              <w:jc w:val="right"/>
-              <w:cnfStyle w:val="000000000000" w:firstRow="0" w:lastRow="0" w:firstColumn="0" w:lastColumn="0" w:oddVBand="0" w:evenVBand="0" w:oddHBand="0" w:evenHBand="0" w:firstRowFirstColumn="0" w:firstRowLastColumn="0" w:lastRowFirstColumn="0" w:lastRowLastColumn="0"/>
-              <w:rPr>
-                <w:rFonts w:ascii="Arial" w:hAnsi="Arial"/>
-                <w:bCs/>
-                <w:color w:val="111111"/>
-                <w:kern w:val="2"/>
-                <w:sz w:val="16"/>
-                <w:szCs w:val="24"/>
-                <w:lang w:eastAsia="en-US"/>
-              </w:rPr>
-            </w:pPr>
-            <w:r>
-              <w:rPr>
-                <w:rFonts w:ascii="Arial" w:hAnsi="Arial"/>
-                <w:bCs/>
-                <w:color w:val="111111"/>
-                <w:kern w:val="2"/>
-                <w:sz w:val="16"/>
-                <w:szCs w:val="24"/>
-                <w:lang w:eastAsia="en-US"/>
-              </w:rPr>
-              <w:t>3241</w:t>
-            </w:r>
-          </w:p>
-        </w:tc>
-      </w:tr>
-      <w:tr>
-        <w:trPr>
-          <w:trHeight w:val="20"/>
-        </w:trPr>
-        <w:tc>
-          <w:tcPr>
-            <w:cnfStyle w:val="001000000000" w:firstRow="0" w:lastRow="0" w:firstColumn="1" w:lastColumn="0" w:oddVBand="0" w:evenVBand="0" w:oddHBand="0" w:evenHBand="0" w:firstRowFirstColumn="0" w:firstRowLastColumn="0" w:lastRowFirstColumn="0" w:lastRowLastColumn="0"/>
-            <w:tcW w:w="1440" w:type="dxa"/>
-            <w:vAlign w:val="center"/>
-            <w:hideMark/>
-          </w:tcPr>
-          <w:p>
-            <w:pPr>
-              <w:spacing w:before="30" w:after="30" w:line="278" w:lineRule="auto"/>
-              <w:jc w:val="right"/>
-              <w:rPr>
-                <w:rFonts w:ascii="Arial" w:hAnsi="Arial"/>
-                <w:bCs w:val="0"/>
-                <w:color w:val="111111"/>
-                <w:kern w:val="2"/>
-                <w:sz w:val="16"/>
-                <w:szCs w:val="24"/>
-                <w:lang w:eastAsia="en-US"/>
-              </w:rPr>
-            </w:pPr>
-            <w:proofErr w:type="spellStart"/>
-            <w:r>
-              <w:rPr>
-                <w:rFonts w:ascii="Arial" w:hAnsi="Arial"/>
-                <w:bCs w:val="0"/>
-                <w:color w:val="111111"/>
-                <w:kern w:val="2"/>
-                <w:sz w:val="16"/>
-                <w:szCs w:val="24"/>
-                <w:lang w:eastAsia="en-US"/>
-              </w:rPr>
-              <w:t>FHx</w:t>
-            </w:r>
-            <w:proofErr w:type="spellEnd"/>
-          </w:p>
-        </w:tc>
-        <w:tc>
-          <w:tcPr>
-            <w:tcW w:w="1440" w:type="dxa"/>
-            <w:vAlign w:val="center"/>
-            <w:hideMark/>
-          </w:tcPr>
-          <w:p>
-            <w:pPr>
-              <w:spacing w:before="30" w:after="30" w:line="278" w:lineRule="auto"/>
-              <w:jc w:val="right"/>
-              <w:cnfStyle w:val="000000000000" w:firstRow="0" w:lastRow="0" w:firstColumn="0" w:lastColumn="0" w:oddVBand="0" w:evenVBand="0" w:oddHBand="0" w:evenHBand="0" w:firstRowFirstColumn="0" w:firstRowLastColumn="0" w:lastRowFirstColumn="0" w:lastRowLastColumn="0"/>
-              <w:rPr>
-                <w:rFonts w:ascii="Arial" w:hAnsi="Arial"/>
-                <w:bCs/>
-                <w:color w:val="111111"/>
-                <w:kern w:val="2"/>
-                <w:sz w:val="16"/>
-                <w:szCs w:val="24"/>
-                <w:lang w:eastAsia="en-US"/>
-              </w:rPr>
-            </w:pPr>
-            <w:r>
-              <w:rPr>
-                <w:rFonts w:ascii="Arial" w:hAnsi="Arial"/>
-                <w:bCs/>
-                <w:color w:val="111111"/>
-                <w:kern w:val="2"/>
-                <w:sz w:val="16"/>
-                <w:szCs w:val="24"/>
-                <w:lang w:eastAsia="en-US"/>
-              </w:rPr>
-              <w:t>105</w:t>
-            </w:r>
-          </w:p>
-        </w:tc>
-        <w:tc>
-          <w:tcPr>
-            <w:tcW w:w="1440" w:type="dxa"/>
-            <w:vAlign w:val="center"/>
-            <w:hideMark/>
-          </w:tcPr>
-          <w:p>
-            <w:pPr>
-              <w:spacing w:before="30" w:after="30" w:line="278" w:lineRule="auto"/>
-              <w:jc w:val="right"/>
-              <w:cnfStyle w:val="000000000000" w:firstRow="0" w:lastRow="0" w:firstColumn="0" w:lastColumn="0" w:oddVBand="0" w:evenVBand="0" w:oddHBand="0" w:evenHBand="0" w:firstRowFirstColumn="0" w:firstRowLastColumn="0" w:lastRowFirstColumn="0" w:lastRowLastColumn="0"/>
-              <w:rPr>
-                <w:rFonts w:ascii="Arial" w:hAnsi="Arial"/>
-                <w:bCs/>
-                <w:color w:val="111111"/>
-                <w:kern w:val="2"/>
-                <w:sz w:val="16"/>
-                <w:szCs w:val="24"/>
-                <w:lang w:eastAsia="en-US"/>
-              </w:rPr>
-            </w:pPr>
-            <w:r>
-              <w:rPr>
-                <w:rFonts w:ascii="Arial" w:hAnsi="Arial"/>
-                <w:bCs/>
-                <w:color w:val="111111"/>
-                <w:kern w:val="2"/>
-                <w:sz w:val="16"/>
-                <w:szCs w:val="24"/>
-                <w:lang w:eastAsia="en-US"/>
-              </w:rPr>
-              <w:t>22</w:t>
-            </w:r>
-          </w:p>
-        </w:tc>
-        <w:tc>
-          <w:tcPr>
-            <w:tcW w:w="1440" w:type="dxa"/>
-            <w:hideMark/>
-          </w:tcPr>
-          <w:p>
-            <w:pPr>
-              <w:spacing w:before="30" w:after="30" w:line="278" w:lineRule="auto"/>
-              <w:jc w:val="right"/>
-              <w:cnfStyle w:val="000000000000" w:firstRow="0" w:lastRow="0" w:firstColumn="0" w:lastColumn="0" w:oddVBand="0" w:evenVBand="0" w:oddHBand="0" w:evenHBand="0" w:firstRowFirstColumn="0" w:firstRowLastColumn="0" w:lastRowFirstColumn="0" w:lastRowLastColumn="0"/>
-              <w:rPr>
-                <w:rFonts w:ascii="Arial" w:hAnsi="Arial"/>
-                <w:bCs/>
-                <w:color w:val="111111"/>
-                <w:kern w:val="2"/>
-                <w:sz w:val="16"/>
-                <w:szCs w:val="24"/>
-                <w:lang w:eastAsia="en-US"/>
-              </w:rPr>
-            </w:pPr>
-            <w:r>
-              <w:rPr>
-                <w:rFonts w:ascii="Arial" w:hAnsi="Arial"/>
-                <w:bCs/>
-                <w:color w:val="111111"/>
-                <w:kern w:val="2"/>
-                <w:sz w:val="16"/>
-                <w:szCs w:val="24"/>
-                <w:lang w:eastAsia="en-US"/>
-              </w:rPr>
-              <w:t>25</w:t>
-            </w:r>
-          </w:p>
-        </w:tc>
-      </w:tr>
-      <w:tr>
-        <w:trPr>
-          <w:trHeight w:val="20"/>
-        </w:trPr>
-        <w:tc>
-          <w:tcPr>
-            <w:cnfStyle w:val="001000000000" w:firstRow="0" w:lastRow="0" w:firstColumn="1" w:lastColumn="0" w:oddVBand="0" w:evenVBand="0" w:oddHBand="0" w:evenHBand="0" w:firstRowFirstColumn="0" w:firstRowLastColumn="0" w:lastRowFirstColumn="0" w:lastRowLastColumn="0"/>
-            <w:tcW w:w="1440" w:type="dxa"/>
-            <w:vAlign w:val="center"/>
-            <w:hideMark/>
-          </w:tcPr>
-          <w:p>
-            <w:pPr>
-              <w:spacing w:before="30" w:after="30" w:line="278" w:lineRule="auto"/>
-              <w:jc w:val="right"/>
-              <w:rPr>
-                <w:rFonts w:ascii="Arial" w:hAnsi="Arial"/>
-                <w:bCs w:val="0"/>
-                <w:color w:val="111111"/>
-                <w:kern w:val="2"/>
-                <w:sz w:val="16"/>
-                <w:szCs w:val="24"/>
-                <w:lang w:eastAsia="en-US"/>
-              </w:rPr>
-            </w:pPr>
-            <w:r>
-              <w:rPr>
-                <w:rFonts w:ascii="Arial" w:hAnsi="Arial"/>
-                <w:bCs w:val="0"/>
-                <w:color w:val="111111"/>
-                <w:kern w:val="2"/>
-                <w:sz w:val="16"/>
-                <w:szCs w:val="24"/>
-                <w:lang w:eastAsia="en-US"/>
-              </w:rPr>
-              <w:t>Age</w:t>
-            </w:r>
-          </w:p>
-        </w:tc>
-        <w:tc>
-          <w:tcPr>
-            <w:tcW w:w="1440" w:type="dxa"/>
-            <w:vAlign w:val="center"/>
-            <w:hideMark/>
-          </w:tcPr>
-          <w:p>
-            <w:pPr>
-              <w:spacing w:before="30" w:after="30" w:line="278" w:lineRule="auto"/>
-              <w:jc w:val="right"/>
-              <w:cnfStyle w:val="000000000000" w:firstRow="0" w:lastRow="0" w:firstColumn="0" w:lastColumn="0" w:oddVBand="0" w:evenVBand="0" w:oddHBand="0" w:evenHBand="0" w:firstRowFirstColumn="0" w:firstRowLastColumn="0" w:lastRowFirstColumn="0" w:lastRowLastColumn="0"/>
-              <w:rPr>
-                <w:rFonts w:ascii="Arial" w:hAnsi="Arial"/>
-                <w:bCs/>
-                <w:color w:val="111111"/>
-                <w:kern w:val="2"/>
-                <w:sz w:val="16"/>
-                <w:szCs w:val="24"/>
-                <w:lang w:eastAsia="en-US"/>
-              </w:rPr>
-            </w:pPr>
-            <w:r>
-              <w:rPr>
-                <w:rFonts w:ascii="Arial" w:hAnsi="Arial"/>
-                <w:bCs/>
-                <w:color w:val="111111"/>
-                <w:kern w:val="2"/>
-                <w:sz w:val="16"/>
-                <w:szCs w:val="24"/>
-                <w:lang w:eastAsia="en-US"/>
-              </w:rPr>
-              <w:t>787</w:t>
-            </w:r>
-          </w:p>
-        </w:tc>
-        <w:tc>
-          <w:tcPr>
-            <w:tcW w:w="1440" w:type="dxa"/>
-            <w:vAlign w:val="center"/>
-            <w:hideMark/>
-          </w:tcPr>
-          <w:p>
-            <w:pPr>
-              <w:spacing w:before="30" w:after="30" w:line="278" w:lineRule="auto"/>
-              <w:jc w:val="right"/>
-              <w:cnfStyle w:val="000000000000" w:firstRow="0" w:lastRow="0" w:firstColumn="0" w:lastColumn="0" w:oddVBand="0" w:evenVBand="0" w:oddHBand="0" w:evenHBand="0" w:firstRowFirstColumn="0" w:firstRowLastColumn="0" w:lastRowFirstColumn="0" w:lastRowLastColumn="0"/>
-              <w:rPr>
-                <w:rFonts w:ascii="Arial" w:hAnsi="Arial"/>
-                <w:bCs/>
-                <w:color w:val="111111"/>
-                <w:kern w:val="2"/>
-                <w:sz w:val="16"/>
-                <w:szCs w:val="24"/>
-                <w:lang w:eastAsia="en-US"/>
-              </w:rPr>
-            </w:pPr>
-            <w:r>
-              <w:rPr>
-                <w:rFonts w:ascii="Arial" w:hAnsi="Arial"/>
-                <w:bCs/>
-                <w:color w:val="111111"/>
-                <w:kern w:val="2"/>
-                <w:sz w:val="16"/>
-                <w:szCs w:val="24"/>
-                <w:lang w:eastAsia="en-US"/>
-              </w:rPr>
-              <w:t>n/a</w:t>
-            </w:r>
-          </w:p>
-        </w:tc>
-        <w:tc>
-          <w:tcPr>
-            <w:tcW w:w="1440" w:type="dxa"/>
-            <w:hideMark/>
-          </w:tcPr>
-          <w:p>
-            <w:pPr>
-              <w:spacing w:before="30" w:after="30" w:line="278" w:lineRule="auto"/>
-              <w:jc w:val="right"/>
-              <w:cnfStyle w:val="000000000000" w:firstRow="0" w:lastRow="0" w:firstColumn="0" w:lastColumn="0" w:oddVBand="0" w:evenVBand="0" w:oddHBand="0" w:evenHBand="0" w:firstRowFirstColumn="0" w:firstRowLastColumn="0" w:lastRowFirstColumn="0" w:lastRowLastColumn="0"/>
-              <w:rPr>
-                <w:rFonts w:ascii="Arial" w:hAnsi="Arial"/>
-                <w:bCs/>
-                <w:color w:val="111111"/>
-                <w:kern w:val="2"/>
-                <w:sz w:val="16"/>
-                <w:szCs w:val="24"/>
-                <w:lang w:eastAsia="en-US"/>
-              </w:rPr>
-            </w:pPr>
-            <w:r>
-              <w:rPr>
-                <w:rFonts w:ascii="Arial" w:hAnsi="Arial"/>
-                <w:bCs/>
-                <w:color w:val="111111"/>
-                <w:kern w:val="2"/>
-                <w:sz w:val="16"/>
-                <w:szCs w:val="24"/>
-                <w:lang w:eastAsia="en-US"/>
-              </w:rPr>
-              <w:t>885</w:t>
-            </w:r>
-          </w:p>
-        </w:tc>
-      </w:tr>
-      <w:tr>
-        <w:trPr>
-          <w:trHeight w:val="20"/>
-        </w:trPr>
-        <w:tc>
-          <w:tcPr>
-            <w:cnfStyle w:val="001000000000" w:firstRow="0" w:lastRow="0" w:firstColumn="1" w:lastColumn="0" w:oddVBand="0" w:evenVBand="0" w:oddHBand="0" w:evenHBand="0" w:firstRowFirstColumn="0" w:firstRowLastColumn="0" w:lastRowFirstColumn="0" w:lastRowLastColumn="0"/>
-            <w:tcW w:w="1440" w:type="dxa"/>
-            <w:vAlign w:val="center"/>
-            <w:hideMark/>
-          </w:tcPr>
-          <w:p>
-            <w:pPr>
-              <w:spacing w:before="30" w:after="30" w:line="278" w:lineRule="auto"/>
-              <w:jc w:val="right"/>
-              <w:rPr>
-                <w:rFonts w:ascii="Arial" w:hAnsi="Arial"/>
-                <w:bCs w:val="0"/>
-                <w:color w:val="111111"/>
-                <w:kern w:val="2"/>
-                <w:sz w:val="16"/>
-                <w:szCs w:val="24"/>
-                <w:lang w:eastAsia="en-US"/>
-              </w:rPr>
-            </w:pPr>
-            <w:r>
-              <w:rPr>
-                <w:rFonts w:ascii="Arial" w:hAnsi="Arial"/>
-                <w:bCs w:val="0"/>
-                <w:color w:val="111111"/>
-                <w:kern w:val="2"/>
-                <w:sz w:val="16"/>
-                <w:szCs w:val="24"/>
-                <w:lang w:eastAsia="en-US"/>
-              </w:rPr>
-              <w:t>Sex</w:t>
-            </w:r>
-          </w:p>
-        </w:tc>
-        <w:tc>
-          <w:tcPr>
-            <w:tcW w:w="1440" w:type="dxa"/>
-            <w:vAlign w:val="center"/>
-            <w:hideMark/>
-          </w:tcPr>
-          <w:p>
-            <w:pPr>
-              <w:spacing w:before="30" w:after="30" w:line="278" w:lineRule="auto"/>
-              <w:jc w:val="right"/>
-              <w:cnfStyle w:val="000000000000" w:firstRow="0" w:lastRow="0" w:firstColumn="0" w:lastColumn="0" w:oddVBand="0" w:evenVBand="0" w:oddHBand="0" w:evenHBand="0" w:firstRowFirstColumn="0" w:firstRowLastColumn="0" w:lastRowFirstColumn="0" w:lastRowLastColumn="0"/>
-              <w:rPr>
-                <w:rFonts w:ascii="Arial" w:hAnsi="Arial"/>
-                <w:bCs/>
-                <w:color w:val="111111"/>
-                <w:kern w:val="2"/>
-                <w:sz w:val="16"/>
-                <w:szCs w:val="24"/>
-                <w:lang w:eastAsia="en-US"/>
-              </w:rPr>
-            </w:pPr>
-            <w:r>
-              <w:rPr>
-                <w:rFonts w:ascii="Arial" w:hAnsi="Arial"/>
-                <w:bCs/>
-                <w:color w:val="111111"/>
-                <w:kern w:val="2"/>
-                <w:sz w:val="16"/>
-                <w:szCs w:val="24"/>
-                <w:lang w:eastAsia="en-US"/>
-              </w:rPr>
-              <w:t>768</w:t>
-            </w:r>
-          </w:p>
-        </w:tc>
-        <w:tc>
-          <w:tcPr>
-            <w:tcW w:w="1440" w:type="dxa"/>
-            <w:vAlign w:val="center"/>
-            <w:hideMark/>
-          </w:tcPr>
-          <w:p>
-            <w:pPr>
-              <w:spacing w:before="30" w:after="30" w:line="278" w:lineRule="auto"/>
-              <w:jc w:val="right"/>
-              <w:cnfStyle w:val="000000000000" w:firstRow="0" w:lastRow="0" w:firstColumn="0" w:lastColumn="0" w:oddVBand="0" w:evenVBand="0" w:oddHBand="0" w:evenHBand="0" w:firstRowFirstColumn="0" w:firstRowLastColumn="0" w:lastRowFirstColumn="0" w:lastRowLastColumn="0"/>
-              <w:rPr>
-                <w:rFonts w:ascii="Arial" w:hAnsi="Arial"/>
-                <w:bCs/>
-                <w:color w:val="111111"/>
-                <w:kern w:val="2"/>
-                <w:sz w:val="16"/>
-                <w:szCs w:val="24"/>
-                <w:lang w:eastAsia="en-US"/>
-              </w:rPr>
-            </w:pPr>
-            <w:r>
-              <w:rPr>
-                <w:rFonts w:ascii="Arial" w:hAnsi="Arial"/>
-                <w:bCs/>
-                <w:color w:val="111111"/>
-                <w:kern w:val="2"/>
-                <w:sz w:val="16"/>
-                <w:szCs w:val="24"/>
-                <w:lang w:eastAsia="en-US"/>
-              </w:rPr>
-              <w:t>n/a</w:t>
-            </w:r>
-          </w:p>
-        </w:tc>
-        <w:tc>
-          <w:tcPr>
-            <w:tcW w:w="1440" w:type="dxa"/>
-            <w:hideMark/>
-          </w:tcPr>
-          <w:p>
-            <w:pPr>
-              <w:spacing w:before="30" w:after="30" w:line="278" w:lineRule="auto"/>
-              <w:jc w:val="right"/>
-              <w:cnfStyle w:val="000000000000" w:firstRow="0" w:lastRow="0" w:firstColumn="0" w:lastColumn="0" w:oddVBand="0" w:evenVBand="0" w:oddHBand="0" w:evenHBand="0" w:firstRowFirstColumn="0" w:firstRowLastColumn="0" w:lastRowFirstColumn="0" w:lastRowLastColumn="0"/>
-              <w:rPr>
-                <w:rFonts w:ascii="Arial" w:hAnsi="Arial"/>
-                <w:bCs/>
-                <w:color w:val="111111"/>
-                <w:kern w:val="2"/>
-                <w:sz w:val="16"/>
-                <w:szCs w:val="24"/>
-                <w:lang w:eastAsia="en-US"/>
-              </w:rPr>
-            </w:pPr>
-            <w:r>
-              <w:rPr>
-                <w:rFonts w:ascii="Arial" w:hAnsi="Arial"/>
-                <w:bCs/>
-                <w:color w:val="111111"/>
-                <w:kern w:val="2"/>
-                <w:sz w:val="16"/>
-                <w:szCs w:val="24"/>
-                <w:lang w:eastAsia="en-US"/>
-              </w:rPr>
-              <w:t>837</w:t>
+              <w:t>35,570</w:t>
             </w:r>
           </w:p>
         </w:tc>
       </w:tr>
     </w:tbl>
-    <w:p/>
+    <w:p>
+      <w:pPr>
+        <w:rPr>
+          <w:i/>
+          <w:sz w:val="16"/>
+        </w:rPr>
+      </w:pPr>
+    </w:p>
     <w:p>
       <w:r>
         <w:t>Category-level analysis (</w:t>
@@ -12632,7 +11150,11 @@
         <w:t>Llama-4</w:t>
       </w:r>
       <w:r>
-        <w:t xml:space="preserve"> was subsuming secondary diagnoses under adverse symptoms (sDx </w:t>
+        <w:t xml:space="preserve"> was subsuming secondary </w:t>
+      </w:r>
+      <w:r>
+        <w:lastRenderedPageBreak/>
+        <w:t xml:space="preserve">diagnoses under adverse symptoms (sDx </w:t>
       </w:r>
       <w:r>
         <w:t>to</w:t>
@@ -12644,11 +11166,7 @@
         <w:t>to</w:t>
       </w:r>
       <w:r>
-        <w:t xml:space="preserve"> sDx: 1,093), </w:t>
-      </w:r>
-      <w:r>
-        <w:lastRenderedPageBreak/>
-        <w:t xml:space="preserve">symptom conflation with medical history (SYM </w:t>
+        <w:t xml:space="preserve"> sDx: 1,093), symptom conflation with medical history (SYM </w:t>
       </w:r>
       <w:r>
         <w:t>to</w:t>
@@ -14169,6 +12687,7 @@
                 <w:color w:val="222222"/>
                 <w:sz w:val="16"/>
               </w:rPr>
+              <w:lastRenderedPageBreak/>
               <w:t>FAERS (4-Fold LOO)</w:t>
             </w:r>
           </w:p>
@@ -14280,7 +12799,6 @@
                 <w:color w:val="222222"/>
                 <w:sz w:val="16"/>
               </w:rPr>
-              <w:lastRenderedPageBreak/>
               <w:t>FAERS (4-Fold LOO)</w:t>
             </w:r>
           </w:p>
@@ -15316,15 +13834,8 @@
         <w:t>er</w:t>
       </w:r>
       <w:r>
-        <w:t xml:space="preserve"> Strict Exact-Match F1 (0.4043 </w:t>
-      </w:r>
-      <w:proofErr w:type="spellStart"/>
-      <w:proofErr w:type="gramStart"/>
-      <w:r>
-        <w:t>v.s</w:t>
-      </w:r>
-      <w:proofErr w:type="spellEnd"/>
-      <w:proofErr w:type="gramEnd"/>
+        <w:t xml:space="preserve"> Strict Exact-Match F1 (0.4043 v.s</w:t>
+      </w:r>
       <w:r>
         <w:t xml:space="preserve"> </w:t>
       </w:r>
@@ -15854,11 +14365,11 @@
     </w:p>
     <w:p>
       <w:r>
-        <w:t xml:space="preserve">To investigate the impact of underlying pretraining corpora on pharmacovigilance concept extraction, we conducted an ablation study comparing four transformer encoder architectures (BERT-Base, BioBERT, Bio_ClinicalBERT, and ClinicalBERT) on the VAERS dataset across 5 independent random initialization seeds (Table 8). BioBERT achieved the highest validation F1 </w:t>
+        <w:t xml:space="preserve">To investigate the impact of underlying pretraining corpora on pharmacovigilance concept extraction, we conducted an ablation study comparing four transformer encoder architectures (BERT-Base, BioBERT, Bio_ClinicalBERT, and ClinicalBERT) on the VAERS </w:t>
       </w:r>
       <w:r>
         <w:lastRenderedPageBreak/>
-        <w:t>(0.8471 ± 0.0058, Precision = 0.8666, Recall = 0.8285), confirming its selection as the primary encoder architecture. All four models demonstrated close performance with minimal variance across seeds (SD &lt; 0.009).</w:t>
+        <w:t>dataset across 5 independent random initialization seeds (Table 8). BioBERT achieved the highest validation F1 (0.8471 ± 0.0058, Precision = 0.8666, Recall = 0.8285), confirming its selection as the primary encoder architecture. All four models demonstrated close performance with minimal variance across seeds (SD &lt; 0.009).</w:t>
       </w:r>
     </w:p>
     <w:p>
@@ -15953,16 +14464,7 @@
                 <w:color w:val="111111"/>
                 <w:sz w:val="16"/>
               </w:rPr>
-              <w:t xml:space="preserve">BERT </w:t>
-            </w:r>
-            <w:r>
-              <w:rPr>
-                <w:rFonts w:ascii="Arial" w:hAnsi="Arial"/>
-                <w:b/>
-                <w:color w:val="111111"/>
-                <w:sz w:val="16"/>
-              </w:rPr>
-              <w:t xml:space="preserve">Model </w:t>
+              <w:t xml:space="preserve">BERT Model </w:t>
             </w:r>
           </w:p>
         </w:tc>
@@ -16740,12 +15242,15 @@
     </w:p>
     <w:p>
       <w:r>
-        <w:t>Taken together with the FAERS results, these VAERS findings demonstrate that BERT-based models trained on high-quality human annotations provide more robust and reliable performance across heterogeneous pharmacovigilance datasets. While LLM-derived annotations offer a convenient low-resource alternative, their direct use leads to substantially lower accuracy, particularly in semantically complex categories such as STATUS, LAB, and HX. These results underscore the continued importance of curated human-labeled data for medical NER and highlight the effectiveness of supervised transformer models for large-scale safety narrative processing in real-world biomedical applications.</w:t>
+        <w:t xml:space="preserve">Taken together with the FAERS results, these VAERS findings demonstrate that BERT-based models trained on high-quality human annotations provide more robust and reliable performance across heterogeneous pharmacovigilance datasets. While LLM-derived annotations offer a convenient low-resource alternative, their direct use leads to substantially lower accuracy, particularly in semantically complex categories such as STATUS, LAB, and HX. These results underscore the continued importance of curated </w:t>
+      </w:r>
+      <w:r>
+        <w:lastRenderedPageBreak/>
+        <w:t>human-labeled data for medical NER and highlight the effectiveness of supervised transformer models for large-scale safety narrative processing in real-world biomedical applications.</w:t>
       </w:r>
     </w:p>
     <w:p>
       <w:r>
-        <w:lastRenderedPageBreak/>
         <w:t xml:space="preserve">The reported performance should be interpreted in the context of a </w:t>
       </w:r>
       <w:r>
@@ -16779,15 +15284,7 @@
     </w:p>
     <w:p>
       <w:r>
-        <w:t xml:space="preserve">Beyond model comparison, the annotated datasets themselves provide a valuable resource for future research. By spanning both drug and vaccine safety narratives and incorporating harmonized entity definitions, they enable studies on cross-domain generalization, transfer learning, and multi-task modeling. The detailed error characterizations also highlight areas </w:t>
-      </w:r>
-      <w:proofErr w:type="gramStart"/>
-      <w:r>
-        <w:t>where</w:t>
-      </w:r>
-      <w:proofErr w:type="gramEnd"/>
-      <w:r>
-        <w:t xml:space="preserve"> additional training data, refined guidelines, or specialized modeling approaches may further improve performance.</w:t>
+        <w:t>Beyond model comparison, the annotated datasets themselves provide a valuable resource for future research. By spanning both drug and vaccine safety narratives and incorporating harmonized entity definitions, they enable studies on cross-domain generalization, transfer learning, and multi-task modeling. The detailed error characterizations also highlight areas where additional training data, refined guidelines, or specialized modeling approaches may further improve performance.</w:t>
       </w:r>
     </w:p>
     <w:p>
@@ -16810,7 +15307,11 @@
         <w:t xml:space="preserve">The current annotation workflow was designed </w:t>
       </w:r>
       <w:r>
-        <w:t>as a linear process</w:t>
+        <w:t xml:space="preserve">as a linear </w:t>
+      </w:r>
+      <w:r>
+        <w:lastRenderedPageBreak/>
+        <w:t>process</w:t>
       </w:r>
       <w:r>
         <w:t>, start</w:t>
@@ -16831,11 +15332,7 @@
         <w:t xml:space="preserve"> </w:t>
       </w:r>
       <w:r>
-        <w:t xml:space="preserve">In addition, this work focuses on span-level NER and does not address downstream tasks such as relation extraction or causality assessment, which are critical for regulatory applications. Finally, due to </w:t>
-      </w:r>
-      <w:r>
-        <w:lastRenderedPageBreak/>
-        <w:t>data sensitivity constraints, we were unable to evaluate certain commercial LLMs, and future advances in model capabilities may shift the relative performance observed here.</w:t>
+        <w:t>In addition, this work focuses on span-level NER and does not address downstream tasks such as relation extraction or causality assessment, which are critical for regulatory applications. Finally, due to data sensitivity constraints, we were unable to evaluate certain commercial LLMs, and future advances in model capabilities may shift the relative performance observed here.</w:t>
       </w:r>
     </w:p>
     <w:p>
@@ -16984,6 +15481,7 @@
         <w:rPr>
           <w:shd w:val="clear" w:color="auto" w:fill="FFFFFF"/>
         </w:rPr>
+        <w:lastRenderedPageBreak/>
         <w:t>Consent to participate</w:t>
       </w:r>
     </w:p>
@@ -17041,7 +15539,6 @@
         <w:rPr>
           <w:shd w:val="clear" w:color="auto" w:fill="FFFFFF"/>
         </w:rPr>
-        <w:lastRenderedPageBreak/>
         <w:t>Availability of data and materials</w:t>
       </w:r>
     </w:p>
@@ -23789,6 +22286,7 @@
   <w:style w:type="character" w:default="1" w:styleId="DefaultParagraphFont">
     <w:name w:val="Default Paragraph Font"/>
     <w:uiPriority w:val="1"/>
+    <w:semiHidden/>
     <w:unhideWhenUsed/>
   </w:style>
   <w:style w:type="table" w:default="1" w:styleId="TableNormal">

</xml_diff>

<commit_message>
Normalize bSYM to Dx across FAERS BERT and LLaMA evaluations, update Figure 5 and manuscript
</commit_message>
<xml_diff>
--- a/publication/manuscripts/LLM4AE_rev1.docx
+++ b/publication/manuscripts/LLM4AE_rev1.docx
@@ -3117,7 +3117,7 @@
         <w:rPr>
           <w:lang w:val="it-IT"/>
         </w:rPr>
-        <w:t>Llama-4</w:t>
+        <w:t>LLaMA-4</w:t>
       </w:r>
       <w:r>
         <w:rPr>
@@ -3131,7 +3131,7 @@
           <w:iCs/>
           <w:lang w:val="it-IT"/>
         </w:rPr>
-        <w:t>Llama</w:t>
+        <w:t>LLaMA-4</w:t>
       </w:r>
       <w:r>
         <w:rPr>
@@ -3139,7 +3139,7 @@
           <w:iCs/>
           <w:lang w:val="it-IT"/>
         </w:rPr>
-        <w:t>-4-Maverick-17B-128E-Instruct-FP8</w:t>
+        <w:t>-Maverick-17B-128E-Instruct-FP8</w:t>
       </w:r>
       <w:r>
         <w:rPr>
@@ -3174,14 +3174,7 @@
             <w:rStyle w:val="Hyperlink"/>
             <w:lang w:val="it-IT"/>
           </w:rPr>
-          <w:t>Llama</w:t>
-        </w:r>
-        <w:r>
-          <w:rPr>
-            <w:rStyle w:val="Hyperlink"/>
-            <w:lang w:val="it-IT"/>
-          </w:rPr>
-          <w:t>-4</w:t>
+          <w:t>LLaMA-4</w:t>
         </w:r>
       </w:hyperlink>
       <w:r>
@@ -4556,7 +4549,31 @@
                 <w:szCs w:val="24"/>
                 <w:lang w:eastAsia="en-US"/>
               </w:rPr>
-              <w:t xml:space="preserve"> (Llama-4)</w:t>
+              <w:t xml:space="preserve"> (</w:t>
+            </w:r>
+            <w:r>
+              <w:rPr>
+                <w:rFonts w:ascii="Arial" w:hAnsi="Arial"/>
+                <w:bCs w:val="0"/>
+                <w:color w:val="111111"/>
+                <w:kern w:val="2"/>
+                <w:sz w:val="16"/>
+                <w:szCs w:val="24"/>
+                <w:lang w:eastAsia="en-US"/>
+              </w:rPr>
+              <w:t>LLaMA-4</w:t>
+            </w:r>
+            <w:r>
+              <w:rPr>
+                <w:rFonts w:ascii="Arial" w:hAnsi="Arial"/>
+                <w:bCs w:val="0"/>
+                <w:color w:val="111111"/>
+                <w:kern w:val="2"/>
+                <w:sz w:val="16"/>
+                <w:szCs w:val="24"/>
+                <w:lang w:eastAsia="en-US"/>
+              </w:rPr>
+              <w:t>)</w:t>
             </w:r>
           </w:p>
         </w:tc>
@@ -7777,10 +7794,7 @@
         <w:t xml:space="preserve">For LLM, both </w:t>
       </w:r>
       <w:r>
-        <w:t>Llama</w:t>
-      </w:r>
-      <w:r>
-        <w:t>-4</w:t>
+        <w:t>LLaMA-4</w:t>
       </w:r>
       <w:r>
         <w:t xml:space="preserve"> and</w:t>
@@ -7834,10 +7848,10 @@
         <w:t xml:space="preserve">, </w:t>
       </w:r>
       <w:r>
-        <w:t>Llama</w:t>
-      </w:r>
-      <w:r>
-        <w:t>-4 and Claude 4.6 Sonnet showed similar performance</w:t>
+        <w:t>LLaMA-4</w:t>
+      </w:r>
+      <w:r>
+        <w:t xml:space="preserve"> and Claude 4.6 Sonnet showed similar performance</w:t>
       </w:r>
       <w:r>
         <w:t xml:space="preserve">, </w:t>
@@ -8069,7 +8083,7 @@
           <w:sz w:val="20"/>
           <w:szCs w:val="20"/>
         </w:rPr>
-        <w:t>Llama-4</w:t>
+        <w:t>LLaMA-4</w:t>
       </w:r>
       <w:r>
         <w:rPr>
@@ -8139,7 +8153,7 @@
           <w:sz w:val="20"/>
           <w:szCs w:val="20"/>
         </w:rPr>
-        <w:t>Llama-4</w:t>
+        <w:t>LLaMA-4</w:t>
       </w:r>
       <w:r>
         <w:rPr>
@@ -8189,7 +8203,7 @@
         <w:t xml:space="preserve"> summarizes the overall benchmark comparison across model families, input paradigms, and evaluation tiers. BioBERT achieved a strict exact-match F1 of 0.5685 and an adapted ADE-Eval F1 of 0.7463, which substantially outperformed few-shot </w:t>
       </w:r>
       <w:r>
-        <w:t>Llama-4</w:t>
+        <w:t>LLaMA-4</w:t>
       </w:r>
       <w:r>
         <w:t xml:space="preserve"> (0.4043 Strict, 0.6249 Adapted), Claude 4.6 Sonnet (0.4667 Strict, 0.6443 Adapted), and baseline ETHER system (0.1147 Strict, 0.2447 Adapted).</w:t>
@@ -8453,7 +8467,16 @@
                 <w:color w:val="222222"/>
                 <w:sz w:val="16"/>
               </w:rPr>
-              <w:t xml:space="preserve">Llama-4 </w:t>
+              <w:t>LLaMA-4</w:t>
+            </w:r>
+            <w:r>
+              <w:rPr>
+                <w:rFonts w:ascii="Arial" w:hAnsi="Arial"/>
+                <w:b/>
+                <w:color w:val="222222"/>
+                <w:sz w:val="16"/>
+              </w:rPr>
+              <w:t xml:space="preserve"> </w:t>
             </w:r>
           </w:p>
         </w:tc>
@@ -8781,7 +8804,7 @@
         <w:t>LLM models (</w:t>
       </w:r>
       <w:r>
-        <w:t>Llama-4</w:t>
+        <w:t>LLaMA-4</w:t>
       </w:r>
       <w:r>
         <w:t xml:space="preserve"> and Sonnet 4.6</w:t>
@@ -8930,7 +8953,7 @@
           <w:sz w:val="20"/>
           <w:szCs w:val="20"/>
         </w:rPr>
-        <w:t>Llama-4</w:t>
+        <w:t>LLaMA-4</w:t>
       </w:r>
       <w:r>
         <w:rPr>
@@ -8962,215 +8985,101 @@
     </w:p>
     <w:p>
       <w:r>
-        <w:t>Next, we conducted a</w:t>
-      </w:r>
-      <w:r>
-        <w:t>n</w:t>
-      </w:r>
-      <w:r>
-        <w:t xml:space="preserve"> error analysis on the FAERS </w:t>
-      </w:r>
+        <w:t>Next, we conducted an error analysis on the FAERS dataset to characterize whether BERT and LLM (LLaMA-4) differed in their failure modes. For this comparison, baseline symptoms were normalized to the formal Dx category, and the BERT results were drawn from the leave-one-pair-out (LOO) evaluation using random seed 42. Figure 5a shows that BERT produces more exact matches and fewer C and spurious outcomes than LLaMA-4. BERT produced 17,864 exact matches (44.3%), compared with 13,770 (30.0%) for LLaMA-4. BERT also had fewer C outcomes (coverage errors, including boundary errors and class confusions: 7,146 [17.7%] vs 10,119 [22.0%]) and fewer non-overlapping spurious predictions (9,861 [24.5%] vs 15,790 [34.4%]). Misses were comparable: 5,436 (13.5%) for BERT and 6,259 (13.6%) for LLaMA-4.</w:t>
+      </w:r>
+      <w:r/>
+      <w:r/>
       <w:r>
         <w:rPr>
           <w:rFonts w:hint="eastAsia"/>
           <w:lang w:eastAsia="zh-CN"/>
         </w:rPr>
-        <w:t>dataset</w:t>
-      </w:r>
-      <w:r>
-        <w:t xml:space="preserve"> to characterize </w:t>
-      </w:r>
-      <w:r>
-        <w:t>whether</w:t>
-      </w:r>
-      <w:r>
-        <w:t xml:space="preserve"> BERT and LLM </w:t>
-      </w:r>
-      <w:r>
-        <w:t xml:space="preserve">(Llama-4) </w:t>
-      </w:r>
-      <w:r>
-        <w:t>differ</w:t>
-      </w:r>
-      <w:r>
-        <w:t>ed</w:t>
-      </w:r>
-      <w:r>
-        <w:t xml:space="preserve"> in their failure modes. </w:t>
-      </w:r>
+      </w:r>
+      <w:r/>
+      <w:r/>
+      <w:r/>
+      <w:r/>
+      <w:r/>
+      <w:r/>
+      <w:r/>
+      <w:r/>
+      <w:r/>
       <w:r>
         <w:rPr>
           <w:b/>
           <w:bCs/>
         </w:rPr>
-        <w:t>Figure 5a</w:t>
-      </w:r>
-      <w:r>
-        <w:t xml:space="preserve"> shows that BERT </w:t>
-      </w:r>
-      <w:r>
-        <w:t xml:space="preserve">overall </w:t>
-      </w:r>
-      <w:r>
-        <w:t>produces more exact matches</w:t>
-      </w:r>
+      </w:r>
+      <w:r/>
+      <w:r/>
+      <w:r/>
       <w:r>
         <w:rPr>
           <w:rFonts w:hint="eastAsia"/>
           <w:lang w:eastAsia="zh-CN"/>
         </w:rPr>
-        <w:t>,</w:t>
-      </w:r>
-      <w:r>
-        <w:t xml:space="preserve"> and fewer conflation and </w:t>
-      </w:r>
+      </w:r>
+      <w:r/>
       <w:r>
         <w:rPr>
           <w:rFonts w:hint="eastAsia"/>
           <w:lang w:eastAsia="zh-CN"/>
         </w:rPr>
-        <w:t>spurious</w:t>
-      </w:r>
-      <w:r>
-        <w:t xml:space="preserve"> errors than LLM. </w:t>
-      </w:r>
-      <w:r>
-        <w:t xml:space="preserve">In </w:t>
-      </w:r>
-      <w:r>
-        <w:t>detail</w:t>
-      </w:r>
-      <w:r>
-        <w:t xml:space="preserve">, </w:t>
-      </w:r>
-      <w:r>
-        <w:t>58.0% of spans are exact matches (26,891)</w:t>
-      </w:r>
-      <w:r>
-        <w:t xml:space="preserve"> in BERT</w:t>
-      </w:r>
-      <w:r>
-        <w:t xml:space="preserve">, compared with 31.6% (17,396) for LLM. LLM </w:t>
-      </w:r>
-      <w:r>
-        <w:t>result</w:t>
-      </w:r>
-      <w:r>
-        <w:t>s in</w:t>
-      </w:r>
-      <w:r>
-        <w:t xml:space="preserve"> more than double the proportion of </w:t>
-      </w:r>
-      <w:r>
-        <w:t>C</w:t>
-      </w:r>
-      <w:r>
-        <w:t>onflation</w:t>
-      </w:r>
-      <w:r>
-        <w:t xml:space="preserve">s </w:t>
-      </w:r>
-      <w:r>
-        <w:t>(16,358 vs 6,485</w:t>
-      </w:r>
-      <w:r>
-        <w:t xml:space="preserve"> in BERT</w:t>
-      </w:r>
-      <w:r>
-        <w:t xml:space="preserve">). The LLM also produces more </w:t>
-      </w:r>
-      <w:r>
-        <w:t>S</w:t>
-      </w:r>
-      <w:r>
-        <w:t xml:space="preserve">purious </w:t>
-      </w:r>
-      <w:r>
-        <w:t xml:space="preserve">predictions </w:t>
-      </w:r>
-      <w:r>
-        <w:t>(14,185 vs 7,195</w:t>
-      </w:r>
-      <w:r>
-        <w:t xml:space="preserve"> in BERT</w:t>
-      </w:r>
-      <w:r>
-        <w:t xml:space="preserve">), </w:t>
-      </w:r>
-      <w:r>
-        <w:t xml:space="preserve">which </w:t>
-      </w:r>
-      <w:r>
-        <w:t>reflect</w:t>
-      </w:r>
-      <w:r>
-        <w:t>s these</w:t>
-      </w:r>
-      <w:r>
-        <w:t xml:space="preserve"> </w:t>
-      </w:r>
+      </w:r>
+      <w:r/>
+      <w:r/>
+      <w:r/>
+      <w:r/>
+      <w:r/>
+      <w:r/>
+      <w:r/>
+      <w:r/>
+      <w:r/>
+      <w:r/>
+      <w:r/>
+      <w:r/>
+      <w:r/>
+      <w:r/>
+      <w:r/>
+      <w:r/>
+      <w:r/>
+      <w:r/>
+      <w:r/>
+      <w:r/>
+      <w:r/>
+      <w:r/>
+      <w:r/>
+      <w:r/>
+      <w:r/>
+      <w:r/>
       <w:r>
         <w:rPr>
           <w:rFonts w:hint="eastAsia"/>
           <w:lang w:eastAsia="zh-CN"/>
         </w:rPr>
-        <w:t>non-overlapped</w:t>
-      </w:r>
-      <w:r>
-        <w:t xml:space="preserve"> entities </w:t>
-      </w:r>
-      <w:r>
-        <w:t>with</w:t>
-      </w:r>
+      </w:r>
+      <w:r/>
+      <w:r/>
       <w:r>
         <w:rPr>
           <w:rFonts w:hint="eastAsia"/>
           <w:lang w:eastAsia="zh-CN"/>
         </w:rPr>
-        <w:t xml:space="preserve"> human SME</w:t>
-      </w:r>
-      <w:r>
-        <w:t xml:space="preserve">. </w:t>
-      </w:r>
-      <w:r>
-        <w:t xml:space="preserve">On the other side, </w:t>
-      </w:r>
-      <w:r>
-        <w:t>Null</w:t>
-      </w:r>
-      <w:r>
-        <w:t xml:space="preserve"> </w:t>
-      </w:r>
-      <w:r>
-        <w:t>show</w:t>
-      </w:r>
-      <w:r>
-        <w:t>s</w:t>
-      </w:r>
-      <w:r>
-        <w:t xml:space="preserve"> comparable proportions</w:t>
-      </w:r>
-      <w:r>
-        <w:t xml:space="preserve"> and counts</w:t>
-      </w:r>
-      <w:r>
-        <w:t xml:space="preserve"> between </w:t>
-      </w:r>
-      <w:r>
-        <w:t xml:space="preserve">BERT </w:t>
-      </w:r>
-      <w:r>
-        <w:t xml:space="preserve">(5,793) </w:t>
-      </w:r>
-      <w:r>
-        <w:t>and LLM</w:t>
-      </w:r>
-      <w:r>
-        <w:t xml:space="preserve"> (7,156</w:t>
-      </w:r>
-      <w:r>
-        <w:t>).</w:t>
-      </w:r>
+      </w:r>
+      <w:r/>
+      <w:r/>
+      <w:r/>
+      <w:r/>
+      <w:r/>
+      <w:r/>
+      <w:r/>
+      <w:r/>
+      <w:r/>
+      <w:r/>
+      <w:r/>
+      <w:r/>
+      <w:r/>
+      <w:r/>
     </w:p>
     <w:p>
       <w:pPr>
@@ -9181,10 +9090,10 @@
           <w:noProof/>
         </w:rPr>
         <w:drawing>
-          <wp:inline distT="0" distB="0" distL="0" distR="0" wp14:anchorId="06F8AC9E" wp14:editId="0D02D8D5">
-            <wp:extent cx="5943600" cy="5033010"/>
-            <wp:effectExtent l="0" t="0" r="0" b="0"/>
-            <wp:docPr id="1005109684" name="Picture 3"/>
+          <wp:inline distT="0" distB="0" distL="0" distR="0" wp14:anchorId="373E1442" wp14:editId="1304D6DB">
+            <wp:extent cx="5939790" cy="5003800"/>
+            <wp:effectExtent l="0" t="0" r="3810" b="6350"/>
+            <wp:docPr id="630368657" name="Picture 1"/>
             <wp:cNvGraphicFramePr>
               <a:graphicFrameLocks xmlns:a="http://schemas.openxmlformats.org/drawingml/2006/main" noChangeAspect="1"/>
             </wp:cNvGraphicFramePr>
@@ -9192,7 +9101,7 @@
               <a:graphicData uri="http://schemas.openxmlformats.org/drawingml/2006/picture">
                 <pic:pic xmlns:pic="http://schemas.openxmlformats.org/drawingml/2006/picture">
                   <pic:nvPicPr>
-                    <pic:cNvPr id="0" name="Picture 4"/>
+                    <pic:cNvPr id="0" name="Picture 2"/>
                     <pic:cNvPicPr>
                       <a:picLocks noChangeAspect="1" noChangeArrowheads="1"/>
                     </pic:cNvPicPr>
@@ -9213,7 +9122,7 @@
                   <pic:spPr bwMode="auto">
                     <a:xfrm>
                       <a:off x="0" y="0"/>
-                      <a:ext cx="5943600" cy="5033010"/>
+                      <a:ext cx="5939790" cy="5003800"/>
                     </a:xfrm>
                     <a:prstGeom prst="rect">
                       <a:avLst/>
@@ -9245,208 +9154,129 @@
           <w:sz w:val="20"/>
           <w:szCs w:val="20"/>
         </w:rPr>
-        <w:t>Figure 5.</w:t>
+        <w:t>Figure 5. Error analysis on the FAERS dataset. Baseline symptoms were normalized to the formal Dx category. BERT results are from the leave-one-pair-out evaluation with random seed 42. (a) Overall M/C/S/N error distribution (M: exact match; C: coverage error, including boundary errors and class confusions; S: non-overlapping spurious prediction; N: miss). (b) Top label misclassifications for BERT. (c) Top label misclassifications for LLaMA-4. (d) Typical concomitant drug and treatment terms misclassified as suspect drug (sDrug) by LLaMA-4. (e) Typical clinical terms exhibiting medical history (MHx) versus diagnosis (Dx) or adverse event (AE) confusions by LLaMA-4.</w:t>
       </w:r>
       <w:r>
         <w:rPr>
           <w:sz w:val="20"/>
           <w:szCs w:val="20"/>
         </w:rPr>
-        <w:t xml:space="preserve"> </w:t>
       </w:r>
       <w:r>
         <w:rPr>
           <w:sz w:val="20"/>
           <w:szCs w:val="20"/>
         </w:rPr>
-        <w:t>Error analysis on the FAERS dataset.</w:t>
       </w:r>
       <w:r>
         <w:rPr>
           <w:sz w:val="20"/>
           <w:szCs w:val="20"/>
         </w:rPr>
-        <w:t xml:space="preserve"> (a) Overall M/C/S/N error distribution (M: exact match; C: coverage error; S: spurious prediction; N: </w:t>
       </w:r>
       <w:r>
         <w:rPr>
           <w:sz w:val="20"/>
           <w:szCs w:val="20"/>
         </w:rPr>
-        <w:t>null/miss</w:t>
       </w:r>
       <w:r>
         <w:rPr>
           <w:sz w:val="20"/>
           <w:szCs w:val="20"/>
         </w:rPr>
-        <w:t xml:space="preserve">). (b) Top label misclassifications for BERT. (c) Top label misclassifications for LLM. (d) Typical concomitant drug and treatment terms misclassified as suspect drug </w:t>
       </w:r>
       <w:r>
         <w:rPr>
           <w:sz w:val="20"/>
           <w:szCs w:val="20"/>
         </w:rPr>
-        <w:lastRenderedPageBreak/>
-        <w:t>(sDrug) by LLM. (e) Typical clinical terms exhibiting medical history (MHx) versus diagnosis (Dx) or adverse event (AE) confusions by LLM.</w:t>
       </w:r>
     </w:p>
     <w:p/>
     <w:p>
       <w:r>
-        <w:t>The top confusion pairs for both systems (</w:t>
+        <w:t>The top confusion pairs for both systems (Figure 5b and 5c) demonstrate that errors cluster within clinically related concept types rather than dispersing randomly. For BERT (Figure 5b), the largest confusions were Dx labeled as adverse events (Dx to AE: 396), suspect drugs labeled as concomitant drugs (sDrug to cDrug: 347), and suspect drugs labeled as treatment interventions (sDrug to Treatment: 211). Other frequent errors involved medical history labeled as AE (MHx to AE: 157), AE labeled as laboratory findings (AE to Lab: 134), and laboratory findings labeled as AE (Lab to AE: 124), AE labeled as Dx (AE to Dx: 121), and medical history labeled as Dx (MHx to Dx: 117). These patterns reflect both clinical-state boundaries and medication-role distinctions.</w:t>
       </w:r>
       <w:r>
         <w:rPr>
           <w:b/>
           <w:bCs/>
         </w:rPr>
-        <w:t>Figure 5b and 5c</w:t>
-      </w:r>
-      <w:r>
-        <w:t>) demonstrate that errors cluster within clinically related concept types rather than dispersing randomly. For BERT</w:t>
-      </w:r>
-      <w:r>
-        <w:t xml:space="preserve"> (</w:t>
-      </w:r>
+      </w:r>
+      <w:r/>
+      <w:r/>
       <w:r>
         <w:rPr>
           <w:b/>
           <w:bCs/>
         </w:rPr>
-        <w:t>Figure 5b</w:t>
-      </w:r>
-      <w:r>
-        <w:t>)</w:t>
-      </w:r>
-      <w:r>
-        <w:t xml:space="preserve">, misclassifications primarily involve context-dependent clinical boundaries, notably medical history conflated with therapeutic indications (MHx </w:t>
-      </w:r>
-      <w:r>
-        <w:t>to</w:t>
-      </w:r>
-      <w:r>
-        <w:t xml:space="preserve"> Indication: 345), adverse events confused with laboratory findings (AE </w:t>
-      </w:r>
-      <w:r>
-        <w:t>to</w:t>
-      </w:r>
-      <w:r>
-        <w:t xml:space="preserve"> Lab: 191), and bidirectional medical history versus AE boundary ambiguities (MHx </w:t>
-      </w:r>
-      <w:r>
-        <w:t>to</w:t>
-      </w:r>
-      <w:r>
-        <w:t xml:space="preserve"> AE: 172; AE </w:t>
-      </w:r>
-      <w:r>
-        <w:t>to</w:t>
-      </w:r>
-      <w:r>
-        <w:t xml:space="preserve"> MHx: 168), typically occurring when chronic comorbidities and acute symptoms are documented within the same sentence. </w:t>
-      </w:r>
+      </w:r>
+      <w:r/>
+      <w:r/>
+      <w:r/>
+      <w:r/>
+      <w:r/>
+      <w:r/>
+      <w:r/>
+      <w:r/>
+      <w:r/>
+      <w:r/>
     </w:p>
     <w:p>
       <w:r>
-        <w:t>For the LLM</w:t>
-      </w:r>
-      <w:r>
-        <w:t xml:space="preserve"> (</w:t>
-      </w:r>
+        <w:t>For LLaMA-4 (Figure 5c), the most frequent confusion was Dx labeled as medical history (Dx to MHx: 698), followed by Dx labeled as indication (Dx to Indication: 456). Other prominent errors included suspect drugs labeled as concomitant drugs (sDrug to cDrug: 403), AE labeled as mild AE (AE to mAE: 308), Dx labeled as AE (Dx to AE: 175), concomitant drugs labeled as treatment (cDrug to Treatment: 168), and laboratory findings labeled as AE (Lab to AE: 161) or Dx (Lab to Dx: 157). Thus, both systems show semantically structured class confusions, while LLaMA-4 has the larger overall burden of non-overlapping spurious predictions.</w:t>
+      </w:r>
+      <w:r/>
       <w:r>
         <w:rPr>
           <w:b/>
           <w:bCs/>
         </w:rPr>
-        <w:t>Figure 5</w:t>
       </w:r>
       <w:r>
         <w:rPr>
           <w:b/>
           <w:bCs/>
         </w:rPr>
-        <w:t>c</w:t>
-      </w:r>
-      <w:r>
-        <w:t>)</w:t>
-      </w:r>
-      <w:r>
-        <w:t xml:space="preserve">, the single largest error mode is the misclassification of concomitant medications as primary suspect drugs (cDrug </w:t>
-      </w:r>
-      <w:r>
-        <w:t>to</w:t>
-      </w:r>
-      <w:r>
-        <w:t xml:space="preserve"> sDrug: 2,737), followed by treatment interventions labeled as suspect drugs (Treatment </w:t>
-      </w:r>
-      <w:r>
-        <w:t>to</w:t>
-      </w:r>
-      <w:r>
-        <w:t xml:space="preserve"> sDrug: 847). Additional prominent LLM confusions include medical history categorized as current diagnoses (MHx </w:t>
-      </w:r>
-      <w:r>
-        <w:t>to</w:t>
-      </w:r>
-      <w:r>
-        <w:t xml:space="preserve"> Dx: 364) or adverse events (MHx </w:t>
-      </w:r>
-      <w:r>
-        <w:t>to</w:t>
-      </w:r>
-      <w:r>
-        <w:t xml:space="preserve"> AE: 342), laboratory values labeled as dosages (Lab </w:t>
-      </w:r>
-      <w:r>
-        <w:t>to</w:t>
-      </w:r>
-      <w:r>
-        <w:t xml:space="preserve"> Dose: 328), and laboratory findings classified as adverse events (Lab </w:t>
-      </w:r>
-      <w:r>
-        <w:t>to</w:t>
-      </w:r>
-      <w:r>
-        <w:t xml:space="preserve"> AE: 230). While BERT errors are concentrated in a tight set of adjacent clinical categories, the LLM exhibits widespread role conflation across pharmacological and historical categories.</w:t>
-      </w:r>
+      </w:r>
+      <w:r/>
+      <w:r/>
+      <w:r/>
+      <w:r/>
+      <w:r/>
+      <w:r/>
+      <w:r/>
+      <w:r/>
+      <w:r/>
+      <w:r/>
+      <w:r/>
+      <w:r/>
+      <w:r/>
+      <w:r/>
     </w:p>
     <w:p>
       <w:r>
-        <w:t xml:space="preserve">We </w:t>
-      </w:r>
-      <w:r>
-        <w:t xml:space="preserve">further </w:t>
-      </w:r>
-      <w:r>
-        <w:t xml:space="preserve">applied word-cloud visualizations on the primary LLM misclassification categories to clarify these </w:t>
-      </w:r>
-      <w:r>
-        <w:t xml:space="preserve">major </w:t>
-      </w:r>
-      <w:r>
-        <w:t>failure modes. For concomitant and treatment spans misclassified as suspect drug (sDrug) by the LLM (</w:t>
-      </w:r>
+        <w:t>We further applied word-cloud visualizations to the primary LLaMA-4 misclassification categories to clarify these failure modes. For concomitant and treatment spans misclassified as suspect drug (sDrug) by LLaMA-4 (Figure 5d), prominent terms included azacitidine, lenalidomide, venetoclax, insulin, and ofloxacin. In contrast, clinical spans exhibiting medical history and diagnosis/AE confusions (Figure 5e) were dominated by chronic conditions and comorbidities, including rheumatoid arthritis, chronic obstructive pulmonary disease, sleep apnoea syndrome, atrial fibrillation, and depression.</w:t>
+      </w:r>
+      <w:r/>
+      <w:r/>
+      <w:r/>
+      <w:r/>
       <w:r>
         <w:rPr>
           <w:b/>
           <w:bCs/>
         </w:rPr>
-        <w:t>Figure 5d</w:t>
-      </w:r>
-      <w:r>
-        <w:t>), the most prominent tokens were common co-administered medications and supportive therapies, including methylprednisolone, methotrexate, prednisone, esomeprazole, folic acid, and dexamethasone. In contrast, clinical spans exhibiting medical history and diagnosis/AE confusions (</w:t>
-      </w:r>
+      </w:r>
+      <w:r/>
       <w:r>
         <w:rPr>
           <w:b/>
           <w:bCs/>
         </w:rPr>
-        <w:t>Figure 5e</w:t>
-      </w:r>
-      <w:r>
-        <w:t>) were dominated by prevalent chronic conditions and comorbidities, such as hypertension, myelodysplastic syndrome, pneumonia, rheumatoid arthritis, osteoporosis, and recurrent infections.</w:t>
-      </w:r>
+      </w:r>
+      <w:r/>
     </w:p>
     <w:p>
       <w:pPr>
@@ -9455,44 +9285,34 @@
         </w:rPr>
       </w:pPr>
       <w:r>
-        <w:t xml:space="preserve">Overall, LLM annotations are prone to spurious </w:t>
+        <w:t>Overall, compared with BERT, LLaMA-4 annotations show fewer exact matches and substantially more non-overlapping spurious predictions, alongside class confusions involving medication roles and clinically adjacent categories. Nevertheless, as shown in Figure 4, partial boundary and label matches can still receive partial credit under the adapted ADE-Eval metric, which is particularly relevant for uncommon categories such as oDrug, mAE, R/O, and CoD.</w:t>
       </w:r>
       <w:r>
         <w:rPr>
           <w:rFonts w:hint="eastAsia"/>
           <w:lang w:eastAsia="zh-CN"/>
         </w:rPr>
-        <w:t>predictions</w:t>
-      </w:r>
-      <w:r>
-        <w:t xml:space="preserve">, boundary drift, and drug role conflation (cDrug/Treatment </w:t>
-      </w:r>
-      <w:r>
-        <w:t>to</w:t>
-      </w:r>
-      <w:r>
-        <w:t xml:space="preserve"> sDrug). </w:t>
-      </w:r>
+      </w:r>
+      <w:r/>
+      <w:r/>
+      <w:r/>
       <w:r>
         <w:rPr>
           <w:rFonts w:hint="eastAsia"/>
           <w:lang w:eastAsia="zh-CN"/>
         </w:rPr>
-        <w:t xml:space="preserve">However, LLM is better to annotate uncommon categories like oDrug, mAE, </w:t>
       </w:r>
       <w:r>
         <w:rPr>
           <w:rFonts w:hint="eastAsia"/>
           <w:lang w:eastAsia="zh-CN"/>
         </w:rPr>
-        <w:t xml:space="preserve">R/O </w:t>
       </w:r>
       <w:r>
         <w:rPr>
           <w:rFonts w:hint="eastAsia"/>
           <w:lang w:eastAsia="zh-CN"/>
         </w:rPr>
-        <w:t>and CoD by conflation through inaccurate boundary or mislabeled category, therefore retrieved higher adapted ADE-Eval F1 in these uncommon categories (</w:t>
       </w:r>
       <w:r>
         <w:rPr>
@@ -9501,14 +9321,12 @@
           <w:bCs/>
           <w:lang w:eastAsia="zh-CN"/>
         </w:rPr>
-        <w:t>Figure 4</w:t>
       </w:r>
       <w:r>
         <w:rPr>
           <w:rFonts w:hint="eastAsia"/>
           <w:lang w:eastAsia="zh-CN"/>
         </w:rPr>
-        <w:t xml:space="preserve">). </w:t>
       </w:r>
     </w:p>
     <w:p>
@@ -9590,7 +9408,7 @@
         <w:t xml:space="preserve">). In contrast, the 1-shot </w:t>
       </w:r>
       <w:r>
-        <w:t>Llama-4</w:t>
+        <w:t>LLaMA-4</w:t>
       </w:r>
       <w:r>
         <w:t xml:space="preserve"> baseline evaluated under the official 11-category annotation guidance achieved a strict F1 of 0.3383 and an adapted ADE-Eval F1 of 0.6400 (with 0.6691 Precision and 0.6134 Recall).</w:t>
@@ -9743,7 +9561,7 @@
                 <w:sz w:val="16"/>
                 <w:szCs w:val="24"/>
               </w:rPr>
-              <w:t>Llama-</w:t>
+              <w:t>LLaMA-4</w:t>
             </w:r>
             <w:r>
               <w:rPr>
@@ -9755,7 +9573,7 @@
                 <w:szCs w:val="24"/>
                 <w:lang w:eastAsia="en-US"/>
               </w:rPr>
-              <w:t>4)</w:t>
+              <w:t>)</w:t>
             </w:r>
           </w:p>
         </w:tc>
@@ -11103,13 +10921,13 @@
         <w:t xml:space="preserve">) across all 11 clinical concept categories confirmed strong supervised encoder advantages across vaccines (VAX: 0.93 vs 0.85), treatments (TX: 0.92 vs 0.76), secondary diagnoses (sDx: 0.87 vs 0.62), medical history (MHx: 0.85 vs 0.58), patient clinical status (STATUS: 0.83 vs 0.61), primary diagnoses (pDx: 0.83 vs 0.70), adverse-event symptoms (SYM: 0.78 vs 0.57), laboratory findings (Lab: 0.76 vs 0.56), and family history (FHx: 0.65 vs 0.51). Notably, few-shot </w:t>
       </w:r>
       <w:r>
-        <w:t>Llama-4</w:t>
+        <w:t>LLaMA-4</w:t>
       </w:r>
       <w:r>
         <w:t xml:space="preserve"> successfully extracted specialized categories unmodeled by the encoder, including cause of death (CoD: 0.70 F1; P = 0.67, R = 0.73) and rule-out diagnoses (RO: 0.53 F1), while overall micro-average performance reached 0.84 for BioBERT versus 0.64 for </w:t>
       </w:r>
       <w:r>
-        <w:t>Llama-4</w:t>
+        <w:t>LLaMA-4</w:t>
       </w:r>
       <w:r>
         <w:t>. Error anatomy (</w:t>
@@ -11131,7 +10949,7 @@
         <w:t xml:space="preserve"> revealed that BioBERT achieved 64.5% exact matches (15,068 spans) and 19.3% coverage errors (4,506 spans), with only 8.9% spurious spans (2,081) and 7.3% misses (1,711). In contrast, </w:t>
       </w:r>
       <w:r>
-        <w:t>Llama-4</w:t>
+        <w:t>LLaMA-4</w:t>
       </w:r>
       <w:r>
         <w:t xml:space="preserve"> produced 30.4% exact matches (12,015 spans) and 49.3% coverage errors (19,476 spans), while spurious hallucinations (10.3%; 4,079 spans) and true unpredicted omissions (10.0%; 3,972 spans). Confusion breakdowns (</w:t>
@@ -11147,7 +10965,7 @@
         <w:t xml:space="preserve">) demonstrated that the predominant error mode for </w:t>
       </w:r>
       <w:r>
-        <w:t>Llama-4</w:t>
+        <w:t>LLaMA-4</w:t>
       </w:r>
       <w:r>
         <w:t xml:space="preserve"> was subsuming secondary </w:t>
@@ -11306,7 +11124,7 @@
           <w:sz w:val="20"/>
           <w:szCs w:val="20"/>
         </w:rPr>
-        <w:t>Llama-4</w:t>
+        <w:t>LLaMA-4</w:t>
       </w:r>
       <w:r>
         <w:rPr>
@@ -11320,7 +11138,7 @@
           <w:sz w:val="20"/>
           <w:szCs w:val="20"/>
         </w:rPr>
-        <w:t>Llama-4</w:t>
+        <w:t>LLaMA-4</w:t>
       </w:r>
       <w:r>
         <w:rPr>
@@ -11348,14 +11166,14 @@
           <w:sz w:val="20"/>
           <w:szCs w:val="20"/>
         </w:rPr>
-        <w:t>Llama-</w:t>
+        <w:t>LLaMA-4</w:t>
       </w:r>
       <w:r>
         <w:rPr>
           <w:sz w:val="20"/>
           <w:szCs w:val="20"/>
         </w:rPr>
-        <w:t xml:space="preserve">4 top </w:t>
+        <w:t xml:space="preserve"> top </w:t>
       </w:r>
       <w:r>
         <w:rPr>
@@ -14044,7 +13862,7 @@
                 <w:color w:val="222222"/>
                 <w:sz w:val="16"/>
               </w:rPr>
-              <w:t>Llama-4</w:t>
+              <w:t>LLaMA-4</w:t>
             </w:r>
           </w:p>
         </w:tc>
@@ -14155,7 +13973,7 @@
                 <w:color w:val="222222"/>
                 <w:sz w:val="16"/>
               </w:rPr>
-              <w:t>Llama-4</w:t>
+              <w:t>LLaMA-4</w:t>
             </w:r>
           </w:p>
         </w:tc>

</xml_diff>

<commit_message>
feat(publication): update generate_table6.py to compute metrics dynamically from raw data with micro-average aggregation
</commit_message>
<xml_diff>
--- a/publication/manuscripts/LLM4AE_rev1.docx
+++ b/publication/manuscripts/LLM4AE_rev1.docx
@@ -11053,92 +11053,7 @@
     </w:p>
     <w:p>
       <w:r>
-        <w:t xml:space="preserve">We applied a repeated Leave-One-Drug-Event-Pair-Out cross-validation protocol on the FAERS corpus to evaluate model generalization across distinct therapeutic contexts on all 17 clinical concept categories. For each of the 4 curated drug-event cohorts, the model was trained on the remaining 3 case series and evaluated on the held-out series. As shown in </w:t>
-      </w:r>
-      <w:r>
-        <w:rPr>
-          <w:b/>
-          <w:bCs/>
-        </w:rPr>
-        <w:t>Table 5</w:t>
-      </w:r>
-      <w:r>
-        <w:t xml:space="preserve">, strict exact-match F1 was 0.6002 for </w:t>
-      </w:r>
-      <w:r>
-        <w:rPr>
-          <w:i/>
-          <w:iCs/>
-        </w:rPr>
-        <w:t>azacitidine–QT prolongation</w:t>
-      </w:r>
-      <w:r>
-        <w:t xml:space="preserve"> (N = 200), 0.6367 for </w:t>
-      </w:r>
-      <w:r>
-        <w:rPr>
-          <w:i/>
-          <w:iCs/>
-        </w:rPr>
-        <w:t>baricitinib–hypersensitivity</w:t>
-      </w:r>
-      <w:r>
-        <w:t xml:space="preserve"> (N = 200), 0.5289 for </w:t>
-      </w:r>
-      <w:r>
-        <w:rPr>
-          <w:i/>
-          <w:iCs/>
-        </w:rPr>
-        <w:t>tramadol–hypoglycemia</w:t>
-      </w:r>
-      <w:r>
-        <w:t xml:space="preserve"> (N = 229), and 0.5084 for </w:t>
-      </w:r>
-      <w:proofErr w:type="spellStart"/>
-      <w:r>
-        <w:rPr>
-          <w:i/>
-          <w:iCs/>
-        </w:rPr>
-        <w:t>erenumab</w:t>
-      </w:r>
-      <w:proofErr w:type="spellEnd"/>
-      <w:r>
-        <w:rPr>
-          <w:i/>
-          <w:iCs/>
-        </w:rPr>
-        <w:t>–stroke</w:t>
-      </w:r>
-      <w:r>
-        <w:t xml:space="preserve"> (N = 200), yielding </w:t>
-      </w:r>
-      <w:r>
-        <w:t>a total of</w:t>
-      </w:r>
-      <w:r>
-        <w:t xml:space="preserve"> F1 0.5</w:t>
-      </w:r>
-      <w:r>
-        <w:rPr>
-          <w:rFonts w:hint="eastAsia"/>
-          <w:lang w:eastAsia="zh-CN"/>
-        </w:rPr>
-        <w:t>564</w:t>
-      </w:r>
-      <w:r>
-        <w:t xml:space="preserve"> across folds (0.74</w:t>
-      </w:r>
-      <w:r>
-        <w:rPr>
-          <w:rFonts w:hint="eastAsia"/>
-          <w:lang w:eastAsia="zh-CN"/>
-        </w:rPr>
-        <w:t xml:space="preserve">20 </w:t>
-      </w:r>
-      <w:r>
-        <w:t>Adapted). The between-series performance variance exceeded within-fold variation, demonstrating that narrative complexity and therapeutic vocabulary differences contribute more variation than stochastic model initialization.</w:t>
+        <w:t>We applied a repeated Leave-One-Drug-Event-Pair-Out cross-validation protocol on the FAERS corpus to evaluate model generalization across distinct therapeutic contexts on all 17 clinical concept categories. For each of the 4 curated drug-event cohorts, the model was trained on the remaining 3 case series and evaluated on the held-out series. As shown in Table 5, strict exact-match F1 was 0.6002 ± 0.0113 for azacitidine–QT prolongation (N = 200), 0.6367 ± 0.0201 for baricitinib–hypersensitivity (N = 200), 0.5289 ± 0.0093 for tramadol–hypoglycemia (N = 229), and 0.5084 ± 0.0122 for erenumab–stroke (N = 200), yielding an aggregated micro-average F1 of 0.5564 ± 0.0069 across the full corpus (0.7420 ± 0.0061 Adapted ADE F1). The between-series performance variance exceeded within-fold variation, demonstrating that narrative complexity and therapeutic vocabulary differences contribute more variation than stochastic model initialization.</w:t>
       </w:r>
     </w:p>
     <w:p>
@@ -11341,17 +11256,7 @@
             <w:vAlign w:val="center"/>
           </w:tcPr>
           <w:p>
-            <w:pPr>
-              <w:spacing w:before="30" w:after="30"/>
-              <w:jc w:val="right"/>
-            </w:pPr>
-            <w:r>
-              <w:rPr>
-                <w:rFonts w:ascii="Arial" w:hAnsi="Arial"/>
-                <w:b/>
-                <w:color w:val="222222"/>
-                <w:sz w:val="16"/>
-              </w:rPr>
+            <w:r>
               <w:t>Azacitidine – QT Prolongation</w:t>
             </w:r>
           </w:p>
@@ -11369,16 +11274,7 @@
             <w:vAlign w:val="center"/>
           </w:tcPr>
           <w:p>
-            <w:pPr>
-              <w:spacing w:before="30" w:after="30"/>
-              <w:jc w:val="center"/>
-            </w:pPr>
-            <w:r>
-              <w:rPr>
-                <w:rFonts w:ascii="Arial" w:hAnsi="Arial"/>
-                <w:color w:val="222222"/>
-                <w:sz w:val="16"/>
-              </w:rPr>
+            <w:r>
               <w:t>200</w:t>
             </w:r>
           </w:p>
@@ -11396,17 +11292,8 @@
             <w:vAlign w:val="center"/>
           </w:tcPr>
           <w:p>
-            <w:pPr>
-              <w:spacing w:before="30" w:after="30"/>
-              <w:jc w:val="center"/>
-            </w:pPr>
-            <w:r>
-              <w:rPr>
-                <w:rFonts w:ascii="Arial" w:hAnsi="Arial"/>
-                <w:color w:val="222222"/>
-                <w:sz w:val="16"/>
-              </w:rPr>
-              <w:t>0.6002 ± 0.0114</w:t>
+            <w:r>
+              <w:t>0.6002 ± 0.0113</w:t>
             </w:r>
           </w:p>
         </w:tc>
@@ -11423,16 +11310,7 @@
             <w:vAlign w:val="center"/>
           </w:tcPr>
           <w:p>
-            <w:pPr>
-              <w:spacing w:before="30" w:after="30"/>
-              <w:jc w:val="center"/>
-            </w:pPr>
-            <w:r>
-              <w:rPr>
-                <w:rFonts w:ascii="Arial" w:hAnsi="Arial"/>
-                <w:color w:val="222222"/>
-                <w:sz w:val="16"/>
-              </w:rPr>
+            <w:r>
               <w:t>0.7733 ± 0.0092</w:t>
             </w:r>
           </w:p>
@@ -11455,17 +11333,7 @@
             <w:vAlign w:val="center"/>
           </w:tcPr>
           <w:p>
-            <w:pPr>
-              <w:spacing w:before="30" w:after="30"/>
-              <w:jc w:val="right"/>
-            </w:pPr>
-            <w:r>
-              <w:rPr>
-                <w:rFonts w:ascii="Arial" w:hAnsi="Arial"/>
-                <w:b/>
-                <w:color w:val="222222"/>
-                <w:sz w:val="16"/>
-              </w:rPr>
+            <w:r>
               <w:t>Baricitinib – Hypersensitivity</w:t>
             </w:r>
           </w:p>
@@ -11483,16 +11351,7 @@
             <w:vAlign w:val="center"/>
           </w:tcPr>
           <w:p>
-            <w:pPr>
-              <w:spacing w:before="30" w:after="30"/>
-              <w:jc w:val="center"/>
-            </w:pPr>
-            <w:r>
-              <w:rPr>
-                <w:rFonts w:ascii="Arial" w:hAnsi="Arial"/>
-                <w:color w:val="222222"/>
-                <w:sz w:val="16"/>
-              </w:rPr>
+            <w:r>
               <w:t>200</w:t>
             </w:r>
           </w:p>
@@ -11510,16 +11369,7 @@
             <w:vAlign w:val="center"/>
           </w:tcPr>
           <w:p>
-            <w:pPr>
-              <w:spacing w:before="30" w:after="30"/>
-              <w:jc w:val="center"/>
-            </w:pPr>
-            <w:r>
-              <w:rPr>
-                <w:rFonts w:ascii="Arial" w:hAnsi="Arial"/>
-                <w:color w:val="222222"/>
-                <w:sz w:val="16"/>
-              </w:rPr>
+            <w:r>
               <w:t>0.6367 ± 0.0201</w:t>
             </w:r>
           </w:p>
@@ -11537,16 +11387,7 @@
             <w:vAlign w:val="center"/>
           </w:tcPr>
           <w:p>
-            <w:pPr>
-              <w:spacing w:before="30" w:after="30"/>
-              <w:jc w:val="center"/>
-            </w:pPr>
-            <w:r>
-              <w:rPr>
-                <w:rFonts w:ascii="Arial" w:hAnsi="Arial"/>
-                <w:color w:val="222222"/>
-                <w:sz w:val="16"/>
-              </w:rPr>
+            <w:r>
               <w:t>0.7751 ± 0.0128</w:t>
             </w:r>
           </w:p>
@@ -11569,17 +11410,7 @@
             <w:vAlign w:val="center"/>
           </w:tcPr>
           <w:p>
-            <w:pPr>
-              <w:spacing w:before="30" w:after="30"/>
-              <w:jc w:val="right"/>
-            </w:pPr>
-            <w:r>
-              <w:rPr>
-                <w:rFonts w:ascii="Arial" w:hAnsi="Arial"/>
-                <w:b/>
-                <w:color w:val="222222"/>
-                <w:sz w:val="16"/>
-              </w:rPr>
+            <w:r>
               <w:t>Tramadol – Hypoglycemia</w:t>
             </w:r>
           </w:p>
@@ -11597,16 +11428,7 @@
             <w:vAlign w:val="center"/>
           </w:tcPr>
           <w:p>
-            <w:pPr>
-              <w:spacing w:before="30" w:after="30"/>
-              <w:jc w:val="center"/>
-            </w:pPr>
-            <w:r>
-              <w:rPr>
-                <w:rFonts w:ascii="Arial" w:hAnsi="Arial"/>
-                <w:color w:val="222222"/>
-                <w:sz w:val="16"/>
-              </w:rPr>
+            <w:r>
               <w:t>229</w:t>
             </w:r>
           </w:p>
@@ -11624,16 +11446,7 @@
             <w:vAlign w:val="center"/>
           </w:tcPr>
           <w:p>
-            <w:pPr>
-              <w:spacing w:before="30" w:after="30"/>
-              <w:jc w:val="center"/>
-            </w:pPr>
-            <w:r>
-              <w:rPr>
-                <w:rFonts w:ascii="Arial" w:hAnsi="Arial"/>
-                <w:color w:val="222222"/>
-                <w:sz w:val="16"/>
-              </w:rPr>
+            <w:r>
               <w:t>0.5289 ± 0.0093</w:t>
             </w:r>
           </w:p>
@@ -11651,16 +11464,7 @@
             <w:vAlign w:val="center"/>
           </w:tcPr>
           <w:p>
-            <w:pPr>
-              <w:spacing w:before="30" w:after="30"/>
-              <w:jc w:val="center"/>
-            </w:pPr>
-            <w:r>
-              <w:rPr>
-                <w:rFonts w:ascii="Arial" w:hAnsi="Arial"/>
-                <w:color w:val="222222"/>
-                <w:sz w:val="16"/>
-              </w:rPr>
+            <w:r>
               <w:t>0.7242 ± 0.0036</w:t>
             </w:r>
           </w:p>
@@ -11683,17 +11487,7 @@
             <w:vAlign w:val="center"/>
           </w:tcPr>
           <w:p>
-            <w:pPr>
-              <w:spacing w:before="30" w:after="30"/>
-              <w:jc w:val="right"/>
-            </w:pPr>
-            <w:r>
-              <w:rPr>
-                <w:rFonts w:ascii="Arial" w:hAnsi="Arial"/>
-                <w:b/>
-                <w:color w:val="222222"/>
-                <w:sz w:val="16"/>
-              </w:rPr>
+            <w:r>
               <w:t>Erenumab – Stroke</w:t>
             </w:r>
           </w:p>
@@ -11711,16 +11505,7 @@
             <w:vAlign w:val="center"/>
           </w:tcPr>
           <w:p>
-            <w:pPr>
-              <w:spacing w:before="30" w:after="30"/>
-              <w:jc w:val="center"/>
-            </w:pPr>
-            <w:r>
-              <w:rPr>
-                <w:rFonts w:ascii="Arial" w:hAnsi="Arial"/>
-                <w:color w:val="222222"/>
-                <w:sz w:val="16"/>
-              </w:rPr>
+            <w:r>
               <w:t>200</w:t>
             </w:r>
           </w:p>
@@ -11738,16 +11523,7 @@
             <w:vAlign w:val="center"/>
           </w:tcPr>
           <w:p>
-            <w:pPr>
-              <w:spacing w:before="30" w:after="30"/>
-              <w:jc w:val="center"/>
-            </w:pPr>
-            <w:r>
-              <w:rPr>
-                <w:rFonts w:ascii="Arial" w:hAnsi="Arial"/>
-                <w:color w:val="222222"/>
-                <w:sz w:val="16"/>
-              </w:rPr>
+            <w:r>
               <w:t>0.5084 ± 0.0122</w:t>
             </w:r>
           </w:p>
@@ -11765,16 +11541,7 @@
             <w:vAlign w:val="center"/>
           </w:tcPr>
           <w:p>
-            <w:pPr>
-              <w:spacing w:before="30" w:after="30"/>
-              <w:jc w:val="center"/>
-            </w:pPr>
-            <w:r>
-              <w:rPr>
-                <w:rFonts w:ascii="Arial" w:hAnsi="Arial"/>
-                <w:color w:val="222222"/>
-                <w:sz w:val="16"/>
-              </w:rPr>
+            <w:r>
               <w:t>0.7126 ± 0.0077</w:t>
             </w:r>
           </w:p>
@@ -11797,21 +11564,8 @@
             <w:vAlign w:val="center"/>
           </w:tcPr>
           <w:p>
-            <w:pPr>
-              <w:spacing w:before="30" w:after="30"/>
-              <w:jc w:val="right"/>
-              <w:rPr>
-                <w:b/>
-              </w:rPr>
-            </w:pPr>
-            <w:r>
-              <w:rPr>
-                <w:rFonts w:ascii="Arial" w:hAnsi="Arial"/>
-                <w:b/>
-                <w:color w:val="222222"/>
-                <w:sz w:val="16"/>
-              </w:rPr>
-              <w:t>Total</w:t>
+            <w:r>
+              <w:t>Total (Micro-Average)</w:t>
             </w:r>
           </w:p>
         </w:tc>
@@ -11828,21 +11582,8 @@
             <w:vAlign w:val="center"/>
           </w:tcPr>
           <w:p>
-            <w:pPr>
-              <w:spacing w:before="30" w:after="30"/>
-              <w:jc w:val="center"/>
-              <w:rPr>
-                <w:b/>
-              </w:rPr>
-            </w:pPr>
-            <w:r>
-              <w:rPr>
-                <w:rFonts w:ascii="Arial" w:hAnsi="Arial"/>
-                <w:b/>
-                <w:color w:val="222222"/>
-                <w:sz w:val="16"/>
-              </w:rPr>
-              <w:t xml:space="preserve">829 </w:t>
+            <w:r>
+              <w:t>829</w:t>
             </w:r>
           </w:p>
         </w:tc>
@@ -11859,18 +11600,7 @@
             <w:vAlign w:val="center"/>
           </w:tcPr>
           <w:p>
-            <w:pPr>
-              <w:spacing w:before="30" w:after="30"/>
-              <w:jc w:val="center"/>
-            </w:pPr>
-            <w:r>
-              <w:rPr>
-                <w:rFonts w:ascii="Arial" w:hAnsi="Arial"/>
-                <w:b/>
-                <w:bCs/>
-                <w:color w:val="222222"/>
-                <w:sz w:val="16"/>
-              </w:rPr>
+            <w:r>
               <w:t>0.5564 ± 0.0069</w:t>
             </w:r>
           </w:p>
@@ -11888,57 +11618,8 @@
             <w:vAlign w:val="center"/>
           </w:tcPr>
           <w:p>
-            <w:pPr>
-              <w:spacing w:before="30" w:after="30"/>
-              <w:jc w:val="center"/>
-              <w:rPr>
-                <w:rFonts w:hint="eastAsia"/>
-                <w:b/>
-                <w:bCs/>
-                <w:lang w:eastAsia="zh-CN"/>
-              </w:rPr>
-            </w:pPr>
-            <w:r>
-              <w:rPr>
-                <w:rFonts w:ascii="Arial" w:hAnsi="Arial"/>
-                <w:b/>
-                <w:bCs/>
-                <w:color w:val="222222"/>
-                <w:sz w:val="16"/>
-              </w:rPr>
-              <w:t>0.74</w:t>
-            </w:r>
-            <w:r>
-              <w:rPr>
-                <w:rFonts w:ascii="Arial" w:hAnsi="Arial" w:hint="eastAsia"/>
-                <w:b/>
-                <w:bCs/>
-                <w:color w:val="222222"/>
-                <w:sz w:val="16"/>
-                <w:lang w:eastAsia="zh-CN"/>
-              </w:rPr>
-              <w:t>20</w:t>
-            </w:r>
-            <w:r>
-              <w:rPr>
-                <w:rFonts w:ascii="Arial" w:hAnsi="Arial"/>
-                <w:b/>
-                <w:bCs/>
-                <w:color w:val="222222"/>
-                <w:sz w:val="16"/>
-              </w:rPr>
-              <w:t xml:space="preserve"> ± 0.00</w:t>
-            </w:r>
-            <w:r>
-              <w:rPr>
-                <w:rFonts w:ascii="Arial" w:hAnsi="Arial" w:hint="eastAsia"/>
-                <w:b/>
-                <w:bCs/>
-                <w:color w:val="222222"/>
-                <w:sz w:val="16"/>
-                <w:lang w:eastAsia="zh-CN"/>
-              </w:rPr>
-              <w:t>61</w:t>
+            <w:r>
+              <w:t>0.7420 ± 0.0061</w:t>
             </w:r>
           </w:p>
         </w:tc>
@@ -11958,29 +11639,7 @@
     </w:p>
     <w:p>
       <w:r>
-        <w:t xml:space="preserve">To rigorously verify neural network optimization stability, we conducted 5 independent training runs using random initialization seeds (42, 123, 456, 789, 1011) across both FAERS and VAERS. As summarized in </w:t>
-      </w:r>
-      <w:r>
-        <w:rPr>
-          <w:b/>
-          <w:bCs/>
-        </w:rPr>
-        <w:t>Table 6</w:t>
-      </w:r>
-      <w:r>
-        <w:t>, cross-</w:t>
-      </w:r>
-      <w:r>
-        <w:t>runs</w:t>
-      </w:r>
-      <w:r>
-        <w:t xml:space="preserve"> variance was exceptionally low across both datasets. On FAERS, strict F1 averaged 0.5685 ± 0.0080 (0.7463 ± 0.0076 Adapted) across the 5 seeds. On VAERS, strict F1 averaged 0.7009 ± 0.0016 (0.8397 ± 0.0018 Adapted) across the 5 seeds. These findings confirm that </w:t>
-      </w:r>
-      <w:r>
-        <w:t>BERT</w:t>
-      </w:r>
-      <w:r>
-        <w:t xml:space="preserve"> convergence is robust to weight initialization.</w:t>
+        <w:t>To rigorously verify neural network optimization stability, we conducted 5 independent training runs using random initialization seeds (42, 123, 456, 789, 1011) across both FAERS and VAERS. As summarized in Table 6, cross-runs variance was exceptionally low across both datasets. On FAERS, strict F1 averaged 0.5564 ± 0.0069 (0.7420 ± 0.0061 Adapted) across the 5 seeds. On VAERS, strict F1 averaged 0.7009 ± 0.0016 (0.8397 ± 0.0018 Adapted) across the 5 seeds. These findings confirm that BERT convergence is robust to weight initialization.</w:t>
       </w:r>
     </w:p>
     <w:p/>
@@ -12247,16 +11906,7 @@
             <w:vAlign w:val="center"/>
           </w:tcPr>
           <w:p>
-            <w:pPr>
-              <w:spacing w:before="30" w:after="30"/>
-              <w:jc w:val="center"/>
-            </w:pPr>
-            <w:r>
-              <w:rPr>
-                <w:rFonts w:ascii="Arial" w:hAnsi="Arial"/>
-                <w:color w:val="222222"/>
-                <w:sz w:val="16"/>
-              </w:rPr>
+            <w:r>
               <w:t>Seed 42</w:t>
             </w:r>
           </w:p>
@@ -12274,17 +11924,8 @@
             <w:vAlign w:val="center"/>
           </w:tcPr>
           <w:p>
-            <w:pPr>
-              <w:spacing w:before="30" w:after="30"/>
-              <w:jc w:val="center"/>
-            </w:pPr>
-            <w:r>
-              <w:rPr>
-                <w:rFonts w:ascii="Arial" w:hAnsi="Arial"/>
-                <w:color w:val="222222"/>
-                <w:sz w:val="16"/>
-              </w:rPr>
-              <w:t>0.5582 ± 0.0649</w:t>
+            <w:r>
+              <w:t>0.5470</w:t>
             </w:r>
           </w:p>
         </w:tc>
@@ -12301,17 +11942,8 @@
             <w:vAlign w:val="center"/>
           </w:tcPr>
           <w:p>
-            <w:pPr>
-              <w:spacing w:before="30" w:after="30"/>
-              <w:jc w:val="center"/>
-            </w:pPr>
-            <w:r>
-              <w:rPr>
-                <w:rFonts w:ascii="Arial" w:hAnsi="Arial"/>
-                <w:color w:val="222222"/>
-                <w:sz w:val="16"/>
-              </w:rPr>
-              <w:t>0.7431 ± 0.0295</w:t>
+            <w:r>
+              <w:t>0.7402</w:t>
             </w:r>
           </w:p>
         </w:tc>
@@ -12365,16 +11997,7 @@
             <w:vAlign w:val="center"/>
           </w:tcPr>
           <w:p>
-            <w:pPr>
-              <w:spacing w:before="30" w:after="30"/>
-              <w:jc w:val="center"/>
-            </w:pPr>
-            <w:r>
-              <w:rPr>
-                <w:rFonts w:ascii="Arial" w:hAnsi="Arial"/>
-                <w:color w:val="222222"/>
-                <w:sz w:val="16"/>
-              </w:rPr>
+            <w:r>
               <w:t>Seed 123</w:t>
             </w:r>
           </w:p>
@@ -12392,17 +12015,8 @@
             <w:vAlign w:val="center"/>
           </w:tcPr>
           <w:p>
-            <w:pPr>
-              <w:spacing w:before="30" w:after="30"/>
-              <w:jc w:val="center"/>
-            </w:pPr>
-            <w:r>
-              <w:rPr>
-                <w:rFonts w:ascii="Arial" w:hAnsi="Arial"/>
-                <w:color w:val="222222"/>
-                <w:sz w:val="16"/>
-              </w:rPr>
-              <w:t>0.5652 ± 0.0509</w:t>
+            <w:r>
+              <w:t>0.5524</w:t>
             </w:r>
           </w:p>
         </w:tc>
@@ -12419,17 +12033,8 @@
             <w:vAlign w:val="center"/>
           </w:tcPr>
           <w:p>
-            <w:pPr>
-              <w:spacing w:before="30" w:after="30"/>
-              <w:jc w:val="center"/>
-            </w:pPr>
-            <w:r>
-              <w:rPr>
-                <w:rFonts w:ascii="Arial" w:hAnsi="Arial"/>
-                <w:color w:val="222222"/>
-                <w:sz w:val="16"/>
-              </w:rPr>
-              <w:t>0.7402 ± 0.0293</w:t>
+            <w:r>
+              <w:t>0.7369</w:t>
             </w:r>
           </w:p>
         </w:tc>
@@ -12482,16 +12087,7 @@
             <w:vAlign w:val="center"/>
           </w:tcPr>
           <w:p>
-            <w:pPr>
-              <w:spacing w:before="30" w:after="30"/>
-              <w:jc w:val="center"/>
-            </w:pPr>
-            <w:r>
-              <w:rPr>
-                <w:rFonts w:ascii="Arial" w:hAnsi="Arial"/>
-                <w:color w:val="222222"/>
-                <w:sz w:val="16"/>
-              </w:rPr>
+            <w:r>
               <w:t>Seed 456</w:t>
             </w:r>
           </w:p>
@@ -12509,17 +12105,8 @@
             <w:vAlign w:val="center"/>
           </w:tcPr>
           <w:p>
-            <w:pPr>
-              <w:spacing w:before="30" w:after="30"/>
-              <w:jc w:val="center"/>
-            </w:pPr>
-            <w:r>
-              <w:rPr>
-                <w:rFonts w:ascii="Arial" w:hAnsi="Arial"/>
-                <w:color w:val="222222"/>
-                <w:sz w:val="16"/>
-              </w:rPr>
-              <w:t>0.5783 ± 0.0697</w:t>
+            <w:r>
+              <w:t>0.5636</w:t>
             </w:r>
           </w:p>
         </w:tc>
@@ -12536,17 +12123,8 @@
             <w:vAlign w:val="center"/>
           </w:tcPr>
           <w:p>
-            <w:pPr>
-              <w:spacing w:before="30" w:after="30"/>
-              <w:jc w:val="center"/>
-            </w:pPr>
-            <w:r>
-              <w:rPr>
-                <w:rFonts w:ascii="Arial" w:hAnsi="Arial"/>
-                <w:color w:val="222222"/>
-                <w:sz w:val="16"/>
-              </w:rPr>
-              <w:t>0.7586 ± 0.0355</w:t>
+            <w:r>
+              <w:t>0.7523</w:t>
             </w:r>
           </w:p>
         </w:tc>
@@ -12599,16 +12177,7 @@
             <w:vAlign w:val="center"/>
           </w:tcPr>
           <w:p>
-            <w:pPr>
-              <w:spacing w:before="30" w:after="30"/>
-              <w:jc w:val="center"/>
-            </w:pPr>
-            <w:r>
-              <w:rPr>
-                <w:rFonts w:ascii="Arial" w:hAnsi="Arial"/>
-                <w:color w:val="222222"/>
-                <w:sz w:val="16"/>
-              </w:rPr>
+            <w:r>
               <w:t>Seed 789</w:t>
             </w:r>
           </w:p>
@@ -12626,17 +12195,8 @@
             <w:vAlign w:val="center"/>
           </w:tcPr>
           <w:p>
-            <w:pPr>
-              <w:spacing w:before="30" w:after="30"/>
-              <w:jc w:val="center"/>
-            </w:pPr>
-            <w:r>
-              <w:rPr>
-                <w:rFonts w:ascii="Arial" w:hAnsi="Arial"/>
-                <w:color w:val="222222"/>
-                <w:sz w:val="16"/>
-              </w:rPr>
-              <w:t>0.5662 ± 0.0476</w:t>
+            <w:r>
+              <w:t>0.5571</w:t>
             </w:r>
           </w:p>
         </w:tc>
@@ -12653,17 +12213,8 @@
             <w:vAlign w:val="center"/>
           </w:tcPr>
           <w:p>
-            <w:pPr>
-              <w:spacing w:before="30" w:after="30"/>
-              <w:jc w:val="center"/>
-            </w:pPr>
-            <w:r>
-              <w:rPr>
-                <w:rFonts w:ascii="Arial" w:hAnsi="Arial"/>
-                <w:color w:val="222222"/>
-                <w:sz w:val="16"/>
-              </w:rPr>
-              <w:t>0.7413 ± 0.0324</w:t>
+            <w:r>
+              <w:t>0.7386</w:t>
             </w:r>
           </w:p>
         </w:tc>
@@ -12716,16 +12267,7 @@
             <w:vAlign w:val="center"/>
           </w:tcPr>
           <w:p>
-            <w:pPr>
-              <w:spacing w:before="30" w:after="30"/>
-              <w:jc w:val="center"/>
-            </w:pPr>
-            <w:r>
-              <w:rPr>
-                <w:rFonts w:ascii="Arial" w:hAnsi="Arial"/>
-                <w:color w:val="222222"/>
-                <w:sz w:val="16"/>
-              </w:rPr>
+            <w:r>
               <w:t>Seed 1011</w:t>
             </w:r>
           </w:p>
@@ -12743,17 +12285,8 @@
             <w:vAlign w:val="center"/>
           </w:tcPr>
           <w:p>
-            <w:pPr>
-              <w:spacing w:before="30" w:after="30"/>
-              <w:jc w:val="center"/>
-            </w:pPr>
-            <w:r>
-              <w:rPr>
-                <w:rFonts w:ascii="Arial" w:hAnsi="Arial"/>
-                <w:color w:val="222222"/>
-                <w:sz w:val="16"/>
-              </w:rPr>
-              <w:t>0.5748 ± 0.0694</w:t>
+            <w:r>
+              <w:t>0.5620</w:t>
             </w:r>
           </w:p>
         </w:tc>
@@ -12770,17 +12303,8 @@
             <w:vAlign w:val="center"/>
           </w:tcPr>
           <w:p>
-            <w:pPr>
-              <w:spacing w:before="30" w:after="30"/>
-              <w:jc w:val="center"/>
-            </w:pPr>
-            <w:r>
-              <w:rPr>
-                <w:rFonts w:ascii="Arial" w:hAnsi="Arial"/>
-                <w:color w:val="222222"/>
-                <w:sz w:val="16"/>
-              </w:rPr>
-              <w:t>0.7484 ± 0.0371</w:t>
+            <w:r>
+              <w:t>0.7422</w:t>
             </w:r>
           </w:p>
         </w:tc>
@@ -12799,21 +12323,8 @@
             <w:vAlign w:val="center"/>
           </w:tcPr>
           <w:p>
-            <w:pPr>
-              <w:spacing w:before="30" w:after="30"/>
-              <w:jc w:val="right"/>
-              <w:rPr>
-                <w:b/>
-              </w:rPr>
-            </w:pPr>
-            <w:r>
-              <w:rPr>
-                <w:rFonts w:ascii="Arial" w:hAnsi="Arial"/>
-                <w:b/>
-                <w:color w:val="222222"/>
-                <w:sz w:val="16"/>
-              </w:rPr>
-              <w:t xml:space="preserve">FAERS </w:t>
+            <w:r>
+              <w:t>FAERS</w:t>
             </w:r>
           </w:p>
         </w:tc>
@@ -12830,23 +12341,7 @@
             <w:vAlign w:val="center"/>
           </w:tcPr>
           <w:p>
-            <w:pPr>
-              <w:spacing w:before="30" w:after="30"/>
-              <w:jc w:val="center"/>
-              <w:rPr>
-                <w:rFonts w:hint="eastAsia"/>
-                <w:b/>
-                <w:lang w:eastAsia="zh-CN"/>
-              </w:rPr>
-            </w:pPr>
-            <w:r>
-              <w:rPr>
-                <w:rFonts w:ascii="Arial" w:hAnsi="Arial" w:hint="eastAsia"/>
-                <w:b/>
-                <w:color w:val="222222"/>
-                <w:sz w:val="16"/>
-                <w:lang w:eastAsia="zh-CN"/>
-              </w:rPr>
+            <w:r>
               <w:t>Average</w:t>
             </w:r>
           </w:p>
@@ -12864,21 +12359,8 @@
             <w:vAlign w:val="center"/>
           </w:tcPr>
           <w:p>
-            <w:pPr>
-              <w:spacing w:before="30" w:after="30"/>
-              <w:jc w:val="center"/>
-              <w:rPr>
-                <w:b/>
-              </w:rPr>
-            </w:pPr>
-            <w:r>
-              <w:rPr>
-                <w:rFonts w:ascii="Arial" w:hAnsi="Arial"/>
-                <w:b/>
-                <w:color w:val="222222"/>
-                <w:sz w:val="16"/>
-              </w:rPr>
-              <w:t>0.5685 ± 0.0080</w:t>
+            <w:r>
+              <w:t>0.5564 ± 0.0069</w:t>
             </w:r>
           </w:p>
         </w:tc>
@@ -12895,21 +12377,8 @@
             <w:vAlign w:val="center"/>
           </w:tcPr>
           <w:p>
-            <w:pPr>
-              <w:spacing w:before="30" w:after="30"/>
-              <w:jc w:val="center"/>
-              <w:rPr>
-                <w:b/>
-              </w:rPr>
-            </w:pPr>
-            <w:r>
-              <w:rPr>
-                <w:rFonts w:ascii="Arial" w:hAnsi="Arial"/>
-                <w:b/>
-                <w:color w:val="222222"/>
-                <w:sz w:val="16"/>
-              </w:rPr>
-              <w:t>0.7463 ± 0.0076</w:t>
+            <w:r>
+              <w:t>0.7420 ± 0.0061</w:t>
             </w:r>
           </w:p>
         </w:tc>
@@ -12975,16 +12444,7 @@
             <w:vAlign w:val="center"/>
           </w:tcPr>
           <w:p>
-            <w:pPr>
-              <w:spacing w:before="30" w:after="30"/>
-              <w:jc w:val="center"/>
-            </w:pPr>
-            <w:r>
-              <w:rPr>
-                <w:rFonts w:ascii="Arial" w:hAnsi="Arial"/>
-                <w:color w:val="222222"/>
-                <w:sz w:val="16"/>
-              </w:rPr>
+            <w:r>
               <w:t>Seed 42</w:t>
             </w:r>
           </w:p>
@@ -13002,16 +12462,7 @@
             <w:vAlign w:val="center"/>
           </w:tcPr>
           <w:p>
-            <w:pPr>
-              <w:spacing w:before="30" w:after="30"/>
-              <w:jc w:val="center"/>
-            </w:pPr>
-            <w:r>
-              <w:rPr>
-                <w:rFonts w:ascii="Arial" w:hAnsi="Arial"/>
-                <w:color w:val="222222"/>
-                <w:sz w:val="16"/>
-              </w:rPr>
+            <w:r>
               <w:t>0.7015 ± 0.0174</w:t>
             </w:r>
           </w:p>
@@ -13029,16 +12480,7 @@
             <w:vAlign w:val="center"/>
           </w:tcPr>
           <w:p>
-            <w:pPr>
-              <w:spacing w:before="30" w:after="30"/>
-              <w:jc w:val="center"/>
-            </w:pPr>
-            <w:r>
-              <w:rPr>
-                <w:rFonts w:ascii="Arial" w:hAnsi="Arial"/>
-                <w:color w:val="222222"/>
-                <w:sz w:val="16"/>
-              </w:rPr>
+            <w:r>
               <w:t>0.8370 ± 0.0095</w:t>
             </w:r>
           </w:p>
@@ -13090,16 +12532,7 @@
             <w:vAlign w:val="center"/>
           </w:tcPr>
           <w:p>
-            <w:pPr>
-              <w:spacing w:before="30" w:after="30"/>
-              <w:jc w:val="center"/>
-            </w:pPr>
-            <w:r>
-              <w:rPr>
-                <w:rFonts w:ascii="Arial" w:hAnsi="Arial"/>
-                <w:color w:val="222222"/>
-                <w:sz w:val="16"/>
-              </w:rPr>
+            <w:r>
               <w:t>Seed 123</w:t>
             </w:r>
           </w:p>
@@ -13117,16 +12550,7 @@
             <w:vAlign w:val="center"/>
           </w:tcPr>
           <w:p>
-            <w:pPr>
-              <w:spacing w:before="30" w:after="30"/>
-              <w:jc w:val="center"/>
-            </w:pPr>
-            <w:r>
-              <w:rPr>
-                <w:rFonts w:ascii="Arial" w:hAnsi="Arial"/>
-                <w:color w:val="222222"/>
-                <w:sz w:val="16"/>
-              </w:rPr>
+            <w:r>
               <w:t>0.7013 ± 0.0156</w:t>
             </w:r>
           </w:p>
@@ -13144,16 +12568,7 @@
             <w:vAlign w:val="center"/>
           </w:tcPr>
           <w:p>
-            <w:pPr>
-              <w:spacing w:before="30" w:after="30"/>
-              <w:jc w:val="center"/>
-            </w:pPr>
-            <w:r>
-              <w:rPr>
-                <w:rFonts w:ascii="Arial" w:hAnsi="Arial"/>
-                <w:color w:val="222222"/>
-                <w:sz w:val="16"/>
-              </w:rPr>
+            <w:r>
               <w:t>0.8405 ± 0.0070</w:t>
             </w:r>
           </w:p>
@@ -13205,16 +12620,7 @@
             <w:vAlign w:val="center"/>
           </w:tcPr>
           <w:p>
-            <w:pPr>
-              <w:spacing w:before="30" w:after="30"/>
-              <w:jc w:val="center"/>
-            </w:pPr>
-            <w:r>
-              <w:rPr>
-                <w:rFonts w:ascii="Arial" w:hAnsi="Arial"/>
-                <w:color w:val="222222"/>
-                <w:sz w:val="16"/>
-              </w:rPr>
+            <w:r>
               <w:t>Seed 456</w:t>
             </w:r>
           </w:p>
@@ -13232,16 +12638,7 @@
             <w:vAlign w:val="center"/>
           </w:tcPr>
           <w:p>
-            <w:pPr>
-              <w:spacing w:before="30" w:after="30"/>
-              <w:jc w:val="center"/>
-            </w:pPr>
-            <w:r>
-              <w:rPr>
-                <w:rFonts w:ascii="Arial" w:hAnsi="Arial"/>
-                <w:color w:val="222222"/>
-                <w:sz w:val="16"/>
-              </w:rPr>
+            <w:r>
               <w:t>0.7008 ± 0.0202</w:t>
             </w:r>
           </w:p>
@@ -13259,16 +12656,7 @@
             <w:vAlign w:val="center"/>
           </w:tcPr>
           <w:p>
-            <w:pPr>
-              <w:spacing w:before="30" w:after="30"/>
-              <w:jc w:val="center"/>
-            </w:pPr>
-            <w:r>
-              <w:rPr>
-                <w:rFonts w:ascii="Arial" w:hAnsi="Arial"/>
-                <w:color w:val="222222"/>
-                <w:sz w:val="16"/>
-              </w:rPr>
+            <w:r>
               <w:t>0.8400 ± 0.0113</w:t>
             </w:r>
           </w:p>
@@ -13320,16 +12708,7 @@
             <w:vAlign w:val="center"/>
           </w:tcPr>
           <w:p>
-            <w:pPr>
-              <w:spacing w:before="30" w:after="30"/>
-              <w:jc w:val="center"/>
-            </w:pPr>
-            <w:r>
-              <w:rPr>
-                <w:rFonts w:ascii="Arial" w:hAnsi="Arial"/>
-                <w:color w:val="222222"/>
-                <w:sz w:val="16"/>
-              </w:rPr>
+            <w:r>
               <w:t>Seed 789</w:t>
             </w:r>
           </w:p>
@@ -13347,16 +12726,7 @@
             <w:vAlign w:val="center"/>
           </w:tcPr>
           <w:p>
-            <w:pPr>
-              <w:spacing w:before="30" w:after="30"/>
-              <w:jc w:val="center"/>
-            </w:pPr>
-            <w:r>
-              <w:rPr>
-                <w:rFonts w:ascii="Arial" w:hAnsi="Arial"/>
-                <w:color w:val="222222"/>
-                <w:sz w:val="16"/>
-              </w:rPr>
+            <w:r>
               <w:t>0.7026 ± 0.0152</w:t>
             </w:r>
           </w:p>
@@ -13374,16 +12744,7 @@
             <w:vAlign w:val="center"/>
           </w:tcPr>
           <w:p>
-            <w:pPr>
-              <w:spacing w:before="30" w:after="30"/>
-              <w:jc w:val="center"/>
-            </w:pPr>
-            <w:r>
-              <w:rPr>
-                <w:rFonts w:ascii="Arial" w:hAnsi="Arial"/>
-                <w:color w:val="222222"/>
-                <w:sz w:val="16"/>
-              </w:rPr>
+            <w:r>
               <w:t>0.8419 ± 0.0082</w:t>
             </w:r>
           </w:p>
@@ -13435,16 +12796,7 @@
             <w:vAlign w:val="center"/>
           </w:tcPr>
           <w:p>
-            <w:pPr>
-              <w:spacing w:before="30" w:after="30"/>
-              <w:jc w:val="center"/>
-            </w:pPr>
-            <w:r>
-              <w:rPr>
-                <w:rFonts w:ascii="Arial" w:hAnsi="Arial"/>
-                <w:color w:val="222222"/>
-                <w:sz w:val="16"/>
-              </w:rPr>
+            <w:r>
               <w:t>Seed 1011</w:t>
             </w:r>
           </w:p>
@@ -13462,16 +12814,7 @@
             <w:vAlign w:val="center"/>
           </w:tcPr>
           <w:p>
-            <w:pPr>
-              <w:spacing w:before="30" w:after="30"/>
-              <w:jc w:val="center"/>
-            </w:pPr>
-            <w:r>
-              <w:rPr>
-                <w:rFonts w:ascii="Arial" w:hAnsi="Arial"/>
-                <w:color w:val="222222"/>
-                <w:sz w:val="16"/>
-              </w:rPr>
+            <w:r>
               <w:t>0.6983 ± 0.0159</w:t>
             </w:r>
           </w:p>
@@ -13489,16 +12832,7 @@
             <w:vAlign w:val="center"/>
           </w:tcPr>
           <w:p>
-            <w:pPr>
-              <w:spacing w:before="30" w:after="30"/>
-              <w:jc w:val="center"/>
-            </w:pPr>
-            <w:r>
-              <w:rPr>
-                <w:rFonts w:ascii="Arial" w:hAnsi="Arial"/>
-                <w:color w:val="222222"/>
-                <w:sz w:val="16"/>
-              </w:rPr>
+            <w:r>
               <w:t>0.8389 ± 0.0091</w:t>
             </w:r>
           </w:p>
@@ -13518,20 +12852,7 @@
             <w:vAlign w:val="center"/>
           </w:tcPr>
           <w:p>
-            <w:pPr>
-              <w:spacing w:before="30" w:after="30"/>
-              <w:jc w:val="right"/>
-              <w:rPr>
-                <w:b/>
-              </w:rPr>
-            </w:pPr>
-            <w:r>
-              <w:rPr>
-                <w:rFonts w:ascii="Arial" w:hAnsi="Arial"/>
-                <w:b/>
-                <w:color w:val="222222"/>
-                <w:sz w:val="16"/>
-              </w:rPr>
+            <w:r>
               <w:t>VAERS</w:t>
             </w:r>
           </w:p>
@@ -13549,21 +12870,7 @@
             <w:vAlign w:val="center"/>
           </w:tcPr>
           <w:p>
-            <w:pPr>
-              <w:spacing w:before="30" w:after="30"/>
-              <w:jc w:val="center"/>
-              <w:rPr>
-                <w:b/>
-              </w:rPr>
-            </w:pPr>
-            <w:r>
-              <w:rPr>
-                <w:rFonts w:ascii="Arial" w:hAnsi="Arial" w:hint="eastAsia"/>
-                <w:b/>
-                <w:color w:val="222222"/>
-                <w:sz w:val="16"/>
-                <w:lang w:eastAsia="zh-CN"/>
-              </w:rPr>
+            <w:r>
               <w:t>Average</w:t>
             </w:r>
           </w:p>
@@ -13581,20 +12888,7 @@
             <w:vAlign w:val="center"/>
           </w:tcPr>
           <w:p>
-            <w:pPr>
-              <w:spacing w:before="30" w:after="30"/>
-              <w:jc w:val="center"/>
-              <w:rPr>
-                <w:b/>
-              </w:rPr>
-            </w:pPr>
-            <w:r>
-              <w:rPr>
-                <w:rFonts w:ascii="Arial" w:hAnsi="Arial"/>
-                <w:b/>
-                <w:color w:val="222222"/>
-                <w:sz w:val="16"/>
-              </w:rPr>
+            <w:r>
               <w:t>0.7009 ± 0.0016</w:t>
             </w:r>
           </w:p>
@@ -13612,20 +12906,7 @@
             <w:vAlign w:val="center"/>
           </w:tcPr>
           <w:p>
-            <w:pPr>
-              <w:spacing w:before="30" w:after="30"/>
-              <w:jc w:val="center"/>
-              <w:rPr>
-                <w:b/>
-              </w:rPr>
-            </w:pPr>
-            <w:r>
-              <w:rPr>
-                <w:rFonts w:ascii="Arial" w:hAnsi="Arial"/>
-                <w:b/>
-                <w:color w:val="222222"/>
-                <w:sz w:val="16"/>
-              </w:rPr>
+            <w:r>
               <w:t>0.8397 ± 0.0018</w:t>
             </w:r>
           </w:p>

</xml_diff>

<commit_message>
docs(manuscript): update paper revisions in LLM4AE_rev1.docx
</commit_message>
<xml_diff>
--- a/publication/manuscripts/LLM4AE_rev1.docx
+++ b/publication/manuscripts/LLM4AE_rev1.docx
@@ -1233,13 +1233,8 @@
         <w:fldChar w:fldCharType="end"/>
       </w:r>
       <w:r>
-        <w:t xml:space="preserve">, </w:t>
-      </w:r>
-      <w:proofErr w:type="spellStart"/>
-      <w:r>
-        <w:t>BioBERT</w:t>
-      </w:r>
-      <w:proofErr w:type="spellEnd"/>
+        <w:t>, BioBERT</w:t>
+      </w:r>
       <w:r>
         <w:fldChar w:fldCharType="begin"/>
       </w:r>
@@ -1259,13 +1254,8 @@
         <w:fldChar w:fldCharType="end"/>
       </w:r>
       <w:r>
-        <w:t xml:space="preserve">, </w:t>
-      </w:r>
-      <w:proofErr w:type="spellStart"/>
-      <w:r>
-        <w:t>ClinicalBERT</w:t>
-      </w:r>
-      <w:proofErr w:type="spellEnd"/>
+        <w:t>, ClinicalBERT</w:t>
+      </w:r>
       <w:r>
         <w:fldChar w:fldCharType="begin"/>
       </w:r>
@@ -3344,15 +3334,9 @@
       <w:r>
         <w:t xml:space="preserve"> using the </w:t>
       </w:r>
-      <w:proofErr w:type="spellStart"/>
-      <w:r>
-        <w:t>SequenceMatcher</w:t>
-      </w:r>
-      <w:proofErr w:type="spellEnd"/>
-      <w:r>
-        <w:t xml:space="preserve"> function from the </w:t>
-      </w:r>
-      <w:proofErr w:type="spellStart"/>
+      <w:r>
+        <w:t xml:space="preserve">SequenceMatcher function from the </w:t>
+      </w:r>
       <w:r>
         <w:rPr>
           <w:i/>
@@ -3360,7 +3344,6 @@
         </w:rPr>
         <w:t>difflib</w:t>
       </w:r>
-      <w:proofErr w:type="spellEnd"/>
       <w:r>
         <w:t xml:space="preserve"> Python library </w:t>
       </w:r>
@@ -3402,7 +3385,6 @@
       <w:r>
         <w:t>did not match pre-defined categories</w:t>
       </w:r>
-      <w:proofErr w:type="gramStart"/>
       <w:r>
         <w:t>)</w:t>
       </w:r>
@@ -3410,11 +3392,7 @@
         <w:t>,</w:t>
       </w:r>
       <w:r>
-        <w:t>using</w:t>
-      </w:r>
-      <w:proofErr w:type="gramEnd"/>
-      <w:r>
-        <w:t xml:space="preserve"> in-text annotation plus back mapping as a strategy helped ensure the original narratives were not altered during the annotation process. Unsuccessful tagging and text alterations have both been observed during preliminary studies, particularly where</w:t>
+        <w:t>using in-text annotation plus back mapping as a strategy helped ensure the original narratives were not altered during the annotation process. Unsuccessful tagging and text alterations have both been observed during preliminary studies, particularly where</w:t>
       </w:r>
       <w:r>
         <w:t xml:space="preserve"> </w:t>
@@ -3600,7 +3578,6 @@
       <w:r>
         <w:t xml:space="preserve"> implemented using the </w:t>
       </w:r>
-      <w:proofErr w:type="spellStart"/>
       <w:r>
         <w:rPr>
           <w:i/>
@@ -3608,7 +3585,6 @@
         </w:rPr>
         <w:t>spaCy</w:t>
       </w:r>
-      <w:proofErr w:type="spellEnd"/>
       <w:r>
         <w:rPr>
           <w:rFonts w:hint="eastAsia"/>
@@ -3723,171 +3699,131 @@
     <w:p>
       <w:pPr>
         <w:rPr>
+          <w:lang w:eastAsia="zh-CN"/>
+        </w:rPr>
+      </w:pPr>
+      <w:r>
+        <w:t>To determine the best base BERT model, w</w:t>
+      </w:r>
+      <w:r>
+        <w:t>e conducted an ablation experiment comparing BERT</w:t>
+      </w:r>
+      <w:r>
+        <w:fldChar w:fldCharType="begin"/>
+      </w:r>
+      <w:r>
+        <w:instrText xml:space="preserve"> ADDIN EN.CITE &lt;EndNote&gt;&lt;Cite&gt;&lt;Author&gt;Devlin&lt;/Author&gt;&lt;Year&gt;2019&lt;/Year&gt;&lt;RecNum&gt;23&lt;/RecNum&gt;&lt;DisplayText&gt;[13]&lt;/DisplayText&gt;&lt;record&gt;&lt;rec-number&gt;23&lt;/rec-number&gt;&lt;foreign-keys&gt;&lt;key app="EN" db-id="2wazf5f082zrfieazeax5tf4wvxz9x59ts99" timestamp="1764084153"&gt;23&lt;/key&gt;&lt;/foreign-keys&gt;&lt;ref-type name="Conference Proceedings"&gt;10&lt;/ref-type&gt;&lt;contributors&gt;&lt;authors&gt;&lt;author&gt;Devlin, Jacob&lt;/author&gt;&lt;author&gt;Chang, Ming-Wei&lt;/author&gt;&lt;author&gt;Lee, Kenton&lt;/author&gt;&lt;author&gt;Toutanova, Kristina&lt;/author&gt;&lt;/authors&gt;&lt;/contributors&gt;&lt;titles&gt;&lt;title&gt;Bert: Pre-training of deep bidirectional transformers for language understanding&lt;/title&gt;&lt;secondary-title&gt;Proceedings of the 2019 conference of the North American chapter of the association for computational linguistics: human language technologies, volume 1 (long and short papers)&lt;/secondary-title&gt;&lt;/titles&gt;&lt;pages&gt;4171-4186&lt;/pages&gt;&lt;dates&gt;&lt;year&gt;2019&lt;/year&gt;&lt;/dates&gt;&lt;urls&gt;&lt;/urls&gt;&lt;/record&gt;&lt;/Cite&gt;&lt;/EndNote&gt;</w:instrText>
+      </w:r>
+      <w:r>
+        <w:fldChar w:fldCharType="separate"/>
+      </w:r>
+      <w:r>
+        <w:rPr>
+          <w:noProof/>
+        </w:rPr>
+        <w:t>[13]</w:t>
+      </w:r>
+      <w:r>
+        <w:fldChar w:fldCharType="end"/>
+      </w:r>
+      <w:r>
+        <w:t>, BioBERT</w:t>
+      </w:r>
+      <w:r>
+        <w:fldChar w:fldCharType="begin"/>
+      </w:r>
+      <w:r>
+        <w:instrText xml:space="preserve"> ADDIN EN.CITE &lt;EndNote&gt;&lt;Cite&gt;&lt;Author&gt;Lee&lt;/Author&gt;&lt;Year&gt;2020&lt;/Year&gt;&lt;RecNum&gt;24&lt;/RecNum&gt;&lt;DisplayText&gt;[14]&lt;/DisplayText&gt;&lt;record&gt;&lt;rec-number&gt;24&lt;/rec-number&gt;&lt;foreign-keys&gt;&lt;key app="EN" db-id="2wazf5f082zrfieazeax5tf4wvxz9x59ts99" timestamp="1764084192"&gt;24&lt;/key&gt;&lt;/foreign-keys&gt;&lt;ref-type name="Journal Article"&gt;17&lt;/ref-type&gt;&lt;contributors&gt;&lt;authors&gt;&lt;author&gt;Lee, Jinhyuk&lt;/author&gt;&lt;author&gt;Yoon, Wonjin&lt;/author&gt;&lt;author&gt;Kim, Sungdong&lt;/author&gt;&lt;author&gt;Kim, Donghyeon&lt;/author&gt;&lt;author&gt;Kim, Sunkyu&lt;/author&gt;&lt;author&gt;So, Chan Ho&lt;/author&gt;&lt;author&gt;Kang, Jaewoo&lt;/author&gt;&lt;/authors&gt;&lt;/contributors&gt;&lt;titles&gt;&lt;title&gt;BioBERT: a pre-trained biomedical language representation model for biomedical text mining&lt;/title&gt;&lt;secondary-title&gt;Bioinformatics&lt;/secondary-title&gt;&lt;/titles&gt;&lt;periodical&gt;&lt;full-title&gt;Bioinformatics&lt;/full-title&gt;&lt;/periodical&gt;&lt;pages&gt;1234-1240&lt;/pages&gt;&lt;volume&gt;36&lt;/volume&gt;&lt;number&gt;4&lt;/number&gt;&lt;dates&gt;&lt;year&gt;2020&lt;/year&gt;&lt;/dates&gt;&lt;isbn&gt;1367-4803&lt;/isbn&gt;&lt;urls&gt;&lt;/urls&gt;&lt;/record&gt;&lt;/Cite&gt;&lt;/EndNote&gt;</w:instrText>
+      </w:r>
+      <w:r>
+        <w:fldChar w:fldCharType="separate"/>
+      </w:r>
+      <w:r>
+        <w:rPr>
+          <w:noProof/>
+        </w:rPr>
+        <w:t>[14]</w:t>
+      </w:r>
+      <w:r>
+        <w:fldChar w:fldCharType="end"/>
+      </w:r>
+      <w:r>
+        <w:t>, ClinicalBERT</w:t>
+      </w:r>
+      <w:r>
+        <w:fldChar w:fldCharType="begin"/>
+      </w:r>
+      <w:r>
+        <w:instrText xml:space="preserve"> ADDIN EN.CITE &lt;EndNote&gt;&lt;Cite&gt;&lt;Author&gt;Huang&lt;/Author&gt;&lt;Year&gt;2019&lt;/Year&gt;&lt;RecNum&gt;25&lt;/RecNum&gt;&lt;DisplayText&gt;[15]&lt;/DisplayText&gt;&lt;record&gt;&lt;rec-number&gt;25&lt;/rec-number&gt;&lt;foreign-keys&gt;&lt;key app="EN" db-id="2wazf5f082zrfieazeax5tf4wvxz9x59ts99" timestamp="1764084225"&gt;25&lt;/key&gt;&lt;/foreign-keys&gt;&lt;ref-type name="Journal Article"&gt;17&lt;/ref-type&gt;&lt;contributors&gt;&lt;authors&gt;&lt;author&gt;Huang, Kexin&lt;/author&gt;&lt;author&gt;Altosaar, Jaan&lt;/author&gt;&lt;author&gt;Ranganath, Rajesh&lt;/author&gt;&lt;/authors&gt;&lt;/contributors&gt;&lt;titles&gt;&lt;title&gt;Clinicalbert: Modeling clinical notes and predicting hospital readmission&lt;/title&gt;&lt;secondary-title&gt;arXiv preprint arXiv:1904.05342&lt;/secondary-title&gt;&lt;/titles&gt;&lt;periodical&gt;&lt;full-title&gt;arXiv preprint arXiv:1904.05342&lt;/full-title&gt;&lt;/periodical&gt;&lt;dates&gt;&lt;year&gt;2019&lt;/year&gt;&lt;/dates&gt;&lt;urls&gt;&lt;/urls&gt;&lt;/record&gt;&lt;/Cite&gt;&lt;/EndNote&gt;</w:instrText>
+      </w:r>
+      <w:r>
+        <w:fldChar w:fldCharType="separate"/>
+      </w:r>
+      <w:r>
+        <w:rPr>
+          <w:noProof/>
+        </w:rPr>
+        <w:t>[15]</w:t>
+      </w:r>
+      <w:r>
+        <w:fldChar w:fldCharType="end"/>
+      </w:r>
+      <w:r>
+        <w:t>, and Bio_ClinicalBERT</w:t>
+      </w:r>
+      <w:r>
+        <w:fldChar w:fldCharType="begin"/>
+      </w:r>
+      <w:r>
+        <w:instrText xml:space="preserve"> ADDIN EN.CITE &lt;EndNote&gt;&lt;Cite&gt;&lt;Author&gt;Lee&lt;/Author&gt;&lt;Year&gt;2025&lt;/Year&gt;&lt;RecNum&gt;26&lt;/RecNum&gt;&lt;DisplayText&gt;[16]&lt;/DisplayText&gt;&lt;record&gt;&lt;rec-number&gt;26&lt;/rec-number&gt;&lt;foreign-keys&gt;&lt;key app="EN" db-id="2wazf5f082zrfieazeax5tf4wvxz9x59ts99" timestamp="1764084329"&gt;26&lt;/key&gt;&lt;/foreign-keys&gt;&lt;ref-type name="Journal Article"&gt;17&lt;/ref-type&gt;&lt;contributors&gt;&lt;authors&gt;&lt;author&gt;Lee, Simon A&lt;/author&gt;&lt;author&gt;Wu, Anthony&lt;/author&gt;&lt;author&gt;Chiang, Jeffrey N&lt;/author&gt;&lt;/authors&gt;&lt;/contributors&gt;&lt;titles&gt;&lt;title&gt;Clinical modernbert: An efficient and long context encoder for biomedical text&lt;/title&gt;&lt;secondary-title&gt;arXiv preprint arXiv:2504.03964&lt;/secondary-title&gt;&lt;/titles&gt;&lt;periodical&gt;&lt;full-title&gt;arXiv preprint arXiv:2504.03964&lt;/full-title&gt;&lt;/periodical&gt;&lt;dates&gt;&lt;year&gt;2025&lt;/year&gt;&lt;/dates&gt;&lt;urls&gt;&lt;/urls&gt;&lt;/record&gt;&lt;/Cite&gt;&lt;/EndNote&gt;</w:instrText>
+      </w:r>
+      <w:r>
+        <w:fldChar w:fldCharType="separate"/>
+      </w:r>
+      <w:r>
+        <w:rPr>
+          <w:noProof/>
+        </w:rPr>
+        <w:t>[16]</w:t>
+      </w:r>
+      <w:r>
+        <w:fldChar w:fldCharType="end"/>
+      </w:r>
+      <w:r>
+        <w:t xml:space="preserve"> using the VAERS data. BioBERT demonstrated superior precision and recall across key biomedical categories and was </w:t>
+      </w:r>
+      <w:r>
+        <w:rPr>
           <w:rFonts w:hint="eastAsia"/>
           <w:lang w:eastAsia="zh-CN"/>
         </w:rPr>
-      </w:pPr>
-      <w:r>
-        <w:t>To determine the best base BERT model, w</w:t>
-      </w:r>
-      <w:r>
-        <w:t>e conducted an ablation experiment comparing BERT</w:t>
-      </w:r>
-      <w:r>
-        <w:fldChar w:fldCharType="begin"/>
-      </w:r>
-      <w:r>
-        <w:instrText xml:space="preserve"> ADDIN EN.CITE &lt;EndNote&gt;&lt;Cite&gt;&lt;Author&gt;Devlin&lt;/Author&gt;&lt;Year&gt;2019&lt;/Year&gt;&lt;RecNum&gt;23&lt;/RecNum&gt;&lt;DisplayText&gt;[13]&lt;/DisplayText&gt;&lt;record&gt;&lt;rec-number&gt;23&lt;/rec-number&gt;&lt;foreign-keys&gt;&lt;key app="EN" db-id="2wazf5f082zrfieazeax5tf4wvxz9x59ts99" timestamp="1764084153"&gt;23&lt;/key&gt;&lt;/foreign-keys&gt;&lt;ref-type name="Conference Proceedings"&gt;10&lt;/ref-type&gt;&lt;contributors&gt;&lt;authors&gt;&lt;author&gt;Devlin, Jacob&lt;/author&gt;&lt;author&gt;Chang, Ming-Wei&lt;/author&gt;&lt;author&gt;Lee, Kenton&lt;/author&gt;&lt;author&gt;Toutanova, Kristina&lt;/author&gt;&lt;/authors&gt;&lt;/contributors&gt;&lt;titles&gt;&lt;title&gt;Bert: Pre-training of deep bidirectional transformers for language understanding&lt;/title&gt;&lt;secondary-title&gt;Proceedings of the 2019 conference of the North American chapter of the association for computational linguistics: human language technologies, volume 1 (long and short papers)&lt;/secondary-title&gt;&lt;/titles&gt;&lt;pages&gt;4171-4186&lt;/pages&gt;&lt;dates&gt;&lt;year&gt;2019&lt;/year&gt;&lt;/dates&gt;&lt;urls&gt;&lt;/urls&gt;&lt;/record&gt;&lt;/Cite&gt;&lt;/EndNote&gt;</w:instrText>
-      </w:r>
-      <w:r>
-        <w:fldChar w:fldCharType="separate"/>
-      </w:r>
-      <w:r>
-        <w:rPr>
-          <w:noProof/>
-        </w:rPr>
-        <w:t>[13]</w:t>
-      </w:r>
-      <w:r>
-        <w:fldChar w:fldCharType="end"/>
-      </w:r>
-      <w:r>
-        <w:t xml:space="preserve">, </w:t>
-      </w:r>
-      <w:proofErr w:type="spellStart"/>
-      <w:r>
-        <w:t>BioBERT</w:t>
-      </w:r>
-      <w:proofErr w:type="spellEnd"/>
-      <w:r>
-        <w:fldChar w:fldCharType="begin"/>
-      </w:r>
-      <w:r>
-        <w:instrText xml:space="preserve"> ADDIN EN.CITE &lt;EndNote&gt;&lt;Cite&gt;&lt;Author&gt;Lee&lt;/Author&gt;&lt;Year&gt;2020&lt;/Year&gt;&lt;RecNum&gt;24&lt;/RecNum&gt;&lt;DisplayText&gt;[14]&lt;/DisplayText&gt;&lt;record&gt;&lt;rec-number&gt;24&lt;/rec-number&gt;&lt;foreign-keys&gt;&lt;key app="EN" db-id="2wazf5f082zrfieazeax5tf4wvxz9x59ts99" timestamp="1764084192"&gt;24&lt;/key&gt;&lt;/foreign-keys&gt;&lt;ref-type name="Journal Article"&gt;17&lt;/ref-type&gt;&lt;contributors&gt;&lt;authors&gt;&lt;author&gt;Lee, Jinhyuk&lt;/author&gt;&lt;author&gt;Yoon, Wonjin&lt;/author&gt;&lt;author&gt;Kim, Sungdong&lt;/author&gt;&lt;author&gt;Kim, Donghyeon&lt;/author&gt;&lt;author&gt;Kim, Sunkyu&lt;/author&gt;&lt;author&gt;So, Chan Ho&lt;/author&gt;&lt;author&gt;Kang, Jaewoo&lt;/author&gt;&lt;/authors&gt;&lt;/contributors&gt;&lt;titles&gt;&lt;title&gt;BioBERT: a pre-trained biomedical language representation model for biomedical text mining&lt;/title&gt;&lt;secondary-title&gt;Bioinformatics&lt;/secondary-title&gt;&lt;/titles&gt;&lt;periodical&gt;&lt;full-title&gt;Bioinformatics&lt;/full-title&gt;&lt;/periodical&gt;&lt;pages&gt;1234-1240&lt;/pages&gt;&lt;volume&gt;36&lt;/volume&gt;&lt;number&gt;4&lt;/number&gt;&lt;dates&gt;&lt;year&gt;2020&lt;/year&gt;&lt;/dates&gt;&lt;isbn&gt;1367-4803&lt;/isbn&gt;&lt;urls&gt;&lt;/urls&gt;&lt;/record&gt;&lt;/Cite&gt;&lt;/EndNote&gt;</w:instrText>
-      </w:r>
-      <w:r>
-        <w:fldChar w:fldCharType="separate"/>
-      </w:r>
-      <w:r>
-        <w:rPr>
-          <w:noProof/>
-        </w:rPr>
-        <w:t>[14]</w:t>
-      </w:r>
-      <w:r>
-        <w:fldChar w:fldCharType="end"/>
-      </w:r>
-      <w:r>
-        <w:t xml:space="preserve">, </w:t>
-      </w:r>
-      <w:proofErr w:type="spellStart"/>
-      <w:r>
-        <w:t>ClinicalBERT</w:t>
-      </w:r>
-      <w:proofErr w:type="spellEnd"/>
-      <w:r>
-        <w:fldChar w:fldCharType="begin"/>
-      </w:r>
-      <w:r>
-        <w:instrText xml:space="preserve"> ADDIN EN.CITE &lt;EndNote&gt;&lt;Cite&gt;&lt;Author&gt;Huang&lt;/Author&gt;&lt;Year&gt;2019&lt;/Year&gt;&lt;RecNum&gt;25&lt;/RecNum&gt;&lt;DisplayText&gt;[15]&lt;/DisplayText&gt;&lt;record&gt;&lt;rec-number&gt;25&lt;/rec-number&gt;&lt;foreign-keys&gt;&lt;key app="EN" db-id="2wazf5f082zrfieazeax5tf4wvxz9x59ts99" timestamp="1764084225"&gt;25&lt;/key&gt;&lt;/foreign-keys&gt;&lt;ref-type name="Journal Article"&gt;17&lt;/ref-type&gt;&lt;contributors&gt;&lt;authors&gt;&lt;author&gt;Huang, Kexin&lt;/author&gt;&lt;author&gt;Altosaar, Jaan&lt;/author&gt;&lt;author&gt;Ranganath, Rajesh&lt;/author&gt;&lt;/authors&gt;&lt;/contributors&gt;&lt;titles&gt;&lt;title&gt;Clinicalbert: Modeling clinical notes and predicting hospital readmission&lt;/title&gt;&lt;secondary-title&gt;arXiv preprint arXiv:1904.05342&lt;/secondary-title&gt;&lt;/titles&gt;&lt;periodical&gt;&lt;full-title&gt;arXiv preprint arXiv:1904.05342&lt;/full-title&gt;&lt;/periodical&gt;&lt;dates&gt;&lt;year&gt;2019&lt;/year&gt;&lt;/dates&gt;&lt;urls&gt;&lt;/urls&gt;&lt;/record&gt;&lt;/Cite&gt;&lt;/EndNote&gt;</w:instrText>
-      </w:r>
-      <w:r>
-        <w:fldChar w:fldCharType="separate"/>
-      </w:r>
-      <w:r>
-        <w:rPr>
-          <w:noProof/>
-        </w:rPr>
-        <w:t>[15]</w:t>
-      </w:r>
-      <w:r>
-        <w:fldChar w:fldCharType="end"/>
-      </w:r>
-      <w:r>
-        <w:t xml:space="preserve">, and </w:t>
-      </w:r>
-      <w:proofErr w:type="spellStart"/>
-      <w:r>
-        <w:t>Bio_ClinicalBERT</w:t>
-      </w:r>
-      <w:proofErr w:type="spellEnd"/>
-      <w:r>
-        <w:fldChar w:fldCharType="begin"/>
-      </w:r>
-      <w:r>
-        <w:instrText xml:space="preserve"> ADDIN EN.CITE &lt;EndNote&gt;&lt;Cite&gt;&lt;Author&gt;Lee&lt;/Author&gt;&lt;Year&gt;2025&lt;/Year&gt;&lt;RecNum&gt;26&lt;/RecNum&gt;&lt;DisplayText&gt;[16]&lt;/DisplayText&gt;&lt;record&gt;&lt;rec-number&gt;26&lt;/rec-number&gt;&lt;foreign-keys&gt;&lt;key app="EN" db-id="2wazf5f082zrfieazeax5tf4wvxz9x59ts99" timestamp="1764084329"&gt;26&lt;/key&gt;&lt;/foreign-keys&gt;&lt;ref-type name="Journal Article"&gt;17&lt;/ref-type&gt;&lt;contributors&gt;&lt;authors&gt;&lt;author&gt;Lee, Simon A&lt;/author&gt;&lt;author&gt;Wu, Anthony&lt;/author&gt;&lt;author&gt;Chiang, Jeffrey N&lt;/author&gt;&lt;/authors&gt;&lt;/contributors&gt;&lt;titles&gt;&lt;title&gt;Clinical modernbert: An efficient and long context encoder for biomedical text&lt;/title&gt;&lt;secondary-title&gt;arXiv preprint arXiv:2504.03964&lt;/secondary-title&gt;&lt;/titles&gt;&lt;periodical&gt;&lt;full-title&gt;arXiv preprint arXiv:2504.03964&lt;/full-title&gt;&lt;/periodical&gt;&lt;dates&gt;&lt;year&gt;2025&lt;/year&gt;&lt;/dates&gt;&lt;urls&gt;&lt;/urls&gt;&lt;/record&gt;&lt;/Cite&gt;&lt;/EndNote&gt;</w:instrText>
-      </w:r>
-      <w:r>
-        <w:fldChar w:fldCharType="separate"/>
-      </w:r>
-      <w:r>
-        <w:rPr>
-          <w:noProof/>
-        </w:rPr>
-        <w:t>[16]</w:t>
-      </w:r>
-      <w:r>
-        <w:fldChar w:fldCharType="end"/>
-      </w:r>
-      <w:r>
-        <w:t xml:space="preserve"> using the VAERS data. </w:t>
-      </w:r>
-      <w:proofErr w:type="spellStart"/>
-      <w:r>
-        <w:t>BioBERT</w:t>
-      </w:r>
-      <w:proofErr w:type="spellEnd"/>
-      <w:r>
-        <w:t xml:space="preserve"> demonstrated superior precision and recall across key biomedical categories and was </w:t>
+        <w:t>used</w:t>
+      </w:r>
+      <w:r>
+        <w:t xml:space="preserve"> as the</w:t>
+      </w:r>
+      <w:r>
+        <w:t xml:space="preserve"> </w:t>
       </w:r>
       <w:r>
         <w:rPr>
           <w:rFonts w:hint="eastAsia"/>
           <w:lang w:eastAsia="zh-CN"/>
         </w:rPr>
-        <w:t>used</w:t>
-      </w:r>
-      <w:r>
-        <w:t xml:space="preserve"> as the</w:t>
-      </w:r>
-      <w:r>
-        <w:t xml:space="preserve"> </w:t>
+        <w:t xml:space="preserve">BERT </w:t>
+      </w:r>
+      <w:r>
+        <w:t>model in this study</w:t>
+      </w:r>
+      <w:r>
+        <w:t>.</w:t>
       </w:r>
       <w:r>
         <w:rPr>
           <w:rFonts w:hint="eastAsia"/>
           <w:lang w:eastAsia="zh-CN"/>
         </w:rPr>
-        <w:t xml:space="preserve">BERT </w:t>
-      </w:r>
-      <w:r>
-        <w:t>model in this study</w:t>
-      </w:r>
-      <w:r>
-        <w:t>.</w:t>
-      </w:r>
-      <w:r>
-        <w:rPr>
-          <w:rFonts w:hint="eastAsia"/>
-          <w:lang w:eastAsia="zh-CN"/>
-        </w:rPr>
-        <w:t xml:space="preserve"> Any unspecified BERT model used in this study were based on </w:t>
-      </w:r>
-      <w:proofErr w:type="spellStart"/>
-      <w:r>
-        <w:rPr>
-          <w:rFonts w:hint="eastAsia"/>
-          <w:lang w:eastAsia="zh-CN"/>
-        </w:rPr>
-        <w:t>BioBERT</w:t>
-      </w:r>
-      <w:proofErr w:type="spellEnd"/>
-      <w:r>
-        <w:rPr>
-          <w:rFonts w:hint="eastAsia"/>
-          <w:lang w:eastAsia="zh-CN"/>
-        </w:rPr>
-        <w:t>.</w:t>
+        <w:t xml:space="preserve"> Any unspecified BERT model used in this study were based on BioBERT.</w:t>
       </w:r>
     </w:p>
     <w:p/>
@@ -6820,7 +6756,6 @@
                 <w:sz w:val="16"/>
               </w:rPr>
             </w:pPr>
-            <w:proofErr w:type="spellStart"/>
             <w:r>
               <w:rPr>
                 <w:rFonts w:ascii="Arial" w:hAnsi="Arial"/>
@@ -6830,7 +6765,6 @@
               </w:rPr>
               <w:t>FHx</w:t>
             </w:r>
-            <w:proofErr w:type="spellEnd"/>
           </w:p>
         </w:tc>
         <w:tc>
@@ -7713,6 +7647,13 @@
         <w:t xml:space="preserve"> summarizes the overall benchmark comparison across model families, input paradigms, and evaluation tiers. </w:t>
       </w:r>
       <w:r>
+        <w:rPr>
+          <w:rFonts w:hint="eastAsia"/>
+          <w:lang w:eastAsia="zh-CN"/>
+        </w:rPr>
+        <w:t xml:space="preserve">By average, </w:t>
+      </w:r>
+      <w:r>
         <w:t>BERT</w:t>
       </w:r>
       <w:r>
@@ -7725,8 +7666,6 @@
         <w:t xml:space="preserve"> (0.4043 Strict, 0.6249 Adapted), Claude 4.6 Sonnet (0.4667 Strict, 0.6443 Adapted), and baseline ETHER system (0.1147 Strict, 0.2447 Adapted).</w:t>
       </w:r>
     </w:p>
-    <w:p/>
-    <w:p/>
     <w:p/>
     <w:p>
       <w:pPr>
@@ -7763,70 +7702,14 @@
         <w:tblLook w:val="04A0" w:firstRow="1" w:lastRow="0" w:firstColumn="1" w:lastColumn="0" w:noHBand="0" w:noVBand="1"/>
       </w:tblPr>
       <w:tblGrid>
-        <w:gridCol w:w="2070"/>
-        <w:gridCol w:w="1630"/>
-        <w:gridCol w:w="1810"/>
+        <w:gridCol w:w="2051"/>
+        <w:gridCol w:w="1551"/>
+        <w:gridCol w:w="2074"/>
       </w:tblGrid>
       <w:tr>
         <w:trPr>
           <w:trHeight w:val="505"/>
         </w:trPr>
-        <w:tc>
-          <w:tcPr>
-            <w:tcW w:w="2070" w:type="dxa"/>
-            <w:shd w:val="clear" w:color="auto" w:fill="F2F4F8"/>
-            <w:tcMar>
-              <w:top w:w="60" w:type="dxa"/>
-              <w:left w:w="90" w:type="dxa"/>
-              <w:bottom w:w="60" w:type="dxa"/>
-              <w:right w:w="90" w:type="dxa"/>
-            </w:tcMar>
-            <w:vAlign w:val="center"/>
-          </w:tcPr>
-          <w:p>
-            <w:pPr>
-              <w:spacing w:before="30" w:after="30"/>
-              <w:jc w:val="right"/>
-            </w:pPr>
-            <w:r>
-              <w:rPr>
-                <w:rFonts w:ascii="Arial" w:hAnsi="Arial"/>
-                <w:b/>
-                <w:color w:val="111111"/>
-                <w:sz w:val="16"/>
-              </w:rPr>
-              <w:t>Model</w:t>
-            </w:r>
-          </w:p>
-        </w:tc>
-        <w:tc>
-          <w:tcPr>
-            <w:tcW w:w="1630" w:type="dxa"/>
-            <w:shd w:val="clear" w:color="auto" w:fill="F2F4F8"/>
-            <w:tcMar>
-              <w:top w:w="60" w:type="dxa"/>
-              <w:left w:w="90" w:type="dxa"/>
-              <w:bottom w:w="60" w:type="dxa"/>
-              <w:right w:w="90" w:type="dxa"/>
-            </w:tcMar>
-            <w:vAlign w:val="center"/>
-          </w:tcPr>
-          <w:p>
-            <w:pPr>
-              <w:spacing w:before="30" w:after="30"/>
-              <w:jc w:val="center"/>
-            </w:pPr>
-            <w:r>
-              <w:rPr>
-                <w:rFonts w:ascii="Arial" w:hAnsi="Arial"/>
-                <w:b/>
-                <w:color w:val="111111"/>
-                <w:sz w:val="16"/>
-              </w:rPr>
-              <w:t>Strict Exact F1</w:t>
-            </w:r>
-          </w:p>
-        </w:tc>
         <w:tc>
           <w:tcPr>
             <w:tcW w:w="0" w:type="auto"/>
@@ -7842,43 +7725,27 @@
           <w:p>
             <w:pPr>
               <w:spacing w:before="30" w:after="30"/>
-              <w:jc w:val="center"/>
-            </w:pPr>
-            <w:r>
-              <w:rPr>
-                <w:rFonts w:ascii="Arial" w:hAnsi="Arial"/>
+              <w:jc w:val="right"/>
+              <w:rPr>
+                <w:sz w:val="20"/>
+                <w:szCs w:val="32"/>
+              </w:rPr>
+            </w:pPr>
+            <w:r>
+              <w:rPr>
                 <w:b/>
                 <w:color w:val="111111"/>
-                <w:sz w:val="16"/>
-              </w:rPr>
-              <w:t>Adapted ADE</w:t>
-            </w:r>
-            <w:r>
-              <w:rPr>
-                <w:rFonts w:ascii="Arial" w:hAnsi="Arial"/>
-                <w:b/>
-                <w:color w:val="111111"/>
-                <w:sz w:val="16"/>
-              </w:rPr>
-              <w:t>-Eval</w:t>
-            </w:r>
-            <w:r>
-              <w:rPr>
-                <w:rFonts w:ascii="Arial" w:hAnsi="Arial"/>
-                <w:b/>
-                <w:color w:val="111111"/>
-                <w:sz w:val="16"/>
-              </w:rPr>
-              <w:t xml:space="preserve"> F1</w:t>
-            </w:r>
-          </w:p>
-        </w:tc>
-      </w:tr>
-      <w:tr>
-        <w:tc>
-          <w:tcPr>
-            <w:tcW w:w="2070" w:type="dxa"/>
-            <w:shd w:val="clear" w:color="auto" w:fill="FFFFFF"/>
+                <w:sz w:val="20"/>
+                <w:szCs w:val="32"/>
+              </w:rPr>
+              <w:t>Model</w:t>
+            </w:r>
+          </w:p>
+        </w:tc>
+        <w:tc>
+          <w:tcPr>
+            <w:tcW w:w="0" w:type="auto"/>
+            <w:shd w:val="clear" w:color="auto" w:fill="F2F4F8"/>
             <w:tcMar>
               <w:top w:w="60" w:type="dxa"/>
               <w:left w:w="90" w:type="dxa"/>
@@ -7890,32 +7757,27 @@
           <w:p>
             <w:pPr>
               <w:spacing w:before="30" w:after="30"/>
-              <w:jc w:val="right"/>
-            </w:pPr>
-            <w:r>
-              <w:rPr>
-                <w:rFonts w:ascii="Arial" w:hAnsi="Arial"/>
+              <w:jc w:val="center"/>
+              <w:rPr>
+                <w:sz w:val="20"/>
+                <w:szCs w:val="32"/>
+              </w:rPr>
+            </w:pPr>
+            <w:r>
+              <w:rPr>
                 <w:b/>
-                <w:color w:val="222222"/>
-                <w:sz w:val="16"/>
-              </w:rPr>
-              <w:t>BERT</w:t>
-            </w:r>
-            <w:r>
-              <w:rPr>
-                <w:rFonts w:ascii="Arial" w:hAnsi="Arial"/>
-                <w:b/>
-                <w:color w:val="222222"/>
-                <w:sz w:val="16"/>
-              </w:rPr>
-              <w:t xml:space="preserve"> </w:t>
-            </w:r>
-          </w:p>
-        </w:tc>
-        <w:tc>
-          <w:tcPr>
-            <w:tcW w:w="1630" w:type="dxa"/>
-            <w:shd w:val="clear" w:color="auto" w:fill="FFFFFF"/>
+                <w:color w:val="111111"/>
+                <w:sz w:val="20"/>
+                <w:szCs w:val="32"/>
+              </w:rPr>
+              <w:t>Strict Exact F1</w:t>
+            </w:r>
+          </w:p>
+        </w:tc>
+        <w:tc>
+          <w:tcPr>
+            <w:tcW w:w="0" w:type="auto"/>
+            <w:shd w:val="clear" w:color="auto" w:fill="F2F4F8"/>
             <w:tcMar>
               <w:top w:w="60" w:type="dxa"/>
               <w:left w:w="90" w:type="dxa"/>
@@ -7928,17 +7790,42 @@
             <w:pPr>
               <w:spacing w:before="30" w:after="30"/>
               <w:jc w:val="center"/>
-            </w:pPr>
-            <w:r>
-              <w:rPr>
-                <w:rFonts w:ascii="Arial" w:hAnsi="Arial"/>
-                <w:color w:val="222222"/>
-                <w:sz w:val="16"/>
-              </w:rPr>
-              <w:t>0.5685 ± 0.0080</w:t>
-            </w:r>
-          </w:p>
-        </w:tc>
+              <w:rPr>
+                <w:sz w:val="20"/>
+                <w:szCs w:val="32"/>
+              </w:rPr>
+            </w:pPr>
+            <w:r>
+              <w:rPr>
+                <w:b/>
+                <w:color w:val="111111"/>
+                <w:sz w:val="20"/>
+                <w:szCs w:val="32"/>
+              </w:rPr>
+              <w:t>Adapted ADE</w:t>
+            </w:r>
+            <w:r>
+              <w:rPr>
+                <w:b/>
+                <w:color w:val="111111"/>
+                <w:sz w:val="20"/>
+                <w:szCs w:val="32"/>
+              </w:rPr>
+              <w:t>-Eval</w:t>
+            </w:r>
+            <w:r>
+              <w:rPr>
+                <w:b/>
+                <w:color w:val="111111"/>
+                <w:sz w:val="20"/>
+                <w:szCs w:val="32"/>
+              </w:rPr>
+              <w:t xml:space="preserve"> F1</w:t>
+            </w:r>
+          </w:p>
+        </w:tc>
+      </w:tr>
+      <w:tr>
         <w:tc>
           <w:tcPr>
             <w:tcW w:w="0" w:type="auto"/>
@@ -7954,24 +7841,33 @@
           <w:p>
             <w:pPr>
               <w:spacing w:before="30" w:after="30"/>
-              <w:jc w:val="center"/>
-            </w:pPr>
-            <w:r>
-              <w:rPr>
-                <w:rFonts w:ascii="Arial" w:hAnsi="Arial"/>
+              <w:jc w:val="right"/>
+              <w:rPr>
+                <w:rFonts w:hint="eastAsia"/>
+                <w:b/>
                 <w:color w:val="222222"/>
-                <w:sz w:val="16"/>
-              </w:rPr>
-              <w:t>0.7463 ± 0.0076</w:t>
-            </w:r>
-          </w:p>
-        </w:tc>
-      </w:tr>
-      <w:tr>
-        <w:tc>
-          <w:tcPr>
-            <w:tcW w:w="2070" w:type="dxa"/>
-            <w:shd w:val="clear" w:color="auto" w:fill="FBFBFB"/>
+                <w:sz w:val="20"/>
+                <w:szCs w:val="32"/>
+                <w:lang w:eastAsia="zh-CN"/>
+              </w:rPr>
+            </w:pPr>
+            <w:r>
+              <w:rPr>
+                <w:rFonts w:hint="eastAsia"/>
+                <w:b/>
+                <w:color w:val="222222"/>
+                <w:sz w:val="20"/>
+                <w:szCs w:val="32"/>
+                <w:lang w:eastAsia="zh-CN"/>
+              </w:rPr>
+              <w:t>BERT (1 run; seed 42)</w:t>
+            </w:r>
+          </w:p>
+        </w:tc>
+        <w:tc>
+          <w:tcPr>
+            <w:tcW w:w="0" w:type="auto"/>
+            <w:shd w:val="clear" w:color="auto" w:fill="FFFFFF"/>
             <w:tcMar>
               <w:top w:w="60" w:type="dxa"/>
               <w:left w:w="90" w:type="dxa"/>
@@ -7983,32 +7879,31 @@
           <w:p>
             <w:pPr>
               <w:spacing w:before="30" w:after="30"/>
-              <w:jc w:val="right"/>
-            </w:pPr>
-            <w:r>
-              <w:rPr>
-                <w:rFonts w:ascii="Arial" w:hAnsi="Arial"/>
-                <w:b/>
+              <w:jc w:val="center"/>
+              <w:rPr>
+                <w:rFonts w:hint="eastAsia"/>
                 <w:color w:val="222222"/>
-                <w:sz w:val="16"/>
-              </w:rPr>
-              <w:t>LLaMA-4</w:t>
-            </w:r>
-            <w:r>
-              <w:rPr>
-                <w:rFonts w:ascii="Arial" w:hAnsi="Arial"/>
-                <w:b/>
+                <w:sz w:val="20"/>
+                <w:szCs w:val="32"/>
+                <w:lang w:eastAsia="zh-CN"/>
+              </w:rPr>
+            </w:pPr>
+            <w:r>
+              <w:rPr>
+                <w:rFonts w:hint="eastAsia"/>
                 <w:color w:val="222222"/>
-                <w:sz w:val="16"/>
-              </w:rPr>
-              <w:t xml:space="preserve"> </w:t>
-            </w:r>
-          </w:p>
-        </w:tc>
-        <w:tc>
-          <w:tcPr>
-            <w:tcW w:w="1630" w:type="dxa"/>
-            <w:shd w:val="clear" w:color="auto" w:fill="FBFBFB"/>
+                <w:sz w:val="20"/>
+                <w:szCs w:val="32"/>
+                <w:lang w:eastAsia="zh-CN"/>
+              </w:rPr>
+              <w:t>0.5582</w:t>
+            </w:r>
+          </w:p>
+        </w:tc>
+        <w:tc>
+          <w:tcPr>
+            <w:tcW w:w="0" w:type="auto"/>
+            <w:shd w:val="clear" w:color="auto" w:fill="FFFFFF"/>
             <w:tcMar>
               <w:top w:w="60" w:type="dxa"/>
               <w:left w:w="90" w:type="dxa"/>
@@ -8021,17 +7916,144 @@
             <w:pPr>
               <w:spacing w:before="30" w:after="30"/>
               <w:jc w:val="center"/>
-            </w:pPr>
-            <w:r>
-              <w:rPr>
-                <w:rFonts w:ascii="Arial" w:hAnsi="Arial"/>
+              <w:rPr>
+                <w:rFonts w:hint="eastAsia"/>
                 <w:color w:val="222222"/>
-                <w:sz w:val="16"/>
-              </w:rPr>
-              <w:t>0.4043</w:t>
-            </w:r>
-          </w:p>
-        </w:tc>
+                <w:sz w:val="20"/>
+                <w:szCs w:val="32"/>
+                <w:lang w:eastAsia="zh-CN"/>
+              </w:rPr>
+            </w:pPr>
+            <w:r>
+              <w:rPr>
+                <w:rFonts w:hint="eastAsia"/>
+                <w:color w:val="222222"/>
+                <w:sz w:val="20"/>
+                <w:szCs w:val="32"/>
+                <w:lang w:eastAsia="zh-CN"/>
+              </w:rPr>
+              <w:t>0.7431</w:t>
+            </w:r>
+          </w:p>
+        </w:tc>
+      </w:tr>
+      <w:tr>
+        <w:tc>
+          <w:tcPr>
+            <w:tcW w:w="0" w:type="auto"/>
+            <w:shd w:val="clear" w:color="auto" w:fill="FFFFFF"/>
+            <w:tcMar>
+              <w:top w:w="60" w:type="dxa"/>
+              <w:left w:w="90" w:type="dxa"/>
+              <w:bottom w:w="60" w:type="dxa"/>
+              <w:right w:w="90" w:type="dxa"/>
+            </w:tcMar>
+            <w:vAlign w:val="center"/>
+          </w:tcPr>
+          <w:p>
+            <w:pPr>
+              <w:spacing w:before="30" w:after="30"/>
+              <w:jc w:val="right"/>
+              <w:rPr>
+                <w:sz w:val="20"/>
+                <w:szCs w:val="32"/>
+              </w:rPr>
+            </w:pPr>
+            <w:r>
+              <w:rPr>
+                <w:b/>
+                <w:color w:val="222222"/>
+                <w:sz w:val="20"/>
+                <w:szCs w:val="32"/>
+              </w:rPr>
+              <w:t>BERT</w:t>
+            </w:r>
+            <w:r>
+              <w:rPr>
+                <w:rFonts w:hint="eastAsia"/>
+                <w:b/>
+                <w:color w:val="222222"/>
+                <w:sz w:val="20"/>
+                <w:szCs w:val="32"/>
+                <w:lang w:eastAsia="zh-CN"/>
+              </w:rPr>
+              <w:t xml:space="preserve"> (Avg. 5 runs)</w:t>
+            </w:r>
+            <w:r>
+              <w:rPr>
+                <w:b/>
+                <w:color w:val="222222"/>
+                <w:sz w:val="20"/>
+                <w:szCs w:val="32"/>
+              </w:rPr>
+              <w:t xml:space="preserve"> </w:t>
+            </w:r>
+          </w:p>
+        </w:tc>
+        <w:tc>
+          <w:tcPr>
+            <w:tcW w:w="0" w:type="auto"/>
+            <w:shd w:val="clear" w:color="auto" w:fill="FFFFFF"/>
+            <w:tcMar>
+              <w:top w:w="60" w:type="dxa"/>
+              <w:left w:w="90" w:type="dxa"/>
+              <w:bottom w:w="60" w:type="dxa"/>
+              <w:right w:w="90" w:type="dxa"/>
+            </w:tcMar>
+            <w:vAlign w:val="center"/>
+          </w:tcPr>
+          <w:p>
+            <w:pPr>
+              <w:spacing w:before="30" w:after="30"/>
+              <w:jc w:val="center"/>
+              <w:rPr>
+                <w:sz w:val="20"/>
+                <w:szCs w:val="32"/>
+              </w:rPr>
+            </w:pPr>
+            <w:r>
+              <w:rPr>
+                <w:color w:val="222222"/>
+                <w:sz w:val="20"/>
+                <w:szCs w:val="32"/>
+              </w:rPr>
+              <w:t>0.5685 ± 0.0080</w:t>
+            </w:r>
+          </w:p>
+        </w:tc>
+        <w:tc>
+          <w:tcPr>
+            <w:tcW w:w="0" w:type="auto"/>
+            <w:shd w:val="clear" w:color="auto" w:fill="FFFFFF"/>
+            <w:tcMar>
+              <w:top w:w="60" w:type="dxa"/>
+              <w:left w:w="90" w:type="dxa"/>
+              <w:bottom w:w="60" w:type="dxa"/>
+              <w:right w:w="90" w:type="dxa"/>
+            </w:tcMar>
+            <w:vAlign w:val="center"/>
+          </w:tcPr>
+          <w:p>
+            <w:pPr>
+              <w:spacing w:before="30" w:after="30"/>
+              <w:jc w:val="center"/>
+              <w:rPr>
+                <w:sz w:val="20"/>
+                <w:szCs w:val="32"/>
+              </w:rPr>
+            </w:pPr>
+            <w:r>
+              <w:rPr>
+                <w:color w:val="222222"/>
+                <w:sz w:val="20"/>
+                <w:szCs w:val="32"/>
+              </w:rPr>
+              <w:t>0.7463 ± 0.0076</w:t>
+            </w:r>
+          </w:p>
+        </w:tc>
+      </w:tr>
+      <w:tr>
         <w:tc>
           <w:tcPr>
             <w:tcW w:w="0" w:type="auto"/>
@@ -8047,24 +8069,36 @@
           <w:p>
             <w:pPr>
               <w:spacing w:before="30" w:after="30"/>
-              <w:jc w:val="center"/>
-            </w:pPr>
-            <w:r>
-              <w:rPr>
-                <w:rFonts w:ascii="Arial" w:hAnsi="Arial"/>
+              <w:jc w:val="right"/>
+              <w:rPr>
+                <w:sz w:val="20"/>
+                <w:szCs w:val="32"/>
+              </w:rPr>
+            </w:pPr>
+            <w:r>
+              <w:rPr>
+                <w:b/>
                 <w:color w:val="222222"/>
-                <w:sz w:val="16"/>
-              </w:rPr>
-              <w:t>0.6249</w:t>
-            </w:r>
-          </w:p>
-        </w:tc>
-      </w:tr>
-      <w:tr>
-        <w:tc>
-          <w:tcPr>
-            <w:tcW w:w="2070" w:type="dxa"/>
-            <w:shd w:val="clear" w:color="auto" w:fill="FFFFFF"/>
+                <w:sz w:val="20"/>
+                <w:szCs w:val="32"/>
+              </w:rPr>
+              <w:t>LLaMA-4</w:t>
+            </w:r>
+            <w:r>
+              <w:rPr>
+                <w:b/>
+                <w:color w:val="222222"/>
+                <w:sz w:val="20"/>
+                <w:szCs w:val="32"/>
+              </w:rPr>
+              <w:t xml:space="preserve"> </w:t>
+            </w:r>
+          </w:p>
+        </w:tc>
+        <w:tc>
+          <w:tcPr>
+            <w:tcW w:w="0" w:type="auto"/>
+            <w:shd w:val="clear" w:color="auto" w:fill="FBFBFB"/>
             <w:tcMar>
               <w:top w:w="60" w:type="dxa"/>
               <w:left w:w="90" w:type="dxa"/>
@@ -8076,23 +8110,26 @@
           <w:p>
             <w:pPr>
               <w:spacing w:before="30" w:after="30"/>
-              <w:jc w:val="right"/>
-            </w:pPr>
-            <w:r>
-              <w:rPr>
-                <w:rFonts w:ascii="Arial" w:hAnsi="Arial"/>
-                <w:b/>
+              <w:jc w:val="center"/>
+              <w:rPr>
+                <w:sz w:val="20"/>
+                <w:szCs w:val="32"/>
+              </w:rPr>
+            </w:pPr>
+            <w:r>
+              <w:rPr>
                 <w:color w:val="222222"/>
-                <w:sz w:val="16"/>
-              </w:rPr>
-              <w:t>Claude 4.6 Sonnet</w:t>
-            </w:r>
-          </w:p>
-        </w:tc>
-        <w:tc>
-          <w:tcPr>
-            <w:tcW w:w="1630" w:type="dxa"/>
-            <w:shd w:val="clear" w:color="auto" w:fill="FFFFFF"/>
+                <w:sz w:val="20"/>
+                <w:szCs w:val="32"/>
+              </w:rPr>
+              <w:t>0.4043</w:t>
+            </w:r>
+          </w:p>
+        </w:tc>
+        <w:tc>
+          <w:tcPr>
+            <w:tcW w:w="0" w:type="auto"/>
+            <w:shd w:val="clear" w:color="auto" w:fill="FBFBFB"/>
             <w:tcMar>
               <w:top w:w="60" w:type="dxa"/>
               <w:left w:w="90" w:type="dxa"/>
@@ -8105,17 +8142,23 @@
             <w:pPr>
               <w:spacing w:before="30" w:after="30"/>
               <w:jc w:val="center"/>
-            </w:pPr>
-            <w:r>
-              <w:rPr>
-                <w:rFonts w:ascii="Arial" w:hAnsi="Arial"/>
+              <w:rPr>
+                <w:sz w:val="20"/>
+                <w:szCs w:val="32"/>
+              </w:rPr>
+            </w:pPr>
+            <w:r>
+              <w:rPr>
                 <w:color w:val="222222"/>
-                <w:sz w:val="16"/>
-              </w:rPr>
-              <w:t>0.4667</w:t>
-            </w:r>
-          </w:p>
-        </w:tc>
+                <w:sz w:val="20"/>
+                <w:szCs w:val="32"/>
+              </w:rPr>
+              <w:t>0.6249</w:t>
+            </w:r>
+          </w:p>
+        </w:tc>
+      </w:tr>
+      <w:tr>
         <w:tc>
           <w:tcPr>
             <w:tcW w:w="0" w:type="auto"/>
@@ -8131,24 +8174,27 @@
           <w:p>
             <w:pPr>
               <w:spacing w:before="30" w:after="30"/>
-              <w:jc w:val="center"/>
-            </w:pPr>
-            <w:r>
-              <w:rPr>
-                <w:rFonts w:ascii="Arial" w:hAnsi="Arial"/>
+              <w:jc w:val="right"/>
+              <w:rPr>
+                <w:sz w:val="20"/>
+                <w:szCs w:val="32"/>
+              </w:rPr>
+            </w:pPr>
+            <w:r>
+              <w:rPr>
+                <w:b/>
                 <w:color w:val="222222"/>
-                <w:sz w:val="16"/>
-              </w:rPr>
-              <w:t>0.6443</w:t>
-            </w:r>
-          </w:p>
-        </w:tc>
-      </w:tr>
-      <w:tr>
-        <w:tc>
-          <w:tcPr>
-            <w:tcW w:w="2070" w:type="dxa"/>
-            <w:shd w:val="clear" w:color="auto" w:fill="FBFBFB"/>
+                <w:sz w:val="20"/>
+                <w:szCs w:val="32"/>
+              </w:rPr>
+              <w:t>Claude 4.6 Sonnet</w:t>
+            </w:r>
+          </w:p>
+        </w:tc>
+        <w:tc>
+          <w:tcPr>
+            <w:tcW w:w="0" w:type="auto"/>
+            <w:shd w:val="clear" w:color="auto" w:fill="FFFFFF"/>
             <w:tcMar>
               <w:top w:w="60" w:type="dxa"/>
               <w:left w:w="90" w:type="dxa"/>
@@ -8160,23 +8206,26 @@
           <w:p>
             <w:pPr>
               <w:spacing w:before="30" w:after="30"/>
-              <w:jc w:val="right"/>
-            </w:pPr>
-            <w:r>
-              <w:rPr>
-                <w:rFonts w:ascii="Arial" w:hAnsi="Arial"/>
-                <w:b/>
+              <w:jc w:val="center"/>
+              <w:rPr>
+                <w:sz w:val="20"/>
+                <w:szCs w:val="32"/>
+              </w:rPr>
+            </w:pPr>
+            <w:r>
+              <w:rPr>
                 <w:color w:val="222222"/>
-                <w:sz w:val="16"/>
-              </w:rPr>
-              <w:t>ETHER</w:t>
-            </w:r>
-          </w:p>
-        </w:tc>
-        <w:tc>
-          <w:tcPr>
-            <w:tcW w:w="1630" w:type="dxa"/>
-            <w:shd w:val="clear" w:color="auto" w:fill="FBFBFB"/>
+                <w:sz w:val="20"/>
+                <w:szCs w:val="32"/>
+              </w:rPr>
+              <w:t>0.4667</w:t>
+            </w:r>
+          </w:p>
+        </w:tc>
+        <w:tc>
+          <w:tcPr>
+            <w:tcW w:w="0" w:type="auto"/>
+            <w:shd w:val="clear" w:color="auto" w:fill="FFFFFF"/>
             <w:tcMar>
               <w:top w:w="60" w:type="dxa"/>
               <w:left w:w="90" w:type="dxa"/>
@@ -8189,17 +8238,23 @@
             <w:pPr>
               <w:spacing w:before="30" w:after="30"/>
               <w:jc w:val="center"/>
-            </w:pPr>
-            <w:r>
-              <w:rPr>
-                <w:rFonts w:ascii="Arial" w:hAnsi="Arial"/>
+              <w:rPr>
+                <w:sz w:val="20"/>
+                <w:szCs w:val="32"/>
+              </w:rPr>
+            </w:pPr>
+            <w:r>
+              <w:rPr>
                 <w:color w:val="222222"/>
-                <w:sz w:val="16"/>
-              </w:rPr>
-              <w:t>0.1147</w:t>
-            </w:r>
-          </w:p>
-        </w:tc>
+                <w:sz w:val="20"/>
+                <w:szCs w:val="32"/>
+              </w:rPr>
+              <w:t>0.6443</w:t>
+            </w:r>
+          </w:p>
+        </w:tc>
+      </w:tr>
+      <w:tr>
         <w:tc>
           <w:tcPr>
             <w:tcW w:w="0" w:type="auto"/>
@@ -8215,13 +8270,80 @@
           <w:p>
             <w:pPr>
               <w:spacing w:before="30" w:after="30"/>
+              <w:jc w:val="right"/>
+              <w:rPr>
+                <w:sz w:val="20"/>
+                <w:szCs w:val="32"/>
+              </w:rPr>
+            </w:pPr>
+            <w:r>
+              <w:rPr>
+                <w:b/>
+                <w:color w:val="222222"/>
+                <w:sz w:val="20"/>
+                <w:szCs w:val="32"/>
+              </w:rPr>
+              <w:t>ETHER</w:t>
+            </w:r>
+          </w:p>
+        </w:tc>
+        <w:tc>
+          <w:tcPr>
+            <w:tcW w:w="0" w:type="auto"/>
+            <w:shd w:val="clear" w:color="auto" w:fill="FBFBFB"/>
+            <w:tcMar>
+              <w:top w:w="60" w:type="dxa"/>
+              <w:left w:w="90" w:type="dxa"/>
+              <w:bottom w:w="60" w:type="dxa"/>
+              <w:right w:w="90" w:type="dxa"/>
+            </w:tcMar>
+            <w:vAlign w:val="center"/>
+          </w:tcPr>
+          <w:p>
+            <w:pPr>
+              <w:spacing w:before="30" w:after="30"/>
               <w:jc w:val="center"/>
-            </w:pPr>
-            <w:r>
-              <w:rPr>
-                <w:rFonts w:ascii="Arial" w:hAnsi="Arial"/>
+              <w:rPr>
+                <w:sz w:val="20"/>
+                <w:szCs w:val="32"/>
+              </w:rPr>
+            </w:pPr>
+            <w:r>
+              <w:rPr>
                 <w:color w:val="222222"/>
-                <w:sz w:val="16"/>
+                <w:sz w:val="20"/>
+                <w:szCs w:val="32"/>
+              </w:rPr>
+              <w:t>0.1147</w:t>
+            </w:r>
+          </w:p>
+        </w:tc>
+        <w:tc>
+          <w:tcPr>
+            <w:tcW w:w="0" w:type="auto"/>
+            <w:shd w:val="clear" w:color="auto" w:fill="FBFBFB"/>
+            <w:tcMar>
+              <w:top w:w="60" w:type="dxa"/>
+              <w:left w:w="90" w:type="dxa"/>
+              <w:bottom w:w="60" w:type="dxa"/>
+              <w:right w:w="90" w:type="dxa"/>
+            </w:tcMar>
+            <w:vAlign w:val="center"/>
+          </w:tcPr>
+          <w:p>
+            <w:pPr>
+              <w:spacing w:before="30" w:after="30"/>
+              <w:jc w:val="center"/>
+              <w:rPr>
+                <w:sz w:val="20"/>
+                <w:szCs w:val="32"/>
+              </w:rPr>
+            </w:pPr>
+            <w:r>
+              <w:rPr>
+                <w:color w:val="222222"/>
+                <w:sz w:val="20"/>
+                <w:szCs w:val="32"/>
               </w:rPr>
               <w:t>0.2447</w:t>
             </w:r>
@@ -8380,6 +8502,7 @@
         <w:t>mplying its weakness on these challenging annotation categories.</w:t>
       </w:r>
     </w:p>
+    <w:p/>
     <w:p>
       <w:r>
         <w:rPr>
@@ -8718,7 +8841,14 @@
           <w:szCs w:val="20"/>
           <w:lang w:eastAsia="zh-CN"/>
         </w:rPr>
-        <w:t xml:space="preserve">Conflation </w:t>
+        <w:t xml:space="preserve">Conflation types </w:t>
+      </w:r>
+      <w:r>
+        <w:rPr>
+          <w:sz w:val="20"/>
+          <w:szCs w:val="20"/>
+        </w:rPr>
+        <w:t xml:space="preserve">for LLaMA-4. (d) </w:t>
       </w:r>
       <w:r>
         <w:rPr>
@@ -8727,14 +8857,14 @@
           <w:szCs w:val="20"/>
           <w:lang w:eastAsia="zh-CN"/>
         </w:rPr>
-        <w:t xml:space="preserve">types </w:t>
+        <w:t xml:space="preserve">Example of </w:t>
       </w:r>
       <w:r>
         <w:rPr>
           <w:sz w:val="20"/>
           <w:szCs w:val="20"/>
         </w:rPr>
-        <w:t xml:space="preserve">for LLaMA-4. (d) </w:t>
+        <w:t xml:space="preserve">concomitant drug and treatment terms misclassified as suspect drug (sDrug) by LLaMA-4. (e) </w:t>
       </w:r>
       <w:r>
         <w:rPr>
@@ -8743,14 +8873,14 @@
           <w:szCs w:val="20"/>
           <w:lang w:eastAsia="zh-CN"/>
         </w:rPr>
-        <w:t xml:space="preserve">Example of </w:t>
+        <w:t>Example of</w:t>
       </w:r>
       <w:r>
         <w:rPr>
           <w:sz w:val="20"/>
           <w:szCs w:val="20"/>
         </w:rPr>
-        <w:t xml:space="preserve">concomitant drug and treatment terms misclassified as suspect drug (sDrug) by LLaMA-4. (e) </w:t>
+        <w:t xml:space="preserve"> medical history (MHx) </w:t>
       </w:r>
       <w:r>
         <w:rPr>
@@ -8759,14 +8889,14 @@
           <w:szCs w:val="20"/>
           <w:lang w:eastAsia="zh-CN"/>
         </w:rPr>
-        <w:t>Example of</w:t>
+        <w:t>to</w:t>
       </w:r>
       <w:r>
         <w:rPr>
           <w:sz w:val="20"/>
           <w:szCs w:val="20"/>
         </w:rPr>
-        <w:t xml:space="preserve"> medical history (MHx) </w:t>
+        <w:t xml:space="preserve"> diagnosis (Dx)</w:t>
       </w:r>
       <w:r>
         <w:rPr>
@@ -8775,22 +8905,6 @@
           <w:szCs w:val="20"/>
           <w:lang w:eastAsia="zh-CN"/>
         </w:rPr>
-        <w:t>to</w:t>
-      </w:r>
-      <w:r>
-        <w:rPr>
-          <w:sz w:val="20"/>
-          <w:szCs w:val="20"/>
-        </w:rPr>
-        <w:t xml:space="preserve"> diagnosis (Dx)</w:t>
-      </w:r>
-      <w:r>
-        <w:rPr>
-          <w:rFonts w:hint="eastAsia"/>
-          <w:sz w:val="20"/>
-          <w:szCs w:val="20"/>
-          <w:lang w:eastAsia="zh-CN"/>
-        </w:rPr>
         <w:t xml:space="preserve"> / </w:t>
       </w:r>
       <w:r>
@@ -9091,16 +9205,13 @@
         <w:t xml:space="preserve"> fine-tuned via 10-fold cross-validation achieved a strict exact-match F1 of 0.7015 </w:t>
       </w:r>
       <w:r>
-        <w:t xml:space="preserve">± 0.0174 </w:t>
+        <w:t xml:space="preserve"> </w:t>
       </w:r>
       <w:r>
         <w:t xml:space="preserve">(0.8370 </w:t>
       </w:r>
       <w:r>
-        <w:t>± 0.0095</w:t>
-      </w:r>
-      <w:r>
-        <w:t xml:space="preserve"> for A</w:t>
+        <w:t>for A</w:t>
       </w:r>
       <w:r>
         <w:t>dapted</w:t>
@@ -9119,13 +9230,34 @@
       </w:r>
     </w:p>
     <w:p>
-      <w:r>
+      <w:pPr>
         <w:rPr>
           <w:b/>
           <w:bCs/>
           <w:sz w:val="20"/>
           <w:szCs w:val="20"/>
         </w:rPr>
+      </w:pPr>
+    </w:p>
+    <w:p>
+      <w:pPr>
+        <w:rPr>
+          <w:b/>
+          <w:bCs/>
+          <w:sz w:val="20"/>
+          <w:szCs w:val="20"/>
+        </w:rPr>
+      </w:pPr>
+    </w:p>
+    <w:p>
+      <w:r>
+        <w:rPr>
+          <w:b/>
+          <w:bCs/>
+          <w:sz w:val="20"/>
+          <w:szCs w:val="20"/>
+        </w:rPr>
+        <w:lastRenderedPageBreak/>
         <w:t xml:space="preserve">Table 4. </w:t>
       </w:r>
       <w:r>
@@ -9184,7 +9316,6 @@
                 <w:szCs w:val="24"/>
                 <w:lang w:eastAsia="en-US"/>
               </w:rPr>
-              <w:lastRenderedPageBreak/>
               <w:t>Category</w:t>
             </w:r>
           </w:p>
@@ -9308,7 +9439,6 @@
                 <w:lang w:eastAsia="en-US"/>
               </w:rPr>
             </w:pPr>
-            <w:proofErr w:type="spellStart"/>
             <w:r>
               <w:rPr>
                 <w:rFonts w:ascii="Arial" w:hAnsi="Arial"/>
@@ -9321,7 +9451,6 @@
               </w:rPr>
               <w:t>pDx</w:t>
             </w:r>
-            <w:proofErr w:type="spellEnd"/>
           </w:p>
         </w:tc>
         <w:tc>
@@ -9419,7 +9548,6 @@
                 <w:lang w:eastAsia="en-US"/>
               </w:rPr>
             </w:pPr>
-            <w:proofErr w:type="spellStart"/>
             <w:r>
               <w:rPr>
                 <w:rFonts w:ascii="Arial" w:hAnsi="Arial"/>
@@ -9432,7 +9560,6 @@
               </w:rPr>
               <w:t>sDx</w:t>
             </w:r>
-            <w:proofErr w:type="spellEnd"/>
           </w:p>
         </w:tc>
         <w:tc>
@@ -9966,7 +10093,6 @@
                 <w:lang w:eastAsia="en-US"/>
               </w:rPr>
             </w:pPr>
-            <w:proofErr w:type="spellStart"/>
             <w:r>
               <w:rPr>
                 <w:rFonts w:ascii="Arial" w:hAnsi="Arial"/>
@@ -9979,7 +10105,6 @@
               </w:rPr>
               <w:t>FHx</w:t>
             </w:r>
-            <w:proofErr w:type="spellEnd"/>
           </w:p>
         </w:tc>
         <w:tc>
@@ -10629,31 +10754,7 @@
         <w:t>Figure 6a</w:t>
       </w:r>
       <w:r>
-        <w:t>) across all 11 clinical concept categories confirmed strong supervised encoder advantages across vaccines (VAX: 0.93 vs 0.85), treatments (TX: 0.92 vs 0.76), secondary diagnoses (</w:t>
-      </w:r>
-      <w:proofErr w:type="spellStart"/>
-      <w:r>
-        <w:t>sDx</w:t>
-      </w:r>
-      <w:proofErr w:type="spellEnd"/>
-      <w:r>
-        <w:t>: 0.87 vs 0.62), medical history (MHx: 0.85 vs 0.58), patient clinical status (STATUS: 0.83 vs 0.61), primary diagnoses (</w:t>
-      </w:r>
-      <w:proofErr w:type="spellStart"/>
-      <w:r>
-        <w:t>pDx</w:t>
-      </w:r>
-      <w:proofErr w:type="spellEnd"/>
-      <w:r>
-        <w:t>: 0.83 vs 0.70), adverse-event symptoms (SYM: 0.78 vs 0.57), laboratory findings (Lab: 0.76 vs 0.56), and family history (</w:t>
-      </w:r>
-      <w:proofErr w:type="spellStart"/>
-      <w:r>
-        <w:t>FHx</w:t>
-      </w:r>
-      <w:proofErr w:type="spellEnd"/>
-      <w:r>
-        <w:t xml:space="preserve">: 0.65 vs 0.51). Notably, few-shot </w:t>
+        <w:t xml:space="preserve">) across all 11 clinical concept categories confirmed strong supervised encoder advantages across vaccines (VAX: 0.93 vs 0.85), treatments (TX: 0.92 vs 0.76), secondary diagnoses (sDx: 0.87 vs 0.62), medical history (MHx: 0.85 vs 0.58), patient clinical status (STATUS: 0.83 vs 0.61), primary diagnoses (pDx: 0.83 vs 0.70), adverse-event symptoms (SYM: 0.78 vs 0.57), laboratory findings (Lab: 0.76 vs 0.56), and family history (FHx: 0.65 vs 0.51). Notably, few-shot </w:t>
       </w:r>
       <w:r>
         <w:t>LLaMA-4</w:t>
@@ -10715,15 +10816,7 @@
         <w:t>LLaMA-4</w:t>
       </w:r>
       <w:r>
-        <w:t xml:space="preserve"> was subsuming secondary diagnoses under adverse symptoms (</w:t>
-      </w:r>
-      <w:proofErr w:type="spellStart"/>
-      <w:r>
-        <w:t>sDx</w:t>
-      </w:r>
-      <w:proofErr w:type="spellEnd"/>
-      <w:r>
-        <w:t xml:space="preserve"> </w:t>
+        <w:t xml:space="preserve"> was subsuming secondary diagnoses under adverse symptoms (sDx </w:t>
       </w:r>
       <w:r>
         <w:t>to</w:t>
@@ -10735,15 +10828,7 @@
         <w:t>to</w:t>
       </w:r>
       <w:r>
-        <w:t xml:space="preserve"> </w:t>
-      </w:r>
-      <w:proofErr w:type="spellStart"/>
-      <w:r>
-        <w:t>sDx</w:t>
-      </w:r>
-      <w:proofErr w:type="spellEnd"/>
-      <w:r>
-        <w:t xml:space="preserve">: 1,093), symptom conflation with medical history (SYM </w:t>
+        <w:t xml:space="preserve"> sDx: 1,093), symptom conflation with medical history (SYM </w:t>
       </w:r>
       <w:r>
         <w:t>to</w:t>
@@ -10761,15 +10846,7 @@
         <w:t>BERT</w:t>
       </w:r>
       <w:r>
-        <w:t xml:space="preserve">, confusions similarly peaked at </w:t>
-      </w:r>
-      <w:proofErr w:type="spellStart"/>
-      <w:r>
-        <w:t>sDx</w:t>
-      </w:r>
-      <w:proofErr w:type="spellEnd"/>
-      <w:r>
-        <w:t xml:space="preserve"> </w:t>
+        <w:t xml:space="preserve">, confusions similarly peaked at sDx </w:t>
       </w:r>
       <w:r>
         <w:t>to</w:t>
@@ -10781,15 +10858,7 @@
         <w:t>to</w:t>
       </w:r>
       <w:r>
-        <w:t xml:space="preserve"> </w:t>
-      </w:r>
-      <w:proofErr w:type="spellStart"/>
-      <w:r>
-        <w:t>sDx</w:t>
-      </w:r>
-      <w:proofErr w:type="spellEnd"/>
-      <w:r>
-        <w:t xml:space="preserve"> (350), but at markedly lower absolute frequencies.</w:t>
+        <w:t xml:space="preserve"> sDx (350), but at markedly lower absolute frequencies.</w:t>
       </w:r>
     </w:p>
     <w:p/>
@@ -11099,10 +11168,10 @@
         <w:tblLook w:val="04A0" w:firstRow="1" w:lastRow="0" w:firstColumn="1" w:lastColumn="0" w:noHBand="0" w:noVBand="1"/>
       </w:tblPr>
       <w:tblGrid>
-        <w:gridCol w:w="3180"/>
-        <w:gridCol w:w="1994"/>
-        <w:gridCol w:w="2083"/>
-        <w:gridCol w:w="2103"/>
+        <w:gridCol w:w="3208"/>
+        <w:gridCol w:w="1974"/>
+        <w:gridCol w:w="2089"/>
+        <w:gridCol w:w="2089"/>
       </w:tblGrid>
       <w:tr>
         <w:trPr>
@@ -11274,6 +11343,9 @@
             <w:vAlign w:val="center"/>
           </w:tcPr>
           <w:p>
+            <w:pPr>
+              <w:jc w:val="center"/>
+            </w:pPr>
             <w:r>
               <w:t>200</w:t>
             </w:r>
@@ -11351,6 +11423,9 @@
             <w:vAlign w:val="center"/>
           </w:tcPr>
           <w:p>
+            <w:pPr>
+              <w:jc w:val="center"/>
+            </w:pPr>
             <w:r>
               <w:t>200</w:t>
             </w:r>
@@ -11428,6 +11503,9 @@
             <w:vAlign w:val="center"/>
           </w:tcPr>
           <w:p>
+            <w:pPr>
+              <w:jc w:val="center"/>
+            </w:pPr>
             <w:r>
               <w:t>229</w:t>
             </w:r>
@@ -11505,6 +11583,9 @@
             <w:vAlign w:val="center"/>
           </w:tcPr>
           <w:p>
+            <w:pPr>
+              <w:jc w:val="center"/>
+            </w:pPr>
             <w:r>
               <w:t>200</w:t>
             </w:r>
@@ -11582,6 +11663,9 @@
             <w:vAlign w:val="center"/>
           </w:tcPr>
           <w:p>
+            <w:pPr>
+              <w:jc w:val="center"/>
+            </w:pPr>
             <w:r>
               <w:t>829</w:t>
             </w:r>
@@ -11657,6 +11741,7 @@
           <w:sz w:val="20"/>
           <w:szCs w:val="20"/>
         </w:rPr>
+        <w:lastRenderedPageBreak/>
         <w:t>Table 6.</w:t>
       </w:r>
       <w:r>
@@ -11713,10 +11798,10 @@
         <w:tblLook w:val="04A0" w:firstRow="1" w:lastRow="0" w:firstColumn="1" w:lastColumn="0" w:noHBand="0" w:noVBand="1"/>
       </w:tblPr>
       <w:tblGrid>
-        <w:gridCol w:w="1209"/>
-        <w:gridCol w:w="1247"/>
-        <w:gridCol w:w="1336"/>
-        <w:gridCol w:w="1810"/>
+        <w:gridCol w:w="1328"/>
+        <w:gridCol w:w="1447"/>
+        <w:gridCol w:w="1557"/>
+        <w:gridCol w:w="2074"/>
       </w:tblGrid>
       <w:tr>
         <w:tc>
@@ -11735,13 +11820,19 @@
             <w:pPr>
               <w:spacing w:before="30" w:after="30"/>
               <w:jc w:val="right"/>
-            </w:pPr>
-            <w:r>
-              <w:rPr>
-                <w:rFonts w:ascii="Arial" w:hAnsi="Arial"/>
+              <w:rPr>
+                <w:rFonts w:cs="Arial"/>
+                <w:sz w:val="20"/>
+                <w:szCs w:val="20"/>
+              </w:rPr>
+            </w:pPr>
+            <w:r>
+              <w:rPr>
+                <w:rFonts w:cs="Arial"/>
                 <w:b/>
                 <w:color w:val="111111"/>
-                <w:sz w:val="16"/>
+                <w:sz w:val="20"/>
+                <w:szCs w:val="20"/>
               </w:rPr>
               <w:t xml:space="preserve">Dataset </w:t>
             </w:r>
@@ -11763,13 +11854,19 @@
             <w:pPr>
               <w:spacing w:before="30" w:after="30"/>
               <w:jc w:val="center"/>
-            </w:pPr>
-            <w:r>
-              <w:rPr>
-                <w:rFonts w:ascii="Arial" w:hAnsi="Arial"/>
+              <w:rPr>
+                <w:rFonts w:cs="Arial"/>
+                <w:sz w:val="20"/>
+                <w:szCs w:val="20"/>
+              </w:rPr>
+            </w:pPr>
+            <w:r>
+              <w:rPr>
+                <w:rFonts w:cs="Arial"/>
                 <w:b/>
                 <w:color w:val="111111"/>
-                <w:sz w:val="16"/>
+                <w:sz w:val="20"/>
+                <w:szCs w:val="20"/>
               </w:rPr>
               <w:t>Random Seed</w:t>
             </w:r>
@@ -11791,13 +11888,19 @@
             <w:pPr>
               <w:spacing w:before="30" w:after="30"/>
               <w:jc w:val="center"/>
-            </w:pPr>
-            <w:r>
-              <w:rPr>
-                <w:rFonts w:ascii="Arial" w:hAnsi="Arial"/>
+              <w:rPr>
+                <w:rFonts w:cs="Arial"/>
+                <w:sz w:val="20"/>
+                <w:szCs w:val="20"/>
+              </w:rPr>
+            </w:pPr>
+            <w:r>
+              <w:rPr>
+                <w:rFonts w:cs="Arial"/>
                 <w:b/>
                 <w:color w:val="111111"/>
-                <w:sz w:val="16"/>
+                <w:sz w:val="20"/>
+                <w:szCs w:val="20"/>
               </w:rPr>
               <w:t>Strict Exact F1</w:t>
             </w:r>
@@ -11819,31 +11922,39 @@
             <w:pPr>
               <w:spacing w:before="30" w:after="30"/>
               <w:jc w:val="center"/>
-            </w:pPr>
-            <w:r>
-              <w:rPr>
-                <w:rFonts w:ascii="Arial" w:hAnsi="Arial"/>
+              <w:rPr>
+                <w:rFonts w:cs="Arial"/>
+                <w:sz w:val="20"/>
+                <w:szCs w:val="20"/>
+              </w:rPr>
+            </w:pPr>
+            <w:r>
+              <w:rPr>
+                <w:rFonts w:cs="Arial"/>
                 <w:b/>
                 <w:color w:val="111111"/>
-                <w:sz w:val="16"/>
+                <w:sz w:val="20"/>
+                <w:szCs w:val="20"/>
               </w:rPr>
               <w:t>Adapted ADE</w:t>
             </w:r>
             <w:r>
               <w:rPr>
-                <w:rFonts w:ascii="Arial" w:hAnsi="Arial"/>
+                <w:rFonts w:cs="Arial"/>
                 <w:b/>
                 <w:color w:val="111111"/>
-                <w:sz w:val="16"/>
+                <w:sz w:val="20"/>
+                <w:szCs w:val="20"/>
               </w:rPr>
               <w:t xml:space="preserve">-Eval </w:t>
             </w:r>
             <w:r>
               <w:rPr>
-                <w:rFonts w:ascii="Arial" w:hAnsi="Arial"/>
+                <w:rFonts w:cs="Arial"/>
                 <w:b/>
                 <w:color w:val="111111"/>
-                <w:sz w:val="16"/>
+                <w:sz w:val="20"/>
+                <w:szCs w:val="20"/>
               </w:rPr>
               <w:t>F1</w:t>
             </w:r>
@@ -11851,6 +11962,9 @@
         </w:tc>
       </w:tr>
       <w:tr>
+        <w:trPr>
+          <w:trHeight w:val="288"/>
+        </w:trPr>
         <w:tc>
           <w:tcPr>
             <w:tcW w:w="0" w:type="auto"/>
@@ -11865,28 +11979,34 @@
           </w:tcPr>
           <w:p>
             <w:pPr>
-              <w:spacing w:before="30" w:after="30"/>
+              <w:spacing w:before="30" w:after="30" w:line="240" w:lineRule="auto"/>
+              <w:contextualSpacing/>
               <w:jc w:val="right"/>
               <w:rPr>
-                <w:rFonts w:hint="eastAsia"/>
+                <w:rFonts w:cs="Arial"/>
+                <w:b/>
+                <w:sz w:val="20"/>
+                <w:szCs w:val="20"/>
                 <w:lang w:eastAsia="zh-CN"/>
               </w:rPr>
             </w:pPr>
             <w:r>
               <w:rPr>
-                <w:rFonts w:ascii="Arial" w:hAnsi="Arial"/>
+                <w:rFonts w:cs="Arial"/>
                 <w:b/>
                 <w:color w:val="222222"/>
-                <w:sz w:val="16"/>
+                <w:sz w:val="20"/>
+                <w:szCs w:val="20"/>
               </w:rPr>
               <w:t>FAERS</w:t>
             </w:r>
             <w:r>
               <w:rPr>
-                <w:rFonts w:ascii="Arial" w:hAnsi="Arial" w:hint="eastAsia"/>
+                <w:rFonts w:cs="Arial"/>
                 <w:b/>
                 <w:color w:val="222222"/>
-                <w:sz w:val="16"/>
+                <w:sz w:val="20"/>
+                <w:szCs w:val="20"/>
                 <w:lang w:eastAsia="zh-CN"/>
               </w:rPr>
               <w:t xml:space="preserve"> Run1</w:t>
@@ -11906,7 +12026,21 @@
             <w:vAlign w:val="center"/>
           </w:tcPr>
           <w:p>
-            <w:r>
+            <w:pPr>
+              <w:spacing w:line="240" w:lineRule="auto"/>
+              <w:contextualSpacing/>
+              <w:rPr>
+                <w:rFonts w:cs="Arial"/>
+                <w:sz w:val="20"/>
+                <w:szCs w:val="20"/>
+              </w:rPr>
+            </w:pPr>
+            <w:r>
+              <w:rPr>
+                <w:rFonts w:cs="Arial"/>
+                <w:sz w:val="20"/>
+                <w:szCs w:val="20"/>
+              </w:rPr>
               <w:t>Seed 42</w:t>
             </w:r>
           </w:p>
@@ -11924,7 +12058,21 @@
             <w:vAlign w:val="center"/>
           </w:tcPr>
           <w:p>
-            <w:r>
+            <w:pPr>
+              <w:spacing w:line="240" w:lineRule="auto"/>
+              <w:contextualSpacing/>
+              <w:rPr>
+                <w:rFonts w:cs="Arial"/>
+                <w:sz w:val="20"/>
+                <w:szCs w:val="20"/>
+              </w:rPr>
+            </w:pPr>
+            <w:r>
+              <w:rPr>
+                <w:rFonts w:cs="Arial"/>
+                <w:sz w:val="20"/>
+                <w:szCs w:val="20"/>
+              </w:rPr>
               <w:t>0.5470</w:t>
             </w:r>
           </w:p>
@@ -11942,13 +12090,30 @@
             <w:vAlign w:val="center"/>
           </w:tcPr>
           <w:p>
-            <w:r>
+            <w:pPr>
+              <w:spacing w:line="240" w:lineRule="auto"/>
+              <w:contextualSpacing/>
+              <w:rPr>
+                <w:rFonts w:cs="Arial"/>
+                <w:sz w:val="20"/>
+                <w:szCs w:val="20"/>
+              </w:rPr>
+            </w:pPr>
+            <w:r>
+              <w:rPr>
+                <w:rFonts w:cs="Arial"/>
+                <w:sz w:val="20"/>
+                <w:szCs w:val="20"/>
+              </w:rPr>
               <w:t>0.7402</w:t>
             </w:r>
           </w:p>
         </w:tc>
       </w:tr>
       <w:tr>
+        <w:trPr>
+          <w:trHeight w:val="288"/>
+        </w:trPr>
         <w:tc>
           <w:tcPr>
             <w:tcW w:w="0" w:type="auto"/>
@@ -11963,23 +12128,25 @@
           </w:tcPr>
           <w:p>
             <w:pPr>
-              <w:spacing w:before="30" w:after="30"/>
+              <w:spacing w:before="30" w:after="30" w:line="240" w:lineRule="auto"/>
+              <w:contextualSpacing/>
               <w:jc w:val="right"/>
               <w:rPr>
-                <w:rFonts w:hint="eastAsia"/>
-                <w:sz w:val="16"/>
-                <w:szCs w:val="16"/>
+                <w:rFonts w:cs="Arial"/>
+                <w:b/>
+                <w:sz w:val="20"/>
+                <w:szCs w:val="20"/>
                 <w:lang w:eastAsia="zh-CN"/>
               </w:rPr>
             </w:pPr>
             <w:r>
               <w:rPr>
-                <w:rFonts w:hint="eastAsia"/>
-                <w:sz w:val="16"/>
-                <w:szCs w:val="16"/>
+                <w:rFonts w:cs="Arial"/>
+                <w:b/>
+                <w:sz w:val="20"/>
+                <w:szCs w:val="20"/>
                 <w:lang w:eastAsia="zh-CN"/>
               </w:rPr>
-              <w:lastRenderedPageBreak/>
               <w:t>Run 2</w:t>
             </w:r>
           </w:p>
@@ -11997,7 +12164,21 @@
             <w:vAlign w:val="center"/>
           </w:tcPr>
           <w:p>
-            <w:r>
+            <w:pPr>
+              <w:spacing w:line="240" w:lineRule="auto"/>
+              <w:contextualSpacing/>
+              <w:rPr>
+                <w:rFonts w:cs="Arial"/>
+                <w:sz w:val="20"/>
+                <w:szCs w:val="20"/>
+              </w:rPr>
+            </w:pPr>
+            <w:r>
+              <w:rPr>
+                <w:rFonts w:cs="Arial"/>
+                <w:sz w:val="20"/>
+                <w:szCs w:val="20"/>
+              </w:rPr>
               <w:t>Seed 123</w:t>
             </w:r>
           </w:p>
@@ -12015,7 +12196,21 @@
             <w:vAlign w:val="center"/>
           </w:tcPr>
           <w:p>
-            <w:r>
+            <w:pPr>
+              <w:spacing w:line="240" w:lineRule="auto"/>
+              <w:contextualSpacing/>
+              <w:rPr>
+                <w:rFonts w:cs="Arial"/>
+                <w:sz w:val="20"/>
+                <w:szCs w:val="20"/>
+              </w:rPr>
+            </w:pPr>
+            <w:r>
+              <w:rPr>
+                <w:rFonts w:cs="Arial"/>
+                <w:sz w:val="20"/>
+                <w:szCs w:val="20"/>
+              </w:rPr>
               <w:t>0.5524</w:t>
             </w:r>
           </w:p>
@@ -12033,13 +12228,30 @@
             <w:vAlign w:val="center"/>
           </w:tcPr>
           <w:p>
-            <w:r>
+            <w:pPr>
+              <w:spacing w:line="240" w:lineRule="auto"/>
+              <w:contextualSpacing/>
+              <w:rPr>
+                <w:rFonts w:cs="Arial"/>
+                <w:sz w:val="20"/>
+                <w:szCs w:val="20"/>
+              </w:rPr>
+            </w:pPr>
+            <w:r>
+              <w:rPr>
+                <w:rFonts w:cs="Arial"/>
+                <w:sz w:val="20"/>
+                <w:szCs w:val="20"/>
+              </w:rPr>
               <w:t>0.7369</w:t>
             </w:r>
           </w:p>
         </w:tc>
       </w:tr>
       <w:tr>
+        <w:trPr>
+          <w:trHeight w:val="288"/>
+        </w:trPr>
         <w:tc>
           <w:tcPr>
             <w:tcW w:w="0" w:type="auto"/>
@@ -12054,20 +12266,23 @@
           </w:tcPr>
           <w:p>
             <w:pPr>
-              <w:spacing w:before="30" w:after="30"/>
+              <w:spacing w:before="30" w:after="30" w:line="240" w:lineRule="auto"/>
+              <w:contextualSpacing/>
               <w:jc w:val="right"/>
               <w:rPr>
-                <w:rFonts w:hint="eastAsia"/>
-                <w:sz w:val="16"/>
-                <w:szCs w:val="16"/>
+                <w:rFonts w:cs="Arial"/>
+                <w:b/>
+                <w:sz w:val="20"/>
+                <w:szCs w:val="20"/>
                 <w:lang w:eastAsia="zh-CN"/>
               </w:rPr>
             </w:pPr>
             <w:r>
               <w:rPr>
-                <w:rFonts w:hint="eastAsia"/>
-                <w:sz w:val="16"/>
-                <w:szCs w:val="16"/>
+                <w:rFonts w:cs="Arial"/>
+                <w:b/>
+                <w:sz w:val="20"/>
+                <w:szCs w:val="20"/>
                 <w:lang w:eastAsia="zh-CN"/>
               </w:rPr>
               <w:t>Run 3</w:t>
@@ -12087,7 +12302,21 @@
             <w:vAlign w:val="center"/>
           </w:tcPr>
           <w:p>
-            <w:r>
+            <w:pPr>
+              <w:spacing w:line="240" w:lineRule="auto"/>
+              <w:contextualSpacing/>
+              <w:rPr>
+                <w:rFonts w:cs="Arial"/>
+                <w:sz w:val="20"/>
+                <w:szCs w:val="20"/>
+              </w:rPr>
+            </w:pPr>
+            <w:r>
+              <w:rPr>
+                <w:rFonts w:cs="Arial"/>
+                <w:sz w:val="20"/>
+                <w:szCs w:val="20"/>
+              </w:rPr>
               <w:t>Seed 456</w:t>
             </w:r>
           </w:p>
@@ -12105,7 +12334,21 @@
             <w:vAlign w:val="center"/>
           </w:tcPr>
           <w:p>
-            <w:r>
+            <w:pPr>
+              <w:spacing w:line="240" w:lineRule="auto"/>
+              <w:contextualSpacing/>
+              <w:rPr>
+                <w:rFonts w:cs="Arial"/>
+                <w:sz w:val="20"/>
+                <w:szCs w:val="20"/>
+              </w:rPr>
+            </w:pPr>
+            <w:r>
+              <w:rPr>
+                <w:rFonts w:cs="Arial"/>
+                <w:sz w:val="20"/>
+                <w:szCs w:val="20"/>
+              </w:rPr>
               <w:t>0.5636</w:t>
             </w:r>
           </w:p>
@@ -12123,13 +12366,30 @@
             <w:vAlign w:val="center"/>
           </w:tcPr>
           <w:p>
-            <w:r>
+            <w:pPr>
+              <w:spacing w:line="240" w:lineRule="auto"/>
+              <w:contextualSpacing/>
+              <w:rPr>
+                <w:rFonts w:cs="Arial"/>
+                <w:sz w:val="20"/>
+                <w:szCs w:val="20"/>
+              </w:rPr>
+            </w:pPr>
+            <w:r>
+              <w:rPr>
+                <w:rFonts w:cs="Arial"/>
+                <w:sz w:val="20"/>
+                <w:szCs w:val="20"/>
+              </w:rPr>
               <w:t>0.7523</w:t>
             </w:r>
           </w:p>
         </w:tc>
       </w:tr>
       <w:tr>
+        <w:trPr>
+          <w:trHeight w:val="288"/>
+        </w:trPr>
         <w:tc>
           <w:tcPr>
             <w:tcW w:w="0" w:type="auto"/>
@@ -12144,20 +12404,23 @@
           </w:tcPr>
           <w:p>
             <w:pPr>
-              <w:spacing w:before="30" w:after="30"/>
+              <w:spacing w:before="30" w:after="30" w:line="240" w:lineRule="auto"/>
+              <w:contextualSpacing/>
               <w:jc w:val="right"/>
               <w:rPr>
-                <w:rFonts w:hint="eastAsia"/>
-                <w:sz w:val="16"/>
-                <w:szCs w:val="16"/>
+                <w:rFonts w:cs="Arial"/>
+                <w:b/>
+                <w:sz w:val="20"/>
+                <w:szCs w:val="20"/>
                 <w:lang w:eastAsia="zh-CN"/>
               </w:rPr>
             </w:pPr>
             <w:r>
               <w:rPr>
-                <w:rFonts w:hint="eastAsia"/>
-                <w:sz w:val="16"/>
-                <w:szCs w:val="16"/>
+                <w:rFonts w:cs="Arial"/>
+                <w:b/>
+                <w:sz w:val="20"/>
+                <w:szCs w:val="20"/>
                 <w:lang w:eastAsia="zh-CN"/>
               </w:rPr>
               <w:t>Run 4</w:t>
@@ -12177,7 +12440,21 @@
             <w:vAlign w:val="center"/>
           </w:tcPr>
           <w:p>
-            <w:r>
+            <w:pPr>
+              <w:spacing w:line="240" w:lineRule="auto"/>
+              <w:contextualSpacing/>
+              <w:rPr>
+                <w:rFonts w:cs="Arial"/>
+                <w:sz w:val="20"/>
+                <w:szCs w:val="20"/>
+              </w:rPr>
+            </w:pPr>
+            <w:r>
+              <w:rPr>
+                <w:rFonts w:cs="Arial"/>
+                <w:sz w:val="20"/>
+                <w:szCs w:val="20"/>
+              </w:rPr>
               <w:t>Seed 789</w:t>
             </w:r>
           </w:p>
@@ -12195,7 +12472,21 @@
             <w:vAlign w:val="center"/>
           </w:tcPr>
           <w:p>
-            <w:r>
+            <w:pPr>
+              <w:spacing w:line="240" w:lineRule="auto"/>
+              <w:contextualSpacing/>
+              <w:rPr>
+                <w:rFonts w:cs="Arial"/>
+                <w:sz w:val="20"/>
+                <w:szCs w:val="20"/>
+              </w:rPr>
+            </w:pPr>
+            <w:r>
+              <w:rPr>
+                <w:rFonts w:cs="Arial"/>
+                <w:sz w:val="20"/>
+                <w:szCs w:val="20"/>
+              </w:rPr>
               <w:t>0.5571</w:t>
             </w:r>
           </w:p>
@@ -12213,13 +12504,30 @@
             <w:vAlign w:val="center"/>
           </w:tcPr>
           <w:p>
-            <w:r>
+            <w:pPr>
+              <w:spacing w:line="240" w:lineRule="auto"/>
+              <w:contextualSpacing/>
+              <w:rPr>
+                <w:rFonts w:cs="Arial"/>
+                <w:sz w:val="20"/>
+                <w:szCs w:val="20"/>
+              </w:rPr>
+            </w:pPr>
+            <w:r>
+              <w:rPr>
+                <w:rFonts w:cs="Arial"/>
+                <w:sz w:val="20"/>
+                <w:szCs w:val="20"/>
+              </w:rPr>
               <w:t>0.7386</w:t>
             </w:r>
           </w:p>
         </w:tc>
       </w:tr>
       <w:tr>
+        <w:trPr>
+          <w:trHeight w:val="288"/>
+        </w:trPr>
         <w:tc>
           <w:tcPr>
             <w:tcW w:w="0" w:type="auto"/>
@@ -12234,20 +12542,23 @@
           </w:tcPr>
           <w:p>
             <w:pPr>
-              <w:spacing w:before="30" w:after="30"/>
+              <w:spacing w:before="30" w:after="30" w:line="240" w:lineRule="auto"/>
+              <w:contextualSpacing/>
               <w:jc w:val="right"/>
               <w:rPr>
-                <w:rFonts w:hint="eastAsia"/>
-                <w:sz w:val="16"/>
-                <w:szCs w:val="16"/>
+                <w:rFonts w:cs="Arial"/>
+                <w:b/>
+                <w:sz w:val="20"/>
+                <w:szCs w:val="20"/>
                 <w:lang w:eastAsia="zh-CN"/>
               </w:rPr>
             </w:pPr>
             <w:r>
               <w:rPr>
-                <w:rFonts w:hint="eastAsia"/>
-                <w:sz w:val="16"/>
-                <w:szCs w:val="16"/>
+                <w:rFonts w:cs="Arial"/>
+                <w:b/>
+                <w:sz w:val="20"/>
+                <w:szCs w:val="20"/>
                 <w:lang w:eastAsia="zh-CN"/>
               </w:rPr>
               <w:t>Run 5</w:t>
@@ -12267,7 +12578,21 @@
             <w:vAlign w:val="center"/>
           </w:tcPr>
           <w:p>
-            <w:r>
+            <w:pPr>
+              <w:spacing w:line="240" w:lineRule="auto"/>
+              <w:contextualSpacing/>
+              <w:rPr>
+                <w:rFonts w:cs="Arial"/>
+                <w:sz w:val="20"/>
+                <w:szCs w:val="20"/>
+              </w:rPr>
+            </w:pPr>
+            <w:r>
+              <w:rPr>
+                <w:rFonts w:cs="Arial"/>
+                <w:sz w:val="20"/>
+                <w:szCs w:val="20"/>
+              </w:rPr>
               <w:t>Seed 1011</w:t>
             </w:r>
           </w:p>
@@ -12285,7 +12610,21 @@
             <w:vAlign w:val="center"/>
           </w:tcPr>
           <w:p>
-            <w:r>
+            <w:pPr>
+              <w:spacing w:line="240" w:lineRule="auto"/>
+              <w:contextualSpacing/>
+              <w:rPr>
+                <w:rFonts w:cs="Arial"/>
+                <w:sz w:val="20"/>
+                <w:szCs w:val="20"/>
+              </w:rPr>
+            </w:pPr>
+            <w:r>
+              <w:rPr>
+                <w:rFonts w:cs="Arial"/>
+                <w:sz w:val="20"/>
+                <w:szCs w:val="20"/>
+              </w:rPr>
               <w:t>0.5620</w:t>
             </w:r>
           </w:p>
@@ -12303,13 +12642,30 @@
             <w:vAlign w:val="center"/>
           </w:tcPr>
           <w:p>
-            <w:r>
+            <w:pPr>
+              <w:spacing w:line="240" w:lineRule="auto"/>
+              <w:contextualSpacing/>
+              <w:rPr>
+                <w:rFonts w:cs="Arial"/>
+                <w:sz w:val="20"/>
+                <w:szCs w:val="20"/>
+              </w:rPr>
+            </w:pPr>
+            <w:r>
+              <w:rPr>
+                <w:rFonts w:cs="Arial"/>
+                <w:sz w:val="20"/>
+                <w:szCs w:val="20"/>
+              </w:rPr>
               <w:t>0.7422</w:t>
             </w:r>
           </w:p>
         </w:tc>
       </w:tr>
       <w:tr>
+        <w:trPr>
+          <w:trHeight w:val="288"/>
+        </w:trPr>
         <w:tc>
           <w:tcPr>
             <w:tcW w:w="0" w:type="auto"/>
@@ -12323,7 +12679,24 @@
             <w:vAlign w:val="center"/>
           </w:tcPr>
           <w:p>
-            <w:r>
+            <w:pPr>
+              <w:spacing w:line="240" w:lineRule="auto"/>
+              <w:contextualSpacing/>
+              <w:jc w:val="right"/>
+              <w:rPr>
+                <w:rFonts w:cs="Arial"/>
+                <w:b/>
+                <w:sz w:val="20"/>
+                <w:szCs w:val="20"/>
+              </w:rPr>
+            </w:pPr>
+            <w:r>
+              <w:rPr>
+                <w:rFonts w:cs="Arial"/>
+                <w:b/>
+                <w:sz w:val="20"/>
+                <w:szCs w:val="20"/>
+              </w:rPr>
               <w:t>FAERS</w:t>
             </w:r>
           </w:p>
@@ -12341,7 +12714,23 @@
             <w:vAlign w:val="center"/>
           </w:tcPr>
           <w:p>
-            <w:r>
+            <w:pPr>
+              <w:spacing w:line="240" w:lineRule="auto"/>
+              <w:contextualSpacing/>
+              <w:rPr>
+                <w:rFonts w:cs="Arial"/>
+                <w:b/>
+                <w:sz w:val="20"/>
+                <w:szCs w:val="20"/>
+              </w:rPr>
+            </w:pPr>
+            <w:r>
+              <w:rPr>
+                <w:rFonts w:cs="Arial"/>
+                <w:b/>
+                <w:sz w:val="20"/>
+                <w:szCs w:val="20"/>
+              </w:rPr>
               <w:t>Average</w:t>
             </w:r>
           </w:p>
@@ -12359,7 +12748,23 @@
             <w:vAlign w:val="center"/>
           </w:tcPr>
           <w:p>
-            <w:r>
+            <w:pPr>
+              <w:spacing w:line="240" w:lineRule="auto"/>
+              <w:contextualSpacing/>
+              <w:rPr>
+                <w:rFonts w:cs="Arial"/>
+                <w:b/>
+                <w:sz w:val="20"/>
+                <w:szCs w:val="20"/>
+              </w:rPr>
+            </w:pPr>
+            <w:r>
+              <w:rPr>
+                <w:rFonts w:cs="Arial"/>
+                <w:b/>
+                <w:sz w:val="20"/>
+                <w:szCs w:val="20"/>
+              </w:rPr>
               <w:t>0.5564 ± 0.0069</w:t>
             </w:r>
           </w:p>
@@ -12377,13 +12782,32 @@
             <w:vAlign w:val="center"/>
           </w:tcPr>
           <w:p>
-            <w:r>
+            <w:pPr>
+              <w:spacing w:line="240" w:lineRule="auto"/>
+              <w:contextualSpacing/>
+              <w:rPr>
+                <w:rFonts w:cs="Arial"/>
+                <w:b/>
+                <w:sz w:val="20"/>
+                <w:szCs w:val="20"/>
+              </w:rPr>
+            </w:pPr>
+            <w:r>
+              <w:rPr>
+                <w:rFonts w:cs="Arial"/>
+                <w:b/>
+                <w:sz w:val="20"/>
+                <w:szCs w:val="20"/>
+              </w:rPr>
               <w:t>0.7420 ± 0.0061</w:t>
             </w:r>
           </w:p>
         </w:tc>
       </w:tr>
       <w:tr>
+        <w:trPr>
+          <w:trHeight w:val="288"/>
+        </w:trPr>
         <w:tc>
           <w:tcPr>
             <w:tcW w:w="0" w:type="auto"/>
@@ -12398,34 +12822,44 @@
           </w:tcPr>
           <w:p>
             <w:pPr>
-              <w:spacing w:before="30" w:after="30"/>
+              <w:spacing w:before="30" w:after="30" w:line="240" w:lineRule="auto"/>
+              <w:contextualSpacing/>
               <w:jc w:val="right"/>
-            </w:pPr>
-            <w:r>
-              <w:rPr>
-                <w:rFonts w:ascii="Arial" w:hAnsi="Arial"/>
+              <w:rPr>
+                <w:rFonts w:cs="Arial"/>
+                <w:b/>
+                <w:sz w:val="20"/>
+                <w:szCs w:val="20"/>
+              </w:rPr>
+            </w:pPr>
+            <w:r>
+              <w:rPr>
+                <w:rFonts w:cs="Arial"/>
                 <w:b/>
                 <w:color w:val="222222"/>
-                <w:sz w:val="16"/>
+                <w:sz w:val="20"/>
+                <w:szCs w:val="20"/>
               </w:rPr>
               <w:t>VAERS</w:t>
             </w:r>
             <w:r>
               <w:rPr>
-                <w:rFonts w:ascii="Arial" w:hAnsi="Arial" w:hint="eastAsia"/>
+                <w:rFonts w:cs="Arial"/>
                 <w:b/>
                 <w:color w:val="222222"/>
-                <w:sz w:val="16"/>
+                <w:sz w:val="20"/>
+                <w:szCs w:val="20"/>
                 <w:lang w:eastAsia="zh-CN"/>
               </w:rPr>
               <w:t xml:space="preserve"> Run 1</w:t>
             </w:r>
             <w:r>
               <w:rPr>
-                <w:rFonts w:ascii="Arial" w:hAnsi="Arial"/>
+                <w:rFonts w:cs="Arial"/>
                 <w:b/>
                 <w:color w:val="222222"/>
-                <w:sz w:val="16"/>
+                <w:sz w:val="20"/>
+                <w:szCs w:val="20"/>
               </w:rPr>
               <w:t xml:space="preserve"> </w:t>
             </w:r>
@@ -12444,7 +12878,21 @@
             <w:vAlign w:val="center"/>
           </w:tcPr>
           <w:p>
-            <w:r>
+            <w:pPr>
+              <w:spacing w:line="240" w:lineRule="auto"/>
+              <w:contextualSpacing/>
+              <w:rPr>
+                <w:rFonts w:cs="Arial"/>
+                <w:sz w:val="20"/>
+                <w:szCs w:val="20"/>
+              </w:rPr>
+            </w:pPr>
+            <w:r>
+              <w:rPr>
+                <w:rFonts w:cs="Arial"/>
+                <w:sz w:val="20"/>
+                <w:szCs w:val="20"/>
+              </w:rPr>
               <w:t>Seed 42</w:t>
             </w:r>
           </w:p>
@@ -12462,7 +12910,21 @@
             <w:vAlign w:val="center"/>
           </w:tcPr>
           <w:p>
-            <w:r>
+            <w:pPr>
+              <w:spacing w:line="240" w:lineRule="auto"/>
+              <w:contextualSpacing/>
+              <w:rPr>
+                <w:rFonts w:cs="Arial"/>
+                <w:sz w:val="20"/>
+                <w:szCs w:val="20"/>
+              </w:rPr>
+            </w:pPr>
+            <w:r>
+              <w:rPr>
+                <w:rFonts w:cs="Arial"/>
+                <w:sz w:val="20"/>
+                <w:szCs w:val="20"/>
+              </w:rPr>
               <w:t>0.7015 ± 0.0174</w:t>
             </w:r>
           </w:p>
@@ -12480,13 +12942,30 @@
             <w:vAlign w:val="center"/>
           </w:tcPr>
           <w:p>
-            <w:r>
+            <w:pPr>
+              <w:spacing w:line="240" w:lineRule="auto"/>
+              <w:contextualSpacing/>
+              <w:rPr>
+                <w:rFonts w:cs="Arial"/>
+                <w:sz w:val="20"/>
+                <w:szCs w:val="20"/>
+              </w:rPr>
+            </w:pPr>
+            <w:r>
+              <w:rPr>
+                <w:rFonts w:cs="Arial"/>
+                <w:sz w:val="20"/>
+                <w:szCs w:val="20"/>
+              </w:rPr>
               <w:t>0.8370 ± 0.0095</w:t>
             </w:r>
           </w:p>
         </w:tc>
       </w:tr>
       <w:tr>
+        <w:trPr>
+          <w:trHeight w:val="288"/>
+        </w:trPr>
         <w:tc>
           <w:tcPr>
             <w:tcW w:w="0" w:type="auto"/>
@@ -12501,18 +12980,22 @@
           </w:tcPr>
           <w:p>
             <w:pPr>
-              <w:spacing w:before="30" w:after="30"/>
+              <w:spacing w:before="30" w:after="30" w:line="240" w:lineRule="auto"/>
+              <w:contextualSpacing/>
               <w:jc w:val="right"/>
               <w:rPr>
-                <w:sz w:val="16"/>
-                <w:szCs w:val="16"/>
-              </w:rPr>
-            </w:pPr>
-            <w:r>
-              <w:rPr>
-                <w:rFonts w:hint="eastAsia"/>
-                <w:sz w:val="16"/>
-                <w:szCs w:val="16"/>
+                <w:rFonts w:cs="Arial"/>
+                <w:b/>
+                <w:sz w:val="20"/>
+                <w:szCs w:val="20"/>
+              </w:rPr>
+            </w:pPr>
+            <w:r>
+              <w:rPr>
+                <w:rFonts w:cs="Arial"/>
+                <w:b/>
+                <w:sz w:val="20"/>
+                <w:szCs w:val="20"/>
                 <w:lang w:eastAsia="zh-CN"/>
               </w:rPr>
               <w:t>Run 2</w:t>
@@ -12532,7 +13015,21 @@
             <w:vAlign w:val="center"/>
           </w:tcPr>
           <w:p>
-            <w:r>
+            <w:pPr>
+              <w:spacing w:line="240" w:lineRule="auto"/>
+              <w:contextualSpacing/>
+              <w:rPr>
+                <w:rFonts w:cs="Arial"/>
+                <w:sz w:val="20"/>
+                <w:szCs w:val="20"/>
+              </w:rPr>
+            </w:pPr>
+            <w:r>
+              <w:rPr>
+                <w:rFonts w:cs="Arial"/>
+                <w:sz w:val="20"/>
+                <w:szCs w:val="20"/>
+              </w:rPr>
               <w:t>Seed 123</w:t>
             </w:r>
           </w:p>
@@ -12550,7 +13047,21 @@
             <w:vAlign w:val="center"/>
           </w:tcPr>
           <w:p>
-            <w:r>
+            <w:pPr>
+              <w:spacing w:line="240" w:lineRule="auto"/>
+              <w:contextualSpacing/>
+              <w:rPr>
+                <w:rFonts w:cs="Arial"/>
+                <w:sz w:val="20"/>
+                <w:szCs w:val="20"/>
+              </w:rPr>
+            </w:pPr>
+            <w:r>
+              <w:rPr>
+                <w:rFonts w:cs="Arial"/>
+                <w:sz w:val="20"/>
+                <w:szCs w:val="20"/>
+              </w:rPr>
               <w:t>0.7013 ± 0.0156</w:t>
             </w:r>
           </w:p>
@@ -12568,13 +13079,30 @@
             <w:vAlign w:val="center"/>
           </w:tcPr>
           <w:p>
-            <w:r>
+            <w:pPr>
+              <w:spacing w:line="240" w:lineRule="auto"/>
+              <w:contextualSpacing/>
+              <w:rPr>
+                <w:rFonts w:cs="Arial"/>
+                <w:sz w:val="20"/>
+                <w:szCs w:val="20"/>
+              </w:rPr>
+            </w:pPr>
+            <w:r>
+              <w:rPr>
+                <w:rFonts w:cs="Arial"/>
+                <w:sz w:val="20"/>
+                <w:szCs w:val="20"/>
+              </w:rPr>
               <w:t>0.8405 ± 0.0070</w:t>
             </w:r>
           </w:p>
         </w:tc>
       </w:tr>
       <w:tr>
+        <w:trPr>
+          <w:trHeight w:val="288"/>
+        </w:trPr>
         <w:tc>
           <w:tcPr>
             <w:tcW w:w="0" w:type="auto"/>
@@ -12589,18 +13117,22 @@
           </w:tcPr>
           <w:p>
             <w:pPr>
-              <w:spacing w:before="30" w:after="30"/>
+              <w:spacing w:before="30" w:after="30" w:line="240" w:lineRule="auto"/>
+              <w:contextualSpacing/>
               <w:jc w:val="right"/>
               <w:rPr>
-                <w:sz w:val="16"/>
-                <w:szCs w:val="16"/>
-              </w:rPr>
-            </w:pPr>
-            <w:r>
-              <w:rPr>
-                <w:rFonts w:hint="eastAsia"/>
-                <w:sz w:val="16"/>
-                <w:szCs w:val="16"/>
+                <w:rFonts w:cs="Arial"/>
+                <w:b/>
+                <w:sz w:val="20"/>
+                <w:szCs w:val="20"/>
+              </w:rPr>
+            </w:pPr>
+            <w:r>
+              <w:rPr>
+                <w:rFonts w:cs="Arial"/>
+                <w:b/>
+                <w:sz w:val="20"/>
+                <w:szCs w:val="20"/>
                 <w:lang w:eastAsia="zh-CN"/>
               </w:rPr>
               <w:t>Run 3</w:t>
@@ -12620,7 +13152,21 @@
             <w:vAlign w:val="center"/>
           </w:tcPr>
           <w:p>
-            <w:r>
+            <w:pPr>
+              <w:spacing w:line="240" w:lineRule="auto"/>
+              <w:contextualSpacing/>
+              <w:rPr>
+                <w:rFonts w:cs="Arial"/>
+                <w:sz w:val="20"/>
+                <w:szCs w:val="20"/>
+              </w:rPr>
+            </w:pPr>
+            <w:r>
+              <w:rPr>
+                <w:rFonts w:cs="Arial"/>
+                <w:sz w:val="20"/>
+                <w:szCs w:val="20"/>
+              </w:rPr>
               <w:t>Seed 456</w:t>
             </w:r>
           </w:p>
@@ -12638,7 +13184,21 @@
             <w:vAlign w:val="center"/>
           </w:tcPr>
           <w:p>
-            <w:r>
+            <w:pPr>
+              <w:spacing w:line="240" w:lineRule="auto"/>
+              <w:contextualSpacing/>
+              <w:rPr>
+                <w:rFonts w:cs="Arial"/>
+                <w:sz w:val="20"/>
+                <w:szCs w:val="20"/>
+              </w:rPr>
+            </w:pPr>
+            <w:r>
+              <w:rPr>
+                <w:rFonts w:cs="Arial"/>
+                <w:sz w:val="20"/>
+                <w:szCs w:val="20"/>
+              </w:rPr>
               <w:t>0.7008 ± 0.0202</w:t>
             </w:r>
           </w:p>
@@ -12656,13 +13216,30 @@
             <w:vAlign w:val="center"/>
           </w:tcPr>
           <w:p>
-            <w:r>
+            <w:pPr>
+              <w:spacing w:line="240" w:lineRule="auto"/>
+              <w:contextualSpacing/>
+              <w:rPr>
+                <w:rFonts w:cs="Arial"/>
+                <w:sz w:val="20"/>
+                <w:szCs w:val="20"/>
+              </w:rPr>
+            </w:pPr>
+            <w:r>
+              <w:rPr>
+                <w:rFonts w:cs="Arial"/>
+                <w:sz w:val="20"/>
+                <w:szCs w:val="20"/>
+              </w:rPr>
               <w:t>0.8400 ± 0.0113</w:t>
             </w:r>
           </w:p>
         </w:tc>
       </w:tr>
       <w:tr>
+        <w:trPr>
+          <w:trHeight w:val="288"/>
+        </w:trPr>
         <w:tc>
           <w:tcPr>
             <w:tcW w:w="0" w:type="auto"/>
@@ -12677,18 +13254,22 @@
           </w:tcPr>
           <w:p>
             <w:pPr>
-              <w:spacing w:before="30" w:after="30"/>
+              <w:spacing w:before="30" w:after="30" w:line="240" w:lineRule="auto"/>
+              <w:contextualSpacing/>
               <w:jc w:val="right"/>
               <w:rPr>
-                <w:sz w:val="16"/>
-                <w:szCs w:val="16"/>
-              </w:rPr>
-            </w:pPr>
-            <w:r>
-              <w:rPr>
-                <w:rFonts w:hint="eastAsia"/>
-                <w:sz w:val="16"/>
-                <w:szCs w:val="16"/>
+                <w:rFonts w:cs="Arial"/>
+                <w:b/>
+                <w:sz w:val="20"/>
+                <w:szCs w:val="20"/>
+              </w:rPr>
+            </w:pPr>
+            <w:r>
+              <w:rPr>
+                <w:rFonts w:cs="Arial"/>
+                <w:b/>
+                <w:sz w:val="20"/>
+                <w:szCs w:val="20"/>
                 <w:lang w:eastAsia="zh-CN"/>
               </w:rPr>
               <w:t>Run 4</w:t>
@@ -12708,7 +13289,21 @@
             <w:vAlign w:val="center"/>
           </w:tcPr>
           <w:p>
-            <w:r>
+            <w:pPr>
+              <w:spacing w:line="240" w:lineRule="auto"/>
+              <w:contextualSpacing/>
+              <w:rPr>
+                <w:rFonts w:cs="Arial"/>
+                <w:sz w:val="20"/>
+                <w:szCs w:val="20"/>
+              </w:rPr>
+            </w:pPr>
+            <w:r>
+              <w:rPr>
+                <w:rFonts w:cs="Arial"/>
+                <w:sz w:val="20"/>
+                <w:szCs w:val="20"/>
+              </w:rPr>
               <w:t>Seed 789</w:t>
             </w:r>
           </w:p>
@@ -12726,7 +13321,21 @@
             <w:vAlign w:val="center"/>
           </w:tcPr>
           <w:p>
-            <w:r>
+            <w:pPr>
+              <w:spacing w:line="240" w:lineRule="auto"/>
+              <w:contextualSpacing/>
+              <w:rPr>
+                <w:rFonts w:cs="Arial"/>
+                <w:sz w:val="20"/>
+                <w:szCs w:val="20"/>
+              </w:rPr>
+            </w:pPr>
+            <w:r>
+              <w:rPr>
+                <w:rFonts w:cs="Arial"/>
+                <w:sz w:val="20"/>
+                <w:szCs w:val="20"/>
+              </w:rPr>
               <w:t>0.7026 ± 0.0152</w:t>
             </w:r>
           </w:p>
@@ -12744,13 +13353,30 @@
             <w:vAlign w:val="center"/>
           </w:tcPr>
           <w:p>
-            <w:r>
+            <w:pPr>
+              <w:spacing w:line="240" w:lineRule="auto"/>
+              <w:contextualSpacing/>
+              <w:rPr>
+                <w:rFonts w:cs="Arial"/>
+                <w:sz w:val="20"/>
+                <w:szCs w:val="20"/>
+              </w:rPr>
+            </w:pPr>
+            <w:r>
+              <w:rPr>
+                <w:rFonts w:cs="Arial"/>
+                <w:sz w:val="20"/>
+                <w:szCs w:val="20"/>
+              </w:rPr>
               <w:t>0.8419 ± 0.0082</w:t>
             </w:r>
           </w:p>
         </w:tc>
       </w:tr>
       <w:tr>
+        <w:trPr>
+          <w:trHeight w:val="288"/>
+        </w:trPr>
         <w:tc>
           <w:tcPr>
             <w:tcW w:w="0" w:type="auto"/>
@@ -12765,18 +13391,22 @@
           </w:tcPr>
           <w:p>
             <w:pPr>
-              <w:spacing w:before="30" w:after="30"/>
+              <w:spacing w:before="30" w:after="30" w:line="240" w:lineRule="auto"/>
+              <w:contextualSpacing/>
               <w:jc w:val="right"/>
               <w:rPr>
-                <w:sz w:val="16"/>
-                <w:szCs w:val="16"/>
-              </w:rPr>
-            </w:pPr>
-            <w:r>
-              <w:rPr>
-                <w:rFonts w:hint="eastAsia"/>
-                <w:sz w:val="16"/>
-                <w:szCs w:val="16"/>
+                <w:rFonts w:cs="Arial"/>
+                <w:b/>
+                <w:sz w:val="20"/>
+                <w:szCs w:val="20"/>
+              </w:rPr>
+            </w:pPr>
+            <w:r>
+              <w:rPr>
+                <w:rFonts w:cs="Arial"/>
+                <w:b/>
+                <w:sz w:val="20"/>
+                <w:szCs w:val="20"/>
                 <w:lang w:eastAsia="zh-CN"/>
               </w:rPr>
               <w:t>Run 5</w:t>
@@ -12796,7 +13426,21 @@
             <w:vAlign w:val="center"/>
           </w:tcPr>
           <w:p>
-            <w:r>
+            <w:pPr>
+              <w:spacing w:line="240" w:lineRule="auto"/>
+              <w:contextualSpacing/>
+              <w:rPr>
+                <w:rFonts w:cs="Arial"/>
+                <w:sz w:val="20"/>
+                <w:szCs w:val="20"/>
+              </w:rPr>
+            </w:pPr>
+            <w:r>
+              <w:rPr>
+                <w:rFonts w:cs="Arial"/>
+                <w:sz w:val="20"/>
+                <w:szCs w:val="20"/>
+              </w:rPr>
               <w:t>Seed 1011</w:t>
             </w:r>
           </w:p>
@@ -12814,7 +13458,21 @@
             <w:vAlign w:val="center"/>
           </w:tcPr>
           <w:p>
-            <w:r>
+            <w:pPr>
+              <w:spacing w:line="240" w:lineRule="auto"/>
+              <w:contextualSpacing/>
+              <w:rPr>
+                <w:rFonts w:cs="Arial"/>
+                <w:sz w:val="20"/>
+                <w:szCs w:val="20"/>
+              </w:rPr>
+            </w:pPr>
+            <w:r>
+              <w:rPr>
+                <w:rFonts w:cs="Arial"/>
+                <w:sz w:val="20"/>
+                <w:szCs w:val="20"/>
+              </w:rPr>
               <w:t>0.6983 ± 0.0159</w:t>
             </w:r>
           </w:p>
@@ -12832,13 +13490,30 @@
             <w:vAlign w:val="center"/>
           </w:tcPr>
           <w:p>
-            <w:r>
+            <w:pPr>
+              <w:spacing w:line="240" w:lineRule="auto"/>
+              <w:contextualSpacing/>
+              <w:rPr>
+                <w:rFonts w:cs="Arial"/>
+                <w:sz w:val="20"/>
+                <w:szCs w:val="20"/>
+              </w:rPr>
+            </w:pPr>
+            <w:r>
+              <w:rPr>
+                <w:rFonts w:cs="Arial"/>
+                <w:sz w:val="20"/>
+                <w:szCs w:val="20"/>
+              </w:rPr>
               <w:t>0.8389 ± 0.0091</w:t>
             </w:r>
           </w:p>
         </w:tc>
       </w:tr>
       <w:tr>
+        <w:trPr>
+          <w:trHeight w:val="288"/>
+        </w:trPr>
         <w:tc>
           <w:tcPr>
             <w:tcW w:w="0" w:type="auto"/>
@@ -12852,7 +13527,24 @@
             <w:vAlign w:val="center"/>
           </w:tcPr>
           <w:p>
-            <w:r>
+            <w:pPr>
+              <w:spacing w:line="240" w:lineRule="auto"/>
+              <w:contextualSpacing/>
+              <w:jc w:val="right"/>
+              <w:rPr>
+                <w:rFonts w:cs="Arial"/>
+                <w:b/>
+                <w:sz w:val="20"/>
+                <w:szCs w:val="20"/>
+              </w:rPr>
+            </w:pPr>
+            <w:r>
+              <w:rPr>
+                <w:rFonts w:cs="Arial"/>
+                <w:b/>
+                <w:sz w:val="20"/>
+                <w:szCs w:val="20"/>
+              </w:rPr>
               <w:t>VAERS</w:t>
             </w:r>
           </w:p>
@@ -12870,7 +13562,23 @@
             <w:vAlign w:val="center"/>
           </w:tcPr>
           <w:p>
-            <w:r>
+            <w:pPr>
+              <w:spacing w:line="240" w:lineRule="auto"/>
+              <w:contextualSpacing/>
+              <w:rPr>
+                <w:rFonts w:cs="Arial"/>
+                <w:b/>
+                <w:sz w:val="20"/>
+                <w:szCs w:val="20"/>
+              </w:rPr>
+            </w:pPr>
+            <w:r>
+              <w:rPr>
+                <w:rFonts w:cs="Arial"/>
+                <w:b/>
+                <w:sz w:val="20"/>
+                <w:szCs w:val="20"/>
+              </w:rPr>
               <w:t>Average</w:t>
             </w:r>
           </w:p>
@@ -12888,7 +13596,23 @@
             <w:vAlign w:val="center"/>
           </w:tcPr>
           <w:p>
-            <w:r>
+            <w:pPr>
+              <w:spacing w:line="240" w:lineRule="auto"/>
+              <w:contextualSpacing/>
+              <w:rPr>
+                <w:rFonts w:cs="Arial"/>
+                <w:b/>
+                <w:sz w:val="20"/>
+                <w:szCs w:val="20"/>
+              </w:rPr>
+            </w:pPr>
+            <w:r>
+              <w:rPr>
+                <w:rFonts w:cs="Arial"/>
+                <w:b/>
+                <w:sz w:val="20"/>
+                <w:szCs w:val="20"/>
+              </w:rPr>
               <w:t>0.7009 ± 0.0016</w:t>
             </w:r>
           </w:p>
@@ -12906,7 +13630,23 @@
             <w:vAlign w:val="center"/>
           </w:tcPr>
           <w:p>
-            <w:r>
+            <w:pPr>
+              <w:spacing w:line="240" w:lineRule="auto"/>
+              <w:contextualSpacing/>
+              <w:rPr>
+                <w:rFonts w:cs="Arial"/>
+                <w:b/>
+                <w:sz w:val="20"/>
+                <w:szCs w:val="20"/>
+              </w:rPr>
+            </w:pPr>
+            <w:r>
+              <w:rPr>
+                <w:rFonts w:cs="Arial"/>
+                <w:b/>
+                <w:sz w:val="20"/>
+                <w:szCs w:val="20"/>
+              </w:rPr>
               <w:t>0.8397 ± 0.0018</w:t>
             </w:r>
           </w:p>
@@ -13476,45 +14216,12 @@
         <w:pStyle w:val="Heading3"/>
       </w:pPr>
       <w:r>
-        <w:lastRenderedPageBreak/>
         <w:t>Pretrained Transformer Encoder Architecture Ablation</w:t>
       </w:r>
     </w:p>
     <w:p>
       <w:r>
-        <w:t xml:space="preserve">To investigate the impact of underlying pretraining corpora on pharmacovigilance concept extraction, we conducted an ablation study comparing four transformer encoder architectures (BERT-Base, </w:t>
-      </w:r>
-      <w:proofErr w:type="spellStart"/>
-      <w:r>
-        <w:t>BioBERT</w:t>
-      </w:r>
-      <w:proofErr w:type="spellEnd"/>
-      <w:r>
-        <w:t xml:space="preserve">, </w:t>
-      </w:r>
-      <w:proofErr w:type="spellStart"/>
-      <w:r>
-        <w:t>Bio_ClinicalBERT</w:t>
-      </w:r>
-      <w:proofErr w:type="spellEnd"/>
-      <w:r>
-        <w:t xml:space="preserve">, and </w:t>
-      </w:r>
-      <w:proofErr w:type="spellStart"/>
-      <w:r>
-        <w:t>ClinicalBERT</w:t>
-      </w:r>
-      <w:proofErr w:type="spellEnd"/>
-      <w:r>
-        <w:t xml:space="preserve">) on the VAERS dataset across 5 independent random initialization seeds (Table 8). </w:t>
-      </w:r>
-      <w:proofErr w:type="spellStart"/>
-      <w:r>
-        <w:t>BioBERT</w:t>
-      </w:r>
-      <w:proofErr w:type="spellEnd"/>
-      <w:r>
-        <w:t xml:space="preserve"> achieved the highest validation F1 (0.8471 ± 0.0058, Precision = 0.8666, Recall = 0.8285), confirming its selection as the primary encoder architecture. All four models demonstrated close performance with minimal variance across seeds (SD &lt; 0.009).</w:t>
+        <w:t>To investigate the impact of underlying pretraining corpora on pharmacovigilance concept extraction, we conducted an ablation study comparing four transformer encoder architectures (BERT-Base, BioBERT, Bio_ClinicalBERT, and ClinicalBERT) on the VAERS dataset across 5 independent random initialization seeds (Table 8). BioBERT achieved the highest validation F1 (0.8471 ± 0.0058, Precision = 0.8666, Recall = 0.8285), confirming its selection as the primary encoder architecture. All four models demonstrated close performance with minimal variance across seeds (SD &lt; 0.009).</w:t>
       </w:r>
     </w:p>
     <w:p>
@@ -13566,7 +14273,6 @@
     <w:tbl>
       <w:tblPr>
         <w:tblW w:w="0" w:type="auto"/>
-        <w:jc w:val="center"/>
         <w:tblBorders>
           <w:top w:val="single" w:sz="8" w:space="0" w:color="333333"/>
           <w:bottom w:val="single" w:sz="8" w:space="0" w:color="333333"/>
@@ -13575,19 +14281,15 @@
         <w:tblLook w:val="04A0" w:firstRow="1" w:lastRow="0" w:firstColumn="1" w:lastColumn="0" w:noHBand="0" w:noVBand="1"/>
       </w:tblPr>
       <w:tblGrid>
-        <w:gridCol w:w="2389"/>
-        <w:gridCol w:w="1810"/>
-        <w:gridCol w:w="1810"/>
-        <w:gridCol w:w="1810"/>
-        <w:gridCol w:w="1541"/>
+        <w:gridCol w:w="1729"/>
+        <w:gridCol w:w="1551"/>
+        <w:gridCol w:w="1551"/>
+        <w:gridCol w:w="1551"/>
       </w:tblGrid>
       <w:tr>
-        <w:trPr>
-          <w:jc w:val="center"/>
-        </w:trPr>
-        <w:tc>
-          <w:tcPr>
-            <w:tcW w:w="2389" w:type="dxa"/>
+        <w:tc>
+          <w:tcPr>
+            <w:tcW w:w="0" w:type="auto"/>
             <w:shd w:val="clear" w:color="auto" w:fill="F2F4F8"/>
             <w:tcMar>
               <w:top w:w="60" w:type="dxa"/>
@@ -13601,13 +14303,17 @@
             <w:pPr>
               <w:spacing w:before="30" w:after="30"/>
               <w:jc w:val="right"/>
-            </w:pPr>
-            <w:r>
-              <w:rPr>
-                <w:rFonts w:ascii="Arial" w:hAnsi="Arial"/>
+              <w:rPr>
+                <w:sz w:val="20"/>
+                <w:szCs w:val="20"/>
+              </w:rPr>
+            </w:pPr>
+            <w:r>
+              <w:rPr>
                 <w:b/>
                 <w:color w:val="111111"/>
-                <w:sz w:val="16"/>
+                <w:sz w:val="20"/>
+                <w:szCs w:val="20"/>
               </w:rPr>
               <w:t xml:space="preserve">BERT Model </w:t>
             </w:r>
@@ -13615,7 +14321,7 @@
         </w:tc>
         <w:tc>
           <w:tcPr>
-            <w:tcW w:w="1810" w:type="dxa"/>
+            <w:tcW w:w="0" w:type="auto"/>
             <w:shd w:val="clear" w:color="auto" w:fill="F2F4F8"/>
             <w:tcMar>
               <w:top w:w="60" w:type="dxa"/>
@@ -13629,21 +14335,46 @@
             <w:pPr>
               <w:spacing w:before="30" w:after="30"/>
               <w:jc w:val="center"/>
-            </w:pPr>
-            <w:r>
-              <w:rPr>
-                <w:rFonts w:ascii="Arial" w:hAnsi="Arial"/>
+              <w:rPr>
                 <w:b/>
                 <w:color w:val="111111"/>
-                <w:sz w:val="16"/>
-              </w:rPr>
-              <w:t>Validation F1 (Mean ± SD)</w:t>
-            </w:r>
-          </w:p>
-        </w:tc>
-        <w:tc>
-          <w:tcPr>
-            <w:tcW w:w="1810" w:type="dxa"/>
+                <w:sz w:val="20"/>
+                <w:szCs w:val="20"/>
+              </w:rPr>
+            </w:pPr>
+            <w:r>
+              <w:rPr>
+                <w:b/>
+                <w:color w:val="111111"/>
+                <w:sz w:val="20"/>
+                <w:szCs w:val="20"/>
+              </w:rPr>
+              <w:t xml:space="preserve">Validation F1 </w:t>
+            </w:r>
+          </w:p>
+          <w:p>
+            <w:pPr>
+              <w:spacing w:before="30" w:after="30"/>
+              <w:jc w:val="center"/>
+              <w:rPr>
+                <w:sz w:val="20"/>
+                <w:szCs w:val="20"/>
+              </w:rPr>
+            </w:pPr>
+            <w:r>
+              <w:rPr>
+                <w:b/>
+                <w:color w:val="111111"/>
+                <w:sz w:val="20"/>
+                <w:szCs w:val="20"/>
+              </w:rPr>
+              <w:t>(Mean ± SD)</w:t>
+            </w:r>
+          </w:p>
+        </w:tc>
+        <w:tc>
+          <w:tcPr>
+            <w:tcW w:w="0" w:type="auto"/>
             <w:shd w:val="clear" w:color="auto" w:fill="F2F4F8"/>
             <w:tcMar>
               <w:top w:w="60" w:type="dxa"/>
@@ -13657,21 +14388,25 @@
             <w:pPr>
               <w:spacing w:before="30" w:after="30"/>
               <w:jc w:val="center"/>
-            </w:pPr>
-            <w:r>
-              <w:rPr>
-                <w:rFonts w:ascii="Arial" w:hAnsi="Arial"/>
+              <w:rPr>
+                <w:sz w:val="20"/>
+                <w:szCs w:val="20"/>
+              </w:rPr>
+            </w:pPr>
+            <w:r>
+              <w:rPr>
                 <w:b/>
                 <w:color w:val="111111"/>
-                <w:sz w:val="16"/>
-              </w:rPr>
-              <w:t>Validation Precision</w:t>
-            </w:r>
-          </w:p>
-        </w:tc>
-        <w:tc>
-          <w:tcPr>
-            <w:tcW w:w="1810" w:type="dxa"/>
+                <w:sz w:val="20"/>
+                <w:szCs w:val="20"/>
+              </w:rPr>
+              <w:t>Precision</w:t>
+            </w:r>
+          </w:p>
+        </w:tc>
+        <w:tc>
+          <w:tcPr>
+            <w:tcW w:w="0" w:type="auto"/>
             <w:shd w:val="clear" w:color="auto" w:fill="F2F4F8"/>
             <w:tcMar>
               <w:top w:w="60" w:type="dxa"/>
@@ -13685,54 +14420,27 @@
             <w:pPr>
               <w:spacing w:before="30" w:after="30"/>
               <w:jc w:val="center"/>
-            </w:pPr>
-            <w:r>
-              <w:rPr>
-                <w:rFonts w:ascii="Arial" w:hAnsi="Arial"/>
+              <w:rPr>
+                <w:sz w:val="20"/>
+                <w:szCs w:val="20"/>
+              </w:rPr>
+            </w:pPr>
+            <w:r>
+              <w:rPr>
                 <w:b/>
                 <w:color w:val="111111"/>
-                <w:sz w:val="16"/>
-              </w:rPr>
-              <w:t>Validation Recall</w:t>
-            </w:r>
-          </w:p>
-        </w:tc>
-        <w:tc>
-          <w:tcPr>
-            <w:tcW w:w="1541" w:type="dxa"/>
-            <w:shd w:val="clear" w:color="auto" w:fill="F2F4F8"/>
-            <w:tcMar>
-              <w:top w:w="60" w:type="dxa"/>
-              <w:left w:w="90" w:type="dxa"/>
-              <w:bottom w:w="60" w:type="dxa"/>
-              <w:right w:w="90" w:type="dxa"/>
-            </w:tcMar>
-            <w:vAlign w:val="center"/>
-          </w:tcPr>
-          <w:p>
-            <w:pPr>
-              <w:spacing w:before="30" w:after="30"/>
-              <w:jc w:val="center"/>
-            </w:pPr>
-            <w:r>
-              <w:rPr>
-                <w:rFonts w:ascii="Arial" w:hAnsi="Arial"/>
-                <w:b/>
-                <w:color w:val="111111"/>
-                <w:sz w:val="16"/>
-              </w:rPr>
-              <w:t>Clinical Score</w:t>
+                <w:sz w:val="20"/>
+                <w:szCs w:val="20"/>
+              </w:rPr>
+              <w:t>Recall</w:t>
             </w:r>
           </w:p>
         </w:tc>
       </w:tr>
       <w:tr>
-        <w:trPr>
-          <w:jc w:val="center"/>
-        </w:trPr>
-        <w:tc>
-          <w:tcPr>
-            <w:tcW w:w="2389" w:type="dxa"/>
+        <w:tc>
+          <w:tcPr>
+            <w:tcW w:w="0" w:type="auto"/>
             <w:shd w:val="clear" w:color="auto" w:fill="FFFFFF"/>
             <w:tcMar>
               <w:top w:w="60" w:type="dxa"/>
@@ -13747,18 +14455,18 @@
               <w:spacing w:before="30" w:after="30"/>
               <w:jc w:val="right"/>
               <w:rPr>
-                <w:rFonts w:ascii="Arial" w:hAnsi="Arial"/>
                 <w:b/>
                 <w:color w:val="222222"/>
-                <w:sz w:val="16"/>
-              </w:rPr>
-            </w:pPr>
-            <w:r>
-              <w:rPr>
-                <w:rFonts w:ascii="Arial" w:hAnsi="Arial"/>
+                <w:sz w:val="20"/>
+                <w:szCs w:val="20"/>
+              </w:rPr>
+            </w:pPr>
+            <w:r>
+              <w:rPr>
                 <w:b/>
                 <w:color w:val="222222"/>
-                <w:sz w:val="16"/>
+                <w:sz w:val="20"/>
+                <w:szCs w:val="20"/>
               </w:rPr>
               <w:t>BERT-Base</w:t>
             </w:r>
@@ -13766,7 +14474,7 @@
         </w:tc>
         <w:tc>
           <w:tcPr>
-            <w:tcW w:w="1810" w:type="dxa"/>
+            <w:tcW w:w="0" w:type="auto"/>
             <w:shd w:val="clear" w:color="auto" w:fill="FFFFFF"/>
             <w:tcMar>
               <w:top w:w="60" w:type="dxa"/>
@@ -13781,16 +14489,16 @@
               <w:spacing w:before="30" w:after="30"/>
               <w:jc w:val="center"/>
               <w:rPr>
-                <w:rFonts w:ascii="Arial" w:hAnsi="Arial"/>
                 <w:color w:val="222222"/>
-                <w:sz w:val="16"/>
-              </w:rPr>
-            </w:pPr>
-            <w:r>
-              <w:rPr>
-                <w:rFonts w:ascii="Arial" w:hAnsi="Arial"/>
+                <w:sz w:val="20"/>
+                <w:szCs w:val="20"/>
+              </w:rPr>
+            </w:pPr>
+            <w:r>
+              <w:rPr>
                 <w:color w:val="222222"/>
-                <w:sz w:val="16"/>
+                <w:sz w:val="20"/>
+                <w:szCs w:val="20"/>
               </w:rPr>
               <w:t>0.8382 ± 0.0047</w:t>
             </w:r>
@@ -13798,7 +14506,7 @@
         </w:tc>
         <w:tc>
           <w:tcPr>
-            <w:tcW w:w="1810" w:type="dxa"/>
+            <w:tcW w:w="0" w:type="auto"/>
             <w:shd w:val="clear" w:color="auto" w:fill="FFFFFF"/>
             <w:tcMar>
               <w:top w:w="60" w:type="dxa"/>
@@ -13813,16 +14521,16 @@
               <w:spacing w:before="30" w:after="30"/>
               <w:jc w:val="center"/>
               <w:rPr>
-                <w:rFonts w:ascii="Arial" w:hAnsi="Arial"/>
                 <w:color w:val="222222"/>
-                <w:sz w:val="16"/>
-              </w:rPr>
-            </w:pPr>
-            <w:r>
-              <w:rPr>
-                <w:rFonts w:ascii="Arial" w:hAnsi="Arial"/>
+                <w:sz w:val="20"/>
+                <w:szCs w:val="20"/>
+              </w:rPr>
+            </w:pPr>
+            <w:r>
+              <w:rPr>
                 <w:color w:val="222222"/>
-                <w:sz w:val="16"/>
+                <w:sz w:val="20"/>
+                <w:szCs w:val="20"/>
               </w:rPr>
               <w:t>0.8596 ± 0.0055</w:t>
             </w:r>
@@ -13830,7 +14538,7 @@
         </w:tc>
         <w:tc>
           <w:tcPr>
-            <w:tcW w:w="1810" w:type="dxa"/>
+            <w:tcW w:w="0" w:type="auto"/>
             <w:shd w:val="clear" w:color="auto" w:fill="FFFFFF"/>
             <w:tcMar>
               <w:top w:w="60" w:type="dxa"/>
@@ -13845,24 +14553,26 @@
               <w:spacing w:before="30" w:after="30"/>
               <w:jc w:val="center"/>
               <w:rPr>
-                <w:rFonts w:ascii="Arial" w:hAnsi="Arial"/>
                 <w:color w:val="222222"/>
-                <w:sz w:val="16"/>
-              </w:rPr>
-            </w:pPr>
-            <w:r>
-              <w:rPr>
-                <w:rFonts w:ascii="Arial" w:hAnsi="Arial"/>
+                <w:sz w:val="20"/>
+                <w:szCs w:val="20"/>
+              </w:rPr>
+            </w:pPr>
+            <w:r>
+              <w:rPr>
                 <w:color w:val="222222"/>
-                <w:sz w:val="16"/>
+                <w:sz w:val="20"/>
+                <w:szCs w:val="20"/>
               </w:rPr>
               <w:t>0.8179 ± 0.0061</w:t>
             </w:r>
           </w:p>
         </w:tc>
-        <w:tc>
-          <w:tcPr>
-            <w:tcW w:w="1541" w:type="dxa"/>
+      </w:tr>
+      <w:tr>
+        <w:tc>
+          <w:tcPr>
+            <w:tcW w:w="0" w:type="auto"/>
             <w:shd w:val="clear" w:color="auto" w:fill="FFFFFF"/>
             <w:tcMar>
               <w:top w:w="60" w:type="dxa"/>
@@ -13875,31 +14585,26 @@
           <w:p>
             <w:pPr>
               <w:spacing w:before="30" w:after="30"/>
-              <w:jc w:val="center"/>
-              <w:rPr>
-                <w:rFonts w:ascii="Arial" w:hAnsi="Arial"/>
+              <w:jc w:val="right"/>
+              <w:rPr>
+                <w:sz w:val="20"/>
+                <w:szCs w:val="20"/>
+              </w:rPr>
+            </w:pPr>
+            <w:r>
+              <w:rPr>
+                <w:b/>
                 <w:color w:val="222222"/>
-                <w:sz w:val="16"/>
-              </w:rPr>
-            </w:pPr>
-            <w:r>
-              <w:rPr>
-                <w:rFonts w:ascii="Arial" w:hAnsi="Arial"/>
-                <w:color w:val="222222"/>
-                <w:sz w:val="16"/>
-              </w:rPr>
-              <w:t>0.8420 ± 0.0045</w:t>
-            </w:r>
-          </w:p>
-        </w:tc>
-      </w:tr>
-      <w:tr>
-        <w:trPr>
-          <w:jc w:val="center"/>
-        </w:trPr>
-        <w:tc>
-          <w:tcPr>
-            <w:tcW w:w="2389" w:type="dxa"/>
+                <w:sz w:val="20"/>
+                <w:szCs w:val="20"/>
+              </w:rPr>
+              <w:t>BioBERT v1.1</w:t>
+            </w:r>
+          </w:p>
+        </w:tc>
+        <w:tc>
+          <w:tcPr>
+            <w:tcW w:w="0" w:type="auto"/>
             <w:shd w:val="clear" w:color="auto" w:fill="FFFFFF"/>
             <w:tcMar>
               <w:top w:w="60" w:type="dxa"/>
@@ -13912,33 +14617,27 @@
           <w:p>
             <w:pPr>
               <w:spacing w:before="30" w:after="30"/>
-              <w:jc w:val="right"/>
-            </w:pPr>
-            <w:proofErr w:type="spellStart"/>
-            <w:r>
-              <w:rPr>
-                <w:rFonts w:ascii="Arial" w:hAnsi="Arial"/>
-                <w:b/>
+              <w:jc w:val="center"/>
+              <w:rPr>
+                <w:sz w:val="20"/>
+                <w:szCs w:val="20"/>
+                <w:u w:val="single"/>
+              </w:rPr>
+            </w:pPr>
+            <w:r>
+              <w:rPr>
                 <w:color w:val="222222"/>
-                <w:sz w:val="16"/>
-              </w:rPr>
-              <w:t>BioBERT</w:t>
-            </w:r>
-            <w:proofErr w:type="spellEnd"/>
-            <w:r>
-              <w:rPr>
-                <w:rFonts w:ascii="Arial" w:hAnsi="Arial"/>
-                <w:b/>
-                <w:color w:val="222222"/>
-                <w:sz w:val="16"/>
-              </w:rPr>
-              <w:t xml:space="preserve"> v1.1</w:t>
-            </w:r>
-          </w:p>
-        </w:tc>
-        <w:tc>
-          <w:tcPr>
-            <w:tcW w:w="1810" w:type="dxa"/>
+                <w:sz w:val="20"/>
+                <w:szCs w:val="20"/>
+                <w:u w:val="single"/>
+              </w:rPr>
+              <w:t>0.8471 ± 0.0058</w:t>
+            </w:r>
+          </w:p>
+        </w:tc>
+        <w:tc>
+          <w:tcPr>
+            <w:tcW w:w="0" w:type="auto"/>
             <w:shd w:val="clear" w:color="auto" w:fill="FFFFFF"/>
             <w:tcMar>
               <w:top w:w="60" w:type="dxa"/>
@@ -13953,23 +14652,25 @@
               <w:spacing w:before="30" w:after="30"/>
               <w:jc w:val="center"/>
               <w:rPr>
+                <w:sz w:val="20"/>
+                <w:szCs w:val="20"/>
                 <w:u w:val="single"/>
               </w:rPr>
             </w:pPr>
             <w:r>
               <w:rPr>
-                <w:rFonts w:ascii="Arial" w:hAnsi="Arial"/>
                 <w:color w:val="222222"/>
-                <w:sz w:val="16"/>
+                <w:sz w:val="20"/>
+                <w:szCs w:val="20"/>
                 <w:u w:val="single"/>
               </w:rPr>
-              <w:t>0.8471 ± 0.0058</w:t>
-            </w:r>
-          </w:p>
-        </w:tc>
-        <w:tc>
-          <w:tcPr>
-            <w:tcW w:w="1810" w:type="dxa"/>
+              <w:t>0.8666 ± 0.0048</w:t>
+            </w:r>
+          </w:p>
+        </w:tc>
+        <w:tc>
+          <w:tcPr>
+            <w:tcW w:w="0" w:type="auto"/>
             <w:shd w:val="clear" w:color="auto" w:fill="FFFFFF"/>
             <w:tcMar>
               <w:top w:w="60" w:type="dxa"/>
@@ -13984,90 +14685,27 @@
               <w:spacing w:before="30" w:after="30"/>
               <w:jc w:val="center"/>
               <w:rPr>
+                <w:sz w:val="20"/>
+                <w:szCs w:val="20"/>
                 <w:u w:val="single"/>
               </w:rPr>
             </w:pPr>
             <w:r>
               <w:rPr>
-                <w:rFonts w:ascii="Arial" w:hAnsi="Arial"/>
                 <w:color w:val="222222"/>
-                <w:sz w:val="16"/>
+                <w:sz w:val="20"/>
+                <w:szCs w:val="20"/>
                 <w:u w:val="single"/>
               </w:rPr>
-              <w:t>0.8666 ± 0.0048</w:t>
-            </w:r>
-          </w:p>
-        </w:tc>
-        <w:tc>
-          <w:tcPr>
-            <w:tcW w:w="1810" w:type="dxa"/>
-            <w:shd w:val="clear" w:color="auto" w:fill="FFFFFF"/>
-            <w:tcMar>
-              <w:top w:w="60" w:type="dxa"/>
-              <w:left w:w="90" w:type="dxa"/>
-              <w:bottom w:w="60" w:type="dxa"/>
-              <w:right w:w="90" w:type="dxa"/>
-            </w:tcMar>
-            <w:vAlign w:val="center"/>
-          </w:tcPr>
-          <w:p>
-            <w:pPr>
-              <w:spacing w:before="30" w:after="30"/>
-              <w:jc w:val="center"/>
-              <w:rPr>
-                <w:u w:val="single"/>
-              </w:rPr>
-            </w:pPr>
-            <w:r>
-              <w:rPr>
-                <w:rFonts w:ascii="Arial" w:hAnsi="Arial"/>
-                <w:color w:val="222222"/>
-                <w:sz w:val="16"/>
-                <w:u w:val="single"/>
-              </w:rPr>
               <w:t>0.8285 ± 0.0089</w:t>
-            </w:r>
-          </w:p>
-        </w:tc>
-        <w:tc>
-          <w:tcPr>
-            <w:tcW w:w="1541" w:type="dxa"/>
-            <w:shd w:val="clear" w:color="auto" w:fill="FFFFFF"/>
-            <w:tcMar>
-              <w:top w:w="60" w:type="dxa"/>
-              <w:left w:w="90" w:type="dxa"/>
-              <w:bottom w:w="60" w:type="dxa"/>
-              <w:right w:w="90" w:type="dxa"/>
-            </w:tcMar>
-            <w:vAlign w:val="center"/>
-          </w:tcPr>
-          <w:p>
-            <w:pPr>
-              <w:spacing w:before="30" w:after="30"/>
-              <w:jc w:val="center"/>
-              <w:rPr>
-                <w:u w:val="single"/>
-              </w:rPr>
-            </w:pPr>
-            <w:r>
-              <w:rPr>
-                <w:rFonts w:ascii="Arial" w:hAnsi="Arial"/>
-                <w:color w:val="222222"/>
-                <w:sz w:val="16"/>
-                <w:u w:val="single"/>
-              </w:rPr>
-              <w:t>0.8500 ± 0.0071</w:t>
             </w:r>
           </w:p>
         </w:tc>
       </w:tr>
       <w:tr>
-        <w:trPr>
-          <w:jc w:val="center"/>
-        </w:trPr>
-        <w:tc>
-          <w:tcPr>
-            <w:tcW w:w="2389" w:type="dxa"/>
+        <w:tc>
+          <w:tcPr>
+            <w:tcW w:w="0" w:type="auto"/>
             <w:shd w:val="clear" w:color="auto" w:fill="FBFBFB"/>
             <w:tcMar>
               <w:top w:w="60" w:type="dxa"/>
@@ -14081,23 +14719,25 @@
             <w:pPr>
               <w:spacing w:before="30" w:after="30"/>
               <w:jc w:val="right"/>
-            </w:pPr>
-            <w:proofErr w:type="spellStart"/>
-            <w:r>
-              <w:rPr>
-                <w:rFonts w:ascii="Arial" w:hAnsi="Arial"/>
+              <w:rPr>
+                <w:sz w:val="20"/>
+                <w:szCs w:val="20"/>
+              </w:rPr>
+            </w:pPr>
+            <w:r>
+              <w:rPr>
                 <w:b/>
                 <w:color w:val="222222"/>
-                <w:sz w:val="16"/>
+                <w:sz w:val="20"/>
+                <w:szCs w:val="20"/>
               </w:rPr>
               <w:t>Bio_ClinicalBERT</w:t>
             </w:r>
-            <w:proofErr w:type="spellEnd"/>
-          </w:p>
-        </w:tc>
-        <w:tc>
-          <w:tcPr>
-            <w:tcW w:w="1810" w:type="dxa"/>
+          </w:p>
+        </w:tc>
+        <w:tc>
+          <w:tcPr>
+            <w:tcW w:w="0" w:type="auto"/>
             <w:shd w:val="clear" w:color="auto" w:fill="FBFBFB"/>
             <w:tcMar>
               <w:top w:w="60" w:type="dxa"/>
@@ -14111,12 +14751,16 @@
             <w:pPr>
               <w:spacing w:before="30" w:after="30"/>
               <w:jc w:val="center"/>
-            </w:pPr>
-            <w:r>
-              <w:rPr>
-                <w:rFonts w:ascii="Arial" w:hAnsi="Arial"/>
+              <w:rPr>
+                <w:sz w:val="20"/>
+                <w:szCs w:val="20"/>
+              </w:rPr>
+            </w:pPr>
+            <w:r>
+              <w:rPr>
                 <w:color w:val="222222"/>
-                <w:sz w:val="16"/>
+                <w:sz w:val="20"/>
+                <w:szCs w:val="20"/>
               </w:rPr>
               <w:t>0.8433 ± 0.0070</w:t>
             </w:r>
@@ -14124,7 +14768,7 @@
         </w:tc>
         <w:tc>
           <w:tcPr>
-            <w:tcW w:w="1810" w:type="dxa"/>
+            <w:tcW w:w="0" w:type="auto"/>
             <w:shd w:val="clear" w:color="auto" w:fill="FBFBFB"/>
             <w:tcMar>
               <w:top w:w="60" w:type="dxa"/>
@@ -14138,12 +14782,16 @@
             <w:pPr>
               <w:spacing w:before="30" w:after="30"/>
               <w:jc w:val="center"/>
-            </w:pPr>
-            <w:r>
-              <w:rPr>
-                <w:rFonts w:ascii="Arial" w:hAnsi="Arial"/>
+              <w:rPr>
+                <w:sz w:val="20"/>
+                <w:szCs w:val="20"/>
+              </w:rPr>
+            </w:pPr>
+            <w:r>
+              <w:rPr>
                 <w:color w:val="222222"/>
-                <w:sz w:val="16"/>
+                <w:sz w:val="20"/>
+                <w:szCs w:val="20"/>
               </w:rPr>
               <w:t>0.8610 ± 0.0078</w:t>
             </w:r>
@@ -14151,7 +14799,7 @@
         </w:tc>
         <w:tc>
           <w:tcPr>
-            <w:tcW w:w="1810" w:type="dxa"/>
+            <w:tcW w:w="0" w:type="auto"/>
             <w:shd w:val="clear" w:color="auto" w:fill="FBFBFB"/>
             <w:tcMar>
               <w:top w:w="60" w:type="dxa"/>
@@ -14165,20 +14813,26 @@
             <w:pPr>
               <w:spacing w:before="30" w:after="30"/>
               <w:jc w:val="center"/>
-            </w:pPr>
-            <w:r>
-              <w:rPr>
-                <w:rFonts w:ascii="Arial" w:hAnsi="Arial"/>
+              <w:rPr>
+                <w:sz w:val="20"/>
+                <w:szCs w:val="20"/>
+              </w:rPr>
+            </w:pPr>
+            <w:r>
+              <w:rPr>
                 <w:color w:val="222222"/>
-                <w:sz w:val="16"/>
+                <w:sz w:val="20"/>
+                <w:szCs w:val="20"/>
               </w:rPr>
               <w:t>0.8264 ± 0.0104</w:t>
             </w:r>
           </w:p>
         </w:tc>
-        <w:tc>
-          <w:tcPr>
-            <w:tcW w:w="1541" w:type="dxa"/>
+      </w:tr>
+      <w:tr>
+        <w:tc>
+          <w:tcPr>
+            <w:tcW w:w="0" w:type="auto"/>
             <w:shd w:val="clear" w:color="auto" w:fill="FBFBFB"/>
             <w:tcMar>
               <w:top w:w="60" w:type="dxa"/>
@@ -14191,26 +14845,26 @@
           <w:p>
             <w:pPr>
               <w:spacing w:before="30" w:after="30"/>
-              <w:jc w:val="center"/>
-            </w:pPr>
-            <w:r>
-              <w:rPr>
-                <w:rFonts w:ascii="Arial" w:hAnsi="Arial"/>
+              <w:jc w:val="right"/>
+              <w:rPr>
+                <w:sz w:val="20"/>
+                <w:szCs w:val="20"/>
+              </w:rPr>
+            </w:pPr>
+            <w:r>
+              <w:rPr>
+                <w:b/>
                 <w:color w:val="222222"/>
-                <w:sz w:val="16"/>
-              </w:rPr>
-              <w:t>0.8440 ± 0.0055</w:t>
-            </w:r>
-          </w:p>
-        </w:tc>
-      </w:tr>
-      <w:tr>
-        <w:trPr>
-          <w:jc w:val="center"/>
-        </w:trPr>
-        <w:tc>
-          <w:tcPr>
-            <w:tcW w:w="2389" w:type="dxa"/>
+                <w:sz w:val="20"/>
+                <w:szCs w:val="20"/>
+              </w:rPr>
+              <w:t>ClinicalBERT</w:t>
+            </w:r>
+          </w:p>
+        </w:tc>
+        <w:tc>
+          <w:tcPr>
+            <w:tcW w:w="0" w:type="auto"/>
             <w:shd w:val="clear" w:color="auto" w:fill="FBFBFB"/>
             <w:tcMar>
               <w:top w:w="60" w:type="dxa"/>
@@ -14223,24 +14877,25 @@
           <w:p>
             <w:pPr>
               <w:spacing w:before="30" w:after="30"/>
-              <w:jc w:val="right"/>
-            </w:pPr>
-            <w:proofErr w:type="spellStart"/>
-            <w:r>
-              <w:rPr>
-                <w:rFonts w:ascii="Arial" w:hAnsi="Arial"/>
-                <w:b/>
+              <w:jc w:val="center"/>
+              <w:rPr>
+                <w:sz w:val="20"/>
+                <w:szCs w:val="20"/>
+              </w:rPr>
+            </w:pPr>
+            <w:r>
+              <w:rPr>
                 <w:color w:val="222222"/>
-                <w:sz w:val="16"/>
-              </w:rPr>
-              <w:t>ClinicalBERT</w:t>
-            </w:r>
-            <w:proofErr w:type="spellEnd"/>
-          </w:p>
-        </w:tc>
-        <w:tc>
-          <w:tcPr>
-            <w:tcW w:w="1810" w:type="dxa"/>
+                <w:sz w:val="20"/>
+                <w:szCs w:val="20"/>
+              </w:rPr>
+              <w:t>0.8369 ± 0.0086</w:t>
+            </w:r>
+          </w:p>
+        </w:tc>
+        <w:tc>
+          <w:tcPr>
+            <w:tcW w:w="0" w:type="auto"/>
             <w:shd w:val="clear" w:color="auto" w:fill="FBFBFB"/>
             <w:tcMar>
               <w:top w:w="60" w:type="dxa"/>
@@ -14254,20 +14909,24 @@
             <w:pPr>
               <w:spacing w:before="30" w:after="30"/>
               <w:jc w:val="center"/>
-            </w:pPr>
-            <w:r>
-              <w:rPr>
-                <w:rFonts w:ascii="Arial" w:hAnsi="Arial"/>
+              <w:rPr>
+                <w:sz w:val="20"/>
+                <w:szCs w:val="20"/>
+              </w:rPr>
+            </w:pPr>
+            <w:r>
+              <w:rPr>
                 <w:color w:val="222222"/>
-                <w:sz w:val="16"/>
-              </w:rPr>
-              <w:t>0.8369 ± 0.0086</w:t>
-            </w:r>
-          </w:p>
-        </w:tc>
-        <w:tc>
-          <w:tcPr>
-            <w:tcW w:w="1810" w:type="dxa"/>
+                <w:sz w:val="20"/>
+                <w:szCs w:val="20"/>
+              </w:rPr>
+              <w:t>0.8615 ± 0.0106</w:t>
+            </w:r>
+          </w:p>
+        </w:tc>
+        <w:tc>
+          <w:tcPr>
+            <w:tcW w:w="0" w:type="auto"/>
             <w:shd w:val="clear" w:color="auto" w:fill="FBFBFB"/>
             <w:tcMar>
               <w:top w:w="60" w:type="dxa"/>
@@ -14281,68 +14940,18 @@
             <w:pPr>
               <w:spacing w:before="30" w:after="30"/>
               <w:jc w:val="center"/>
-            </w:pPr>
-            <w:r>
-              <w:rPr>
-                <w:rFonts w:ascii="Arial" w:hAnsi="Arial"/>
+              <w:rPr>
+                <w:sz w:val="20"/>
+                <w:szCs w:val="20"/>
+              </w:rPr>
+            </w:pPr>
+            <w:r>
+              <w:rPr>
                 <w:color w:val="222222"/>
-                <w:sz w:val="16"/>
-              </w:rPr>
-              <w:t>0.8615 ± 0.0106</w:t>
-            </w:r>
-          </w:p>
-        </w:tc>
-        <w:tc>
-          <w:tcPr>
-            <w:tcW w:w="1810" w:type="dxa"/>
-            <w:shd w:val="clear" w:color="auto" w:fill="FBFBFB"/>
-            <w:tcMar>
-              <w:top w:w="60" w:type="dxa"/>
-              <w:left w:w="90" w:type="dxa"/>
-              <w:bottom w:w="60" w:type="dxa"/>
-              <w:right w:w="90" w:type="dxa"/>
-            </w:tcMar>
-            <w:vAlign w:val="center"/>
-          </w:tcPr>
-          <w:p>
-            <w:pPr>
-              <w:spacing w:before="30" w:after="30"/>
-              <w:jc w:val="center"/>
-            </w:pPr>
-            <w:r>
-              <w:rPr>
-                <w:rFonts w:ascii="Arial" w:hAnsi="Arial"/>
-                <w:color w:val="222222"/>
-                <w:sz w:val="16"/>
+                <w:sz w:val="20"/>
+                <w:szCs w:val="20"/>
               </w:rPr>
               <w:t>0.8140 ± 0.0167</w:t>
-            </w:r>
-          </w:p>
-        </w:tc>
-        <w:tc>
-          <w:tcPr>
-            <w:tcW w:w="1541" w:type="dxa"/>
-            <w:shd w:val="clear" w:color="auto" w:fill="FBFBFB"/>
-            <w:tcMar>
-              <w:top w:w="60" w:type="dxa"/>
-              <w:left w:w="90" w:type="dxa"/>
-              <w:bottom w:w="60" w:type="dxa"/>
-              <w:right w:w="90" w:type="dxa"/>
-            </w:tcMar>
-            <w:vAlign w:val="center"/>
-          </w:tcPr>
-          <w:p>
-            <w:pPr>
-              <w:spacing w:before="30" w:after="30"/>
-              <w:jc w:val="center"/>
-            </w:pPr>
-            <w:r>
-              <w:rPr>
-                <w:rFonts w:ascii="Arial" w:hAnsi="Arial"/>
-                <w:color w:val="222222"/>
-                <w:sz w:val="16"/>
-              </w:rPr>
-              <w:t>0.8400 ± 0.0071</w:t>
             </w:r>
           </w:p>
         </w:tc>
@@ -14444,11 +15053,8 @@
     </w:p>
     <w:p>
       <w:r>
-        <w:t xml:space="preserve">Taken together with the FAERS results, these VAERS findings demonstrate that BERT-based models trained on high-quality human annotations provide more robust and reliable </w:t>
-      </w:r>
-      <w:r>
         <w:lastRenderedPageBreak/>
-        <w:t>performance across heterogeneous pharmacovigilance datasets. While LLM-derived annotations offer a convenient low-resource alternative, their direct use leads to substantially lower accuracy, particularly in semantically complex categories such as STATUS, LAB, and HX. These results underscore the continued importance of curated human-labeled data for medical NER and highlight the effectiveness of supervised transformer models for large-scale safety narrative processing in real-world biomedical applications.</w:t>
+        <w:t>Taken together with the FAERS results, these VAERS findings demonstrate that BERT-based models trained on high-quality human annotations provide more robust and reliable performance across heterogeneous pharmacovigilance datasets. While LLM-derived annotations offer a convenient low-resource alternative, their direct use leads to substantially lower accuracy, particularly in semantically complex categories such as STATUS, LAB, and HX. These results underscore the continued importance of curated human-labeled data for medical NER and highlight the effectiveness of supervised transformer models for large-scale safety narrative processing in real-world biomedical applications.</w:t>
       </w:r>
     </w:p>
     <w:p>
@@ -14486,20 +15092,15 @@
     </w:p>
     <w:p>
       <w:r>
-        <w:t xml:space="preserve">Beyond model comparison, the annotated datasets themselves provide a valuable resource for future research. By spanning both drug and vaccine safety narratives and incorporating harmonized entity definitions, they enable studies on cross-domain generalization, transfer learning, and multi-task modeling. The detailed error characterizations also highlight areas </w:t>
-      </w:r>
-      <w:proofErr w:type="gramStart"/>
-      <w:r>
-        <w:t>where</w:t>
-      </w:r>
-      <w:proofErr w:type="gramEnd"/>
-      <w:r>
-        <w:t xml:space="preserve"> additional training data, refined guidelines, or specialized modeling approaches may further improve performance.</w:t>
+        <w:t xml:space="preserve">Beyond model comparison, the annotated datasets themselves provide a valuable resource for future research. By spanning both drug and vaccine safety narratives and incorporating harmonized entity definitions, they enable studies on cross-domain generalization, transfer learning, and multi-task modeling. The detailed error </w:t>
+      </w:r>
+      <w:r>
+        <w:lastRenderedPageBreak/>
+        <w:t>characterizations also highlight areas where additional training data, refined guidelines, or specialized modeling approaches may further improve performance.</w:t>
       </w:r>
     </w:p>
     <w:p>
       <w:r>
-        <w:lastRenderedPageBreak/>
         <w:t>This study has several limitations. The annotated datasets, while carefully constructed, represent a subset of possible reporting scenarios and may not fully generalize across all products</w:t>
       </w:r>
       <w:r>
@@ -14639,6 +15240,7 @@
         <w:rPr>
           <w:shd w:val="clear" w:color="auto" w:fill="FFFFFF"/>
         </w:rPr>
+        <w:lastRenderedPageBreak/>
         <w:t xml:space="preserve">Conflicts of </w:t>
       </w:r>
       <w:r>
@@ -14661,7 +15263,6 @@
         <w:rPr>
           <w:shd w:val="clear" w:color="auto" w:fill="FFFFFF"/>
         </w:rPr>
-        <w:lastRenderedPageBreak/>
         <w:t>Ethics approval</w:t>
       </w:r>
     </w:p>
@@ -14873,7 +15474,6 @@
         </w:rPr>
       </w:pPr>
       <w:r>
-        <w:lastRenderedPageBreak/>
         <w:br w:type="page"/>
       </w:r>
     </w:p>
@@ -21494,6 +22094,7 @@
   <w:style w:type="character" w:default="1" w:styleId="DefaultParagraphFont">
     <w:name w:val="Default Paragraph Font"/>
     <w:uiPriority w:val="1"/>
+    <w:semiHidden/>
     <w:unhideWhenUsed/>
   </w:style>
   <w:style w:type="table" w:default="1" w:styleId="TableNormal">

</xml_diff>

<commit_message>
Remove legacy implementation and simplify project structure
</commit_message>
<xml_diff>
--- a/publication/manuscripts/LLM4AE_rev1.docx
+++ b/publication/manuscripts/LLM4AE_rev1.docx
@@ -1233,8 +1233,13 @@
         <w:fldChar w:fldCharType="end"/>
       </w:r>
       <w:r>
-        <w:t>, BioBERT</w:t>
-      </w:r>
+        <w:t xml:space="preserve">, </w:t>
+      </w:r>
+      <w:proofErr w:type="spellStart"/>
+      <w:r>
+        <w:t>BioBERT</w:t>
+      </w:r>
+      <w:proofErr w:type="spellEnd"/>
       <w:r>
         <w:fldChar w:fldCharType="begin"/>
       </w:r>
@@ -1254,8 +1259,13 @@
         <w:fldChar w:fldCharType="end"/>
       </w:r>
       <w:r>
-        <w:t>, ClinicalBERT</w:t>
-      </w:r>
+        <w:t xml:space="preserve">, </w:t>
+      </w:r>
+      <w:proofErr w:type="spellStart"/>
+      <w:r>
+        <w:t>ClinicalBERT</w:t>
+      </w:r>
+      <w:proofErr w:type="spellEnd"/>
       <w:r>
         <w:fldChar w:fldCharType="begin"/>
       </w:r>
@@ -3334,9 +3344,15 @@
       <w:r>
         <w:t xml:space="preserve"> using the </w:t>
       </w:r>
-      <w:r>
-        <w:t xml:space="preserve">SequenceMatcher function from the </w:t>
-      </w:r>
+      <w:proofErr w:type="spellStart"/>
+      <w:r>
+        <w:t>SequenceMatcher</w:t>
+      </w:r>
+      <w:proofErr w:type="spellEnd"/>
+      <w:r>
+        <w:t xml:space="preserve"> function from the </w:t>
+      </w:r>
+      <w:proofErr w:type="spellStart"/>
       <w:r>
         <w:rPr>
           <w:i/>
@@ -3344,6 +3360,7 @@
         </w:rPr>
         <w:t>difflib</w:t>
       </w:r>
+      <w:proofErr w:type="spellEnd"/>
       <w:r>
         <w:t xml:space="preserve"> Python library </w:t>
       </w:r>
@@ -3385,6 +3402,7 @@
       <w:r>
         <w:t>did not match pre-defined categories</w:t>
       </w:r>
+      <w:proofErr w:type="gramStart"/>
       <w:r>
         <w:t>)</w:t>
       </w:r>
@@ -3392,7 +3410,11 @@
         <w:t>,</w:t>
       </w:r>
       <w:r>
-        <w:t>using in-text annotation plus back mapping as a strategy helped ensure the original narratives were not altered during the annotation process. Unsuccessful tagging and text alterations have both been observed during preliminary studies, particularly where</w:t>
+        <w:t>using</w:t>
+      </w:r>
+      <w:proofErr w:type="gramEnd"/>
+      <w:r>
+        <w:t xml:space="preserve"> in-text annotation plus back mapping as a strategy helped ensure the original narratives were not altered during the annotation process. Unsuccessful tagging and text alterations have both been observed during preliminary studies, particularly where</w:t>
       </w:r>
       <w:r>
         <w:t xml:space="preserve"> </w:t>
@@ -3578,6 +3600,7 @@
       <w:r>
         <w:t xml:space="preserve"> implemented using the </w:t>
       </w:r>
+      <w:proofErr w:type="spellStart"/>
       <w:r>
         <w:rPr>
           <w:i/>
@@ -3585,6 +3608,7 @@
         </w:rPr>
         <w:t>spaCy</w:t>
       </w:r>
+      <w:proofErr w:type="spellEnd"/>
       <w:r>
         <w:rPr>
           <w:rFonts w:hint="eastAsia"/>
@@ -3727,8 +3751,13 @@
         <w:fldChar w:fldCharType="end"/>
       </w:r>
       <w:r>
-        <w:t>, BioBERT</w:t>
-      </w:r>
+        <w:t xml:space="preserve">, </w:t>
+      </w:r>
+      <w:proofErr w:type="spellStart"/>
+      <w:r>
+        <w:t>BioBERT</w:t>
+      </w:r>
+      <w:proofErr w:type="spellEnd"/>
       <w:r>
         <w:fldChar w:fldCharType="begin"/>
       </w:r>
@@ -3748,8 +3777,13 @@
         <w:fldChar w:fldCharType="end"/>
       </w:r>
       <w:r>
-        <w:t>, ClinicalBERT</w:t>
-      </w:r>
+        <w:t xml:space="preserve">, </w:t>
+      </w:r>
+      <w:proofErr w:type="spellStart"/>
+      <w:r>
+        <w:t>ClinicalBERT</w:t>
+      </w:r>
+      <w:proofErr w:type="spellEnd"/>
       <w:r>
         <w:fldChar w:fldCharType="begin"/>
       </w:r>
@@ -3769,8 +3803,13 @@
         <w:fldChar w:fldCharType="end"/>
       </w:r>
       <w:r>
-        <w:t>, and Bio_ClinicalBERT</w:t>
-      </w:r>
+        <w:t xml:space="preserve">, and </w:t>
+      </w:r>
+      <w:proofErr w:type="spellStart"/>
+      <w:r>
+        <w:t>Bio_ClinicalBERT</w:t>
+      </w:r>
+      <w:proofErr w:type="spellEnd"/>
       <w:r>
         <w:fldChar w:fldCharType="begin"/>
       </w:r>
@@ -3790,7 +3829,15 @@
         <w:fldChar w:fldCharType="end"/>
       </w:r>
       <w:r>
-        <w:t xml:space="preserve"> using the VAERS data. BioBERT demonstrated superior precision and recall across key biomedical categories and was </w:t>
+        <w:t xml:space="preserve"> using the VAERS data. </w:t>
+      </w:r>
+      <w:proofErr w:type="spellStart"/>
+      <w:r>
+        <w:t>BioBERT</w:t>
+      </w:r>
+      <w:proofErr w:type="spellEnd"/>
+      <w:r>
+        <w:t xml:space="preserve"> demonstrated superior precision and recall across key biomedical categories and was </w:t>
       </w:r>
       <w:r>
         <w:rPr>
@@ -3823,7 +3870,23 @@
           <w:rFonts w:hint="eastAsia"/>
           <w:lang w:eastAsia="zh-CN"/>
         </w:rPr>
-        <w:t xml:space="preserve"> Any unspecified BERT model used in this study were based on BioBERT.</w:t>
+        <w:t xml:space="preserve"> Any unspecified BERT model used in this study were based on </w:t>
+      </w:r>
+      <w:proofErr w:type="spellStart"/>
+      <w:r>
+        <w:rPr>
+          <w:rFonts w:hint="eastAsia"/>
+          <w:lang w:eastAsia="zh-CN"/>
+        </w:rPr>
+        <w:t>BioBERT</w:t>
+      </w:r>
+      <w:proofErr w:type="spellEnd"/>
+      <w:r>
+        <w:rPr>
+          <w:rFonts w:hint="eastAsia"/>
+          <w:lang w:eastAsia="zh-CN"/>
+        </w:rPr>
+        <w:t>.</w:t>
       </w:r>
     </w:p>
     <w:p/>
@@ -6756,6 +6819,7 @@
                 <w:sz w:val="16"/>
               </w:rPr>
             </w:pPr>
+            <w:proofErr w:type="spellStart"/>
             <w:r>
               <w:rPr>
                 <w:rFonts w:ascii="Arial" w:hAnsi="Arial"/>
@@ -6765,6 +6829,7 @@
               </w:rPr>
               <w:t>FHx</w:t>
             </w:r>
+            <w:proofErr w:type="spellEnd"/>
           </w:p>
         </w:tc>
         <w:tc>
@@ -7843,6 +7908,15 @@
               <w:spacing w:before="30" w:after="30"/>
               <w:jc w:val="right"/>
               <w:rPr>
+                <w:b/>
+                <w:color w:val="222222"/>
+                <w:sz w:val="20"/>
+                <w:szCs w:val="32"/>
+                <w:lang w:eastAsia="zh-CN"/>
+              </w:rPr>
+            </w:pPr>
+            <w:r>
+              <w:rPr>
                 <w:rFonts w:hint="eastAsia"/>
                 <w:b/>
                 <w:color w:val="222222"/>
@@ -7850,20 +7924,80 @@
                 <w:szCs w:val="32"/>
                 <w:lang w:eastAsia="zh-CN"/>
               </w:rPr>
-            </w:pPr>
-            <w:r>
-              <w:rPr>
-                <w:rFonts w:hint="eastAsia"/>
-                <w:b/>
+              <w:t>BERT (1 run; seed 42)</w:t>
+            </w:r>
+          </w:p>
+        </w:tc>
+        <w:tc>
+          <w:tcPr>
+            <w:tcW w:w="0" w:type="auto"/>
+            <w:shd w:val="clear" w:color="auto" w:fill="FFFFFF"/>
+            <w:tcMar>
+              <w:top w:w="60" w:type="dxa"/>
+              <w:left w:w="90" w:type="dxa"/>
+              <w:bottom w:w="60" w:type="dxa"/>
+              <w:right w:w="90" w:type="dxa"/>
+            </w:tcMar>
+            <w:vAlign w:val="bottom"/>
+          </w:tcPr>
+          <w:p>
+            <w:pPr>
+              <w:spacing w:before="30" w:after="30"/>
+              <w:jc w:val="center"/>
+              <w:rPr>
                 <w:color w:val="222222"/>
                 <w:sz w:val="20"/>
-                <w:szCs w:val="32"/>
+                <w:szCs w:val="20"/>
                 <w:lang w:eastAsia="zh-CN"/>
               </w:rPr>
-              <w:t>BERT (1 run; seed 42)</w:t>
-            </w:r>
-          </w:p>
-        </w:tc>
+            </w:pPr>
+            <w:r>
+              <w:rPr>
+                <w:rFonts w:cs="Calibri"/>
+                <w:color w:val="000000"/>
+                <w:sz w:val="20"/>
+                <w:szCs w:val="20"/>
+              </w:rPr>
+              <w:t>0.5582</w:t>
+            </w:r>
+          </w:p>
+        </w:tc>
+        <w:tc>
+          <w:tcPr>
+            <w:tcW w:w="0" w:type="auto"/>
+            <w:shd w:val="clear" w:color="auto" w:fill="FFFFFF"/>
+            <w:tcMar>
+              <w:top w:w="60" w:type="dxa"/>
+              <w:left w:w="90" w:type="dxa"/>
+              <w:bottom w:w="60" w:type="dxa"/>
+              <w:right w:w="90" w:type="dxa"/>
+            </w:tcMar>
+            <w:vAlign w:val="bottom"/>
+          </w:tcPr>
+          <w:p>
+            <w:pPr>
+              <w:spacing w:before="30" w:after="30"/>
+              <w:jc w:val="center"/>
+              <w:rPr>
+                <w:color w:val="222222"/>
+                <w:sz w:val="20"/>
+                <w:szCs w:val="20"/>
+                <w:lang w:eastAsia="zh-CN"/>
+              </w:rPr>
+            </w:pPr>
+            <w:r>
+              <w:rPr>
+                <w:rFonts w:cs="Calibri"/>
+                <w:color w:val="000000"/>
+                <w:sz w:val="20"/>
+                <w:szCs w:val="20"/>
+              </w:rPr>
+              <w:t>0.7431</w:t>
+            </w:r>
+          </w:p>
+        </w:tc>
+      </w:tr>
+      <w:tr>
         <w:tc>
           <w:tcPr>
             <w:tcW w:w="0" w:type="auto"/>
@@ -7879,27 +8013,207 @@
           <w:p>
             <w:pPr>
               <w:spacing w:before="30" w:after="30"/>
-              <w:jc w:val="center"/>
+              <w:jc w:val="right"/>
+              <w:rPr>
+                <w:sz w:val="20"/>
+                <w:szCs w:val="32"/>
+              </w:rPr>
+            </w:pPr>
+            <w:r>
+              <w:rPr>
+                <w:b/>
+                <w:color w:val="222222"/>
+                <w:sz w:val="20"/>
+                <w:szCs w:val="32"/>
+              </w:rPr>
+              <w:t>BERT</w:t>
+            </w:r>
+            <w:r>
               <w:rPr>
                 <w:rFonts w:hint="eastAsia"/>
+                <w:b/>
                 <w:color w:val="222222"/>
                 <w:sz w:val="20"/>
                 <w:szCs w:val="32"/>
                 <w:lang w:eastAsia="zh-CN"/>
               </w:rPr>
-            </w:pPr>
-            <w:r>
-              <w:rPr>
-                <w:rFonts w:hint="eastAsia"/>
+              <w:t xml:space="preserve"> (Avg. 5 runs)</w:t>
+            </w:r>
+            <w:r>
+              <w:rPr>
+                <w:b/>
                 <w:color w:val="222222"/>
                 <w:sz w:val="20"/>
                 <w:szCs w:val="32"/>
-                <w:lang w:eastAsia="zh-CN"/>
-              </w:rPr>
-              <w:t>0.5582</w:t>
-            </w:r>
-          </w:p>
-        </w:tc>
+              </w:rPr>
+              <w:t xml:space="preserve"> </w:t>
+            </w:r>
+          </w:p>
+        </w:tc>
+        <w:tc>
+          <w:tcPr>
+            <w:tcW w:w="0" w:type="auto"/>
+            <w:shd w:val="clear" w:color="auto" w:fill="FFFFFF"/>
+            <w:tcMar>
+              <w:top w:w="60" w:type="dxa"/>
+              <w:left w:w="90" w:type="dxa"/>
+              <w:bottom w:w="60" w:type="dxa"/>
+              <w:right w:w="90" w:type="dxa"/>
+            </w:tcMar>
+            <w:vAlign w:val="bottom"/>
+          </w:tcPr>
+          <w:p>
+            <w:pPr>
+              <w:spacing w:before="30" w:after="30"/>
+              <w:jc w:val="center"/>
+              <w:rPr>
+                <w:sz w:val="20"/>
+                <w:szCs w:val="20"/>
+              </w:rPr>
+            </w:pPr>
+            <w:r>
+              <w:rPr>
+                <w:rFonts w:cs="Calibri"/>
+                <w:color w:val="000000"/>
+                <w:sz w:val="20"/>
+                <w:szCs w:val="20"/>
+              </w:rPr>
+              <w:t>0.5685 ± 0.0080</w:t>
+            </w:r>
+          </w:p>
+        </w:tc>
+        <w:tc>
+          <w:tcPr>
+            <w:tcW w:w="0" w:type="auto"/>
+            <w:shd w:val="clear" w:color="auto" w:fill="FFFFFF"/>
+            <w:tcMar>
+              <w:top w:w="60" w:type="dxa"/>
+              <w:left w:w="90" w:type="dxa"/>
+              <w:bottom w:w="60" w:type="dxa"/>
+              <w:right w:w="90" w:type="dxa"/>
+            </w:tcMar>
+            <w:vAlign w:val="bottom"/>
+          </w:tcPr>
+          <w:p>
+            <w:pPr>
+              <w:spacing w:before="30" w:after="30"/>
+              <w:jc w:val="center"/>
+              <w:rPr>
+                <w:sz w:val="20"/>
+                <w:szCs w:val="20"/>
+              </w:rPr>
+            </w:pPr>
+            <w:r>
+              <w:rPr>
+                <w:rFonts w:cs="Calibri"/>
+                <w:color w:val="000000"/>
+                <w:sz w:val="20"/>
+                <w:szCs w:val="20"/>
+              </w:rPr>
+              <w:t>0.7463 ± 0.0075</w:t>
+            </w:r>
+          </w:p>
+        </w:tc>
+      </w:tr>
+      <w:tr>
+        <w:tc>
+          <w:tcPr>
+            <w:tcW w:w="0" w:type="auto"/>
+            <w:shd w:val="clear" w:color="auto" w:fill="FBFBFB"/>
+            <w:tcMar>
+              <w:top w:w="60" w:type="dxa"/>
+              <w:left w:w="90" w:type="dxa"/>
+              <w:bottom w:w="60" w:type="dxa"/>
+              <w:right w:w="90" w:type="dxa"/>
+            </w:tcMar>
+            <w:vAlign w:val="center"/>
+          </w:tcPr>
+          <w:p>
+            <w:pPr>
+              <w:spacing w:before="30" w:after="30"/>
+              <w:jc w:val="right"/>
+              <w:rPr>
+                <w:sz w:val="20"/>
+                <w:szCs w:val="32"/>
+              </w:rPr>
+            </w:pPr>
+            <w:r>
+              <w:rPr>
+                <w:b/>
+                <w:color w:val="222222"/>
+                <w:sz w:val="20"/>
+                <w:szCs w:val="32"/>
+              </w:rPr>
+              <w:t xml:space="preserve">LLaMA-4 </w:t>
+            </w:r>
+          </w:p>
+        </w:tc>
+        <w:tc>
+          <w:tcPr>
+            <w:tcW w:w="0" w:type="auto"/>
+            <w:shd w:val="clear" w:color="auto" w:fill="FBFBFB"/>
+            <w:tcMar>
+              <w:top w:w="60" w:type="dxa"/>
+              <w:left w:w="90" w:type="dxa"/>
+              <w:bottom w:w="60" w:type="dxa"/>
+              <w:right w:w="90" w:type="dxa"/>
+            </w:tcMar>
+            <w:vAlign w:val="bottom"/>
+          </w:tcPr>
+          <w:p>
+            <w:pPr>
+              <w:spacing w:before="30" w:after="30"/>
+              <w:jc w:val="center"/>
+              <w:rPr>
+                <w:sz w:val="20"/>
+                <w:szCs w:val="20"/>
+              </w:rPr>
+            </w:pPr>
+            <w:r>
+              <w:rPr>
+                <w:rFonts w:cs="Calibri"/>
+                <w:color w:val="000000"/>
+                <w:sz w:val="20"/>
+                <w:szCs w:val="20"/>
+              </w:rPr>
+              <w:t>0.3944</w:t>
+            </w:r>
+          </w:p>
+        </w:tc>
+        <w:tc>
+          <w:tcPr>
+            <w:tcW w:w="0" w:type="auto"/>
+            <w:shd w:val="clear" w:color="auto" w:fill="FBFBFB"/>
+            <w:tcMar>
+              <w:top w:w="60" w:type="dxa"/>
+              <w:left w:w="90" w:type="dxa"/>
+              <w:bottom w:w="60" w:type="dxa"/>
+              <w:right w:w="90" w:type="dxa"/>
+            </w:tcMar>
+            <w:vAlign w:val="bottom"/>
+          </w:tcPr>
+          <w:p>
+            <w:pPr>
+              <w:spacing w:before="30" w:after="30"/>
+              <w:jc w:val="center"/>
+              <w:rPr>
+                <w:sz w:val="20"/>
+                <w:szCs w:val="20"/>
+              </w:rPr>
+            </w:pPr>
+            <w:r>
+              <w:rPr>
+                <w:rFonts w:cs="Calibri"/>
+                <w:color w:val="000000"/>
+                <w:sz w:val="20"/>
+                <w:szCs w:val="20"/>
+              </w:rPr>
+              <w:t>0.6495</w:t>
+            </w:r>
+          </w:p>
+        </w:tc>
+      </w:tr>
+      <w:tr>
         <w:tc>
           <w:tcPr>
             <w:tcW w:w="0" w:type="auto"/>
@@ -7915,29 +8229,23 @@
           <w:p>
             <w:pPr>
               <w:spacing w:before="30" w:after="30"/>
-              <w:jc w:val="center"/>
-              <w:rPr>
-                <w:rFonts w:hint="eastAsia"/>
+              <w:jc w:val="right"/>
+              <w:rPr>
+                <w:sz w:val="20"/>
+                <w:szCs w:val="32"/>
+              </w:rPr>
+            </w:pPr>
+            <w:r>
+              <w:rPr>
+                <w:b/>
                 <w:color w:val="222222"/>
                 <w:sz w:val="20"/>
                 <w:szCs w:val="32"/>
-                <w:lang w:eastAsia="zh-CN"/>
-              </w:rPr>
-            </w:pPr>
-            <w:r>
-              <w:rPr>
-                <w:rFonts w:hint="eastAsia"/>
-                <w:color w:val="222222"/>
-                <w:sz w:val="20"/>
-                <w:szCs w:val="32"/>
-                <w:lang w:eastAsia="zh-CN"/>
-              </w:rPr>
-              <w:t>0.7431</w:t>
-            </w:r>
-          </w:p>
-        </w:tc>
-      </w:tr>
-      <w:tr>
+              </w:rPr>
+              <w:t>Claude 4.6 Sonnet</w:t>
+            </w:r>
+          </w:p>
+        </w:tc>
         <w:tc>
           <w:tcPr>
             <w:tcW w:w="0" w:type="auto"/>
@@ -7948,45 +8256,25 @@
               <w:bottom w:w="60" w:type="dxa"/>
               <w:right w:w="90" w:type="dxa"/>
             </w:tcMar>
-            <w:vAlign w:val="center"/>
+            <w:vAlign w:val="bottom"/>
           </w:tcPr>
           <w:p>
             <w:pPr>
               <w:spacing w:before="30" w:after="30"/>
-              <w:jc w:val="right"/>
+              <w:jc w:val="center"/>
               <w:rPr>
                 <w:sz w:val="20"/>
-                <w:szCs w:val="32"/>
-              </w:rPr>
-            </w:pPr>
-            <w:r>
-              <w:rPr>
-                <w:b/>
-                <w:color w:val="222222"/>
+                <w:szCs w:val="20"/>
+              </w:rPr>
+            </w:pPr>
+            <w:r>
+              <w:rPr>
+                <w:rFonts w:cs="Calibri"/>
+                <w:color w:val="000000"/>
                 <w:sz w:val="20"/>
-                <w:szCs w:val="32"/>
-              </w:rPr>
-              <w:t>BERT</w:t>
-            </w:r>
-            <w:r>
-              <w:rPr>
-                <w:rFonts w:hint="eastAsia"/>
-                <w:b/>
-                <w:color w:val="222222"/>
-                <w:sz w:val="20"/>
-                <w:szCs w:val="32"/>
-                <w:lang w:eastAsia="zh-CN"/>
-              </w:rPr>
-              <w:t xml:space="preserve"> (Avg. 5 runs)</w:t>
-            </w:r>
-            <w:r>
-              <w:rPr>
-                <w:b/>
-                <w:color w:val="222222"/>
-                <w:sz w:val="20"/>
-                <w:szCs w:val="32"/>
-              </w:rPr>
-              <w:t xml:space="preserve"> </w:t>
+                <w:szCs w:val="20"/>
+              </w:rPr>
+              <w:t>0.4535</w:t>
             </w:r>
           </w:p>
         </w:tc>
@@ -8000,7 +8288,7 @@
               <w:bottom w:w="60" w:type="dxa"/>
               <w:right w:w="90" w:type="dxa"/>
             </w:tcMar>
-            <w:vAlign w:val="center"/>
+            <w:vAlign w:val="bottom"/>
           </w:tcPr>
           <w:p>
             <w:pPr>
@@ -8008,47 +8296,17 @@
               <w:jc w:val="center"/>
               <w:rPr>
                 <w:sz w:val="20"/>
-                <w:szCs w:val="32"/>
-              </w:rPr>
-            </w:pPr>
-            <w:r>
-              <w:rPr>
-                <w:color w:val="222222"/>
+                <w:szCs w:val="20"/>
+              </w:rPr>
+            </w:pPr>
+            <w:r>
+              <w:rPr>
+                <w:rFonts w:cs="Calibri"/>
+                <w:color w:val="000000"/>
                 <w:sz w:val="20"/>
-                <w:szCs w:val="32"/>
-              </w:rPr>
-              <w:t>0.5685 ± 0.0080</w:t>
-            </w:r>
-          </w:p>
-        </w:tc>
-        <w:tc>
-          <w:tcPr>
-            <w:tcW w:w="0" w:type="auto"/>
-            <w:shd w:val="clear" w:color="auto" w:fill="FFFFFF"/>
-            <w:tcMar>
-              <w:top w:w="60" w:type="dxa"/>
-              <w:left w:w="90" w:type="dxa"/>
-              <w:bottom w:w="60" w:type="dxa"/>
-              <w:right w:w="90" w:type="dxa"/>
-            </w:tcMar>
-            <w:vAlign w:val="center"/>
-          </w:tcPr>
-          <w:p>
-            <w:pPr>
-              <w:spacing w:before="30" w:after="30"/>
-              <w:jc w:val="center"/>
-              <w:rPr>
-                <w:sz w:val="20"/>
-                <w:szCs w:val="32"/>
-              </w:rPr>
-            </w:pPr>
-            <w:r>
-              <w:rPr>
-                <w:color w:val="222222"/>
-                <w:sz w:val="20"/>
-                <w:szCs w:val="32"/>
-              </w:rPr>
-              <w:t>0.7463 ± 0.0076</w:t>
+                <w:szCs w:val="20"/>
+              </w:rPr>
+              <w:t>0.6597</w:t>
             </w:r>
           </w:p>
         </w:tc>
@@ -8082,16 +8340,7 @@
                 <w:sz w:val="20"/>
                 <w:szCs w:val="32"/>
               </w:rPr>
-              <w:t>LLaMA-4</w:t>
-            </w:r>
-            <w:r>
-              <w:rPr>
-                <w:b/>
-                <w:color w:val="222222"/>
-                <w:sz w:val="20"/>
-                <w:szCs w:val="32"/>
-              </w:rPr>
-              <w:t xml:space="preserve"> </w:t>
+              <w:t>ETHER</w:t>
             </w:r>
           </w:p>
         </w:tc>
@@ -8105,7 +8354,7 @@
               <w:bottom w:w="60" w:type="dxa"/>
               <w:right w:w="90" w:type="dxa"/>
             </w:tcMar>
-            <w:vAlign w:val="center"/>
+            <w:vAlign w:val="bottom"/>
           </w:tcPr>
           <w:p>
             <w:pPr>
@@ -8113,16 +8362,17 @@
               <w:jc w:val="center"/>
               <w:rPr>
                 <w:sz w:val="20"/>
-                <w:szCs w:val="32"/>
-              </w:rPr>
-            </w:pPr>
-            <w:r>
-              <w:rPr>
-                <w:color w:val="222222"/>
+                <w:szCs w:val="20"/>
+              </w:rPr>
+            </w:pPr>
+            <w:r>
+              <w:rPr>
+                <w:rFonts w:cs="Calibri"/>
+                <w:color w:val="000000"/>
                 <w:sz w:val="20"/>
-                <w:szCs w:val="32"/>
-              </w:rPr>
-              <w:t>0.4043</w:t>
+                <w:szCs w:val="20"/>
+              </w:rPr>
+              <w:t>0.1147</w:t>
             </w:r>
           </w:p>
         </w:tc>
@@ -8136,7 +8386,7 @@
               <w:bottom w:w="60" w:type="dxa"/>
               <w:right w:w="90" w:type="dxa"/>
             </w:tcMar>
-            <w:vAlign w:val="center"/>
+            <w:vAlign w:val="bottom"/>
           </w:tcPr>
           <w:p>
             <w:pPr>
@@ -8144,208 +8394,17 @@
               <w:jc w:val="center"/>
               <w:rPr>
                 <w:sz w:val="20"/>
-                <w:szCs w:val="32"/>
-              </w:rPr>
-            </w:pPr>
-            <w:r>
-              <w:rPr>
-                <w:color w:val="222222"/>
+                <w:szCs w:val="20"/>
+              </w:rPr>
+            </w:pPr>
+            <w:r>
+              <w:rPr>
+                <w:rFonts w:cs="Calibri"/>
+                <w:color w:val="000000"/>
                 <w:sz w:val="20"/>
-                <w:szCs w:val="32"/>
-              </w:rPr>
-              <w:t>0.6249</w:t>
-            </w:r>
-          </w:p>
-        </w:tc>
-      </w:tr>
-      <w:tr>
-        <w:tc>
-          <w:tcPr>
-            <w:tcW w:w="0" w:type="auto"/>
-            <w:shd w:val="clear" w:color="auto" w:fill="FFFFFF"/>
-            <w:tcMar>
-              <w:top w:w="60" w:type="dxa"/>
-              <w:left w:w="90" w:type="dxa"/>
-              <w:bottom w:w="60" w:type="dxa"/>
-              <w:right w:w="90" w:type="dxa"/>
-            </w:tcMar>
-            <w:vAlign w:val="center"/>
-          </w:tcPr>
-          <w:p>
-            <w:pPr>
-              <w:spacing w:before="30" w:after="30"/>
-              <w:jc w:val="right"/>
-              <w:rPr>
-                <w:sz w:val="20"/>
-                <w:szCs w:val="32"/>
-              </w:rPr>
-            </w:pPr>
-            <w:r>
-              <w:rPr>
-                <w:b/>
-                <w:color w:val="222222"/>
-                <w:sz w:val="20"/>
-                <w:szCs w:val="32"/>
-              </w:rPr>
-              <w:t>Claude 4.6 Sonnet</w:t>
-            </w:r>
-          </w:p>
-        </w:tc>
-        <w:tc>
-          <w:tcPr>
-            <w:tcW w:w="0" w:type="auto"/>
-            <w:shd w:val="clear" w:color="auto" w:fill="FFFFFF"/>
-            <w:tcMar>
-              <w:top w:w="60" w:type="dxa"/>
-              <w:left w:w="90" w:type="dxa"/>
-              <w:bottom w:w="60" w:type="dxa"/>
-              <w:right w:w="90" w:type="dxa"/>
-            </w:tcMar>
-            <w:vAlign w:val="center"/>
-          </w:tcPr>
-          <w:p>
-            <w:pPr>
-              <w:spacing w:before="30" w:after="30"/>
-              <w:jc w:val="center"/>
-              <w:rPr>
-                <w:sz w:val="20"/>
-                <w:szCs w:val="32"/>
-              </w:rPr>
-            </w:pPr>
-            <w:r>
-              <w:rPr>
-                <w:color w:val="222222"/>
-                <w:sz w:val="20"/>
-                <w:szCs w:val="32"/>
-              </w:rPr>
-              <w:t>0.4667</w:t>
-            </w:r>
-          </w:p>
-        </w:tc>
-        <w:tc>
-          <w:tcPr>
-            <w:tcW w:w="0" w:type="auto"/>
-            <w:shd w:val="clear" w:color="auto" w:fill="FFFFFF"/>
-            <w:tcMar>
-              <w:top w:w="60" w:type="dxa"/>
-              <w:left w:w="90" w:type="dxa"/>
-              <w:bottom w:w="60" w:type="dxa"/>
-              <w:right w:w="90" w:type="dxa"/>
-            </w:tcMar>
-            <w:vAlign w:val="center"/>
-          </w:tcPr>
-          <w:p>
-            <w:pPr>
-              <w:spacing w:before="30" w:after="30"/>
-              <w:jc w:val="center"/>
-              <w:rPr>
-                <w:sz w:val="20"/>
-                <w:szCs w:val="32"/>
-              </w:rPr>
-            </w:pPr>
-            <w:r>
-              <w:rPr>
-                <w:color w:val="222222"/>
-                <w:sz w:val="20"/>
-                <w:szCs w:val="32"/>
-              </w:rPr>
-              <w:t>0.6443</w:t>
-            </w:r>
-          </w:p>
-        </w:tc>
-      </w:tr>
-      <w:tr>
-        <w:tc>
-          <w:tcPr>
-            <w:tcW w:w="0" w:type="auto"/>
-            <w:shd w:val="clear" w:color="auto" w:fill="FBFBFB"/>
-            <w:tcMar>
-              <w:top w:w="60" w:type="dxa"/>
-              <w:left w:w="90" w:type="dxa"/>
-              <w:bottom w:w="60" w:type="dxa"/>
-              <w:right w:w="90" w:type="dxa"/>
-            </w:tcMar>
-            <w:vAlign w:val="center"/>
-          </w:tcPr>
-          <w:p>
-            <w:pPr>
-              <w:spacing w:before="30" w:after="30"/>
-              <w:jc w:val="right"/>
-              <w:rPr>
-                <w:sz w:val="20"/>
-                <w:szCs w:val="32"/>
-              </w:rPr>
-            </w:pPr>
-            <w:r>
-              <w:rPr>
-                <w:b/>
-                <w:color w:val="222222"/>
-                <w:sz w:val="20"/>
-                <w:szCs w:val="32"/>
-              </w:rPr>
-              <w:t>ETHER</w:t>
-            </w:r>
-          </w:p>
-        </w:tc>
-        <w:tc>
-          <w:tcPr>
-            <w:tcW w:w="0" w:type="auto"/>
-            <w:shd w:val="clear" w:color="auto" w:fill="FBFBFB"/>
-            <w:tcMar>
-              <w:top w:w="60" w:type="dxa"/>
-              <w:left w:w="90" w:type="dxa"/>
-              <w:bottom w:w="60" w:type="dxa"/>
-              <w:right w:w="90" w:type="dxa"/>
-            </w:tcMar>
-            <w:vAlign w:val="center"/>
-          </w:tcPr>
-          <w:p>
-            <w:pPr>
-              <w:spacing w:before="30" w:after="30"/>
-              <w:jc w:val="center"/>
-              <w:rPr>
-                <w:sz w:val="20"/>
-                <w:szCs w:val="32"/>
-              </w:rPr>
-            </w:pPr>
-            <w:r>
-              <w:rPr>
-                <w:color w:val="222222"/>
-                <w:sz w:val="20"/>
-                <w:szCs w:val="32"/>
-              </w:rPr>
-              <w:t>0.1147</w:t>
-            </w:r>
-          </w:p>
-        </w:tc>
-        <w:tc>
-          <w:tcPr>
-            <w:tcW w:w="0" w:type="auto"/>
-            <w:shd w:val="clear" w:color="auto" w:fill="FBFBFB"/>
-            <w:tcMar>
-              <w:top w:w="60" w:type="dxa"/>
-              <w:left w:w="90" w:type="dxa"/>
-              <w:bottom w:w="60" w:type="dxa"/>
-              <w:right w:w="90" w:type="dxa"/>
-            </w:tcMar>
-            <w:vAlign w:val="center"/>
-          </w:tcPr>
-          <w:p>
-            <w:pPr>
-              <w:spacing w:before="30" w:after="30"/>
-              <w:jc w:val="center"/>
-              <w:rPr>
-                <w:sz w:val="20"/>
-                <w:szCs w:val="32"/>
-              </w:rPr>
-            </w:pPr>
-            <w:r>
-              <w:rPr>
-                <w:color w:val="222222"/>
-                <w:sz w:val="20"/>
-                <w:szCs w:val="32"/>
-              </w:rPr>
-              <w:t>0.2447</w:t>
+                <w:szCs w:val="20"/>
+              </w:rPr>
+              <w:t>0.2691</w:t>
             </w:r>
           </w:p>
         </w:tc>
@@ -9079,26 +9138,42 @@
           <w:i/>
           <w:iCs/>
         </w:rPr>
-        <w:t>sleep apnoea syndrome</w:t>
-      </w:r>
-      <w:r>
-        <w:t xml:space="preserve">, </w:t>
-      </w:r>
+        <w:t xml:space="preserve">sleep </w:t>
+      </w:r>
+      <w:proofErr w:type="spellStart"/>
       <w:r>
         <w:rPr>
           <w:i/>
           <w:iCs/>
         </w:rPr>
-        <w:t>atrial fibrillation</w:t>
-      </w:r>
-      <w:r>
-        <w:t xml:space="preserve">, and </w:t>
-      </w:r>
+        <w:t>apnoea</w:t>
+      </w:r>
+      <w:proofErr w:type="spellEnd"/>
       <w:r>
         <w:rPr>
           <w:i/>
           <w:iCs/>
         </w:rPr>
+        <w:t xml:space="preserve"> syndrome</w:t>
+      </w:r>
+      <w:r>
+        <w:t xml:space="preserve">, </w:t>
+      </w:r>
+      <w:r>
+        <w:rPr>
+          <w:i/>
+          <w:iCs/>
+        </w:rPr>
+        <w:t>atrial fibrillation</w:t>
+      </w:r>
+      <w:r>
+        <w:t xml:space="preserve">, and </w:t>
+      </w:r>
+      <w:r>
+        <w:rPr>
+          <w:i/>
+          <w:iCs/>
+        </w:rPr>
         <w:t>depression</w:t>
       </w:r>
       <w:r>
@@ -9202,13 +9277,21 @@
         <w:t>BERT</w:t>
       </w:r>
       <w:r>
-        <w:t xml:space="preserve"> fine-tuned via 10-fold cross-validation achieved a strict exact-match F1 of 0.7015 </w:t>
+        <w:t xml:space="preserve"> fine-tuned via 10-fold cross-validation achieved a strict exact-match F1 of </w:t>
+      </w:r>
+      <w:proofErr w:type="gramStart"/>
+      <w:r>
+        <w:t xml:space="preserve">0.7015 </w:t>
       </w:r>
       <w:r>
         <w:t xml:space="preserve"> </w:t>
       </w:r>
       <w:r>
-        <w:t xml:space="preserve">(0.8370 </w:t>
+        <w:t>(</w:t>
+      </w:r>
+      <w:proofErr w:type="gramEnd"/>
+      <w:r>
+        <w:t xml:space="preserve">0.8370 </w:t>
       </w:r>
       <w:r>
         <w:t>for A</w:t>
@@ -9439,6 +9522,7 @@
                 <w:lang w:eastAsia="en-US"/>
               </w:rPr>
             </w:pPr>
+            <w:proofErr w:type="spellStart"/>
             <w:r>
               <w:rPr>
                 <w:rFonts w:ascii="Arial" w:hAnsi="Arial"/>
@@ -9451,6 +9535,7 @@
               </w:rPr>
               <w:t>pDx</w:t>
             </w:r>
+            <w:proofErr w:type="spellEnd"/>
           </w:p>
         </w:tc>
         <w:tc>
@@ -9548,6 +9633,7 @@
                 <w:lang w:eastAsia="en-US"/>
               </w:rPr>
             </w:pPr>
+            <w:proofErr w:type="spellStart"/>
             <w:r>
               <w:rPr>
                 <w:rFonts w:ascii="Arial" w:hAnsi="Arial"/>
@@ -9560,6 +9646,7 @@
               </w:rPr>
               <w:t>sDx</w:t>
             </w:r>
+            <w:proofErr w:type="spellEnd"/>
           </w:p>
         </w:tc>
         <w:tc>
@@ -10093,6 +10180,7 @@
                 <w:lang w:eastAsia="en-US"/>
               </w:rPr>
             </w:pPr>
+            <w:proofErr w:type="spellStart"/>
             <w:r>
               <w:rPr>
                 <w:rFonts w:ascii="Arial" w:hAnsi="Arial"/>
@@ -10105,6 +10193,7 @@
               </w:rPr>
               <w:t>FHx</w:t>
             </w:r>
+            <w:proofErr w:type="spellEnd"/>
           </w:p>
         </w:tc>
         <w:tc>
@@ -10754,7 +10843,31 @@
         <w:t>Figure 6a</w:t>
       </w:r>
       <w:r>
-        <w:t xml:space="preserve">) across all 11 clinical concept categories confirmed strong supervised encoder advantages across vaccines (VAX: 0.93 vs 0.85), treatments (TX: 0.92 vs 0.76), secondary diagnoses (sDx: 0.87 vs 0.62), medical history (MHx: 0.85 vs 0.58), patient clinical status (STATUS: 0.83 vs 0.61), primary diagnoses (pDx: 0.83 vs 0.70), adverse-event symptoms (SYM: 0.78 vs 0.57), laboratory findings (Lab: 0.76 vs 0.56), and family history (FHx: 0.65 vs 0.51). Notably, few-shot </w:t>
+        <w:t>) across all 11 clinical concept categories confirmed strong supervised encoder advantages across vaccines (VAX: 0.93 vs 0.85), treatments (TX: 0.92 vs 0.76), secondary diagnoses (</w:t>
+      </w:r>
+      <w:proofErr w:type="spellStart"/>
+      <w:r>
+        <w:t>sDx</w:t>
+      </w:r>
+      <w:proofErr w:type="spellEnd"/>
+      <w:r>
+        <w:t>: 0.87 vs 0.62), medical history (MHx: 0.85 vs 0.58), patient clinical status (STATUS: 0.83 vs 0.61), primary diagnoses (</w:t>
+      </w:r>
+      <w:proofErr w:type="spellStart"/>
+      <w:r>
+        <w:t>pDx</w:t>
+      </w:r>
+      <w:proofErr w:type="spellEnd"/>
+      <w:r>
+        <w:t>: 0.83 vs 0.70), adverse-event symptoms (SYM: 0.78 vs 0.57), laboratory findings (Lab: 0.76 vs 0.56), and family history (</w:t>
+      </w:r>
+      <w:proofErr w:type="spellStart"/>
+      <w:r>
+        <w:t>FHx</w:t>
+      </w:r>
+      <w:proofErr w:type="spellEnd"/>
+      <w:r>
+        <w:t xml:space="preserve">: 0.65 vs 0.51). Notably, few-shot </w:t>
       </w:r>
       <w:r>
         <w:t>LLaMA-4</w:t>
@@ -10816,7 +10929,15 @@
         <w:t>LLaMA-4</w:t>
       </w:r>
       <w:r>
-        <w:t xml:space="preserve"> was subsuming secondary diagnoses under adverse symptoms (sDx </w:t>
+        <w:t xml:space="preserve"> was subsuming secondary diagnoses under adverse symptoms (</w:t>
+      </w:r>
+      <w:proofErr w:type="spellStart"/>
+      <w:r>
+        <w:t>sDx</w:t>
+      </w:r>
+      <w:proofErr w:type="spellEnd"/>
+      <w:r>
+        <w:t xml:space="preserve"> </w:t>
       </w:r>
       <w:r>
         <w:t>to</w:t>
@@ -10828,7 +10949,15 @@
         <w:t>to</w:t>
       </w:r>
       <w:r>
-        <w:t xml:space="preserve"> sDx: 1,093), symptom conflation with medical history (SYM </w:t>
+        <w:t xml:space="preserve"> </w:t>
+      </w:r>
+      <w:proofErr w:type="spellStart"/>
+      <w:r>
+        <w:t>sDx</w:t>
+      </w:r>
+      <w:proofErr w:type="spellEnd"/>
+      <w:r>
+        <w:t xml:space="preserve">: 1,093), symptom conflation with medical history (SYM </w:t>
       </w:r>
       <w:r>
         <w:t>to</w:t>
@@ -10846,7 +10975,15 @@
         <w:t>BERT</w:t>
       </w:r>
       <w:r>
-        <w:t xml:space="preserve">, confusions similarly peaked at sDx </w:t>
+        <w:t xml:space="preserve">, confusions similarly peaked at </w:t>
+      </w:r>
+      <w:proofErr w:type="spellStart"/>
+      <w:r>
+        <w:t>sDx</w:t>
+      </w:r>
+      <w:proofErr w:type="spellEnd"/>
+      <w:r>
+        <w:t xml:space="preserve"> </w:t>
       </w:r>
       <w:r>
         <w:t>to</w:t>
@@ -10858,7 +10995,15 @@
         <w:t>to</w:t>
       </w:r>
       <w:r>
-        <w:t xml:space="preserve"> sDx (350), but at markedly lower absolute frequencies.</w:t>
+        <w:t xml:space="preserve"> </w:t>
+      </w:r>
+      <w:proofErr w:type="spellStart"/>
+      <w:r>
+        <w:t>sDx</w:t>
+      </w:r>
+      <w:proofErr w:type="spellEnd"/>
+      <w:r>
+        <w:t xml:space="preserve"> (350), but at markedly lower absolute frequencies.</w:t>
       </w:r>
     </w:p>
     <w:p/>
@@ -11122,7 +11267,15 @@
     </w:p>
     <w:p>
       <w:r>
-        <w:t>We applied a repeated Leave-One-Drug-Event-Pair-Out cross-validation protocol on the FAERS corpus to evaluate model generalization across distinct therapeutic contexts on all 17 clinical concept categories. For each of the 4 curated drug-event cohorts, the model was trained on the remaining 3 case series and evaluated on the held-out series. As shown in Table 5, strict exact-match F1 was 0.6002 ± 0.0113 for azacitidine–QT prolongation (N = 200), 0.6367 ± 0.0201 for baricitinib–hypersensitivity (N = 200), 0.5289 ± 0.0093 for tramadol–hypoglycemia (N = 229), and 0.5084 ± 0.0122 for erenumab–stroke (N = 200), yielding an aggregated micro-average F1 of 0.5564 ± 0.0069 across the full corpus (0.7420 ± 0.0061 Adapted ADE F1). The between-series performance variance exceeded within-fold variation, demonstrating that narrative complexity and therapeutic vocabulary differences contribute more variation than stochastic model initialization.</w:t>
+        <w:t xml:space="preserve">We applied a repeated Leave-One-Drug-Event-Pair-Out cross-validation protocol on the FAERS corpus to evaluate model generalization across distinct therapeutic contexts on all 17 clinical concept categories. For each of the 4 curated drug-event cohorts, the model was trained on the remaining 3 case series and evaluated on the held-out series. As shown in Table 5, strict exact-match F1 was 0.6002 ± 0.0113 for azacitidine–QT prolongation (N = 200), 0.6367 ± 0.0201 for baricitinib–hypersensitivity (N = 200), 0.5289 ± 0.0093 for tramadol–hypoglycemia (N = 229), and 0.5084 ± 0.0122 for </w:t>
+      </w:r>
+      <w:proofErr w:type="spellStart"/>
+      <w:r>
+        <w:t>erenumab</w:t>
+      </w:r>
+      <w:proofErr w:type="spellEnd"/>
+      <w:r>
+        <w:t>–stroke (N = 200), yielding an aggregated micro-average F1 of 0.5564 ± 0.0069 across the full corpus (0.7420 ± 0.0061 Adapted ADE F1). The between-series performance variance exceeded within-fold variation, demonstrating that narrative complexity and therapeutic vocabulary differences contribute more variation than stochastic model initialization.</w:t>
       </w:r>
     </w:p>
     <w:p>
@@ -14221,7 +14374,39 @@
     </w:p>
     <w:p>
       <w:r>
-        <w:t>To investigate the impact of underlying pretraining corpora on pharmacovigilance concept extraction, we conducted an ablation study comparing four transformer encoder architectures (BERT-Base, BioBERT, Bio_ClinicalBERT, and ClinicalBERT) on the VAERS dataset across 5 independent random initialization seeds (Table 8). BioBERT achieved the highest validation F1 (0.8471 ± 0.0058, Precision = 0.8666, Recall = 0.8285), confirming its selection as the primary encoder architecture. All four models demonstrated close performance with minimal variance across seeds (SD &lt; 0.009).</w:t>
+        <w:t xml:space="preserve">To investigate the impact of underlying pretraining corpora on pharmacovigilance concept extraction, we conducted an ablation study comparing four transformer encoder architectures (BERT-Base, </w:t>
+      </w:r>
+      <w:proofErr w:type="spellStart"/>
+      <w:r>
+        <w:t>BioBERT</w:t>
+      </w:r>
+      <w:proofErr w:type="spellEnd"/>
+      <w:r>
+        <w:t xml:space="preserve">, </w:t>
+      </w:r>
+      <w:proofErr w:type="spellStart"/>
+      <w:r>
+        <w:t>Bio_ClinicalBERT</w:t>
+      </w:r>
+      <w:proofErr w:type="spellEnd"/>
+      <w:r>
+        <w:t xml:space="preserve">, and </w:t>
+      </w:r>
+      <w:proofErr w:type="spellStart"/>
+      <w:r>
+        <w:t>ClinicalBERT</w:t>
+      </w:r>
+      <w:proofErr w:type="spellEnd"/>
+      <w:r>
+        <w:t xml:space="preserve">) on the VAERS dataset across 5 independent random initialization seeds (Table 8). </w:t>
+      </w:r>
+      <w:proofErr w:type="spellStart"/>
+      <w:r>
+        <w:t>BioBERT</w:t>
+      </w:r>
+      <w:proofErr w:type="spellEnd"/>
+      <w:r>
+        <w:t xml:space="preserve"> achieved the highest validation F1 (0.8471 ± 0.0058, Precision = 0.8666, Recall = 0.8285), confirming its selection as the primary encoder architecture. All four models demonstrated close performance with minimal variance across seeds (SD &lt; 0.009).</w:t>
       </w:r>
     </w:p>
     <w:p>
@@ -14591,6 +14776,7 @@
                 <w:szCs w:val="20"/>
               </w:rPr>
             </w:pPr>
+            <w:proofErr w:type="spellStart"/>
             <w:r>
               <w:rPr>
                 <w:b/>
@@ -14598,7 +14784,17 @@
                 <w:sz w:val="20"/>
                 <w:szCs w:val="20"/>
               </w:rPr>
-              <w:t>BioBERT v1.1</w:t>
+              <w:t>BioBERT</w:t>
+            </w:r>
+            <w:proofErr w:type="spellEnd"/>
+            <w:r>
+              <w:rPr>
+                <w:b/>
+                <w:color w:val="222222"/>
+                <w:sz w:val="20"/>
+                <w:szCs w:val="20"/>
+              </w:rPr>
+              <w:t xml:space="preserve"> v1.1</w:t>
             </w:r>
           </w:p>
         </w:tc>
@@ -14724,6 +14920,7 @@
                 <w:szCs w:val="20"/>
               </w:rPr>
             </w:pPr>
+            <w:proofErr w:type="spellStart"/>
             <w:r>
               <w:rPr>
                 <w:b/>
@@ -14733,6 +14930,7 @@
               </w:rPr>
               <w:t>Bio_ClinicalBERT</w:t>
             </w:r>
+            <w:proofErr w:type="spellEnd"/>
           </w:p>
         </w:tc>
         <w:tc>
@@ -14851,6 +15049,7 @@
                 <w:szCs w:val="20"/>
               </w:rPr>
             </w:pPr>
+            <w:proofErr w:type="spellStart"/>
             <w:r>
               <w:rPr>
                 <w:b/>
@@ -14860,6 +15059,7 @@
               </w:rPr>
               <w:t>ClinicalBERT</w:t>
             </w:r>
+            <w:proofErr w:type="spellEnd"/>
           </w:p>
         </w:tc>
         <w:tc>
@@ -15096,7 +15296,15 @@
       </w:r>
       <w:r>
         <w:lastRenderedPageBreak/>
-        <w:t>characterizations also highlight areas where additional training data, refined guidelines, or specialized modeling approaches may further improve performance.</w:t>
+        <w:t xml:space="preserve">characterizations also highlight areas </w:t>
+      </w:r>
+      <w:proofErr w:type="gramStart"/>
+      <w:r>
+        <w:t>where</w:t>
+      </w:r>
+      <w:proofErr w:type="gramEnd"/>
+      <w:r>
+        <w:t xml:space="preserve"> additional training data, refined guidelines, or specialized modeling approaches may further improve performance.</w:t>
       </w:r>
     </w:p>
     <w:p>

</xml_diff>

<commit_message>
Align FAERS tables with canonical case-series data
</commit_message>
<xml_diff>
--- a/publication/manuscripts/LLM4AE_rev1.docx
+++ b/publication/manuscripts/LLM4AE_rev1.docx
@@ -7768,7 +7768,7 @@
       </w:tblPr>
       <w:tblGrid>
         <w:gridCol w:w="2051"/>
-        <w:gridCol w:w="1551"/>
+        <w:gridCol w:w="1478"/>
         <w:gridCol w:w="2074"/>
       </w:tblGrid>
       <w:tr>
@@ -7945,20 +7945,22 @@
               <w:spacing w:before="30" w:after="30"/>
               <w:jc w:val="center"/>
               <w:rPr>
+                <w:bCs/>
                 <w:color w:val="222222"/>
                 <w:sz w:val="20"/>
-                <w:szCs w:val="20"/>
+                <w:szCs w:val="32"/>
                 <w:lang w:eastAsia="zh-CN"/>
               </w:rPr>
             </w:pPr>
             <w:r>
               <w:rPr>
-                <w:rFonts w:cs="Calibri"/>
-                <w:color w:val="000000"/>
+                <w:bCs/>
+                <w:color w:val="222222"/>
                 <w:sz w:val="20"/>
-                <w:szCs w:val="20"/>
-              </w:rPr>
-              <w:t>0.5582</w:t>
+                <w:szCs w:val="32"/>
+                <w:lang w:eastAsia="zh-CN"/>
+              </w:rPr>
+              <w:t>0.5508</w:t>
             </w:r>
           </w:p>
         </w:tc>
@@ -7979,20 +7981,128 @@
               <w:spacing w:before="30" w:after="30"/>
               <w:jc w:val="center"/>
               <w:rPr>
+                <w:bCs/>
                 <w:color w:val="222222"/>
                 <w:sz w:val="20"/>
-                <w:szCs w:val="20"/>
+                <w:szCs w:val="32"/>
                 <w:lang w:eastAsia="zh-CN"/>
               </w:rPr>
             </w:pPr>
             <w:r>
               <w:rPr>
-                <w:rFonts w:cs="Calibri"/>
-                <w:color w:val="000000"/>
+                <w:bCs/>
+                <w:color w:val="222222"/>
                 <w:sz w:val="20"/>
-                <w:szCs w:val="20"/>
-              </w:rPr>
-              <w:t>0.7431</w:t>
+                <w:szCs w:val="32"/>
+                <w:lang w:eastAsia="zh-CN"/>
+              </w:rPr>
+              <w:t>0.7312</w:t>
+            </w:r>
+          </w:p>
+        </w:tc>
+      </w:tr>
+      <w:tr>
+        <w:tc>
+          <w:tcPr>
+            <w:tcW w:w="0" w:type="auto"/>
+            <w:shd w:val="clear" w:color="auto" w:fill="FBFBFB"/>
+            <w:tcMar>
+              <w:top w:w="60" w:type="dxa"/>
+              <w:left w:w="90" w:type="dxa"/>
+              <w:bottom w:w="60" w:type="dxa"/>
+              <w:right w:w="90" w:type="dxa"/>
+            </w:tcMar>
+            <w:vAlign w:val="center"/>
+          </w:tcPr>
+          <w:p>
+            <w:pPr>
+              <w:spacing w:before="30" w:after="30"/>
+              <w:jc w:val="right"/>
+              <w:rPr>
+                <w:sz w:val="20"/>
+                <w:szCs w:val="32"/>
+              </w:rPr>
+            </w:pPr>
+            <w:r>
+              <w:rPr>
+                <w:b/>
+                <w:color w:val="222222"/>
+                <w:sz w:val="20"/>
+                <w:szCs w:val="32"/>
+              </w:rPr>
+              <w:t xml:space="preserve">LLaMA-4 </w:t>
+            </w:r>
+          </w:p>
+        </w:tc>
+        <w:tc>
+          <w:tcPr>
+            <w:tcW w:w="0" w:type="auto"/>
+            <w:shd w:val="clear" w:color="auto" w:fill="FBFBFB"/>
+            <w:tcMar>
+              <w:top w:w="60" w:type="dxa"/>
+              <w:left w:w="90" w:type="dxa"/>
+              <w:bottom w:w="60" w:type="dxa"/>
+              <w:right w:w="90" w:type="dxa"/>
+            </w:tcMar>
+            <w:vAlign w:val="bottom"/>
+          </w:tcPr>
+          <w:p>
+            <w:pPr>
+              <w:spacing w:before="30" w:after="30"/>
+              <w:jc w:val="center"/>
+              <w:rPr>
+                <w:bCs/>
+                <w:color w:val="222222"/>
+                <w:sz w:val="20"/>
+                <w:szCs w:val="32"/>
+                <w:lang w:eastAsia="zh-CN"/>
+              </w:rPr>
+            </w:pPr>
+            <w:r>
+              <w:rPr>
+                <w:bCs/>
+                <w:color w:val="222222"/>
+                <w:sz w:val="20"/>
+                <w:szCs w:val="32"/>
+                <w:lang w:eastAsia="zh-CN"/>
+              </w:rPr>
+              <w:t>0.3944</w:t>
+            </w:r>
+          </w:p>
+        </w:tc>
+        <w:tc>
+          <w:tcPr>
+            <w:tcW w:w="0" w:type="auto"/>
+            <w:shd w:val="clear" w:color="auto" w:fill="FBFBFB"/>
+            <w:tcMar>
+              <w:top w:w="60" w:type="dxa"/>
+              <w:left w:w="90" w:type="dxa"/>
+              <w:bottom w:w="60" w:type="dxa"/>
+              <w:right w:w="90" w:type="dxa"/>
+            </w:tcMar>
+            <w:vAlign w:val="bottom"/>
+          </w:tcPr>
+          <w:p>
+            <w:pPr>
+              <w:spacing w:before="30" w:after="30"/>
+              <w:jc w:val="center"/>
+              <w:rPr>
+                <w:bCs/>
+                <w:color w:val="222222"/>
+                <w:sz w:val="20"/>
+                <w:szCs w:val="32"/>
+                <w:lang w:eastAsia="zh-CN"/>
+              </w:rPr>
+            </w:pPr>
+            <w:r>
+              <w:rPr>
+                <w:bCs/>
+                <w:color w:val="222222"/>
+                <w:sz w:val="20"/>
+                <w:szCs w:val="32"/>
+                <w:lang w:eastAsia="zh-CN"/>
+              </w:rPr>
+              <w:t>0.6495</w:t>
             </w:r>
           </w:p>
         </w:tc>
@@ -8026,27 +8136,7 @@
                 <w:sz w:val="20"/>
                 <w:szCs w:val="32"/>
               </w:rPr>
-              <w:t>BERT</w:t>
-            </w:r>
-            <w:r>
-              <w:rPr>
-                <w:rFonts w:hint="eastAsia"/>
-                <w:b/>
-                <w:color w:val="222222"/>
-                <w:sz w:val="20"/>
-                <w:szCs w:val="32"/>
-                <w:lang w:eastAsia="zh-CN"/>
-              </w:rPr>
-              <w:t xml:space="preserve"> (Avg. 5 runs)</w:t>
-            </w:r>
-            <w:r>
-              <w:rPr>
-                <w:b/>
-                <w:color w:val="222222"/>
-                <w:sz w:val="20"/>
-                <w:szCs w:val="32"/>
-              </w:rPr>
-              <w:t xml:space="preserve"> </w:t>
+              <w:t>Claude 4.6 Sonnet</w:t>
             </w:r>
           </w:p>
         </w:tc>
@@ -8067,18 +8157,22 @@
               <w:spacing w:before="30" w:after="30"/>
               <w:jc w:val="center"/>
               <w:rPr>
+                <w:bCs/>
+                <w:color w:val="222222"/>
                 <w:sz w:val="20"/>
-                <w:szCs w:val="20"/>
-              </w:rPr>
-            </w:pPr>
-            <w:r>
-              <w:rPr>
-                <w:rFonts w:cs="Calibri"/>
-                <w:color w:val="000000"/>
+                <w:szCs w:val="32"/>
+                <w:lang w:eastAsia="zh-CN"/>
+              </w:rPr>
+            </w:pPr>
+            <w:r>
+              <w:rPr>
+                <w:bCs/>
+                <w:color w:val="222222"/>
                 <w:sz w:val="20"/>
-                <w:szCs w:val="20"/>
-              </w:rPr>
-              <w:t>0.5685 ± 0.0080</w:t>
+                <w:szCs w:val="32"/>
+                <w:lang w:eastAsia="zh-CN"/>
+              </w:rPr>
+              <w:t>0.4535</w:t>
             </w:r>
           </w:p>
         </w:tc>
@@ -8099,18 +8193,22 @@
               <w:spacing w:before="30" w:after="30"/>
               <w:jc w:val="center"/>
               <w:rPr>
+                <w:bCs/>
+                <w:color w:val="222222"/>
                 <w:sz w:val="20"/>
-                <w:szCs w:val="20"/>
-              </w:rPr>
-            </w:pPr>
-            <w:r>
-              <w:rPr>
-                <w:rFonts w:cs="Calibri"/>
-                <w:color w:val="000000"/>
+                <w:szCs w:val="32"/>
+                <w:lang w:eastAsia="zh-CN"/>
+              </w:rPr>
+            </w:pPr>
+            <w:r>
+              <w:rPr>
+                <w:bCs/>
+                <w:color w:val="222222"/>
                 <w:sz w:val="20"/>
-                <w:szCs w:val="20"/>
-              </w:rPr>
-              <w:t>0.7463 ± 0.0075</w:t>
+                <w:szCs w:val="32"/>
+                <w:lang w:eastAsia="zh-CN"/>
+              </w:rPr>
+              <w:t>0.6597</w:t>
             </w:r>
           </w:p>
         </w:tc>
@@ -8144,7 +8242,7 @@
                 <w:sz w:val="20"/>
                 <w:szCs w:val="32"/>
               </w:rPr>
-              <w:t xml:space="preserve">LLaMA-4 </w:t>
+              <w:t>ETHER</w:t>
             </w:r>
           </w:p>
         </w:tc>
@@ -8165,18 +8263,22 @@
               <w:spacing w:before="30" w:after="30"/>
               <w:jc w:val="center"/>
               <w:rPr>
+                <w:bCs/>
+                <w:color w:val="222222"/>
                 <w:sz w:val="20"/>
-                <w:szCs w:val="20"/>
-              </w:rPr>
-            </w:pPr>
-            <w:r>
-              <w:rPr>
-                <w:rFonts w:cs="Calibri"/>
-                <w:color w:val="000000"/>
+                <w:szCs w:val="32"/>
+                <w:lang w:eastAsia="zh-CN"/>
+              </w:rPr>
+            </w:pPr>
+            <w:r>
+              <w:rPr>
+                <w:bCs/>
+                <w:color w:val="222222"/>
                 <w:sz w:val="20"/>
-                <w:szCs w:val="20"/>
-              </w:rPr>
-              <w:t>0.3944</w:t>
+                <w:szCs w:val="32"/>
+                <w:lang w:eastAsia="zh-CN"/>
+              </w:rPr>
+              <w:t>0.1147</w:t>
             </w:r>
           </w:p>
         </w:tc>
@@ -8197,212 +8299,20 @@
               <w:spacing w:before="30" w:after="30"/>
               <w:jc w:val="center"/>
               <w:rPr>
-                <w:sz w:val="20"/>
-                <w:szCs w:val="20"/>
-              </w:rPr>
-            </w:pPr>
-            <w:r>
-              <w:rPr>
-                <w:rFonts w:cs="Calibri"/>
-                <w:color w:val="000000"/>
-                <w:sz w:val="20"/>
-                <w:szCs w:val="20"/>
-              </w:rPr>
-              <w:t>0.6495</w:t>
-            </w:r>
-          </w:p>
-        </w:tc>
-      </w:tr>
-      <w:tr>
-        <w:tc>
-          <w:tcPr>
-            <w:tcW w:w="0" w:type="auto"/>
-            <w:shd w:val="clear" w:color="auto" w:fill="FFFFFF"/>
-            <w:tcMar>
-              <w:top w:w="60" w:type="dxa"/>
-              <w:left w:w="90" w:type="dxa"/>
-              <w:bottom w:w="60" w:type="dxa"/>
-              <w:right w:w="90" w:type="dxa"/>
-            </w:tcMar>
-            <w:vAlign w:val="center"/>
-          </w:tcPr>
-          <w:p>
-            <w:pPr>
-              <w:spacing w:before="30" w:after="30"/>
-              <w:jc w:val="right"/>
-              <w:rPr>
-                <w:sz w:val="20"/>
-                <w:szCs w:val="32"/>
-              </w:rPr>
-            </w:pPr>
-            <w:r>
-              <w:rPr>
-                <w:b/>
+                <w:bCs/>
                 <w:color w:val="222222"/>
                 <w:sz w:val="20"/>
                 <w:szCs w:val="32"/>
-              </w:rPr>
-              <w:t>Claude 4.6 Sonnet</w:t>
-            </w:r>
-          </w:p>
-        </w:tc>
-        <w:tc>
-          <w:tcPr>
-            <w:tcW w:w="0" w:type="auto"/>
-            <w:shd w:val="clear" w:color="auto" w:fill="FFFFFF"/>
-            <w:tcMar>
-              <w:top w:w="60" w:type="dxa"/>
-              <w:left w:w="90" w:type="dxa"/>
-              <w:bottom w:w="60" w:type="dxa"/>
-              <w:right w:w="90" w:type="dxa"/>
-            </w:tcMar>
-            <w:vAlign w:val="bottom"/>
-          </w:tcPr>
-          <w:p>
-            <w:pPr>
-              <w:spacing w:before="30" w:after="30"/>
-              <w:jc w:val="center"/>
-              <w:rPr>
-                <w:sz w:val="20"/>
-                <w:szCs w:val="20"/>
-              </w:rPr>
-            </w:pPr>
-            <w:r>
-              <w:rPr>
-                <w:rFonts w:cs="Calibri"/>
-                <w:color w:val="000000"/>
-                <w:sz w:val="20"/>
-                <w:szCs w:val="20"/>
-              </w:rPr>
-              <w:t>0.4535</w:t>
-            </w:r>
-          </w:p>
-        </w:tc>
-        <w:tc>
-          <w:tcPr>
-            <w:tcW w:w="0" w:type="auto"/>
-            <w:shd w:val="clear" w:color="auto" w:fill="FFFFFF"/>
-            <w:tcMar>
-              <w:top w:w="60" w:type="dxa"/>
-              <w:left w:w="90" w:type="dxa"/>
-              <w:bottom w:w="60" w:type="dxa"/>
-              <w:right w:w="90" w:type="dxa"/>
-            </w:tcMar>
-            <w:vAlign w:val="bottom"/>
-          </w:tcPr>
-          <w:p>
-            <w:pPr>
-              <w:spacing w:before="30" w:after="30"/>
-              <w:jc w:val="center"/>
-              <w:rPr>
-                <w:sz w:val="20"/>
-                <w:szCs w:val="20"/>
-              </w:rPr>
-            </w:pPr>
-            <w:r>
-              <w:rPr>
-                <w:rFonts w:cs="Calibri"/>
-                <w:color w:val="000000"/>
-                <w:sz w:val="20"/>
-                <w:szCs w:val="20"/>
-              </w:rPr>
-              <w:t>0.6597</w:t>
-            </w:r>
-          </w:p>
-        </w:tc>
-      </w:tr>
-      <w:tr>
-        <w:tc>
-          <w:tcPr>
-            <w:tcW w:w="0" w:type="auto"/>
-            <w:shd w:val="clear" w:color="auto" w:fill="FBFBFB"/>
-            <w:tcMar>
-              <w:top w:w="60" w:type="dxa"/>
-              <w:left w:w="90" w:type="dxa"/>
-              <w:bottom w:w="60" w:type="dxa"/>
-              <w:right w:w="90" w:type="dxa"/>
-            </w:tcMar>
-            <w:vAlign w:val="center"/>
-          </w:tcPr>
-          <w:p>
-            <w:pPr>
-              <w:spacing w:before="30" w:after="30"/>
-              <w:jc w:val="right"/>
-              <w:rPr>
-                <w:sz w:val="20"/>
-                <w:szCs w:val="32"/>
-              </w:rPr>
-            </w:pPr>
-            <w:r>
-              <w:rPr>
-                <w:b/>
+                <w:lang w:eastAsia="zh-CN"/>
+              </w:rPr>
+            </w:pPr>
+            <w:r>
+              <w:rPr>
+                <w:bCs/>
                 <w:color w:val="222222"/>
                 <w:sz w:val="20"/>
                 <w:szCs w:val="32"/>
-              </w:rPr>
-              <w:t>ETHER</w:t>
-            </w:r>
-          </w:p>
-        </w:tc>
-        <w:tc>
-          <w:tcPr>
-            <w:tcW w:w="0" w:type="auto"/>
-            <w:shd w:val="clear" w:color="auto" w:fill="FBFBFB"/>
-            <w:tcMar>
-              <w:top w:w="60" w:type="dxa"/>
-              <w:left w:w="90" w:type="dxa"/>
-              <w:bottom w:w="60" w:type="dxa"/>
-              <w:right w:w="90" w:type="dxa"/>
-            </w:tcMar>
-            <w:vAlign w:val="bottom"/>
-          </w:tcPr>
-          <w:p>
-            <w:pPr>
-              <w:spacing w:before="30" w:after="30"/>
-              <w:jc w:val="center"/>
-              <w:rPr>
-                <w:sz w:val="20"/>
-                <w:szCs w:val="20"/>
-              </w:rPr>
-            </w:pPr>
-            <w:r>
-              <w:rPr>
-                <w:rFonts w:cs="Calibri"/>
-                <w:color w:val="000000"/>
-                <w:sz w:val="20"/>
-                <w:szCs w:val="20"/>
-              </w:rPr>
-              <w:t>0.1147</w:t>
-            </w:r>
-          </w:p>
-        </w:tc>
-        <w:tc>
-          <w:tcPr>
-            <w:tcW w:w="0" w:type="auto"/>
-            <w:shd w:val="clear" w:color="auto" w:fill="FBFBFB"/>
-            <w:tcMar>
-              <w:top w:w="60" w:type="dxa"/>
-              <w:left w:w="90" w:type="dxa"/>
-              <w:bottom w:w="60" w:type="dxa"/>
-              <w:right w:w="90" w:type="dxa"/>
-            </w:tcMar>
-            <w:vAlign w:val="bottom"/>
-          </w:tcPr>
-          <w:p>
-            <w:pPr>
-              <w:spacing w:before="30" w:after="30"/>
-              <w:jc w:val="center"/>
-              <w:rPr>
-                <w:sz w:val="20"/>
-                <w:szCs w:val="20"/>
-              </w:rPr>
-            </w:pPr>
-            <w:r>
-              <w:rPr>
-                <w:rFonts w:cs="Calibri"/>
-                <w:color w:val="000000"/>
-                <w:sz w:val="20"/>
-                <w:szCs w:val="20"/>
+                <w:lang w:eastAsia="zh-CN"/>
               </w:rPr>
               <w:t>0.2691</w:t>
             </w:r>
@@ -8698,6 +8608,7 @@
         <w:pStyle w:val="Heading2"/>
       </w:pPr>
       <w:r>
+        <w:lastRenderedPageBreak/>
         <w:t xml:space="preserve">3.4 </w:t>
       </w:r>
       <w:r>
@@ -8987,11 +8898,7 @@
         <w:t>Figure 5b and 5c</w:t>
       </w:r>
       <w:r>
-        <w:t xml:space="preserve">) demonstrate that errors cluster within clinically related concept types rather than dispersing randomly. For BERT </w:t>
-      </w:r>
-      <w:r>
-        <w:lastRenderedPageBreak/>
-        <w:t>(</w:t>
+        <w:t>) demonstrate that errors cluster within clinically related concept types rather than dispersing randomly. For BERT (</w:t>
       </w:r>
       <w:r>
         <w:rPr>
@@ -9001,7 +8908,11 @@
         <w:t>Figure 5b</w:t>
       </w:r>
       <w:r>
-        <w:t>), the largest confusions were Dx labeled as adverse events (Dx to AE: 396), suspect drugs labeled as concomitant drugs (sDrug to cDrug: 347), and suspect drugs labeled as treatment interventions (sDrug to Treatment: 211). Other frequent errors involved medical history labeled as AE (MHx to AE: 157), AE labeled as laboratory findings (AE to Lab: 134), and laboratory findings labeled as AE (Lab to AE: 124), AE labeled as Dx (AE to Dx: 121), and medical history labeled as Dx (MHx to Dx: 117).</w:t>
+        <w:t xml:space="preserve">), the largest confusions were Dx labeled as adverse events (Dx to AE: 396), </w:t>
+      </w:r>
+      <w:r>
+        <w:lastRenderedPageBreak/>
+        <w:t>suspect drugs labeled as concomitant drugs (sDrug to cDrug: 347), and suspect drugs labeled as treatment interventions (sDrug to Treatment: 211). Other frequent errors involved medical history labeled as AE (MHx to AE: 157), AE labeled as laboratory findings (AE to Lab: 134), and laboratory findings labeled as AE (Lab to AE: 124), AE labeled as Dx (AE to Dx: 121), and medical history labeled as Dx (MHx to Dx: 117).</w:t>
       </w:r>
     </w:p>
     <w:p>
@@ -9340,7 +9251,6 @@
           <w:sz w:val="20"/>
           <w:szCs w:val="20"/>
         </w:rPr>
-        <w:lastRenderedPageBreak/>
         <w:t xml:space="preserve">Table 4. </w:t>
       </w:r>
       <w:r>
@@ -9399,6 +9309,7 @@
                 <w:szCs w:val="24"/>
                 <w:lang w:eastAsia="en-US"/>
               </w:rPr>
+              <w:lastRenderedPageBreak/>
               <w:t>Category</w:t>
             </w:r>
           </w:p>
@@ -11332,7 +11243,7 @@
         </w:trPr>
         <w:tc>
           <w:tcPr>
-            <w:tcW w:w="3456" w:type="dxa"/>
+            <w:tcW w:w="3208" w:type="dxa"/>
             <w:shd w:val="clear" w:color="auto" w:fill="F2F4F8"/>
             <w:tcMar>
               <w:top w:w="60" w:type="dxa"/>
@@ -11360,7 +11271,7 @@
         </w:tc>
         <w:tc>
           <w:tcPr>
-            <w:tcW w:w="2160" w:type="dxa"/>
+            <w:tcW w:w="1974" w:type="dxa"/>
             <w:shd w:val="clear" w:color="auto" w:fill="F2F4F8"/>
             <w:tcMar>
               <w:top w:w="60" w:type="dxa"/>
@@ -11373,7 +11284,6 @@
           <w:p>
             <w:pPr>
               <w:spacing w:before="30" w:after="30"/>
-              <w:jc w:val="center"/>
             </w:pPr>
             <w:r>
               <w:rPr>
@@ -11388,7 +11298,7 @@
         </w:tc>
         <w:tc>
           <w:tcPr>
-            <w:tcW w:w="2304" w:type="dxa"/>
+            <w:tcW w:w="2089" w:type="dxa"/>
             <w:shd w:val="clear" w:color="auto" w:fill="F2F4F8"/>
             <w:tcMar>
               <w:top w:w="60" w:type="dxa"/>
@@ -11401,7 +11311,6 @@
           <w:p>
             <w:pPr>
               <w:spacing w:before="30" w:after="30"/>
-              <w:jc w:val="center"/>
             </w:pPr>
             <w:r>
               <w:rPr>
@@ -11416,7 +11325,7 @@
         </w:tc>
         <w:tc>
           <w:tcPr>
-            <w:tcW w:w="2304" w:type="dxa"/>
+            <w:tcW w:w="2089" w:type="dxa"/>
             <w:shd w:val="clear" w:color="auto" w:fill="F2F4F8"/>
             <w:tcMar>
               <w:top w:w="60" w:type="dxa"/>
@@ -11429,7 +11338,6 @@
           <w:p>
             <w:pPr>
               <w:spacing w:before="30" w:after="30"/>
-              <w:jc w:val="center"/>
             </w:pPr>
             <w:r>
               <w:rPr>
@@ -11467,7 +11375,7 @@
         </w:trPr>
         <w:tc>
           <w:tcPr>
-            <w:tcW w:w="3456" w:type="dxa"/>
+            <w:tcW w:w="3208" w:type="dxa"/>
             <w:shd w:val="clear" w:color="auto" w:fill="FFFFFF"/>
             <w:tcMar>
               <w:top w:w="60" w:type="dxa"/>
@@ -11475,17 +11383,30 @@
               <w:bottom w:w="60" w:type="dxa"/>
               <w:right w:w="90" w:type="dxa"/>
             </w:tcMar>
-            <w:vAlign w:val="center"/>
-          </w:tcPr>
-          <w:p>
-            <w:r>
+            <w:vAlign w:val="bottom"/>
+          </w:tcPr>
+          <w:p>
+            <w:pPr>
+              <w:jc w:val="right"/>
+              <w:rPr>
+                <w:sz w:val="20"/>
+                <w:szCs w:val="20"/>
+              </w:rPr>
+            </w:pPr>
+            <w:r>
+              <w:rPr>
+                <w:rFonts w:cs="Calibri"/>
+                <w:color w:val="000000"/>
+                <w:sz w:val="20"/>
+                <w:szCs w:val="20"/>
+              </w:rPr>
               <w:t>Azacitidine – QT Prolongation</w:t>
             </w:r>
           </w:p>
         </w:tc>
         <w:tc>
           <w:tcPr>
-            <w:tcW w:w="2160" w:type="dxa"/>
+            <w:tcW w:w="1974" w:type="dxa"/>
             <w:shd w:val="clear" w:color="auto" w:fill="FFFFFF"/>
             <w:tcMar>
               <w:top w:w="60" w:type="dxa"/>
@@ -11493,20 +11414,30 @@
               <w:bottom w:w="60" w:type="dxa"/>
               <w:right w:w="90" w:type="dxa"/>
             </w:tcMar>
-            <w:vAlign w:val="center"/>
+            <w:vAlign w:val="bottom"/>
           </w:tcPr>
           <w:p>
             <w:pPr>
               <w:jc w:val="center"/>
-            </w:pPr>
-            <w:r>
-              <w:t>200</w:t>
-            </w:r>
-          </w:p>
-        </w:tc>
-        <w:tc>
-          <w:tcPr>
-            <w:tcW w:w="2304" w:type="dxa"/>
+              <w:rPr>
+                <w:sz w:val="20"/>
+                <w:szCs w:val="20"/>
+              </w:rPr>
+            </w:pPr>
+            <w:r>
+              <w:rPr>
+                <w:rFonts w:cs="Calibri"/>
+                <w:color w:val="000000"/>
+                <w:sz w:val="20"/>
+                <w:szCs w:val="20"/>
+              </w:rPr>
+              <w:t>191</w:t>
+            </w:r>
+          </w:p>
+        </w:tc>
+        <w:tc>
+          <w:tcPr>
+            <w:tcW w:w="2089" w:type="dxa"/>
             <w:shd w:val="clear" w:color="auto" w:fill="FFFFFF"/>
             <w:tcMar>
               <w:top w:w="60" w:type="dxa"/>
@@ -11514,17 +11445,29 @@
               <w:bottom w:w="60" w:type="dxa"/>
               <w:right w:w="90" w:type="dxa"/>
             </w:tcMar>
-            <w:vAlign w:val="center"/>
-          </w:tcPr>
-          <w:p>
-            <w:r>
-              <w:t>0.6002 ± 0.0113</w:t>
-            </w:r>
-          </w:p>
-        </w:tc>
-        <w:tc>
-          <w:tcPr>
-            <w:tcW w:w="2304" w:type="dxa"/>
+            <w:vAlign w:val="bottom"/>
+          </w:tcPr>
+          <w:p>
+            <w:pPr>
+              <w:rPr>
+                <w:sz w:val="20"/>
+                <w:szCs w:val="20"/>
+              </w:rPr>
+            </w:pPr>
+            <w:r>
+              <w:rPr>
+                <w:rFonts w:cs="Calibri"/>
+                <w:color w:val="000000"/>
+                <w:sz w:val="20"/>
+                <w:szCs w:val="20"/>
+              </w:rPr>
+              <w:t>0.6079 ± 0.0081</w:t>
+            </w:r>
+          </w:p>
+        </w:tc>
+        <w:tc>
+          <w:tcPr>
+            <w:tcW w:w="2089" w:type="dxa"/>
             <w:shd w:val="clear" w:color="auto" w:fill="FFFFFF"/>
             <w:tcMar>
               <w:top w:w="60" w:type="dxa"/>
@@ -11532,11 +11475,23 @@
               <w:bottom w:w="60" w:type="dxa"/>
               <w:right w:w="90" w:type="dxa"/>
             </w:tcMar>
-            <w:vAlign w:val="center"/>
-          </w:tcPr>
-          <w:p>
-            <w:r>
-              <w:t>0.7733 ± 0.0092</w:t>
+            <w:vAlign w:val="bottom"/>
+          </w:tcPr>
+          <w:p>
+            <w:pPr>
+              <w:rPr>
+                <w:sz w:val="20"/>
+                <w:szCs w:val="20"/>
+              </w:rPr>
+            </w:pPr>
+            <w:r>
+              <w:rPr>
+                <w:rFonts w:cs="Calibri"/>
+                <w:color w:val="000000"/>
+                <w:sz w:val="20"/>
+                <w:szCs w:val="20"/>
+              </w:rPr>
+              <w:t>0.7824 ± 0.0092</w:t>
             </w:r>
           </w:p>
         </w:tc>
@@ -11547,7 +11502,7 @@
         </w:trPr>
         <w:tc>
           <w:tcPr>
-            <w:tcW w:w="3456" w:type="dxa"/>
+            <w:tcW w:w="3208" w:type="dxa"/>
             <w:shd w:val="clear" w:color="auto" w:fill="FBFBFB"/>
             <w:tcMar>
               <w:top w:w="60" w:type="dxa"/>
@@ -11555,17 +11510,30 @@
               <w:bottom w:w="60" w:type="dxa"/>
               <w:right w:w="90" w:type="dxa"/>
             </w:tcMar>
-            <w:vAlign w:val="center"/>
-          </w:tcPr>
-          <w:p>
-            <w:r>
+            <w:vAlign w:val="bottom"/>
+          </w:tcPr>
+          <w:p>
+            <w:pPr>
+              <w:jc w:val="right"/>
+              <w:rPr>
+                <w:sz w:val="20"/>
+                <w:szCs w:val="20"/>
+              </w:rPr>
+            </w:pPr>
+            <w:r>
+              <w:rPr>
+                <w:rFonts w:cs="Calibri"/>
+                <w:color w:val="000000"/>
+                <w:sz w:val="20"/>
+                <w:szCs w:val="20"/>
+              </w:rPr>
               <w:t>Baricitinib – Hypersensitivity</w:t>
             </w:r>
           </w:p>
         </w:tc>
         <w:tc>
           <w:tcPr>
-            <w:tcW w:w="2160" w:type="dxa"/>
+            <w:tcW w:w="1974" w:type="dxa"/>
             <w:shd w:val="clear" w:color="auto" w:fill="FBFBFB"/>
             <w:tcMar>
               <w:top w:w="60" w:type="dxa"/>
@@ -11573,20 +11541,30 @@
               <w:bottom w:w="60" w:type="dxa"/>
               <w:right w:w="90" w:type="dxa"/>
             </w:tcMar>
-            <w:vAlign w:val="center"/>
+            <w:vAlign w:val="bottom"/>
           </w:tcPr>
           <w:p>
             <w:pPr>
               <w:jc w:val="center"/>
-            </w:pPr>
-            <w:r>
-              <w:t>200</w:t>
-            </w:r>
-          </w:p>
-        </w:tc>
-        <w:tc>
-          <w:tcPr>
-            <w:tcW w:w="2304" w:type="dxa"/>
+              <w:rPr>
+                <w:sz w:val="20"/>
+                <w:szCs w:val="20"/>
+              </w:rPr>
+            </w:pPr>
+            <w:r>
+              <w:rPr>
+                <w:rFonts w:cs="Calibri"/>
+                <w:color w:val="000000"/>
+                <w:sz w:val="20"/>
+                <w:szCs w:val="20"/>
+              </w:rPr>
+              <w:t>100</w:t>
+            </w:r>
+          </w:p>
+        </w:tc>
+        <w:tc>
+          <w:tcPr>
+            <w:tcW w:w="2089" w:type="dxa"/>
             <w:shd w:val="clear" w:color="auto" w:fill="FBFBFB"/>
             <w:tcMar>
               <w:top w:w="60" w:type="dxa"/>
@@ -11594,17 +11572,29 @@
               <w:bottom w:w="60" w:type="dxa"/>
               <w:right w:w="90" w:type="dxa"/>
             </w:tcMar>
-            <w:vAlign w:val="center"/>
-          </w:tcPr>
-          <w:p>
-            <w:r>
-              <w:t>0.6367 ± 0.0201</w:t>
-            </w:r>
-          </w:p>
-        </w:tc>
-        <w:tc>
-          <w:tcPr>
-            <w:tcW w:w="2304" w:type="dxa"/>
+            <w:vAlign w:val="bottom"/>
+          </w:tcPr>
+          <w:p>
+            <w:pPr>
+              <w:rPr>
+                <w:sz w:val="20"/>
+                <w:szCs w:val="20"/>
+              </w:rPr>
+            </w:pPr>
+            <w:r>
+              <w:rPr>
+                <w:rFonts w:cs="Calibri"/>
+                <w:color w:val="000000"/>
+                <w:sz w:val="20"/>
+                <w:szCs w:val="20"/>
+              </w:rPr>
+              <w:t>0.6270 ± 0.0034</w:t>
+            </w:r>
+          </w:p>
+        </w:tc>
+        <w:tc>
+          <w:tcPr>
+            <w:tcW w:w="2089" w:type="dxa"/>
             <w:shd w:val="clear" w:color="auto" w:fill="FBFBFB"/>
             <w:tcMar>
               <w:top w:w="60" w:type="dxa"/>
@@ -11612,11 +11602,23 @@
               <w:bottom w:w="60" w:type="dxa"/>
               <w:right w:w="90" w:type="dxa"/>
             </w:tcMar>
-            <w:vAlign w:val="center"/>
-          </w:tcPr>
-          <w:p>
-            <w:r>
-              <w:t>0.7751 ± 0.0128</w:t>
+            <w:vAlign w:val="bottom"/>
+          </w:tcPr>
+          <w:p>
+            <w:pPr>
+              <w:rPr>
+                <w:sz w:val="20"/>
+                <w:szCs w:val="20"/>
+              </w:rPr>
+            </w:pPr>
+            <w:r>
+              <w:rPr>
+                <w:rFonts w:cs="Calibri"/>
+                <w:color w:val="000000"/>
+                <w:sz w:val="20"/>
+                <w:szCs w:val="20"/>
+              </w:rPr>
+              <w:t>0.7721 ± 0.0075</w:t>
             </w:r>
           </w:p>
         </w:tc>
@@ -11627,7 +11629,7 @@
         </w:trPr>
         <w:tc>
           <w:tcPr>
-            <w:tcW w:w="3456" w:type="dxa"/>
+            <w:tcW w:w="3208" w:type="dxa"/>
             <w:shd w:val="clear" w:color="auto" w:fill="FFFFFF"/>
             <w:tcMar>
               <w:top w:w="60" w:type="dxa"/>
@@ -11635,17 +11637,30 @@
               <w:bottom w:w="60" w:type="dxa"/>
               <w:right w:w="90" w:type="dxa"/>
             </w:tcMar>
-            <w:vAlign w:val="center"/>
-          </w:tcPr>
-          <w:p>
-            <w:r>
+            <w:vAlign w:val="bottom"/>
+          </w:tcPr>
+          <w:p>
+            <w:pPr>
+              <w:jc w:val="right"/>
+              <w:rPr>
+                <w:sz w:val="20"/>
+                <w:szCs w:val="20"/>
+              </w:rPr>
+            </w:pPr>
+            <w:r>
+              <w:rPr>
+                <w:rFonts w:cs="Calibri"/>
+                <w:color w:val="000000"/>
+                <w:sz w:val="20"/>
+                <w:szCs w:val="20"/>
+              </w:rPr>
               <w:t>Tramadol – Hypoglycemia</w:t>
             </w:r>
           </w:p>
         </w:tc>
         <w:tc>
           <w:tcPr>
-            <w:tcW w:w="2160" w:type="dxa"/>
+            <w:tcW w:w="1974" w:type="dxa"/>
             <w:shd w:val="clear" w:color="auto" w:fill="FFFFFF"/>
             <w:tcMar>
               <w:top w:w="60" w:type="dxa"/>
@@ -11653,20 +11668,30 @@
               <w:bottom w:w="60" w:type="dxa"/>
               <w:right w:w="90" w:type="dxa"/>
             </w:tcMar>
-            <w:vAlign w:val="center"/>
+            <w:vAlign w:val="bottom"/>
           </w:tcPr>
           <w:p>
             <w:pPr>
               <w:jc w:val="center"/>
-            </w:pPr>
-            <w:r>
-              <w:t>229</w:t>
-            </w:r>
-          </w:p>
-        </w:tc>
-        <w:tc>
-          <w:tcPr>
-            <w:tcW w:w="2304" w:type="dxa"/>
+              <w:rPr>
+                <w:sz w:val="20"/>
+                <w:szCs w:val="20"/>
+              </w:rPr>
+            </w:pPr>
+            <w:r>
+              <w:rPr>
+                <w:rFonts w:cs="Calibri"/>
+                <w:color w:val="000000"/>
+                <w:sz w:val="20"/>
+                <w:szCs w:val="20"/>
+              </w:rPr>
+              <w:t>342</w:t>
+            </w:r>
+          </w:p>
+        </w:tc>
+        <w:tc>
+          <w:tcPr>
+            <w:tcW w:w="2089" w:type="dxa"/>
             <w:shd w:val="clear" w:color="auto" w:fill="FFFFFF"/>
             <w:tcMar>
               <w:top w:w="60" w:type="dxa"/>
@@ -11674,17 +11699,29 @@
               <w:bottom w:w="60" w:type="dxa"/>
               <w:right w:w="90" w:type="dxa"/>
             </w:tcMar>
-            <w:vAlign w:val="center"/>
-          </w:tcPr>
-          <w:p>
-            <w:r>
-              <w:t>0.5289 ± 0.0093</w:t>
-            </w:r>
-          </w:p>
-        </w:tc>
-        <w:tc>
-          <w:tcPr>
-            <w:tcW w:w="2304" w:type="dxa"/>
+            <w:vAlign w:val="bottom"/>
+          </w:tcPr>
+          <w:p>
+            <w:pPr>
+              <w:rPr>
+                <w:sz w:val="20"/>
+                <w:szCs w:val="20"/>
+              </w:rPr>
+            </w:pPr>
+            <w:r>
+              <w:rPr>
+                <w:rFonts w:cs="Calibri"/>
+                <w:color w:val="000000"/>
+                <w:sz w:val="20"/>
+                <w:szCs w:val="20"/>
+              </w:rPr>
+              <w:t>0.5215 ± 0.0059</w:t>
+            </w:r>
+          </w:p>
+        </w:tc>
+        <w:tc>
+          <w:tcPr>
+            <w:tcW w:w="2089" w:type="dxa"/>
             <w:shd w:val="clear" w:color="auto" w:fill="FFFFFF"/>
             <w:tcMar>
               <w:top w:w="60" w:type="dxa"/>
@@ -11692,11 +11729,23 @@
               <w:bottom w:w="60" w:type="dxa"/>
               <w:right w:w="90" w:type="dxa"/>
             </w:tcMar>
-            <w:vAlign w:val="center"/>
-          </w:tcPr>
-          <w:p>
-            <w:r>
-              <w:t>0.7242 ± 0.0036</w:t>
+            <w:vAlign w:val="bottom"/>
+          </w:tcPr>
+          <w:p>
+            <w:pPr>
+              <w:rPr>
+                <w:sz w:val="20"/>
+                <w:szCs w:val="20"/>
+              </w:rPr>
+            </w:pPr>
+            <w:r>
+              <w:rPr>
+                <w:rFonts w:cs="Calibri"/>
+                <w:color w:val="000000"/>
+                <w:sz w:val="20"/>
+                <w:szCs w:val="20"/>
+              </w:rPr>
+              <w:t>0.7143 ± 0.0060</w:t>
             </w:r>
           </w:p>
         </w:tc>
@@ -11707,7 +11756,7 @@
         </w:trPr>
         <w:tc>
           <w:tcPr>
-            <w:tcW w:w="3456" w:type="dxa"/>
+            <w:tcW w:w="3208" w:type="dxa"/>
             <w:shd w:val="clear" w:color="auto" w:fill="FBFBFB"/>
             <w:tcMar>
               <w:top w:w="60" w:type="dxa"/>
@@ -11715,17 +11764,30 @@
               <w:bottom w:w="60" w:type="dxa"/>
               <w:right w:w="90" w:type="dxa"/>
             </w:tcMar>
-            <w:vAlign w:val="center"/>
-          </w:tcPr>
-          <w:p>
-            <w:r>
+            <w:vAlign w:val="bottom"/>
+          </w:tcPr>
+          <w:p>
+            <w:pPr>
+              <w:jc w:val="right"/>
+              <w:rPr>
+                <w:sz w:val="20"/>
+                <w:szCs w:val="20"/>
+              </w:rPr>
+            </w:pPr>
+            <w:r>
+              <w:rPr>
+                <w:rFonts w:cs="Calibri"/>
+                <w:color w:val="000000"/>
+                <w:sz w:val="20"/>
+                <w:szCs w:val="20"/>
+              </w:rPr>
               <w:t>Erenumab – Stroke</w:t>
             </w:r>
           </w:p>
         </w:tc>
         <w:tc>
           <w:tcPr>
-            <w:tcW w:w="2160" w:type="dxa"/>
+            <w:tcW w:w="1974" w:type="dxa"/>
             <w:shd w:val="clear" w:color="auto" w:fill="FBFBFB"/>
             <w:tcMar>
               <w:top w:w="60" w:type="dxa"/>
@@ -11733,20 +11795,30 @@
               <w:bottom w:w="60" w:type="dxa"/>
               <w:right w:w="90" w:type="dxa"/>
             </w:tcMar>
-            <w:vAlign w:val="center"/>
+            <w:vAlign w:val="bottom"/>
           </w:tcPr>
           <w:p>
             <w:pPr>
               <w:jc w:val="center"/>
-            </w:pPr>
-            <w:r>
-              <w:t>200</w:t>
-            </w:r>
-          </w:p>
-        </w:tc>
-        <w:tc>
-          <w:tcPr>
-            <w:tcW w:w="2304" w:type="dxa"/>
+              <w:rPr>
+                <w:sz w:val="20"/>
+                <w:szCs w:val="20"/>
+              </w:rPr>
+            </w:pPr>
+            <w:r>
+              <w:rPr>
+                <w:rFonts w:cs="Calibri"/>
+                <w:color w:val="000000"/>
+                <w:sz w:val="20"/>
+                <w:szCs w:val="20"/>
+              </w:rPr>
+              <w:t>196</w:t>
+            </w:r>
+          </w:p>
+        </w:tc>
+        <w:tc>
+          <w:tcPr>
+            <w:tcW w:w="2089" w:type="dxa"/>
             <w:shd w:val="clear" w:color="auto" w:fill="FBFBFB"/>
             <w:tcMar>
               <w:top w:w="60" w:type="dxa"/>
@@ -11754,17 +11826,29 @@
               <w:bottom w:w="60" w:type="dxa"/>
               <w:right w:w="90" w:type="dxa"/>
             </w:tcMar>
-            <w:vAlign w:val="center"/>
-          </w:tcPr>
-          <w:p>
-            <w:r>
-              <w:t>0.5084 ± 0.0122</w:t>
-            </w:r>
-          </w:p>
-        </w:tc>
-        <w:tc>
-          <w:tcPr>
-            <w:tcW w:w="2304" w:type="dxa"/>
+            <w:vAlign w:val="bottom"/>
+          </w:tcPr>
+          <w:p>
+            <w:pPr>
+              <w:rPr>
+                <w:sz w:val="20"/>
+                <w:szCs w:val="20"/>
+              </w:rPr>
+            </w:pPr>
+            <w:r>
+              <w:rPr>
+                <w:rFonts w:cs="Calibri"/>
+                <w:color w:val="000000"/>
+                <w:sz w:val="20"/>
+                <w:szCs w:val="20"/>
+              </w:rPr>
+              <w:t>0.4922 ± 0.0119</w:t>
+            </w:r>
+          </w:p>
+        </w:tc>
+        <w:tc>
+          <w:tcPr>
+            <w:tcW w:w="2089" w:type="dxa"/>
             <w:shd w:val="clear" w:color="auto" w:fill="FBFBFB"/>
             <w:tcMar>
               <w:top w:w="60" w:type="dxa"/>
@@ -11772,11 +11856,23 @@
               <w:bottom w:w="60" w:type="dxa"/>
               <w:right w:w="90" w:type="dxa"/>
             </w:tcMar>
-            <w:vAlign w:val="center"/>
-          </w:tcPr>
-          <w:p>
-            <w:r>
-              <w:t>0.7126 ± 0.0077</w:t>
+            <w:vAlign w:val="bottom"/>
+          </w:tcPr>
+          <w:p>
+            <w:pPr>
+              <w:rPr>
+                <w:sz w:val="20"/>
+                <w:szCs w:val="20"/>
+              </w:rPr>
+            </w:pPr>
+            <w:r>
+              <w:rPr>
+                <w:rFonts w:cs="Calibri"/>
+                <w:color w:val="000000"/>
+                <w:sz w:val="20"/>
+                <w:szCs w:val="20"/>
+              </w:rPr>
+              <w:t>0.6983 ± 0.0054</w:t>
             </w:r>
           </w:p>
         </w:tc>
@@ -11787,7 +11883,7 @@
         </w:trPr>
         <w:tc>
           <w:tcPr>
-            <w:tcW w:w="3456" w:type="dxa"/>
+            <w:tcW w:w="3208" w:type="dxa"/>
             <w:shd w:val="clear" w:color="auto" w:fill="FFFFFF"/>
             <w:tcMar>
               <w:top w:w="60" w:type="dxa"/>
@@ -11795,17 +11891,34 @@
               <w:bottom w:w="60" w:type="dxa"/>
               <w:right w:w="90" w:type="dxa"/>
             </w:tcMar>
-            <w:vAlign w:val="center"/>
-          </w:tcPr>
-          <w:p>
-            <w:r>
+            <w:vAlign w:val="bottom"/>
+          </w:tcPr>
+          <w:p>
+            <w:pPr>
+              <w:jc w:val="right"/>
+              <w:rPr>
+                <w:b/>
+                <w:bCs/>
+                <w:sz w:val="20"/>
+                <w:szCs w:val="20"/>
+              </w:rPr>
+            </w:pPr>
+            <w:r>
+              <w:rPr>
+                <w:rFonts w:cs="Calibri"/>
+                <w:b/>
+                <w:bCs/>
+                <w:color w:val="000000"/>
+                <w:sz w:val="20"/>
+                <w:szCs w:val="20"/>
+              </w:rPr>
               <w:t>Total (Micro-Average)</w:t>
             </w:r>
           </w:p>
         </w:tc>
         <w:tc>
           <w:tcPr>
-            <w:tcW w:w="2160" w:type="dxa"/>
+            <w:tcW w:w="1974" w:type="dxa"/>
             <w:shd w:val="clear" w:color="auto" w:fill="FFFFFF"/>
             <w:tcMar>
               <w:top w:w="60" w:type="dxa"/>
@@ -11813,20 +11926,34 @@
               <w:bottom w:w="60" w:type="dxa"/>
               <w:right w:w="90" w:type="dxa"/>
             </w:tcMar>
-            <w:vAlign w:val="center"/>
+            <w:vAlign w:val="bottom"/>
           </w:tcPr>
           <w:p>
             <w:pPr>
               <w:jc w:val="center"/>
-            </w:pPr>
-            <w:r>
+              <w:rPr>
+                <w:b/>
+                <w:bCs/>
+                <w:sz w:val="20"/>
+                <w:szCs w:val="20"/>
+              </w:rPr>
+            </w:pPr>
+            <w:r>
+              <w:rPr>
+                <w:rFonts w:cs="Calibri"/>
+                <w:b/>
+                <w:bCs/>
+                <w:color w:val="000000"/>
+                <w:sz w:val="20"/>
+                <w:szCs w:val="20"/>
+              </w:rPr>
               <w:t>829</w:t>
             </w:r>
           </w:p>
         </w:tc>
         <w:tc>
           <w:tcPr>
-            <w:tcW w:w="2304" w:type="dxa"/>
+            <w:tcW w:w="2089" w:type="dxa"/>
             <w:shd w:val="clear" w:color="auto" w:fill="FFFFFF"/>
             <w:tcMar>
               <w:top w:w="60" w:type="dxa"/>
@@ -11834,17 +11961,33 @@
               <w:bottom w:w="60" w:type="dxa"/>
               <w:right w:w="90" w:type="dxa"/>
             </w:tcMar>
-            <w:vAlign w:val="center"/>
-          </w:tcPr>
-          <w:p>
-            <w:r>
-              <w:t>0.5564 ± 0.0069</w:t>
-            </w:r>
-          </w:p>
-        </w:tc>
-        <w:tc>
-          <w:tcPr>
-            <w:tcW w:w="2304" w:type="dxa"/>
+            <w:vAlign w:val="bottom"/>
+          </w:tcPr>
+          <w:p>
+            <w:pPr>
+              <w:rPr>
+                <w:b/>
+                <w:bCs/>
+                <w:sz w:val="20"/>
+                <w:szCs w:val="20"/>
+              </w:rPr>
+            </w:pPr>
+            <w:r>
+              <w:rPr>
+                <w:rFonts w:cs="Calibri"/>
+                <w:b/>
+                <w:bCs/>
+                <w:color w:val="000000"/>
+                <w:sz w:val="20"/>
+                <w:szCs w:val="20"/>
+              </w:rPr>
+              <w:t>0.5526 ± 0.0062</w:t>
+            </w:r>
+          </w:p>
+        </w:tc>
+        <w:tc>
+          <w:tcPr>
+            <w:tcW w:w="2089" w:type="dxa"/>
             <w:shd w:val="clear" w:color="auto" w:fill="FFFFFF"/>
             <w:tcMar>
               <w:top w:w="60" w:type="dxa"/>
@@ -11852,11 +11995,27 @@
               <w:bottom w:w="60" w:type="dxa"/>
               <w:right w:w="90" w:type="dxa"/>
             </w:tcMar>
-            <w:vAlign w:val="center"/>
-          </w:tcPr>
-          <w:p>
-            <w:r>
-              <w:t>0.7420 ± 0.0061</w:t>
+            <w:vAlign w:val="bottom"/>
+          </w:tcPr>
+          <w:p>
+            <w:pPr>
+              <w:rPr>
+                <w:b/>
+                <w:bCs/>
+                <w:sz w:val="20"/>
+                <w:szCs w:val="20"/>
+              </w:rPr>
+            </w:pPr>
+            <w:r>
+              <w:rPr>
+                <w:rFonts w:cs="Calibri"/>
+                <w:b/>
+                <w:bCs/>
+                <w:color w:val="000000"/>
+                <w:sz w:val="20"/>
+                <w:szCs w:val="20"/>
+              </w:rPr>
+              <w:t>0.7380 ± 0.0054</w:t>
             </w:r>
           </w:p>
         </w:tc>

</xml_diff>

<commit_message>
Centralize figure outputs in manuscript directory
</commit_message>
<xml_diff>
--- a/publication/manuscripts/LLM4AE_rev1.docx
+++ b/publication/manuscripts/LLM4AE_rev1.docx
@@ -8471,17 +8471,16 @@
         <w:t>mplying its weakness on these challenging annotation categories.</w:t>
       </w:r>
     </w:p>
-    <w:p/>
     <w:p>
       <w:r>
         <w:rPr>
           <w:noProof/>
         </w:rPr>
         <w:drawing>
-          <wp:inline distT="0" distB="0" distL="0" distR="0" wp14:anchorId="41BA8244" wp14:editId="42276A0A">
-            <wp:extent cx="5939155" cy="2571750"/>
-            <wp:effectExtent l="0" t="0" r="4445" b="0"/>
-            <wp:docPr id="62442150" name="Picture 3"/>
+          <wp:inline distT="0" distB="0" distL="0" distR="0" wp14:anchorId="4A1C8121" wp14:editId="61DE39ED">
+            <wp:extent cx="5934710" cy="2907030"/>
+            <wp:effectExtent l="0" t="0" r="8890" b="7620"/>
+            <wp:docPr id="1328119140" name="Picture 1"/>
             <wp:cNvGraphicFramePr>
               <a:graphicFrameLocks xmlns:a="http://schemas.openxmlformats.org/drawingml/2006/main" noChangeAspect="1"/>
             </wp:cNvGraphicFramePr>
@@ -8489,7 +8488,7 @@
               <a:graphicData uri="http://schemas.openxmlformats.org/drawingml/2006/picture">
                 <pic:pic xmlns:pic="http://schemas.openxmlformats.org/drawingml/2006/picture">
                   <pic:nvPicPr>
-                    <pic:cNvPr id="0" name="Picture 4"/>
+                    <pic:cNvPr id="0" name="Picture 2"/>
                     <pic:cNvPicPr>
                       <a:picLocks noChangeAspect="1" noChangeArrowheads="1"/>
                     </pic:cNvPicPr>
@@ -8510,7 +8509,7 @@
                   <pic:spPr bwMode="auto">
                     <a:xfrm>
                       <a:off x="0" y="0"/>
-                      <a:ext cx="5939155" cy="2571750"/>
+                      <a:ext cx="5934710" cy="2907030"/>
                     </a:xfrm>
                     <a:prstGeom prst="rect">
                       <a:avLst/>
@@ -8690,6 +8689,7 @@
         <w:t>isses were comparable: 5,436 for BERT and 6,259 for LLaMA-4.</w:t>
       </w:r>
     </w:p>
+    <w:p/>
     <w:p>
       <w:pPr>
         <w:jc w:val="center"/>
@@ -8699,10 +8699,10 @@
           <w:noProof/>
         </w:rPr>
         <w:drawing>
-          <wp:inline distT="0" distB="0" distL="0" distR="0" wp14:anchorId="384A4D54" wp14:editId="0C2947EB">
-            <wp:extent cx="4862945" cy="4186683"/>
-            <wp:effectExtent l="0" t="0" r="0" b="4445"/>
-            <wp:docPr id="366600786" name="Picture 5"/>
+          <wp:inline distT="0" distB="0" distL="0" distR="0" wp14:anchorId="510D84BB" wp14:editId="45B23D15">
+            <wp:extent cx="5934710" cy="5038090"/>
+            <wp:effectExtent l="0" t="0" r="8890" b="0"/>
+            <wp:docPr id="785705503" name="Picture 2"/>
             <wp:cNvGraphicFramePr>
               <a:graphicFrameLocks xmlns:a="http://schemas.openxmlformats.org/drawingml/2006/main" noChangeAspect="1"/>
             </wp:cNvGraphicFramePr>
@@ -8710,7 +8710,7 @@
               <a:graphicData uri="http://schemas.openxmlformats.org/drawingml/2006/picture">
                 <pic:pic xmlns:pic="http://schemas.openxmlformats.org/drawingml/2006/picture">
                   <pic:nvPicPr>
-                    <pic:cNvPr id="0" name="Picture 6"/>
+                    <pic:cNvPr id="0" name="Picture 3"/>
                     <pic:cNvPicPr>
                       <a:picLocks noChangeAspect="1" noChangeArrowheads="1"/>
                     </pic:cNvPicPr>
@@ -8731,7 +8731,7 @@
                   <pic:spPr bwMode="auto">
                     <a:xfrm>
                       <a:off x="0" y="0"/>
-                      <a:ext cx="4871379" cy="4193944"/>
+                      <a:ext cx="5934710" cy="5038090"/>
                     </a:xfrm>
                     <a:prstGeom prst="rect">
                       <a:avLst/>
@@ -8908,11 +8908,7 @@
         <w:t>Figure 5b</w:t>
       </w:r>
       <w:r>
-        <w:t xml:space="preserve">), the largest confusions were Dx labeled as adverse events (Dx to AE: 396), </w:t>
-      </w:r>
-      <w:r>
-        <w:lastRenderedPageBreak/>
-        <w:t>suspect drugs labeled as concomitant drugs (sDrug to cDrug: 347), and suspect drugs labeled as treatment interventions (sDrug to Treatment: 211). Other frequent errors involved medical history labeled as AE (MHx to AE: 157), AE labeled as laboratory findings (AE to Lab: 134), and laboratory findings labeled as AE (Lab to AE: 124), AE labeled as Dx (AE to Dx: 121), and medical history labeled as Dx (MHx to Dx: 117).</w:t>
+        <w:t>), the largest confusions were Dx labeled as adverse events (Dx to AE: 396), suspect drugs labeled as concomitant drugs (sDrug to cDrug: 347), and suspect drugs labeled as treatment interventions (sDrug to Treatment: 211). Other frequent errors involved medical history labeled as AE (MHx to AE: 157), AE labeled as laboratory findings (AE to Lab: 134), and laboratory findings labeled as AE (Lab to AE: 124), AE labeled as Dx (AE to Dx: 121), and medical history labeled as Dx (MHx to Dx: 117).</w:t>
       </w:r>
     </w:p>
     <w:p>
@@ -9179,32 +9175,58 @@
         <w:t xml:space="preserve"> As </w:t>
       </w:r>
       <w:r>
-        <w:t>the result,</w:t>
-      </w:r>
-      <w:r>
+        <w:t>the</w:t>
+      </w:r>
+      <w:r>
+        <w:rPr>
+          <w:rFonts w:hint="eastAsia"/>
+          <w:lang w:eastAsia="zh-CN"/>
+        </w:rPr>
         <w:t xml:space="preserve"> </w:t>
       </w:r>
       <w:r>
+        <w:t>result</w:t>
+      </w:r>
+      <w:r>
+        <w:rPr>
+          <w:rFonts w:hint="eastAsia"/>
+          <w:lang w:eastAsia="zh-CN"/>
+        </w:rPr>
+        <w:t xml:space="preserve"> in primary run (seed 42)</w:t>
+      </w:r>
+      <w:r>
+        <w:t>,</w:t>
+      </w:r>
+      <w:r>
+        <w:t xml:space="preserve"> </w:t>
+      </w:r>
+      <w:r>
         <w:t>BERT</w:t>
       </w:r>
       <w:r>
-        <w:t xml:space="preserve"> fine-tuned via 10-fold cross-validation achieved a strict exact-match F1 of </w:t>
-      </w:r>
-      <w:proofErr w:type="gramStart"/>
-      <w:r>
-        <w:t xml:space="preserve">0.7015 </w:t>
+        <w:t xml:space="preserve"> fine-tuned via 10-fold cross-validation achieved a strict exact-match F1 of 0.70</w:t>
+      </w:r>
+      <w:r>
+        <w:rPr>
+          <w:rFonts w:hint="eastAsia"/>
+          <w:lang w:eastAsia="zh-CN"/>
+        </w:rPr>
+        <w:t>21</w:t>
+      </w:r>
+      <w:r>
+        <w:t xml:space="preserve"> (0.83</w:t>
+      </w:r>
+      <w:r>
+        <w:rPr>
+          <w:rFonts w:hint="eastAsia"/>
+          <w:lang w:eastAsia="zh-CN"/>
+        </w:rPr>
+        <w:t>58</w:t>
       </w:r>
       <w:r>
         <w:t xml:space="preserve"> </w:t>
       </w:r>
       <w:r>
-        <w:t>(</w:t>
-      </w:r>
-      <w:proofErr w:type="gramEnd"/>
-      <w:r>
-        <w:t xml:space="preserve">0.8370 </w:t>
-      </w:r>
-      <w:r>
         <w:t>for A</w:t>
       </w:r>
       <w:r>
@@ -9214,24 +9236,14 @@
         <w:t xml:space="preserve"> F1</w:t>
       </w:r>
       <w:r>
-        <w:t xml:space="preserve">). In contrast, the 1-shot </w:t>
+        <w:t xml:space="preserve">). In contrast, </w:t>
       </w:r>
       <w:r>
         <w:t>LLaMA-4</w:t>
       </w:r>
       <w:r>
-        <w:t xml:space="preserve"> baseline evaluated under the official 11-category annotation guidance achieved a strict F1 of 0.3383 and an adapted ADE-Eval F1 of 0.6400 (with 0.6691 Precision and 0.6134 Recall).</w:t>
-      </w:r>
-    </w:p>
-    <w:p>
-      <w:pPr>
-        <w:rPr>
-          <w:b/>
-          <w:bCs/>
-          <w:sz w:val="20"/>
-          <w:szCs w:val="20"/>
-        </w:rPr>
-      </w:pPr>
+        <w:t xml:space="preserve"> evaluated achieved a strict F1 of 0.3383 and an adapted ADE-Eval F1 of 0.6400 (with 0.6691 Precision and 0.6134 Recall).</w:t>
+      </w:r>
     </w:p>
     <w:p>
       <w:pPr>
@@ -9309,7 +9321,6 @@
                 <w:szCs w:val="24"/>
                 <w:lang w:eastAsia="en-US"/>
               </w:rPr>
-              <w:lastRenderedPageBreak/>
               <w:t>Category</w:t>
             </w:r>
           </w:p>
@@ -10925,10 +10936,10 @@
         </w:rPr>
         <w:lastRenderedPageBreak/>
         <w:drawing>
-          <wp:inline distT="0" distB="0" distL="0" distR="0" wp14:anchorId="7F29C378" wp14:editId="57A79F57">
-            <wp:extent cx="5932170" cy="4251960"/>
-            <wp:effectExtent l="0" t="0" r="0" b="0"/>
-            <wp:docPr id="33667654" name="Picture 4"/>
+          <wp:inline distT="0" distB="0" distL="0" distR="0" wp14:anchorId="1B27B770" wp14:editId="647A5F98">
+            <wp:extent cx="5934710" cy="4201160"/>
+            <wp:effectExtent l="0" t="0" r="8890" b="8890"/>
+            <wp:docPr id="458283980" name="Picture 3"/>
             <wp:cNvGraphicFramePr>
               <a:graphicFrameLocks xmlns:a="http://schemas.openxmlformats.org/drawingml/2006/main" noChangeAspect="1"/>
             </wp:cNvGraphicFramePr>
@@ -10936,7 +10947,7 @@
               <a:graphicData uri="http://schemas.openxmlformats.org/drawingml/2006/picture">
                 <pic:pic xmlns:pic="http://schemas.openxmlformats.org/drawingml/2006/picture">
                   <pic:nvPicPr>
-                    <pic:cNvPr id="0" name="Picture 5"/>
+                    <pic:cNvPr id="0" name="Picture 4"/>
                     <pic:cNvPicPr>
                       <a:picLocks noChangeAspect="1" noChangeArrowheads="1"/>
                     </pic:cNvPicPr>
@@ -10957,7 +10968,7 @@
                   <pic:spPr bwMode="auto">
                     <a:xfrm>
                       <a:off x="0" y="0"/>
-                      <a:ext cx="5932170" cy="4251960"/>
+                      <a:ext cx="5934710" cy="4201160"/>
                     </a:xfrm>
                     <a:prstGeom prst="rect">
                       <a:avLst/>
@@ -12112,7 +12123,7 @@
       <w:tblGrid>
         <w:gridCol w:w="1328"/>
         <w:gridCol w:w="1447"/>
-        <w:gridCol w:w="1557"/>
+        <w:gridCol w:w="1622"/>
         <w:gridCol w:w="2074"/>
       </w:tblGrid>
       <w:tr>
@@ -12367,7 +12378,7 @@
               <w:bottom w:w="60" w:type="dxa"/>
               <w:right w:w="90" w:type="dxa"/>
             </w:tcMar>
-            <w:vAlign w:val="center"/>
+            <w:vAlign w:val="bottom"/>
           </w:tcPr>
           <w:p>
             <w:pPr>
@@ -12385,10 +12396,185 @@
                 <w:sz w:val="20"/>
                 <w:szCs w:val="20"/>
               </w:rPr>
-              <w:t>0.5470</w:t>
-            </w:r>
-          </w:p>
-        </w:tc>
+              <w:t>0.5508</w:t>
+            </w:r>
+          </w:p>
+        </w:tc>
+        <w:tc>
+          <w:tcPr>
+            <w:tcW w:w="0" w:type="auto"/>
+            <w:shd w:val="clear" w:color="auto" w:fill="FFFFFF"/>
+            <w:tcMar>
+              <w:top w:w="60" w:type="dxa"/>
+              <w:left w:w="90" w:type="dxa"/>
+              <w:bottom w:w="60" w:type="dxa"/>
+              <w:right w:w="90" w:type="dxa"/>
+            </w:tcMar>
+            <w:vAlign w:val="bottom"/>
+          </w:tcPr>
+          <w:p>
+            <w:pPr>
+              <w:spacing w:line="240" w:lineRule="auto"/>
+              <w:contextualSpacing/>
+              <w:rPr>
+                <w:rFonts w:cs="Arial"/>
+                <w:sz w:val="20"/>
+                <w:szCs w:val="20"/>
+              </w:rPr>
+            </w:pPr>
+            <w:r>
+              <w:rPr>
+                <w:rFonts w:cs="Arial"/>
+                <w:sz w:val="20"/>
+                <w:szCs w:val="20"/>
+              </w:rPr>
+              <w:t>0.7312</w:t>
+            </w:r>
+          </w:p>
+        </w:tc>
+      </w:tr>
+      <w:tr>
+        <w:trPr>
+          <w:trHeight w:val="288"/>
+        </w:trPr>
+        <w:tc>
+          <w:tcPr>
+            <w:tcW w:w="0" w:type="auto"/>
+            <w:shd w:val="clear" w:color="auto" w:fill="FBFBFB"/>
+            <w:tcMar>
+              <w:top w:w="60" w:type="dxa"/>
+              <w:left w:w="90" w:type="dxa"/>
+              <w:bottom w:w="60" w:type="dxa"/>
+              <w:right w:w="90" w:type="dxa"/>
+            </w:tcMar>
+            <w:vAlign w:val="center"/>
+          </w:tcPr>
+          <w:p>
+            <w:pPr>
+              <w:spacing w:before="30" w:after="30" w:line="240" w:lineRule="auto"/>
+              <w:contextualSpacing/>
+              <w:jc w:val="right"/>
+              <w:rPr>
+                <w:rFonts w:cs="Arial"/>
+                <w:b/>
+                <w:sz w:val="20"/>
+                <w:szCs w:val="20"/>
+                <w:lang w:eastAsia="zh-CN"/>
+              </w:rPr>
+            </w:pPr>
+            <w:r>
+              <w:rPr>
+                <w:rFonts w:cs="Arial"/>
+                <w:b/>
+                <w:sz w:val="20"/>
+                <w:szCs w:val="20"/>
+                <w:lang w:eastAsia="zh-CN"/>
+              </w:rPr>
+              <w:t>Run 2</w:t>
+            </w:r>
+          </w:p>
+        </w:tc>
+        <w:tc>
+          <w:tcPr>
+            <w:tcW w:w="0" w:type="auto"/>
+            <w:shd w:val="clear" w:color="auto" w:fill="FBFBFB"/>
+            <w:tcMar>
+              <w:top w:w="60" w:type="dxa"/>
+              <w:left w:w="90" w:type="dxa"/>
+              <w:bottom w:w="60" w:type="dxa"/>
+              <w:right w:w="90" w:type="dxa"/>
+            </w:tcMar>
+            <w:vAlign w:val="center"/>
+          </w:tcPr>
+          <w:p>
+            <w:pPr>
+              <w:spacing w:line="240" w:lineRule="auto"/>
+              <w:contextualSpacing/>
+              <w:rPr>
+                <w:rFonts w:cs="Arial"/>
+                <w:sz w:val="20"/>
+                <w:szCs w:val="20"/>
+              </w:rPr>
+            </w:pPr>
+            <w:r>
+              <w:rPr>
+                <w:rFonts w:cs="Arial"/>
+                <w:sz w:val="20"/>
+                <w:szCs w:val="20"/>
+              </w:rPr>
+              <w:t>Seed 123</w:t>
+            </w:r>
+          </w:p>
+        </w:tc>
+        <w:tc>
+          <w:tcPr>
+            <w:tcW w:w="0" w:type="auto"/>
+            <w:shd w:val="clear" w:color="auto" w:fill="FBFBFB"/>
+            <w:tcMar>
+              <w:top w:w="60" w:type="dxa"/>
+              <w:left w:w="90" w:type="dxa"/>
+              <w:bottom w:w="60" w:type="dxa"/>
+              <w:right w:w="90" w:type="dxa"/>
+            </w:tcMar>
+            <w:vAlign w:val="bottom"/>
+          </w:tcPr>
+          <w:p>
+            <w:pPr>
+              <w:spacing w:line="240" w:lineRule="auto"/>
+              <w:contextualSpacing/>
+              <w:rPr>
+                <w:rFonts w:cs="Arial"/>
+                <w:sz w:val="20"/>
+                <w:szCs w:val="20"/>
+              </w:rPr>
+            </w:pPr>
+            <w:r>
+              <w:rPr>
+                <w:rFonts w:cs="Arial"/>
+                <w:sz w:val="20"/>
+                <w:szCs w:val="20"/>
+              </w:rPr>
+              <w:t>0.5592</w:t>
+            </w:r>
+          </w:p>
+        </w:tc>
+        <w:tc>
+          <w:tcPr>
+            <w:tcW w:w="0" w:type="auto"/>
+            <w:shd w:val="clear" w:color="auto" w:fill="FBFBFB"/>
+            <w:tcMar>
+              <w:top w:w="60" w:type="dxa"/>
+              <w:left w:w="90" w:type="dxa"/>
+              <w:bottom w:w="60" w:type="dxa"/>
+              <w:right w:w="90" w:type="dxa"/>
+            </w:tcMar>
+            <w:vAlign w:val="bottom"/>
+          </w:tcPr>
+          <w:p>
+            <w:pPr>
+              <w:spacing w:line="240" w:lineRule="auto"/>
+              <w:contextualSpacing/>
+              <w:rPr>
+                <w:rFonts w:cs="Arial"/>
+                <w:sz w:val="20"/>
+                <w:szCs w:val="20"/>
+              </w:rPr>
+            </w:pPr>
+            <w:r>
+              <w:rPr>
+                <w:rFonts w:cs="Arial"/>
+                <w:sz w:val="20"/>
+                <w:szCs w:val="20"/>
+              </w:rPr>
+              <w:t>0.7413</w:t>
+            </w:r>
+          </w:p>
+        </w:tc>
+      </w:tr>
+      <w:tr>
+        <w:trPr>
+          <w:trHeight w:val="288"/>
+        </w:trPr>
         <w:tc>
           <w:tcPr>
             <w:tcW w:w="0" w:type="auto"/>
@@ -12403,6 +12589,43 @@
           </w:tcPr>
           <w:p>
             <w:pPr>
+              <w:spacing w:before="30" w:after="30" w:line="240" w:lineRule="auto"/>
+              <w:contextualSpacing/>
+              <w:jc w:val="right"/>
+              <w:rPr>
+                <w:rFonts w:cs="Arial"/>
+                <w:b/>
+                <w:sz w:val="20"/>
+                <w:szCs w:val="20"/>
+                <w:lang w:eastAsia="zh-CN"/>
+              </w:rPr>
+            </w:pPr>
+            <w:r>
+              <w:rPr>
+                <w:rFonts w:cs="Arial"/>
+                <w:b/>
+                <w:sz w:val="20"/>
+                <w:szCs w:val="20"/>
+                <w:lang w:eastAsia="zh-CN"/>
+              </w:rPr>
+              <w:t>Run 3</w:t>
+            </w:r>
+          </w:p>
+        </w:tc>
+        <w:tc>
+          <w:tcPr>
+            <w:tcW w:w="0" w:type="auto"/>
+            <w:shd w:val="clear" w:color="auto" w:fill="FFFFFF"/>
+            <w:tcMar>
+              <w:top w:w="60" w:type="dxa"/>
+              <w:left w:w="90" w:type="dxa"/>
+              <w:bottom w:w="60" w:type="dxa"/>
+              <w:right w:w="90" w:type="dxa"/>
+            </w:tcMar>
+            <w:vAlign w:val="center"/>
+          </w:tcPr>
+          <w:p>
+            <w:pPr>
               <w:spacing w:line="240" w:lineRule="auto"/>
               <w:contextualSpacing/>
               <w:rPr>
@@ -12417,7 +12640,71 @@
                 <w:sz w:val="20"/>
                 <w:szCs w:val="20"/>
               </w:rPr>
-              <w:t>0.7402</w:t>
+              <w:t>Seed 456</w:t>
+            </w:r>
+          </w:p>
+        </w:tc>
+        <w:tc>
+          <w:tcPr>
+            <w:tcW w:w="0" w:type="auto"/>
+            <w:shd w:val="clear" w:color="auto" w:fill="FFFFFF"/>
+            <w:tcMar>
+              <w:top w:w="60" w:type="dxa"/>
+              <w:left w:w="90" w:type="dxa"/>
+              <w:bottom w:w="60" w:type="dxa"/>
+              <w:right w:w="90" w:type="dxa"/>
+            </w:tcMar>
+            <w:vAlign w:val="bottom"/>
+          </w:tcPr>
+          <w:p>
+            <w:pPr>
+              <w:spacing w:line="240" w:lineRule="auto"/>
+              <w:contextualSpacing/>
+              <w:rPr>
+                <w:rFonts w:cs="Arial"/>
+                <w:sz w:val="20"/>
+                <w:szCs w:val="20"/>
+              </w:rPr>
+            </w:pPr>
+            <w:r>
+              <w:rPr>
+                <w:rFonts w:cs="Arial"/>
+                <w:sz w:val="20"/>
+                <w:szCs w:val="20"/>
+              </w:rPr>
+              <w:t>0.5558</w:t>
+            </w:r>
+          </w:p>
+        </w:tc>
+        <w:tc>
+          <w:tcPr>
+            <w:tcW w:w="0" w:type="auto"/>
+            <w:shd w:val="clear" w:color="auto" w:fill="FFFFFF"/>
+            <w:tcMar>
+              <w:top w:w="60" w:type="dxa"/>
+              <w:left w:w="90" w:type="dxa"/>
+              <w:bottom w:w="60" w:type="dxa"/>
+              <w:right w:w="90" w:type="dxa"/>
+            </w:tcMar>
+            <w:vAlign w:val="bottom"/>
+          </w:tcPr>
+          <w:p>
+            <w:pPr>
+              <w:spacing w:line="240" w:lineRule="auto"/>
+              <w:contextualSpacing/>
+              <w:rPr>
+                <w:rFonts w:cs="Arial"/>
+                <w:sz w:val="20"/>
+                <w:szCs w:val="20"/>
+              </w:rPr>
+            </w:pPr>
+            <w:r>
+              <w:rPr>
+                <w:rFonts w:cs="Arial"/>
+                <w:sz w:val="20"/>
+                <w:szCs w:val="20"/>
+              </w:rPr>
+              <w:t>0.7333</w:t>
             </w:r>
           </w:p>
         </w:tc>
@@ -12459,7 +12746,7 @@
                 <w:szCs w:val="20"/>
                 <w:lang w:eastAsia="zh-CN"/>
               </w:rPr>
-              <w:t>Run 2</w:t>
+              <w:t>Run 4</w:t>
             </w:r>
           </w:p>
         </w:tc>
@@ -12491,10 +12778,217 @@
                 <w:sz w:val="20"/>
                 <w:szCs w:val="20"/>
               </w:rPr>
-              <w:t>Seed 123</w:t>
-            </w:r>
-          </w:p>
-        </w:tc>
+              <w:t>Seed 789</w:t>
+            </w:r>
+          </w:p>
+        </w:tc>
+        <w:tc>
+          <w:tcPr>
+            <w:tcW w:w="0" w:type="auto"/>
+            <w:shd w:val="clear" w:color="auto" w:fill="FBFBFB"/>
+            <w:tcMar>
+              <w:top w:w="60" w:type="dxa"/>
+              <w:left w:w="90" w:type="dxa"/>
+              <w:bottom w:w="60" w:type="dxa"/>
+              <w:right w:w="90" w:type="dxa"/>
+            </w:tcMar>
+            <w:vAlign w:val="bottom"/>
+          </w:tcPr>
+          <w:p>
+            <w:pPr>
+              <w:spacing w:line="240" w:lineRule="auto"/>
+              <w:contextualSpacing/>
+              <w:rPr>
+                <w:rFonts w:cs="Arial"/>
+                <w:sz w:val="20"/>
+                <w:szCs w:val="20"/>
+              </w:rPr>
+            </w:pPr>
+            <w:r>
+              <w:rPr>
+                <w:rFonts w:cs="Arial"/>
+                <w:sz w:val="20"/>
+                <w:szCs w:val="20"/>
+              </w:rPr>
+              <w:t>0.5544</w:t>
+            </w:r>
+          </w:p>
+        </w:tc>
+        <w:tc>
+          <w:tcPr>
+            <w:tcW w:w="0" w:type="auto"/>
+            <w:shd w:val="clear" w:color="auto" w:fill="FBFBFB"/>
+            <w:tcMar>
+              <w:top w:w="60" w:type="dxa"/>
+              <w:left w:w="90" w:type="dxa"/>
+              <w:bottom w:w="60" w:type="dxa"/>
+              <w:right w:w="90" w:type="dxa"/>
+            </w:tcMar>
+            <w:vAlign w:val="bottom"/>
+          </w:tcPr>
+          <w:p>
+            <w:pPr>
+              <w:spacing w:line="240" w:lineRule="auto"/>
+              <w:contextualSpacing/>
+              <w:rPr>
+                <w:rFonts w:cs="Arial"/>
+                <w:sz w:val="20"/>
+                <w:szCs w:val="20"/>
+              </w:rPr>
+            </w:pPr>
+            <w:r>
+              <w:rPr>
+                <w:rFonts w:cs="Arial"/>
+                <w:sz w:val="20"/>
+                <w:szCs w:val="20"/>
+              </w:rPr>
+              <w:t>0.7433</w:t>
+            </w:r>
+          </w:p>
+        </w:tc>
+      </w:tr>
+      <w:tr>
+        <w:trPr>
+          <w:trHeight w:val="288"/>
+        </w:trPr>
+        <w:tc>
+          <w:tcPr>
+            <w:tcW w:w="0" w:type="auto"/>
+            <w:shd w:val="clear" w:color="auto" w:fill="FFFFFF"/>
+            <w:tcMar>
+              <w:top w:w="60" w:type="dxa"/>
+              <w:left w:w="90" w:type="dxa"/>
+              <w:bottom w:w="60" w:type="dxa"/>
+              <w:right w:w="90" w:type="dxa"/>
+            </w:tcMar>
+            <w:vAlign w:val="center"/>
+          </w:tcPr>
+          <w:p>
+            <w:pPr>
+              <w:spacing w:before="30" w:after="30" w:line="240" w:lineRule="auto"/>
+              <w:contextualSpacing/>
+              <w:jc w:val="right"/>
+              <w:rPr>
+                <w:rFonts w:cs="Arial"/>
+                <w:b/>
+                <w:sz w:val="20"/>
+                <w:szCs w:val="20"/>
+                <w:lang w:eastAsia="zh-CN"/>
+              </w:rPr>
+            </w:pPr>
+            <w:r>
+              <w:rPr>
+                <w:rFonts w:cs="Arial"/>
+                <w:b/>
+                <w:sz w:val="20"/>
+                <w:szCs w:val="20"/>
+                <w:lang w:eastAsia="zh-CN"/>
+              </w:rPr>
+              <w:t>Run 5</w:t>
+            </w:r>
+          </w:p>
+        </w:tc>
+        <w:tc>
+          <w:tcPr>
+            <w:tcW w:w="0" w:type="auto"/>
+            <w:shd w:val="clear" w:color="auto" w:fill="FFFFFF"/>
+            <w:tcMar>
+              <w:top w:w="60" w:type="dxa"/>
+              <w:left w:w="90" w:type="dxa"/>
+              <w:bottom w:w="60" w:type="dxa"/>
+              <w:right w:w="90" w:type="dxa"/>
+            </w:tcMar>
+            <w:vAlign w:val="center"/>
+          </w:tcPr>
+          <w:p>
+            <w:pPr>
+              <w:spacing w:line="240" w:lineRule="auto"/>
+              <w:contextualSpacing/>
+              <w:rPr>
+                <w:rFonts w:cs="Arial"/>
+                <w:sz w:val="20"/>
+                <w:szCs w:val="20"/>
+              </w:rPr>
+            </w:pPr>
+            <w:r>
+              <w:rPr>
+                <w:rFonts w:cs="Arial"/>
+                <w:sz w:val="20"/>
+                <w:szCs w:val="20"/>
+              </w:rPr>
+              <w:t>Seed 1011</w:t>
+            </w:r>
+          </w:p>
+        </w:tc>
+        <w:tc>
+          <w:tcPr>
+            <w:tcW w:w="0" w:type="auto"/>
+            <w:shd w:val="clear" w:color="auto" w:fill="FFFFFF"/>
+            <w:tcMar>
+              <w:top w:w="60" w:type="dxa"/>
+              <w:left w:w="90" w:type="dxa"/>
+              <w:bottom w:w="60" w:type="dxa"/>
+              <w:right w:w="90" w:type="dxa"/>
+            </w:tcMar>
+            <w:vAlign w:val="bottom"/>
+          </w:tcPr>
+          <w:p>
+            <w:pPr>
+              <w:spacing w:line="240" w:lineRule="auto"/>
+              <w:contextualSpacing/>
+              <w:rPr>
+                <w:rFonts w:cs="Arial"/>
+                <w:sz w:val="20"/>
+                <w:szCs w:val="20"/>
+              </w:rPr>
+            </w:pPr>
+            <w:r>
+              <w:rPr>
+                <w:rFonts w:cs="Arial"/>
+                <w:sz w:val="20"/>
+                <w:szCs w:val="20"/>
+              </w:rPr>
+              <w:t>0.5429</w:t>
+            </w:r>
+          </w:p>
+        </w:tc>
+        <w:tc>
+          <w:tcPr>
+            <w:tcW w:w="0" w:type="auto"/>
+            <w:shd w:val="clear" w:color="auto" w:fill="FFFFFF"/>
+            <w:tcMar>
+              <w:top w:w="60" w:type="dxa"/>
+              <w:left w:w="90" w:type="dxa"/>
+              <w:bottom w:w="60" w:type="dxa"/>
+              <w:right w:w="90" w:type="dxa"/>
+            </w:tcMar>
+            <w:vAlign w:val="bottom"/>
+          </w:tcPr>
+          <w:p>
+            <w:pPr>
+              <w:spacing w:line="240" w:lineRule="auto"/>
+              <w:contextualSpacing/>
+              <w:rPr>
+                <w:rFonts w:cs="Arial"/>
+                <w:sz w:val="20"/>
+                <w:szCs w:val="20"/>
+              </w:rPr>
+            </w:pPr>
+            <w:r>
+              <w:rPr>
+                <w:rFonts w:cs="Arial"/>
+                <w:sz w:val="20"/>
+                <w:szCs w:val="20"/>
+              </w:rPr>
+              <w:t>0.7409</w:t>
+            </w:r>
+          </w:p>
+        </w:tc>
+      </w:tr>
+      <w:tr>
+        <w:trPr>
+          <w:trHeight w:val="288"/>
+        </w:trPr>
         <w:tc>
           <w:tcPr>
             <w:tcW w:w="0" w:type="auto"/>
@@ -12511,8 +13005,10 @@
             <w:pPr>
               <w:spacing w:line="240" w:lineRule="auto"/>
               <w:contextualSpacing/>
+              <w:jc w:val="right"/>
               <w:rPr>
                 <w:rFonts w:cs="Arial"/>
+                <w:b/>
                 <w:sz w:val="20"/>
                 <w:szCs w:val="20"/>
               </w:rPr>
@@ -12520,10 +13016,11 @@
             <w:r>
               <w:rPr>
                 <w:rFonts w:cs="Arial"/>
+                <w:b/>
                 <w:sz w:val="20"/>
                 <w:szCs w:val="20"/>
               </w:rPr>
-              <w:t>0.5524</w:t>
+              <w:t>FAERS</w:t>
             </w:r>
           </w:p>
         </w:tc>
@@ -12545,6 +13042,7 @@
               <w:contextualSpacing/>
               <w:rPr>
                 <w:rFonts w:cs="Arial"/>
+                <w:b/>
                 <w:sz w:val="20"/>
                 <w:szCs w:val="20"/>
               </w:rPr>
@@ -12552,10 +13050,85 @@
             <w:r>
               <w:rPr>
                 <w:rFonts w:cs="Arial"/>
+                <w:b/>
                 <w:sz w:val="20"/>
                 <w:szCs w:val="20"/>
               </w:rPr>
-              <w:t>0.7369</w:t>
+              <w:t>Average</w:t>
+            </w:r>
+          </w:p>
+        </w:tc>
+        <w:tc>
+          <w:tcPr>
+            <w:tcW w:w="0" w:type="auto"/>
+            <w:shd w:val="clear" w:color="auto" w:fill="FBFBFB"/>
+            <w:tcMar>
+              <w:top w:w="60" w:type="dxa"/>
+              <w:left w:w="90" w:type="dxa"/>
+              <w:bottom w:w="60" w:type="dxa"/>
+              <w:right w:w="90" w:type="dxa"/>
+            </w:tcMar>
+            <w:vAlign w:val="bottom"/>
+          </w:tcPr>
+          <w:p>
+            <w:pPr>
+              <w:spacing w:line="240" w:lineRule="auto"/>
+              <w:contextualSpacing/>
+              <w:rPr>
+                <w:rFonts w:cs="Arial"/>
+                <w:b/>
+                <w:bCs/>
+                <w:sz w:val="20"/>
+                <w:szCs w:val="20"/>
+              </w:rPr>
+            </w:pPr>
+            <w:r>
+              <w:rPr>
+                <w:rFonts w:ascii="Calibri" w:hAnsi="Calibri" w:cs="Calibri"/>
+                <w:b/>
+                <w:bCs/>
+                <w:color w:val="000000"/>
+                <w:sz w:val="22"/>
+                <w:szCs w:val="22"/>
+              </w:rPr>
+              <w:t>0.5526 ± 0.0062</w:t>
+            </w:r>
+          </w:p>
+        </w:tc>
+        <w:tc>
+          <w:tcPr>
+            <w:tcW w:w="0" w:type="auto"/>
+            <w:shd w:val="clear" w:color="auto" w:fill="FBFBFB"/>
+            <w:tcMar>
+              <w:top w:w="60" w:type="dxa"/>
+              <w:left w:w="90" w:type="dxa"/>
+              <w:bottom w:w="60" w:type="dxa"/>
+              <w:right w:w="90" w:type="dxa"/>
+            </w:tcMar>
+            <w:vAlign w:val="bottom"/>
+          </w:tcPr>
+          <w:p>
+            <w:pPr>
+              <w:spacing w:line="240" w:lineRule="auto"/>
+              <w:contextualSpacing/>
+              <w:rPr>
+                <w:rFonts w:cs="Arial"/>
+                <w:b/>
+                <w:bCs/>
+                <w:sz w:val="20"/>
+                <w:szCs w:val="20"/>
+              </w:rPr>
+            </w:pPr>
+            <w:r>
+              <w:rPr>
+                <w:rFonts w:ascii="Calibri" w:hAnsi="Calibri" w:cs="Calibri"/>
+                <w:b/>
+                <w:bCs/>
+                <w:color w:val="000000"/>
+                <w:sz w:val="22"/>
+                <w:szCs w:val="22"/>
+              </w:rPr>
+              <w:t>0.7380 ± 0.0054</w:t>
             </w:r>
           </w:p>
         </w:tc>
@@ -12586,18 +13159,38 @@
                 <w:b/>
                 <w:sz w:val="20"/>
                 <w:szCs w:val="20"/>
-                <w:lang w:eastAsia="zh-CN"/>
               </w:rPr>
             </w:pPr>
             <w:r>
               <w:rPr>
                 <w:rFonts w:cs="Arial"/>
                 <w:b/>
+                <w:color w:val="222222"/>
+                <w:sz w:val="20"/>
+                <w:szCs w:val="20"/>
+              </w:rPr>
+              <w:t>VAERS</w:t>
+            </w:r>
+            <w:r>
+              <w:rPr>
+                <w:rFonts w:cs="Arial"/>
+                <w:b/>
+                <w:color w:val="222222"/>
                 <w:sz w:val="20"/>
                 <w:szCs w:val="20"/>
                 <w:lang w:eastAsia="zh-CN"/>
               </w:rPr>
-              <w:t>Run 3</w:t>
+              <w:t xml:space="preserve"> Run 1</w:t>
+            </w:r>
+            <w:r>
+              <w:rPr>
+                <w:rFonts w:cs="Arial"/>
+                <w:b/>
+                <w:color w:val="222222"/>
+                <w:sz w:val="20"/>
+                <w:szCs w:val="20"/>
+              </w:rPr>
+              <w:t xml:space="preserve"> </w:t>
             </w:r>
           </w:p>
         </w:tc>
@@ -12629,10 +13222,216 @@
                 <w:sz w:val="20"/>
                 <w:szCs w:val="20"/>
               </w:rPr>
-              <w:t>Seed 456</w:t>
-            </w:r>
-          </w:p>
-        </w:tc>
+              <w:t>Seed 42</w:t>
+            </w:r>
+          </w:p>
+        </w:tc>
+        <w:tc>
+          <w:tcPr>
+            <w:tcW w:w="0" w:type="auto"/>
+            <w:shd w:val="clear" w:color="auto" w:fill="FFFFFF"/>
+            <w:tcMar>
+              <w:top w:w="60" w:type="dxa"/>
+              <w:left w:w="90" w:type="dxa"/>
+              <w:bottom w:w="60" w:type="dxa"/>
+              <w:right w:w="90" w:type="dxa"/>
+            </w:tcMar>
+            <w:vAlign w:val="bottom"/>
+          </w:tcPr>
+          <w:p>
+            <w:pPr>
+              <w:spacing w:line="240" w:lineRule="auto"/>
+              <w:contextualSpacing/>
+              <w:rPr>
+                <w:rFonts w:cs="Arial"/>
+                <w:sz w:val="20"/>
+                <w:szCs w:val="20"/>
+              </w:rPr>
+            </w:pPr>
+            <w:r>
+              <w:rPr>
+                <w:rFonts w:cs="Arial"/>
+                <w:sz w:val="20"/>
+                <w:szCs w:val="20"/>
+              </w:rPr>
+              <w:t>0.7021</w:t>
+            </w:r>
+          </w:p>
+        </w:tc>
+        <w:tc>
+          <w:tcPr>
+            <w:tcW w:w="0" w:type="auto"/>
+            <w:shd w:val="clear" w:color="auto" w:fill="FFFFFF"/>
+            <w:tcMar>
+              <w:top w:w="60" w:type="dxa"/>
+              <w:left w:w="90" w:type="dxa"/>
+              <w:bottom w:w="60" w:type="dxa"/>
+              <w:right w:w="90" w:type="dxa"/>
+            </w:tcMar>
+            <w:vAlign w:val="bottom"/>
+          </w:tcPr>
+          <w:p>
+            <w:pPr>
+              <w:spacing w:line="240" w:lineRule="auto"/>
+              <w:contextualSpacing/>
+              <w:rPr>
+                <w:rFonts w:cs="Arial"/>
+                <w:sz w:val="20"/>
+                <w:szCs w:val="20"/>
+              </w:rPr>
+            </w:pPr>
+            <w:r>
+              <w:rPr>
+                <w:rFonts w:cs="Arial"/>
+                <w:sz w:val="20"/>
+                <w:szCs w:val="20"/>
+              </w:rPr>
+              <w:t>0.8358</w:t>
+            </w:r>
+          </w:p>
+        </w:tc>
+      </w:tr>
+      <w:tr>
+        <w:trPr>
+          <w:trHeight w:val="288"/>
+        </w:trPr>
+        <w:tc>
+          <w:tcPr>
+            <w:tcW w:w="0" w:type="auto"/>
+            <w:shd w:val="clear" w:color="auto" w:fill="FBFBFB"/>
+            <w:tcMar>
+              <w:top w:w="60" w:type="dxa"/>
+              <w:left w:w="90" w:type="dxa"/>
+              <w:bottom w:w="60" w:type="dxa"/>
+              <w:right w:w="90" w:type="dxa"/>
+            </w:tcMar>
+            <w:vAlign w:val="center"/>
+          </w:tcPr>
+          <w:p>
+            <w:pPr>
+              <w:spacing w:before="30" w:after="30" w:line="240" w:lineRule="auto"/>
+              <w:contextualSpacing/>
+              <w:jc w:val="right"/>
+              <w:rPr>
+                <w:rFonts w:cs="Arial"/>
+                <w:b/>
+                <w:sz w:val="20"/>
+                <w:szCs w:val="20"/>
+              </w:rPr>
+            </w:pPr>
+            <w:r>
+              <w:rPr>
+                <w:rFonts w:cs="Arial"/>
+                <w:b/>
+                <w:sz w:val="20"/>
+                <w:szCs w:val="20"/>
+                <w:lang w:eastAsia="zh-CN"/>
+              </w:rPr>
+              <w:t>Run 2</w:t>
+            </w:r>
+          </w:p>
+        </w:tc>
+        <w:tc>
+          <w:tcPr>
+            <w:tcW w:w="0" w:type="auto"/>
+            <w:shd w:val="clear" w:color="auto" w:fill="FBFBFB"/>
+            <w:tcMar>
+              <w:top w:w="60" w:type="dxa"/>
+              <w:left w:w="90" w:type="dxa"/>
+              <w:bottom w:w="60" w:type="dxa"/>
+              <w:right w:w="90" w:type="dxa"/>
+            </w:tcMar>
+            <w:vAlign w:val="center"/>
+          </w:tcPr>
+          <w:p>
+            <w:pPr>
+              <w:spacing w:line="240" w:lineRule="auto"/>
+              <w:contextualSpacing/>
+              <w:rPr>
+                <w:rFonts w:cs="Arial"/>
+                <w:sz w:val="20"/>
+                <w:szCs w:val="20"/>
+              </w:rPr>
+            </w:pPr>
+            <w:r>
+              <w:rPr>
+                <w:rFonts w:cs="Arial"/>
+                <w:sz w:val="20"/>
+                <w:szCs w:val="20"/>
+              </w:rPr>
+              <w:t>Seed 123</w:t>
+            </w:r>
+          </w:p>
+        </w:tc>
+        <w:tc>
+          <w:tcPr>
+            <w:tcW w:w="0" w:type="auto"/>
+            <w:shd w:val="clear" w:color="auto" w:fill="FBFBFB"/>
+            <w:tcMar>
+              <w:top w:w="60" w:type="dxa"/>
+              <w:left w:w="90" w:type="dxa"/>
+              <w:bottom w:w="60" w:type="dxa"/>
+              <w:right w:w="90" w:type="dxa"/>
+            </w:tcMar>
+            <w:vAlign w:val="bottom"/>
+          </w:tcPr>
+          <w:p>
+            <w:pPr>
+              <w:spacing w:line="240" w:lineRule="auto"/>
+              <w:contextualSpacing/>
+              <w:rPr>
+                <w:rFonts w:cs="Arial"/>
+                <w:sz w:val="20"/>
+                <w:szCs w:val="20"/>
+              </w:rPr>
+            </w:pPr>
+            <w:r>
+              <w:rPr>
+                <w:rFonts w:cs="Arial"/>
+                <w:sz w:val="20"/>
+                <w:szCs w:val="20"/>
+              </w:rPr>
+              <w:t>0.7029</w:t>
+            </w:r>
+          </w:p>
+        </w:tc>
+        <w:tc>
+          <w:tcPr>
+            <w:tcW w:w="0" w:type="auto"/>
+            <w:shd w:val="clear" w:color="auto" w:fill="FBFBFB"/>
+            <w:tcMar>
+              <w:top w:w="60" w:type="dxa"/>
+              <w:left w:w="90" w:type="dxa"/>
+              <w:bottom w:w="60" w:type="dxa"/>
+              <w:right w:w="90" w:type="dxa"/>
+            </w:tcMar>
+            <w:vAlign w:val="bottom"/>
+          </w:tcPr>
+          <w:p>
+            <w:pPr>
+              <w:spacing w:line="240" w:lineRule="auto"/>
+              <w:contextualSpacing/>
+              <w:rPr>
+                <w:rFonts w:cs="Arial"/>
+                <w:sz w:val="20"/>
+                <w:szCs w:val="20"/>
+              </w:rPr>
+            </w:pPr>
+            <w:r>
+              <w:rPr>
+                <w:rFonts w:cs="Arial"/>
+                <w:sz w:val="20"/>
+                <w:szCs w:val="20"/>
+              </w:rPr>
+              <w:t>0.8403</w:t>
+            </w:r>
+          </w:p>
+        </w:tc>
+      </w:tr>
+      <w:tr>
+        <w:trPr>
+          <w:trHeight w:val="288"/>
+        </w:trPr>
         <w:tc>
           <w:tcPr>
             <w:tcW w:w="0" w:type="auto"/>
@@ -12647,10 +13446,12 @@
           </w:tcPr>
           <w:p>
             <w:pPr>
-              <w:spacing w:line="240" w:lineRule="auto"/>
+              <w:spacing w:before="30" w:after="30" w:line="240" w:lineRule="auto"/>
               <w:contextualSpacing/>
+              <w:jc w:val="right"/>
               <w:rPr>
                 <w:rFonts w:cs="Arial"/>
+                <w:b/>
                 <w:sz w:val="20"/>
                 <w:szCs w:val="20"/>
               </w:rPr>
@@ -12658,10 +13459,12 @@
             <w:r>
               <w:rPr>
                 <w:rFonts w:cs="Arial"/>
+                <w:b/>
                 <w:sz w:val="20"/>
                 <w:szCs w:val="20"/>
-              </w:rPr>
-              <w:t>0.5636</w:t>
+                <w:lang w:eastAsia="zh-CN"/>
+              </w:rPr>
+              <w:t>Run 3</w:t>
             </w:r>
           </w:p>
         </w:tc>
@@ -12693,7 +13496,71 @@
                 <w:sz w:val="20"/>
                 <w:szCs w:val="20"/>
               </w:rPr>
-              <w:t>0.7523</w:t>
+              <w:t>Seed 456</w:t>
+            </w:r>
+          </w:p>
+        </w:tc>
+        <w:tc>
+          <w:tcPr>
+            <w:tcW w:w="0" w:type="auto"/>
+            <w:shd w:val="clear" w:color="auto" w:fill="FFFFFF"/>
+            <w:tcMar>
+              <w:top w:w="60" w:type="dxa"/>
+              <w:left w:w="90" w:type="dxa"/>
+              <w:bottom w:w="60" w:type="dxa"/>
+              <w:right w:w="90" w:type="dxa"/>
+            </w:tcMar>
+            <w:vAlign w:val="bottom"/>
+          </w:tcPr>
+          <w:p>
+            <w:pPr>
+              <w:spacing w:line="240" w:lineRule="auto"/>
+              <w:contextualSpacing/>
+              <w:rPr>
+                <w:rFonts w:cs="Arial"/>
+                <w:sz w:val="20"/>
+                <w:szCs w:val="20"/>
+              </w:rPr>
+            </w:pPr>
+            <w:r>
+              <w:rPr>
+                <w:rFonts w:cs="Arial"/>
+                <w:sz w:val="20"/>
+                <w:szCs w:val="20"/>
+              </w:rPr>
+              <w:t>0.7021</w:t>
+            </w:r>
+          </w:p>
+        </w:tc>
+        <w:tc>
+          <w:tcPr>
+            <w:tcW w:w="0" w:type="auto"/>
+            <w:shd w:val="clear" w:color="auto" w:fill="FFFFFF"/>
+            <w:tcMar>
+              <w:top w:w="60" w:type="dxa"/>
+              <w:left w:w="90" w:type="dxa"/>
+              <w:bottom w:w="60" w:type="dxa"/>
+              <w:right w:w="90" w:type="dxa"/>
+            </w:tcMar>
+            <w:vAlign w:val="bottom"/>
+          </w:tcPr>
+          <w:p>
+            <w:pPr>
+              <w:spacing w:line="240" w:lineRule="auto"/>
+              <w:contextualSpacing/>
+              <w:rPr>
+                <w:rFonts w:cs="Arial"/>
+                <w:sz w:val="20"/>
+                <w:szCs w:val="20"/>
+              </w:rPr>
+            </w:pPr>
+            <w:r>
+              <w:rPr>
+                <w:rFonts w:cs="Arial"/>
+                <w:sz w:val="20"/>
+                <w:szCs w:val="20"/>
+              </w:rPr>
+              <w:t>0.8397</w:t>
             </w:r>
           </w:p>
         </w:tc>
@@ -12724,7 +13591,6 @@
                 <w:b/>
                 <w:sz w:val="20"/>
                 <w:szCs w:val="20"/>
-                <w:lang w:eastAsia="zh-CN"/>
               </w:rPr>
             </w:pPr>
             <w:r>
@@ -12781,7 +13647,7 @@
               <w:bottom w:w="60" w:type="dxa"/>
               <w:right w:w="90" w:type="dxa"/>
             </w:tcMar>
-            <w:vAlign w:val="center"/>
+            <w:vAlign w:val="bottom"/>
           </w:tcPr>
           <w:p>
             <w:pPr>
@@ -12799,10 +13665,184 @@
                 <w:sz w:val="20"/>
                 <w:szCs w:val="20"/>
               </w:rPr>
-              <w:t>0.5571</w:t>
-            </w:r>
-          </w:p>
-        </w:tc>
+              <w:t>0.7039</w:t>
+            </w:r>
+          </w:p>
+        </w:tc>
+        <w:tc>
+          <w:tcPr>
+            <w:tcW w:w="0" w:type="auto"/>
+            <w:shd w:val="clear" w:color="auto" w:fill="FBFBFB"/>
+            <w:tcMar>
+              <w:top w:w="60" w:type="dxa"/>
+              <w:left w:w="90" w:type="dxa"/>
+              <w:bottom w:w="60" w:type="dxa"/>
+              <w:right w:w="90" w:type="dxa"/>
+            </w:tcMar>
+            <w:vAlign w:val="bottom"/>
+          </w:tcPr>
+          <w:p>
+            <w:pPr>
+              <w:spacing w:line="240" w:lineRule="auto"/>
+              <w:contextualSpacing/>
+              <w:rPr>
+                <w:rFonts w:cs="Arial"/>
+                <w:sz w:val="20"/>
+                <w:szCs w:val="20"/>
+              </w:rPr>
+            </w:pPr>
+            <w:r>
+              <w:rPr>
+                <w:rFonts w:cs="Arial"/>
+                <w:sz w:val="20"/>
+                <w:szCs w:val="20"/>
+              </w:rPr>
+              <w:t>0.8416</w:t>
+            </w:r>
+          </w:p>
+        </w:tc>
+      </w:tr>
+      <w:tr>
+        <w:trPr>
+          <w:trHeight w:val="288"/>
+        </w:trPr>
+        <w:tc>
+          <w:tcPr>
+            <w:tcW w:w="0" w:type="auto"/>
+            <w:shd w:val="clear" w:color="auto" w:fill="FFFFFF"/>
+            <w:tcMar>
+              <w:top w:w="60" w:type="dxa"/>
+              <w:left w:w="90" w:type="dxa"/>
+              <w:bottom w:w="60" w:type="dxa"/>
+              <w:right w:w="90" w:type="dxa"/>
+            </w:tcMar>
+            <w:vAlign w:val="center"/>
+          </w:tcPr>
+          <w:p>
+            <w:pPr>
+              <w:spacing w:before="30" w:after="30" w:line="240" w:lineRule="auto"/>
+              <w:contextualSpacing/>
+              <w:jc w:val="right"/>
+              <w:rPr>
+                <w:rFonts w:cs="Arial"/>
+                <w:b/>
+                <w:sz w:val="20"/>
+                <w:szCs w:val="20"/>
+              </w:rPr>
+            </w:pPr>
+            <w:r>
+              <w:rPr>
+                <w:rFonts w:cs="Arial"/>
+                <w:b/>
+                <w:sz w:val="20"/>
+                <w:szCs w:val="20"/>
+                <w:lang w:eastAsia="zh-CN"/>
+              </w:rPr>
+              <w:t>Run 5</w:t>
+            </w:r>
+          </w:p>
+        </w:tc>
+        <w:tc>
+          <w:tcPr>
+            <w:tcW w:w="0" w:type="auto"/>
+            <w:shd w:val="clear" w:color="auto" w:fill="FFFFFF"/>
+            <w:tcMar>
+              <w:top w:w="60" w:type="dxa"/>
+              <w:left w:w="90" w:type="dxa"/>
+              <w:bottom w:w="60" w:type="dxa"/>
+              <w:right w:w="90" w:type="dxa"/>
+            </w:tcMar>
+            <w:vAlign w:val="center"/>
+          </w:tcPr>
+          <w:p>
+            <w:pPr>
+              <w:spacing w:line="240" w:lineRule="auto"/>
+              <w:contextualSpacing/>
+              <w:rPr>
+                <w:rFonts w:cs="Arial"/>
+                <w:sz w:val="20"/>
+                <w:szCs w:val="20"/>
+              </w:rPr>
+            </w:pPr>
+            <w:r>
+              <w:rPr>
+                <w:rFonts w:cs="Arial"/>
+                <w:sz w:val="20"/>
+                <w:szCs w:val="20"/>
+              </w:rPr>
+              <w:t>Seed 1011</w:t>
+            </w:r>
+          </w:p>
+        </w:tc>
+        <w:tc>
+          <w:tcPr>
+            <w:tcW w:w="0" w:type="auto"/>
+            <w:shd w:val="clear" w:color="auto" w:fill="FFFFFF"/>
+            <w:tcMar>
+              <w:top w:w="60" w:type="dxa"/>
+              <w:left w:w="90" w:type="dxa"/>
+              <w:bottom w:w="60" w:type="dxa"/>
+              <w:right w:w="90" w:type="dxa"/>
+            </w:tcMar>
+            <w:vAlign w:val="bottom"/>
+          </w:tcPr>
+          <w:p>
+            <w:pPr>
+              <w:spacing w:line="240" w:lineRule="auto"/>
+              <w:contextualSpacing/>
+              <w:rPr>
+                <w:rFonts w:cs="Arial"/>
+                <w:sz w:val="20"/>
+                <w:szCs w:val="20"/>
+              </w:rPr>
+            </w:pPr>
+            <w:r>
+              <w:rPr>
+                <w:rFonts w:cs="Arial"/>
+                <w:sz w:val="20"/>
+                <w:szCs w:val="20"/>
+              </w:rPr>
+              <w:t>0.7002</w:t>
+            </w:r>
+          </w:p>
+        </w:tc>
+        <w:tc>
+          <w:tcPr>
+            <w:tcW w:w="0" w:type="auto"/>
+            <w:shd w:val="clear" w:color="auto" w:fill="FFFFFF"/>
+            <w:tcMar>
+              <w:top w:w="60" w:type="dxa"/>
+              <w:left w:w="90" w:type="dxa"/>
+              <w:bottom w:w="60" w:type="dxa"/>
+              <w:right w:w="90" w:type="dxa"/>
+            </w:tcMar>
+            <w:vAlign w:val="bottom"/>
+          </w:tcPr>
+          <w:p>
+            <w:pPr>
+              <w:spacing w:line="240" w:lineRule="auto"/>
+              <w:contextualSpacing/>
+              <w:rPr>
+                <w:rFonts w:cs="Arial"/>
+                <w:sz w:val="20"/>
+                <w:szCs w:val="20"/>
+              </w:rPr>
+            </w:pPr>
+            <w:r>
+              <w:rPr>
+                <w:rFonts w:cs="Arial"/>
+                <w:sz w:val="20"/>
+                <w:szCs w:val="20"/>
+              </w:rPr>
+              <w:t>0.8389</w:t>
+            </w:r>
+          </w:p>
+        </w:tc>
+      </w:tr>
+      <w:tr>
+        <w:trPr>
+          <w:trHeight w:val="288"/>
+        </w:trPr>
         <w:tc>
           <w:tcPr>
             <w:tcW w:w="0" w:type="auto"/>
@@ -12819,50 +13859,12 @@
             <w:pPr>
               <w:spacing w:line="240" w:lineRule="auto"/>
               <w:contextualSpacing/>
-              <w:rPr>
-                <w:rFonts w:cs="Arial"/>
-                <w:sz w:val="20"/>
-                <w:szCs w:val="20"/>
-              </w:rPr>
-            </w:pPr>
-            <w:r>
-              <w:rPr>
-                <w:rFonts w:cs="Arial"/>
-                <w:sz w:val="20"/>
-                <w:szCs w:val="20"/>
-              </w:rPr>
-              <w:t>0.7386</w:t>
-            </w:r>
-          </w:p>
-        </w:tc>
-      </w:tr>
-      <w:tr>
-        <w:trPr>
-          <w:trHeight w:val="288"/>
-        </w:trPr>
-        <w:tc>
-          <w:tcPr>
-            <w:tcW w:w="0" w:type="auto"/>
-            <w:shd w:val="clear" w:color="auto" w:fill="FFFFFF"/>
-            <w:tcMar>
-              <w:top w:w="60" w:type="dxa"/>
-              <w:left w:w="90" w:type="dxa"/>
-              <w:bottom w:w="60" w:type="dxa"/>
-              <w:right w:w="90" w:type="dxa"/>
-            </w:tcMar>
-            <w:vAlign w:val="center"/>
-          </w:tcPr>
-          <w:p>
-            <w:pPr>
-              <w:spacing w:before="30" w:after="30" w:line="240" w:lineRule="auto"/>
-              <w:contextualSpacing/>
               <w:jc w:val="right"/>
               <w:rPr>
                 <w:rFonts w:cs="Arial"/>
                 <w:b/>
                 <w:sz w:val="20"/>
                 <w:szCs w:val="20"/>
-                <w:lang w:eastAsia="zh-CN"/>
               </w:rPr>
             </w:pPr>
             <w:r>
@@ -12871,113 +13873,11 @@
                 <w:b/>
                 <w:sz w:val="20"/>
                 <w:szCs w:val="20"/>
-                <w:lang w:eastAsia="zh-CN"/>
-              </w:rPr>
-              <w:t>Run 5</w:t>
-            </w:r>
-          </w:p>
-        </w:tc>
-        <w:tc>
-          <w:tcPr>
-            <w:tcW w:w="0" w:type="auto"/>
-            <w:shd w:val="clear" w:color="auto" w:fill="FFFFFF"/>
-            <w:tcMar>
-              <w:top w:w="60" w:type="dxa"/>
-              <w:left w:w="90" w:type="dxa"/>
-              <w:bottom w:w="60" w:type="dxa"/>
-              <w:right w:w="90" w:type="dxa"/>
-            </w:tcMar>
-            <w:vAlign w:val="center"/>
-          </w:tcPr>
-          <w:p>
-            <w:pPr>
-              <w:spacing w:line="240" w:lineRule="auto"/>
-              <w:contextualSpacing/>
-              <w:rPr>
-                <w:rFonts w:cs="Arial"/>
-                <w:sz w:val="20"/>
-                <w:szCs w:val="20"/>
-              </w:rPr>
-            </w:pPr>
-            <w:r>
-              <w:rPr>
-                <w:rFonts w:cs="Arial"/>
-                <w:sz w:val="20"/>
-                <w:szCs w:val="20"/>
-              </w:rPr>
-              <w:t>Seed 1011</w:t>
-            </w:r>
-          </w:p>
-        </w:tc>
-        <w:tc>
-          <w:tcPr>
-            <w:tcW w:w="0" w:type="auto"/>
-            <w:shd w:val="clear" w:color="auto" w:fill="FFFFFF"/>
-            <w:tcMar>
-              <w:top w:w="60" w:type="dxa"/>
-              <w:left w:w="90" w:type="dxa"/>
-              <w:bottom w:w="60" w:type="dxa"/>
-              <w:right w:w="90" w:type="dxa"/>
-            </w:tcMar>
-            <w:vAlign w:val="center"/>
-          </w:tcPr>
-          <w:p>
-            <w:pPr>
-              <w:spacing w:line="240" w:lineRule="auto"/>
-              <w:contextualSpacing/>
-              <w:rPr>
-                <w:rFonts w:cs="Arial"/>
-                <w:sz w:val="20"/>
-                <w:szCs w:val="20"/>
-              </w:rPr>
-            </w:pPr>
-            <w:r>
-              <w:rPr>
-                <w:rFonts w:cs="Arial"/>
-                <w:sz w:val="20"/>
-                <w:szCs w:val="20"/>
-              </w:rPr>
-              <w:t>0.5620</w:t>
-            </w:r>
-          </w:p>
-        </w:tc>
-        <w:tc>
-          <w:tcPr>
-            <w:tcW w:w="0" w:type="auto"/>
-            <w:shd w:val="clear" w:color="auto" w:fill="FFFFFF"/>
-            <w:tcMar>
-              <w:top w:w="60" w:type="dxa"/>
-              <w:left w:w="90" w:type="dxa"/>
-              <w:bottom w:w="60" w:type="dxa"/>
-              <w:right w:w="90" w:type="dxa"/>
-            </w:tcMar>
-            <w:vAlign w:val="center"/>
-          </w:tcPr>
-          <w:p>
-            <w:pPr>
-              <w:spacing w:line="240" w:lineRule="auto"/>
-              <w:contextualSpacing/>
-              <w:rPr>
-                <w:rFonts w:cs="Arial"/>
-                <w:sz w:val="20"/>
-                <w:szCs w:val="20"/>
-              </w:rPr>
-            </w:pPr>
-            <w:r>
-              <w:rPr>
-                <w:rFonts w:cs="Arial"/>
-                <w:sz w:val="20"/>
-                <w:szCs w:val="20"/>
-              </w:rPr>
-              <w:t>0.7422</w:t>
-            </w:r>
-          </w:p>
-        </w:tc>
-      </w:tr>
-      <w:tr>
-        <w:trPr>
-          <w:trHeight w:val="288"/>
-        </w:trPr>
+              </w:rPr>
+              <w:t>VAERS</w:t>
+            </w:r>
+          </w:p>
+        </w:tc>
         <w:tc>
           <w:tcPr>
             <w:tcW w:w="0" w:type="auto"/>
@@ -12994,7 +13894,6 @@
             <w:pPr>
               <w:spacing w:line="240" w:lineRule="auto"/>
               <w:contextualSpacing/>
-              <w:jc w:val="right"/>
               <w:rPr>
                 <w:rFonts w:cs="Arial"/>
                 <w:b/>
@@ -13009,7 +13908,7 @@
                 <w:sz w:val="20"/>
                 <w:szCs w:val="20"/>
               </w:rPr>
-              <w:t>FAERS</w:t>
+              <w:t>Average</w:t>
             </w:r>
           </w:p>
         </w:tc>
@@ -13023,7 +13922,7 @@
               <w:bottom w:w="60" w:type="dxa"/>
               <w:right w:w="90" w:type="dxa"/>
             </w:tcMar>
-            <w:vAlign w:val="center"/>
+            <w:vAlign w:val="bottom"/>
           </w:tcPr>
           <w:p>
             <w:pPr>
@@ -13032,6 +13931,7 @@
               <w:rPr>
                 <w:rFonts w:cs="Arial"/>
                 <w:b/>
+                <w:bCs/>
                 <w:sz w:val="20"/>
                 <w:szCs w:val="20"/>
               </w:rPr>
@@ -13040,10 +13940,11 @@
               <w:rPr>
                 <w:rFonts w:cs="Arial"/>
                 <w:b/>
+                <w:bCs/>
                 <w:sz w:val="20"/>
                 <w:szCs w:val="20"/>
               </w:rPr>
-              <w:t>Average</w:t>
+              <w:t>0.7022 ± 0.0014</w:t>
             </w:r>
           </w:p>
         </w:tc>
@@ -13057,7 +13958,7 @@
               <w:bottom w:w="60" w:type="dxa"/>
               <w:right w:w="90" w:type="dxa"/>
             </w:tcMar>
-            <w:vAlign w:val="center"/>
+            <w:vAlign w:val="bottom"/>
           </w:tcPr>
           <w:p>
             <w:pPr>
@@ -13066,6 +13967,7 @@
               <w:rPr>
                 <w:rFonts w:cs="Arial"/>
                 <w:b/>
+                <w:bCs/>
                 <w:sz w:val="20"/>
                 <w:szCs w:val="20"/>
               </w:rPr>
@@ -13074,892 +13976,11 @@
               <w:rPr>
                 <w:rFonts w:cs="Arial"/>
                 <w:b/>
+                <w:bCs/>
                 <w:sz w:val="20"/>
                 <w:szCs w:val="20"/>
               </w:rPr>
-              <w:t>0.5564 ± 0.0069</w:t>
-            </w:r>
-          </w:p>
-        </w:tc>
-        <w:tc>
-          <w:tcPr>
-            <w:tcW w:w="0" w:type="auto"/>
-            <w:shd w:val="clear" w:color="auto" w:fill="FBFBFB"/>
-            <w:tcMar>
-              <w:top w:w="60" w:type="dxa"/>
-              <w:left w:w="90" w:type="dxa"/>
-              <w:bottom w:w="60" w:type="dxa"/>
-              <w:right w:w="90" w:type="dxa"/>
-            </w:tcMar>
-            <w:vAlign w:val="center"/>
-          </w:tcPr>
-          <w:p>
-            <w:pPr>
-              <w:spacing w:line="240" w:lineRule="auto"/>
-              <w:contextualSpacing/>
-              <w:rPr>
-                <w:rFonts w:cs="Arial"/>
-                <w:b/>
-                <w:sz w:val="20"/>
-                <w:szCs w:val="20"/>
-              </w:rPr>
-            </w:pPr>
-            <w:r>
-              <w:rPr>
-                <w:rFonts w:cs="Arial"/>
-                <w:b/>
-                <w:sz w:val="20"/>
-                <w:szCs w:val="20"/>
-              </w:rPr>
-              <w:t>0.7420 ± 0.0061</w:t>
-            </w:r>
-          </w:p>
-        </w:tc>
-      </w:tr>
-      <w:tr>
-        <w:trPr>
-          <w:trHeight w:val="288"/>
-        </w:trPr>
-        <w:tc>
-          <w:tcPr>
-            <w:tcW w:w="0" w:type="auto"/>
-            <w:shd w:val="clear" w:color="auto" w:fill="FFFFFF"/>
-            <w:tcMar>
-              <w:top w:w="60" w:type="dxa"/>
-              <w:left w:w="90" w:type="dxa"/>
-              <w:bottom w:w="60" w:type="dxa"/>
-              <w:right w:w="90" w:type="dxa"/>
-            </w:tcMar>
-            <w:vAlign w:val="center"/>
-          </w:tcPr>
-          <w:p>
-            <w:pPr>
-              <w:spacing w:before="30" w:after="30" w:line="240" w:lineRule="auto"/>
-              <w:contextualSpacing/>
-              <w:jc w:val="right"/>
-              <w:rPr>
-                <w:rFonts w:cs="Arial"/>
-                <w:b/>
-                <w:sz w:val="20"/>
-                <w:szCs w:val="20"/>
-              </w:rPr>
-            </w:pPr>
-            <w:r>
-              <w:rPr>
-                <w:rFonts w:cs="Arial"/>
-                <w:b/>
-                <w:color w:val="222222"/>
-                <w:sz w:val="20"/>
-                <w:szCs w:val="20"/>
-              </w:rPr>
-              <w:t>VAERS</w:t>
-            </w:r>
-            <w:r>
-              <w:rPr>
-                <w:rFonts w:cs="Arial"/>
-                <w:b/>
-                <w:color w:val="222222"/>
-                <w:sz w:val="20"/>
-                <w:szCs w:val="20"/>
-                <w:lang w:eastAsia="zh-CN"/>
-              </w:rPr>
-              <w:t xml:space="preserve"> Run 1</w:t>
-            </w:r>
-            <w:r>
-              <w:rPr>
-                <w:rFonts w:cs="Arial"/>
-                <w:b/>
-                <w:color w:val="222222"/>
-                <w:sz w:val="20"/>
-                <w:szCs w:val="20"/>
-              </w:rPr>
-              <w:t xml:space="preserve"> </w:t>
-            </w:r>
-          </w:p>
-        </w:tc>
-        <w:tc>
-          <w:tcPr>
-            <w:tcW w:w="0" w:type="auto"/>
-            <w:shd w:val="clear" w:color="auto" w:fill="FFFFFF"/>
-            <w:tcMar>
-              <w:top w:w="60" w:type="dxa"/>
-              <w:left w:w="90" w:type="dxa"/>
-              <w:bottom w:w="60" w:type="dxa"/>
-              <w:right w:w="90" w:type="dxa"/>
-            </w:tcMar>
-            <w:vAlign w:val="center"/>
-          </w:tcPr>
-          <w:p>
-            <w:pPr>
-              <w:spacing w:line="240" w:lineRule="auto"/>
-              <w:contextualSpacing/>
-              <w:rPr>
-                <w:rFonts w:cs="Arial"/>
-                <w:sz w:val="20"/>
-                <w:szCs w:val="20"/>
-              </w:rPr>
-            </w:pPr>
-            <w:r>
-              <w:rPr>
-                <w:rFonts w:cs="Arial"/>
-                <w:sz w:val="20"/>
-                <w:szCs w:val="20"/>
-              </w:rPr>
-              <w:t>Seed 42</w:t>
-            </w:r>
-          </w:p>
-        </w:tc>
-        <w:tc>
-          <w:tcPr>
-            <w:tcW w:w="0" w:type="auto"/>
-            <w:shd w:val="clear" w:color="auto" w:fill="FFFFFF"/>
-            <w:tcMar>
-              <w:top w:w="60" w:type="dxa"/>
-              <w:left w:w="90" w:type="dxa"/>
-              <w:bottom w:w="60" w:type="dxa"/>
-              <w:right w:w="90" w:type="dxa"/>
-            </w:tcMar>
-            <w:vAlign w:val="center"/>
-          </w:tcPr>
-          <w:p>
-            <w:pPr>
-              <w:spacing w:line="240" w:lineRule="auto"/>
-              <w:contextualSpacing/>
-              <w:rPr>
-                <w:rFonts w:cs="Arial"/>
-                <w:sz w:val="20"/>
-                <w:szCs w:val="20"/>
-              </w:rPr>
-            </w:pPr>
-            <w:r>
-              <w:rPr>
-                <w:rFonts w:cs="Arial"/>
-                <w:sz w:val="20"/>
-                <w:szCs w:val="20"/>
-              </w:rPr>
-              <w:t>0.7015 ± 0.0174</w:t>
-            </w:r>
-          </w:p>
-        </w:tc>
-        <w:tc>
-          <w:tcPr>
-            <w:tcW w:w="0" w:type="auto"/>
-            <w:shd w:val="clear" w:color="auto" w:fill="FFFFFF"/>
-            <w:tcMar>
-              <w:top w:w="60" w:type="dxa"/>
-              <w:left w:w="90" w:type="dxa"/>
-              <w:bottom w:w="60" w:type="dxa"/>
-              <w:right w:w="90" w:type="dxa"/>
-            </w:tcMar>
-            <w:vAlign w:val="center"/>
-          </w:tcPr>
-          <w:p>
-            <w:pPr>
-              <w:spacing w:line="240" w:lineRule="auto"/>
-              <w:contextualSpacing/>
-              <w:rPr>
-                <w:rFonts w:cs="Arial"/>
-                <w:sz w:val="20"/>
-                <w:szCs w:val="20"/>
-              </w:rPr>
-            </w:pPr>
-            <w:r>
-              <w:rPr>
-                <w:rFonts w:cs="Arial"/>
-                <w:sz w:val="20"/>
-                <w:szCs w:val="20"/>
-              </w:rPr>
-              <w:t>0.8370 ± 0.0095</w:t>
-            </w:r>
-          </w:p>
-        </w:tc>
-      </w:tr>
-      <w:tr>
-        <w:trPr>
-          <w:trHeight w:val="288"/>
-        </w:trPr>
-        <w:tc>
-          <w:tcPr>
-            <w:tcW w:w="0" w:type="auto"/>
-            <w:shd w:val="clear" w:color="auto" w:fill="FBFBFB"/>
-            <w:tcMar>
-              <w:top w:w="60" w:type="dxa"/>
-              <w:left w:w="90" w:type="dxa"/>
-              <w:bottom w:w="60" w:type="dxa"/>
-              <w:right w:w="90" w:type="dxa"/>
-            </w:tcMar>
-            <w:vAlign w:val="center"/>
-          </w:tcPr>
-          <w:p>
-            <w:pPr>
-              <w:spacing w:before="30" w:after="30" w:line="240" w:lineRule="auto"/>
-              <w:contextualSpacing/>
-              <w:jc w:val="right"/>
-              <w:rPr>
-                <w:rFonts w:cs="Arial"/>
-                <w:b/>
-                <w:sz w:val="20"/>
-                <w:szCs w:val="20"/>
-              </w:rPr>
-            </w:pPr>
-            <w:r>
-              <w:rPr>
-                <w:rFonts w:cs="Arial"/>
-                <w:b/>
-                <w:sz w:val="20"/>
-                <w:szCs w:val="20"/>
-                <w:lang w:eastAsia="zh-CN"/>
-              </w:rPr>
-              <w:t>Run 2</w:t>
-            </w:r>
-          </w:p>
-        </w:tc>
-        <w:tc>
-          <w:tcPr>
-            <w:tcW w:w="0" w:type="auto"/>
-            <w:shd w:val="clear" w:color="auto" w:fill="FBFBFB"/>
-            <w:tcMar>
-              <w:top w:w="60" w:type="dxa"/>
-              <w:left w:w="90" w:type="dxa"/>
-              <w:bottom w:w="60" w:type="dxa"/>
-              <w:right w:w="90" w:type="dxa"/>
-            </w:tcMar>
-            <w:vAlign w:val="center"/>
-          </w:tcPr>
-          <w:p>
-            <w:pPr>
-              <w:spacing w:line="240" w:lineRule="auto"/>
-              <w:contextualSpacing/>
-              <w:rPr>
-                <w:rFonts w:cs="Arial"/>
-                <w:sz w:val="20"/>
-                <w:szCs w:val="20"/>
-              </w:rPr>
-            </w:pPr>
-            <w:r>
-              <w:rPr>
-                <w:rFonts w:cs="Arial"/>
-                <w:sz w:val="20"/>
-                <w:szCs w:val="20"/>
-              </w:rPr>
-              <w:t>Seed 123</w:t>
-            </w:r>
-          </w:p>
-        </w:tc>
-        <w:tc>
-          <w:tcPr>
-            <w:tcW w:w="0" w:type="auto"/>
-            <w:shd w:val="clear" w:color="auto" w:fill="FBFBFB"/>
-            <w:tcMar>
-              <w:top w:w="60" w:type="dxa"/>
-              <w:left w:w="90" w:type="dxa"/>
-              <w:bottom w:w="60" w:type="dxa"/>
-              <w:right w:w="90" w:type="dxa"/>
-            </w:tcMar>
-            <w:vAlign w:val="center"/>
-          </w:tcPr>
-          <w:p>
-            <w:pPr>
-              <w:spacing w:line="240" w:lineRule="auto"/>
-              <w:contextualSpacing/>
-              <w:rPr>
-                <w:rFonts w:cs="Arial"/>
-                <w:sz w:val="20"/>
-                <w:szCs w:val="20"/>
-              </w:rPr>
-            </w:pPr>
-            <w:r>
-              <w:rPr>
-                <w:rFonts w:cs="Arial"/>
-                <w:sz w:val="20"/>
-                <w:szCs w:val="20"/>
-              </w:rPr>
-              <w:t>0.7013 ± 0.0156</w:t>
-            </w:r>
-          </w:p>
-        </w:tc>
-        <w:tc>
-          <w:tcPr>
-            <w:tcW w:w="0" w:type="auto"/>
-            <w:shd w:val="clear" w:color="auto" w:fill="FBFBFB"/>
-            <w:tcMar>
-              <w:top w:w="60" w:type="dxa"/>
-              <w:left w:w="90" w:type="dxa"/>
-              <w:bottom w:w="60" w:type="dxa"/>
-              <w:right w:w="90" w:type="dxa"/>
-            </w:tcMar>
-            <w:vAlign w:val="center"/>
-          </w:tcPr>
-          <w:p>
-            <w:pPr>
-              <w:spacing w:line="240" w:lineRule="auto"/>
-              <w:contextualSpacing/>
-              <w:rPr>
-                <w:rFonts w:cs="Arial"/>
-                <w:sz w:val="20"/>
-                <w:szCs w:val="20"/>
-              </w:rPr>
-            </w:pPr>
-            <w:r>
-              <w:rPr>
-                <w:rFonts w:cs="Arial"/>
-                <w:sz w:val="20"/>
-                <w:szCs w:val="20"/>
-              </w:rPr>
-              <w:t>0.8405 ± 0.0070</w:t>
-            </w:r>
-          </w:p>
-        </w:tc>
-      </w:tr>
-      <w:tr>
-        <w:trPr>
-          <w:trHeight w:val="288"/>
-        </w:trPr>
-        <w:tc>
-          <w:tcPr>
-            <w:tcW w:w="0" w:type="auto"/>
-            <w:shd w:val="clear" w:color="auto" w:fill="FFFFFF"/>
-            <w:tcMar>
-              <w:top w:w="60" w:type="dxa"/>
-              <w:left w:w="90" w:type="dxa"/>
-              <w:bottom w:w="60" w:type="dxa"/>
-              <w:right w:w="90" w:type="dxa"/>
-            </w:tcMar>
-            <w:vAlign w:val="center"/>
-          </w:tcPr>
-          <w:p>
-            <w:pPr>
-              <w:spacing w:before="30" w:after="30" w:line="240" w:lineRule="auto"/>
-              <w:contextualSpacing/>
-              <w:jc w:val="right"/>
-              <w:rPr>
-                <w:rFonts w:cs="Arial"/>
-                <w:b/>
-                <w:sz w:val="20"/>
-                <w:szCs w:val="20"/>
-              </w:rPr>
-            </w:pPr>
-            <w:r>
-              <w:rPr>
-                <w:rFonts w:cs="Arial"/>
-                <w:b/>
-                <w:sz w:val="20"/>
-                <w:szCs w:val="20"/>
-                <w:lang w:eastAsia="zh-CN"/>
-              </w:rPr>
-              <w:t>Run 3</w:t>
-            </w:r>
-          </w:p>
-        </w:tc>
-        <w:tc>
-          <w:tcPr>
-            <w:tcW w:w="0" w:type="auto"/>
-            <w:shd w:val="clear" w:color="auto" w:fill="FFFFFF"/>
-            <w:tcMar>
-              <w:top w:w="60" w:type="dxa"/>
-              <w:left w:w="90" w:type="dxa"/>
-              <w:bottom w:w="60" w:type="dxa"/>
-              <w:right w:w="90" w:type="dxa"/>
-            </w:tcMar>
-            <w:vAlign w:val="center"/>
-          </w:tcPr>
-          <w:p>
-            <w:pPr>
-              <w:spacing w:line="240" w:lineRule="auto"/>
-              <w:contextualSpacing/>
-              <w:rPr>
-                <w:rFonts w:cs="Arial"/>
-                <w:sz w:val="20"/>
-                <w:szCs w:val="20"/>
-              </w:rPr>
-            </w:pPr>
-            <w:r>
-              <w:rPr>
-                <w:rFonts w:cs="Arial"/>
-                <w:sz w:val="20"/>
-                <w:szCs w:val="20"/>
-              </w:rPr>
-              <w:t>Seed 456</w:t>
-            </w:r>
-          </w:p>
-        </w:tc>
-        <w:tc>
-          <w:tcPr>
-            <w:tcW w:w="0" w:type="auto"/>
-            <w:shd w:val="clear" w:color="auto" w:fill="FFFFFF"/>
-            <w:tcMar>
-              <w:top w:w="60" w:type="dxa"/>
-              <w:left w:w="90" w:type="dxa"/>
-              <w:bottom w:w="60" w:type="dxa"/>
-              <w:right w:w="90" w:type="dxa"/>
-            </w:tcMar>
-            <w:vAlign w:val="center"/>
-          </w:tcPr>
-          <w:p>
-            <w:pPr>
-              <w:spacing w:line="240" w:lineRule="auto"/>
-              <w:contextualSpacing/>
-              <w:rPr>
-                <w:rFonts w:cs="Arial"/>
-                <w:sz w:val="20"/>
-                <w:szCs w:val="20"/>
-              </w:rPr>
-            </w:pPr>
-            <w:r>
-              <w:rPr>
-                <w:rFonts w:cs="Arial"/>
-                <w:sz w:val="20"/>
-                <w:szCs w:val="20"/>
-              </w:rPr>
-              <w:t>0.7008 ± 0.0202</w:t>
-            </w:r>
-          </w:p>
-        </w:tc>
-        <w:tc>
-          <w:tcPr>
-            <w:tcW w:w="0" w:type="auto"/>
-            <w:shd w:val="clear" w:color="auto" w:fill="FFFFFF"/>
-            <w:tcMar>
-              <w:top w:w="60" w:type="dxa"/>
-              <w:left w:w="90" w:type="dxa"/>
-              <w:bottom w:w="60" w:type="dxa"/>
-              <w:right w:w="90" w:type="dxa"/>
-            </w:tcMar>
-            <w:vAlign w:val="center"/>
-          </w:tcPr>
-          <w:p>
-            <w:pPr>
-              <w:spacing w:line="240" w:lineRule="auto"/>
-              <w:contextualSpacing/>
-              <w:rPr>
-                <w:rFonts w:cs="Arial"/>
-                <w:sz w:val="20"/>
-                <w:szCs w:val="20"/>
-              </w:rPr>
-            </w:pPr>
-            <w:r>
-              <w:rPr>
-                <w:rFonts w:cs="Arial"/>
-                <w:sz w:val="20"/>
-                <w:szCs w:val="20"/>
-              </w:rPr>
-              <w:t>0.8400 ± 0.0113</w:t>
-            </w:r>
-          </w:p>
-        </w:tc>
-      </w:tr>
-      <w:tr>
-        <w:trPr>
-          <w:trHeight w:val="288"/>
-        </w:trPr>
-        <w:tc>
-          <w:tcPr>
-            <w:tcW w:w="0" w:type="auto"/>
-            <w:shd w:val="clear" w:color="auto" w:fill="FBFBFB"/>
-            <w:tcMar>
-              <w:top w:w="60" w:type="dxa"/>
-              <w:left w:w="90" w:type="dxa"/>
-              <w:bottom w:w="60" w:type="dxa"/>
-              <w:right w:w="90" w:type="dxa"/>
-            </w:tcMar>
-            <w:vAlign w:val="center"/>
-          </w:tcPr>
-          <w:p>
-            <w:pPr>
-              <w:spacing w:before="30" w:after="30" w:line="240" w:lineRule="auto"/>
-              <w:contextualSpacing/>
-              <w:jc w:val="right"/>
-              <w:rPr>
-                <w:rFonts w:cs="Arial"/>
-                <w:b/>
-                <w:sz w:val="20"/>
-                <w:szCs w:val="20"/>
-              </w:rPr>
-            </w:pPr>
-            <w:r>
-              <w:rPr>
-                <w:rFonts w:cs="Arial"/>
-                <w:b/>
-                <w:sz w:val="20"/>
-                <w:szCs w:val="20"/>
-                <w:lang w:eastAsia="zh-CN"/>
-              </w:rPr>
-              <w:t>Run 4</w:t>
-            </w:r>
-          </w:p>
-        </w:tc>
-        <w:tc>
-          <w:tcPr>
-            <w:tcW w:w="0" w:type="auto"/>
-            <w:shd w:val="clear" w:color="auto" w:fill="FBFBFB"/>
-            <w:tcMar>
-              <w:top w:w="60" w:type="dxa"/>
-              <w:left w:w="90" w:type="dxa"/>
-              <w:bottom w:w="60" w:type="dxa"/>
-              <w:right w:w="90" w:type="dxa"/>
-            </w:tcMar>
-            <w:vAlign w:val="center"/>
-          </w:tcPr>
-          <w:p>
-            <w:pPr>
-              <w:spacing w:line="240" w:lineRule="auto"/>
-              <w:contextualSpacing/>
-              <w:rPr>
-                <w:rFonts w:cs="Arial"/>
-                <w:sz w:val="20"/>
-                <w:szCs w:val="20"/>
-              </w:rPr>
-            </w:pPr>
-            <w:r>
-              <w:rPr>
-                <w:rFonts w:cs="Arial"/>
-                <w:sz w:val="20"/>
-                <w:szCs w:val="20"/>
-              </w:rPr>
-              <w:t>Seed 789</w:t>
-            </w:r>
-          </w:p>
-        </w:tc>
-        <w:tc>
-          <w:tcPr>
-            <w:tcW w:w="0" w:type="auto"/>
-            <w:shd w:val="clear" w:color="auto" w:fill="FBFBFB"/>
-            <w:tcMar>
-              <w:top w:w="60" w:type="dxa"/>
-              <w:left w:w="90" w:type="dxa"/>
-              <w:bottom w:w="60" w:type="dxa"/>
-              <w:right w:w="90" w:type="dxa"/>
-            </w:tcMar>
-            <w:vAlign w:val="center"/>
-          </w:tcPr>
-          <w:p>
-            <w:pPr>
-              <w:spacing w:line="240" w:lineRule="auto"/>
-              <w:contextualSpacing/>
-              <w:rPr>
-                <w:rFonts w:cs="Arial"/>
-                <w:sz w:val="20"/>
-                <w:szCs w:val="20"/>
-              </w:rPr>
-            </w:pPr>
-            <w:r>
-              <w:rPr>
-                <w:rFonts w:cs="Arial"/>
-                <w:sz w:val="20"/>
-                <w:szCs w:val="20"/>
-              </w:rPr>
-              <w:t>0.7026 ± 0.0152</w:t>
-            </w:r>
-          </w:p>
-        </w:tc>
-        <w:tc>
-          <w:tcPr>
-            <w:tcW w:w="0" w:type="auto"/>
-            <w:shd w:val="clear" w:color="auto" w:fill="FBFBFB"/>
-            <w:tcMar>
-              <w:top w:w="60" w:type="dxa"/>
-              <w:left w:w="90" w:type="dxa"/>
-              <w:bottom w:w="60" w:type="dxa"/>
-              <w:right w:w="90" w:type="dxa"/>
-            </w:tcMar>
-            <w:vAlign w:val="center"/>
-          </w:tcPr>
-          <w:p>
-            <w:pPr>
-              <w:spacing w:line="240" w:lineRule="auto"/>
-              <w:contextualSpacing/>
-              <w:rPr>
-                <w:rFonts w:cs="Arial"/>
-                <w:sz w:val="20"/>
-                <w:szCs w:val="20"/>
-              </w:rPr>
-            </w:pPr>
-            <w:r>
-              <w:rPr>
-                <w:rFonts w:cs="Arial"/>
-                <w:sz w:val="20"/>
-                <w:szCs w:val="20"/>
-              </w:rPr>
-              <w:t>0.8419 ± 0.0082</w:t>
-            </w:r>
-          </w:p>
-        </w:tc>
-      </w:tr>
-      <w:tr>
-        <w:trPr>
-          <w:trHeight w:val="288"/>
-        </w:trPr>
-        <w:tc>
-          <w:tcPr>
-            <w:tcW w:w="0" w:type="auto"/>
-            <w:shd w:val="clear" w:color="auto" w:fill="FFFFFF"/>
-            <w:tcMar>
-              <w:top w:w="60" w:type="dxa"/>
-              <w:left w:w="90" w:type="dxa"/>
-              <w:bottom w:w="60" w:type="dxa"/>
-              <w:right w:w="90" w:type="dxa"/>
-            </w:tcMar>
-            <w:vAlign w:val="center"/>
-          </w:tcPr>
-          <w:p>
-            <w:pPr>
-              <w:spacing w:before="30" w:after="30" w:line="240" w:lineRule="auto"/>
-              <w:contextualSpacing/>
-              <w:jc w:val="right"/>
-              <w:rPr>
-                <w:rFonts w:cs="Arial"/>
-                <w:b/>
-                <w:sz w:val="20"/>
-                <w:szCs w:val="20"/>
-              </w:rPr>
-            </w:pPr>
-            <w:r>
-              <w:rPr>
-                <w:rFonts w:cs="Arial"/>
-                <w:b/>
-                <w:sz w:val="20"/>
-                <w:szCs w:val="20"/>
-                <w:lang w:eastAsia="zh-CN"/>
-              </w:rPr>
-              <w:t>Run 5</w:t>
-            </w:r>
-          </w:p>
-        </w:tc>
-        <w:tc>
-          <w:tcPr>
-            <w:tcW w:w="0" w:type="auto"/>
-            <w:shd w:val="clear" w:color="auto" w:fill="FFFFFF"/>
-            <w:tcMar>
-              <w:top w:w="60" w:type="dxa"/>
-              <w:left w:w="90" w:type="dxa"/>
-              <w:bottom w:w="60" w:type="dxa"/>
-              <w:right w:w="90" w:type="dxa"/>
-            </w:tcMar>
-            <w:vAlign w:val="center"/>
-          </w:tcPr>
-          <w:p>
-            <w:pPr>
-              <w:spacing w:line="240" w:lineRule="auto"/>
-              <w:contextualSpacing/>
-              <w:rPr>
-                <w:rFonts w:cs="Arial"/>
-                <w:sz w:val="20"/>
-                <w:szCs w:val="20"/>
-              </w:rPr>
-            </w:pPr>
-            <w:r>
-              <w:rPr>
-                <w:rFonts w:cs="Arial"/>
-                <w:sz w:val="20"/>
-                <w:szCs w:val="20"/>
-              </w:rPr>
-              <w:t>Seed 1011</w:t>
-            </w:r>
-          </w:p>
-        </w:tc>
-        <w:tc>
-          <w:tcPr>
-            <w:tcW w:w="0" w:type="auto"/>
-            <w:shd w:val="clear" w:color="auto" w:fill="FFFFFF"/>
-            <w:tcMar>
-              <w:top w:w="60" w:type="dxa"/>
-              <w:left w:w="90" w:type="dxa"/>
-              <w:bottom w:w="60" w:type="dxa"/>
-              <w:right w:w="90" w:type="dxa"/>
-            </w:tcMar>
-            <w:vAlign w:val="center"/>
-          </w:tcPr>
-          <w:p>
-            <w:pPr>
-              <w:spacing w:line="240" w:lineRule="auto"/>
-              <w:contextualSpacing/>
-              <w:rPr>
-                <w:rFonts w:cs="Arial"/>
-                <w:sz w:val="20"/>
-                <w:szCs w:val="20"/>
-              </w:rPr>
-            </w:pPr>
-            <w:r>
-              <w:rPr>
-                <w:rFonts w:cs="Arial"/>
-                <w:sz w:val="20"/>
-                <w:szCs w:val="20"/>
-              </w:rPr>
-              <w:t>0.6983 ± 0.0159</w:t>
-            </w:r>
-          </w:p>
-        </w:tc>
-        <w:tc>
-          <w:tcPr>
-            <w:tcW w:w="0" w:type="auto"/>
-            <w:shd w:val="clear" w:color="auto" w:fill="FFFFFF"/>
-            <w:tcMar>
-              <w:top w:w="60" w:type="dxa"/>
-              <w:left w:w="90" w:type="dxa"/>
-              <w:bottom w:w="60" w:type="dxa"/>
-              <w:right w:w="90" w:type="dxa"/>
-            </w:tcMar>
-            <w:vAlign w:val="center"/>
-          </w:tcPr>
-          <w:p>
-            <w:pPr>
-              <w:spacing w:line="240" w:lineRule="auto"/>
-              <w:contextualSpacing/>
-              <w:rPr>
-                <w:rFonts w:cs="Arial"/>
-                <w:sz w:val="20"/>
-                <w:szCs w:val="20"/>
-              </w:rPr>
-            </w:pPr>
-            <w:r>
-              <w:rPr>
-                <w:rFonts w:cs="Arial"/>
-                <w:sz w:val="20"/>
-                <w:szCs w:val="20"/>
-              </w:rPr>
-              <w:t>0.8389 ± 0.0091</w:t>
-            </w:r>
-          </w:p>
-        </w:tc>
-      </w:tr>
-      <w:tr>
-        <w:trPr>
-          <w:trHeight w:val="288"/>
-        </w:trPr>
-        <w:tc>
-          <w:tcPr>
-            <w:tcW w:w="0" w:type="auto"/>
-            <w:shd w:val="clear" w:color="auto" w:fill="FBFBFB"/>
-            <w:tcMar>
-              <w:top w:w="60" w:type="dxa"/>
-              <w:left w:w="90" w:type="dxa"/>
-              <w:bottom w:w="60" w:type="dxa"/>
-              <w:right w:w="90" w:type="dxa"/>
-            </w:tcMar>
-            <w:vAlign w:val="center"/>
-          </w:tcPr>
-          <w:p>
-            <w:pPr>
-              <w:spacing w:line="240" w:lineRule="auto"/>
-              <w:contextualSpacing/>
-              <w:jc w:val="right"/>
-              <w:rPr>
-                <w:rFonts w:cs="Arial"/>
-                <w:b/>
-                <w:sz w:val="20"/>
-                <w:szCs w:val="20"/>
-              </w:rPr>
-            </w:pPr>
-            <w:r>
-              <w:rPr>
-                <w:rFonts w:cs="Arial"/>
-                <w:b/>
-                <w:sz w:val="20"/>
-                <w:szCs w:val="20"/>
-              </w:rPr>
-              <w:t>VAERS</w:t>
-            </w:r>
-          </w:p>
-        </w:tc>
-        <w:tc>
-          <w:tcPr>
-            <w:tcW w:w="0" w:type="auto"/>
-            <w:shd w:val="clear" w:color="auto" w:fill="FBFBFB"/>
-            <w:tcMar>
-              <w:top w:w="60" w:type="dxa"/>
-              <w:left w:w="90" w:type="dxa"/>
-              <w:bottom w:w="60" w:type="dxa"/>
-              <w:right w:w="90" w:type="dxa"/>
-            </w:tcMar>
-            <w:vAlign w:val="center"/>
-          </w:tcPr>
-          <w:p>
-            <w:pPr>
-              <w:spacing w:line="240" w:lineRule="auto"/>
-              <w:contextualSpacing/>
-              <w:rPr>
-                <w:rFonts w:cs="Arial"/>
-                <w:b/>
-                <w:sz w:val="20"/>
-                <w:szCs w:val="20"/>
-              </w:rPr>
-            </w:pPr>
-            <w:r>
-              <w:rPr>
-                <w:rFonts w:cs="Arial"/>
-                <w:b/>
-                <w:sz w:val="20"/>
-                <w:szCs w:val="20"/>
-              </w:rPr>
-              <w:t>Average</w:t>
-            </w:r>
-          </w:p>
-        </w:tc>
-        <w:tc>
-          <w:tcPr>
-            <w:tcW w:w="0" w:type="auto"/>
-            <w:shd w:val="clear" w:color="auto" w:fill="FBFBFB"/>
-            <w:tcMar>
-              <w:top w:w="60" w:type="dxa"/>
-              <w:left w:w="90" w:type="dxa"/>
-              <w:bottom w:w="60" w:type="dxa"/>
-              <w:right w:w="90" w:type="dxa"/>
-            </w:tcMar>
-            <w:vAlign w:val="center"/>
-          </w:tcPr>
-          <w:p>
-            <w:pPr>
-              <w:spacing w:line="240" w:lineRule="auto"/>
-              <w:contextualSpacing/>
-              <w:rPr>
-                <w:rFonts w:cs="Arial"/>
-                <w:b/>
-                <w:sz w:val="20"/>
-                <w:szCs w:val="20"/>
-              </w:rPr>
-            </w:pPr>
-            <w:r>
-              <w:rPr>
-                <w:rFonts w:cs="Arial"/>
-                <w:b/>
-                <w:sz w:val="20"/>
-                <w:szCs w:val="20"/>
-              </w:rPr>
-              <w:t>0.7009 ± 0.0016</w:t>
-            </w:r>
-          </w:p>
-        </w:tc>
-        <w:tc>
-          <w:tcPr>
-            <w:tcW w:w="0" w:type="auto"/>
-            <w:shd w:val="clear" w:color="auto" w:fill="FBFBFB"/>
-            <w:tcMar>
-              <w:top w:w="60" w:type="dxa"/>
-              <w:left w:w="90" w:type="dxa"/>
-              <w:bottom w:w="60" w:type="dxa"/>
-              <w:right w:w="90" w:type="dxa"/>
-            </w:tcMar>
-            <w:vAlign w:val="center"/>
-          </w:tcPr>
-          <w:p>
-            <w:pPr>
-              <w:spacing w:line="240" w:lineRule="auto"/>
-              <w:contextualSpacing/>
-              <w:rPr>
-                <w:rFonts w:cs="Arial"/>
-                <w:b/>
-                <w:sz w:val="20"/>
-                <w:szCs w:val="20"/>
-              </w:rPr>
-            </w:pPr>
-            <w:r>
-              <w:rPr>
-                <w:rFonts w:cs="Arial"/>
-                <w:b/>
-                <w:sz w:val="20"/>
-                <w:szCs w:val="20"/>
-              </w:rPr>
-              <w:t>0.8397 ± 0.0018</w:t>
+              <w:t>0.8393 ± 0.0022</w:t>
             </w:r>
           </w:p>
         </w:tc>
@@ -14253,20 +14274,24 @@
               <w:bottom w:w="60" w:type="dxa"/>
               <w:right w:w="90" w:type="dxa"/>
             </w:tcMar>
-            <w:vAlign w:val="center"/>
           </w:tcPr>
           <w:p>
             <w:pPr>
               <w:spacing w:before="30" w:after="30"/>
               <w:jc w:val="center"/>
-            </w:pPr>
-            <w:r>
               <w:rPr>
                 <w:rFonts w:ascii="Arial" w:hAnsi="Arial"/>
                 <w:color w:val="222222"/>
                 <w:sz w:val="16"/>
               </w:rPr>
-              <w:t>0.4043</w:t>
+            </w:pPr>
+            <w:r>
+              <w:rPr>
+                <w:rFonts w:ascii="Arial" w:hAnsi="Arial"/>
+                <w:color w:val="222222"/>
+                <w:sz w:val="16"/>
+              </w:rPr>
+              <w:t>0.3944</w:t>
             </w:r>
           </w:p>
         </w:tc>
@@ -14280,20 +14305,24 @@
               <w:bottom w:w="60" w:type="dxa"/>
               <w:right w:w="90" w:type="dxa"/>
             </w:tcMar>
-            <w:vAlign w:val="center"/>
           </w:tcPr>
           <w:p>
             <w:pPr>
               <w:spacing w:before="30" w:after="30"/>
               <w:jc w:val="center"/>
-            </w:pPr>
-            <w:r>
               <w:rPr>
                 <w:rFonts w:ascii="Arial" w:hAnsi="Arial"/>
                 <w:color w:val="222222"/>
                 <w:sz w:val="16"/>
               </w:rPr>
-              <w:t>0.6249</w:t>
+            </w:pPr>
+            <w:r>
+              <w:rPr>
+                <w:rFonts w:ascii="Arial" w:hAnsi="Arial"/>
+                <w:color w:val="222222"/>
+                <w:sz w:val="16"/>
+              </w:rPr>
+              <w:t>0.6495</w:t>
             </w:r>
           </w:p>
         </w:tc>
@@ -14364,12 +14393,16 @@
               <w:bottom w:w="60" w:type="dxa"/>
               <w:right w:w="90" w:type="dxa"/>
             </w:tcMar>
-            <w:vAlign w:val="center"/>
           </w:tcPr>
           <w:p>
             <w:pPr>
               <w:spacing w:before="30" w:after="30"/>
               <w:jc w:val="center"/>
+              <w:rPr>
+                <w:rFonts w:ascii="Arial" w:hAnsi="Arial"/>
+                <w:color w:val="222222"/>
+                <w:sz w:val="16"/>
+              </w:rPr>
             </w:pPr>
             <w:r>
               <w:rPr>
@@ -14391,20 +14424,24 @@
               <w:bottom w:w="60" w:type="dxa"/>
               <w:right w:w="90" w:type="dxa"/>
             </w:tcMar>
-            <w:vAlign w:val="center"/>
           </w:tcPr>
           <w:p>
             <w:pPr>
               <w:spacing w:before="30" w:after="30"/>
               <w:jc w:val="center"/>
-            </w:pPr>
-            <w:r>
               <w:rPr>
                 <w:rFonts w:ascii="Arial" w:hAnsi="Arial"/>
                 <w:color w:val="222222"/>
                 <w:sz w:val="16"/>
               </w:rPr>
-              <w:t>0.5995</w:t>
+            </w:pPr>
+            <w:r>
+              <w:rPr>
+                <w:rFonts w:ascii="Arial" w:hAnsi="Arial"/>
+                <w:color w:val="222222"/>
+                <w:sz w:val="16"/>
+              </w:rPr>
+              <w:t>0.6305</w:t>
             </w:r>
           </w:p>
         </w:tc>
@@ -14475,20 +14512,24 @@
               <w:bottom w:w="60" w:type="dxa"/>
               <w:right w:w="90" w:type="dxa"/>
             </w:tcMar>
-            <w:vAlign w:val="center"/>
           </w:tcPr>
           <w:p>
             <w:pPr>
               <w:spacing w:before="30" w:after="30"/>
               <w:jc w:val="center"/>
-            </w:pPr>
-            <w:r>
               <w:rPr>
                 <w:rFonts w:ascii="Arial" w:hAnsi="Arial"/>
                 <w:color w:val="222222"/>
                 <w:sz w:val="16"/>
               </w:rPr>
-              <w:t>0.4667</w:t>
+            </w:pPr>
+            <w:r>
+              <w:rPr>
+                <w:rFonts w:ascii="Arial" w:hAnsi="Arial"/>
+                <w:color w:val="222222"/>
+                <w:sz w:val="16"/>
+              </w:rPr>
+              <w:t>0.4535</w:t>
             </w:r>
           </w:p>
         </w:tc>
@@ -14502,20 +14543,24 @@
               <w:bottom w:w="60" w:type="dxa"/>
               <w:right w:w="90" w:type="dxa"/>
             </w:tcMar>
-            <w:vAlign w:val="center"/>
           </w:tcPr>
           <w:p>
             <w:pPr>
               <w:spacing w:before="30" w:after="30"/>
               <w:jc w:val="center"/>
-            </w:pPr>
-            <w:r>
               <w:rPr>
                 <w:rFonts w:ascii="Arial" w:hAnsi="Arial"/>
                 <w:color w:val="222222"/>
                 <w:sz w:val="16"/>
               </w:rPr>
-              <w:t>0.6443</w:t>
+            </w:pPr>
+            <w:r>
+              <w:rPr>
+                <w:rFonts w:ascii="Arial" w:hAnsi="Arial"/>
+                <w:color w:val="222222"/>
+                <w:sz w:val="16"/>
+              </w:rPr>
+              <w:t>0.6597</w:t>
             </w:r>
           </w:p>
         </w:tc>

</xml_diff>